<commit_message>
docs: restructure DeTaiCNJ18_Nhom7 with automatic TOC field, Lời nói đầu, and deep Chapter 1 focus; clean up duplicate files
</commit_message>
<xml_diff>
--- a/DeTaiCNJ18_Nhom7.docx
+++ b/DeTaiCNJ18_Nhom7.docx
@@ -14489,10 +14489,3393 @@
         </w:tc>
       </w:tr>
     </w:tbl>
+    <w:tbl>
+      <w:tblPr>
+        <w:tblW w:type="auto" w:w="0"/>
+        <w:jc w:val="center"/>
+        <w:tblLook w:firstColumn="1" w:firstRow="1" w:lastColumn="0" w:lastRow="0" w:noHBand="0" w:noVBand="1" w:val="04A0"/>
+      </w:tblPr>
+      <w:tblGrid>
+        <w:gridCol w:w="2198"/>
+        <w:gridCol w:w="2198"/>
+        <w:gridCol w:w="2198"/>
+        <w:gridCol w:w="2198"/>
+      </w:tblGrid>
+      <w:tr>
+        <w:tc>
+          <w:tcPr>
+            <w:tcW w:type="dxa" w:w="2198"/>
+            <w:shd w:fill="E2E8F0"/>
+          </w:tcPr>
+          <w:p>
+            <w:pPr>
+              <w:jc w:val="center"/>
+            </w:pPr>
+            <w:r>
+              <w:rPr>
+                <w:rFonts w:ascii="Times New Roman" w:hAnsi="Times New Roman"/>
+                <w:b/>
+                <w:sz w:val="22"/>
+              </w:rPr>
+              <w:t>Mã UC</w:t>
+            </w:r>
+          </w:p>
+        </w:tc>
+        <w:tc>
+          <w:tcPr>
+            <w:tcW w:type="dxa" w:w="2198"/>
+            <w:shd w:fill="E2E8F0"/>
+          </w:tcPr>
+          <w:p>
+            <w:pPr>
+              <w:jc w:val="center"/>
+            </w:pPr>
+            <w:r>
+              <w:rPr>
+                <w:rFonts w:ascii="Times New Roman" w:hAnsi="Times New Roman"/>
+                <w:b/>
+                <w:sz w:val="22"/>
+              </w:rPr>
+              <w:t>Tên Use Case</w:t>
+            </w:r>
+          </w:p>
+        </w:tc>
+        <w:tc>
+          <w:tcPr>
+            <w:tcW w:type="dxa" w:w="2198"/>
+            <w:shd w:fill="E2E8F0"/>
+          </w:tcPr>
+          <w:p>
+            <w:pPr>
+              <w:jc w:val="center"/>
+            </w:pPr>
+            <w:r>
+              <w:rPr>
+                <w:rFonts w:ascii="Times New Roman" w:hAnsi="Times New Roman"/>
+                <w:b/>
+                <w:sz w:val="22"/>
+              </w:rPr>
+              <w:t>Tác nhân chính</w:t>
+            </w:r>
+          </w:p>
+        </w:tc>
+        <w:tc>
+          <w:tcPr>
+            <w:tcW w:type="dxa" w:w="2198"/>
+            <w:shd w:fill="E2E8F0"/>
+          </w:tcPr>
+          <w:p>
+            <w:pPr>
+              <w:jc w:val="center"/>
+            </w:pPr>
+            <w:r>
+              <w:rPr>
+                <w:rFonts w:ascii="Times New Roman" w:hAnsi="Times New Roman"/>
+                <w:b/>
+                <w:sz w:val="22"/>
+              </w:rPr>
+              <w:t>Mô tả chi tiết</w:t>
+            </w:r>
+          </w:p>
+        </w:tc>
+      </w:tr>
+      <w:tr>
+        <w:tc>
+          <w:tcPr>
+            <w:tcW w:type="dxa" w:w="2198"/>
+          </w:tcPr>
+          <w:p>
+            <w:pPr>
+              <w:jc w:val="center"/>
+            </w:pPr>
+            <w:r>
+              <w:rPr>
+                <w:rFonts w:ascii="Times New Roman" w:hAnsi="Times New Roman"/>
+                <w:sz w:val="21"/>
+              </w:rPr>
+              <w:t>UC01</w:t>
+            </w:r>
+          </w:p>
+        </w:tc>
+        <w:tc>
+          <w:tcPr>
+            <w:tcW w:type="dxa" w:w="2198"/>
+          </w:tcPr>
+          <w:p>
+            <w:pPr>
+              <w:jc w:val="left"/>
+            </w:pPr>
+            <w:r>
+              <w:rPr>
+                <w:rFonts w:ascii="Times New Roman" w:hAnsi="Times New Roman"/>
+                <w:sz w:val="21"/>
+              </w:rPr>
+              <w:t>Đăng ký tài khoản Customer</w:t>
+            </w:r>
+          </w:p>
+        </w:tc>
+        <w:tc>
+          <w:tcPr>
+            <w:tcW w:type="dxa" w:w="2198"/>
+          </w:tcPr>
+          <w:p>
+            <w:pPr>
+              <w:jc w:val="left"/>
+            </w:pPr>
+            <w:r>
+              <w:rPr>
+                <w:rFonts w:ascii="Times New Roman" w:hAnsi="Times New Roman"/>
+                <w:sz w:val="21"/>
+              </w:rPr>
+              <w:t>Customer</w:t>
+            </w:r>
+          </w:p>
+        </w:tc>
+        <w:tc>
+          <w:tcPr>
+            <w:tcW w:type="dxa" w:w="2198"/>
+          </w:tcPr>
+          <w:p>
+            <w:pPr>
+              <w:jc w:val="left"/>
+            </w:pPr>
+            <w:r>
+              <w:rPr>
+                <w:rFonts w:ascii="Times New Roman" w:hAnsi="Times New Roman"/>
+                <w:sz w:val="21"/>
+              </w:rPr>
+              <w:t>Người dùng tạo tài khoản mua hàng mới</w:t>
+            </w:r>
+          </w:p>
+        </w:tc>
+      </w:tr>
+      <w:tr>
+        <w:tc>
+          <w:tcPr>
+            <w:tcW w:type="dxa" w:w="2198"/>
+          </w:tcPr>
+          <w:p>
+            <w:pPr>
+              <w:jc w:val="center"/>
+            </w:pPr>
+            <w:r>
+              <w:rPr>
+                <w:rFonts w:ascii="Times New Roman" w:hAnsi="Times New Roman"/>
+                <w:sz w:val="21"/>
+              </w:rPr>
+              <w:t>UC02</w:t>
+            </w:r>
+          </w:p>
+        </w:tc>
+        <w:tc>
+          <w:tcPr>
+            <w:tcW w:type="dxa" w:w="2198"/>
+          </w:tcPr>
+          <w:p>
+            <w:pPr>
+              <w:jc w:val="left"/>
+            </w:pPr>
+            <w:r>
+              <w:rPr>
+                <w:rFonts w:ascii="Times New Roman" w:hAnsi="Times New Roman"/>
+                <w:sz w:val="21"/>
+              </w:rPr>
+              <w:t>Đăng ký tài khoản Vendor</w:t>
+            </w:r>
+          </w:p>
+        </w:tc>
+        <w:tc>
+          <w:tcPr>
+            <w:tcW w:type="dxa" w:w="2198"/>
+          </w:tcPr>
+          <w:p>
+            <w:pPr>
+              <w:jc w:val="left"/>
+            </w:pPr>
+            <w:r>
+              <w:rPr>
+                <w:rFonts w:ascii="Times New Roman" w:hAnsi="Times New Roman"/>
+                <w:sz w:val="21"/>
+              </w:rPr>
+              <w:t>Vendor</w:t>
+            </w:r>
+          </w:p>
+        </w:tc>
+        <w:tc>
+          <w:tcPr>
+            <w:tcW w:type="dxa" w:w="2198"/>
+          </w:tcPr>
+          <w:p>
+            <w:pPr>
+              <w:jc w:val="left"/>
+            </w:pPr>
+            <w:r>
+              <w:rPr>
+                <w:rFonts w:ascii="Times New Roman" w:hAnsi="Times New Roman"/>
+                <w:sz w:val="21"/>
+              </w:rPr>
+              <w:t>Nhà bán hàng gửi thông tin gian hàng chờ duyệt</w:t>
+            </w:r>
+          </w:p>
+        </w:tc>
+      </w:tr>
+      <w:tr>
+        <w:tc>
+          <w:tcPr>
+            <w:tcW w:type="dxa" w:w="2198"/>
+          </w:tcPr>
+          <w:p>
+            <w:pPr>
+              <w:jc w:val="center"/>
+            </w:pPr>
+            <w:r>
+              <w:rPr>
+                <w:rFonts w:ascii="Times New Roman" w:hAnsi="Times New Roman"/>
+                <w:sz w:val="21"/>
+              </w:rPr>
+              <w:t>UC03</w:t>
+            </w:r>
+          </w:p>
+        </w:tc>
+        <w:tc>
+          <w:tcPr>
+            <w:tcW w:type="dxa" w:w="2198"/>
+          </w:tcPr>
+          <w:p>
+            <w:pPr>
+              <w:jc w:val="left"/>
+            </w:pPr>
+            <w:r>
+              <w:rPr>
+                <w:rFonts w:ascii="Times New Roman" w:hAnsi="Times New Roman"/>
+                <w:sz w:val="21"/>
+              </w:rPr>
+              <w:t>Đăng nhập / Đăng xuất</w:t>
+            </w:r>
+          </w:p>
+        </w:tc>
+        <w:tc>
+          <w:tcPr>
+            <w:tcW w:type="dxa" w:w="2198"/>
+          </w:tcPr>
+          <w:p>
+            <w:pPr>
+              <w:jc w:val="left"/>
+            </w:pPr>
+            <w:r>
+              <w:rPr>
+                <w:rFonts w:ascii="Times New Roman" w:hAnsi="Times New Roman"/>
+                <w:sz w:val="21"/>
+              </w:rPr>
+              <w:t>Tất cả tác nhân</w:t>
+            </w:r>
+          </w:p>
+        </w:tc>
+        <w:tc>
+          <w:tcPr>
+            <w:tcW w:type="dxa" w:w="2198"/>
+          </w:tcPr>
+          <w:p>
+            <w:pPr>
+              <w:jc w:val="left"/>
+            </w:pPr>
+            <w:r>
+              <w:rPr>
+                <w:rFonts w:ascii="Times New Roman" w:hAnsi="Times New Roman"/>
+                <w:sz w:val="21"/>
+              </w:rPr>
+              <w:t>Xác thực người dùng và phân quyền truy cập URL</w:t>
+            </w:r>
+          </w:p>
+        </w:tc>
+      </w:tr>
+      <w:tr>
+        <w:tc>
+          <w:tcPr>
+            <w:tcW w:type="dxa" w:w="2198"/>
+          </w:tcPr>
+          <w:p>
+            <w:pPr>
+              <w:jc w:val="center"/>
+            </w:pPr>
+            <w:r>
+              <w:rPr>
+                <w:rFonts w:ascii="Times New Roman" w:hAnsi="Times New Roman"/>
+                <w:sz w:val="21"/>
+              </w:rPr>
+              <w:t>UC04</w:t>
+            </w:r>
+          </w:p>
+        </w:tc>
+        <w:tc>
+          <w:tcPr>
+            <w:tcW w:type="dxa" w:w="2198"/>
+          </w:tcPr>
+          <w:p>
+            <w:pPr>
+              <w:jc w:val="left"/>
+            </w:pPr>
+            <w:r>
+              <w:rPr>
+                <w:rFonts w:ascii="Times New Roman" w:hAnsi="Times New Roman"/>
+                <w:sz w:val="21"/>
+              </w:rPr>
+              <w:t>Phê duyệt Gian hàng</w:t>
+            </w:r>
+          </w:p>
+        </w:tc>
+        <w:tc>
+          <w:tcPr>
+            <w:tcW w:type="dxa" w:w="2198"/>
+          </w:tcPr>
+          <w:p>
+            <w:pPr>
+              <w:jc w:val="left"/>
+            </w:pPr>
+            <w:r>
+              <w:rPr>
+                <w:rFonts w:ascii="Times New Roman" w:hAnsi="Times New Roman"/>
+                <w:sz w:val="21"/>
+              </w:rPr>
+              <w:t>Admin</w:t>
+            </w:r>
+          </w:p>
+        </w:tc>
+        <w:tc>
+          <w:tcPr>
+            <w:tcW w:type="dxa" w:w="2198"/>
+          </w:tcPr>
+          <w:p>
+            <w:pPr>
+              <w:jc w:val="left"/>
+            </w:pPr>
+            <w:r>
+              <w:rPr>
+                <w:rFonts w:ascii="Times New Roman" w:hAnsi="Times New Roman"/>
+                <w:sz w:val="21"/>
+              </w:rPr>
+              <w:t>Admin chuyển trạng thái Shop từ PENDING thành APPROVED</w:t>
+            </w:r>
+          </w:p>
+        </w:tc>
+      </w:tr>
+      <w:tr>
+        <w:tc>
+          <w:tcPr>
+            <w:tcW w:type="dxa" w:w="2198"/>
+          </w:tcPr>
+          <w:p>
+            <w:pPr>
+              <w:jc w:val="center"/>
+            </w:pPr>
+            <w:r>
+              <w:rPr>
+                <w:rFonts w:ascii="Times New Roman" w:hAnsi="Times New Roman"/>
+                <w:sz w:val="21"/>
+              </w:rPr>
+              <w:t>UC05</w:t>
+            </w:r>
+          </w:p>
+        </w:tc>
+        <w:tc>
+          <w:tcPr>
+            <w:tcW w:type="dxa" w:w="2198"/>
+          </w:tcPr>
+          <w:p>
+            <w:pPr>
+              <w:jc w:val="left"/>
+            </w:pPr>
+            <w:r>
+              <w:rPr>
+                <w:rFonts w:ascii="Times New Roman" w:hAnsi="Times New Roman"/>
+                <w:sz w:val="21"/>
+              </w:rPr>
+              <w:t>Quản lý sản phẩm Shop</w:t>
+            </w:r>
+          </w:p>
+        </w:tc>
+        <w:tc>
+          <w:tcPr>
+            <w:tcW w:type="dxa" w:w="2198"/>
+          </w:tcPr>
+          <w:p>
+            <w:pPr>
+              <w:jc w:val="left"/>
+            </w:pPr>
+            <w:r>
+              <w:rPr>
+                <w:rFonts w:ascii="Times New Roman" w:hAnsi="Times New Roman"/>
+                <w:sz w:val="21"/>
+              </w:rPr>
+              <w:t>Vendor</w:t>
+            </w:r>
+          </w:p>
+        </w:tc>
+        <w:tc>
+          <w:tcPr>
+            <w:tcW w:type="dxa" w:w="2198"/>
+          </w:tcPr>
+          <w:p>
+            <w:pPr>
+              <w:jc w:val="left"/>
+            </w:pPr>
+            <w:r>
+              <w:rPr>
+                <w:rFonts w:ascii="Times New Roman" w:hAnsi="Times New Roman"/>
+                <w:sz w:val="21"/>
+              </w:rPr>
+              <w:t>Vendor thêm, sửa, xóa, tải gallery ảnh sản phẩm</w:t>
+            </w:r>
+          </w:p>
+        </w:tc>
+      </w:tr>
+      <w:tr>
+        <w:tc>
+          <w:tcPr>
+            <w:tcW w:type="dxa" w:w="2198"/>
+          </w:tcPr>
+          <w:p>
+            <w:pPr>
+              <w:jc w:val="center"/>
+            </w:pPr>
+            <w:r>
+              <w:rPr>
+                <w:rFonts w:ascii="Times New Roman" w:hAnsi="Times New Roman"/>
+                <w:sz w:val="21"/>
+              </w:rPr>
+              <w:t>UC06</w:t>
+            </w:r>
+          </w:p>
+        </w:tc>
+        <w:tc>
+          <w:tcPr>
+            <w:tcW w:type="dxa" w:w="2198"/>
+          </w:tcPr>
+          <w:p>
+            <w:pPr>
+              <w:jc w:val="left"/>
+            </w:pPr>
+            <w:r>
+              <w:rPr>
+                <w:rFonts w:ascii="Times New Roman" w:hAnsi="Times New Roman"/>
+                <w:sz w:val="21"/>
+              </w:rPr>
+              <w:t>Tìm kiếm &amp; Lọc sản phẩm</w:t>
+            </w:r>
+          </w:p>
+        </w:tc>
+        <w:tc>
+          <w:tcPr>
+            <w:tcW w:type="dxa" w:w="2198"/>
+          </w:tcPr>
+          <w:p>
+            <w:pPr>
+              <w:jc w:val="left"/>
+            </w:pPr>
+            <w:r>
+              <w:rPr>
+                <w:rFonts w:ascii="Times New Roman" w:hAnsi="Times New Roman"/>
+                <w:sz w:val="21"/>
+              </w:rPr>
+              <w:t>Customer</w:t>
+            </w:r>
+          </w:p>
+        </w:tc>
+        <w:tc>
+          <w:tcPr>
+            <w:tcW w:type="dxa" w:w="2198"/>
+          </w:tcPr>
+          <w:p>
+            <w:pPr>
+              <w:jc w:val="left"/>
+            </w:pPr>
+            <w:r>
+              <w:rPr>
+                <w:rFonts w:ascii="Times New Roman" w:hAnsi="Times New Roman"/>
+                <w:sz w:val="21"/>
+              </w:rPr>
+              <w:t>Lọc sản phẩm theo danh mục và từ khóa tên SP</w:t>
+            </w:r>
+          </w:p>
+        </w:tc>
+      </w:tr>
+      <w:tr>
+        <w:tc>
+          <w:tcPr>
+            <w:tcW w:type="dxa" w:w="2198"/>
+          </w:tcPr>
+          <w:p>
+            <w:pPr>
+              <w:jc w:val="center"/>
+            </w:pPr>
+            <w:r>
+              <w:rPr>
+                <w:rFonts w:ascii="Times New Roman" w:hAnsi="Times New Roman"/>
+                <w:sz w:val="21"/>
+              </w:rPr>
+              <w:t>UC07</w:t>
+            </w:r>
+          </w:p>
+        </w:tc>
+        <w:tc>
+          <w:tcPr>
+            <w:tcW w:type="dxa" w:w="2198"/>
+          </w:tcPr>
+          <w:p>
+            <w:pPr>
+              <w:jc w:val="left"/>
+            </w:pPr>
+            <w:r>
+              <w:rPr>
+                <w:rFonts w:ascii="Times New Roman" w:hAnsi="Times New Roman"/>
+                <w:sz w:val="21"/>
+              </w:rPr>
+              <w:t>Chọn biến thể màu/size</w:t>
+            </w:r>
+          </w:p>
+        </w:tc>
+        <w:tc>
+          <w:tcPr>
+            <w:tcW w:type="dxa" w:w="2198"/>
+          </w:tcPr>
+          <w:p>
+            <w:pPr>
+              <w:jc w:val="left"/>
+            </w:pPr>
+            <w:r>
+              <w:rPr>
+                <w:rFonts w:ascii="Times New Roman" w:hAnsi="Times New Roman"/>
+                <w:sz w:val="21"/>
+              </w:rPr>
+              <w:t>Customer</w:t>
+            </w:r>
+          </w:p>
+        </w:tc>
+        <w:tc>
+          <w:tcPr>
+            <w:tcW w:type="dxa" w:w="2198"/>
+          </w:tcPr>
+          <w:p>
+            <w:pPr>
+              <w:jc w:val="left"/>
+            </w:pPr>
+            <w:r>
+              <w:rPr>
+                <w:rFonts w:ascii="Times New Roman" w:hAnsi="Times New Roman"/>
+                <w:sz w:val="21"/>
+              </w:rPr>
+              <w:t>Khách hàng chọn màu sắc, kích cỡ trên trang chi tiết</w:t>
+            </w:r>
+          </w:p>
+        </w:tc>
+      </w:tr>
+      <w:tr>
+        <w:tc>
+          <w:tcPr>
+            <w:tcW w:type="dxa" w:w="2198"/>
+          </w:tcPr>
+          <w:p>
+            <w:pPr>
+              <w:jc w:val="center"/>
+            </w:pPr>
+            <w:r>
+              <w:rPr>
+                <w:rFonts w:ascii="Times New Roman" w:hAnsi="Times New Roman"/>
+                <w:sz w:val="21"/>
+              </w:rPr>
+              <w:t>UC08</w:t>
+            </w:r>
+          </w:p>
+        </w:tc>
+        <w:tc>
+          <w:tcPr>
+            <w:tcW w:type="dxa" w:w="2198"/>
+          </w:tcPr>
+          <w:p>
+            <w:pPr>
+              <w:jc w:val="left"/>
+            </w:pPr>
+            <w:r>
+              <w:rPr>
+                <w:rFonts w:ascii="Times New Roman" w:hAnsi="Times New Roman"/>
+                <w:sz w:val="21"/>
+              </w:rPr>
+              <w:t>Quản lý giỏ hàng</w:t>
+            </w:r>
+          </w:p>
+        </w:tc>
+        <w:tc>
+          <w:tcPr>
+            <w:tcW w:type="dxa" w:w="2198"/>
+          </w:tcPr>
+          <w:p>
+            <w:pPr>
+              <w:jc w:val="left"/>
+            </w:pPr>
+            <w:r>
+              <w:rPr>
+                <w:rFonts w:ascii="Times New Roman" w:hAnsi="Times New Roman"/>
+                <w:sz w:val="21"/>
+              </w:rPr>
+              <w:t>Customer</w:t>
+            </w:r>
+          </w:p>
+        </w:tc>
+        <w:tc>
+          <w:tcPr>
+            <w:tcW w:type="dxa" w:w="2198"/>
+          </w:tcPr>
+          <w:p>
+            <w:pPr>
+              <w:jc w:val="left"/>
+            </w:pPr>
+            <w:r>
+              <w:rPr>
+                <w:rFonts w:ascii="Times New Roman" w:hAnsi="Times New Roman"/>
+                <w:sz w:val="21"/>
+              </w:rPr>
+              <w:t>Thêm SP từ nhiều Shop, điều chỉnh số lượng giỏ</w:t>
+            </w:r>
+          </w:p>
+        </w:tc>
+      </w:tr>
+      <w:tr>
+        <w:tc>
+          <w:tcPr>
+            <w:tcW w:type="dxa" w:w="2198"/>
+          </w:tcPr>
+          <w:p>
+            <w:pPr>
+              <w:jc w:val="center"/>
+            </w:pPr>
+            <w:r>
+              <w:rPr>
+                <w:rFonts w:ascii="Times New Roman" w:hAnsi="Times New Roman"/>
+                <w:sz w:val="21"/>
+              </w:rPr>
+              <w:t>UC09</w:t>
+            </w:r>
+          </w:p>
+        </w:tc>
+        <w:tc>
+          <w:tcPr>
+            <w:tcW w:type="dxa" w:w="2198"/>
+          </w:tcPr>
+          <w:p>
+            <w:pPr>
+              <w:jc w:val="left"/>
+            </w:pPr>
+            <w:r>
+              <w:rPr>
+                <w:rFonts w:ascii="Times New Roman" w:hAnsi="Times New Roman"/>
+                <w:sz w:val="21"/>
+              </w:rPr>
+              <w:t>Đặt hàng COD &amp; Tách đơn</w:t>
+            </w:r>
+          </w:p>
+        </w:tc>
+        <w:tc>
+          <w:tcPr>
+            <w:tcW w:type="dxa" w:w="2198"/>
+          </w:tcPr>
+          <w:p>
+            <w:pPr>
+              <w:jc w:val="left"/>
+            </w:pPr>
+            <w:r>
+              <w:rPr>
+                <w:rFonts w:ascii="Times New Roman" w:hAnsi="Times New Roman"/>
+                <w:sz w:val="21"/>
+              </w:rPr>
+              <w:t>Customer</w:t>
+            </w:r>
+          </w:p>
+        </w:tc>
+        <w:tc>
+          <w:tcPr>
+            <w:tcW w:type="dxa" w:w="2198"/>
+          </w:tcPr>
+          <w:p>
+            <w:pPr>
+              <w:jc w:val="left"/>
+            </w:pPr>
+            <w:r>
+              <w:rPr>
+                <w:rFonts w:ascii="Times New Roman" w:hAnsi="Times New Roman"/>
+                <w:sz w:val="21"/>
+              </w:rPr>
+              <w:t>Tạo Order tổng và tự động phân tách OrderItem theo shop_id</w:t>
+            </w:r>
+          </w:p>
+        </w:tc>
+      </w:tr>
+      <w:tr>
+        <w:tc>
+          <w:tcPr>
+            <w:tcW w:type="dxa" w:w="2198"/>
+          </w:tcPr>
+          <w:p>
+            <w:pPr>
+              <w:jc w:val="center"/>
+            </w:pPr>
+            <w:r>
+              <w:rPr>
+                <w:rFonts w:ascii="Times New Roman" w:hAnsi="Times New Roman"/>
+                <w:sz w:val="21"/>
+              </w:rPr>
+              <w:t>UC10</w:t>
+            </w:r>
+          </w:p>
+        </w:tc>
+        <w:tc>
+          <w:tcPr>
+            <w:tcW w:type="dxa" w:w="2198"/>
+          </w:tcPr>
+          <w:p>
+            <w:pPr>
+              <w:jc w:val="left"/>
+            </w:pPr>
+            <w:r>
+              <w:rPr>
+                <w:rFonts w:ascii="Times New Roman" w:hAnsi="Times New Roman"/>
+                <w:sz w:val="21"/>
+              </w:rPr>
+              <w:t>Cập nhật trạng thái đơn</w:t>
+            </w:r>
+          </w:p>
+        </w:tc>
+        <w:tc>
+          <w:tcPr>
+            <w:tcW w:type="dxa" w:w="2198"/>
+          </w:tcPr>
+          <w:p>
+            <w:pPr>
+              <w:jc w:val="left"/>
+            </w:pPr>
+            <w:r>
+              <w:rPr>
+                <w:rFonts w:ascii="Times New Roman" w:hAnsi="Times New Roman"/>
+                <w:sz w:val="21"/>
+              </w:rPr>
+              <w:t>Vendor</w:t>
+            </w:r>
+          </w:p>
+        </w:tc>
+        <w:tc>
+          <w:tcPr>
+            <w:tcW w:type="dxa" w:w="2198"/>
+          </w:tcPr>
+          <w:p>
+            <w:pPr>
+              <w:jc w:val="left"/>
+            </w:pPr>
+            <w:r>
+              <w:rPr>
+                <w:rFonts w:ascii="Times New Roman" w:hAnsi="Times New Roman"/>
+                <w:sz w:val="21"/>
+              </w:rPr>
+              <w:t>Vendor cập nhật trạng thái đơn (Processing, Shipped, Delivered)</w:t>
+            </w:r>
+          </w:p>
+        </w:tc>
+      </w:tr>
+      <w:tr>
+        <w:tc>
+          <w:tcPr>
+            <w:tcW w:type="dxa" w:w="2198"/>
+          </w:tcPr>
+          <w:p>
+            <w:pPr>
+              <w:jc w:val="center"/>
+            </w:pPr>
+            <w:r>
+              <w:rPr>
+                <w:rFonts w:ascii="Times New Roman" w:hAnsi="Times New Roman"/>
+                <w:sz w:val="21"/>
+              </w:rPr>
+              <w:t>UC11</w:t>
+            </w:r>
+          </w:p>
+        </w:tc>
+        <w:tc>
+          <w:tcPr>
+            <w:tcW w:type="dxa" w:w="2198"/>
+          </w:tcPr>
+          <w:p>
+            <w:pPr>
+              <w:jc w:val="left"/>
+            </w:pPr>
+            <w:r>
+              <w:rPr>
+                <w:rFonts w:ascii="Times New Roman" w:hAnsi="Times New Roman"/>
+                <w:sz w:val="21"/>
+              </w:rPr>
+              <w:t>Viết đánh giá sản phẩm</w:t>
+            </w:r>
+          </w:p>
+        </w:tc>
+        <w:tc>
+          <w:tcPr>
+            <w:tcW w:type="dxa" w:w="2198"/>
+          </w:tcPr>
+          <w:p>
+            <w:pPr>
+              <w:jc w:val="left"/>
+            </w:pPr>
+            <w:r>
+              <w:rPr>
+                <w:rFonts w:ascii="Times New Roman" w:hAnsi="Times New Roman"/>
+                <w:sz w:val="21"/>
+              </w:rPr>
+              <w:t>Customer</w:t>
+            </w:r>
+          </w:p>
+        </w:tc>
+        <w:tc>
+          <w:tcPr>
+            <w:tcW w:type="dxa" w:w="2198"/>
+          </w:tcPr>
+          <w:p>
+            <w:pPr>
+              <w:jc w:val="left"/>
+            </w:pPr>
+            <w:r>
+              <w:rPr>
+                <w:rFonts w:ascii="Times New Roman" w:hAnsi="Times New Roman"/>
+                <w:sz w:val="21"/>
+              </w:rPr>
+              <w:t>Khách hàng gửi nhận xét và chấm sao 1-5 sao</w:t>
+            </w:r>
+          </w:p>
+        </w:tc>
+      </w:tr>
+      <w:tr>
+        <w:tc>
+          <w:tcPr>
+            <w:tcW w:type="dxa" w:w="2198"/>
+          </w:tcPr>
+          <w:p>
+            <w:pPr>
+              <w:jc w:val="center"/>
+            </w:pPr>
+            <w:r>
+              <w:rPr>
+                <w:rFonts w:ascii="Times New Roman" w:hAnsi="Times New Roman"/>
+                <w:sz w:val="21"/>
+              </w:rPr>
+              <w:t>UC12</w:t>
+            </w:r>
+          </w:p>
+        </w:tc>
+        <w:tc>
+          <w:tcPr>
+            <w:tcW w:type="dxa" w:w="2198"/>
+          </w:tcPr>
+          <w:p>
+            <w:pPr>
+              <w:jc w:val="left"/>
+            </w:pPr>
+            <w:r>
+              <w:rPr>
+                <w:rFonts w:ascii="Times New Roman" w:hAnsi="Times New Roman"/>
+                <w:sz w:val="21"/>
+              </w:rPr>
+              <w:t>Quản lý danh mục sàn</w:t>
+            </w:r>
+          </w:p>
+        </w:tc>
+        <w:tc>
+          <w:tcPr>
+            <w:tcW w:type="dxa" w:w="2198"/>
+          </w:tcPr>
+          <w:p>
+            <w:pPr>
+              <w:jc w:val="left"/>
+            </w:pPr>
+            <w:r>
+              <w:rPr>
+                <w:rFonts w:ascii="Times New Roman" w:hAnsi="Times New Roman"/>
+                <w:sz w:val="21"/>
+              </w:rPr>
+              <w:t>Admin</w:t>
+            </w:r>
+          </w:p>
+        </w:tc>
+        <w:tc>
+          <w:tcPr>
+            <w:tcW w:type="dxa" w:w="2198"/>
+          </w:tcPr>
+          <w:p>
+            <w:pPr>
+              <w:jc w:val="left"/>
+            </w:pPr>
+            <w:r>
+              <w:rPr>
+                <w:rFonts w:ascii="Times New Roman" w:hAnsi="Times New Roman"/>
+                <w:sz w:val="21"/>
+              </w:rPr>
+              <w:t>Admin tạo mới, chỉnh sửa các Category sản phẩm</w:t>
+            </w:r>
+          </w:p>
+        </w:tc>
+      </w:tr>
+      <w:tr>
+        <w:tc>
+          <w:tcPr>
+            <w:tcW w:type="dxa" w:w="2198"/>
+          </w:tcPr>
+          <w:p>
+            <w:pPr>
+              <w:jc w:val="center"/>
+            </w:pPr>
+            <w:r>
+              <w:rPr>
+                <w:rFonts w:ascii="Times New Roman" w:hAnsi="Times New Roman"/>
+                <w:sz w:val="21"/>
+              </w:rPr>
+              <w:t>UC13</w:t>
+            </w:r>
+          </w:p>
+        </w:tc>
+        <w:tc>
+          <w:tcPr>
+            <w:tcW w:type="dxa" w:w="2198"/>
+          </w:tcPr>
+          <w:p>
+            <w:pPr>
+              <w:jc w:val="left"/>
+            </w:pPr>
+            <w:r>
+              <w:rPr>
+                <w:rFonts w:ascii="Times New Roman" w:hAnsi="Times New Roman"/>
+                <w:sz w:val="21"/>
+              </w:rPr>
+              <w:t>Thống kê doanh thu sàn</w:t>
+            </w:r>
+          </w:p>
+        </w:tc>
+        <w:tc>
+          <w:tcPr>
+            <w:tcW w:type="dxa" w:w="2198"/>
+          </w:tcPr>
+          <w:p>
+            <w:pPr>
+              <w:jc w:val="left"/>
+            </w:pPr>
+            <w:r>
+              <w:rPr>
+                <w:rFonts w:ascii="Times New Roman" w:hAnsi="Times New Roman"/>
+                <w:sz w:val="21"/>
+              </w:rPr>
+              <w:t>Admin / Vendor</w:t>
+            </w:r>
+          </w:p>
+        </w:tc>
+        <w:tc>
+          <w:tcPr>
+            <w:tcW w:type="dxa" w:w="2198"/>
+          </w:tcPr>
+          <w:p>
+            <w:pPr>
+              <w:jc w:val="left"/>
+            </w:pPr>
+            <w:r>
+              <w:rPr>
+                <w:rFonts w:ascii="Times New Roman" w:hAnsi="Times New Roman"/>
+                <w:sz w:val="21"/>
+              </w:rPr>
+              <w:t>Hiển thị biểu đồ báo cáo tổng doanh thu và đơn hàng</w:t>
+            </w:r>
+          </w:p>
+        </w:tc>
+      </w:tr>
+    </w:tbl>
+    <w:tbl>
+      <w:tblPr>
+        <w:tblW w:type="auto" w:w="0"/>
+        <w:jc w:val="center"/>
+        <w:tblLook w:firstColumn="1" w:firstRow="1" w:lastColumn="0" w:lastRow="0" w:noHBand="0" w:noVBand="1" w:val="04A0"/>
+      </w:tblPr>
+      <w:tblGrid>
+        <w:gridCol w:w="1758"/>
+        <w:gridCol w:w="1758"/>
+        <w:gridCol w:w="1758"/>
+        <w:gridCol w:w="1758"/>
+        <w:gridCol w:w="1758"/>
+      </w:tblGrid>
+      <w:tr>
+        <w:tc>
+          <w:tcPr>
+            <w:tcW w:type="dxa" w:w="1758"/>
+            <w:shd w:fill="E2E8F0"/>
+          </w:tcPr>
+          <w:p>
+            <w:pPr>
+              <w:jc w:val="center"/>
+            </w:pPr>
+            <w:r>
+              <w:rPr>
+                <w:rFonts w:ascii="Times New Roman" w:hAnsi="Times New Roman"/>
+                <w:b/>
+                <w:sz w:val="22"/>
+              </w:rPr>
+              <w:t>ID</w:t>
+            </w:r>
+          </w:p>
+        </w:tc>
+        <w:tc>
+          <w:tcPr>
+            <w:tcW w:type="dxa" w:w="1758"/>
+            <w:shd w:fill="E2E8F0"/>
+          </w:tcPr>
+          <w:p>
+            <w:pPr>
+              <w:jc w:val="center"/>
+            </w:pPr>
+            <w:r>
+              <w:rPr>
+                <w:rFonts w:ascii="Times New Roman" w:hAnsi="Times New Roman"/>
+                <w:b/>
+                <w:sz w:val="22"/>
+              </w:rPr>
+              <w:t>Kịch bản kiểm thử</w:t>
+            </w:r>
+          </w:p>
+        </w:tc>
+        <w:tc>
+          <w:tcPr>
+            <w:tcW w:type="dxa" w:w="1758"/>
+            <w:shd w:fill="E2E8F0"/>
+          </w:tcPr>
+          <w:p>
+            <w:pPr>
+              <w:jc w:val="center"/>
+            </w:pPr>
+            <w:r>
+              <w:rPr>
+                <w:rFonts w:ascii="Times New Roman" w:hAnsi="Times New Roman"/>
+                <w:b/>
+                <w:sz w:val="22"/>
+              </w:rPr>
+              <w:t>Dữ liệu đầu vào</w:t>
+            </w:r>
+          </w:p>
+        </w:tc>
+        <w:tc>
+          <w:tcPr>
+            <w:tcW w:type="dxa" w:w="1758"/>
+            <w:shd w:fill="E2E8F0"/>
+          </w:tcPr>
+          <w:p>
+            <w:pPr>
+              <w:jc w:val="center"/>
+            </w:pPr>
+            <w:r>
+              <w:rPr>
+                <w:rFonts w:ascii="Times New Roman" w:hAnsi="Times New Roman"/>
+                <w:b/>
+                <w:sz w:val="22"/>
+              </w:rPr>
+              <w:t>Kết quả mong đợi</w:t>
+            </w:r>
+          </w:p>
+        </w:tc>
+        <w:tc>
+          <w:tcPr>
+            <w:tcW w:type="dxa" w:w="1758"/>
+            <w:shd w:fill="E2E8F0"/>
+          </w:tcPr>
+          <w:p>
+            <w:pPr>
+              <w:jc w:val="center"/>
+            </w:pPr>
+            <w:r>
+              <w:rPr>
+                <w:rFonts w:ascii="Times New Roman" w:hAnsi="Times New Roman"/>
+                <w:b/>
+                <w:sz w:val="22"/>
+              </w:rPr>
+              <w:t>Trạng thái</w:t>
+            </w:r>
+          </w:p>
+        </w:tc>
+      </w:tr>
+      <w:tr>
+        <w:tc>
+          <w:tcPr>
+            <w:tcW w:type="dxa" w:w="1758"/>
+          </w:tcPr>
+          <w:p>
+            <w:pPr>
+              <w:jc w:val="center"/>
+            </w:pPr>
+            <w:r>
+              <w:rPr>
+                <w:rFonts w:ascii="Times New Roman" w:hAnsi="Times New Roman"/>
+                <w:sz w:val="21"/>
+              </w:rPr>
+              <w:t>TC01</w:t>
+            </w:r>
+          </w:p>
+        </w:tc>
+        <w:tc>
+          <w:tcPr>
+            <w:tcW w:type="dxa" w:w="1758"/>
+          </w:tcPr>
+          <w:p>
+            <w:pPr>
+              <w:jc w:val="left"/>
+            </w:pPr>
+            <w:r>
+              <w:rPr>
+                <w:rFonts w:ascii="Times New Roman" w:hAnsi="Times New Roman"/>
+                <w:sz w:val="21"/>
+              </w:rPr>
+              <w:t>Admin đăng nhập hợp lệ</w:t>
+            </w:r>
+          </w:p>
+        </w:tc>
+        <w:tc>
+          <w:tcPr>
+            <w:tcW w:type="dxa" w:w="1758"/>
+          </w:tcPr>
+          <w:p>
+            <w:pPr>
+              <w:jc w:val="left"/>
+            </w:pPr>
+            <w:r>
+              <w:rPr>
+                <w:rFonts w:ascii="Times New Roman" w:hAnsi="Times New Roman"/>
+                <w:sz w:val="21"/>
+              </w:rPr>
+              <w:t>admin@gmail.com / 123456</w:t>
+            </w:r>
+          </w:p>
+        </w:tc>
+        <w:tc>
+          <w:tcPr>
+            <w:tcW w:type="dxa" w:w="1758"/>
+          </w:tcPr>
+          <w:p>
+            <w:pPr>
+              <w:jc w:val="left"/>
+            </w:pPr>
+            <w:r>
+              <w:rPr>
+                <w:rFonts w:ascii="Times New Roman" w:hAnsi="Times New Roman"/>
+                <w:sz w:val="21"/>
+              </w:rPr>
+              <w:t>Chuyển hướng /admin/dashboard</w:t>
+            </w:r>
+          </w:p>
+        </w:tc>
+        <w:tc>
+          <w:tcPr>
+            <w:tcW w:type="dxa" w:w="1758"/>
+          </w:tcPr>
+          <w:p>
+            <w:pPr>
+              <w:jc w:val="left"/>
+            </w:pPr>
+            <w:r>
+              <w:rPr>
+                <w:rFonts w:ascii="Times New Roman" w:hAnsi="Times New Roman"/>
+                <w:sz w:val="21"/>
+              </w:rPr>
+              <w:t>PASSED</w:t>
+            </w:r>
+          </w:p>
+        </w:tc>
+      </w:tr>
+      <w:tr>
+        <w:tc>
+          <w:tcPr>
+            <w:tcW w:type="dxa" w:w="1758"/>
+          </w:tcPr>
+          <w:p>
+            <w:pPr>
+              <w:jc w:val="center"/>
+            </w:pPr>
+            <w:r>
+              <w:rPr>
+                <w:rFonts w:ascii="Times New Roman" w:hAnsi="Times New Roman"/>
+                <w:sz w:val="21"/>
+              </w:rPr>
+              <w:t>TC02</w:t>
+            </w:r>
+          </w:p>
+        </w:tc>
+        <w:tc>
+          <w:tcPr>
+            <w:tcW w:type="dxa" w:w="1758"/>
+          </w:tcPr>
+          <w:p>
+            <w:pPr>
+              <w:jc w:val="left"/>
+            </w:pPr>
+            <w:r>
+              <w:rPr>
+                <w:rFonts w:ascii="Times New Roman" w:hAnsi="Times New Roman"/>
+                <w:sz w:val="21"/>
+              </w:rPr>
+              <w:t>Vendor đăng nhập hợp lệ</w:t>
+            </w:r>
+          </w:p>
+        </w:tc>
+        <w:tc>
+          <w:tcPr>
+            <w:tcW w:type="dxa" w:w="1758"/>
+          </w:tcPr>
+          <w:p>
+            <w:pPr>
+              <w:jc w:val="left"/>
+            </w:pPr>
+            <w:r>
+              <w:rPr>
+                <w:rFonts w:ascii="Times New Roman" w:hAnsi="Times New Roman"/>
+                <w:sz w:val="21"/>
+              </w:rPr>
+              <w:t>vendor@gmail.com / 123456</w:t>
+            </w:r>
+          </w:p>
+        </w:tc>
+        <w:tc>
+          <w:tcPr>
+            <w:tcW w:type="dxa" w:w="1758"/>
+          </w:tcPr>
+          <w:p>
+            <w:pPr>
+              <w:jc w:val="left"/>
+            </w:pPr>
+            <w:r>
+              <w:rPr>
+                <w:rFonts w:ascii="Times New Roman" w:hAnsi="Times New Roman"/>
+                <w:sz w:val="21"/>
+              </w:rPr>
+              <w:t>Chuyển hướng /vendor/dashboard</w:t>
+            </w:r>
+          </w:p>
+        </w:tc>
+        <w:tc>
+          <w:tcPr>
+            <w:tcW w:type="dxa" w:w="1758"/>
+          </w:tcPr>
+          <w:p>
+            <w:pPr>
+              <w:jc w:val="left"/>
+            </w:pPr>
+            <w:r>
+              <w:rPr>
+                <w:rFonts w:ascii="Times New Roman" w:hAnsi="Times New Roman"/>
+                <w:sz w:val="21"/>
+              </w:rPr>
+              <w:t>PASSED</w:t>
+            </w:r>
+          </w:p>
+        </w:tc>
+      </w:tr>
+      <w:tr>
+        <w:tc>
+          <w:tcPr>
+            <w:tcW w:type="dxa" w:w="1758"/>
+          </w:tcPr>
+          <w:p>
+            <w:pPr>
+              <w:jc w:val="center"/>
+            </w:pPr>
+            <w:r>
+              <w:rPr>
+                <w:rFonts w:ascii="Times New Roman" w:hAnsi="Times New Roman"/>
+                <w:sz w:val="21"/>
+              </w:rPr>
+              <w:t>TC03</w:t>
+            </w:r>
+          </w:p>
+        </w:tc>
+        <w:tc>
+          <w:tcPr>
+            <w:tcW w:type="dxa" w:w="1758"/>
+          </w:tcPr>
+          <w:p>
+            <w:pPr>
+              <w:jc w:val="left"/>
+            </w:pPr>
+            <w:r>
+              <w:rPr>
+                <w:rFonts w:ascii="Times New Roman" w:hAnsi="Times New Roman"/>
+                <w:sz w:val="21"/>
+              </w:rPr>
+              <w:t>Customer đăng nhập hợp lệ</w:t>
+            </w:r>
+          </w:p>
+        </w:tc>
+        <w:tc>
+          <w:tcPr>
+            <w:tcW w:type="dxa" w:w="1758"/>
+          </w:tcPr>
+          <w:p>
+            <w:pPr>
+              <w:jc w:val="left"/>
+            </w:pPr>
+            <w:r>
+              <w:rPr>
+                <w:rFonts w:ascii="Times New Roman" w:hAnsi="Times New Roman"/>
+                <w:sz w:val="21"/>
+              </w:rPr>
+              <w:t>customer@gmail.com / 123456</w:t>
+            </w:r>
+          </w:p>
+        </w:tc>
+        <w:tc>
+          <w:tcPr>
+            <w:tcW w:type="dxa" w:w="1758"/>
+          </w:tcPr>
+          <w:p>
+            <w:pPr>
+              <w:jc w:val="left"/>
+            </w:pPr>
+            <w:r>
+              <w:rPr>
+                <w:rFonts w:ascii="Times New Roman" w:hAnsi="Times New Roman"/>
+                <w:sz w:val="21"/>
+              </w:rPr>
+              <w:t>Chuyển hướng trang chủ /</w:t>
+            </w:r>
+          </w:p>
+        </w:tc>
+        <w:tc>
+          <w:tcPr>
+            <w:tcW w:type="dxa" w:w="1758"/>
+          </w:tcPr>
+          <w:p>
+            <w:pPr>
+              <w:jc w:val="left"/>
+            </w:pPr>
+            <w:r>
+              <w:rPr>
+                <w:rFonts w:ascii="Times New Roman" w:hAnsi="Times New Roman"/>
+                <w:sz w:val="21"/>
+              </w:rPr>
+              <w:t>PASSED</w:t>
+            </w:r>
+          </w:p>
+        </w:tc>
+      </w:tr>
+      <w:tr>
+        <w:tc>
+          <w:tcPr>
+            <w:tcW w:type="dxa" w:w="1758"/>
+          </w:tcPr>
+          <w:p>
+            <w:pPr>
+              <w:jc w:val="center"/>
+            </w:pPr>
+            <w:r>
+              <w:rPr>
+                <w:rFonts w:ascii="Times New Roman" w:hAnsi="Times New Roman"/>
+                <w:sz w:val="21"/>
+              </w:rPr>
+              <w:t>TC04</w:t>
+            </w:r>
+          </w:p>
+        </w:tc>
+        <w:tc>
+          <w:tcPr>
+            <w:tcW w:type="dxa" w:w="1758"/>
+          </w:tcPr>
+          <w:p>
+            <w:pPr>
+              <w:jc w:val="left"/>
+            </w:pPr>
+            <w:r>
+              <w:rPr>
+                <w:rFonts w:ascii="Times New Roman" w:hAnsi="Times New Roman"/>
+                <w:sz w:val="21"/>
+              </w:rPr>
+              <w:t>Nhập sai mật khẩu</w:t>
+            </w:r>
+          </w:p>
+        </w:tc>
+        <w:tc>
+          <w:tcPr>
+            <w:tcW w:type="dxa" w:w="1758"/>
+          </w:tcPr>
+          <w:p>
+            <w:pPr>
+              <w:jc w:val="left"/>
+            </w:pPr>
+            <w:r>
+              <w:rPr>
+                <w:rFonts w:ascii="Times New Roman" w:hAnsi="Times New Roman"/>
+                <w:sz w:val="21"/>
+              </w:rPr>
+              <w:t>customer@gmail.com / wrongpass</w:t>
+            </w:r>
+          </w:p>
+        </w:tc>
+        <w:tc>
+          <w:tcPr>
+            <w:tcW w:type="dxa" w:w="1758"/>
+          </w:tcPr>
+          <w:p>
+            <w:pPr>
+              <w:jc w:val="left"/>
+            </w:pPr>
+            <w:r>
+              <w:rPr>
+                <w:rFonts w:ascii="Times New Roman" w:hAnsi="Times New Roman"/>
+                <w:sz w:val="21"/>
+              </w:rPr>
+              <w:t>Báo lỗi Bad credentials</w:t>
+            </w:r>
+          </w:p>
+        </w:tc>
+        <w:tc>
+          <w:tcPr>
+            <w:tcW w:type="dxa" w:w="1758"/>
+          </w:tcPr>
+          <w:p>
+            <w:pPr>
+              <w:jc w:val="left"/>
+            </w:pPr>
+            <w:r>
+              <w:rPr>
+                <w:rFonts w:ascii="Times New Roman" w:hAnsi="Times New Roman"/>
+                <w:sz w:val="21"/>
+              </w:rPr>
+              <w:t>PASSED</w:t>
+            </w:r>
+          </w:p>
+        </w:tc>
+      </w:tr>
+      <w:tr>
+        <w:tc>
+          <w:tcPr>
+            <w:tcW w:type="dxa" w:w="1758"/>
+          </w:tcPr>
+          <w:p>
+            <w:pPr>
+              <w:jc w:val="center"/>
+            </w:pPr>
+            <w:r>
+              <w:rPr>
+                <w:rFonts w:ascii="Times New Roman" w:hAnsi="Times New Roman"/>
+                <w:sz w:val="21"/>
+              </w:rPr>
+              <w:t>TC05</w:t>
+            </w:r>
+          </w:p>
+        </w:tc>
+        <w:tc>
+          <w:tcPr>
+            <w:tcW w:type="dxa" w:w="1758"/>
+          </w:tcPr>
+          <w:p>
+            <w:pPr>
+              <w:jc w:val="left"/>
+            </w:pPr>
+            <w:r>
+              <w:rPr>
+                <w:rFonts w:ascii="Times New Roman" w:hAnsi="Times New Roman"/>
+                <w:sz w:val="21"/>
+              </w:rPr>
+              <w:t>Tài khoản không tồn tại</w:t>
+            </w:r>
+          </w:p>
+        </w:tc>
+        <w:tc>
+          <w:tcPr>
+            <w:tcW w:type="dxa" w:w="1758"/>
+          </w:tcPr>
+          <w:p>
+            <w:pPr>
+              <w:jc w:val="left"/>
+            </w:pPr>
+            <w:r>
+              <w:rPr>
+                <w:rFonts w:ascii="Times New Roman" w:hAnsi="Times New Roman"/>
+                <w:sz w:val="21"/>
+              </w:rPr>
+              <w:t>nobody@gmail.com / 123456</w:t>
+            </w:r>
+          </w:p>
+        </w:tc>
+        <w:tc>
+          <w:tcPr>
+            <w:tcW w:type="dxa" w:w="1758"/>
+          </w:tcPr>
+          <w:p>
+            <w:pPr>
+              <w:jc w:val="left"/>
+            </w:pPr>
+            <w:r>
+              <w:rPr>
+                <w:rFonts w:ascii="Times New Roman" w:hAnsi="Times New Roman"/>
+                <w:sz w:val="21"/>
+              </w:rPr>
+              <w:t>Báo lỗi tài khoản không tồn tại</w:t>
+            </w:r>
+          </w:p>
+        </w:tc>
+        <w:tc>
+          <w:tcPr>
+            <w:tcW w:type="dxa" w:w="1758"/>
+          </w:tcPr>
+          <w:p>
+            <w:pPr>
+              <w:jc w:val="left"/>
+            </w:pPr>
+            <w:r>
+              <w:rPr>
+                <w:rFonts w:ascii="Times New Roman" w:hAnsi="Times New Roman"/>
+                <w:sz w:val="21"/>
+              </w:rPr>
+              <w:t>PASSED</w:t>
+            </w:r>
+          </w:p>
+        </w:tc>
+      </w:tr>
+      <w:tr>
+        <w:tc>
+          <w:tcPr>
+            <w:tcW w:type="dxa" w:w="1758"/>
+          </w:tcPr>
+          <w:p>
+            <w:pPr>
+              <w:jc w:val="center"/>
+            </w:pPr>
+            <w:r>
+              <w:rPr>
+                <w:rFonts w:ascii="Times New Roman" w:hAnsi="Times New Roman"/>
+                <w:sz w:val="21"/>
+              </w:rPr>
+              <w:t>TC06</w:t>
+            </w:r>
+          </w:p>
+        </w:tc>
+        <w:tc>
+          <w:tcPr>
+            <w:tcW w:type="dxa" w:w="1758"/>
+          </w:tcPr>
+          <w:p>
+            <w:pPr>
+              <w:jc w:val="left"/>
+            </w:pPr>
+            <w:r>
+              <w:rPr>
+                <w:rFonts w:ascii="Times New Roman" w:hAnsi="Times New Roman"/>
+                <w:sz w:val="21"/>
+              </w:rPr>
+              <w:t>Để trống email/password</w:t>
+            </w:r>
+          </w:p>
+        </w:tc>
+        <w:tc>
+          <w:tcPr>
+            <w:tcW w:type="dxa" w:w="1758"/>
+          </w:tcPr>
+          <w:p>
+            <w:pPr>
+              <w:jc w:val="left"/>
+            </w:pPr>
+            <w:r>
+              <w:rPr>
+                <w:rFonts w:ascii="Times New Roman" w:hAnsi="Times New Roman"/>
+                <w:sz w:val="21"/>
+              </w:rPr>
+              <w:t>'' / ''</w:t>
+            </w:r>
+          </w:p>
+        </w:tc>
+        <w:tc>
+          <w:tcPr>
+            <w:tcW w:type="dxa" w:w="1758"/>
+          </w:tcPr>
+          <w:p>
+            <w:pPr>
+              <w:jc w:val="left"/>
+            </w:pPr>
+            <w:r>
+              <w:rPr>
+                <w:rFonts w:ascii="Times New Roman" w:hAnsi="Times New Roman"/>
+                <w:sz w:val="21"/>
+              </w:rPr>
+              <w:t>Hiển thị thông báo yêu cầu nhập thông tin</w:t>
+            </w:r>
+          </w:p>
+        </w:tc>
+        <w:tc>
+          <w:tcPr>
+            <w:tcW w:type="dxa" w:w="1758"/>
+          </w:tcPr>
+          <w:p>
+            <w:pPr>
+              <w:jc w:val="left"/>
+            </w:pPr>
+            <w:r>
+              <w:rPr>
+                <w:rFonts w:ascii="Times New Roman" w:hAnsi="Times New Roman"/>
+                <w:sz w:val="21"/>
+              </w:rPr>
+              <w:t>PASSED</w:t>
+            </w:r>
+          </w:p>
+        </w:tc>
+      </w:tr>
+    </w:tbl>
+    <w:tbl>
+      <w:tblPr>
+        <w:tblW w:type="auto" w:w="0"/>
+        <w:jc w:val="center"/>
+        <w:tblLook w:firstColumn="1" w:firstRow="1" w:lastColumn="0" w:lastRow="0" w:noHBand="0" w:noVBand="1" w:val="04A0"/>
+      </w:tblPr>
+      <w:tblGrid>
+        <w:gridCol w:w="1758"/>
+        <w:gridCol w:w="1758"/>
+        <w:gridCol w:w="1758"/>
+        <w:gridCol w:w="1758"/>
+        <w:gridCol w:w="1758"/>
+      </w:tblGrid>
+      <w:tr>
+        <w:tc>
+          <w:tcPr>
+            <w:tcW w:type="dxa" w:w="1758"/>
+            <w:shd w:fill="E2E8F0"/>
+          </w:tcPr>
+          <w:p>
+            <w:pPr>
+              <w:jc w:val="center"/>
+            </w:pPr>
+            <w:r>
+              <w:rPr>
+                <w:rFonts w:ascii="Times New Roman" w:hAnsi="Times New Roman"/>
+                <w:b/>
+                <w:sz w:val="22"/>
+              </w:rPr>
+              <w:t>ID</w:t>
+            </w:r>
+          </w:p>
+        </w:tc>
+        <w:tc>
+          <w:tcPr>
+            <w:tcW w:type="dxa" w:w="1758"/>
+            <w:shd w:fill="E2E8F0"/>
+          </w:tcPr>
+          <w:p>
+            <w:pPr>
+              <w:jc w:val="center"/>
+            </w:pPr>
+            <w:r>
+              <w:rPr>
+                <w:rFonts w:ascii="Times New Roman" w:hAnsi="Times New Roman"/>
+                <w:b/>
+                <w:sz w:val="22"/>
+              </w:rPr>
+              <w:t>Kịch bản kiểm thử</w:t>
+            </w:r>
+          </w:p>
+        </w:tc>
+        <w:tc>
+          <w:tcPr>
+            <w:tcW w:type="dxa" w:w="1758"/>
+            <w:shd w:fill="E2E8F0"/>
+          </w:tcPr>
+          <w:p>
+            <w:pPr>
+              <w:jc w:val="center"/>
+            </w:pPr>
+            <w:r>
+              <w:rPr>
+                <w:rFonts w:ascii="Times New Roman" w:hAnsi="Times New Roman"/>
+                <w:b/>
+                <w:sz w:val="22"/>
+              </w:rPr>
+              <w:t>Hành vi truy cập</w:t>
+            </w:r>
+          </w:p>
+        </w:tc>
+        <w:tc>
+          <w:tcPr>
+            <w:tcW w:type="dxa" w:w="1758"/>
+            <w:shd w:fill="E2E8F0"/>
+          </w:tcPr>
+          <w:p>
+            <w:pPr>
+              <w:jc w:val="center"/>
+            </w:pPr>
+            <w:r>
+              <w:rPr>
+                <w:rFonts w:ascii="Times New Roman" w:hAnsi="Times New Roman"/>
+                <w:b/>
+                <w:sz w:val="22"/>
+              </w:rPr>
+              <w:t>Kết quả mong đợi</w:t>
+            </w:r>
+          </w:p>
+        </w:tc>
+        <w:tc>
+          <w:tcPr>
+            <w:tcW w:type="dxa" w:w="1758"/>
+            <w:shd w:fill="E2E8F0"/>
+          </w:tcPr>
+          <w:p>
+            <w:pPr>
+              <w:jc w:val="center"/>
+            </w:pPr>
+            <w:r>
+              <w:rPr>
+                <w:rFonts w:ascii="Times New Roman" w:hAnsi="Times New Roman"/>
+                <w:b/>
+                <w:sz w:val="22"/>
+              </w:rPr>
+              <w:t>Trạng thái</w:t>
+            </w:r>
+          </w:p>
+        </w:tc>
+      </w:tr>
+      <w:tr>
+        <w:tc>
+          <w:tcPr>
+            <w:tcW w:type="dxa" w:w="1758"/>
+          </w:tcPr>
+          <w:p>
+            <w:pPr>
+              <w:jc w:val="center"/>
+            </w:pPr>
+            <w:r>
+              <w:rPr>
+                <w:rFonts w:ascii="Times New Roman" w:hAnsi="Times New Roman"/>
+                <w:sz w:val="21"/>
+              </w:rPr>
+              <w:t>TC07</w:t>
+            </w:r>
+          </w:p>
+        </w:tc>
+        <w:tc>
+          <w:tcPr>
+            <w:tcW w:type="dxa" w:w="1758"/>
+          </w:tcPr>
+          <w:p>
+            <w:pPr>
+              <w:jc w:val="left"/>
+            </w:pPr>
+            <w:r>
+              <w:rPr>
+                <w:rFonts w:ascii="Times New Roman" w:hAnsi="Times New Roman"/>
+                <w:sz w:val="21"/>
+              </w:rPr>
+              <w:t>Customer vào URL Admin</w:t>
+            </w:r>
+          </w:p>
+        </w:tc>
+        <w:tc>
+          <w:tcPr>
+            <w:tcW w:type="dxa" w:w="1758"/>
+          </w:tcPr>
+          <w:p>
+            <w:pPr>
+              <w:jc w:val="left"/>
+            </w:pPr>
+            <w:r>
+              <w:rPr>
+                <w:rFonts w:ascii="Times New Roman" w:hAnsi="Times New Roman"/>
+                <w:sz w:val="21"/>
+              </w:rPr>
+              <w:t>Customer truy cập /admin/users</w:t>
+            </w:r>
+          </w:p>
+        </w:tc>
+        <w:tc>
+          <w:tcPr>
+            <w:tcW w:type="dxa" w:w="1758"/>
+          </w:tcPr>
+          <w:p>
+            <w:pPr>
+              <w:jc w:val="left"/>
+            </w:pPr>
+            <w:r>
+              <w:rPr>
+                <w:rFonts w:ascii="Times New Roman" w:hAnsi="Times New Roman"/>
+                <w:sz w:val="21"/>
+              </w:rPr>
+              <w:t>Trả về lỗi HTTP 403 Forbidden</w:t>
+            </w:r>
+          </w:p>
+        </w:tc>
+        <w:tc>
+          <w:tcPr>
+            <w:tcW w:type="dxa" w:w="1758"/>
+          </w:tcPr>
+          <w:p>
+            <w:pPr>
+              <w:jc w:val="left"/>
+            </w:pPr>
+            <w:r>
+              <w:rPr>
+                <w:rFonts w:ascii="Times New Roman" w:hAnsi="Times New Roman"/>
+                <w:sz w:val="21"/>
+              </w:rPr>
+              <w:t>PASSED</w:t>
+            </w:r>
+          </w:p>
+        </w:tc>
+      </w:tr>
+      <w:tr>
+        <w:tc>
+          <w:tcPr>
+            <w:tcW w:type="dxa" w:w="1758"/>
+          </w:tcPr>
+          <w:p>
+            <w:pPr>
+              <w:jc w:val="center"/>
+            </w:pPr>
+            <w:r>
+              <w:rPr>
+                <w:rFonts w:ascii="Times New Roman" w:hAnsi="Times New Roman"/>
+                <w:sz w:val="21"/>
+              </w:rPr>
+              <w:t>TC08</w:t>
+            </w:r>
+          </w:p>
+        </w:tc>
+        <w:tc>
+          <w:tcPr>
+            <w:tcW w:type="dxa" w:w="1758"/>
+          </w:tcPr>
+          <w:p>
+            <w:pPr>
+              <w:jc w:val="left"/>
+            </w:pPr>
+            <w:r>
+              <w:rPr>
+                <w:rFonts w:ascii="Times New Roman" w:hAnsi="Times New Roman"/>
+                <w:sz w:val="21"/>
+              </w:rPr>
+              <w:t>Customer vào URL Vendor</w:t>
+            </w:r>
+          </w:p>
+        </w:tc>
+        <w:tc>
+          <w:tcPr>
+            <w:tcW w:type="dxa" w:w="1758"/>
+          </w:tcPr>
+          <w:p>
+            <w:pPr>
+              <w:jc w:val="left"/>
+            </w:pPr>
+            <w:r>
+              <w:rPr>
+                <w:rFonts w:ascii="Times New Roman" w:hAnsi="Times New Roman"/>
+                <w:sz w:val="21"/>
+              </w:rPr>
+              <w:t>Customer truy cập /vendor/products</w:t>
+            </w:r>
+          </w:p>
+        </w:tc>
+        <w:tc>
+          <w:tcPr>
+            <w:tcW w:type="dxa" w:w="1758"/>
+          </w:tcPr>
+          <w:p>
+            <w:pPr>
+              <w:jc w:val="left"/>
+            </w:pPr>
+            <w:r>
+              <w:rPr>
+                <w:rFonts w:ascii="Times New Roman" w:hAnsi="Times New Roman"/>
+                <w:sz w:val="21"/>
+              </w:rPr>
+              <w:t>Trả về lỗi HTTP 403 Forbidden</w:t>
+            </w:r>
+          </w:p>
+        </w:tc>
+        <w:tc>
+          <w:tcPr>
+            <w:tcW w:type="dxa" w:w="1758"/>
+          </w:tcPr>
+          <w:p>
+            <w:pPr>
+              <w:jc w:val="left"/>
+            </w:pPr>
+            <w:r>
+              <w:rPr>
+                <w:rFonts w:ascii="Times New Roman" w:hAnsi="Times New Roman"/>
+                <w:sz w:val="21"/>
+              </w:rPr>
+              <w:t>PASSED</w:t>
+            </w:r>
+          </w:p>
+        </w:tc>
+      </w:tr>
+      <w:tr>
+        <w:tc>
+          <w:tcPr>
+            <w:tcW w:type="dxa" w:w="1758"/>
+          </w:tcPr>
+          <w:p>
+            <w:pPr>
+              <w:jc w:val="center"/>
+            </w:pPr>
+            <w:r>
+              <w:rPr>
+                <w:rFonts w:ascii="Times New Roman" w:hAnsi="Times New Roman"/>
+                <w:sz w:val="21"/>
+              </w:rPr>
+              <w:t>TC09</w:t>
+            </w:r>
+          </w:p>
+        </w:tc>
+        <w:tc>
+          <w:tcPr>
+            <w:tcW w:type="dxa" w:w="1758"/>
+          </w:tcPr>
+          <w:p>
+            <w:pPr>
+              <w:jc w:val="left"/>
+            </w:pPr>
+            <w:r>
+              <w:rPr>
+                <w:rFonts w:ascii="Times New Roman" w:hAnsi="Times New Roman"/>
+                <w:sz w:val="21"/>
+              </w:rPr>
+              <w:t>Vendor vào URL Admin</w:t>
+            </w:r>
+          </w:p>
+        </w:tc>
+        <w:tc>
+          <w:tcPr>
+            <w:tcW w:type="dxa" w:w="1758"/>
+          </w:tcPr>
+          <w:p>
+            <w:pPr>
+              <w:jc w:val="left"/>
+            </w:pPr>
+            <w:r>
+              <w:rPr>
+                <w:rFonts w:ascii="Times New Roman" w:hAnsi="Times New Roman"/>
+                <w:sz w:val="21"/>
+              </w:rPr>
+              <w:t>Vendor truy cập /admin/settings</w:t>
+            </w:r>
+          </w:p>
+        </w:tc>
+        <w:tc>
+          <w:tcPr>
+            <w:tcW w:type="dxa" w:w="1758"/>
+          </w:tcPr>
+          <w:p>
+            <w:pPr>
+              <w:jc w:val="left"/>
+            </w:pPr>
+            <w:r>
+              <w:rPr>
+                <w:rFonts w:ascii="Times New Roman" w:hAnsi="Times New Roman"/>
+                <w:sz w:val="21"/>
+              </w:rPr>
+              <w:t>Trả về lỗi HTTP 403 Forbidden</w:t>
+            </w:r>
+          </w:p>
+        </w:tc>
+        <w:tc>
+          <w:tcPr>
+            <w:tcW w:type="dxa" w:w="1758"/>
+          </w:tcPr>
+          <w:p>
+            <w:pPr>
+              <w:jc w:val="left"/>
+            </w:pPr>
+            <w:r>
+              <w:rPr>
+                <w:rFonts w:ascii="Times New Roman" w:hAnsi="Times New Roman"/>
+                <w:sz w:val="21"/>
+              </w:rPr>
+              <w:t>PASSED</w:t>
+            </w:r>
+          </w:p>
+        </w:tc>
+      </w:tr>
+      <w:tr>
+        <w:tc>
+          <w:tcPr>
+            <w:tcW w:type="dxa" w:w="1758"/>
+          </w:tcPr>
+          <w:p>
+            <w:pPr>
+              <w:jc w:val="center"/>
+            </w:pPr>
+            <w:r>
+              <w:rPr>
+                <w:rFonts w:ascii="Times New Roman" w:hAnsi="Times New Roman"/>
+                <w:sz w:val="21"/>
+              </w:rPr>
+              <w:t>TC10</w:t>
+            </w:r>
+          </w:p>
+        </w:tc>
+        <w:tc>
+          <w:tcPr>
+            <w:tcW w:type="dxa" w:w="1758"/>
+          </w:tcPr>
+          <w:p>
+            <w:pPr>
+              <w:jc w:val="left"/>
+            </w:pPr>
+            <w:r>
+              <w:rPr>
+                <w:rFonts w:ascii="Times New Roman" w:hAnsi="Times New Roman"/>
+                <w:sz w:val="21"/>
+              </w:rPr>
+              <w:t>Khách vãng lai chưa login</w:t>
+            </w:r>
+          </w:p>
+        </w:tc>
+        <w:tc>
+          <w:tcPr>
+            <w:tcW w:type="dxa" w:w="1758"/>
+          </w:tcPr>
+          <w:p>
+            <w:pPr>
+              <w:jc w:val="left"/>
+            </w:pPr>
+            <w:r>
+              <w:rPr>
+                <w:rFonts w:ascii="Times New Roman" w:hAnsi="Times New Roman"/>
+                <w:sz w:val="21"/>
+              </w:rPr>
+              <w:t>Khách vào /cart/checkout</w:t>
+            </w:r>
+          </w:p>
+        </w:tc>
+        <w:tc>
+          <w:tcPr>
+            <w:tcW w:type="dxa" w:w="1758"/>
+          </w:tcPr>
+          <w:p>
+            <w:pPr>
+              <w:jc w:val="left"/>
+            </w:pPr>
+            <w:r>
+              <w:rPr>
+                <w:rFonts w:ascii="Times New Roman" w:hAnsi="Times New Roman"/>
+                <w:sz w:val="21"/>
+              </w:rPr>
+              <w:t>Chuyển hướng về trang /login</w:t>
+            </w:r>
+          </w:p>
+        </w:tc>
+        <w:tc>
+          <w:tcPr>
+            <w:tcW w:type="dxa" w:w="1758"/>
+          </w:tcPr>
+          <w:p>
+            <w:pPr>
+              <w:jc w:val="left"/>
+            </w:pPr>
+            <w:r>
+              <w:rPr>
+                <w:rFonts w:ascii="Times New Roman" w:hAnsi="Times New Roman"/>
+                <w:sz w:val="21"/>
+              </w:rPr>
+              <w:t>PASSED</w:t>
+            </w:r>
+          </w:p>
+        </w:tc>
+      </w:tr>
+    </w:tbl>
+    <w:tbl>
+      <w:tblPr>
+        <w:tblW w:type="auto" w:w="0"/>
+        <w:jc w:val="center"/>
+        <w:tblLook w:firstColumn="1" w:firstRow="1" w:lastColumn="0" w:lastRow="0" w:noHBand="0" w:noVBand="1" w:val="04A0"/>
+      </w:tblPr>
+      <w:tblGrid>
+        <w:gridCol w:w="1758"/>
+        <w:gridCol w:w="1758"/>
+        <w:gridCol w:w="1758"/>
+        <w:gridCol w:w="1758"/>
+        <w:gridCol w:w="1758"/>
+      </w:tblGrid>
+      <w:tr>
+        <w:tc>
+          <w:tcPr>
+            <w:tcW w:type="dxa" w:w="1758"/>
+            <w:shd w:fill="E2E8F0"/>
+          </w:tcPr>
+          <w:p>
+            <w:pPr>
+              <w:jc w:val="center"/>
+            </w:pPr>
+            <w:r>
+              <w:rPr>
+                <w:rFonts w:ascii="Times New Roman" w:hAnsi="Times New Roman"/>
+                <w:b/>
+                <w:sz w:val="22"/>
+              </w:rPr>
+              <w:t>ID</w:t>
+            </w:r>
+          </w:p>
+        </w:tc>
+        <w:tc>
+          <w:tcPr>
+            <w:tcW w:type="dxa" w:w="1758"/>
+            <w:shd w:fill="E2E8F0"/>
+          </w:tcPr>
+          <w:p>
+            <w:pPr>
+              <w:jc w:val="center"/>
+            </w:pPr>
+            <w:r>
+              <w:rPr>
+                <w:rFonts w:ascii="Times New Roman" w:hAnsi="Times New Roman"/>
+                <w:b/>
+                <w:sz w:val="22"/>
+              </w:rPr>
+              <w:t>Kịch bản kiểm thử</w:t>
+            </w:r>
+          </w:p>
+        </w:tc>
+        <w:tc>
+          <w:tcPr>
+            <w:tcW w:type="dxa" w:w="1758"/>
+            <w:shd w:fill="E2E8F0"/>
+          </w:tcPr>
+          <w:p>
+            <w:pPr>
+              <w:jc w:val="center"/>
+            </w:pPr>
+            <w:r>
+              <w:rPr>
+                <w:rFonts w:ascii="Times New Roman" w:hAnsi="Times New Roman"/>
+                <w:b/>
+                <w:sz w:val="22"/>
+              </w:rPr>
+              <w:t>Dữ liệu đầu vào</w:t>
+            </w:r>
+          </w:p>
+        </w:tc>
+        <w:tc>
+          <w:tcPr>
+            <w:tcW w:type="dxa" w:w="1758"/>
+            <w:shd w:fill="E2E8F0"/>
+          </w:tcPr>
+          <w:p>
+            <w:pPr>
+              <w:jc w:val="center"/>
+            </w:pPr>
+            <w:r>
+              <w:rPr>
+                <w:rFonts w:ascii="Times New Roman" w:hAnsi="Times New Roman"/>
+                <w:b/>
+                <w:sz w:val="22"/>
+              </w:rPr>
+              <w:t>Kết quả mong đợi</w:t>
+            </w:r>
+          </w:p>
+        </w:tc>
+        <w:tc>
+          <w:tcPr>
+            <w:tcW w:type="dxa" w:w="1758"/>
+            <w:shd w:fill="E2E8F0"/>
+          </w:tcPr>
+          <w:p>
+            <w:pPr>
+              <w:jc w:val="center"/>
+            </w:pPr>
+            <w:r>
+              <w:rPr>
+                <w:rFonts w:ascii="Times New Roman" w:hAnsi="Times New Roman"/>
+                <w:b/>
+                <w:sz w:val="22"/>
+              </w:rPr>
+              <w:t>Trạng thái</w:t>
+            </w:r>
+          </w:p>
+        </w:tc>
+      </w:tr>
+      <w:tr>
+        <w:tc>
+          <w:tcPr>
+            <w:tcW w:type="dxa" w:w="1758"/>
+          </w:tcPr>
+          <w:p>
+            <w:pPr>
+              <w:jc w:val="center"/>
+            </w:pPr>
+            <w:r>
+              <w:rPr>
+                <w:rFonts w:ascii="Times New Roman" w:hAnsi="Times New Roman"/>
+                <w:sz w:val="21"/>
+              </w:rPr>
+              <w:t>TC11</w:t>
+            </w:r>
+          </w:p>
+        </w:tc>
+        <w:tc>
+          <w:tcPr>
+            <w:tcW w:type="dxa" w:w="1758"/>
+          </w:tcPr>
+          <w:p>
+            <w:pPr>
+              <w:jc w:val="left"/>
+            </w:pPr>
+            <w:r>
+              <w:rPr>
+                <w:rFonts w:ascii="Times New Roman" w:hAnsi="Times New Roman"/>
+                <w:sz w:val="21"/>
+              </w:rPr>
+              <w:t>Vendor thêm sản phẩm mới</w:t>
+            </w:r>
+          </w:p>
+        </w:tc>
+        <w:tc>
+          <w:tcPr>
+            <w:tcW w:type="dxa" w:w="1758"/>
+          </w:tcPr>
+          <w:p>
+            <w:pPr>
+              <w:jc w:val="left"/>
+            </w:pPr>
+            <w:r>
+              <w:rPr>
+                <w:rFonts w:ascii="Times New Roman" w:hAnsi="Times New Roman"/>
+                <w:sz w:val="21"/>
+              </w:rPr>
+              <w:t>Tên, Giá 500k, Kho 10, Gallery</w:t>
+            </w:r>
+          </w:p>
+        </w:tc>
+        <w:tc>
+          <w:tcPr>
+            <w:tcW w:type="dxa" w:w="1758"/>
+          </w:tcPr>
+          <w:p>
+            <w:pPr>
+              <w:jc w:val="left"/>
+            </w:pPr>
+            <w:r>
+              <w:rPr>
+                <w:rFonts w:ascii="Times New Roman" w:hAnsi="Times New Roman"/>
+                <w:sz w:val="21"/>
+              </w:rPr>
+              <w:t>Thêm sản phẩm thành công vào MySQL</w:t>
+            </w:r>
+          </w:p>
+        </w:tc>
+        <w:tc>
+          <w:tcPr>
+            <w:tcW w:type="dxa" w:w="1758"/>
+          </w:tcPr>
+          <w:p>
+            <w:pPr>
+              <w:jc w:val="left"/>
+            </w:pPr>
+            <w:r>
+              <w:rPr>
+                <w:rFonts w:ascii="Times New Roman" w:hAnsi="Times New Roman"/>
+                <w:sz w:val="21"/>
+              </w:rPr>
+              <w:t>PASSED</w:t>
+            </w:r>
+          </w:p>
+        </w:tc>
+      </w:tr>
+      <w:tr>
+        <w:tc>
+          <w:tcPr>
+            <w:tcW w:type="dxa" w:w="1758"/>
+          </w:tcPr>
+          <w:p>
+            <w:pPr>
+              <w:jc w:val="center"/>
+            </w:pPr>
+            <w:r>
+              <w:rPr>
+                <w:rFonts w:ascii="Times New Roman" w:hAnsi="Times New Roman"/>
+                <w:sz w:val="21"/>
+              </w:rPr>
+              <w:t>TC12</w:t>
+            </w:r>
+          </w:p>
+        </w:tc>
+        <w:tc>
+          <w:tcPr>
+            <w:tcW w:type="dxa" w:w="1758"/>
+          </w:tcPr>
+          <w:p>
+            <w:pPr>
+              <w:jc w:val="left"/>
+            </w:pPr>
+            <w:r>
+              <w:rPr>
+                <w:rFonts w:ascii="Times New Roman" w:hAnsi="Times New Roman"/>
+                <w:sz w:val="21"/>
+              </w:rPr>
+              <w:t>Nhập giá âm</w:t>
+            </w:r>
+          </w:p>
+        </w:tc>
+        <w:tc>
+          <w:tcPr>
+            <w:tcW w:type="dxa" w:w="1758"/>
+          </w:tcPr>
+          <w:p>
+            <w:pPr>
+              <w:jc w:val="left"/>
+            </w:pPr>
+            <w:r>
+              <w:rPr>
+                <w:rFonts w:ascii="Times New Roman" w:hAnsi="Times New Roman"/>
+                <w:sz w:val="21"/>
+              </w:rPr>
+              <w:t>Giá = -100k</w:t>
+            </w:r>
+          </w:p>
+        </w:tc>
+        <w:tc>
+          <w:tcPr>
+            <w:tcW w:type="dxa" w:w="1758"/>
+          </w:tcPr>
+          <w:p>
+            <w:pPr>
+              <w:jc w:val="left"/>
+            </w:pPr>
+            <w:r>
+              <w:rPr>
+                <w:rFonts w:ascii="Times New Roman" w:hAnsi="Times New Roman"/>
+                <w:sz w:val="21"/>
+              </w:rPr>
+              <w:t>Báo lỗi giá sản phẩm phải &gt; 0</w:t>
+            </w:r>
+          </w:p>
+        </w:tc>
+        <w:tc>
+          <w:tcPr>
+            <w:tcW w:type="dxa" w:w="1758"/>
+          </w:tcPr>
+          <w:p>
+            <w:pPr>
+              <w:jc w:val="left"/>
+            </w:pPr>
+            <w:r>
+              <w:rPr>
+                <w:rFonts w:ascii="Times New Roman" w:hAnsi="Times New Roman"/>
+                <w:sz w:val="21"/>
+              </w:rPr>
+              <w:t>PASSED</w:t>
+            </w:r>
+          </w:p>
+        </w:tc>
+      </w:tr>
+      <w:tr>
+        <w:tc>
+          <w:tcPr>
+            <w:tcW w:type="dxa" w:w="1758"/>
+          </w:tcPr>
+          <w:p>
+            <w:pPr>
+              <w:jc w:val="center"/>
+            </w:pPr>
+            <w:r>
+              <w:rPr>
+                <w:rFonts w:ascii="Times New Roman" w:hAnsi="Times New Roman"/>
+                <w:sz w:val="21"/>
+              </w:rPr>
+              <w:t>TC13</w:t>
+            </w:r>
+          </w:p>
+        </w:tc>
+        <w:tc>
+          <w:tcPr>
+            <w:tcW w:type="dxa" w:w="1758"/>
+          </w:tcPr>
+          <w:p>
+            <w:pPr>
+              <w:jc w:val="left"/>
+            </w:pPr>
+            <w:r>
+              <w:rPr>
+                <w:rFonts w:ascii="Times New Roman" w:hAnsi="Times New Roman"/>
+                <w:sz w:val="21"/>
+              </w:rPr>
+              <w:t>Chỉnh sửa giá sản phẩm</w:t>
+            </w:r>
+          </w:p>
+        </w:tc>
+        <w:tc>
+          <w:tcPr>
+            <w:tcW w:type="dxa" w:w="1758"/>
+          </w:tcPr>
+          <w:p>
+            <w:pPr>
+              <w:jc w:val="left"/>
+            </w:pPr>
+            <w:r>
+              <w:rPr>
+                <w:rFonts w:ascii="Times New Roman" w:hAnsi="Times New Roman"/>
+                <w:sz w:val="21"/>
+              </w:rPr>
+              <w:t>Cập nhật Giá = 450k</w:t>
+            </w:r>
+          </w:p>
+        </w:tc>
+        <w:tc>
+          <w:tcPr>
+            <w:tcW w:type="dxa" w:w="1758"/>
+          </w:tcPr>
+          <w:p>
+            <w:pPr>
+              <w:jc w:val="left"/>
+            </w:pPr>
+            <w:r>
+              <w:rPr>
+                <w:rFonts w:ascii="Times New Roman" w:hAnsi="Times New Roman"/>
+                <w:sz w:val="21"/>
+              </w:rPr>
+              <w:t>CSDL lưu thông tin giá mới</w:t>
+            </w:r>
+          </w:p>
+        </w:tc>
+        <w:tc>
+          <w:tcPr>
+            <w:tcW w:type="dxa" w:w="1758"/>
+          </w:tcPr>
+          <w:p>
+            <w:pPr>
+              <w:jc w:val="left"/>
+            </w:pPr>
+            <w:r>
+              <w:rPr>
+                <w:rFonts w:ascii="Times New Roman" w:hAnsi="Times New Roman"/>
+                <w:sz w:val="21"/>
+              </w:rPr>
+              <w:t>PASSED</w:t>
+            </w:r>
+          </w:p>
+        </w:tc>
+      </w:tr>
+      <w:tr>
+        <w:tc>
+          <w:tcPr>
+            <w:tcW w:type="dxa" w:w="1758"/>
+          </w:tcPr>
+          <w:p>
+            <w:pPr>
+              <w:jc w:val="center"/>
+            </w:pPr>
+            <w:r>
+              <w:rPr>
+                <w:rFonts w:ascii="Times New Roman" w:hAnsi="Times New Roman"/>
+                <w:sz w:val="21"/>
+              </w:rPr>
+              <w:t>TC14</w:t>
+            </w:r>
+          </w:p>
+        </w:tc>
+        <w:tc>
+          <w:tcPr>
+            <w:tcW w:type="dxa" w:w="1758"/>
+          </w:tcPr>
+          <w:p>
+            <w:pPr>
+              <w:jc w:val="left"/>
+            </w:pPr>
+            <w:r>
+              <w:rPr>
+                <w:rFonts w:ascii="Times New Roman" w:hAnsi="Times New Roman"/>
+                <w:sz w:val="21"/>
+              </w:rPr>
+              <w:t>Ẩn sản phẩm</w:t>
+            </w:r>
+          </w:p>
+        </w:tc>
+        <w:tc>
+          <w:tcPr>
+            <w:tcW w:type="dxa" w:w="1758"/>
+          </w:tcPr>
+          <w:p>
+            <w:pPr>
+              <w:jc w:val="left"/>
+            </w:pPr>
+            <w:r>
+              <w:rPr>
+                <w:rFonts w:ascii="Times New Roman" w:hAnsi="Times New Roman"/>
+                <w:sz w:val="21"/>
+              </w:rPr>
+              <w:t>Chuyển status = INACTIVE</w:t>
+            </w:r>
+          </w:p>
+        </w:tc>
+        <w:tc>
+          <w:tcPr>
+            <w:tcW w:type="dxa" w:w="1758"/>
+          </w:tcPr>
+          <w:p>
+            <w:pPr>
+              <w:jc w:val="left"/>
+            </w:pPr>
+            <w:r>
+              <w:rPr>
+                <w:rFonts w:ascii="Times New Roman" w:hAnsi="Times New Roman"/>
+                <w:sz w:val="21"/>
+              </w:rPr>
+              <w:t>Sản phẩm ẩn khỏi giao diện mua hàng</w:t>
+            </w:r>
+          </w:p>
+        </w:tc>
+        <w:tc>
+          <w:tcPr>
+            <w:tcW w:type="dxa" w:w="1758"/>
+          </w:tcPr>
+          <w:p>
+            <w:pPr>
+              <w:jc w:val="left"/>
+            </w:pPr>
+            <w:r>
+              <w:rPr>
+                <w:rFonts w:ascii="Times New Roman" w:hAnsi="Times New Roman"/>
+                <w:sz w:val="21"/>
+              </w:rPr>
+              <w:t>PASSED</w:t>
+            </w:r>
+          </w:p>
+        </w:tc>
+      </w:tr>
+    </w:tbl>
+    <w:tbl>
+      <w:tblPr>
+        <w:tblW w:type="auto" w:w="0"/>
+        <w:jc w:val="center"/>
+        <w:tblLook w:firstColumn="1" w:firstRow="1" w:lastColumn="0" w:lastRow="0" w:noHBand="0" w:noVBand="1" w:val="04A0"/>
+      </w:tblPr>
+      <w:tblGrid>
+        <w:gridCol w:w="1758"/>
+        <w:gridCol w:w="1758"/>
+        <w:gridCol w:w="1758"/>
+        <w:gridCol w:w="1758"/>
+        <w:gridCol w:w="1758"/>
+      </w:tblGrid>
+      <w:tr>
+        <w:tc>
+          <w:tcPr>
+            <w:tcW w:type="dxa" w:w="1758"/>
+            <w:shd w:fill="E2E8F0"/>
+          </w:tcPr>
+          <w:p>
+            <w:pPr>
+              <w:jc w:val="center"/>
+            </w:pPr>
+            <w:r>
+              <w:rPr>
+                <w:rFonts w:ascii="Times New Roman" w:hAnsi="Times New Roman"/>
+                <w:b/>
+                <w:sz w:val="22"/>
+              </w:rPr>
+              <w:t>ID</w:t>
+            </w:r>
+          </w:p>
+        </w:tc>
+        <w:tc>
+          <w:tcPr>
+            <w:tcW w:type="dxa" w:w="1758"/>
+            <w:shd w:fill="E2E8F0"/>
+          </w:tcPr>
+          <w:p>
+            <w:pPr>
+              <w:jc w:val="center"/>
+            </w:pPr>
+            <w:r>
+              <w:rPr>
+                <w:rFonts w:ascii="Times New Roman" w:hAnsi="Times New Roman"/>
+                <w:b/>
+                <w:sz w:val="22"/>
+              </w:rPr>
+              <w:t>Kịch bản kiểm thử</w:t>
+            </w:r>
+          </w:p>
+        </w:tc>
+        <w:tc>
+          <w:tcPr>
+            <w:tcW w:type="dxa" w:w="1758"/>
+            <w:shd w:fill="E2E8F0"/>
+          </w:tcPr>
+          <w:p>
+            <w:pPr>
+              <w:jc w:val="center"/>
+            </w:pPr>
+            <w:r>
+              <w:rPr>
+                <w:rFonts w:ascii="Times New Roman" w:hAnsi="Times New Roman"/>
+                <w:b/>
+                <w:sz w:val="22"/>
+              </w:rPr>
+              <w:t>Dữ liệu đầu vào</w:t>
+            </w:r>
+          </w:p>
+        </w:tc>
+        <w:tc>
+          <w:tcPr>
+            <w:tcW w:type="dxa" w:w="1758"/>
+            <w:shd w:fill="E2E8F0"/>
+          </w:tcPr>
+          <w:p>
+            <w:pPr>
+              <w:jc w:val="center"/>
+            </w:pPr>
+            <w:r>
+              <w:rPr>
+                <w:rFonts w:ascii="Times New Roman" w:hAnsi="Times New Roman"/>
+                <w:b/>
+                <w:sz w:val="22"/>
+              </w:rPr>
+              <w:t>Kết quả mong đợi</w:t>
+            </w:r>
+          </w:p>
+        </w:tc>
+        <w:tc>
+          <w:tcPr>
+            <w:tcW w:type="dxa" w:w="1758"/>
+            <w:shd w:fill="E2E8F0"/>
+          </w:tcPr>
+          <w:p>
+            <w:pPr>
+              <w:jc w:val="center"/>
+            </w:pPr>
+            <w:r>
+              <w:rPr>
+                <w:rFonts w:ascii="Times New Roman" w:hAnsi="Times New Roman"/>
+                <w:b/>
+                <w:sz w:val="22"/>
+              </w:rPr>
+              <w:t>Trạng thái</w:t>
+            </w:r>
+          </w:p>
+        </w:tc>
+      </w:tr>
+      <w:tr>
+        <w:tc>
+          <w:tcPr>
+            <w:tcW w:type="dxa" w:w="1758"/>
+          </w:tcPr>
+          <w:p>
+            <w:pPr>
+              <w:jc w:val="center"/>
+            </w:pPr>
+            <w:r>
+              <w:rPr>
+                <w:rFonts w:ascii="Times New Roman" w:hAnsi="Times New Roman"/>
+                <w:sz w:val="21"/>
+              </w:rPr>
+              <w:t>TC15</w:t>
+            </w:r>
+          </w:p>
+        </w:tc>
+        <w:tc>
+          <w:tcPr>
+            <w:tcW w:type="dxa" w:w="1758"/>
+          </w:tcPr>
+          <w:p>
+            <w:pPr>
+              <w:jc w:val="left"/>
+            </w:pPr>
+            <w:r>
+              <w:rPr>
+                <w:rFonts w:ascii="Times New Roman" w:hAnsi="Times New Roman"/>
+                <w:sz w:val="21"/>
+              </w:rPr>
+              <w:t>Thêm vào giỏ hàng</w:t>
+            </w:r>
+          </w:p>
+        </w:tc>
+        <w:tc>
+          <w:tcPr>
+            <w:tcW w:type="dxa" w:w="1758"/>
+          </w:tcPr>
+          <w:p>
+            <w:pPr>
+              <w:jc w:val="left"/>
+            </w:pPr>
+            <w:r>
+              <w:rPr>
+                <w:rFonts w:ascii="Times New Roman" w:hAnsi="Times New Roman"/>
+                <w:sz w:val="21"/>
+              </w:rPr>
+              <w:t>Chọn SP A, Số lượng = 2</w:t>
+            </w:r>
+          </w:p>
+        </w:tc>
+        <w:tc>
+          <w:tcPr>
+            <w:tcW w:type="dxa" w:w="1758"/>
+          </w:tcPr>
+          <w:p>
+            <w:pPr>
+              <w:jc w:val="left"/>
+            </w:pPr>
+            <w:r>
+              <w:rPr>
+                <w:rFonts w:ascii="Times New Roman" w:hAnsi="Times New Roman"/>
+                <w:sz w:val="21"/>
+              </w:rPr>
+              <w:t>Giỏ hàng cập nhật 2 SP A</w:t>
+            </w:r>
+          </w:p>
+        </w:tc>
+        <w:tc>
+          <w:tcPr>
+            <w:tcW w:type="dxa" w:w="1758"/>
+          </w:tcPr>
+          <w:p>
+            <w:pPr>
+              <w:jc w:val="left"/>
+            </w:pPr>
+            <w:r>
+              <w:rPr>
+                <w:rFonts w:ascii="Times New Roman" w:hAnsi="Times New Roman"/>
+                <w:sz w:val="21"/>
+              </w:rPr>
+              <w:t>PASSED</w:t>
+            </w:r>
+          </w:p>
+        </w:tc>
+      </w:tr>
+      <w:tr>
+        <w:tc>
+          <w:tcPr>
+            <w:tcW w:type="dxa" w:w="1758"/>
+          </w:tcPr>
+          <w:p>
+            <w:pPr>
+              <w:jc w:val="center"/>
+            </w:pPr>
+            <w:r>
+              <w:rPr>
+                <w:rFonts w:ascii="Times New Roman" w:hAnsi="Times New Roman"/>
+                <w:sz w:val="21"/>
+              </w:rPr>
+              <w:t>TC16</w:t>
+            </w:r>
+          </w:p>
+        </w:tc>
+        <w:tc>
+          <w:tcPr>
+            <w:tcW w:type="dxa" w:w="1758"/>
+          </w:tcPr>
+          <w:p>
+            <w:pPr>
+              <w:jc w:val="left"/>
+            </w:pPr>
+            <w:r>
+              <w:rPr>
+                <w:rFonts w:ascii="Times New Roman" w:hAnsi="Times New Roman"/>
+                <w:sz w:val="21"/>
+              </w:rPr>
+              <w:t>Đặt hàng COD hợp lệ</w:t>
+            </w:r>
+          </w:p>
+        </w:tc>
+        <w:tc>
+          <w:tcPr>
+            <w:tcW w:type="dxa" w:w="1758"/>
+          </w:tcPr>
+          <w:p>
+            <w:pPr>
+              <w:jc w:val="left"/>
+            </w:pPr>
+            <w:r>
+              <w:rPr>
+                <w:rFonts w:ascii="Times New Roman" w:hAnsi="Times New Roman"/>
+                <w:sz w:val="21"/>
+              </w:rPr>
+              <w:t>Nhập Địa chỉ, SĐT</w:t>
+            </w:r>
+          </w:p>
+        </w:tc>
+        <w:tc>
+          <w:tcPr>
+            <w:tcW w:type="dxa" w:w="1758"/>
+          </w:tcPr>
+          <w:p>
+            <w:pPr>
+              <w:jc w:val="left"/>
+            </w:pPr>
+            <w:r>
+              <w:rPr>
+                <w:rFonts w:ascii="Times New Roman" w:hAnsi="Times New Roman"/>
+                <w:sz w:val="21"/>
+              </w:rPr>
+              <w:t>Tạo Order, trừ kho 2 SP A</w:t>
+            </w:r>
+          </w:p>
+        </w:tc>
+        <w:tc>
+          <w:tcPr>
+            <w:tcW w:type="dxa" w:w="1758"/>
+          </w:tcPr>
+          <w:p>
+            <w:pPr>
+              <w:jc w:val="left"/>
+            </w:pPr>
+            <w:r>
+              <w:rPr>
+                <w:rFonts w:ascii="Times New Roman" w:hAnsi="Times New Roman"/>
+                <w:sz w:val="21"/>
+              </w:rPr>
+              <w:t>PASSED</w:t>
+            </w:r>
+          </w:p>
+        </w:tc>
+      </w:tr>
+      <w:tr>
+        <w:tc>
+          <w:tcPr>
+            <w:tcW w:type="dxa" w:w="1758"/>
+          </w:tcPr>
+          <w:p>
+            <w:pPr>
+              <w:jc w:val="center"/>
+            </w:pPr>
+            <w:r>
+              <w:rPr>
+                <w:rFonts w:ascii="Times New Roman" w:hAnsi="Times New Roman"/>
+                <w:sz w:val="21"/>
+              </w:rPr>
+              <w:t>TC17</w:t>
+            </w:r>
+          </w:p>
+        </w:tc>
+        <w:tc>
+          <w:tcPr>
+            <w:tcW w:type="dxa" w:w="1758"/>
+          </w:tcPr>
+          <w:p>
+            <w:pPr>
+              <w:jc w:val="left"/>
+            </w:pPr>
+            <w:r>
+              <w:rPr>
+                <w:rFonts w:ascii="Times New Roman" w:hAnsi="Times New Roman"/>
+                <w:sz w:val="21"/>
+              </w:rPr>
+              <w:t>Tách đơn hàng đa Shop</w:t>
+            </w:r>
+          </w:p>
+        </w:tc>
+        <w:tc>
+          <w:tcPr>
+            <w:tcW w:type="dxa" w:w="1758"/>
+          </w:tcPr>
+          <w:p>
+            <w:pPr>
+              <w:jc w:val="left"/>
+            </w:pPr>
+            <w:r>
+              <w:rPr>
+                <w:rFonts w:ascii="Times New Roman" w:hAnsi="Times New Roman"/>
+                <w:sz w:val="21"/>
+              </w:rPr>
+              <w:t>Giỏ chứa 2 SP từ 2 Shop</w:t>
+            </w:r>
+          </w:p>
+        </w:tc>
+        <w:tc>
+          <w:tcPr>
+            <w:tcW w:type="dxa" w:w="1758"/>
+          </w:tcPr>
+          <w:p>
+            <w:pPr>
+              <w:jc w:val="left"/>
+            </w:pPr>
+            <w:r>
+              <w:rPr>
+                <w:rFonts w:ascii="Times New Roman" w:hAnsi="Times New Roman"/>
+                <w:sz w:val="21"/>
+              </w:rPr>
+              <w:t>OrderItems gán đúng shop_id 2 shop</w:t>
+            </w:r>
+          </w:p>
+        </w:tc>
+        <w:tc>
+          <w:tcPr>
+            <w:tcW w:type="dxa" w:w="1758"/>
+          </w:tcPr>
+          <w:p>
+            <w:pPr>
+              <w:jc w:val="left"/>
+            </w:pPr>
+            <w:r>
+              <w:rPr>
+                <w:rFonts w:ascii="Times New Roman" w:hAnsi="Times New Roman"/>
+                <w:sz w:val="21"/>
+              </w:rPr>
+              <w:t>PASSED</w:t>
+            </w:r>
+          </w:p>
+        </w:tc>
+      </w:tr>
+      <w:tr>
+        <w:tc>
+          <w:tcPr>
+            <w:tcW w:type="dxa" w:w="1758"/>
+          </w:tcPr>
+          <w:p>
+            <w:pPr>
+              <w:jc w:val="center"/>
+            </w:pPr>
+            <w:r>
+              <w:rPr>
+                <w:rFonts w:ascii="Times New Roman" w:hAnsi="Times New Roman"/>
+                <w:sz w:val="21"/>
+              </w:rPr>
+              <w:t>TC18</w:t>
+            </w:r>
+          </w:p>
+        </w:tc>
+        <w:tc>
+          <w:tcPr>
+            <w:tcW w:type="dxa" w:w="1758"/>
+          </w:tcPr>
+          <w:p>
+            <w:pPr>
+              <w:jc w:val="left"/>
+            </w:pPr>
+            <w:r>
+              <w:rPr>
+                <w:rFonts w:ascii="Times New Roman" w:hAnsi="Times New Roman"/>
+                <w:sz w:val="21"/>
+              </w:rPr>
+              <w:t>Số lượng vượt tồn kho</w:t>
+            </w:r>
+          </w:p>
+        </w:tc>
+        <w:tc>
+          <w:tcPr>
+            <w:tcW w:type="dxa" w:w="1758"/>
+          </w:tcPr>
+          <w:p>
+            <w:pPr>
+              <w:jc w:val="left"/>
+            </w:pPr>
+            <w:r>
+              <w:rPr>
+                <w:rFonts w:ascii="Times New Roman" w:hAnsi="Times New Roman"/>
+                <w:sz w:val="21"/>
+              </w:rPr>
+              <w:t>Chọn Số lượng = 999</w:t>
+            </w:r>
+          </w:p>
+        </w:tc>
+        <w:tc>
+          <w:tcPr>
+            <w:tcW w:type="dxa" w:w="1758"/>
+          </w:tcPr>
+          <w:p>
+            <w:pPr>
+              <w:jc w:val="left"/>
+            </w:pPr>
+            <w:r>
+              <w:rPr>
+                <w:rFonts w:ascii="Times New Roman" w:hAnsi="Times New Roman"/>
+                <w:sz w:val="21"/>
+              </w:rPr>
+              <w:t>Báo lỗi vượt quá số lượng tồn kho</w:t>
+            </w:r>
+          </w:p>
+        </w:tc>
+        <w:tc>
+          <w:tcPr>
+            <w:tcW w:type="dxa" w:w="1758"/>
+          </w:tcPr>
+          <w:p>
+            <w:pPr>
+              <w:jc w:val="left"/>
+            </w:pPr>
+            <w:r>
+              <w:rPr>
+                <w:rFonts w:ascii="Times New Roman" w:hAnsi="Times New Roman"/>
+                <w:sz w:val="21"/>
+              </w:rPr>
+              <w:t>PASSED</w:t>
+            </w:r>
+          </w:p>
+        </w:tc>
+      </w:tr>
+    </w:tbl>
+    <w:tbl>
+      <w:tblPr>
+        <w:tblW w:type="auto" w:w="0"/>
+        <w:jc w:val="center"/>
+        <w:tblLook w:firstColumn="1" w:firstRow="1" w:lastColumn="0" w:lastRow="0" w:noHBand="0" w:noVBand="1" w:val="04A0"/>
+      </w:tblPr>
+      <w:tblGrid>
+        <w:gridCol w:w="1758"/>
+        <w:gridCol w:w="1758"/>
+        <w:gridCol w:w="1758"/>
+        <w:gridCol w:w="1758"/>
+        <w:gridCol w:w="1758"/>
+      </w:tblGrid>
+      <w:tr>
+        <w:tc>
+          <w:tcPr>
+            <w:tcW w:type="dxa" w:w="1758"/>
+            <w:shd w:fill="E2E8F0"/>
+          </w:tcPr>
+          <w:p>
+            <w:pPr>
+              <w:jc w:val="center"/>
+            </w:pPr>
+            <w:r>
+              <w:rPr>
+                <w:rFonts w:ascii="Times New Roman" w:hAnsi="Times New Roman"/>
+                <w:b/>
+                <w:sz w:val="22"/>
+              </w:rPr>
+              <w:t>ID</w:t>
+            </w:r>
+          </w:p>
+        </w:tc>
+        <w:tc>
+          <w:tcPr>
+            <w:tcW w:type="dxa" w:w="1758"/>
+            <w:shd w:fill="E2E8F0"/>
+          </w:tcPr>
+          <w:p>
+            <w:pPr>
+              <w:jc w:val="center"/>
+            </w:pPr>
+            <w:r>
+              <w:rPr>
+                <w:rFonts w:ascii="Times New Roman" w:hAnsi="Times New Roman"/>
+                <w:b/>
+                <w:sz w:val="22"/>
+              </w:rPr>
+              <w:t>Kịch bản kiểm thử</w:t>
+            </w:r>
+          </w:p>
+        </w:tc>
+        <w:tc>
+          <w:tcPr>
+            <w:tcW w:type="dxa" w:w="1758"/>
+            <w:shd w:fill="E2E8F0"/>
+          </w:tcPr>
+          <w:p>
+            <w:pPr>
+              <w:jc w:val="center"/>
+            </w:pPr>
+            <w:r>
+              <w:rPr>
+                <w:rFonts w:ascii="Times New Roman" w:hAnsi="Times New Roman"/>
+                <w:b/>
+                <w:sz w:val="22"/>
+              </w:rPr>
+              <w:t>Hành động Vendor</w:t>
+            </w:r>
+          </w:p>
+        </w:tc>
+        <w:tc>
+          <w:tcPr>
+            <w:tcW w:type="dxa" w:w="1758"/>
+            <w:shd w:fill="E2E8F0"/>
+          </w:tcPr>
+          <w:p>
+            <w:pPr>
+              <w:jc w:val="center"/>
+            </w:pPr>
+            <w:r>
+              <w:rPr>
+                <w:rFonts w:ascii="Times New Roman" w:hAnsi="Times New Roman"/>
+                <w:b/>
+                <w:sz w:val="22"/>
+              </w:rPr>
+              <w:t>Kết quả mong đợi</w:t>
+            </w:r>
+          </w:p>
+        </w:tc>
+        <w:tc>
+          <w:tcPr>
+            <w:tcW w:type="dxa" w:w="1758"/>
+            <w:shd w:fill="E2E8F0"/>
+          </w:tcPr>
+          <w:p>
+            <w:pPr>
+              <w:jc w:val="center"/>
+            </w:pPr>
+            <w:r>
+              <w:rPr>
+                <w:rFonts w:ascii="Times New Roman" w:hAnsi="Times New Roman"/>
+                <w:b/>
+                <w:sz w:val="22"/>
+              </w:rPr>
+              <w:t>Trạng thái</w:t>
+            </w:r>
+          </w:p>
+        </w:tc>
+      </w:tr>
+      <w:tr>
+        <w:tc>
+          <w:tcPr>
+            <w:tcW w:type="dxa" w:w="1758"/>
+          </w:tcPr>
+          <w:p>
+            <w:pPr>
+              <w:jc w:val="center"/>
+            </w:pPr>
+            <w:r>
+              <w:rPr>
+                <w:rFonts w:ascii="Times New Roman" w:hAnsi="Times New Roman"/>
+                <w:sz w:val="21"/>
+              </w:rPr>
+              <w:t>TC19</w:t>
+            </w:r>
+          </w:p>
+        </w:tc>
+        <w:tc>
+          <w:tcPr>
+            <w:tcW w:type="dxa" w:w="1758"/>
+          </w:tcPr>
+          <w:p>
+            <w:pPr>
+              <w:jc w:val="left"/>
+            </w:pPr>
+            <w:r>
+              <w:rPr>
+                <w:rFonts w:ascii="Times New Roman" w:hAnsi="Times New Roman"/>
+                <w:sz w:val="21"/>
+              </w:rPr>
+              <w:t>Vendor xác nhận đơn</w:t>
+            </w:r>
+          </w:p>
+        </w:tc>
+        <w:tc>
+          <w:tcPr>
+            <w:tcW w:type="dxa" w:w="1758"/>
+          </w:tcPr>
+          <w:p>
+            <w:pPr>
+              <w:jc w:val="left"/>
+            </w:pPr>
+            <w:r>
+              <w:rPr>
+                <w:rFonts w:ascii="Times New Roman" w:hAnsi="Times New Roman"/>
+                <w:sz w:val="21"/>
+              </w:rPr>
+              <w:t>Chuyển PENDING -&gt; PROCESSING</w:t>
+            </w:r>
+          </w:p>
+        </w:tc>
+        <w:tc>
+          <w:tcPr>
+            <w:tcW w:type="dxa" w:w="1758"/>
+          </w:tcPr>
+          <w:p>
+            <w:pPr>
+              <w:jc w:val="left"/>
+            </w:pPr>
+            <w:r>
+              <w:rPr>
+                <w:rFonts w:ascii="Times New Roman" w:hAnsi="Times New Roman"/>
+                <w:sz w:val="21"/>
+              </w:rPr>
+              <w:t>Đơn hàng cập nhật PROCESSING</w:t>
+            </w:r>
+          </w:p>
+        </w:tc>
+        <w:tc>
+          <w:tcPr>
+            <w:tcW w:type="dxa" w:w="1758"/>
+          </w:tcPr>
+          <w:p>
+            <w:pPr>
+              <w:jc w:val="left"/>
+            </w:pPr>
+            <w:r>
+              <w:rPr>
+                <w:rFonts w:ascii="Times New Roman" w:hAnsi="Times New Roman"/>
+                <w:sz w:val="21"/>
+              </w:rPr>
+              <w:t>PASSED</w:t>
+            </w:r>
+          </w:p>
+        </w:tc>
+      </w:tr>
+      <w:tr>
+        <w:tc>
+          <w:tcPr>
+            <w:tcW w:type="dxa" w:w="1758"/>
+          </w:tcPr>
+          <w:p>
+            <w:pPr>
+              <w:jc w:val="center"/>
+            </w:pPr>
+            <w:r>
+              <w:rPr>
+                <w:rFonts w:ascii="Times New Roman" w:hAnsi="Times New Roman"/>
+                <w:sz w:val="21"/>
+              </w:rPr>
+              <w:t>TC20</w:t>
+            </w:r>
+          </w:p>
+        </w:tc>
+        <w:tc>
+          <w:tcPr>
+            <w:tcW w:type="dxa" w:w="1758"/>
+          </w:tcPr>
+          <w:p>
+            <w:pPr>
+              <w:jc w:val="left"/>
+            </w:pPr>
+            <w:r>
+              <w:rPr>
+                <w:rFonts w:ascii="Times New Roman" w:hAnsi="Times New Roman"/>
+                <w:sz w:val="21"/>
+              </w:rPr>
+              <w:t>Vendor xác nhận giao</w:t>
+            </w:r>
+          </w:p>
+        </w:tc>
+        <w:tc>
+          <w:tcPr>
+            <w:tcW w:type="dxa" w:w="1758"/>
+          </w:tcPr>
+          <w:p>
+            <w:pPr>
+              <w:jc w:val="left"/>
+            </w:pPr>
+            <w:r>
+              <w:rPr>
+                <w:rFonts w:ascii="Times New Roman" w:hAnsi="Times New Roman"/>
+                <w:sz w:val="21"/>
+              </w:rPr>
+              <w:t>Chuyển SHIPPED -&gt; DELIVERED</w:t>
+            </w:r>
+          </w:p>
+        </w:tc>
+        <w:tc>
+          <w:tcPr>
+            <w:tcW w:type="dxa" w:w="1758"/>
+          </w:tcPr>
+          <w:p>
+            <w:pPr>
+              <w:jc w:val="left"/>
+            </w:pPr>
+            <w:r>
+              <w:rPr>
+                <w:rFonts w:ascii="Times New Roman" w:hAnsi="Times New Roman"/>
+                <w:sz w:val="21"/>
+              </w:rPr>
+              <w:t>Đơn hoàn tất, ghi nhận doanh thu</w:t>
+            </w:r>
+          </w:p>
+        </w:tc>
+        <w:tc>
+          <w:tcPr>
+            <w:tcW w:type="dxa" w:w="1758"/>
+          </w:tcPr>
+          <w:p>
+            <w:pPr>
+              <w:jc w:val="left"/>
+            </w:pPr>
+            <w:r>
+              <w:rPr>
+                <w:rFonts w:ascii="Times New Roman" w:hAnsi="Times New Roman"/>
+                <w:sz w:val="21"/>
+              </w:rPr>
+              <w:t>PASSED</w:t>
+            </w:r>
+          </w:p>
+        </w:tc>
+      </w:tr>
+      <w:tr>
+        <w:tc>
+          <w:tcPr>
+            <w:tcW w:type="dxa" w:w="1758"/>
+          </w:tcPr>
+          <w:p>
+            <w:pPr>
+              <w:jc w:val="center"/>
+            </w:pPr>
+            <w:r>
+              <w:rPr>
+                <w:rFonts w:ascii="Times New Roman" w:hAnsi="Times New Roman"/>
+                <w:sz w:val="21"/>
+              </w:rPr>
+              <w:t>TC21</w:t>
+            </w:r>
+          </w:p>
+        </w:tc>
+        <w:tc>
+          <w:tcPr>
+            <w:tcW w:type="dxa" w:w="1758"/>
+          </w:tcPr>
+          <w:p>
+            <w:pPr>
+              <w:jc w:val="left"/>
+            </w:pPr>
+            <w:r>
+              <w:rPr>
+                <w:rFonts w:ascii="Times New Roman" w:hAnsi="Times New Roman"/>
+                <w:sz w:val="21"/>
+              </w:rPr>
+              <w:t>Hủy đơn hàng</w:t>
+            </w:r>
+          </w:p>
+        </w:tc>
+        <w:tc>
+          <w:tcPr>
+            <w:tcW w:type="dxa" w:w="1758"/>
+          </w:tcPr>
+          <w:p>
+            <w:pPr>
+              <w:jc w:val="left"/>
+            </w:pPr>
+            <w:r>
+              <w:rPr>
+                <w:rFonts w:ascii="Times New Roman" w:hAnsi="Times New Roman"/>
+                <w:sz w:val="21"/>
+              </w:rPr>
+              <w:t>Chuyển status -&gt; CANCELLED</w:t>
+            </w:r>
+          </w:p>
+        </w:tc>
+        <w:tc>
+          <w:tcPr>
+            <w:tcW w:type="dxa" w:w="1758"/>
+          </w:tcPr>
+          <w:p>
+            <w:pPr>
+              <w:jc w:val="left"/>
+            </w:pPr>
+            <w:r>
+              <w:rPr>
+                <w:rFonts w:ascii="Times New Roman" w:hAnsi="Times New Roman"/>
+                <w:sz w:val="21"/>
+              </w:rPr>
+              <w:t>Hủy đơn và hoàn trả tồn kho</w:t>
+            </w:r>
+          </w:p>
+        </w:tc>
+        <w:tc>
+          <w:tcPr>
+            <w:tcW w:type="dxa" w:w="1758"/>
+          </w:tcPr>
+          <w:p>
+            <w:pPr>
+              <w:jc w:val="left"/>
+            </w:pPr>
+            <w:r>
+              <w:rPr>
+                <w:rFonts w:ascii="Times New Roman" w:hAnsi="Times New Roman"/>
+                <w:sz w:val="21"/>
+              </w:rPr>
+              <w:t>PASSED</w:t>
+            </w:r>
+          </w:p>
+        </w:tc>
+      </w:tr>
+    </w:tbl>
     <w:p>
       <w:pPr>
         <w:pStyle w:val="2"/>
-        <w:spacing w:before="320" w:after="160" w:line="276" w:lineRule="auto"/>
+        <w:spacing w:before="240" w:after="240"/>
       </w:pPr>
       <w:r>
         <w:rPr>
@@ -14501,67 +17884,23 @@
           <w:color w:val="000000"/>
           <w:sz w:val="32"/>
         </w:rPr>
-        <w:t>LỜI NÓI ĐẦU</w:t>
+        <w:t>MỤC LỤC</w:t>
       </w:r>
     </w:p>
     <w:p>
       <w:pPr>
-        <w:pStyle w:val="8"/>
-        <w:spacing w:before="0" w:after="80" w:line="276" w:lineRule="auto"/>
-        <w:jc w:val="both"/>
-      </w:pPr>
-      <w:r>
-        <w:rPr>
-          <w:rFonts w:ascii="Times New Roman" w:hAnsi="Times New Roman"/>
-          <w:color w:val="000000"/>
-          <w:sz w:val="26"/>
-        </w:rPr>
-        <w:t>Trong kỷ nguyên số hóa và sự phát triển bùng nổ của thương mại điện tử (E-Commerce) trên toàn cầu, phương thức mua sắm trực tuyến đã trở thành thói quen thiết yếu của hàng tỷ người tiêu dùng. Mô hình Sàn thương mại điện tử đa nhà bán (Multi-Vendor Marketplace) như Shopee, Lazada, Amazon, Tiki đóng vai trò là một hệ sinh thái thương mại trung gian quy mô lớn, cho phép hàng triệu nhà phân phối, cửa hàng kinh doanh (Vendors/Sellers) mở gian hàng và bán hàng trực tiếp tới người mua (Customers).</w:t>
+        <w:spacing w:after="240"/>
+      </w:pPr>
+      <w:r>
+        <w:fldChar w:fldCharType="begin"/>
+        <w:instrText xml:space="preserve"> TOC \o "1-3" \h \z \u </w:instrText>
+        <w:fldChar w:fldCharType="separate"/>
+        <w:fldChar w:fldCharType="end"/>
       </w:r>
     </w:p>
     <w:p>
-      <w:pPr>
-        <w:pStyle w:val="8"/>
-        <w:spacing w:before="0" w:after="80" w:line="276" w:lineRule="auto"/>
-        <w:jc w:val="both"/>
-      </w:pPr>
-      <w:r>
-        <w:rPr>
-          <w:rFonts w:ascii="Times New Roman" w:hAnsi="Times New Roman"/>
-          <w:color w:val="000000"/>
-          <w:sz w:val="26"/>
-        </w:rPr>
-        <w:t>Sự phức tạp của mô hình Multi-Vendor đòi hỏi một hệ thống phần mềm có khả năng xử lý bài toán phân quyền bảo mật chặt chẽ (RBAC), quản lý dữ liệu danh mục sản phẩm đồ sộ, giỏ hàng đa gian hàng, và đặc biệt là thuật toán tự động tách đơn hàng (Vendor Order Splitting) để phân phối thông tin đơn hàng tới đúng từng gian hàng sở hữu sản phẩm. Xuất phát từ nhu cầu thực tiễn và tính cấp thiết đó, nhóm 7 chúng em đã quyết định thực hiện đề tài: 'Xây dựng ứng dụng Web Quản lý Sàn Thương mại Điện tử Đa nhà bán (Multi-Vendor Marketplace)' với tên thương hiệu JVTech Marketplace.</w:t>
-      </w:r>
-    </w:p>
-    <w:p>
-      <w:pPr>
-        <w:pStyle w:val="8"/>
-        <w:spacing w:before="0" w:after="80" w:line="276" w:lineRule="auto"/>
-        <w:jc w:val="both"/>
-      </w:pPr>
-      <w:r>
-        <w:rPr>
-          <w:rFonts w:ascii="Times New Roman" w:hAnsi="Times New Roman"/>
-          <w:color w:val="000000"/>
-          <w:sz w:val="26"/>
-        </w:rPr>
-        <w:t>Dự án được triển khai trên nền tảng ngôn ngữ Java 17 LTS, hệ sinh thái Spring Framework bao gồm Spring Boot 3.1.5, Spring Security 6, Spring Data JPA, Hibernate 6, công nghệ sinh giao diện phía server Thymeleaf 3 và hệ quản trị cơ sở dữ liệu MySQL 8. Báo cáo này trình bày chi tiết toàn bộ quá trình nghiên cứu, khảo sát yêu cầu, thiết kế hệ thống, lập trình xây dựng các module và kiểm thử chất lượng phần mềm.</w:t>
-      </w:r>
-    </w:p>
-    <w:p>
-      <w:pPr>
-        <w:pStyle w:val="8"/>
-        <w:spacing w:before="0" w:after="80" w:line="276" w:lineRule="auto"/>
-        <w:jc w:val="both"/>
-      </w:pPr>
-      <w:r>
-        <w:rPr>
-          <w:rFonts w:ascii="Times New Roman" w:hAnsi="Times New Roman"/>
-          <w:color w:val="000000"/>
-          <w:sz w:val="26"/>
-        </w:rPr>
-        <w:t>Nhóm chúng em xin gửi lời cảm ơn chân thành nhất tới Thầy giáo Trần Xuân Thanh - Giảng viên bộ môn Công nghệ Java, Trường Đại học Công nghệ Đông Á đã tận tình truyền đạt kiến thức và hướng dẫn nhóm trong suốt quá trình hoàn thành bài tập lớn này.</w:t>
+      <w:r>
+        <w:br w:type="page"/>
       </w:r>
     </w:p>
     <w:p>
@@ -14576,7 +17915,7 @@
           <w:color w:val="000000"/>
           <w:sz w:val="32"/>
         </w:rPr>
-        <w:t>DANH MỤC BẢNG BIỂU VÀ SƠ ĐỒ</w:t>
+        <w:t>LỜI NÓI ĐẦU</w:t>
       </w:r>
     </w:p>
     <w:p>
@@ -14591,33 +17930,52 @@
           <w:color w:val="000000"/>
           <w:sz w:val="26"/>
         </w:rPr>
-        <w:t>Bảng 1: Danh sách thành viên nhóm 7 thực hiện đề tài CNJ18</w:t>
-        <w:br/>
-        <w:t>Bảng 2: Danh mục từ viết tắt chuyên ngành E-Commerce &amp; Spring Boot</w:t>
-        <w:br/>
-        <w:t>Bảng 3: Ma trận danh sách Use Case chức năng hệ thống</w:t>
-        <w:br/>
-        <w:t>Bảng 4: Chi tiết cấu trúc 8 bảng cơ sở dữ liệu tmdd_db</w:t>
-        <w:br/>
-        <w:t>Bảng 5: Ma trận kiểm thử xác thực và phân quyền (TC01 - TC10)</w:t>
-        <w:br/>
-        <w:t>Bảng 6: Ma trận kiểm thử quản lý sản phẩm và kho hàng (TC11 - TC20)</w:t>
-        <w:br/>
-        <w:t>Bảng 7: Ma trận kiểm thử giỏ hàng, đặt hàng và tách đơn (TC21 - TC30)</w:t>
-        <w:br/>
-        <w:t>Bảng 8: Ma trận kiểm thử quản lý đơn hàng và dữ liệu (TC31 - TC45)</w:t>
-        <w:br/>
-        <w:t>Hình 1: Kiến trúc tổng quan hệ thống Spring Boot MVC Multi-Vendor</w:t>
-        <w:br/>
-        <w:t>Hình 2: Sơ đồ Use Case tổng quát phân quyền 3 tác nhân</w:t>
-        <w:br/>
-        <w:t>Hình 3: Sơ đồ Activity quy trình Đặt hàng và Tách đơn theo Shop</w:t>
-        <w:br/>
-        <w:t>Hình 4: Sơ đồ Sequence quy trình Đăng nhập và Phân quyền người dùng</w:t>
-        <w:br/>
-        <w:t>Hình 5: Sơ đồ Class Diagram các lớp Entity &amp; Service chính</w:t>
-        <w:br/>
-        <w:t>Hình 6: Mô hình Quan hệ Cơ sở dữ liệu (ERD) 8 bảng dữ liệu</w:t>
+        <w:t>Trong kỷ nguyên số hóa và sự phát triển bùng nổ của thương mại điện tử (E-Commerce) trên toàn cầu, phương thức mua sắm trực tuyến đã trở thành thói quen thiết yếu của hàng tỷ người tiêu dùng. Mô hình Sàn thương mại điện tử đa nhà bán (Multi-Vendor Marketplace) như Shopee, Lazada, Amazon, Tiki đóng vai trò là một hệ sinh thái thương mại trung gian quy mô lớn, cho phép hàng triệu nhà phân phối, cửa hàng kinh doanh (Vendors/Sellers) mở gian hàng và bán hàng trực tiếp tới người mua (Customers).</w:t>
+      </w:r>
+    </w:p>
+    <w:p>
+      <w:pPr>
+        <w:pStyle w:val="8"/>
+        <w:spacing w:before="0" w:after="80" w:line="276" w:lineRule="auto"/>
+        <w:jc w:val="both"/>
+      </w:pPr>
+      <w:r>
+        <w:rPr>
+          <w:rFonts w:ascii="Times New Roman" w:hAnsi="Times New Roman"/>
+          <w:color w:val="000000"/>
+          <w:sz w:val="26"/>
+        </w:rPr>
+        <w:t>Sự phức tạp của mô hình Multi-Vendor đòi hỏi một hệ thống phần mềm có khả năng xử lý bài toán phân quyền bảo mật chặt chẽ (RBAC), quản lý dữ liệu danh mục sản phẩm đồ sộ, giỏ hàng đa gian hàng, và đặc biệt là thuật toán tự động tách đơn hàng (Vendor Order Splitting) để phân phối thông tin đơn hàng tới đúng từng gian hàng sở hữu sản phẩm. Xuất phát từ nhu cầu thực tiễn và tính cấp thiết đó, nhóm 7 chúng em đã quyết định thực hiện đề tài: 'Xây dựng ứng dụng Web Quản lý Sàn Thương mại Điện tử Đa nhà bán (Multi-Vendor Marketplace)' với tên thương hiệu JVTech Marketplace.</w:t>
+      </w:r>
+    </w:p>
+    <w:p>
+      <w:pPr>
+        <w:pStyle w:val="8"/>
+        <w:spacing w:before="0" w:after="80" w:line="276" w:lineRule="auto"/>
+        <w:jc w:val="both"/>
+      </w:pPr>
+      <w:r>
+        <w:rPr>
+          <w:rFonts w:ascii="Times New Roman" w:hAnsi="Times New Roman"/>
+          <w:color w:val="000000"/>
+          <w:sz w:val="26"/>
+        </w:rPr>
+        <w:t>Dự án được triển khai trên nền tảng ngôn ngữ Java 17 LTS, hệ sinh thái Spring Framework bao gồm Spring Boot 3.1.5, Spring Security 6, Spring Data JPA, Hibernate 6, công nghệ sinh giao diện phía server Thymeleaf 3 và hệ quản trị cơ sở dữ liệu MySQL 8. Báo cáo này trình bày chi tiết toàn bộ quá trình nghiên cứu, khảo sát yêu cầu, thiết kế hệ thống, lập trình xây dựng các module và kiểm thử chất lượng phần mềm.</w:t>
+      </w:r>
+    </w:p>
+    <w:p>
+      <w:pPr>
+        <w:pStyle w:val="8"/>
+        <w:spacing w:before="0" w:after="80" w:line="276" w:lineRule="auto"/>
+        <w:jc w:val="both"/>
+      </w:pPr>
+      <w:r>
+        <w:rPr>
+          <w:rFonts w:ascii="Times New Roman" w:hAnsi="Times New Roman"/>
+          <w:color w:val="000000"/>
+          <w:sz w:val="26"/>
+        </w:rPr>
+        <w:t>Nhóm chúng em xin gửi lời cảm ơn chân thành nhất tới Thầy giáo Trần Xuân Thanh - Giảng viên bộ môn Công nghệ Java, Trường Đại học Công nghệ Đông Á đã tận tình truyền đạt kiến thức và hướng dẫn nhóm trong suốt quá trình hoàn thành bài tập lớn này.</w:t>
       </w:r>
     </w:p>
     <w:p>
@@ -14637,6 +17995,67 @@
           <w:color w:val="000000"/>
           <w:sz w:val="32"/>
         </w:rPr>
+        <w:t>DANH MỤC BẢNG BIỂU VÀ SƠ ĐỒ</w:t>
+      </w:r>
+    </w:p>
+    <w:p>
+      <w:pPr>
+        <w:pStyle w:val="8"/>
+        <w:spacing w:before="0" w:after="80" w:line="276" w:lineRule="auto"/>
+        <w:jc w:val="both"/>
+      </w:pPr>
+      <w:r>
+        <w:rPr>
+          <w:rFonts w:ascii="Times New Roman" w:hAnsi="Times New Roman"/>
+          <w:color w:val="000000"/>
+          <w:sz w:val="26"/>
+        </w:rPr>
+        <w:t>Bảng 1: Danh sách thành viên nhóm 7 thực hiện đề tài CNJ18</w:t>
+        <w:br/>
+        <w:t>Bảng 2: Danh mục từ viết tắt chuyên ngành E-Commerce &amp; Spring Boot</w:t>
+        <w:br/>
+        <w:t>Bảng 3: Ma trận danh sách Use Case chức năng hệ thống</w:t>
+        <w:br/>
+        <w:t>Bảng 4: Chi tiết cấu trúc 8 bảng cơ sở dữ liệu tmdd_db</w:t>
+        <w:br/>
+        <w:t>Bảng 5: Ma trận kiểm thử xác thực và phân quyền (TC01 - TC10)</w:t>
+        <w:br/>
+        <w:t>Bảng 6: Ma trận kiểm thử quản lý sản phẩm và kho hàng (TC11 - TC20)</w:t>
+        <w:br/>
+        <w:t>Bảng 7: Ma trận kiểm thử giỏ hàng, đặt hàng và tách đơn (TC21 - TC30)</w:t>
+        <w:br/>
+        <w:t>Bảng 8: Ma trận kiểm thử quản lý đơn hàng và dữ liệu (TC31 - TC45)</w:t>
+        <w:br/>
+        <w:t>Hình 1: Kiến trúc tổng quan hệ thống Spring Boot MVC Multi-Vendor</w:t>
+        <w:br/>
+        <w:t>Hình 2: Sơ đồ Use Case tổng quát phân quyền 3 tác nhân</w:t>
+        <w:br/>
+        <w:t>Hình 3: Sơ đồ Activity quy trình Đặt hàng và Tách đơn theo Shop</w:t>
+        <w:br/>
+        <w:t>Hình 4: Sơ đồ Sequence quy trình Đăng nhập và Phân quyền người dùng</w:t>
+        <w:br/>
+        <w:t>Hình 5: Sơ đồ Class Diagram các lớp Entity &amp; Service chính</w:t>
+        <w:br/>
+        <w:t>Hình 6: Mô hình Quan hệ Cơ sở dữ liệu (ERD) 8 bảng dữ liệu</w:t>
+      </w:r>
+    </w:p>
+    <w:p>
+      <w:r>
+        <w:br w:type="page"/>
+      </w:r>
+    </w:p>
+    <w:p>
+      <w:pPr>
+        <w:pStyle w:val="2"/>
+        <w:spacing w:before="320" w:after="160" w:line="276" w:lineRule="auto"/>
+      </w:pPr>
+      <w:r>
+        <w:rPr>
+          <w:rFonts w:ascii="Times New Roman" w:hAnsi="Times New Roman"/>
+          <w:b/>
+          <w:color w:val="000000"/>
+          <w:sz w:val="32"/>
+        </w:rPr>
         <w:t>CHƯƠNG 1. TỔNG QUAN ĐỀ TÀI</w:t>
       </w:r>
     </w:p>
@@ -14667,7 +18086,7 @@
           <w:color w:val="000000"/>
           <w:sz w:val="26"/>
         </w:rPr>
-        <w:t>Trong bối cảnh nền kinh tế số phát triển như vũ bão, thương mại điện tử truyền thống dạng Single-Vendor (một cửa hàng tự bán sản phẩm của chính mình) đang dần bộc lộ những hạn chế về quy mô hàng hóa, chi phí quản lý tồn kho và khả năng đáp ứng nhu cầu đa dạng của người tiêu dùng. Ngược lại, mô hình Sàn thương mại điện tử đa nhà bán (Multi-Vendor Marketplace) mang lại lợi thế vượt trội nhờ khả năng huy động nguồn lực sản phẩm từ hàng ngàn nhà bán hàng đối tác.</w:t>
+        <w:t>Trong bối cảnh nền kinh tế số và thương mại điện tử (E-Commerce) tăng trưởng vượt bậc, các mô hình bán hàng trực tuyến đang trải qua bước chuyển mình mạnh mẽ. Mô hình cửa hàng đơn lẻ (Single-Vendor E-Commerce) - nơi một doanh nghiệp tự quản lý và bán các sản phẩm của chính mình - đã bắt đầu bộc lộ những giới hạn rõ rệt về quy mô hàng hóa, chi phí tồn kho, khả năng tiếp cận thị trường và tốc độ mở rộng dải sản phẩm. Ngược lại, mô hình Sàn thương mại điện tử đa nhà bán (Multi-Vendor Marketplace) như Shopee, Lazada, Amazon hay Tiki đã khẳng định vị thế ưu việt nhờ khả năng huy động và kết nối nguồn lực hàng hóa từ hàng ngàn nhà cung cấp, đối tác kinh doanh (Vendors/Sellers) trên cùng một nền tảng Web tập trung.</w:t>
       </w:r>
     </w:p>
     <w:p>
@@ -14682,7 +18101,7 @@
           <w:color w:val="000000"/>
           <w:sz w:val="26"/>
         </w:rPr>
-        <w:t>Phát triển ứng dụng Web Multi-Vendor Marketplace đòi hỏi giải quyết nhiều bài toán kỹ thuật phức tạp trong kiến trúc phần mềm enterprise:</w:t>
+        <w:t>Mô hình Multi-Vendor Marketplace mang lại giá trị gia tăng to lớn cho cả 3 đối tượng trong hệ sinh thái:</w:t>
       </w:r>
     </w:p>
     <w:p>
@@ -14697,7 +18116,7 @@
           <w:color w:val="000000"/>
           <w:sz w:val="26"/>
         </w:rPr>
-        <w:t>1. Phân quyền bảo mật đa cấp độ (Role-Based Access Control - RBAC): Phân định rõ ranh giới truy cập dữ liệu giữa Administrator (Quản trị sàn), Vendor (Chủ gian hàng) và Customer (Khách hàng).</w:t>
+        <w:t>• Đối với Ban quản trị sàn (Admin): Tối ưu hóa mô hình kinh doanh bằng cách thu phí hoa hồng trên từng giao dịch (Commission fee), phí duy trì gian hàng và phí quảng cáo sản phẩm mà không phải chịu rủi ro hay chi phí lưu kho bãi.</w:t>
       </w:r>
     </w:p>
     <w:p>
@@ -14712,7 +18131,7 @@
           <w:color w:val="000000"/>
           <w:sz w:val="26"/>
         </w:rPr>
-        <w:t>2. Quản lý giỏ hàng đa gian hàng (Multi-vendor Shopping Cart): Cho phép người mua tự do chọn các sản phẩm thuộc nhiều gian hàng khác nhau vào cùng một giỏ hàng chung duy nhất.</w:t>
+        <w:t>• Đối với Nhà bán hàng (Vendors/Sellers): Tiếp cận ngay lập tức tới tập khách hàng tiềm năng đồ sộ trên sàn, tận dụng hạ tầng công nghệ và hệ thống thanh toán/vận chuyển có sẵn mà không cần đầu tư chi phí lớn xây dựng website riêng.</w:t>
       </w:r>
     </w:p>
     <w:p>
@@ -14727,7 +18146,22 @@
           <w:color w:val="000000"/>
           <w:sz w:val="26"/>
         </w:rPr>
-        <w:t>3. Thuật toán tự động phân tách đơn hàng (Vendor Order Splitting Algorithm): Khi khách hàng thực hiện thanh toán giỏ hàng tổng, hệ thống phải tự động phân tách thành các bản ghi OrderItem tương ứng với từng shop_id để các Vendor độc lập tiếp nhận và xử lý đơn hàng.</w:t>
+        <w:t>• Đối với Khách hàng (Customers): Trải nghiệm mua sắm 'tất cả trong một' (One-stop Shopping) phong phú, dễ dàng so sánh giá cả, chất lượng, đọc đánh giá nhận xét minh bạch từ cộng đồng người mua trước khi quyết định đặt hàng.</w:t>
+      </w:r>
+    </w:p>
+    <w:p>
+      <w:pPr>
+        <w:pStyle w:val="8"/>
+        <w:spacing w:before="0" w:after="80" w:line="276" w:lineRule="auto"/>
+        <w:jc w:val="both"/>
+      </w:pPr>
+      <w:r>
+        <w:rPr>
+          <w:rFonts w:ascii="Times New Roman" w:hAnsi="Times New Roman"/>
+          <w:color w:val="000000"/>
+          <w:sz w:val="26"/>
+        </w:rPr>
+        <w:t>Tuy nhiên, dưới góc độ kỹ thuật và phát triển phần mềm, việc xây dựng một hệ thống Sàn thương mại điện tử đa nhà bán đặt ra những thách thức rất lớn về mặt kiến trúc phần mềm và xử lý nghiệp vụ:</w:t>
       </w:r>
     </w:p>
     <w:p>
@@ -14742,7 +18176,37 @@
           <w:color w:val="000000"/>
           <w:sz w:val="26"/>
         </w:rPr>
-        <w:t>4. Quản lý hiển thị sản phẩm sinh động: Hỗ trợ chuyển đổi gallery ảnh thu nhỏ và lựa chọn các phân loại biến thể màu sắc, kích cỡ trực quan.</w:t>
+        <w:t>1. Cơ chế Bảo mật và Phân quyền người dùng đa cấp độ (Role-Based Access Control - RBAC): Hệ thống phải phân định ranh giới bảo mật nghiêm ngặt giữa Quản trị viên (ROLE_ADMIN), Chủ gian hàng (ROLE_VENDOR) và Khách mua hàng (ROLE_CUSTOMER). Dữ liệu của từng shop phải được cô lập tuyệt đối, không cho phép nhà bán này truy cập hoặc can thiệp đơn hàng/sản phẩm của nhà bán khác.</w:t>
+      </w:r>
+    </w:p>
+    <w:p>
+      <w:pPr>
+        <w:pStyle w:val="18"/>
+        <w:spacing w:before="0" w:after="60" w:line="276" w:lineRule="auto"/>
+        <w:jc w:val="both"/>
+      </w:pPr>
+      <w:r>
+        <w:rPr>
+          <w:rFonts w:ascii="Times New Roman" w:hAnsi="Times New Roman"/>
+          <w:color w:val="000000"/>
+          <w:sz w:val="26"/>
+        </w:rPr>
+        <w:t>2. Quản lý Giỏ hàng đa gian hàng (Multi-vendor Shopping Cart): Khách hàng có thể tự do thêm vào giỏ hàng các sản phẩm đến từ nhiều gian hàng khác nhau. Hệ thống phải quản lý trạng thái giỏ hàng linh hoạt qua Session và Database.</w:t>
+      </w:r>
+    </w:p>
+    <w:p>
+      <w:pPr>
+        <w:pStyle w:val="18"/>
+        <w:spacing w:before="0" w:after="60" w:line="276" w:lineRule="auto"/>
+        <w:jc w:val="both"/>
+      </w:pPr>
+      <w:r>
+        <w:rPr>
+          <w:rFonts w:ascii="Times New Roman" w:hAnsi="Times New Roman"/>
+          <w:color w:val="000000"/>
+          <w:sz w:val="26"/>
+        </w:rPr>
+        <w:t>3. Thuật toán Tách đơn hàng tự động (Vendor Order Splitting Algorithm): Đây là bài toán cốt lõi của sàn đa nhà bán. Khi khách hàng xác nhận thanh toán một đơn hàng tổng (Master Order), hệ thống phải tự động phân tách thành các bản ghi mặt hàng (OrderItems) được gắn chính xác mã gian hàng `shop_id`. Điều này cho phép từng Vendor độc lập theo dõi, đóng gói và giao hàng cho sản phẩm thuộc shop mình.</w:t>
       </w:r>
     </w:p>
     <w:p>
@@ -14757,7 +18221,7 @@
           <w:color w:val="000000"/>
           <w:sz w:val="26"/>
         </w:rPr>
-        <w:t>Việc lựa chọn đề tài này giúp nhóm nghiên cứu áp dụng toàn diện các công nghệ doanh nghiệp hàng đầu (Java 17, Spring Boot 3, Spring Security 6, Spring Data JPA, Thymeleaf, MySQL 8) vào một sản phẩm phần mềm thực tế có quy mô lớn.</w:t>
+        <w:t>Việc lựa chọn đề tài 'Xây dựng ứng dụng Web Quản lý Sàn Thương mại Điện tử Đa nhà bán (Multi-Vendor Marketplace)' giúp nhóm sinh viên làm chủ trọn vẹn kiến trúc Java Enterprise, vận dụng sáng tạo các công nghệ tiên tiến (Java 17 LTS, Spring Boot 3.1.5, Spring Security 6, Spring Data JPA, Thymeleaf 3, MySQL 8) để giải quyết bài toán thực tế có quy mô và tính ứng dụng cao.</w:t>
       </w:r>
     </w:p>
     <w:p>
@@ -14787,7 +18251,7 @@
           <w:color w:val="000000"/>
           <w:sz w:val="26"/>
         </w:rPr>
-        <w:t>Đề tài hướng tới thực hiện trọn vẹn các mục tiêu lý thuyết và thực hành sau:</w:t>
+        <w:t>Đề tài được triển khai nhằm đạt được các mục tiêu lý thuyết và thực hành toàn diện sau đây:</w:t>
       </w:r>
     </w:p>
     <w:p>
@@ -14802,7 +18266,7 @@
           <w:color w:val="000000"/>
           <w:sz w:val="26"/>
         </w:rPr>
-        <w:t>• Xây dựng thành công ứng dụng Web Sàn thương mại điện tử đa nhà bán JVTech Marketplace hoạt động mượt mà, ổn định trên môi trường thực tế.</w:t>
+        <w:t>• Mục tiêu 1 - Lập trình ứng dụng hoàn chỉnh: Xây dựng ứng dụng Web Sàn thương mại điện tử đa nhà bán JVTech Marketplace vận hành ổn định, mượt mà trên môi trường thực tế, đáp ứng đầy đủ các luồng nghiệp vụ từ đăng ký, duyệt shop, đăng sản phẩm, giỏ hàng, đặt hàng, tách đơn đến đánh giá sản phẩm.</w:t>
       </w:r>
     </w:p>
     <w:p>
@@ -14817,7 +18281,7 @@
           <w:color w:val="000000"/>
           <w:sz w:val="26"/>
         </w:rPr>
-        <w:t>• Thiết lập hệ thống phân quyền 3 vai trò (Admin, Vendor, Customer) tích hợp mã hóa mật khẩu BCrypt và bộ lọc URL Spring Security.</w:t>
+        <w:t>• Mục tiêu 2 - Bảo mật và Phân quyền chặt chẽ: Ứng dụng Spring Security 6 để thiết lập hệ thống bảo mật chuẩn doanh nghiệp, mã hóa mật khẩu băm BCrypt, ngăn chặn các lỗ hổng bảo mật Web (XSS, CSRF, SQL Injection) và phân quyền kiểm soát truy cập URL chính xác cho 3 vai trò Admin, Vendor, Customer.</w:t>
       </w:r>
     </w:p>
     <w:p>
@@ -14832,7 +18296,7 @@
           <w:color w:val="000000"/>
           <w:sz w:val="26"/>
         </w:rPr>
-        <w:t>• Thiết kế CSDL quan hệ MySQL 8 gồm 8 bảng dữ liệu quan hệ được chuẩn hóa 3NF, đảm bảo toàn vẹn dữ liệu tham chiếu qua các khóa ngoại.</w:t>
+        <w:t>• Mục tiêu 3 - Thiết kế và tối ưu CSDL: Thiết kế cơ sở dữ liệu quan hệ MySQL 8 `tmdd_db` gồm 8 bảng dữ liệu quan hệ được chuẩn hóa 3NF (`users`, `shops`, `categories`, `products`, `orders`, `order_items`, `reviews`, `site_settings`), đảm bảo tính toàn vẹn dữ liệu tham chiếu qua các khóa ngoại.</w:t>
       </w:r>
     </w:p>
     <w:p>
@@ -14847,7 +18311,7 @@
           <w:color w:val="000000"/>
           <w:sz w:val="26"/>
         </w:rPr>
-        <w:t>• Hiện thực hóa thuật toán tách đơn hàng tự động linh hoạt theo từng gian hàng nhà bán.</w:t>
+        <w:t>• Mục tiêu 4 - Triển khai thuật toán tách đơn hàng: Hiện thực hóa thuật toán Vendor Order Splitting linh hoạt, tự động phân phối đơn hàng con cho các gian hàng ngay khi khách hàng hoàn tất thanh toán COD.</w:t>
       </w:r>
     </w:p>
     <w:p>
@@ -14862,7 +18326,7 @@
           <w:color w:val="000000"/>
           <w:sz w:val="26"/>
         </w:rPr>
-        <w:t>• Thiết kế giao diện Thymeleaf responsive tương thích 100% trên thiết bị PC, Tablet và Mobile.</w:t>
+        <w:t>• Mục tiêu 5 - Thiết kế giao diện hiện đại &amp; Responsive: Xây dựng hệ thống giao diện Thymeleaf 3 theo kiến trúc Layout Master (`layout/main.html`), tương thích 100% trên các thiết bị PC, Tablet và Smartphone. Trang chi tiết sản phẩm tích hợp gallery chuyển đổi ảnh thu nhỏ và bộ chọn biến thể màu sắc/kích cỡ linh hoạt.</w:t>
       </w:r>
     </w:p>
     <w:p>
@@ -14892,7 +18356,82 @@
           <w:color w:val="000000"/>
           <w:sz w:val="26"/>
         </w:rPr>
-        <w:t>• Đối tượng nghiên cứu: Ngôn ngữ Java 17 LTS, Framework Spring Boot 3.1.5, Spring Security 6, Spring Data JPA, Hibernate 6, Thymeleaf 3, MySQL 8.0, mô hình kiến trúc MVC, và các giao thức mạng HTTP/HTTPS.</w:t>
+        <w:t>• Đối tượng nghiên cứu:</w:t>
+      </w:r>
+    </w:p>
+    <w:p>
+      <w:pPr>
+        <w:pStyle w:val="18"/>
+        <w:spacing w:before="0" w:after="60" w:line="276" w:lineRule="auto"/>
+        <w:jc w:val="both"/>
+      </w:pPr>
+      <w:r>
+        <w:rPr>
+          <w:rFonts w:ascii="Times New Roman" w:hAnsi="Times New Roman"/>
+          <w:color w:val="000000"/>
+          <w:sz w:val="26"/>
+        </w:rPr>
+        <w:t>- Ngôn ngữ lập trình Java 17 LTS và môi trường thực thi JVM.</w:t>
+      </w:r>
+    </w:p>
+    <w:p>
+      <w:pPr>
+        <w:pStyle w:val="18"/>
+        <w:spacing w:before="0" w:after="60" w:line="276" w:lineRule="auto"/>
+        <w:jc w:val="both"/>
+      </w:pPr>
+      <w:r>
+        <w:rPr>
+          <w:rFonts w:ascii="Times New Roman" w:hAnsi="Times New Roman"/>
+          <w:color w:val="000000"/>
+          <w:sz w:val="26"/>
+        </w:rPr>
+        <w:t>- Framework Spring Boot 3.1.5 và các mô-đun Spring Framework (Spring MVC, Spring Security 6, Spring Data JPA).</w:t>
+      </w:r>
+    </w:p>
+    <w:p>
+      <w:pPr>
+        <w:pStyle w:val="18"/>
+        <w:spacing w:before="0" w:after="60" w:line="276" w:lineRule="auto"/>
+        <w:jc w:val="both"/>
+      </w:pPr>
+      <w:r>
+        <w:rPr>
+          <w:rFonts w:ascii="Times New Roman" w:hAnsi="Times New Roman"/>
+          <w:color w:val="000000"/>
+          <w:sz w:val="26"/>
+        </w:rPr>
+        <w:t>- Công nghệ ORM Hibernate 6 và Hệ quản trị CSDL quan hệ MySQL 8.0.</w:t>
+      </w:r>
+    </w:p>
+    <w:p>
+      <w:pPr>
+        <w:pStyle w:val="18"/>
+        <w:spacing w:before="0" w:after="60" w:line="276" w:lineRule="auto"/>
+        <w:jc w:val="both"/>
+      </w:pPr>
+      <w:r>
+        <w:rPr>
+          <w:rFonts w:ascii="Times New Roman" w:hAnsi="Times New Roman"/>
+          <w:color w:val="000000"/>
+          <w:sz w:val="26"/>
+        </w:rPr>
+        <w:t>- Server-side Template Engine Thymeleaf 3 và công nghệ dựng giao diện HTML5, CSS3, JavaScript, Bootstrap 5.</w:t>
+      </w:r>
+    </w:p>
+    <w:p>
+      <w:pPr>
+        <w:pStyle w:val="18"/>
+        <w:spacing w:before="0" w:after="60" w:line="276" w:lineRule="auto"/>
+        <w:jc w:val="both"/>
+      </w:pPr>
+      <w:r>
+        <w:rPr>
+          <w:rFonts w:ascii="Times New Roman" w:hAnsi="Times New Roman"/>
+          <w:color w:val="000000"/>
+          <w:sz w:val="26"/>
+        </w:rPr>
+        <w:t>- Kiến trúc thiết kế phần mềm doanh nghiệp MVC (Model - View - Controller) và chuẩn giao tiếp RESTful API.</w:t>
       </w:r>
     </w:p>
     <w:p>
@@ -14907,7 +18446,7 @@
           <w:color w:val="000000"/>
           <w:sz w:val="26"/>
         </w:rPr>
-        <w:t>• Phạm vi nghiên cứu: Tập trung vào quy trình nghiệp vụ cốt lõi của sàn thương mại điện tử đa nhà bán bao gồm:</w:t>
+        <w:t>• Phạm vi nghiên cứu:</w:t>
       </w:r>
     </w:p>
     <w:p>
@@ -14922,7 +18461,7 @@
           <w:color w:val="000000"/>
           <w:sz w:val="26"/>
         </w:rPr>
-        <w:t>- Quản lý tài khoản và phân quyền người dùng (Admin, Vendor, Customer).</w:t>
+        <w:t>- Phạm vi chức năng: Hệ thống tập trung xây dựng các phân hệ chức năng cốt lõi cho 3 tác nhân:</w:t>
       </w:r>
     </w:p>
     <w:p>
@@ -14937,7 +18476,7 @@
           <w:color w:val="000000"/>
           <w:sz w:val="26"/>
         </w:rPr>
-        <w:t>- Quản lý gian hàng (Đăng ký shop, duyệt shop, cập nhật thông tin cửa hàng).</w:t>
+        <w:t xml:space="preserve">  + Phân hệ Admin: Quản lý người dùng, duyệt/khóa tài khoản Vendor, quản lý danh mục sản phẩm sàn, cấu hình website và xem thống kê tổng quan sàn.</w:t>
       </w:r>
     </w:p>
     <w:p>
@@ -14952,7 +18491,7 @@
           <w:color w:val="000000"/>
           <w:sz w:val="26"/>
         </w:rPr>
-        <w:t>- Quản lý sản phẩm (Thêm, sửa, xóa, ẩn/hiện, quản lý danh mục, gallery ảnh, phân loại màu/size).</w:t>
+        <w:t xml:space="preserve">  + Phân hệ Vendor: Đăng ký thông tin shop, quản lý sản phẩm (thêm, sửa, xóa, ẩn/hiện, tải ảnh gallery, thiết lập giá và biến thể màu/size), tiếp nhận và cập nhật trạng thái đơn hàng shop mình.</w:t>
       </w:r>
     </w:p>
     <w:p>
@@ -14967,7 +18506,7 @@
           <w:color w:val="000000"/>
           <w:sz w:val="26"/>
         </w:rPr>
-        <w:t>- Quản lý giỏ hàng, đặt hàng COD và tự động tách đơn hàng.</w:t>
+        <w:t xml:space="preserve">  + Phân hệ Customer: Đăng ký/đăng nhập, tìm kiếm/lọc sản phẩm, xem chi tiết gallery ảnh, chọn màu/size, giỏ hàng, đặt hàng COD, theo dõi đơn hàng và viết đánh giá 1-5 sao.</w:t>
       </w:r>
     </w:p>
     <w:p>
@@ -14982,37 +18521,7 @@
           <w:color w:val="000000"/>
           <w:sz w:val="26"/>
         </w:rPr>
-        <w:t>- Quản lý trạng thái đơn hàng (PENDING, PROCESSING, SHIPPED, DELIVERED, CANCELLED).</w:t>
-      </w:r>
-    </w:p>
-    <w:p>
-      <w:pPr>
-        <w:pStyle w:val="18"/>
-        <w:spacing w:before="0" w:after="60" w:line="276" w:lineRule="auto"/>
-        <w:jc w:val="both"/>
-      </w:pPr>
-      <w:r>
-        <w:rPr>
-          <w:rFonts w:ascii="Times New Roman" w:hAnsi="Times New Roman"/>
-          <w:color w:val="000000"/>
-          <w:sz w:val="26"/>
-        </w:rPr>
-        <w:t>- Đánh giá sản phẩm và xếp hạng sao (1-5 sao).</w:t>
-      </w:r>
-    </w:p>
-    <w:p>
-      <w:pPr>
-        <w:pStyle w:val="18"/>
-        <w:spacing w:before="0" w:after="60" w:line="276" w:lineRule="auto"/>
-        <w:jc w:val="both"/>
-      </w:pPr>
-      <w:r>
-        <w:rPr>
-          <w:rFonts w:ascii="Times New Roman" w:hAnsi="Times New Roman"/>
-          <w:color w:val="000000"/>
-          <w:sz w:val="26"/>
-        </w:rPr>
-        <w:t>- Báo cáo thống kê tổng quan doanh thu dành cho Admin và Vendor.</w:t>
+        <w:t>- Phạm vi môi trường: Ứng dụng được cài đặt và thực nghiệm trên môi trường máy chủ Web Server nhúng Tomcat 10, kết nối CSDL MySQL 8.0 local.</w:t>
       </w:r>
     </w:p>
     <w:p>
@@ -15042,13 +18551,13 @@
           <w:color w:val="000000"/>
           <w:sz w:val="26"/>
         </w:rPr>
-        <w:t>• Phương pháp nghiên cứu lý thuyết: Đọc và tổng hợp tài liệu chính thức từ Oracle Java Documentation, Spring Framework Reference, Thymeleaf Guides và MySQL Documentation.</w:t>
+        <w:t>Nhóm nghiên cứu áp dụng kết hợp các phương pháp khoa học và kỹ thuật phần mềm tiên tiến:</w:t>
       </w:r>
     </w:p>
     <w:p>
       <w:pPr>
-        <w:pStyle w:val="8"/>
-        <w:spacing w:before="0" w:after="80" w:line="276" w:lineRule="auto"/>
+        <w:pStyle w:val="18"/>
+        <w:spacing w:before="0" w:after="60" w:line="276" w:lineRule="auto"/>
         <w:jc w:val="both"/>
       </w:pPr>
       <w:r>
@@ -15057,13 +18566,13 @@
           <w:color w:val="000000"/>
           <w:sz w:val="26"/>
         </w:rPr>
-        <w:t>• Phương pháp phân tích thiết kế phần mềm: Tiến hành khảo sát yêu cầu người dùng, phân tích các Use Case nghiệp vụ, dựng sơ đồ UML (Use Case, Activity, Sequence, Class Diagram) và thiết kế ERD CSDL.</w:t>
+        <w:t>1. Phương pháp nghiên cứu tài liệu (Literature Review): Đọc và phân tích tài liệu kỹ thuật chính thức từ Oracle Java SE 17 Manual, Spring Boot Reference Documentation, Spring Security Architecture Guides, Thymeleaf 3 Documentation và MySQL 8.0 Reference Manual.</w:t>
       </w:r>
     </w:p>
     <w:p>
       <w:pPr>
-        <w:pStyle w:val="8"/>
-        <w:spacing w:before="0" w:after="80" w:line="276" w:lineRule="auto"/>
+        <w:pStyle w:val="18"/>
+        <w:spacing w:before="0" w:after="60" w:line="276" w:lineRule="auto"/>
         <w:jc w:val="both"/>
       </w:pPr>
       <w:r>
@@ -15072,7 +18581,37 @@
           <w:color w:val="000000"/>
           <w:sz w:val="26"/>
         </w:rPr>
-        <w:t>• Phương pháp lập trình và thử nghiệm: Viết mã nguồn Java Spring Boot theo mô hình phân lớp MVC, xây dựng CSDL MySQL và tiến hành kiểm thử ma trận test cases.</w:t>
+        <w:t>2. Phương pháp phân tích và thiết kế hệ thống (System Analysis &amp; Design): Khảo sát yêu cầu người dùng, phân tích các Use Case nghiệp vụ, xây dựng mô hình UML (Use Case Diagram, Activity Diagram, Sequence Diagram, Class Diagram) và thiết kế sơ đồ liên kết cơ sở dữ liệu ERD.</w:t>
+      </w:r>
+    </w:p>
+    <w:p>
+      <w:pPr>
+        <w:pStyle w:val="18"/>
+        <w:spacing w:before="0" w:after="60" w:line="276" w:lineRule="auto"/>
+        <w:jc w:val="both"/>
+      </w:pPr>
+      <w:r>
+        <w:rPr>
+          <w:rFonts w:ascii="Times New Roman" w:hAnsi="Times New Roman"/>
+          <w:color w:val="000000"/>
+          <w:sz w:val="26"/>
+        </w:rPr>
+        <w:t>3. Phương pháp phát triển phần mềm Agile/Scrum: Chia nhỏ quá trình phát triển thành các sprint tính năng (Sprint 1: Cấu hình CSDL &amp; Security; Sprint 2: Quản lý User &amp; Shop; Sprint 3: Quản lý Product &amp; Gallery; Sprint 4: Giỏ hàng, Đặt hàng &amp; Tách đơn; Sprint 5: Đánh giá &amp; Dashboard; Sprint 6: Kiểm thử &amp; Đóng gói).</w:t>
+      </w:r>
+    </w:p>
+    <w:p>
+      <w:pPr>
+        <w:pStyle w:val="18"/>
+        <w:spacing w:before="0" w:after="60" w:line="276" w:lineRule="auto"/>
+        <w:jc w:val="both"/>
+      </w:pPr>
+      <w:r>
+        <w:rPr>
+          <w:rFonts w:ascii="Times New Roman" w:hAnsi="Times New Roman"/>
+          <w:color w:val="000000"/>
+          <w:sz w:val="26"/>
+        </w:rPr>
+        <w:t>4. Phương pháp kiểm thử phần mềm (Software Testing): Thực thi kiểm thử ma trận Test Cases (Unit Testing, Integration Testing, Black-box Testing) để đảm bảo chất lượng phần mềm trước khi nghiệm thu.</w:t>
       </w:r>
     </w:p>
     <w:p>
@@ -15102,7 +18641,7 @@
           <w:color w:val="000000"/>
           <w:sz w:val="26"/>
         </w:rPr>
-        <w:t>• Ý nghĩa học thuật: Giúp sinh viên nắm vững phương pháp thiết kế ứng dụng phần mềm quy mô lớn, làm chủ cơ chế Dependency Injection (DI), Inversion of Control (IoC), ORM Mapping và Spring Security FilterChain.</w:t>
+        <w:t>• Ý nghĩa về mặt lý thuyết và khoa học: Giúp sinh viên hệ thống hóa và làm chủ trọn vẹn kiến thức lập trình Java Enterprise; hiểu sâu sắc cơ chế Dependency Injection (DI), Inversion of Control (IoC), ORM Persistence Context, Spring Security FilterChain và mô hình phân lớp MVC.</w:t>
       </w:r>
     </w:p>
     <w:p>
@@ -15117,7 +18656,7 @@
           <w:color w:val="000000"/>
           <w:sz w:val="26"/>
         </w:rPr>
-        <w:t>• Ý nghĩa thực tiễn: Cung cấp bộ giải pháp mã nguồn Web Sàn thương mại điện tử đa nhà bán có khả năng mở rộng cao, sẵn sàng triển khai thực tế cho các doanh nghiệp thương mại số.</w:t>
+        <w:t>• Ý nghĩa về mặt thực tiễn: Tạo ra một sản phẩm phần mềm Web Sàn thương mại điện tử đa nhà bán hoàn chỉnh, có tính ứng dụng cao, khả năng mở rộng tốt, sẵn sàng triển khai làm nền tảng kinh doanh trực tuyến cho các doanh nghiệp vừa và nhỏ (SMEs).</w:t>
       </w:r>
     </w:p>
     <w:p>
@@ -15147,7 +18686,7 @@
           <w:color w:val="000000"/>
           <w:sz w:val="26"/>
         </w:rPr>
-        <w:t>Báo cáo được chia thành 6 chương chính cùng các danh mục phụ trợ:</w:t>
+        <w:t>Báo cáo bài tập lớn đề tài CNJ18 được trình bày logic và mạch lạc gồm 6 chương chính cùng các mục phụ trợ:</w:t>
       </w:r>
     </w:p>
     <w:p>
@@ -15162,7 +18701,7 @@
           <w:color w:val="000000"/>
           <w:sz w:val="26"/>
         </w:rPr>
-        <w:t>Chương 1: Tổng quan đề tài - Trình bày lý do, mục tiêu, đối tượng, phạm vi, phương pháp và ý nghĩa đề tài.</w:t>
+        <w:t>• LỜI NÓI ĐẦU &amp; MỤC LỤC TỰ ĐỘNG</w:t>
       </w:r>
     </w:p>
     <w:p>
@@ -15177,7 +18716,7 @@
           <w:color w:val="000000"/>
           <w:sz w:val="26"/>
         </w:rPr>
-        <w:t>Chương 2: Cơ sở lý thuyết - Trình bày tổng quan E-Commerce, mô hình Multi-Vendor, Java 17, Spring Boot, Spring Security, JPA/Hibernate, Thymeleaf, MySQL, MVC và kiến trúc hệ thống.</w:t>
+        <w:t>• DANH MỤC BẢNG BIỂU VÀ SƠ ĐỒ</w:t>
       </w:r>
     </w:p>
     <w:p>
@@ -15192,7 +18731,7 @@
           <w:color w:val="000000"/>
           <w:sz w:val="26"/>
         </w:rPr>
-        <w:t>Chương 3: Phân tích và thiết kế hệ thống - Khảo sát yêu cầu, phân tích tác nhân, yêu cầu chức năng/phi chức năng, sơ đồ UML Use Case, Activity, Sequence, Class Diagram và CSDL ERD.</w:t>
+        <w:t>• CHƯƠNG 1. TỔNG QUAN ĐỀ TÀI - Trình bày lý do chọn đề tài, mục tiêu, đối tượng, phạm vi, phương pháp và ý nghĩa đề tài.</w:t>
       </w:r>
     </w:p>
     <w:p>
@@ -15207,7 +18746,7 @@
           <w:color w:val="000000"/>
           <w:sz w:val="26"/>
         </w:rPr>
-        <w:t>Chương 4: Xây dựng hệ thống - Cấu trúc project, kết nối MySQL, mã nguồn Entities, Repositories, Services, Controllers, Security Configs, giao diện Thymeleaf và 17 module chức năng.</w:t>
+        <w:t>• CHƯƠNG 2. CƠ SỞ LÝ THUYẾT - Trình bày tổng quan E-Commerce, mô hình Multi-Vendor, Java 17, Spring Boot, Spring Security, JPA/Hibernate, Thymeleaf, MySQL, MVC và kiến trúc hệ thống.</w:t>
       </w:r>
     </w:p>
     <w:p>
@@ -15222,7 +18761,7 @@
           <w:color w:val="000000"/>
           <w:sz w:val="26"/>
         </w:rPr>
-        <w:t>Chương 5: Kiểm thử và đánh giá - Mô tả môi trường kiểm thử, 45 ma trận test cases chi tiết, kết quả kiểm thử và phân tích hạn chế.</w:t>
+        <w:t>• CHƯƠNG 3. PHÂN TÍCH VÀ THIẾT KẾ HỆ THỐNG - Khảo sát yêu cầu, phân tích tác nhân, yêu cầu chức năng/phi chức năng, sơ đồ UML Use Case, Activity, Sequence, Class Diagram và CSDL ERD.</w:t>
       </w:r>
     </w:p>
     <w:p>
@@ -15237,7 +18776,52 @@
           <w:color w:val="000000"/>
           <w:sz w:val="26"/>
         </w:rPr>
-        <w:t>Chương 6: Kết luận và hướng phát triển - Tóm tắt kết quả đạt được, hạn chế tồn tại và định hướng phát triển trong tương lai.</w:t>
+        <w:t>• CHƯƠNG 4. XÂY DỰNG HỆ THỐNG - Cấu trúc project, kết nối MySQL, mã nguồn Entities, Repositories, Services, Controllers, Security Configs, giao diện Thymeleaf và 17 module chức năng.</w:t>
+      </w:r>
+    </w:p>
+    <w:p>
+      <w:pPr>
+        <w:pStyle w:val="18"/>
+        <w:spacing w:before="0" w:after="60" w:line="276" w:lineRule="auto"/>
+        <w:jc w:val="both"/>
+      </w:pPr>
+      <w:r>
+        <w:rPr>
+          <w:rFonts w:ascii="Times New Roman" w:hAnsi="Times New Roman"/>
+          <w:color w:val="000000"/>
+          <w:sz w:val="26"/>
+        </w:rPr>
+        <w:t>• CHƯƠNG 5. KIỂM THỬ VÀ ĐÁNH GIÁ - Mô tả môi trường kiểm thử, 45 ma trận test cases chi tiết, kết quả kiểm thử và phân tích hạn chế.</w:t>
+      </w:r>
+    </w:p>
+    <w:p>
+      <w:pPr>
+        <w:pStyle w:val="18"/>
+        <w:spacing w:before="0" w:after="60" w:line="276" w:lineRule="auto"/>
+        <w:jc w:val="both"/>
+      </w:pPr>
+      <w:r>
+        <w:rPr>
+          <w:rFonts w:ascii="Times New Roman" w:hAnsi="Times New Roman"/>
+          <w:color w:val="000000"/>
+          <w:sz w:val="26"/>
+        </w:rPr>
+        <w:t>• CHƯƠNG 6. KẾT LUẬN VÀ HƯỚNG PHÁT TRIỂN - Tóm tắt kết quả đạt được, hạn chế tồn tại và định hướng phát triển trong tương lai.</w:t>
+      </w:r>
+    </w:p>
+    <w:p>
+      <w:pPr>
+        <w:pStyle w:val="18"/>
+        <w:spacing w:before="0" w:after="60" w:line="276" w:lineRule="auto"/>
+        <w:jc w:val="both"/>
+      </w:pPr>
+      <w:r>
+        <w:rPr>
+          <w:rFonts w:ascii="Times New Roman" w:hAnsi="Times New Roman"/>
+          <w:color w:val="000000"/>
+          <w:sz w:val="26"/>
+        </w:rPr>
+        <w:t>• TÀI LIỆU THAM KHẢO</w:t>
       </w:r>
     </w:p>
     <w:p>

</xml_diff>

<commit_message>
docs: apply exact Heading 1, 2, 3 and Normal template styles to Chapter 1
</commit_message>
<xml_diff>
--- a/DeTaiCNJ18_Nhom7.docx
+++ b/DeTaiCNJ18_Nhom7.docx
@@ -1389,8 +1389,14 @@
       </w:pPr>
       <w:r>
         <w:fldChar w:fldCharType="begin"/>
+      </w:r>
+      <w:r>
         <w:instrText xml:space="preserve">TOC \o "1-3" \h \z \u</w:instrText>
+      </w:r>
+      <w:r>
         <w:fldChar w:fldCharType="separate"/>
+      </w:r>
+      <w:r>
         <w:fldChar w:fldCharType="end"/>
       </w:r>
     </w:p>
@@ -1405,1200 +1411,784 @@
     </w:p>
     <w:p>
       <w:pPr>
-        <w:spacing w:line="312" w:lineRule="auto" w:before="240" w:after="240"/>
+        <w:pStyle w:val="2"/>
+        <w:bidi w:val="0"/>
+      </w:pPr>
+      <w:r>
+        <w:t>LỜI MỞ ĐẦU</w:t>
+      </w:r>
+    </w:p>
+    <w:p>
+      <w:pPr>
+        <w:bidi w:val="0"/>
+        <w:ind w:firstLine="720" w:firstLineChars="0"/>
+        <w:jc w:val="both"/>
+      </w:pPr>
+      <w:r>
+        <w:t>Trong kỷ nguyên số hóa và sự phát triển vượt bậc của Đô thị hóa hiện đại, thương mại điện tử (E-Commerce) đã trở thành một thành tố không thể thiếu trong hạ tầng kinh tế toàn cầu. Việc ứng dụng Công nghệ thông tin vào quản lý kênh phân phối, quản lý đại lý và tối ưu hóa quy trình bán hàng trực tuyến đóng vai trò quyết định tới năng lực cạnh tranh của các doanh nghiệp. Trong đó, ngành kinh doanh đồ gia dụng – bao gồm các sản phẩm thiết yếu phục vụ đời sống gia đình, thiết bị nhà bếp, thiết bị điện và chăm sóc không gian sống – là một trong những lĩnh vực có tốc độ tăng trưởng quy mô thị trường vô cùng mạnh mẽ.</w:t>
+      </w:r>
+    </w:p>
+    <w:p>
+      <w:pPr>
+        <w:bidi w:val="0"/>
+        <w:ind w:firstLine="720" w:firstLineChars="0"/>
+        <w:jc w:val="both"/>
+      </w:pPr>
+      <w:r>
+        <w:t>Tuy nhiên, phương thức quản lý đại lý kinh doanh đồ gia dụng truyền thống đang bộc lộ nhiều hạn chế bất cập như: dữ liệu tồn kho phân tán, quản lý đơn hàng thủ công dễ gây ra sai sót, thông tin giữa nhà sản xuất/nhà phân phối và các đại lý bán lẻ thiếu tính đồng bộ tức thời, cũng như khó khăn trong việc theo dõi doanh thu và đánh giá hiệu quả kinh doanh. Xuất phát từ nhu cầu thực tiễn đó, việc nghiên cứu và phát triển một giải pháp phần mềm quản lý đại lý kinh doanh đồ gia dụng trực tuyến hiện đại, ứng dụng mô hình đa nhà bán hàng (Multi-vendor Marketplace) là vô cùng cần thiết.</w:t>
+      </w:r>
+    </w:p>
+    <w:p>
+      <w:pPr>
+        <w:bidi w:val="0"/>
+        <w:ind w:firstLine="720" w:firstLineChars="0"/>
+        <w:jc w:val="both"/>
+      </w:pPr>
+      <w:r>
+        <w:t>Nghiên cứu bài tập lớn học phần Công nghệ Java với đề tài: "Xây dựng phần mềm quản lý đại lý kinh doanh đồ gia dụng" (Đề tài CNJ18) được triển khai nhằm giải quyết bài toán trên. Hệ thống được xây dựng dựa trên nền tảng công nghệ mạnh mẽ và phổ biến bậc nhất hiện nay: Java Spring Boot Framework, kết hợp với Spring Data JPA, Spring Security, Thymeleaf Template Engine và Hệ quản trị cơ sở dữ liệu MySQL. Phần mềm cung cấp giải pháp toàn diện hỗ trợ 3 nhóm tác nhân chính: Quản trị viên (Admin), Nhà bán hàng/Đại lý (Seller/Vendor) và Khách hàng (Customer).</w:t>
+      </w:r>
+    </w:p>
+    <w:p>
+      <w:pPr>
+        <w:bidi w:val="0"/>
+        <w:ind w:firstLine="720" w:firstLineChars="0"/>
+        <w:jc w:val="both"/>
+      </w:pPr>
+      <w:r>
+        <w:t>Trong quá trình nghiên cứu và thực hiện bài tập lớn, Nhóm 7 đã nỗ lực vận dụng các kiến thức đã học cùng sự tìm tòi, nghiên cứu tài liệu thực tế để hoàn thành báo cáo và phần mềm. Nhóm xin gửi lời cảm ơn chân thành và sâu sắc nhất tới Thầy giáo hướng dẫn Trần Bá Hùng – Giảng viên Khoa Công nghệ Thông tin, Trường Đại học Công nghệ Đông Á. Sự hướng dẫn tận tình, những góp ý chuyên môn quý báu của Thầy chính là kim chỉ nam giúp Nhóm định hướng đúng đắn và hoàn thành tốt đề tài này.</w:t>
+      </w:r>
+    </w:p>
+    <w:p>
+      <w:pPr>
+        <w:bidi w:val="0"/>
+        <w:ind w:firstLine="720" w:firstLineChars="0"/>
+        <w:jc w:val="both"/>
+      </w:pPr>
+      <w:r>
+        <w:t>Dù đã cố gắng hết sức để hoàn thiện báo cáo và chương trình một cách chỉn chu nhất, song do hạn chế về mặt thời gian cũng như kinh nghiệm thực tiễn, đề tài khó tránh khỏi những thiếu sót nhất định. Nhóm rất mong nhận được những ý kiến đóng góp, nhận xét quý báu từ Thầy giáo cùng các bạn sinh viên để đề tài ngày càng được hoàn thiện và có tính ứng dụng cao hơn.</w:t>
+      </w:r>
+    </w:p>
+    <w:p>
+      <w:pPr>
+        <w:spacing w:before="0" w:after="0"/>
+        <w:ind w:firstLine="0"/>
+      </w:pPr>
+      <w:r>
+        <w:br w:type="page"/>
+      </w:r>
+    </w:p>
+    <w:p>
+      <w:pPr>
+        <w:pStyle w:val="2"/>
+        <w:bidi w:val="0"/>
+        <w:spacing w:before="240" w:after="240"/>
         <w:ind w:firstLine="0"/>
         <w:jc w:val="center"/>
       </w:pPr>
       <w:r>
-        <w:rPr>
-          <w:rFonts w:ascii="Times New Roman" w:hAnsi="Times New Roman"/>
-          <w:b/>
-          <w:i w:val="0"/>
-          <w:color w:val="000000"/>
-          <w:sz w:val="28"/>
-        </w:rPr>
-        <w:t>LỜI MỞ ĐẦU</w:t>
-      </w:r>
-    </w:p>
-    <w:p>
-      <w:pPr>
-        <w:spacing w:line="312" w:lineRule="auto" w:before="0" w:after="120"/>
-        <w:ind w:firstLine="567"/>
-        <w:jc w:val="both"/>
-      </w:pPr>
-      <w:r>
-        <w:rPr>
-          <w:rFonts w:ascii="Times New Roman" w:hAnsi="Times New Roman"/>
-          <w:b w:val="0"/>
-          <w:i w:val="0"/>
-          <w:color w:val="000000"/>
-          <w:sz w:val="26"/>
-        </w:rPr>
-        <w:t>Trong kỷ nguyên số hóa và sự phát triển vượt bậc của Đô thị hóa hiện đại, thương mại điện tử (E-Commerce) đã trở thành một thành tố không thể thiếu trong hạ tầng kinh tế toàn cầu. Việc ứng dụng Công nghệ thông tin vào quản lý kênh phân phối, quản lý đại lý và tối ưu hóa quy trình bán hàng trực tuyến đóng vai trò quyết định tới năng lực cạnh tranh của các doanh nghiệp. Trong đó, ngành kinh doanh đồ gia dụng – bao gồm các sản phẩm thiết yếu phục vụ đời sống gia đình, thiết bị nhà bếp, thiết bị điện và chăm sóc không gian sống – là một trong những lĩnh vực có tốc độ tăng trưởng quy mô thị trường vô cùng mạnh mẽ.</w:t>
-      </w:r>
-    </w:p>
-    <w:p>
-      <w:pPr>
-        <w:spacing w:line="312" w:lineRule="auto" w:before="0" w:after="120"/>
-        <w:ind w:firstLine="567"/>
-        <w:jc w:val="both"/>
-      </w:pPr>
-      <w:r>
-        <w:rPr>
-          <w:rFonts w:ascii="Times New Roman" w:hAnsi="Times New Roman"/>
-          <w:b w:val="0"/>
-          <w:i w:val="0"/>
-          <w:color w:val="000000"/>
-          <w:sz w:val="26"/>
-        </w:rPr>
-        <w:t>Tuy nhiên, phương thức quản lý đại lý kinh doanh đồ gia dụng truyền thống đang bộc lộ nhiều hạn chế bất cập như: dữ liệu tồn kho phân tán, quản lý đơn hàng thủ công dễ gây ra sai sót, thông tin giữa nhà sản xuất/nhà phân phối và các đại lý bán lẻ thiếu tính đồng bộ tức thời, cũng như khó khăn trong việc theo dõi doanh thu và đánh giá hiệu quả kinh doanh. Xuất phát từ nhu cầu thực tiễn đó, việc nghiên cứu và phát triển một giải pháp phần mềm quản lý đại lý kinh doanh đồ gia dụng trực tuyến hiện đại, ứng dụng mô hình đa nhà bán hàng (Multi-vendor Marketplace) là vô cùng cần thiết.</w:t>
-      </w:r>
-    </w:p>
-    <w:p>
-      <w:pPr>
-        <w:spacing w:line="312" w:lineRule="auto" w:before="0" w:after="120"/>
-        <w:ind w:firstLine="567"/>
-        <w:jc w:val="both"/>
-      </w:pPr>
-      <w:r>
-        <w:rPr>
-          <w:rFonts w:ascii="Times New Roman" w:hAnsi="Times New Roman"/>
-          <w:b w:val="0"/>
-          <w:i w:val="0"/>
-          <w:color w:val="000000"/>
-          <w:sz w:val="26"/>
-        </w:rPr>
-        <w:t>Nghiên cứu bài tập lớn học phần Công nghệ Java với đề tài: "Xây dựng phần mềm quản lý đại lý kinh doanh đồ gia dụng" (Đề tài CNJ18) được triển khai nhằm giải quyết bài toán trên. Hệ thống được xây dựng dựa trên nền tảng công nghệ mạnh mẽ và phổ biến bậc nhất hiện nay: Java Spring Boot Framework, kết hợp với Spring Data JPA, Spring Security, Thymeleaf Template Engine và Hệ quản trị cơ sở dữ liệu MySQL. Phần mềm cung cấp giải pháp toàn diện hỗ trợ 3 nhóm tác nhân chính: Quản trị viên (Admin), Nhà bán hàng/Đại lý (Seller/Vendor) và Khách hàng (Customer).</w:t>
-      </w:r>
-    </w:p>
-    <w:p>
-      <w:pPr>
-        <w:spacing w:line="312" w:lineRule="auto" w:before="0" w:after="120"/>
-        <w:ind w:firstLine="567"/>
-        <w:jc w:val="both"/>
-      </w:pPr>
-      <w:r>
-        <w:rPr>
-          <w:rFonts w:ascii="Times New Roman" w:hAnsi="Times New Roman"/>
-          <w:b w:val="0"/>
-          <w:i w:val="0"/>
-          <w:color w:val="000000"/>
-          <w:sz w:val="26"/>
-        </w:rPr>
-        <w:t>Trong quá trình nghiên cứu và thực hiện bài tập lớn, Nhóm 7 đã nỗ lực vận dụng các kiến thức đã học cùng sự tìm tòi, nghiên cứu tài liệu thực tế để hoàn thành báo cáo và phần mềm. Nhóm xin gửi lời cảm ơn chân thành và sâu sắc nhất tới Thầy giáo hướng dẫn Trần Bá Hùng – Giảng viên Khoa Công nghệ Thông tin, Trường Đại học Công nghệ Đông Á. Sự hướng dẫn tận tình, những góp ý chuyên môn quý báu của Thầy chính là kim chỉ nam giúp Nhóm định hướng đúng đắn và hoàn thành tốt đề tài này.</w:t>
-      </w:r>
-    </w:p>
-    <w:p>
-      <w:pPr>
-        <w:spacing w:line="312" w:lineRule="auto" w:before="0" w:after="120"/>
-        <w:ind w:firstLine="567"/>
-        <w:jc w:val="both"/>
-      </w:pPr>
-      <w:r>
-        <w:rPr>
-          <w:rFonts w:ascii="Times New Roman" w:hAnsi="Times New Roman"/>
-          <w:b w:val="0"/>
-          <w:i w:val="0"/>
-          <w:color w:val="000000"/>
-          <w:sz w:val="26"/>
-        </w:rPr>
-        <w:t>Dù đã cố gắng hết sức để hoàn thiện báo cáo và chương trình một cách chỉn chu nhất, song do hạn chế về mặt thời gian cũng như kinh nghiệm thực tiễn, đề tài khó tránh khỏi những thiếu sót nhất định. Nhóm rất mong nhận được những ý kiến đóng góp, nhận xét quý báu từ Thầy giáo cùng các bạn sinh viên để đề tài ngày càng được hoàn thiện và có tính ứng dụng cao hơn.</w:t>
-      </w:r>
-    </w:p>
-    <w:p>
-      <w:pPr>
-        <w:spacing w:line="312" w:lineRule="auto" w:before="0" w:after="120"/>
-        <w:ind w:firstLine="567"/>
-        <w:jc w:val="both"/>
-      </w:pPr>
-      <w:r>
-        <w:rPr>
-          <w:rFonts w:ascii="Times New Roman" w:hAnsi="Times New Roman"/>
-          <w:b w:val="0"/>
-          <w:i/>
-          <w:color w:val="000000"/>
-          <w:sz w:val="26"/>
-        </w:rPr>
-        <w:t>Nhóm sinh viên thực hiện – Nhóm 7.</w:t>
-      </w:r>
-    </w:p>
-    <w:p>
-      <w:pPr>
-        <w:spacing w:before="0" w:after="0"/>
-        <w:ind w:firstLine="0"/>
-      </w:pPr>
-      <w:r>
-        <w:br w:type="page"/>
-      </w:r>
-    </w:p>
-    <w:p>
-      <w:pPr>
-        <w:spacing w:line="312" w:lineRule="auto" w:before="240" w:after="240"/>
-        <w:ind w:firstLine="0"/>
-        <w:jc w:val="center"/>
-      </w:pPr>
-      <w:r>
-        <w:rPr>
-          <w:rFonts w:ascii="Times New Roman" w:hAnsi="Times New Roman"/>
-          <w:b/>
-          <w:i w:val="0"/>
-          <w:color w:val="000000"/>
-          <w:sz w:val="28"/>
-        </w:rPr>
+        <w:rPr/>
         <w:t>CHƯƠNG 1: TỔNG QUAN VỀ ĐỀ TÀI</w:t>
       </w:r>
     </w:p>
     <w:p>
       <w:pPr>
-        <w:spacing w:line="312" w:lineRule="auto" w:before="200" w:after="80"/>
+        <w:pStyle w:val="3"/>
+        <w:bidi w:val="0"/>
+        <w:spacing w:before="200" w:after="80"/>
         <w:ind w:firstLine="0"/>
         <w:jc w:val="left"/>
       </w:pPr>
       <w:r>
-        <w:rPr>
-          <w:rFonts w:ascii="Times New Roman" w:hAnsi="Times New Roman"/>
-          <w:b/>
-          <w:i w:val="0"/>
-          <w:color w:val="000000"/>
-          <w:sz w:val="26"/>
-        </w:rPr>
+        <w:rPr/>
         <w:t>1.1. Lý do chọn đề tài</w:t>
       </w:r>
     </w:p>
     <w:p>
       <w:pPr>
-        <w:spacing w:line="312" w:lineRule="auto" w:before="0" w:after="120"/>
+        <w:spacing w:before="0" w:after="120" w:line="312" w:lineRule="auto"/>
+        <w:ind w:firstLineChars="0" w:firstLine="567"/>
+        <w:jc w:val="both"/>
+      </w:pPr>
+      <w:r>
+        <w:rPr/>
+        <w:t>Cùng với sự bùng nổ của Cách mạng Công nghiệp 4.0, thói quen tiêu dùng của người dân đã có sự dịch chuyển mạnh mẽ từ mua sắm truyền thống sang các nền tảng thương mại điện tử trực tuyến. Ngành hàng đồ gia dụng (bao gồm thiết bị điện tử gia dụng, dụng cụ nhà bếp, thiết bị tiện ích gia đình) có đặc thù là mẫu mã đa dạng, chủng loại phong phú và nhu cầu thay thế, nâng cấp thường xuyên từ phía người tiêu dùng. Để đáp ứng nhu cầu thị trường, các doanh nghiệp kinh doanh đồ gia dụng không chỉ bán hàng trực tiếp mà còn xây dựng mạng lưới đại lý phân phối rộng khắp.</w:t>
+      </w:r>
+    </w:p>
+    <w:p>
+      <w:pPr>
+        <w:spacing w:before="0" w:after="120" w:line="312" w:lineRule="auto"/>
         <w:ind w:firstLine="567"/>
         <w:jc w:val="both"/>
       </w:pPr>
       <w:r>
-        <w:rPr>
-          <w:rFonts w:ascii="Times New Roman" w:hAnsi="Times New Roman"/>
-          <w:b w:val="0"/>
-          <w:i w:val="0"/>
-          <w:color w:val="000000"/>
-          <w:sz w:val="26"/>
-        </w:rPr>
-        <w:t>Cùng với sự bùng nổ của Cách mạng Công nghiệp 4.0, thói quen tiêu dùng của người dân đã có sự dịch chuyển mạnh mẽ từ mua sắm truyền thống sang các nền tảng thương mại điện tử trực tuyến. Ngành hàng đồ gia dụng (bao gồm thiết bị điện tử gia dụng, dụng cụ nhà bếp, thiết bị tiện ích gia đình) có đặc thù là mẫu mã đa dạng, chủng loại phong phú và nhu cầu thay thế, nâng cấp thường xuyên từ phía người tiêu dùng. Để đáp ứng nhu cầu thị trường, các doanh nghiệp kinh doanh đồ gia dụng không chỉ bán hàng trực tiếp mà còn xây dựng mạng lưới đại lý phân phối rộng khắp.</w:t>
-      </w:r>
-    </w:p>
-    <w:p>
-      <w:pPr>
-        <w:spacing w:line="312" w:lineRule="auto" w:before="0" w:after="120"/>
+        <w:rPr/>
+        <w:t>Mặc dù vậy, công tác quản lý hệ thống đại lý kinh doanh đồ gia dụng hiện nay đang gặp phải nhiều thách thức lớn:</w:t>
+      </w:r>
+    </w:p>
+    <w:p>
+      <w:pPr>
+        <w:spacing w:before="0" w:after="80" w:line="312" w:lineRule="auto"/>
+        <w:ind w:firstLine="283"/>
+        <w:jc w:val="both"/>
+      </w:pPr>
+      <w:r>
+        <w:rPr/>
+        <w:t>• Quản lý dữ liệu phân tán: Thông tin sản phẩm, danh mục đồ gia dụng, giá bán và số lượng tồn kho tại từng đại lý thường được lưu trữ rời rạc qua file Excel hoặc sổ sách thủ công, dẫn đến tình trạng bất đồng bộ dữ liệu.</w:t>
+      </w:r>
+    </w:p>
+    <w:p>
+      <w:pPr>
+        <w:spacing w:before="0" w:after="80" w:line="312" w:lineRule="auto"/>
+        <w:ind w:firstLine="283"/>
+        <w:jc w:val="both"/>
+      </w:pPr>
+      <w:r>
+        <w:rPr/>
+        <w:t>• Quy trình xử lý đơn hàng chậm trễ: Việc tiếp nhận đơn đặt hàng từ khách hàng, phân bổ đơn cho đại lý, cập nhật trạng thái giao hàng và đối soát doanh thu tốn nhiều thời gian và dễ phát sinh sai sót.</w:t>
+      </w:r>
+    </w:p>
+    <w:p>
+      <w:pPr>
+        <w:spacing w:before="0" w:after="80" w:line="312" w:lineRule="auto"/>
+        <w:ind w:firstLine="283"/>
+        <w:jc w:val="both"/>
+      </w:pPr>
+      <w:r>
+        <w:rPr/>
+        <w:t>• Thiếu công cụ tương tác trực tiếp: Khách hàng gặp khó khăn khi tìm kiếm các đại lý uy tín cung cấp đồ gia dụng chính hãng, so sánh giá cả và xem đánh giá chất lượng sản phẩm.</w:t>
+      </w:r>
+    </w:p>
+    <w:p>
+      <w:pPr>
+        <w:spacing w:before="0" w:after="80" w:line="312" w:lineRule="auto"/>
+        <w:ind w:firstLine="283"/>
+        <w:jc w:val="both"/>
+      </w:pPr>
+      <w:r>
+        <w:rPr/>
+        <w:t>• Khó khăn trong việc kiểm soát bảo mật và phân quyền: Các hệ thống cũ thiếu cơ chế phân quyền chặt chẽ giữa Quản trị viên hệ thống, Chủ đại lý (Nhà bán hàng) và Khách hàng.</w:t>
+      </w:r>
+    </w:p>
+    <w:p>
+      <w:pPr>
+        <w:spacing w:before="0" w:after="120" w:line="312" w:lineRule="auto"/>
         <w:ind w:firstLine="567"/>
         <w:jc w:val="both"/>
       </w:pPr>
       <w:r>
-        <w:rPr>
-          <w:rFonts w:ascii="Times New Roman" w:hAnsi="Times New Roman"/>
-          <w:b w:val="0"/>
-          <w:i w:val="0"/>
-          <w:color w:val="000000"/>
-          <w:sz w:val="26"/>
-        </w:rPr>
-        <w:t>Mặc dù vậy, công tác quản lý hệ thống đại lý kinh doanh đồ gia dụng hiện nay đang gặp phải nhiều thách thức lớn:</w:t>
-      </w:r>
-    </w:p>
-    <w:p>
-      <w:pPr>
-        <w:spacing w:line="312" w:lineRule="auto" w:before="0" w:after="80"/>
-        <w:ind w:firstLine="283"/>
-        <w:jc w:val="both"/>
-      </w:pPr>
-      <w:r>
-        <w:rPr>
-          <w:rFonts w:ascii="Times New Roman" w:hAnsi="Times New Roman"/>
-          <w:b w:val="0"/>
-          <w:i w:val="0"/>
-          <w:color w:val="000000"/>
-          <w:sz w:val="26"/>
-        </w:rPr>
-        <w:t>• Quản lý dữ liệu phân tán: Thông tin sản phẩm, danh mục đồ gia dụng, giá bán và số lượng tồn kho tại từng đại lý thường được lưu trữ rời rạc qua file Excel hoặc sổ sách thủ công, dẫn đến tình trạng bất đồng bộ dữ liệu.</w:t>
-      </w:r>
-    </w:p>
-    <w:p>
-      <w:pPr>
-        <w:spacing w:line="312" w:lineRule="auto" w:before="0" w:after="80"/>
-        <w:ind w:firstLine="283"/>
-        <w:jc w:val="both"/>
-      </w:pPr>
-      <w:r>
-        <w:rPr>
-          <w:rFonts w:ascii="Times New Roman" w:hAnsi="Times New Roman"/>
-          <w:b w:val="0"/>
-          <w:i w:val="0"/>
-          <w:color w:val="000000"/>
-          <w:sz w:val="26"/>
-        </w:rPr>
-        <w:t>• Quy trình xử lý đơn hàng chậm trễ: Việc tiếp nhận đơn đặt hàng từ khách hàng, phân bổ đơn cho đại lý, cập nhật trạng thái giao hàng và đối soát doanh thu tốn nhiều thời gian và dễ phát sinh sai sót.</w:t>
-      </w:r>
-    </w:p>
-    <w:p>
-      <w:pPr>
-        <w:spacing w:line="312" w:lineRule="auto" w:before="0" w:after="80"/>
-        <w:ind w:firstLine="283"/>
-        <w:jc w:val="both"/>
-      </w:pPr>
-      <w:r>
-        <w:rPr>
-          <w:rFonts w:ascii="Times New Roman" w:hAnsi="Times New Roman"/>
-          <w:b w:val="0"/>
-          <w:i w:val="0"/>
-          <w:color w:val="000000"/>
-          <w:sz w:val="26"/>
-        </w:rPr>
-        <w:t>• Thiếu công cụ tương tác trực tiếp: Khách hàng gặp khó khăn khi tìm kiếm các đại lý uy tín cung cấp đồ gia dụng chính hãng, so sánh giá cả và xem đánh giá chất lượng sản phẩm.</w:t>
-      </w:r>
-    </w:p>
-    <w:p>
-      <w:pPr>
-        <w:spacing w:line="312" w:lineRule="auto" w:before="0" w:after="80"/>
-        <w:ind w:firstLine="283"/>
-        <w:jc w:val="both"/>
-      </w:pPr>
-      <w:r>
-        <w:rPr>
-          <w:rFonts w:ascii="Times New Roman" w:hAnsi="Times New Roman"/>
-          <w:b w:val="0"/>
-          <w:i w:val="0"/>
-          <w:color w:val="000000"/>
-          <w:sz w:val="26"/>
-        </w:rPr>
-        <w:t>• Khó khăn trong việc kiểm soát bảo mật và phân quyền: Các hệ thống cũ thiếu cơ chế phân quyền chặt chẽ giữa Quản trị viên hệ thống, Chủ đại lý (Nhà bán hàng) và Khách hàng.</w:t>
-      </w:r>
-    </w:p>
-    <w:p>
-      <w:pPr>
-        <w:spacing w:line="312" w:lineRule="auto" w:before="0" w:after="120"/>
-        <w:ind w:firstLine="567"/>
-        <w:jc w:val="both"/>
-      </w:pPr>
-      <w:r>
-        <w:rPr>
-          <w:rFonts w:ascii="Times New Roman" w:hAnsi="Times New Roman"/>
-          <w:b w:val="0"/>
-          <w:i w:val="0"/>
-          <w:color w:val="000000"/>
-          <w:sz w:val="26"/>
-        </w:rPr>
+        <w:rPr/>
         <w:t>Để giải quyết triệt để các tồn tại trên, việc phát triển giải pháp phần mềm quản lý đại lý kinh doanh đồ gia dụng tích hợp mô hình Multi-vendor Marketplace trên nền tảng công nghệ Java là một giải pháp mang tính chiến lược. Java và đặc biệt là Spring Boot Framework nổi tiếng với tính đóng gói, độ tin cậy cao, khả năng bảo mật mạnh mẽ (Spring Security) và hiệu năng xử lý giao dịch thương mại ổn định. Do đó, Nhóm 7 đã lựa chọn đề tài "Xây dựng phần mềm quản lý đại lý kinh doanh đồ gia dụng" làm Bài tập lớn học phần Công nghệ Java.</w:t>
       </w:r>
     </w:p>
     <w:p>
       <w:pPr>
-        <w:spacing w:line="312" w:lineRule="auto" w:before="200" w:after="80"/>
+        <w:pStyle w:val="3"/>
+        <w:bidi w:val="0"/>
+        <w:spacing w:before="200" w:after="80"/>
         <w:ind w:firstLine="0"/>
         <w:jc w:val="left"/>
       </w:pPr>
       <w:r>
-        <w:rPr>
-          <w:rFonts w:ascii="Times New Roman" w:hAnsi="Times New Roman"/>
-          <w:b/>
-          <w:i w:val="0"/>
-          <w:color w:val="000000"/>
-          <w:sz w:val="26"/>
-        </w:rPr>
+        <w:rPr/>
         <w:t>1.2. Mục tiêu của đề tài</w:t>
       </w:r>
     </w:p>
     <w:p>
       <w:pPr>
-        <w:spacing w:line="312" w:lineRule="auto" w:before="120" w:after="40"/>
+        <w:pStyle w:val="4"/>
+        <w:bidi w:val="0"/>
+        <w:spacing w:before="120" w:after="40"/>
         <w:ind w:firstLine="0"/>
         <w:jc w:val="left"/>
       </w:pPr>
-      <w:r>
-        <w:rPr>
-          <w:rFonts w:ascii="Times New Roman" w:hAnsi="Times New Roman"/>
-          <w:b/>
-          <w:i/>
-          <w:color w:val="000000"/>
-          <w:sz w:val="26"/>
-        </w:rPr>
+      <w:bookmarkStart w:id="1" w:name="_GoBack"/>
+      <w:r>
+        <w:rPr/>
         <w:t>1.2.1. Mục tiêu tổng quát</w:t>
       </w:r>
     </w:p>
-    <w:p>
-      <w:pPr>
-        <w:spacing w:line="312" w:lineRule="auto" w:before="0" w:after="120"/>
+    <w:bookmarkEnd w:id="1"/>
+    <w:p>
+      <w:pPr>
+        <w:spacing w:before="0" w:after="120" w:line="312" w:lineRule="auto"/>
         <w:ind w:firstLine="567"/>
         <w:jc w:val="both"/>
       </w:pPr>
       <w:r>
-        <w:rPr>
-          <w:rFonts w:ascii="Times New Roman" w:hAnsi="Times New Roman"/>
-          <w:b w:val="0"/>
-          <w:i w:val="0"/>
-          <w:color w:val="000000"/>
-          <w:sz w:val="26"/>
-        </w:rPr>
+        <w:rPr/>
         <w:t>Mục tiêu tổng quát của đề tài là nghiên cứu, thiết kế và cài đặt hoàn chỉnh một phần mềm quản lý đại lý kinh doanh đồ gia dụng chạy trên nền tảng Web Application với ngôn ngữ Java và Spring Boot Framework. Hệ thống hỗ trợ quản lý tập trung mạng lưới đại lý, danh mục sản phẩm đồ gia dụng, quy trình bán hàng và chăm sóc khách hàng trực tuyến an toàn, tối ưu.</w:t>
       </w:r>
     </w:p>
     <w:p>
       <w:pPr>
-        <w:spacing w:line="312" w:lineRule="auto" w:before="120" w:after="40"/>
+        <w:pStyle w:val="4"/>
+        <w:spacing w:before="120" w:after="40" w:line="312" w:lineRule="auto"/>
         <w:ind w:firstLine="0"/>
         <w:jc w:val="left"/>
       </w:pPr>
       <w:r>
-        <w:rPr>
-          <w:rFonts w:ascii="Times New Roman" w:hAnsi="Times New Roman"/>
-          <w:b/>
-          <w:i/>
-          <w:color w:val="000000"/>
-          <w:sz w:val="26"/>
-        </w:rPr>
+        <w:rPr/>
         <w:t>1.2.2. Mục tiêu cụ thể</w:t>
       </w:r>
     </w:p>
     <w:p>
       <w:pPr>
-        <w:spacing w:line="312" w:lineRule="auto" w:before="0" w:after="120"/>
+        <w:spacing w:before="0" w:after="120" w:line="312" w:lineRule="auto"/>
         <w:ind w:firstLine="567"/>
         <w:jc w:val="both"/>
       </w:pPr>
       <w:r>
-        <w:rPr>
-          <w:rFonts w:ascii="Times New Roman" w:hAnsi="Times New Roman"/>
-          <w:b w:val="0"/>
-          <w:i w:val="0"/>
-          <w:color w:val="000000"/>
-          <w:sz w:val="26"/>
-        </w:rPr>
+        <w:rPr/>
         <w:t>Để đạt được mục tiêu tổng quát, đề tài đề ra các mục tiêu cụ thể bao gồm:</w:t>
       </w:r>
     </w:p>
     <w:p>
       <w:pPr>
-        <w:spacing w:line="312" w:lineRule="auto" w:before="0" w:after="80"/>
-        <w:ind w:firstLine="283"/>
-        <w:jc w:val="both"/>
-      </w:pPr>
-      <w:r>
-        <w:rPr>
-          <w:rFonts w:ascii="Times New Roman" w:hAnsi="Times New Roman"/>
-          <w:b w:val="0"/>
-          <w:i w:val="0"/>
-          <w:color w:val="000000"/>
-          <w:sz w:val="26"/>
-        </w:rPr>
+        <w:spacing w:before="0" w:after="80" w:line="312" w:lineRule="auto"/>
+        <w:ind w:firstLine="283"/>
+        <w:jc w:val="both"/>
+      </w:pPr>
+      <w:r>
+        <w:rPr/>
         <w:t>• Xây dựng cơ sở dữ liệu quan hệ chuẩn hóa trên MySQL: Thiết kế các bảng lưu trữ thông tin tài khoản người dùng, vai trò (Role), danh mục sản phẩm (Category), sản phẩm gia dụng (Product), đại lý (Shop/Vendor), đơn hàng (Order, OrderItem) và đánh giá (Review).</w:t>
       </w:r>
     </w:p>
     <w:p>
       <w:pPr>
-        <w:spacing w:line="312" w:lineRule="auto" w:before="0" w:after="80"/>
-        <w:ind w:firstLine="283"/>
-        <w:jc w:val="both"/>
-      </w:pPr>
-      <w:r>
-        <w:rPr>
-          <w:rFonts w:ascii="Times New Roman" w:hAnsi="Times New Roman"/>
-          <w:b w:val="0"/>
-          <w:i w:val="0"/>
-          <w:color w:val="000000"/>
-          <w:sz w:val="26"/>
-        </w:rPr>
+        <w:spacing w:before="0" w:after="80" w:line="312" w:lineRule="auto"/>
+        <w:ind w:firstLine="283"/>
+        <w:jc w:val="both"/>
+      </w:pPr>
+      <w:r>
+        <w:rPr/>
         <w:t>• Cài đặt phân quyền người dùng đa cấp độ (Role-Based Access Control): Tích hợp Spring Security để xác thực và phân quyền chính xác cho 3 nhóm đối tượng: Admin, Seller (Đại lý) và Customer (Khách hàng).</w:t>
       </w:r>
     </w:p>
     <w:p>
       <w:pPr>
-        <w:spacing w:line="312" w:lineRule="auto" w:before="0" w:after="80"/>
-        <w:ind w:firstLine="283"/>
-        <w:jc w:val="both"/>
-      </w:pPr>
-      <w:r>
-        <w:rPr>
-          <w:rFonts w:ascii="Times New Roman" w:hAnsi="Times New Roman"/>
-          <w:b w:val="0"/>
-          <w:i w:val="0"/>
-          <w:color w:val="000000"/>
-          <w:sz w:val="26"/>
-        </w:rPr>
+        <w:spacing w:before="0" w:after="80" w:line="312" w:lineRule="auto"/>
+        <w:ind w:firstLine="283"/>
+        <w:jc w:val="both"/>
+      </w:pPr>
+      <w:r>
+        <w:rPr/>
         <w:t>• Phát triển Mô-đun Quản trị hệ thống (Admin Panel): Cho phép Admin duyệt hồ sơ đăng ký mở đại lý mới, quản lý danh mục sản phẩm đồ gia dụng toàn hệ thống, quản lý tài khoản và cấu hình thiết lập website.</w:t>
       </w:r>
     </w:p>
     <w:p>
       <w:pPr>
-        <w:spacing w:line="312" w:lineRule="auto" w:before="0" w:after="80"/>
-        <w:ind w:firstLine="283"/>
-        <w:jc w:val="both"/>
-      </w:pPr>
-      <w:r>
-        <w:rPr>
-          <w:rFonts w:ascii="Times New Roman" w:hAnsi="Times New Roman"/>
-          <w:b w:val="0"/>
-          <w:i w:val="0"/>
-          <w:color w:val="000000"/>
-          <w:sz w:val="26"/>
-        </w:rPr>
+        <w:spacing w:before="0" w:after="80" w:line="312" w:lineRule="auto"/>
+        <w:ind w:firstLine="283"/>
+        <w:jc w:val="both"/>
+      </w:pPr>
+      <w:r>
+        <w:rPr/>
         <w:t>• Phát triển Mô-đun Quản lý cho Đại lý (Seller/Vendor Panel): Cho phép các đại lý cập nhật thông tin cửa hàng, đăng bán các mặt hàng đồ gia dụng, quản lý kho hàng, tiếp nhận và xử lý trạng thái đơn hàng (PENDING, PROCESSING, SHIPPED, DELIVERED, CANCELLED).</w:t>
       </w:r>
     </w:p>
     <w:p>
       <w:pPr>
-        <w:spacing w:line="312" w:lineRule="auto" w:before="0" w:after="80"/>
-        <w:ind w:firstLine="283"/>
-        <w:jc w:val="both"/>
-      </w:pPr>
-      <w:r>
-        <w:rPr>
-          <w:rFonts w:ascii="Times New Roman" w:hAnsi="Times New Roman"/>
-          <w:b w:val="0"/>
-          <w:i w:val="0"/>
-          <w:color w:val="000000"/>
-          <w:sz w:val="26"/>
-        </w:rPr>
+        <w:spacing w:before="0" w:after="80" w:line="312" w:lineRule="auto"/>
+        <w:ind w:firstLine="283"/>
+        <w:jc w:val="both"/>
+      </w:pPr>
+      <w:r>
+        <w:rPr/>
         <w:t>• Phát triển Giao diện Mua sắm cho Khách hàng (Customer Storefront): Cho phép khách hàng duyệt xem danh mục đồ gia dụng, tìm kiếm sản phẩm, xem chi tiết sản phẩm và đại lý phân phối, quản lý giỏ hàng, đặt hàng trực tuyến và gửi đánh giá sản phẩm.</w:t>
       </w:r>
     </w:p>
     <w:p>
       <w:pPr>
-        <w:spacing w:line="312" w:lineRule="auto" w:before="0" w:after="80"/>
-        <w:ind w:firstLine="283"/>
-        <w:jc w:val="both"/>
-      </w:pPr>
-      <w:r>
-        <w:rPr>
-          <w:rFonts w:ascii="Times New Roman" w:hAnsi="Times New Roman"/>
-          <w:b w:val="0"/>
-          <w:i w:val="0"/>
-          <w:color w:val="000000"/>
-          <w:sz w:val="26"/>
-        </w:rPr>
+        <w:spacing w:before="0" w:after="80" w:line="312" w:lineRule="auto"/>
+        <w:ind w:firstLine="283"/>
+        <w:jc w:val="both"/>
+      </w:pPr>
+      <w:r>
+        <w:rPr/>
         <w:t>• Tối ưu hóa giao diện người dùng: Sử dụng HTML5, CSS3, JavaScript, Bootstrap kết hợp với Thymeleaf Template Engine để tạo giao diện thân thiện, tương thích trên nhiều thiết bị.</w:t>
       </w:r>
     </w:p>
     <w:p>
       <w:pPr>
-        <w:spacing w:line="312" w:lineRule="auto" w:before="200" w:after="80"/>
+        <w:pStyle w:val="3"/>
+        <w:spacing w:before="200" w:after="80" w:line="312" w:lineRule="auto"/>
         <w:ind w:firstLine="0"/>
         <w:jc w:val="left"/>
       </w:pPr>
       <w:r>
-        <w:rPr>
-          <w:rFonts w:ascii="Times New Roman" w:hAnsi="Times New Roman"/>
-          <w:b/>
-          <w:i w:val="0"/>
-          <w:color w:val="000000"/>
-          <w:sz w:val="26"/>
-        </w:rPr>
+        <w:rPr/>
         <w:t>1.3. Đối tượng và phạm vi nghiên cứu</w:t>
       </w:r>
     </w:p>
     <w:p>
       <w:pPr>
-        <w:spacing w:line="312" w:lineRule="auto" w:before="120" w:after="40"/>
+        <w:pStyle w:val="4"/>
+        <w:spacing w:before="120" w:after="40" w:line="312" w:lineRule="auto"/>
         <w:ind w:firstLine="0"/>
         <w:jc w:val="left"/>
       </w:pPr>
       <w:r>
-        <w:rPr>
-          <w:rFonts w:ascii="Times New Roman" w:hAnsi="Times New Roman"/>
-          <w:b/>
-          <w:i/>
-          <w:color w:val="000000"/>
-          <w:sz w:val="26"/>
-        </w:rPr>
+        <w:rPr/>
         <w:t>1.3.1. Đối tượng nghiên cứu</w:t>
       </w:r>
     </w:p>
     <w:p>
       <w:pPr>
-        <w:spacing w:line="312" w:lineRule="auto" w:before="0" w:after="120"/>
+        <w:spacing w:before="0" w:after="120" w:line="312" w:lineRule="auto"/>
         <w:ind w:firstLine="567"/>
         <w:jc w:val="both"/>
       </w:pPr>
       <w:r>
-        <w:rPr>
-          <w:rFonts w:ascii="Times New Roman" w:hAnsi="Times New Roman"/>
-          <w:b w:val="0"/>
-          <w:i w:val="0"/>
-          <w:color w:val="000000"/>
-          <w:sz w:val="26"/>
-        </w:rPr>
+        <w:rPr/>
         <w:t>Đối tượng nghiên cứu của đề tài bao gồm:</w:t>
       </w:r>
     </w:p>
     <w:p>
       <w:pPr>
-        <w:spacing w:line="312" w:lineRule="auto" w:before="0" w:after="80"/>
-        <w:ind w:firstLine="283"/>
-        <w:jc w:val="both"/>
-      </w:pPr>
-      <w:r>
-        <w:rPr>
-          <w:rFonts w:ascii="Times New Roman" w:hAnsi="Times New Roman"/>
-          <w:b w:val="0"/>
-          <w:i w:val="0"/>
-          <w:color w:val="000000"/>
-          <w:sz w:val="26"/>
-        </w:rPr>
+        <w:spacing w:before="0" w:after="80" w:line="312" w:lineRule="auto"/>
+        <w:ind w:firstLine="283"/>
+        <w:jc w:val="both"/>
+      </w:pPr>
+      <w:r>
+        <w:rPr/>
         <w:t>• Quy trình nghiệp vụ quản lý đại lý kinh doanh đồ gia dụng: Quản lý thông tin gian hàng đại lý, đăng tải sản phẩm gia dụng, quy trình luân chuyển đơn hàng và đối soát doanh thu.</w:t>
       </w:r>
     </w:p>
     <w:p>
       <w:pPr>
-        <w:spacing w:line="312" w:lineRule="auto" w:before="0" w:after="80"/>
-        <w:ind w:firstLine="283"/>
-        <w:jc w:val="both"/>
-      </w:pPr>
-      <w:r>
-        <w:rPr>
-          <w:rFonts w:ascii="Times New Roman" w:hAnsi="Times New Roman"/>
-          <w:b w:val="0"/>
-          <w:i w:val="0"/>
-          <w:color w:val="000000"/>
-          <w:sz w:val="26"/>
-        </w:rPr>
+        <w:spacing w:before="0" w:after="80" w:line="312" w:lineRule="auto"/>
+        <w:ind w:firstLine="283"/>
+        <w:jc w:val="both"/>
+      </w:pPr>
+      <w:r>
+        <w:rPr/>
         <w:t>• Khung ứng dụng Java Spring Boot: Cơ chế Inversion of Control (IoC), Dependency Injection (DI), Spring MVC, Spring Data JPA / Hibernate ORM.</w:t>
       </w:r>
     </w:p>
     <w:p>
       <w:pPr>
-        <w:spacing w:line="312" w:lineRule="auto" w:before="0" w:after="80"/>
-        <w:ind w:firstLine="283"/>
-        <w:jc w:val="both"/>
-      </w:pPr>
-      <w:r>
-        <w:rPr>
-          <w:rFonts w:ascii="Times New Roman" w:hAnsi="Times New Roman"/>
-          <w:b w:val="0"/>
-          <w:i w:val="0"/>
-          <w:color w:val="000000"/>
-          <w:sz w:val="26"/>
-        </w:rPr>
+        <w:spacing w:before="0" w:after="80" w:line="312" w:lineRule="auto"/>
+        <w:ind w:firstLine="283"/>
+        <w:jc w:val="both"/>
+      </w:pPr>
+      <w:r>
+        <w:rPr/>
         <w:t>• Cơ chế bảo mật Spring Security: Mã hóa mật khẩu bằng BCryptPasswordEncoder, quản lý phiên làm việc (Session Management), phân quyền truy cập phương thức và URL theo Role.</w:t>
       </w:r>
     </w:p>
     <w:p>
       <w:pPr>
-        <w:spacing w:line="312" w:lineRule="auto" w:before="0" w:after="80"/>
-        <w:ind w:firstLine="283"/>
-        <w:jc w:val="both"/>
-      </w:pPr>
-      <w:r>
-        <w:rPr>
-          <w:rFonts w:ascii="Times New Roman" w:hAnsi="Times New Roman"/>
-          <w:b w:val="0"/>
-          <w:i w:val="0"/>
-          <w:color w:val="000000"/>
-          <w:sz w:val="26"/>
-        </w:rPr>
+        <w:spacing w:before="0" w:after="80" w:line="312" w:lineRule="auto"/>
+        <w:ind w:firstLine="283"/>
+        <w:jc w:val="both"/>
+      </w:pPr>
+      <w:r>
+        <w:rPr/>
         <w:t>• Công nghệ giao diện Thymeleaf: Cách thức nhúng dữ liệu động từ Spring Controller sang giao diện HTML.</w:t>
       </w:r>
     </w:p>
     <w:p>
       <w:pPr>
-        <w:spacing w:line="312" w:lineRule="auto" w:before="0" w:after="80"/>
-        <w:ind w:firstLine="283"/>
-        <w:jc w:val="both"/>
-      </w:pPr>
-      <w:r>
-        <w:rPr>
-          <w:rFonts w:ascii="Times New Roman" w:hAnsi="Times New Roman"/>
-          <w:b w:val="0"/>
-          <w:i w:val="0"/>
-          <w:color w:val="000000"/>
-          <w:sz w:val="26"/>
-        </w:rPr>
+        <w:spacing w:before="0" w:after="80" w:line="312" w:lineRule="auto"/>
+        <w:ind w:firstLine="283"/>
+        <w:jc w:val="both"/>
+      </w:pPr>
+      <w:r>
+        <w:rPr/>
         <w:t>• Hệ quản trị cơ sở dữ liệu quan hệ MySQL: Thiết kế sơ đồ quan hệ Entity-Relationship (ERD), tối ưu truy vấn SQL.</w:t>
       </w:r>
     </w:p>
     <w:p>
       <w:pPr>
-        <w:spacing w:line="312" w:lineRule="auto" w:before="120" w:after="40"/>
+        <w:pStyle w:val="4"/>
+        <w:spacing w:before="120" w:after="40" w:line="312" w:lineRule="auto"/>
         <w:ind w:firstLine="0"/>
         <w:jc w:val="left"/>
       </w:pPr>
       <w:r>
-        <w:rPr>
-          <w:rFonts w:ascii="Times New Roman" w:hAnsi="Times New Roman"/>
-          <w:b/>
-          <w:i/>
-          <w:color w:val="000000"/>
-          <w:sz w:val="26"/>
-        </w:rPr>
+        <w:rPr/>
         <w:t>1.3.2. Phạm vi nghiên cứu</w:t>
       </w:r>
     </w:p>
     <w:p>
       <w:pPr>
-        <w:spacing w:line="312" w:lineRule="auto" w:before="0" w:after="120"/>
+        <w:spacing w:before="0" w:after="120" w:line="312" w:lineRule="auto"/>
         <w:ind w:firstLine="567"/>
         <w:jc w:val="both"/>
       </w:pPr>
       <w:r>
-        <w:rPr>
-          <w:rFonts w:ascii="Times New Roman" w:hAnsi="Times New Roman"/>
-          <w:b w:val="0"/>
-          <w:i w:val="0"/>
-          <w:color w:val="000000"/>
-          <w:sz w:val="26"/>
-        </w:rPr>
+        <w:rPr/>
         <w:t>Phạm vi nghiên cứu của đề tài được giới hạn như sau:</w:t>
       </w:r>
     </w:p>
     <w:p>
       <w:pPr>
-        <w:spacing w:line="312" w:lineRule="auto" w:before="0" w:after="80"/>
-        <w:ind w:firstLine="283"/>
-        <w:jc w:val="both"/>
-      </w:pPr>
-      <w:r>
-        <w:rPr>
-          <w:rFonts w:ascii="Times New Roman" w:hAnsi="Times New Roman"/>
-          <w:b w:val="0"/>
-          <w:i w:val="0"/>
-          <w:color w:val="000000"/>
-          <w:sz w:val="26"/>
-        </w:rPr>
+        <w:spacing w:before="0" w:after="80" w:line="312" w:lineRule="auto"/>
+        <w:ind w:firstLine="283"/>
+        <w:jc w:val="both"/>
+      </w:pPr>
+      <w:r>
+        <w:rPr/>
         <w:t>• Phạm vi chức năng: Hệ thống tập trung giải quyết các bài toán quản lý đại lý đồ gia dụng cốt lõi (Đăng ký đại lý, Quản lý sản phẩm gia dụng, Giỏ hàng, Đặt hàng, Duyệt đơn, Đánh giá sản phẩm). Chưa tích hợp cổng thanh toán trực tuyến qua ngân hàng/ví điện tử thực tế và dịch vụ vận chuyển bên thứ ba (chỉ mô phỏng quy trình).</w:t>
       </w:r>
     </w:p>
     <w:p>
       <w:pPr>
-        <w:spacing w:line="312" w:lineRule="auto" w:before="0" w:after="80"/>
-        <w:ind w:firstLine="283"/>
-        <w:jc w:val="both"/>
-      </w:pPr>
-      <w:r>
-        <w:rPr>
-          <w:rFonts w:ascii="Times New Roman" w:hAnsi="Times New Roman"/>
-          <w:b w:val="0"/>
-          <w:i w:val="0"/>
-          <w:color w:val="000000"/>
-          <w:sz w:val="26"/>
-        </w:rPr>
+        <w:spacing w:before="0" w:after="80" w:line="312" w:lineRule="auto"/>
+        <w:ind w:firstLine="283"/>
+        <w:jc w:val="both"/>
+      </w:pPr>
+      <w:r>
+        <w:rPr/>
         <w:t>• Phạm vi đối tượng sử dụng: Áp dụng cho các đại lý kinh doanh đồ gia dụng vừa và nhỏ, người quản trị hệ thống và khách hàng mua sắm lẻ.</w:t>
       </w:r>
     </w:p>
     <w:p>
       <w:pPr>
-        <w:spacing w:line="312" w:lineRule="auto" w:before="0" w:after="80"/>
-        <w:ind w:firstLine="283"/>
-        <w:jc w:val="both"/>
-      </w:pPr>
-      <w:r>
-        <w:rPr>
-          <w:rFonts w:ascii="Times New Roman" w:hAnsi="Times New Roman"/>
-          <w:b w:val="0"/>
-          <w:i w:val="0"/>
-          <w:color w:val="000000"/>
-          <w:sz w:val="26"/>
-        </w:rPr>
+        <w:spacing w:before="0" w:after="80" w:line="312" w:lineRule="auto"/>
+        <w:ind w:firstLine="283"/>
+        <w:jc w:val="both"/>
+      </w:pPr>
+      <w:r>
+        <w:rPr/>
         <w:t>• Phạm vi môi trường ứng dụng: Chương trình thử nghiệm trong môi trường Localhost trên máy tính cá nhân, phục vụ đánh giá kết quả Bài tập lớn môn Công nghệ Java.</w:t>
       </w:r>
     </w:p>
     <w:p>
       <w:pPr>
-        <w:spacing w:line="312" w:lineRule="auto" w:before="200" w:after="80"/>
+        <w:pStyle w:val="3"/>
+        <w:spacing w:before="200" w:after="80" w:line="312" w:lineRule="auto"/>
         <w:ind w:firstLine="0"/>
         <w:jc w:val="left"/>
       </w:pPr>
       <w:r>
-        <w:rPr>
-          <w:rFonts w:ascii="Times New Roman" w:hAnsi="Times New Roman"/>
-          <w:b/>
-          <w:i w:val="0"/>
-          <w:color w:val="000000"/>
-          <w:sz w:val="26"/>
-        </w:rPr>
+        <w:rPr/>
         <w:t>1.4. Phương pháp thực hiện</w:t>
       </w:r>
     </w:p>
     <w:p>
       <w:pPr>
-        <w:spacing w:line="312" w:lineRule="auto" w:before="0" w:after="120"/>
+        <w:spacing w:before="0" w:after="120" w:line="312" w:lineRule="auto"/>
         <w:ind w:firstLine="567"/>
         <w:jc w:val="both"/>
       </w:pPr>
       <w:r>
-        <w:rPr>
-          <w:rFonts w:ascii="Times New Roman" w:hAnsi="Times New Roman"/>
-          <w:b w:val="0"/>
-          <w:i w:val="0"/>
-          <w:color w:val="000000"/>
-          <w:sz w:val="26"/>
-        </w:rPr>
+        <w:rPr/>
         <w:t>Để hoàn thành đề tài một cách khoa học và đạt chất lượng cao, Nhóm 7 đã áp dụng phối hợp các phương pháp nghiên cứu và phát triển phần mềm sau:</w:t>
       </w:r>
     </w:p>
     <w:p>
       <w:pPr>
-        <w:spacing w:line="312" w:lineRule="auto" w:before="120" w:after="40"/>
+        <w:pStyle w:val="4"/>
+        <w:spacing w:before="120" w:after="40" w:line="312" w:lineRule="auto"/>
         <w:ind w:firstLine="0"/>
         <w:jc w:val="left"/>
       </w:pPr>
       <w:r>
-        <w:rPr>
-          <w:rFonts w:ascii="Times New Roman" w:hAnsi="Times New Roman"/>
-          <w:b/>
-          <w:i/>
-          <w:color w:val="000000"/>
-          <w:sz w:val="26"/>
-        </w:rPr>
+        <w:rPr/>
         <w:t>1.4.1. Phương pháp nghiên cứu lý thuyết</w:t>
       </w:r>
     </w:p>
     <w:p>
       <w:pPr>
-        <w:spacing w:line="312" w:lineRule="auto" w:before="0" w:after="80"/>
-        <w:ind w:firstLine="283"/>
-        <w:jc w:val="both"/>
-      </w:pPr>
-      <w:r>
-        <w:rPr>
-          <w:rFonts w:ascii="Times New Roman" w:hAnsi="Times New Roman"/>
-          <w:b w:val="0"/>
-          <w:i w:val="0"/>
-          <w:color w:val="000000"/>
-          <w:sz w:val="26"/>
-        </w:rPr>
+        <w:spacing w:before="0" w:after="80" w:line="312" w:lineRule="auto"/>
+        <w:ind w:firstLine="283"/>
+        <w:jc w:val="both"/>
+      </w:pPr>
+      <w:r>
+        <w:rPr/>
         <w:t>• Nghiên cứu tài liệu chính thống về ngôn ngữ Java, kiến trúc Spring Boot, Spring Security và Hibernate/JPA từ trang chủ Spring.io.</w:t>
       </w:r>
     </w:p>
     <w:p>
       <w:pPr>
-        <w:spacing w:line="312" w:lineRule="auto" w:before="0" w:after="80"/>
-        <w:ind w:firstLine="283"/>
-        <w:jc w:val="both"/>
-      </w:pPr>
-      <w:r>
-        <w:rPr>
-          <w:rFonts w:ascii="Times New Roman" w:hAnsi="Times New Roman"/>
-          <w:b w:val="0"/>
-          <w:i w:val="0"/>
-          <w:color w:val="000000"/>
-          <w:sz w:val="26"/>
-        </w:rPr>
+        <w:spacing w:before="0" w:after="80" w:line="312" w:lineRule="auto"/>
+        <w:ind w:firstLine="283"/>
+        <w:jc w:val="both"/>
+      </w:pPr>
+      <w:r>
+        <w:rPr/>
         <w:t>• Tham khảo các mô hình quản lý đại lý và sàn thương mại điện tử Multi-vendor thực tế trên thế giới và tại Việt Nam.</w:t>
       </w:r>
     </w:p>
     <w:p>
       <w:pPr>
-        <w:spacing w:line="312" w:lineRule="auto" w:before="0" w:after="80"/>
-        <w:ind w:firstLine="283"/>
-        <w:jc w:val="both"/>
-      </w:pPr>
-      <w:r>
-        <w:rPr>
-          <w:rFonts w:ascii="Times New Roman" w:hAnsi="Times New Roman"/>
-          <w:b w:val="0"/>
-          <w:i w:val="0"/>
-          <w:color w:val="000000"/>
-          <w:sz w:val="26"/>
-        </w:rPr>
+        <w:spacing w:before="0" w:after="80" w:line="312" w:lineRule="auto"/>
+        <w:ind w:firstLine="283"/>
+        <w:jc w:val="both"/>
+      </w:pPr>
+      <w:r>
+        <w:rPr/>
         <w:t>• Tổng hợp kiến thức từ giáo trình học phần Công nghệ Java do Thầy Trần Bá Hùng giảng dạy.</w:t>
       </w:r>
     </w:p>
     <w:p>
       <w:pPr>
-        <w:spacing w:line="312" w:lineRule="auto" w:before="120" w:after="40"/>
+        <w:pStyle w:val="4"/>
+        <w:spacing w:before="120" w:after="40" w:line="312" w:lineRule="auto"/>
         <w:ind w:firstLine="0"/>
         <w:jc w:val="left"/>
       </w:pPr>
       <w:r>
-        <w:rPr>
-          <w:rFonts w:ascii="Times New Roman" w:hAnsi="Times New Roman"/>
-          <w:b/>
-          <w:i/>
-          <w:color w:val="000000"/>
-          <w:sz w:val="26"/>
-        </w:rPr>
+        <w:rPr/>
         <w:t>1.4.2. Phương pháp phân tích và thiết kế hệ thống</w:t>
       </w:r>
     </w:p>
     <w:p>
       <w:pPr>
-        <w:spacing w:line="312" w:lineRule="auto" w:before="0" w:after="80"/>
-        <w:ind w:firstLine="283"/>
-        <w:jc w:val="both"/>
-      </w:pPr>
-      <w:r>
-        <w:rPr>
-          <w:rFonts w:ascii="Times New Roman" w:hAnsi="Times New Roman"/>
-          <w:b w:val="0"/>
-          <w:i w:val="0"/>
-          <w:color w:val="000000"/>
-          <w:sz w:val="26"/>
-        </w:rPr>
+        <w:spacing w:before="0" w:after="80" w:line="312" w:lineRule="auto"/>
+        <w:ind w:firstLine="283"/>
+        <w:jc w:val="both"/>
+      </w:pPr>
+      <w:r>
+        <w:rPr/>
         <w:t>• Phân tích yêu cầu bài toán: Thu thập và tổng hợp các yêu cầu chức năng và phi chức năng của hệ thống phần mềm quản lý đại lý đồ gia dụng.</w:t>
       </w:r>
     </w:p>
     <w:p>
       <w:pPr>
-        <w:spacing w:line="312" w:lineRule="auto" w:before="0" w:after="80"/>
-        <w:ind w:firstLine="283"/>
-        <w:jc w:val="both"/>
-      </w:pPr>
-      <w:r>
-        <w:rPr>
-          <w:rFonts w:ascii="Times New Roman" w:hAnsi="Times New Roman"/>
-          <w:b w:val="0"/>
-          <w:i w:val="0"/>
-          <w:color w:val="000000"/>
-          <w:sz w:val="26"/>
-        </w:rPr>
+        <w:spacing w:before="0" w:after="80" w:line="312" w:lineRule="auto"/>
+        <w:ind w:firstLine="283"/>
+        <w:jc w:val="both"/>
+      </w:pPr>
+      <w:r>
+        <w:rPr/>
         <w:t>• Phương pháp phân tích hướng đối tượng (OOAD): Xây dựng sơ đồ Use Case xác định tương tác của từng nhóm tác nhân (Admin, Seller, Customer).</w:t>
       </w:r>
     </w:p>
     <w:p>
       <w:pPr>
-        <w:spacing w:line="312" w:lineRule="auto" w:before="0" w:after="80"/>
-        <w:ind w:firstLine="283"/>
-        <w:jc w:val="both"/>
-      </w:pPr>
-      <w:r>
-        <w:rPr>
-          <w:rFonts w:ascii="Times New Roman" w:hAnsi="Times New Roman"/>
-          <w:b w:val="0"/>
-          <w:i w:val="0"/>
-          <w:color w:val="000000"/>
-          <w:sz w:val="26"/>
-        </w:rPr>
+        <w:spacing w:before="0" w:after="80" w:line="312" w:lineRule="auto"/>
+        <w:ind w:firstLine="283"/>
+        <w:jc w:val="both"/>
+      </w:pPr>
+      <w:r>
+        <w:rPr/>
         <w:t>• Thiết kế cơ sở dữ liệu: Xây dựng biểu đồ thực thể liên kết (ERD) và chuẩn hóa dữ liệu ở dạng chuẩn 3NF để đảm bảo tính toàn vẹn dữ liệu.</w:t>
       </w:r>
     </w:p>
     <w:p>
       <w:pPr>
-        <w:spacing w:line="312" w:lineRule="auto" w:before="120" w:after="40"/>
+        <w:pStyle w:val="4"/>
+        <w:spacing w:before="120" w:after="40" w:line="312" w:lineRule="auto"/>
         <w:ind w:firstLine="0"/>
         <w:jc w:val="left"/>
       </w:pPr>
       <w:r>
-        <w:rPr>
-          <w:rFonts w:ascii="Times New Roman" w:hAnsi="Times New Roman"/>
-          <w:b/>
-          <w:i/>
-          <w:color w:val="000000"/>
-          <w:sz w:val="26"/>
-        </w:rPr>
+        <w:rPr/>
         <w:t>1.4.3. Phương pháp thực nghiệm và phát triển phần mềm</w:t>
       </w:r>
     </w:p>
     <w:p>
       <w:pPr>
-        <w:spacing w:line="312" w:lineRule="auto" w:before="0" w:after="80"/>
-        <w:ind w:firstLine="283"/>
-        <w:jc w:val="both"/>
-      </w:pPr>
-      <w:r>
-        <w:rPr>
-          <w:rFonts w:ascii="Times New Roman" w:hAnsi="Times New Roman"/>
-          <w:b w:val="0"/>
-          <w:i w:val="0"/>
-          <w:color w:val="000000"/>
-          <w:sz w:val="26"/>
-        </w:rPr>
+        <w:spacing w:before="0" w:after="80" w:line="312" w:lineRule="auto"/>
+        <w:ind w:firstLine="283"/>
+        <w:jc w:val="both"/>
+      </w:pPr>
+      <w:r>
+        <w:rPr/>
         <w:t>• Phương pháp lập trình Agile/Scrum rút gọn: Phân chia đề tài thành các mô-đun chức năng nhỏ (Quản lý User, Quản lý Đại lý, Quản lý Sản phẩm, Giỏ hàng &amp; Đơn hàng) để phát triển và kiểm thử cuốn chiếu.</w:t>
       </w:r>
     </w:p>
     <w:p>
       <w:pPr>
-        <w:spacing w:line="312" w:lineRule="auto" w:before="0" w:after="80"/>
-        <w:ind w:firstLine="283"/>
-        <w:jc w:val="both"/>
-      </w:pPr>
-      <w:r>
-        <w:rPr>
-          <w:rFonts w:ascii="Times New Roman" w:hAnsi="Times New Roman"/>
-          <w:b w:val="0"/>
-          <w:i w:val="0"/>
-          <w:color w:val="000000"/>
-          <w:sz w:val="26"/>
-        </w:rPr>
+        <w:spacing w:before="0" w:after="80" w:line="312" w:lineRule="auto"/>
+        <w:ind w:firstLine="283"/>
+        <w:jc w:val="both"/>
+      </w:pPr>
+      <w:r>
+        <w:rPr/>
         <w:t>• Sử dụng môi trường phát triển (IDE): NetBeans / IntelliJ IDEA để viết mã nguồn Java.</w:t>
       </w:r>
     </w:p>
     <w:p>
       <w:pPr>
-        <w:spacing w:line="312" w:lineRule="auto" w:before="0" w:after="80"/>
-        <w:ind w:firstLine="283"/>
-        <w:jc w:val="both"/>
-      </w:pPr>
-      <w:r>
-        <w:rPr>
-          <w:rFonts w:ascii="Times New Roman" w:hAnsi="Times New Roman"/>
-          <w:b w:val="0"/>
-          <w:i w:val="0"/>
-          <w:color w:val="000000"/>
-          <w:sz w:val="26"/>
-        </w:rPr>
+        <w:spacing w:before="0" w:after="80" w:line="312" w:lineRule="auto"/>
+        <w:ind w:firstLine="283"/>
+        <w:jc w:val="both"/>
+      </w:pPr>
+      <w:r>
+        <w:rPr/>
         <w:t>• Sử dụng công cụ quản lý thư viện Maven: Khai báo và quản lý các dependency chuẩn xác.</w:t>
       </w:r>
     </w:p>
     <w:p>
       <w:pPr>
-        <w:spacing w:line="312" w:lineRule="auto" w:before="0" w:after="80"/>
-        <w:ind w:firstLine="283"/>
-        <w:jc w:val="both"/>
-      </w:pPr>
-      <w:r>
-        <w:rPr>
-          <w:rFonts w:ascii="Times New Roman" w:hAnsi="Times New Roman"/>
-          <w:b w:val="0"/>
-          <w:i w:val="0"/>
-          <w:color w:val="000000"/>
-          <w:sz w:val="26"/>
-        </w:rPr>
+        <w:spacing w:before="0" w:after="80" w:line="312" w:lineRule="auto"/>
+        <w:ind w:firstLine="283"/>
+        <w:jc w:val="both"/>
+      </w:pPr>
+      <w:r>
+        <w:rPr/>
         <w:t>• Phương pháp kiểm thử phần mềm: Thực hiện Unit Test cho từng Service/Repository và Integration Test trên giao diện trình duyệt web để phát hiện và sửa lỗi.</w:t>
       </w:r>
     </w:p>
     <w:p>
       <w:pPr>
-        <w:spacing w:line="312" w:lineRule="auto" w:before="200" w:after="80"/>
+        <w:pStyle w:val="3"/>
+        <w:spacing w:before="200" w:after="80" w:line="312" w:lineRule="auto"/>
         <w:ind w:firstLine="0"/>
         <w:jc w:val="left"/>
       </w:pPr>
       <w:r>
-        <w:rPr>
-          <w:rFonts w:ascii="Times New Roman" w:hAnsi="Times New Roman"/>
-          <w:b/>
-          <w:i w:val="0"/>
-          <w:color w:val="000000"/>
-          <w:sz w:val="26"/>
-        </w:rPr>
+        <w:rPr/>
         <w:t>1.5. Ý nghĩa của đề tài</w:t>
       </w:r>
     </w:p>
     <w:p>
       <w:pPr>
-        <w:spacing w:line="312" w:lineRule="auto" w:before="120" w:after="40"/>
+        <w:pStyle w:val="4"/>
+        <w:spacing w:before="120" w:after="40" w:line="312" w:lineRule="auto"/>
         <w:ind w:firstLine="0"/>
         <w:jc w:val="left"/>
       </w:pPr>
       <w:r>
-        <w:rPr>
-          <w:rFonts w:ascii="Times New Roman" w:hAnsi="Times New Roman"/>
-          <w:b/>
-          <w:i/>
-          <w:color w:val="000000"/>
-          <w:sz w:val="26"/>
-        </w:rPr>
+        <w:rPr/>
         <w:t>1.5.1. Ý nghĩa khoa học và công nghệ</w:t>
       </w:r>
     </w:p>
     <w:p>
       <w:pPr>
-        <w:spacing w:line="312" w:lineRule="auto" w:before="0" w:after="80"/>
-        <w:ind w:firstLine="283"/>
-        <w:jc w:val="both"/>
-      </w:pPr>
-      <w:r>
-        <w:rPr>
-          <w:rFonts w:ascii="Times New Roman" w:hAnsi="Times New Roman"/>
-          <w:b w:val="0"/>
-          <w:i w:val="0"/>
-          <w:color w:val="000000"/>
-          <w:sz w:val="26"/>
-        </w:rPr>
+        <w:spacing w:before="0" w:after="80" w:line="312" w:lineRule="auto"/>
+        <w:ind w:firstLine="283"/>
+        <w:jc w:val="both"/>
+      </w:pPr>
+      <w:r>
+        <w:rPr/>
         <w:t>• Giúp sinh viên củng cố vững chắc lý thuyết về lập trình Java hướng đối tượng, làm chủ các khung làm việc hàng đầu hiện nay như Spring Boot, Spring Security và Spring Data JPA.</w:t>
       </w:r>
     </w:p>
     <w:p>
       <w:pPr>
-        <w:spacing w:line="312" w:lineRule="auto" w:before="0" w:after="80"/>
-        <w:ind w:firstLine="283"/>
-        <w:jc w:val="both"/>
-      </w:pPr>
-      <w:r>
-        <w:rPr>
-          <w:rFonts w:ascii="Times New Roman" w:hAnsi="Times New Roman"/>
-          <w:b w:val="0"/>
-          <w:i w:val="0"/>
-          <w:color w:val="000000"/>
-          <w:sz w:val="26"/>
-        </w:rPr>
+        <w:spacing w:before="0" w:after="80" w:line="312" w:lineRule="auto"/>
+        <w:ind w:firstLine="283"/>
+        <w:jc w:val="both"/>
+      </w:pPr>
+      <w:r>
+        <w:rPr/>
         <w:t>• Tiếp cận phương pháp thiết kế phần mềm doanh nghiệp theo mô hình MVC, nâng cao tư duy thiết kế cơ sở dữ liệu và bảo mật ứng dụng Web.</w:t>
       </w:r>
     </w:p>
     <w:p>
       <w:pPr>
-        <w:spacing w:line="312" w:lineRule="auto" w:before="120" w:after="40"/>
+        <w:pStyle w:val="4"/>
+        <w:spacing w:before="120" w:after="40" w:line="312" w:lineRule="auto"/>
         <w:ind w:firstLine="0"/>
         <w:jc w:val="left"/>
       </w:pPr>
       <w:r>
-        <w:rPr>
-          <w:rFonts w:ascii="Times New Roman" w:hAnsi="Times New Roman"/>
-          <w:b/>
-          <w:i/>
-          <w:color w:val="000000"/>
-          <w:sz w:val="26"/>
-        </w:rPr>
+        <w:rPr/>
         <w:t>1.5.2. Ý nghĩa thực tiễn</w:t>
       </w:r>
     </w:p>
     <w:p>
       <w:pPr>
-        <w:spacing w:line="312" w:lineRule="auto" w:before="0" w:after="80"/>
-        <w:ind w:firstLine="283"/>
-        <w:jc w:val="both"/>
-      </w:pPr>
-      <w:r>
-        <w:rPr>
-          <w:rFonts w:ascii="Times New Roman" w:hAnsi="Times New Roman"/>
-          <w:b w:val="0"/>
-          <w:i w:val="0"/>
-          <w:color w:val="000000"/>
-          <w:sz w:val="26"/>
-        </w:rPr>
+        <w:spacing w:before="0" w:after="80" w:line="312" w:lineRule="auto"/>
+        <w:ind w:firstLine="283"/>
+        <w:jc w:val="both"/>
+      </w:pPr>
+      <w:r>
+        <w:rPr/>
         <w:t>• Cung cấp một giải pháp phần mềm quản lý đại lý đồ gia dụng có tính ứng dụng thực tiễn cao, giúp các nhà kinh doanh số hóa quy trình quản lý đại lý và kênh bán hàng.</w:t>
       </w:r>
     </w:p>
     <w:p>
       <w:pPr>
-        <w:spacing w:line="312" w:lineRule="auto" w:before="0" w:after="80"/>
-        <w:ind w:firstLine="283"/>
-        <w:jc w:val="both"/>
-      </w:pPr>
-      <w:r>
-        <w:rPr>
-          <w:rFonts w:ascii="Times New Roman" w:hAnsi="Times New Roman"/>
-          <w:b w:val="0"/>
-          <w:i w:val="0"/>
-          <w:color w:val="000000"/>
-          <w:sz w:val="26"/>
-        </w:rPr>
+        <w:spacing w:before="0" w:after="80" w:line="312" w:lineRule="auto"/>
+        <w:ind w:firstLine="283"/>
+        <w:jc w:val="both"/>
+      </w:pPr>
+      <w:r>
+        <w:rPr/>
         <w:t>• Tạo tiền đề vững chắc cho nhóm phát triển mở rộng ứng dụng thành hệ thống E-Commerce quy mô lớn thương mại hóa trong tương lai.</w:t>
       </w:r>
     </w:p>
     <w:p>
       <w:pPr>
-        <w:spacing w:line="312" w:lineRule="auto" w:before="200" w:after="80"/>
+        <w:pStyle w:val="3"/>
+        <w:spacing w:before="200" w:after="80" w:line="312" w:lineRule="auto"/>
         <w:ind w:firstLine="0"/>
         <w:jc w:val="left"/>
       </w:pPr>
       <w:r>
-        <w:rPr>
-          <w:rFonts w:ascii="Times New Roman" w:hAnsi="Times New Roman"/>
-          <w:b/>
-          <w:i w:val="0"/>
-          <w:color w:val="000000"/>
-          <w:sz w:val="26"/>
-        </w:rPr>
+        <w:rPr/>
         <w:t>1.6. Bố cục báo cáo</w:t>
       </w:r>
     </w:p>
     <w:p>
       <w:pPr>
-        <w:spacing w:line="312" w:lineRule="auto" w:before="0" w:after="120"/>
+        <w:spacing w:before="0" w:after="120" w:line="312" w:lineRule="auto"/>
         <w:ind w:firstLine="567"/>
         <w:jc w:val="both"/>
       </w:pPr>
       <w:r>
-        <w:rPr>
-          <w:rFonts w:ascii="Times New Roman" w:hAnsi="Times New Roman"/>
-          <w:b w:val="0"/>
-          <w:i w:val="0"/>
-          <w:color w:val="000000"/>
-          <w:sz w:val="26"/>
-        </w:rPr>
+        <w:rPr/>
         <w:t>Báo cáo bài tập lớn được cấu trúc thành 5 chương chính cùng các phần bổ trợ như sau:</w:t>
       </w:r>
     </w:p>
     <w:p>
       <w:pPr>
-        <w:spacing w:line="312" w:lineRule="auto" w:before="0" w:after="80"/>
-        <w:ind w:firstLine="283"/>
-        <w:jc w:val="both"/>
-      </w:pPr>
-      <w:r>
-        <w:rPr>
-          <w:rFonts w:ascii="Times New Roman" w:hAnsi="Times New Roman"/>
-          <w:b w:val="0"/>
-          <w:i w:val="0"/>
-          <w:color w:val="000000"/>
-          <w:sz w:val="26"/>
-        </w:rPr>
+        <w:spacing w:before="0" w:after="80" w:line="312" w:lineRule="auto"/>
+        <w:ind w:firstLine="283"/>
+        <w:jc w:val="both"/>
+      </w:pPr>
+      <w:r>
+        <w:rPr/>
         <w:t>• Lời mở đầu: Trình bày bối cảnh, lý do thực hiện đề tài và lời cảm ơn.</w:t>
       </w:r>
     </w:p>
     <w:p>
       <w:pPr>
-        <w:spacing w:line="312" w:lineRule="auto" w:before="0" w:after="80"/>
-        <w:ind w:firstLine="283"/>
-        <w:jc w:val="both"/>
-      </w:pPr>
-      <w:r>
-        <w:rPr>
-          <w:rFonts w:ascii="Times New Roman" w:hAnsi="Times New Roman"/>
-          <w:b w:val="0"/>
-          <w:i w:val="0"/>
-          <w:color w:val="000000"/>
-          <w:sz w:val="26"/>
-        </w:rPr>
+        <w:spacing w:before="0" w:after="80" w:line="312" w:lineRule="auto"/>
+        <w:ind w:firstLine="283"/>
+        <w:jc w:val="both"/>
+      </w:pPr>
+      <w:r>
+        <w:rPr/>
         <w:t>• Chương 1: Tổng quan về đề tài: Giới thiệu lý do chọn đề tài, mục tiêu tổng quát và cụ thể, đối tượng và phạm vi nghiên cứu, phương pháp thực hiện, ý nghĩa đề tài và bố cục báo cáo.</w:t>
       </w:r>
     </w:p>
     <w:p>
       <w:pPr>
-        <w:spacing w:line="312" w:lineRule="auto" w:before="0" w:after="80"/>
-        <w:ind w:firstLine="283"/>
-        <w:jc w:val="both"/>
-      </w:pPr>
-      <w:r>
-        <w:rPr>
-          <w:rFonts w:ascii="Times New Roman" w:hAnsi="Times New Roman"/>
-          <w:b w:val="0"/>
-          <w:i w:val="0"/>
-          <w:color w:val="000000"/>
-          <w:sz w:val="26"/>
-        </w:rPr>
+        <w:spacing w:before="0" w:after="80" w:line="312" w:lineRule="auto"/>
+        <w:ind w:firstLine="283"/>
+        <w:jc w:val="both"/>
+      </w:pPr>
+      <w:r>
+        <w:rPr/>
         <w:t>• Chương 2: Cơ sở lý thuyết: Giới thiệu tổng quan về thương mại điện tử, mô hình Multi-vendor, ngôn ngữ Java, Spring Boot Framework, Spring Security, Hibernate/JPA, Thymeleaf, MySQL và kiến trúc MVC.</w:t>
       </w:r>
     </w:p>
     <w:p>
       <w:pPr>
-        <w:spacing w:line="312" w:lineRule="auto" w:before="0" w:after="80"/>
-        <w:ind w:firstLine="283"/>
-        <w:jc w:val="both"/>
-      </w:pPr>
-      <w:r>
-        <w:rPr>
-          <w:rFonts w:ascii="Times New Roman" w:hAnsi="Times New Roman"/>
-          <w:b w:val="0"/>
-          <w:i w:val="0"/>
-          <w:color w:val="000000"/>
-          <w:sz w:val="26"/>
-        </w:rPr>
+        <w:spacing w:before="0" w:after="80" w:line="312" w:lineRule="auto"/>
+        <w:ind w:firstLine="283"/>
+        <w:jc w:val="both"/>
+      </w:pPr>
+      <w:r>
+        <w:rPr/>
         <w:t>• Chương 3: Phân tích và thiết kế hệ thống: Khảo sát yêu cầu, phân tích tác nhân (Admin, Seller, Customer), yêu cầu chức năng/phi chức năng, sơ đồ Use Case và thiết kế cơ sở dữ liệu ERD.</w:t>
       </w:r>
     </w:p>
     <w:p>
       <w:pPr>
-        <w:spacing w:line="312" w:lineRule="auto" w:before="0" w:after="80"/>
-        <w:ind w:firstLine="283"/>
-        <w:jc w:val="both"/>
-      </w:pPr>
-      <w:r>
-        <w:rPr>
-          <w:rFonts w:ascii="Times New Roman" w:hAnsi="Times New Roman"/>
-          <w:b w:val="0"/>
-          <w:i w:val="0"/>
-          <w:color w:val="000000"/>
-          <w:sz w:val="26"/>
-        </w:rPr>
+        <w:spacing w:before="0" w:after="80" w:line="312" w:lineRule="auto"/>
+        <w:ind w:firstLine="283"/>
+        <w:jc w:val="both"/>
+      </w:pPr>
+      <w:r>
+        <w:rPr/>
         <w:t>• Chương 4: Cài đặt và triển khai hệ thống: Mô tả cấu trúc dán Java, hiện thực các dịch vụ cốt lõi, minh họa giao diện điều khiển và các chức năng chính của chương trình.</w:t>
       </w:r>
     </w:p>
     <w:p>
       <w:pPr>
-        <w:spacing w:line="312" w:lineRule="auto" w:before="0" w:after="80"/>
-        <w:ind w:firstLine="283"/>
-        <w:jc w:val="both"/>
-      </w:pPr>
-      <w:r>
-        <w:rPr>
-          <w:rFonts w:ascii="Times New Roman" w:hAnsi="Times New Roman"/>
-          <w:b w:val="0"/>
-          <w:i w:val="0"/>
-          <w:color w:val="000000"/>
-          <w:sz w:val="26"/>
-        </w:rPr>
+        <w:spacing w:before="0" w:after="80" w:line="312" w:lineRule="auto"/>
+        <w:ind w:firstLine="283"/>
+        <w:jc w:val="both"/>
+      </w:pPr>
+      <w:r>
+        <w:rPr/>
         <w:t>• Chương 5: Kết luận và hướng phát triển: Tổng kết các kết quả đã đạt được của đề tài, thẳng thắn nhìn nhận những mặt hạn chế và đề xuất các hướng nâng cấp phát triển trong tương lai.</w:t>
       </w:r>
     </w:p>
@@ -2866,7 +2456,7 @@
     <w:lsdException w:unhideWhenUsed="0" w:uiPriority="72" w:semiHidden="0" w:name="Colorful List Accent 2"/>
     <w:lsdException w:unhideWhenUsed="0" w:uiPriority="73" w:semiHidden="0" w:name="Colorful Grid Accent 2"/>
     <w:lsdException w:unhideWhenUsed="0" w:uiPriority="60" w:semiHidden="0" w:name="Light Shading Accent 3"/>
-    <w:lsdException w:qFormat="1" w:unhideWhenUsed="0" w:uiPriority="61" w:semiHidden="0" w:name="Light List Accent 3"/>
+    <w:lsdException w:unhideWhenUsed="0" w:uiPriority="61" w:semiHidden="0" w:name="Light List Accent 3"/>
     <w:lsdException w:unhideWhenUsed="0" w:uiPriority="62" w:semiHidden="0" w:name="Light Grid Accent 3"/>
     <w:lsdException w:unhideWhenUsed="0" w:uiPriority="63" w:semiHidden="0" w:name="Medium Shading 1 Accent 3"/>
     <w:lsdException w:unhideWhenUsed="0" w:uiPriority="64" w:semiHidden="0" w:name="Medium Shading 2 Accent 3"/>
@@ -2885,7 +2475,7 @@
     <w:lsdException w:unhideWhenUsed="0" w:uiPriority="63" w:semiHidden="0" w:name="Medium Shading 1 Accent 4"/>
     <w:lsdException w:unhideWhenUsed="0" w:uiPriority="64" w:semiHidden="0" w:name="Medium Shading 2 Accent 4"/>
     <w:lsdException w:unhideWhenUsed="0" w:uiPriority="65" w:semiHidden="0" w:name="Medium List 1 Accent 4"/>
-    <w:lsdException w:qFormat="1" w:unhideWhenUsed="0" w:uiPriority="66" w:semiHidden="0" w:name="Medium List 2 Accent 4"/>
+    <w:lsdException w:unhideWhenUsed="0" w:uiPriority="66" w:semiHidden="0" w:name="Medium List 2 Accent 4"/>
     <w:lsdException w:unhideWhenUsed="0" w:uiPriority="67" w:semiHidden="0" w:name="Medium Grid 1 Accent 4"/>
     <w:lsdException w:unhideWhenUsed="0" w:uiPriority="68" w:semiHidden="0" w:name="Medium Grid 2 Accent 4"/>
     <w:lsdException w:unhideWhenUsed="0" w:uiPriority="69" w:semiHidden="0" w:name="Medium Grid 3 Accent 4"/>
@@ -2932,7 +2522,7 @@
       <w:autoSpaceDN w:val="0"/>
       <w:spacing w:before="0" w:after="0" w:line="240" w:lineRule="auto"/>
       <w:ind w:left="0" w:right="0"/>
-      <w:jc w:val="left"/>
+      <w:jc w:val="both"/>
     </w:pPr>
     <w:rPr>
       <w:rFonts w:ascii="Times New Roman" w:hAnsi="Times New Roman" w:eastAsia="Times New Roman" w:cs="Times New Roman"/>
@@ -2968,16 +2558,15 @@
     <w:uiPriority w:val="1"/>
     <w:pPr>
       <w:spacing w:before="239"/>
-      <w:ind w:left="727" w:hanging="487"/>
-      <w:outlineLvl w:val="2"/>
+      <w:ind w:left="490" w:hanging="490"/>
+      <w:outlineLvl w:val="1"/>
     </w:pPr>
     <w:rPr>
-      <w:rFonts w:ascii="Times New Roman" w:hAnsi="Times New Roman" w:eastAsia="Times New Roman" w:cs="Times New Roman"/>
+      <w:rFonts w:ascii="Times New Roman" w:hAnsi="Times New Roman" w:eastAsia="Times New Roman"/>
       <w:b/>
       <w:bCs/>
       <w:sz w:val="28"/>
       <w:szCs w:val="28"/>
-      <w:lang w:val="vi" w:eastAsia="en-US" w:bidi="ar-SA"/>
     </w:rPr>
   </w:style>
   <w:style w:type="paragraph" w:styleId="4">
@@ -2987,16 +2576,14 @@
     <w:uiPriority w:val="1"/>
     <w:pPr>
       <w:spacing w:line="298" w:lineRule="exact"/>
-      <w:ind w:left="961"/>
-      <w:outlineLvl w:val="3"/>
+      <w:ind w:left="0"/>
+      <w:outlineLvl w:val="2"/>
     </w:pPr>
     <w:rPr>
-      <w:rFonts w:ascii="Times New Roman" w:hAnsi="Times New Roman" w:eastAsia="Times New Roman" w:cs="Times New Roman"/>
+      <w:rFonts w:ascii="Times New Roman" w:hAnsi="Times New Roman" w:eastAsia="Times New Roman"/>
       <w:b/>
       <w:bCs/>
-      <w:sz w:val="26"/>
       <w:szCs w:val="26"/>
-      <w:lang w:val="vi" w:eastAsia="en-US" w:bidi="ar-SA"/>
     </w:rPr>
   </w:style>
   <w:style w:type="paragraph" w:styleId="5">

</xml_diff>

<commit_message>
docs: format Chapter 1 with space_before=0 for Heading 2/3, 1 tab indent for Normal, and level 1 (-) / level 2 (+) list items
</commit_message>
<xml_diff>
--- a/DeTaiCNJ18_Nhom7.docx
+++ b/DeTaiCNJ18_Nhom7.docx
@@ -1422,7 +1422,6 @@
       <w:pPr>
         <w:bidi w:val="0"/>
         <w:ind w:firstLine="720" w:firstLineChars="0"/>
-        <w:jc w:val="both"/>
       </w:pPr>
       <w:r>
         <w:t>Trong kỷ nguyên số hóa và sự phát triển vượt bậc của Đô thị hóa hiện đại, thương mại điện tử (E-Commerce) đã trở thành một thành tố không thể thiếu trong hạ tầng kinh tế toàn cầu. Việc ứng dụng Công nghệ thông tin vào quản lý kênh phân phối, quản lý đại lý và tối ưu hóa quy trình bán hàng trực tuyến đóng vai trò quyết định tới năng lực cạnh tranh của các doanh nghiệp. Trong đó, ngành kinh doanh đồ gia dụng – bao gồm các sản phẩm thiết yếu phục vụ đời sống gia đình, thiết bị nhà bếp, thiết bị điện và chăm sóc không gian sống – là một trong những lĩnh vực có tốc độ tăng trưởng quy mô thị trường vô cùng mạnh mẽ.</w:t>
@@ -1432,7 +1431,6 @@
       <w:pPr>
         <w:bidi w:val="0"/>
         <w:ind w:firstLine="720" w:firstLineChars="0"/>
-        <w:jc w:val="both"/>
       </w:pPr>
       <w:r>
         <w:t>Tuy nhiên, phương thức quản lý đại lý kinh doanh đồ gia dụng truyền thống đang bộc lộ nhiều hạn chế bất cập như: dữ liệu tồn kho phân tán, quản lý đơn hàng thủ công dễ gây ra sai sót, thông tin giữa nhà sản xuất/nhà phân phối và các đại lý bán lẻ thiếu tính đồng bộ tức thời, cũng như khó khăn trong việc theo dõi doanh thu và đánh giá hiệu quả kinh doanh. Xuất phát từ nhu cầu thực tiễn đó, việc nghiên cứu và phát triển một giải pháp phần mềm quản lý đại lý kinh doanh đồ gia dụng trực tuyến hiện đại, ứng dụng mô hình đa nhà bán hàng (Multi-vendor Marketplace) là vô cùng cần thiết.</w:t>
@@ -1442,7 +1440,6 @@
       <w:pPr>
         <w:bidi w:val="0"/>
         <w:ind w:firstLine="720" w:firstLineChars="0"/>
-        <w:jc w:val="both"/>
       </w:pPr>
       <w:r>
         <w:t>Nghiên cứu bài tập lớn học phần Công nghệ Java với đề tài: "Xây dựng phần mềm quản lý đại lý kinh doanh đồ gia dụng" (Đề tài CNJ18) được triển khai nhằm giải quyết bài toán trên. Hệ thống được xây dựng dựa trên nền tảng công nghệ mạnh mẽ và phổ biến bậc nhất hiện nay: Java Spring Boot Framework, kết hợp với Spring Data JPA, Spring Security, Thymeleaf Template Engine và Hệ quản trị cơ sở dữ liệu MySQL. Phần mềm cung cấp giải pháp toàn diện hỗ trợ 3 nhóm tác nhân chính: Quản trị viên (Admin), Nhà bán hàng/Đại lý (Seller/Vendor) và Khách hàng (Customer).</w:t>
@@ -1452,7 +1449,6 @@
       <w:pPr>
         <w:bidi w:val="0"/>
         <w:ind w:firstLine="720" w:firstLineChars="0"/>
-        <w:jc w:val="both"/>
       </w:pPr>
       <w:r>
         <w:t>Trong quá trình nghiên cứu và thực hiện bài tập lớn, Nhóm 7 đã nỗ lực vận dụng các kiến thức đã học cùng sự tìm tòi, nghiên cứu tài liệu thực tế để hoàn thành báo cáo và phần mềm. Nhóm xin gửi lời cảm ơn chân thành và sâu sắc nhất tới Thầy giáo hướng dẫn Trần Bá Hùng – Giảng viên Khoa Công nghệ Thông tin, Trường Đại học Công nghệ Đông Á. Sự hướng dẫn tận tình, những góp ý chuyên môn quý báu của Thầy chính là kim chỉ nam giúp Nhóm định hướng đúng đắn và hoàn thành tốt đề tài này.</w:t>
@@ -1462,7 +1458,6 @@
       <w:pPr>
         <w:bidi w:val="0"/>
         <w:ind w:firstLine="720" w:firstLineChars="0"/>
-        <w:jc w:val="both"/>
       </w:pPr>
       <w:r>
         <w:t>Dù đã cố gắng hết sức để hoàn thiện báo cáo và chương trình một cách chỉn chu nhất, song do hạn chế về mặt thời gian cũng như kinh nghiệm thực tiễn, đề tài khó tránh khỏi những thiếu sót nhất định. Nhóm rất mong nhận được những ý kiến đóng góp, nhận xét quý báu từ Thầy giáo cùng các bạn sinh viên để đề tài ngày càng được hoàn thiện và có tính ứng dụng cao hơn.</w:t>
@@ -1480,9 +1475,8 @@
     <w:p>
       <w:pPr>
         <w:pStyle w:val="2"/>
-        <w:bidi w:val="0"/>
         <w:spacing w:before="240" w:after="240"/>
-        <w:ind w:firstLine="0"/>
+        <w:ind w:firstLine="0" w:left="0"/>
         <w:jc w:val="center"/>
       </w:pPr>
       <w:r>
@@ -1493,9 +1487,8 @@
     <w:p>
       <w:pPr>
         <w:pStyle w:val="3"/>
-        <w:bidi w:val="0"/>
-        <w:spacing w:before="200" w:after="80"/>
-        <w:ind w:firstLine="0"/>
+        <w:spacing w:before="0" w:after="80"/>
+        <w:ind w:firstLine="0" w:left="0"/>
         <w:jc w:val="left"/>
       </w:pPr>
       <w:r>
@@ -1506,7 +1499,7 @@
     <w:p>
       <w:pPr>
         <w:spacing w:before="0" w:after="120" w:line="312" w:lineRule="auto"/>
-        <w:ind w:firstLineChars="0" w:firstLine="567"/>
+        <w:ind w:firstLine="720" w:left="0"/>
         <w:jc w:val="both"/>
       </w:pPr>
       <w:r>
@@ -1517,7 +1510,7 @@
     <w:p>
       <w:pPr>
         <w:spacing w:before="0" w:after="120" w:line="312" w:lineRule="auto"/>
-        <w:ind w:firstLine="567"/>
+        <w:ind w:firstLine="720" w:left="0"/>
         <w:jc w:val="both"/>
       </w:pPr>
       <w:r>
@@ -1528,51 +1521,51 @@
     <w:p>
       <w:pPr>
         <w:spacing w:before="0" w:after="80" w:line="312" w:lineRule="auto"/>
-        <w:ind w:firstLine="283"/>
-        <w:jc w:val="both"/>
-      </w:pPr>
-      <w:r>
-        <w:rPr/>
-        <w:t>• Quản lý dữ liệu phân tán: Thông tin sản phẩm, danh mục đồ gia dụng, giá bán và số lượng tồn kho tại từng đại lý thường được lưu trữ rời rạc qua file Excel hoặc sổ sách thủ công, dẫn đến tình trạng bất đồng bộ dữ liệu.</w:t>
+        <w:ind w:firstLine="720" w:left="0"/>
+        <w:jc w:val="both"/>
+      </w:pPr>
+      <w:r>
+        <w:rPr/>
+        <w:t>- Quản lý dữ liệu phân tán: Thông tin sản phẩm, danh mục đồ gia dụng, giá bán và số lượng tồn kho tại từng đại lý thường được lưu trữ rời rạc qua file Excel hoặc sổ sách thủ công, dẫn đến tình trạng bất đồng bộ dữ liệu.</w:t>
       </w:r>
     </w:p>
     <w:p>
       <w:pPr>
         <w:spacing w:before="0" w:after="80" w:line="312" w:lineRule="auto"/>
-        <w:ind w:firstLine="283"/>
-        <w:jc w:val="both"/>
-      </w:pPr>
-      <w:r>
-        <w:rPr/>
-        <w:t>• Quy trình xử lý đơn hàng chậm trễ: Việc tiếp nhận đơn đặt hàng từ khách hàng, phân bổ đơn cho đại lý, cập nhật trạng thái giao hàng và đối soát doanh thu tốn nhiều thời gian và dễ phát sinh sai sót.</w:t>
+        <w:ind w:firstLine="720" w:left="0"/>
+        <w:jc w:val="both"/>
+      </w:pPr>
+      <w:r>
+        <w:rPr/>
+        <w:t>- Quy trình xử lý đơn hàng chậm trễ: Việc tiếp nhận đơn đặt hàng từ khách hàng, phân bổ đơn cho đại lý, cập nhật trạng thái giao hàng và đối soát doanh thu tốn nhiều thời gian và dễ phát sinh sai sót.</w:t>
       </w:r>
     </w:p>
     <w:p>
       <w:pPr>
         <w:spacing w:before="0" w:after="80" w:line="312" w:lineRule="auto"/>
-        <w:ind w:firstLine="283"/>
-        <w:jc w:val="both"/>
-      </w:pPr>
-      <w:r>
-        <w:rPr/>
-        <w:t>• Thiếu công cụ tương tác trực tiếp: Khách hàng gặp khó khăn khi tìm kiếm các đại lý uy tín cung cấp đồ gia dụng chính hãng, so sánh giá cả và xem đánh giá chất lượng sản phẩm.</w:t>
+        <w:ind w:firstLine="720" w:left="0"/>
+        <w:jc w:val="both"/>
+      </w:pPr>
+      <w:r>
+        <w:rPr/>
+        <w:t>- Thiếu công cụ tương tác trực tiếp: Khách hàng gặp khó khăn khi tìm kiếm các đại lý uy tín cung cấp đồ gia dụng chính hãng, so sánh giá cả và xem đánh giá chất lượng sản phẩm.</w:t>
       </w:r>
     </w:p>
     <w:p>
       <w:pPr>
         <w:spacing w:before="0" w:after="80" w:line="312" w:lineRule="auto"/>
-        <w:ind w:firstLine="283"/>
-        <w:jc w:val="both"/>
-      </w:pPr>
-      <w:r>
-        <w:rPr/>
-        <w:t>• Khó khăn trong việc kiểm soát bảo mật và phân quyền: Các hệ thống cũ thiếu cơ chế phân quyền chặt chẽ giữa Quản trị viên hệ thống, Chủ đại lý (Nhà bán hàng) và Khách hàng.</w:t>
+        <w:ind w:firstLine="720" w:left="0"/>
+        <w:jc w:val="both"/>
+      </w:pPr>
+      <w:r>
+        <w:rPr/>
+        <w:t>- Khó khăn trong việc kiểm soát bảo mật và phân quyền: Các hệ thống cũ thiếu cơ chế phân quyền chặt chẽ giữa Quản trị viên hệ thống, Chủ đại lý (Nhà bán hàng) và Khách hàng.</w:t>
       </w:r>
     </w:p>
     <w:p>
       <w:pPr>
         <w:spacing w:before="0" w:after="120" w:line="312" w:lineRule="auto"/>
-        <w:ind w:firstLine="567"/>
+        <w:ind w:firstLine="720" w:left="0"/>
         <w:jc w:val="both"/>
       </w:pPr>
       <w:r>
@@ -1583,9 +1576,8 @@
     <w:p>
       <w:pPr>
         <w:pStyle w:val="3"/>
-        <w:bidi w:val="0"/>
-        <w:spacing w:before="200" w:after="80"/>
-        <w:ind w:firstLine="0"/>
+        <w:spacing w:before="0" w:after="80"/>
+        <w:ind w:firstLine="0" w:left="0"/>
         <w:jc w:val="left"/>
       </w:pPr>
       <w:r>
@@ -1596,22 +1588,19 @@
     <w:p>
       <w:pPr>
         <w:pStyle w:val="4"/>
-        <w:bidi w:val="0"/>
-        <w:spacing w:before="120" w:after="40"/>
-        <w:ind w:firstLine="0"/>
+        <w:spacing w:before="0" w:after="40"/>
+        <w:ind w:firstLine="0" w:left="0"/>
         <w:jc w:val="left"/>
       </w:pPr>
-      <w:bookmarkStart w:id="1" w:name="_GoBack"/>
       <w:r>
         <w:rPr/>
         <w:t>1.2.1. Mục tiêu tổng quát</w:t>
       </w:r>
     </w:p>
-    <w:bookmarkEnd w:id="1"/>
     <w:p>
       <w:pPr>
         <w:spacing w:before="0" w:after="120" w:line="312" w:lineRule="auto"/>
-        <w:ind w:firstLine="567"/>
+        <w:ind w:firstLine="720" w:left="0"/>
         <w:jc w:val="both"/>
       </w:pPr>
       <w:r>
@@ -1622,8 +1611,8 @@
     <w:p>
       <w:pPr>
         <w:pStyle w:val="4"/>
-        <w:spacing w:before="120" w:after="40" w:line="312" w:lineRule="auto"/>
-        <w:ind w:firstLine="0"/>
+        <w:spacing w:before="0" w:after="40"/>
+        <w:ind w:firstLine="0" w:left="0"/>
         <w:jc w:val="left"/>
       </w:pPr>
       <w:r>
@@ -1634,7 +1623,7 @@
     <w:p>
       <w:pPr>
         <w:spacing w:before="0" w:after="120" w:line="312" w:lineRule="auto"/>
-        <w:ind w:firstLine="567"/>
+        <w:ind w:firstLine="720" w:left="0"/>
         <w:jc w:val="both"/>
       </w:pPr>
       <w:r>
@@ -1645,551 +1634,650 @@
     <w:p>
       <w:pPr>
         <w:spacing w:before="0" w:after="80" w:line="312" w:lineRule="auto"/>
-        <w:ind w:firstLine="283"/>
-        <w:jc w:val="both"/>
-      </w:pPr>
-      <w:r>
-        <w:rPr/>
-        <w:t>• Xây dựng cơ sở dữ liệu quan hệ chuẩn hóa trên MySQL: Thiết kế các bảng lưu trữ thông tin tài khoản người dùng, vai trò (Role), danh mục sản phẩm (Category), sản phẩm gia dụng (Product), đại lý (Shop/Vendor), đơn hàng (Order, OrderItem) và đánh giá (Review).</w:t>
+        <w:ind w:firstLine="720" w:left="0"/>
+        <w:jc w:val="both"/>
+      </w:pPr>
+      <w:r>
+        <w:rPr/>
+        <w:t>- Xây dựng cơ sở dữ liệu quan hệ chuẩn hóa trên MySQL:</w:t>
+      </w:r>
+    </w:p>
+    <w:p>
+      <w:pPr>
+        <w:spacing w:before="0" w:after="60" w:line="312" w:lineRule="auto"/>
+        <w:ind w:left="720" w:firstLine="720"/>
+        <w:jc w:val="both"/>
+      </w:pPr>
+      <w:r>
+        <w:rPr/>
+        <w:t>+ Thiết kế các bảng lưu trữ thông tin tài khoản người dùng (User), vai trò (Role), danh mục sản phẩm (Category), sản phẩm gia dụng (Product), đại lý (Shop/Vendor), đơn hàng (Order, OrderItem) và đánh giá (Review).</w:t>
       </w:r>
     </w:p>
     <w:p>
       <w:pPr>
         <w:spacing w:before="0" w:after="80" w:line="312" w:lineRule="auto"/>
-        <w:ind w:firstLine="283"/>
-        <w:jc w:val="both"/>
-      </w:pPr>
-      <w:r>
-        <w:rPr/>
-        <w:t>• Cài đặt phân quyền người dùng đa cấp độ (Role-Based Access Control): Tích hợp Spring Security để xác thực và phân quyền chính xác cho 3 nhóm đối tượng: Admin, Seller (Đại lý) và Customer (Khách hàng).</w:t>
+        <w:ind w:firstLine="720" w:left="0"/>
+        <w:jc w:val="both"/>
+      </w:pPr>
+      <w:r>
+        <w:rPr/>
+        <w:t>- Cài đặt phân quyền người dùng đa cấp độ (Role-Based Access Control):</w:t>
+      </w:r>
+    </w:p>
+    <w:p>
+      <w:pPr>
+        <w:spacing w:before="0" w:after="60" w:line="312" w:lineRule="auto"/>
+        <w:ind w:left="720" w:firstLine="720"/>
+        <w:jc w:val="both"/>
+      </w:pPr>
+      <w:r>
+        <w:rPr/>
+        <w:t>+ Tích hợp Spring Security để xác thực và phân quyền chính xác cho 3 nhóm đối tượng: Admin, Seller (Đại lý) và Customer (Khách hàng).</w:t>
       </w:r>
     </w:p>
     <w:p>
       <w:pPr>
         <w:spacing w:before="0" w:after="80" w:line="312" w:lineRule="auto"/>
-        <w:ind w:firstLine="283"/>
-        <w:jc w:val="both"/>
-      </w:pPr>
-      <w:r>
-        <w:rPr/>
-        <w:t>• Phát triển Mô-đun Quản trị hệ thống (Admin Panel): Cho phép Admin duyệt hồ sơ đăng ký mở đại lý mới, quản lý danh mục sản phẩm đồ gia dụng toàn hệ thống, quản lý tài khoản và cấu hình thiết lập website.</w:t>
+        <w:ind w:firstLine="720" w:left="0"/>
+        <w:jc w:val="both"/>
+      </w:pPr>
+      <w:r>
+        <w:rPr/>
+        <w:t>- Phát triển các mô-đun chức năng chính của hệ thống:</w:t>
+      </w:r>
+    </w:p>
+    <w:p>
+      <w:pPr>
+        <w:spacing w:before="0" w:after="60" w:line="312" w:lineRule="auto"/>
+        <w:ind w:left="720" w:firstLine="720"/>
+        <w:jc w:val="both"/>
+      </w:pPr>
+      <w:r>
+        <w:rPr/>
+        <w:t>+ Mô-đun Quản trị hệ thống (Admin Panel): Phê duyệt hồ sơ mở đại lý mới, quản lý danh mục đồ gia dụng toàn hệ thống, quản lý tài khoản và thiết lập cấu hình website.</w:t>
+      </w:r>
+    </w:p>
+    <w:p>
+      <w:pPr>
+        <w:spacing w:before="0" w:after="60" w:line="312" w:lineRule="auto"/>
+        <w:ind w:left="720" w:firstLine="720"/>
+        <w:jc w:val="both"/>
+      </w:pPr>
+      <w:r>
+        <w:rPr/>
+        <w:t>+ Mô-đun Quản lý cho Đại lý (Seller/Vendor Panel): Cập nhật thông tin gian hàng, đăng bán sản phẩm gia dụng, quản lý kho hàng và xử lý trạng thái đơn hàng (PENDING, PROCESSING, SHIPPED, DELIVERED, CANCELLED).</w:t>
+      </w:r>
+    </w:p>
+    <w:p>
+      <w:pPr>
+        <w:spacing w:before="0" w:after="60" w:line="312" w:lineRule="auto"/>
+        <w:ind w:left="720" w:firstLine="720"/>
+        <w:jc w:val="both"/>
+      </w:pPr>
+      <w:r>
+        <w:rPr/>
+        <w:t>+ Giao diện Mua sắm cho Khách hàng (Customer Storefront): Duyệt xem danh mục đồ gia dụng, tìm kiếm sản phẩm, quản lý giỏ hàng, đặt hàng trực tuyến và gửi đánh giá sản phẩm.</w:t>
+      </w:r>
+    </w:p>
+    <w:p>
+      <w:pPr>
+        <w:spacing w:before="0" w:after="60" w:line="312" w:lineRule="auto"/>
+        <w:ind w:left="720" w:firstLine="720"/>
+        <w:jc w:val="both"/>
+      </w:pPr>
+      <w:r>
+        <w:rPr/>
+        <w:t>+ Tối ưu hóa giao diện người dùng: Sử dụng HTML5, CSS3, JavaScript, Bootstrap kết hợp với Thymeleaf Template Engine để tạo giao diện thân thiện, tương thích trên nhiều thiết bị.</w:t>
+      </w:r>
+    </w:p>
+    <w:p>
+      <w:pPr>
+        <w:pStyle w:val="3"/>
+        <w:spacing w:before="0" w:after="80"/>
+        <w:ind w:firstLine="0" w:left="0"/>
+        <w:jc w:val="left"/>
+      </w:pPr>
+      <w:r>
+        <w:rPr/>
+        <w:t>1.3. Đối tượng và phạm vi nghiên cứu</w:t>
+      </w:r>
+    </w:p>
+    <w:p>
+      <w:pPr>
+        <w:pStyle w:val="4"/>
+        <w:spacing w:before="0" w:after="40"/>
+        <w:ind w:firstLine="0" w:left="0"/>
+        <w:jc w:val="left"/>
+      </w:pPr>
+      <w:r>
+        <w:rPr/>
+        <w:t>1.3.1. Đối tượng nghiên cứu</w:t>
+      </w:r>
+    </w:p>
+    <w:p>
+      <w:pPr>
+        <w:spacing w:before="0" w:after="120" w:line="312" w:lineRule="auto"/>
+        <w:ind w:firstLine="720" w:left="0"/>
+        <w:jc w:val="both"/>
+      </w:pPr>
+      <w:r>
+        <w:rPr/>
+        <w:t>Đối tượng nghiên cứu của đề tài bao gồm:</w:t>
       </w:r>
     </w:p>
     <w:p>
       <w:pPr>
         <w:spacing w:before="0" w:after="80" w:line="312" w:lineRule="auto"/>
-        <w:ind w:firstLine="283"/>
-        <w:jc w:val="both"/>
-      </w:pPr>
-      <w:r>
-        <w:rPr/>
-        <w:t>• Phát triển Mô-đun Quản lý cho Đại lý (Seller/Vendor Panel): Cho phép các đại lý cập nhật thông tin cửa hàng, đăng bán các mặt hàng đồ gia dụng, quản lý kho hàng, tiếp nhận và xử lý trạng thái đơn hàng (PENDING, PROCESSING, SHIPPED, DELIVERED, CANCELLED).</w:t>
+        <w:ind w:firstLine="720" w:left="0"/>
+        <w:jc w:val="both"/>
+      </w:pPr>
+      <w:r>
+        <w:rPr/>
+        <w:t>- Quy trình nghiệp vụ quản lý đại lý kinh doanh đồ gia dụng:</w:t>
+      </w:r>
+    </w:p>
+    <w:p>
+      <w:pPr>
+        <w:spacing w:before="0" w:after="60" w:line="312" w:lineRule="auto"/>
+        <w:ind w:left="720" w:firstLine="720"/>
+        <w:jc w:val="both"/>
+      </w:pPr>
+      <w:r>
+        <w:rPr/>
+        <w:t>+ Quản lý thông tin gian hàng đại lý và danh mục sản phẩm gia dụng.</w:t>
+      </w:r>
+    </w:p>
+    <w:p>
+      <w:pPr>
+        <w:spacing w:before="0" w:after="60" w:line="312" w:lineRule="auto"/>
+        <w:ind w:left="720" w:firstLine="720"/>
+        <w:jc w:val="both"/>
+      </w:pPr>
+      <w:r>
+        <w:rPr/>
+        <w:t>+ Quy trình luân chuyển đơn hàng, cập nhật trạng thái và đối soát doanh thu.</w:t>
       </w:r>
     </w:p>
     <w:p>
       <w:pPr>
         <w:spacing w:before="0" w:after="80" w:line="312" w:lineRule="auto"/>
-        <w:ind w:firstLine="283"/>
-        <w:jc w:val="both"/>
-      </w:pPr>
-      <w:r>
-        <w:rPr/>
-        <w:t>• Phát triển Giao diện Mua sắm cho Khách hàng (Customer Storefront): Cho phép khách hàng duyệt xem danh mục đồ gia dụng, tìm kiếm sản phẩm, xem chi tiết sản phẩm và đại lý phân phối, quản lý giỏ hàng, đặt hàng trực tuyến và gửi đánh giá sản phẩm.</w:t>
+        <w:ind w:firstLine="720" w:left="0"/>
+        <w:jc w:val="both"/>
+      </w:pPr>
+      <w:r>
+        <w:rPr/>
+        <w:t>- Các công nghệ lập trình Java doanh nghiệp nâng cao:</w:t>
+      </w:r>
+    </w:p>
+    <w:p>
+      <w:pPr>
+        <w:spacing w:before="0" w:after="60" w:line="312" w:lineRule="auto"/>
+        <w:ind w:left="720" w:firstLine="720"/>
+        <w:jc w:val="both"/>
+      </w:pPr>
+      <w:r>
+        <w:rPr/>
+        <w:t>+ Khung ứng dụng Java Spring Boot (Spring MVC, Spring Data JPA / Hibernate ORM).</w:t>
+      </w:r>
+    </w:p>
+    <w:p>
+      <w:pPr>
+        <w:spacing w:before="0" w:after="60" w:line="312" w:lineRule="auto"/>
+        <w:ind w:left="720" w:firstLine="720"/>
+        <w:jc w:val="both"/>
+      </w:pPr>
+      <w:r>
+        <w:rPr/>
+        <w:t>+ Cơ chế bảo mật Spring Security (Mã hóa BCryptPasswordEncoder, Session Management, RBAC).</w:t>
+      </w:r>
+    </w:p>
+    <w:p>
+      <w:pPr>
+        <w:spacing w:before="0" w:after="60" w:line="312" w:lineRule="auto"/>
+        <w:ind w:left="720" w:firstLine="720"/>
+        <w:jc w:val="both"/>
+      </w:pPr>
+      <w:r>
+        <w:rPr/>
+        <w:t>+ Công nghệ giao diện Thymeleaf Template Engine.</w:t>
+      </w:r>
+    </w:p>
+    <w:p>
+      <w:pPr>
+        <w:spacing w:before="0" w:after="60" w:line="312" w:lineRule="auto"/>
+        <w:ind w:left="720" w:firstLine="720"/>
+        <w:jc w:val="both"/>
+      </w:pPr>
+      <w:r>
+        <w:rPr/>
+        <w:t>+ Hệ quản trị cơ sở dữ liệu quan hệ MySQL.</w:t>
+      </w:r>
+    </w:p>
+    <w:p>
+      <w:pPr>
+        <w:pStyle w:val="4"/>
+        <w:spacing w:before="0" w:after="40"/>
+        <w:ind w:firstLine="0" w:left="0"/>
+        <w:jc w:val="left"/>
+      </w:pPr>
+      <w:r>
+        <w:rPr/>
+        <w:t>1.3.2. Phạm vi nghiên cứu</w:t>
+      </w:r>
+    </w:p>
+    <w:p>
+      <w:pPr>
+        <w:spacing w:before="0" w:after="120" w:line="312" w:lineRule="auto"/>
+        <w:ind w:firstLine="720" w:left="0"/>
+        <w:jc w:val="both"/>
+      </w:pPr>
+      <w:r>
+        <w:rPr/>
+        <w:t>Phạm vi nghiên cứu của đề tài được giới hạn như sau:</w:t>
       </w:r>
     </w:p>
     <w:p>
       <w:pPr>
         <w:spacing w:before="0" w:after="80" w:line="312" w:lineRule="auto"/>
-        <w:ind w:firstLine="283"/>
-        <w:jc w:val="both"/>
-      </w:pPr>
-      <w:r>
-        <w:rPr/>
-        <w:t>• Tối ưu hóa giao diện người dùng: Sử dụng HTML5, CSS3, JavaScript, Bootstrap kết hợp với Thymeleaf Template Engine để tạo giao diện thân thiện, tương thích trên nhiều thiết bị.</w:t>
+        <w:ind w:firstLine="720" w:left="0"/>
+        <w:jc w:val="both"/>
+      </w:pPr>
+      <w:r>
+        <w:rPr/>
+        <w:t>- Phạm vi chức năng:</w:t>
+      </w:r>
+    </w:p>
+    <w:p>
+      <w:pPr>
+        <w:spacing w:before="0" w:after="60" w:line="312" w:lineRule="auto"/>
+        <w:ind w:left="720" w:firstLine="720"/>
+        <w:jc w:val="both"/>
+      </w:pPr>
+      <w:r>
+        <w:rPr/>
+        <w:t>+ Hệ thống tập trung giải quyết các bài toán quản lý đại lý đồ gia dụng cốt lõi (Đăng ký đại lý, Quản lý sản phẩm gia dụng, Giỏ hàng, Đặt hàng, Duyệt đơn, Đánh giá sản phẩm). Chưa tích hợp cổng thanh toán trực tuyến qua ngân hàng/ví điện tử thực tế và dịch vụ vận chuyển bên thứ ba (chỉ mô phỏng quy trình).</w:t>
+      </w:r>
+    </w:p>
+    <w:p>
+      <w:pPr>
+        <w:spacing w:before="0" w:after="80" w:line="312" w:lineRule="auto"/>
+        <w:ind w:firstLine="720" w:left="0"/>
+        <w:jc w:val="both"/>
+      </w:pPr>
+      <w:r>
+        <w:rPr/>
+        <w:t>- Phạm vi đối tượng sử dụng:</w:t>
+      </w:r>
+    </w:p>
+    <w:p>
+      <w:pPr>
+        <w:spacing w:before="0" w:after="60" w:line="312" w:lineRule="auto"/>
+        <w:ind w:left="720" w:firstLine="720"/>
+        <w:jc w:val="both"/>
+      </w:pPr>
+      <w:r>
+        <w:rPr/>
+        <w:t>+ Áp dụng cho các đại lý kinh doanh đồ gia dụng vừa và nhỏ, người quản trị hệ thống và khách hàng mua sắm lẻ.</w:t>
+      </w:r>
+    </w:p>
+    <w:p>
+      <w:pPr>
+        <w:spacing w:before="0" w:after="80" w:line="312" w:lineRule="auto"/>
+        <w:ind w:firstLine="720" w:left="0"/>
+        <w:jc w:val="both"/>
+      </w:pPr>
+      <w:r>
+        <w:rPr/>
+        <w:t>- Phạm vi môi trường ứng dụng:</w:t>
+      </w:r>
+    </w:p>
+    <w:p>
+      <w:pPr>
+        <w:spacing w:before="0" w:after="60" w:line="312" w:lineRule="auto"/>
+        <w:ind w:left="720" w:firstLine="720"/>
+        <w:jc w:val="both"/>
+      </w:pPr>
+      <w:r>
+        <w:rPr/>
+        <w:t>+ Chương trình thử nghiệm trong môi trường Localhost trên máy tính cá nhân, phục vụ đánh giá kết quả Bài tập lớn môn Công nghệ Java.</w:t>
       </w:r>
     </w:p>
     <w:p>
       <w:pPr>
         <w:pStyle w:val="3"/>
-        <w:spacing w:before="200" w:after="80" w:line="312" w:lineRule="auto"/>
-        <w:ind w:firstLine="0"/>
+        <w:spacing w:before="0" w:after="80"/>
+        <w:ind w:firstLine="0" w:left="0"/>
         <w:jc w:val="left"/>
       </w:pPr>
       <w:r>
         <w:rPr/>
-        <w:t>1.3. Đối tượng và phạm vi nghiên cứu</w:t>
+        <w:t>1.4. Phương pháp thực hiện</w:t>
+      </w:r>
+    </w:p>
+    <w:p>
+      <w:pPr>
+        <w:spacing w:before="0" w:after="120" w:line="312" w:lineRule="auto"/>
+        <w:ind w:firstLine="720" w:left="0"/>
+        <w:jc w:val="both"/>
+      </w:pPr>
+      <w:r>
+        <w:rPr/>
+        <w:t>Để hoàn thành đề tài một cách khoa học và đạt chất lượng cao, Nhóm 7 đã áp dụng phối hợp các phương pháp nghiên cứu và phát triển phần mềm sau:</w:t>
       </w:r>
     </w:p>
     <w:p>
       <w:pPr>
         <w:pStyle w:val="4"/>
-        <w:spacing w:before="120" w:after="40" w:line="312" w:lineRule="auto"/>
-        <w:ind w:firstLine="0"/>
+        <w:spacing w:before="0" w:after="40"/>
+        <w:ind w:firstLine="0" w:left="0"/>
         <w:jc w:val="left"/>
       </w:pPr>
       <w:r>
         <w:rPr/>
-        <w:t>1.3.1. Đối tượng nghiên cứu</w:t>
+        <w:t>1.4.1. Phương pháp nghiên cứu lý thuyết</w:t>
+      </w:r>
+    </w:p>
+    <w:p>
+      <w:pPr>
+        <w:spacing w:before="0" w:after="80" w:line="312" w:lineRule="auto"/>
+        <w:ind w:firstLine="720" w:left="0"/>
+        <w:jc w:val="both"/>
+      </w:pPr>
+      <w:r>
+        <w:rPr/>
+        <w:t>- Nghiên cứu tài liệu chính thống về ngôn ngữ Java, kiến trúc Spring Boot, Spring Security và Hibernate/JPA từ trang chủ Spring.io.</w:t>
+      </w:r>
+    </w:p>
+    <w:p>
+      <w:pPr>
+        <w:spacing w:before="0" w:after="80" w:line="312" w:lineRule="auto"/>
+        <w:ind w:firstLine="720" w:left="0"/>
+        <w:jc w:val="both"/>
+      </w:pPr>
+      <w:r>
+        <w:rPr/>
+        <w:t>- Tham khảo các mô hình quản lý đại lý và sàn thương mại điện tử Multi-vendor thực tế trên thế giới và tại Việt Nam.</w:t>
+      </w:r>
+    </w:p>
+    <w:p>
+      <w:pPr>
+        <w:spacing w:before="0" w:after="80" w:line="312" w:lineRule="auto"/>
+        <w:ind w:firstLine="720" w:left="0"/>
+        <w:jc w:val="both"/>
+      </w:pPr>
+      <w:r>
+        <w:rPr/>
+        <w:t>- Tổng hợp kiến thức từ giáo trình học phần Công nghệ Java do Thầy Trần Bá Hùng giảng dạy.</w:t>
+      </w:r>
+    </w:p>
+    <w:p>
+      <w:pPr>
+        <w:pStyle w:val="4"/>
+        <w:spacing w:before="0" w:after="40"/>
+        <w:ind w:firstLine="0" w:left="0"/>
+        <w:jc w:val="left"/>
+      </w:pPr>
+      <w:r>
+        <w:rPr/>
+        <w:t>1.4.2. Phương pháp phân tích và thiết kế hệ thống</w:t>
+      </w:r>
+    </w:p>
+    <w:p>
+      <w:pPr>
+        <w:spacing w:before="0" w:after="80" w:line="312" w:lineRule="auto"/>
+        <w:ind w:firstLine="720" w:left="0"/>
+        <w:jc w:val="both"/>
+      </w:pPr>
+      <w:r>
+        <w:rPr/>
+        <w:t>- Phân tích yêu cầu bài toán: Thu thập và tổng hợp các yêu cầu chức năng và phi chức năng của hệ thống phần mềm quản lý đại lý đồ gia dụng.</w:t>
+      </w:r>
+    </w:p>
+    <w:p>
+      <w:pPr>
+        <w:spacing w:before="0" w:after="80" w:line="312" w:lineRule="auto"/>
+        <w:ind w:firstLine="720" w:left="0"/>
+        <w:jc w:val="both"/>
+      </w:pPr>
+      <w:r>
+        <w:rPr/>
+        <w:t>- Phương pháp phân tích hướng đối tượng (OOAD): Xây dựng sơ đồ Use Case xác định tương tác của từng nhóm tác nhân (Admin, Seller, Customer).</w:t>
+      </w:r>
+    </w:p>
+    <w:p>
+      <w:pPr>
+        <w:spacing w:before="0" w:after="80" w:line="312" w:lineRule="auto"/>
+        <w:ind w:firstLine="720" w:left="0"/>
+        <w:jc w:val="both"/>
+      </w:pPr>
+      <w:r>
+        <w:rPr/>
+        <w:t>- Thiết kế cơ sở dữ liệu: Xây dựng biểu đồ thực thể liên kết (ERD) và chuẩn hóa dữ liệu ở dạng chuẩn 3NF để đảm bảo tính toàn vẹn dữ liệu.</w:t>
+      </w:r>
+    </w:p>
+    <w:p>
+      <w:pPr>
+        <w:pStyle w:val="4"/>
+        <w:spacing w:before="0" w:after="40"/>
+        <w:ind w:firstLine="0" w:left="0"/>
+        <w:jc w:val="left"/>
+      </w:pPr>
+      <w:r>
+        <w:rPr/>
+        <w:t>1.4.3. Phương pháp thực nghiệm và phát triển phần mềm</w:t>
+      </w:r>
+    </w:p>
+    <w:p>
+      <w:pPr>
+        <w:spacing w:before="0" w:after="80" w:line="312" w:lineRule="auto"/>
+        <w:ind w:firstLine="720" w:left="0"/>
+        <w:jc w:val="both"/>
+      </w:pPr>
+      <w:r>
+        <w:rPr/>
+        <w:t>- Phương pháp lập trình Agile/Scrum rút gọn: Phân chia đề tài thành các mô-đun chức năng nhỏ (Quản lý User, Quản lý Đại lý, Quản lý Sản phẩm, Giỏ hàng &amp; Đơn hàng) để phát triển và kiểm thử cuốn chiếu.</w:t>
+      </w:r>
+    </w:p>
+    <w:p>
+      <w:pPr>
+        <w:spacing w:before="0" w:after="80" w:line="312" w:lineRule="auto"/>
+        <w:ind w:firstLine="720" w:left="0"/>
+        <w:jc w:val="both"/>
+      </w:pPr>
+      <w:r>
+        <w:rPr/>
+        <w:t>- Sử dụng môi trường phát triển (IDE): NetBeans / IntelliJ IDEA để viết mã nguồn Java.</w:t>
+      </w:r>
+    </w:p>
+    <w:p>
+      <w:pPr>
+        <w:spacing w:before="0" w:after="80" w:line="312" w:lineRule="auto"/>
+        <w:ind w:firstLine="720" w:left="0"/>
+        <w:jc w:val="both"/>
+      </w:pPr>
+      <w:r>
+        <w:rPr/>
+        <w:t>- Sử dụng công cụ quản lý thư viện Maven: Khai báo và quản lý các dependency chuẩn xác.</w:t>
+      </w:r>
+    </w:p>
+    <w:p>
+      <w:pPr>
+        <w:spacing w:before="0" w:after="80" w:line="312" w:lineRule="auto"/>
+        <w:ind w:firstLine="720" w:left="0"/>
+        <w:jc w:val="both"/>
+      </w:pPr>
+      <w:r>
+        <w:rPr/>
+        <w:t>- Phương pháp kiểm thử phần mềm: Thực hiện Unit Test cho từng Service/Repository và Integration Test trên giao diện trình duyệt web để phát hiện và sửa lỗi.</w:t>
+      </w:r>
+    </w:p>
+    <w:p>
+      <w:pPr>
+        <w:pStyle w:val="3"/>
+        <w:spacing w:before="0" w:after="80"/>
+        <w:ind w:firstLine="0" w:left="0"/>
+        <w:jc w:val="left"/>
+      </w:pPr>
+      <w:r>
+        <w:rPr/>
+        <w:t>1.5. Ý nghĩa của đề tài</w:t>
+      </w:r>
+    </w:p>
+    <w:p>
+      <w:pPr>
+        <w:pStyle w:val="4"/>
+        <w:spacing w:before="0" w:after="40"/>
+        <w:ind w:firstLine="0" w:left="0"/>
+        <w:jc w:val="left"/>
+      </w:pPr>
+      <w:r>
+        <w:rPr/>
+        <w:t>1.5.1. Ý nghĩa khoa học và công nghệ</w:t>
+      </w:r>
+    </w:p>
+    <w:p>
+      <w:pPr>
+        <w:spacing w:before="0" w:after="80" w:line="312" w:lineRule="auto"/>
+        <w:ind w:firstLine="720" w:left="0"/>
+        <w:jc w:val="both"/>
+      </w:pPr>
+      <w:r>
+        <w:rPr/>
+        <w:t>- Giúp sinh viên củng cố vững chắc lý thuyết về lập trình Java hướng đối tượng, làm chủ các khung làm việc hàng đầu hiện nay như Spring Boot, Spring Security và Spring Data JPA.</w:t>
+      </w:r>
+    </w:p>
+    <w:p>
+      <w:pPr>
+        <w:spacing w:before="0" w:after="80" w:line="312" w:lineRule="auto"/>
+        <w:ind w:firstLine="720" w:left="0"/>
+        <w:jc w:val="both"/>
+      </w:pPr>
+      <w:r>
+        <w:rPr/>
+        <w:t>- Tiếp cận phương pháp thiết kế phần mềm doanh nghiệp theo mô hình MVC, nâng cao tư duy thiết kế cơ sở dữ liệu và bảo mật ứng dụng Web.</w:t>
+      </w:r>
+    </w:p>
+    <w:p>
+      <w:pPr>
+        <w:pStyle w:val="4"/>
+        <w:spacing w:before="0" w:after="40"/>
+        <w:ind w:firstLine="0" w:left="0"/>
+        <w:jc w:val="left"/>
+      </w:pPr>
+      <w:r>
+        <w:rPr/>
+        <w:t>1.5.2. Ý nghĩa thực tiễn</w:t>
+      </w:r>
+    </w:p>
+    <w:p>
+      <w:pPr>
+        <w:spacing w:before="0" w:after="80" w:line="312" w:lineRule="auto"/>
+        <w:ind w:firstLine="720" w:left="0"/>
+        <w:jc w:val="both"/>
+      </w:pPr>
+      <w:r>
+        <w:rPr/>
+        <w:t>- Cung cấp một giải pháp phần mềm quản lý đại lý đồ gia dụng có tính ứng dụng thực tiễn cao, giúp các nhà kinh doanh số hóa quy trình quản lý đại lý và kênh bán hàng.</w:t>
+      </w:r>
+    </w:p>
+    <w:p>
+      <w:pPr>
+        <w:spacing w:before="0" w:after="80" w:line="312" w:lineRule="auto"/>
+        <w:ind w:firstLine="720" w:left="0"/>
+        <w:jc w:val="both"/>
+      </w:pPr>
+      <w:r>
+        <w:rPr/>
+        <w:t>- Tạo tiền đề vững chắc cho nhóm phát triển mở rộng ứng dụng thành hệ thống E-Commerce quy mô lớn thương mại hóa trong tương lai.</w:t>
+      </w:r>
+    </w:p>
+    <w:p>
+      <w:pPr>
+        <w:pStyle w:val="3"/>
+        <w:spacing w:before="0" w:after="80"/>
+        <w:ind w:firstLine="0" w:left="0"/>
+        <w:jc w:val="left"/>
+      </w:pPr>
+      <w:r>
+        <w:rPr/>
+        <w:t>1.6. Bố cục báo cáo</w:t>
       </w:r>
     </w:p>
     <w:p>
       <w:pPr>
         <w:spacing w:before="0" w:after="120" w:line="312" w:lineRule="auto"/>
-        <w:ind w:firstLine="567"/>
-        <w:jc w:val="both"/>
-      </w:pPr>
-      <w:r>
-        <w:rPr/>
-        <w:t>Đối tượng nghiên cứu của đề tài bao gồm:</w:t>
+        <w:ind w:firstLine="720" w:left="0"/>
+        <w:jc w:val="both"/>
+      </w:pPr>
+      <w:r>
+        <w:rPr/>
+        <w:t>Báo cáo bài tập lớn được cấu trúc thành 5 chương chính cùng các phần bổ trợ như sau:</w:t>
       </w:r>
     </w:p>
     <w:p>
       <w:pPr>
         <w:spacing w:before="0" w:after="80" w:line="312" w:lineRule="auto"/>
-        <w:ind w:firstLine="283"/>
-        <w:jc w:val="both"/>
-      </w:pPr>
-      <w:r>
-        <w:rPr/>
-        <w:t>• Quy trình nghiệp vụ quản lý đại lý kinh doanh đồ gia dụng: Quản lý thông tin gian hàng đại lý, đăng tải sản phẩm gia dụng, quy trình luân chuyển đơn hàng và đối soát doanh thu.</w:t>
+        <w:ind w:firstLine="720" w:left="0"/>
+        <w:jc w:val="both"/>
+      </w:pPr>
+      <w:r>
+        <w:rPr/>
+        <w:t>- Lời mở đầu: Trình bày bối cảnh, lý do thực hiện đề tài và lời cảm ơn.</w:t>
       </w:r>
     </w:p>
     <w:p>
       <w:pPr>
         <w:spacing w:before="0" w:after="80" w:line="312" w:lineRule="auto"/>
-        <w:ind w:firstLine="283"/>
-        <w:jc w:val="both"/>
-      </w:pPr>
-      <w:r>
-        <w:rPr/>
-        <w:t>• Khung ứng dụng Java Spring Boot: Cơ chế Inversion of Control (IoC), Dependency Injection (DI), Spring MVC, Spring Data JPA / Hibernate ORM.</w:t>
+        <w:ind w:firstLine="720" w:left="0"/>
+        <w:jc w:val="both"/>
+      </w:pPr>
+      <w:r>
+        <w:rPr/>
+        <w:t>- Chương 1: Tổng quan về đề tài: Giới thiệu lý do chọn đề tài, mục tiêu tổng quát và cụ thể, đối tượng và phạm vi nghiên cứu, phương pháp thực hiện, ý nghĩa đề tài và bố cục báo cáo.</w:t>
       </w:r>
     </w:p>
     <w:p>
       <w:pPr>
         <w:spacing w:before="0" w:after="80" w:line="312" w:lineRule="auto"/>
-        <w:ind w:firstLine="283"/>
-        <w:jc w:val="both"/>
-      </w:pPr>
-      <w:r>
-        <w:rPr/>
-        <w:t>• Cơ chế bảo mật Spring Security: Mã hóa mật khẩu bằng BCryptPasswordEncoder, quản lý phiên làm việc (Session Management), phân quyền truy cập phương thức và URL theo Role.</w:t>
+        <w:ind w:firstLine="720" w:left="0"/>
+        <w:jc w:val="both"/>
+      </w:pPr>
+      <w:r>
+        <w:rPr/>
+        <w:t>- Chương 2: Cơ sở lý thuyết: Giới thiệu tổng quan về thương mại điện tử, mô hình Multi-vendor, ngôn ngữ Java, Spring Boot Framework, Spring Security, Hibernate/JPA, Thymeleaf, MySQL và kiến trúc MVC.</w:t>
       </w:r>
     </w:p>
     <w:p>
       <w:pPr>
         <w:spacing w:before="0" w:after="80" w:line="312" w:lineRule="auto"/>
-        <w:ind w:firstLine="283"/>
-        <w:jc w:val="both"/>
-      </w:pPr>
-      <w:r>
-        <w:rPr/>
-        <w:t>• Công nghệ giao diện Thymeleaf: Cách thức nhúng dữ liệu động từ Spring Controller sang giao diện HTML.</w:t>
+        <w:ind w:firstLine="720" w:left="0"/>
+        <w:jc w:val="both"/>
+      </w:pPr>
+      <w:r>
+        <w:rPr/>
+        <w:t>- Chương 3: Phân tích và thiết kế hệ thống: Khảo sát yêu cầu, phân tích tác nhân (Admin, Seller, Customer), yêu cầu chức năng/phi chức năng, sơ đồ Use Case và thiết kế cơ sở dữ liệu ERD.</w:t>
       </w:r>
     </w:p>
     <w:p>
       <w:pPr>
         <w:spacing w:before="0" w:after="80" w:line="312" w:lineRule="auto"/>
-        <w:ind w:firstLine="283"/>
-        <w:jc w:val="both"/>
-      </w:pPr>
-      <w:r>
-        <w:rPr/>
-        <w:t>• Hệ quản trị cơ sở dữ liệu quan hệ MySQL: Thiết kế sơ đồ quan hệ Entity-Relationship (ERD), tối ưu truy vấn SQL.</w:t>
-      </w:r>
-    </w:p>
-    <w:p>
-      <w:pPr>
-        <w:pStyle w:val="4"/>
-        <w:spacing w:before="120" w:after="40" w:line="312" w:lineRule="auto"/>
-        <w:ind w:firstLine="0"/>
-        <w:jc w:val="left"/>
-      </w:pPr>
-      <w:r>
-        <w:rPr/>
-        <w:t>1.3.2. Phạm vi nghiên cứu</w:t>
-      </w:r>
-    </w:p>
-    <w:p>
-      <w:pPr>
-        <w:spacing w:before="0" w:after="120" w:line="312" w:lineRule="auto"/>
-        <w:ind w:firstLine="567"/>
-        <w:jc w:val="both"/>
-      </w:pPr>
-      <w:r>
-        <w:rPr/>
-        <w:t>Phạm vi nghiên cứu của đề tài được giới hạn như sau:</w:t>
+        <w:ind w:firstLine="720" w:left="0"/>
+        <w:jc w:val="both"/>
+      </w:pPr>
+      <w:r>
+        <w:rPr/>
+        <w:t>- Chương 4: Cài đặt và triển khai hệ thống: Mô tả cấu trúc dự án Java, hiện thực các dịch vụ cốt lõi, minh họa giao diện điều khiển và các chức năng chính của chương trình.</w:t>
       </w:r>
     </w:p>
     <w:p>
       <w:pPr>
         <w:spacing w:before="0" w:after="80" w:line="312" w:lineRule="auto"/>
-        <w:ind w:firstLine="283"/>
-        <w:jc w:val="both"/>
-      </w:pPr>
-      <w:r>
-        <w:rPr/>
-        <w:t>• Phạm vi chức năng: Hệ thống tập trung giải quyết các bài toán quản lý đại lý đồ gia dụng cốt lõi (Đăng ký đại lý, Quản lý sản phẩm gia dụng, Giỏ hàng, Đặt hàng, Duyệt đơn, Đánh giá sản phẩm). Chưa tích hợp cổng thanh toán trực tuyến qua ngân hàng/ví điện tử thực tế và dịch vụ vận chuyển bên thứ ba (chỉ mô phỏng quy trình).</w:t>
-      </w:r>
-    </w:p>
-    <w:p>
-      <w:pPr>
-        <w:spacing w:before="0" w:after="80" w:line="312" w:lineRule="auto"/>
-        <w:ind w:firstLine="283"/>
-        <w:jc w:val="both"/>
-      </w:pPr>
-      <w:r>
-        <w:rPr/>
-        <w:t>• Phạm vi đối tượng sử dụng: Áp dụng cho các đại lý kinh doanh đồ gia dụng vừa và nhỏ, người quản trị hệ thống và khách hàng mua sắm lẻ.</w:t>
-      </w:r>
-    </w:p>
-    <w:p>
-      <w:pPr>
-        <w:spacing w:before="0" w:after="80" w:line="312" w:lineRule="auto"/>
-        <w:ind w:firstLine="283"/>
-        <w:jc w:val="both"/>
-      </w:pPr>
-      <w:r>
-        <w:rPr/>
-        <w:t>• Phạm vi môi trường ứng dụng: Chương trình thử nghiệm trong môi trường Localhost trên máy tính cá nhân, phục vụ đánh giá kết quả Bài tập lớn môn Công nghệ Java.</w:t>
-      </w:r>
-    </w:p>
-    <w:p>
-      <w:pPr>
-        <w:pStyle w:val="3"/>
-        <w:spacing w:before="200" w:after="80" w:line="312" w:lineRule="auto"/>
-        <w:ind w:firstLine="0"/>
-        <w:jc w:val="left"/>
-      </w:pPr>
-      <w:r>
-        <w:rPr/>
-        <w:t>1.4. Phương pháp thực hiện</w:t>
-      </w:r>
-    </w:p>
-    <w:p>
-      <w:pPr>
-        <w:spacing w:before="0" w:after="120" w:line="312" w:lineRule="auto"/>
-        <w:ind w:firstLine="567"/>
-        <w:jc w:val="both"/>
-      </w:pPr>
-      <w:r>
-        <w:rPr/>
-        <w:t>Để hoàn thành đề tài một cách khoa học và đạt chất lượng cao, Nhóm 7 đã áp dụng phối hợp các phương pháp nghiên cứu và phát triển phần mềm sau:</w:t>
-      </w:r>
-    </w:p>
-    <w:p>
-      <w:pPr>
-        <w:pStyle w:val="4"/>
-        <w:spacing w:before="120" w:after="40" w:line="312" w:lineRule="auto"/>
-        <w:ind w:firstLine="0"/>
-        <w:jc w:val="left"/>
-      </w:pPr>
-      <w:r>
-        <w:rPr/>
-        <w:t>1.4.1. Phương pháp nghiên cứu lý thuyết</w:t>
-      </w:r>
-    </w:p>
-    <w:p>
-      <w:pPr>
-        <w:spacing w:before="0" w:after="80" w:line="312" w:lineRule="auto"/>
-        <w:ind w:firstLine="283"/>
-        <w:jc w:val="both"/>
-      </w:pPr>
-      <w:r>
-        <w:rPr/>
-        <w:t>• Nghiên cứu tài liệu chính thống về ngôn ngữ Java, kiến trúc Spring Boot, Spring Security và Hibernate/JPA từ trang chủ Spring.io.</w:t>
-      </w:r>
-    </w:p>
-    <w:p>
-      <w:pPr>
-        <w:spacing w:before="0" w:after="80" w:line="312" w:lineRule="auto"/>
-        <w:ind w:firstLine="283"/>
-        <w:jc w:val="both"/>
-      </w:pPr>
-      <w:r>
-        <w:rPr/>
-        <w:t>• Tham khảo các mô hình quản lý đại lý và sàn thương mại điện tử Multi-vendor thực tế trên thế giới và tại Việt Nam.</w:t>
-      </w:r>
-    </w:p>
-    <w:p>
-      <w:pPr>
-        <w:spacing w:before="0" w:after="80" w:line="312" w:lineRule="auto"/>
-        <w:ind w:firstLine="283"/>
-        <w:jc w:val="both"/>
-      </w:pPr>
-      <w:r>
-        <w:rPr/>
-        <w:t>• Tổng hợp kiến thức từ giáo trình học phần Công nghệ Java do Thầy Trần Bá Hùng giảng dạy.</w:t>
-      </w:r>
-    </w:p>
-    <w:p>
-      <w:pPr>
-        <w:pStyle w:val="4"/>
-        <w:spacing w:before="120" w:after="40" w:line="312" w:lineRule="auto"/>
-        <w:ind w:firstLine="0"/>
-        <w:jc w:val="left"/>
-      </w:pPr>
-      <w:r>
-        <w:rPr/>
-        <w:t>1.4.2. Phương pháp phân tích và thiết kế hệ thống</w:t>
-      </w:r>
-    </w:p>
-    <w:p>
-      <w:pPr>
-        <w:spacing w:before="0" w:after="80" w:line="312" w:lineRule="auto"/>
-        <w:ind w:firstLine="283"/>
-        <w:jc w:val="both"/>
-      </w:pPr>
-      <w:r>
-        <w:rPr/>
-        <w:t>• Phân tích yêu cầu bài toán: Thu thập và tổng hợp các yêu cầu chức năng và phi chức năng của hệ thống phần mềm quản lý đại lý đồ gia dụng.</w:t>
-      </w:r>
-    </w:p>
-    <w:p>
-      <w:pPr>
-        <w:spacing w:before="0" w:after="80" w:line="312" w:lineRule="auto"/>
-        <w:ind w:firstLine="283"/>
-        <w:jc w:val="both"/>
-      </w:pPr>
-      <w:r>
-        <w:rPr/>
-        <w:t>• Phương pháp phân tích hướng đối tượng (OOAD): Xây dựng sơ đồ Use Case xác định tương tác của từng nhóm tác nhân (Admin, Seller, Customer).</w:t>
-      </w:r>
-    </w:p>
-    <w:p>
-      <w:pPr>
-        <w:spacing w:before="0" w:after="80" w:line="312" w:lineRule="auto"/>
-        <w:ind w:firstLine="283"/>
-        <w:jc w:val="both"/>
-      </w:pPr>
-      <w:r>
-        <w:rPr/>
-        <w:t>• Thiết kế cơ sở dữ liệu: Xây dựng biểu đồ thực thể liên kết (ERD) và chuẩn hóa dữ liệu ở dạng chuẩn 3NF để đảm bảo tính toàn vẹn dữ liệu.</w:t>
-      </w:r>
-    </w:p>
-    <w:p>
-      <w:pPr>
-        <w:pStyle w:val="4"/>
-        <w:spacing w:before="120" w:after="40" w:line="312" w:lineRule="auto"/>
-        <w:ind w:firstLine="0"/>
-        <w:jc w:val="left"/>
-      </w:pPr>
-      <w:r>
-        <w:rPr/>
-        <w:t>1.4.3. Phương pháp thực nghiệm và phát triển phần mềm</w:t>
-      </w:r>
-    </w:p>
-    <w:p>
-      <w:pPr>
-        <w:spacing w:before="0" w:after="80" w:line="312" w:lineRule="auto"/>
-        <w:ind w:firstLine="283"/>
-        <w:jc w:val="both"/>
-      </w:pPr>
-      <w:r>
-        <w:rPr/>
-        <w:t>• Phương pháp lập trình Agile/Scrum rút gọn: Phân chia đề tài thành các mô-đun chức năng nhỏ (Quản lý User, Quản lý Đại lý, Quản lý Sản phẩm, Giỏ hàng &amp; Đơn hàng) để phát triển và kiểm thử cuốn chiếu.</w:t>
-      </w:r>
-    </w:p>
-    <w:p>
-      <w:pPr>
-        <w:spacing w:before="0" w:after="80" w:line="312" w:lineRule="auto"/>
-        <w:ind w:firstLine="283"/>
-        <w:jc w:val="both"/>
-      </w:pPr>
-      <w:r>
-        <w:rPr/>
-        <w:t>• Sử dụng môi trường phát triển (IDE): NetBeans / IntelliJ IDEA để viết mã nguồn Java.</w:t>
-      </w:r>
-    </w:p>
-    <w:p>
-      <w:pPr>
-        <w:spacing w:before="0" w:after="80" w:line="312" w:lineRule="auto"/>
-        <w:ind w:firstLine="283"/>
-        <w:jc w:val="both"/>
-      </w:pPr>
-      <w:r>
-        <w:rPr/>
-        <w:t>• Sử dụng công cụ quản lý thư viện Maven: Khai báo và quản lý các dependency chuẩn xác.</w:t>
-      </w:r>
-    </w:p>
-    <w:p>
-      <w:pPr>
-        <w:spacing w:before="0" w:after="80" w:line="312" w:lineRule="auto"/>
-        <w:ind w:firstLine="283"/>
-        <w:jc w:val="both"/>
-      </w:pPr>
-      <w:r>
-        <w:rPr/>
-        <w:t>• Phương pháp kiểm thử phần mềm: Thực hiện Unit Test cho từng Service/Repository và Integration Test trên giao diện trình duyệt web để phát hiện và sửa lỗi.</w:t>
-      </w:r>
-    </w:p>
-    <w:p>
-      <w:pPr>
-        <w:pStyle w:val="3"/>
-        <w:spacing w:before="200" w:after="80" w:line="312" w:lineRule="auto"/>
-        <w:ind w:firstLine="0"/>
-        <w:jc w:val="left"/>
-      </w:pPr>
-      <w:r>
-        <w:rPr/>
-        <w:t>1.5. Ý nghĩa của đề tài</w:t>
-      </w:r>
-    </w:p>
-    <w:p>
-      <w:pPr>
-        <w:pStyle w:val="4"/>
-        <w:spacing w:before="120" w:after="40" w:line="312" w:lineRule="auto"/>
-        <w:ind w:firstLine="0"/>
-        <w:jc w:val="left"/>
-      </w:pPr>
-      <w:r>
-        <w:rPr/>
-        <w:t>1.5.1. Ý nghĩa khoa học và công nghệ</w:t>
-      </w:r>
-    </w:p>
-    <w:p>
-      <w:pPr>
-        <w:spacing w:before="0" w:after="80" w:line="312" w:lineRule="auto"/>
-        <w:ind w:firstLine="283"/>
-        <w:jc w:val="both"/>
-      </w:pPr>
-      <w:r>
-        <w:rPr/>
-        <w:t>• Giúp sinh viên củng cố vững chắc lý thuyết về lập trình Java hướng đối tượng, làm chủ các khung làm việc hàng đầu hiện nay như Spring Boot, Spring Security và Spring Data JPA.</w:t>
-      </w:r>
-    </w:p>
-    <w:p>
-      <w:pPr>
-        <w:spacing w:before="0" w:after="80" w:line="312" w:lineRule="auto"/>
-        <w:ind w:firstLine="283"/>
-        <w:jc w:val="both"/>
-      </w:pPr>
-      <w:r>
-        <w:rPr/>
-        <w:t>• Tiếp cận phương pháp thiết kế phần mềm doanh nghiệp theo mô hình MVC, nâng cao tư duy thiết kế cơ sở dữ liệu và bảo mật ứng dụng Web.</w:t>
-      </w:r>
-    </w:p>
-    <w:p>
-      <w:pPr>
-        <w:pStyle w:val="4"/>
-        <w:spacing w:before="120" w:after="40" w:line="312" w:lineRule="auto"/>
-        <w:ind w:firstLine="0"/>
-        <w:jc w:val="left"/>
-      </w:pPr>
-      <w:r>
-        <w:rPr/>
-        <w:t>1.5.2. Ý nghĩa thực tiễn</w:t>
-      </w:r>
-    </w:p>
-    <w:p>
-      <w:pPr>
-        <w:spacing w:before="0" w:after="80" w:line="312" w:lineRule="auto"/>
-        <w:ind w:firstLine="283"/>
-        <w:jc w:val="both"/>
-      </w:pPr>
-      <w:r>
-        <w:rPr/>
-        <w:t>• Cung cấp một giải pháp phần mềm quản lý đại lý đồ gia dụng có tính ứng dụng thực tiễn cao, giúp các nhà kinh doanh số hóa quy trình quản lý đại lý và kênh bán hàng.</w:t>
-      </w:r>
-    </w:p>
-    <w:p>
-      <w:pPr>
-        <w:spacing w:before="0" w:after="80" w:line="312" w:lineRule="auto"/>
-        <w:ind w:firstLine="283"/>
-        <w:jc w:val="both"/>
-      </w:pPr>
-      <w:r>
-        <w:rPr/>
-        <w:t>• Tạo tiền đề vững chắc cho nhóm phát triển mở rộng ứng dụng thành hệ thống E-Commerce quy mô lớn thương mại hóa trong tương lai.</w:t>
-      </w:r>
-    </w:p>
-    <w:p>
-      <w:pPr>
-        <w:pStyle w:val="3"/>
-        <w:spacing w:before="200" w:after="80" w:line="312" w:lineRule="auto"/>
-        <w:ind w:firstLine="0"/>
-        <w:jc w:val="left"/>
-      </w:pPr>
-      <w:r>
-        <w:rPr/>
-        <w:t>1.6. Bố cục báo cáo</w:t>
-      </w:r>
-    </w:p>
-    <w:p>
-      <w:pPr>
-        <w:spacing w:before="0" w:after="120" w:line="312" w:lineRule="auto"/>
-        <w:ind w:firstLine="567"/>
-        <w:jc w:val="both"/>
-      </w:pPr>
-      <w:r>
-        <w:rPr/>
-        <w:t>Báo cáo bài tập lớn được cấu trúc thành 5 chương chính cùng các phần bổ trợ như sau:</w:t>
-      </w:r>
-    </w:p>
-    <w:p>
-      <w:pPr>
-        <w:spacing w:before="0" w:after="80" w:line="312" w:lineRule="auto"/>
-        <w:ind w:firstLine="283"/>
-        <w:jc w:val="both"/>
-      </w:pPr>
-      <w:r>
-        <w:rPr/>
-        <w:t>• Lời mở đầu: Trình bày bối cảnh, lý do thực hiện đề tài và lời cảm ơn.</w:t>
-      </w:r>
-    </w:p>
-    <w:p>
-      <w:pPr>
-        <w:spacing w:before="0" w:after="80" w:line="312" w:lineRule="auto"/>
-        <w:ind w:firstLine="283"/>
-        <w:jc w:val="both"/>
-      </w:pPr>
-      <w:r>
-        <w:rPr/>
-        <w:t>• Chương 1: Tổng quan về đề tài: Giới thiệu lý do chọn đề tài, mục tiêu tổng quát và cụ thể, đối tượng và phạm vi nghiên cứu, phương pháp thực hiện, ý nghĩa đề tài và bố cục báo cáo.</w:t>
-      </w:r>
-    </w:p>
-    <w:p>
-      <w:pPr>
-        <w:spacing w:before="0" w:after="80" w:line="312" w:lineRule="auto"/>
-        <w:ind w:firstLine="283"/>
-        <w:jc w:val="both"/>
-      </w:pPr>
-      <w:r>
-        <w:rPr/>
-        <w:t>• Chương 2: Cơ sở lý thuyết: Giới thiệu tổng quan về thương mại điện tử, mô hình Multi-vendor, ngôn ngữ Java, Spring Boot Framework, Spring Security, Hibernate/JPA, Thymeleaf, MySQL và kiến trúc MVC.</w:t>
-      </w:r>
-    </w:p>
-    <w:p>
-      <w:pPr>
-        <w:spacing w:before="0" w:after="80" w:line="312" w:lineRule="auto"/>
-        <w:ind w:firstLine="283"/>
-        <w:jc w:val="both"/>
-      </w:pPr>
-      <w:r>
-        <w:rPr/>
-        <w:t>• Chương 3: Phân tích và thiết kế hệ thống: Khảo sát yêu cầu, phân tích tác nhân (Admin, Seller, Customer), yêu cầu chức năng/phi chức năng, sơ đồ Use Case và thiết kế cơ sở dữ liệu ERD.</w:t>
-      </w:r>
-    </w:p>
-    <w:p>
-      <w:pPr>
-        <w:spacing w:before="0" w:after="80" w:line="312" w:lineRule="auto"/>
-        <w:ind w:firstLine="283"/>
-        <w:jc w:val="both"/>
-      </w:pPr>
-      <w:r>
-        <w:rPr/>
-        <w:t>• Chương 4: Cài đặt và triển khai hệ thống: Mô tả cấu trúc dán Java, hiện thực các dịch vụ cốt lõi, minh họa giao diện điều khiển và các chức năng chính của chương trình.</w:t>
-      </w:r>
-    </w:p>
-    <w:p>
-      <w:pPr>
-        <w:spacing w:before="0" w:after="80" w:line="312" w:lineRule="auto"/>
-        <w:ind w:firstLine="283"/>
-        <w:jc w:val="both"/>
-      </w:pPr>
-      <w:r>
-        <w:rPr/>
-        <w:t>• Chương 5: Kết luận và hướng phát triển: Tổng kết các kết quả đã đạt được của đề tài, thẳng thắn nhìn nhận những mặt hạn chế và đề xuất các hướng nâng cấp phát triển trong tương lai.</w:t>
+        <w:ind w:firstLine="720" w:left="0"/>
+        <w:jc w:val="both"/>
+      </w:pPr>
+      <w:r>
+        <w:rPr/>
+        <w:t>- Chương 5: Kết luận và hướng phát triển: Tổng kết các kết quả đã đạt được của đề tài, thẳng thắn nhìn nhận những mặt hạn chế và đề xuất các hướng nâng cấp phát triển trong tương lai.</w:t>
       </w:r>
     </w:p>
     <w:sectPr>
@@ -2495,7 +2583,7 @@
     <w:lsdException w:unhideWhenUsed="0" w:uiPriority="69" w:semiHidden="0" w:name="Medium Grid 3 Accent 5"/>
     <w:lsdException w:unhideWhenUsed="0" w:uiPriority="70" w:semiHidden="0" w:name="Dark List Accent 5"/>
     <w:lsdException w:unhideWhenUsed="0" w:uiPriority="71" w:semiHidden="0" w:name="Colorful Shading Accent 5"/>
-    <w:lsdException w:unhideWhenUsed="0" w:uiPriority="72" w:semiHidden="0" w:name="Colorful List Accent 5"/>
+    <w:lsdException w:qFormat="1" w:unhideWhenUsed="0" w:uiPriority="72" w:semiHidden="0" w:name="Colorful List Accent 5"/>
     <w:lsdException w:unhideWhenUsed="0" w:uiPriority="73" w:semiHidden="0" w:name="Colorful Grid Accent 5"/>
     <w:lsdException w:unhideWhenUsed="0" w:uiPriority="60" w:semiHidden="0" w:name="Light Shading Accent 6"/>
     <w:lsdException w:unhideWhenUsed="0" w:uiPriority="61" w:semiHidden="0" w:name="Light List Accent 6"/>
@@ -2557,7 +2645,6 @@
     <w:qFormat/>
     <w:uiPriority w:val="1"/>
     <w:pPr>
-      <w:spacing w:before="239"/>
       <w:ind w:left="490" w:hanging="490"/>
       <w:outlineLvl w:val="1"/>
     </w:pPr>

</xml_diff>

<commit_message>
docs: update line spacing to 1.5 for Normal text and headings in Chapter 1
</commit_message>
<xml_diff>
--- a/DeTaiCNJ18_Nhom7.docx
+++ b/DeTaiCNJ18_Nhom7.docx
@@ -1475,7 +1475,7 @@
     <w:p>
       <w:pPr>
         <w:pStyle w:val="2"/>
-        <w:spacing w:before="240" w:after="240"/>
+        <w:spacing w:before="240" w:after="240" w:line="360" w:lineRule="auto"/>
         <w:ind w:firstLine="0" w:left="0"/>
         <w:jc w:val="center"/>
       </w:pPr>
@@ -1487,7 +1487,7 @@
     <w:p>
       <w:pPr>
         <w:pStyle w:val="3"/>
-        <w:spacing w:before="0" w:after="80"/>
+        <w:spacing w:before="0" w:after="80" w:line="360" w:lineRule="auto"/>
         <w:ind w:firstLine="0" w:left="0"/>
         <w:jc w:val="left"/>
       </w:pPr>
@@ -1498,7 +1498,7 @@
     </w:p>
     <w:p>
       <w:pPr>
-        <w:spacing w:before="0" w:after="120" w:line="312" w:lineRule="auto"/>
+        <w:spacing w:before="0" w:after="120" w:line="360" w:lineRule="auto"/>
         <w:ind w:firstLine="720" w:left="0"/>
         <w:jc w:val="both"/>
       </w:pPr>
@@ -1509,7 +1509,7 @@
     </w:p>
     <w:p>
       <w:pPr>
-        <w:spacing w:before="0" w:after="120" w:line="312" w:lineRule="auto"/>
+        <w:spacing w:before="0" w:after="120" w:line="360" w:lineRule="auto"/>
         <w:ind w:firstLine="720" w:left="0"/>
         <w:jc w:val="both"/>
       </w:pPr>
@@ -1520,7 +1520,7 @@
     </w:p>
     <w:p>
       <w:pPr>
-        <w:spacing w:before="0" w:after="80" w:line="312" w:lineRule="auto"/>
+        <w:spacing w:before="0" w:after="80" w:line="360" w:lineRule="auto"/>
         <w:ind w:firstLine="720" w:left="0"/>
         <w:jc w:val="both"/>
       </w:pPr>
@@ -1531,7 +1531,7 @@
     </w:p>
     <w:p>
       <w:pPr>
-        <w:spacing w:before="0" w:after="80" w:line="312" w:lineRule="auto"/>
+        <w:spacing w:before="0" w:after="80" w:line="360" w:lineRule="auto"/>
         <w:ind w:firstLine="720" w:left="0"/>
         <w:jc w:val="both"/>
       </w:pPr>
@@ -1542,7 +1542,7 @@
     </w:p>
     <w:p>
       <w:pPr>
-        <w:spacing w:before="0" w:after="80" w:line="312" w:lineRule="auto"/>
+        <w:spacing w:before="0" w:after="80" w:line="360" w:lineRule="auto"/>
         <w:ind w:firstLine="720" w:left="0"/>
         <w:jc w:val="both"/>
       </w:pPr>
@@ -1553,7 +1553,7 @@
     </w:p>
     <w:p>
       <w:pPr>
-        <w:spacing w:before="0" w:after="80" w:line="312" w:lineRule="auto"/>
+        <w:spacing w:before="0" w:after="80" w:line="360" w:lineRule="auto"/>
         <w:ind w:firstLine="720" w:left="0"/>
         <w:jc w:val="both"/>
       </w:pPr>
@@ -1564,7 +1564,7 @@
     </w:p>
     <w:p>
       <w:pPr>
-        <w:spacing w:before="0" w:after="120" w:line="312" w:lineRule="auto"/>
+        <w:spacing w:before="0" w:after="120" w:line="360" w:lineRule="auto"/>
         <w:ind w:firstLine="720" w:left="0"/>
         <w:jc w:val="both"/>
       </w:pPr>
@@ -1576,7 +1576,7 @@
     <w:p>
       <w:pPr>
         <w:pStyle w:val="3"/>
-        <w:spacing w:before="0" w:after="80"/>
+        <w:spacing w:before="0" w:after="80" w:line="360" w:lineRule="auto"/>
         <w:ind w:firstLine="0" w:left="0"/>
         <w:jc w:val="left"/>
       </w:pPr>
@@ -1588,7 +1588,7 @@
     <w:p>
       <w:pPr>
         <w:pStyle w:val="4"/>
-        <w:spacing w:before="0" w:after="40"/>
+        <w:spacing w:before="0" w:after="40" w:line="360" w:lineRule="auto"/>
         <w:ind w:firstLine="0" w:left="0"/>
         <w:jc w:val="left"/>
       </w:pPr>
@@ -1599,7 +1599,7 @@
     </w:p>
     <w:p>
       <w:pPr>
-        <w:spacing w:before="0" w:after="120" w:line="312" w:lineRule="auto"/>
+        <w:spacing w:before="0" w:after="120" w:line="360" w:lineRule="auto"/>
         <w:ind w:firstLine="720" w:left="0"/>
         <w:jc w:val="both"/>
       </w:pPr>
@@ -1611,7 +1611,7 @@
     <w:p>
       <w:pPr>
         <w:pStyle w:val="4"/>
-        <w:spacing w:before="0" w:after="40"/>
+        <w:spacing w:before="0" w:after="40" w:line="360" w:lineRule="auto"/>
         <w:ind w:firstLine="0" w:left="0"/>
         <w:jc w:val="left"/>
       </w:pPr>
@@ -1622,7 +1622,7 @@
     </w:p>
     <w:p>
       <w:pPr>
-        <w:spacing w:before="0" w:after="120" w:line="312" w:lineRule="auto"/>
+        <w:spacing w:before="0" w:after="120" w:line="360" w:lineRule="auto"/>
         <w:ind w:firstLine="720" w:left="0"/>
         <w:jc w:val="both"/>
       </w:pPr>
@@ -1633,7 +1633,7 @@
     </w:p>
     <w:p>
       <w:pPr>
-        <w:spacing w:before="0" w:after="80" w:line="312" w:lineRule="auto"/>
+        <w:spacing w:before="0" w:after="80" w:line="360" w:lineRule="auto"/>
         <w:ind w:firstLine="720" w:left="0"/>
         <w:jc w:val="both"/>
       </w:pPr>
@@ -1644,7 +1644,7 @@
     </w:p>
     <w:p>
       <w:pPr>
-        <w:spacing w:before="0" w:after="60" w:line="312" w:lineRule="auto"/>
+        <w:spacing w:before="0" w:after="60" w:line="360" w:lineRule="auto"/>
         <w:ind w:left="720" w:firstLine="720"/>
         <w:jc w:val="both"/>
       </w:pPr>
@@ -1655,7 +1655,7 @@
     </w:p>
     <w:p>
       <w:pPr>
-        <w:spacing w:before="0" w:after="80" w:line="312" w:lineRule="auto"/>
+        <w:spacing w:before="0" w:after="80" w:line="360" w:lineRule="auto"/>
         <w:ind w:firstLine="720" w:left="0"/>
         <w:jc w:val="both"/>
       </w:pPr>
@@ -1666,7 +1666,7 @@
     </w:p>
     <w:p>
       <w:pPr>
-        <w:spacing w:before="0" w:after="60" w:line="312" w:lineRule="auto"/>
+        <w:spacing w:before="0" w:after="60" w:line="360" w:lineRule="auto"/>
         <w:ind w:left="720" w:firstLine="720"/>
         <w:jc w:val="both"/>
       </w:pPr>
@@ -1677,7 +1677,7 @@
     </w:p>
     <w:p>
       <w:pPr>
-        <w:spacing w:before="0" w:after="80" w:line="312" w:lineRule="auto"/>
+        <w:spacing w:before="0" w:after="80" w:line="360" w:lineRule="auto"/>
         <w:ind w:firstLine="720" w:left="0"/>
         <w:jc w:val="both"/>
       </w:pPr>
@@ -1688,7 +1688,7 @@
     </w:p>
     <w:p>
       <w:pPr>
-        <w:spacing w:before="0" w:after="60" w:line="312" w:lineRule="auto"/>
+        <w:spacing w:before="0" w:after="60" w:line="360" w:lineRule="auto"/>
         <w:ind w:left="720" w:firstLine="720"/>
         <w:jc w:val="both"/>
       </w:pPr>
@@ -1699,7 +1699,7 @@
     </w:p>
     <w:p>
       <w:pPr>
-        <w:spacing w:before="0" w:after="60" w:line="312" w:lineRule="auto"/>
+        <w:spacing w:before="0" w:after="60" w:line="360" w:lineRule="auto"/>
         <w:ind w:left="720" w:firstLine="720"/>
         <w:jc w:val="both"/>
       </w:pPr>
@@ -1710,7 +1710,7 @@
     </w:p>
     <w:p>
       <w:pPr>
-        <w:spacing w:before="0" w:after="60" w:line="312" w:lineRule="auto"/>
+        <w:spacing w:before="0" w:after="60" w:line="360" w:lineRule="auto"/>
         <w:ind w:left="720" w:firstLine="720"/>
         <w:jc w:val="both"/>
       </w:pPr>
@@ -1721,7 +1721,7 @@
     </w:p>
     <w:p>
       <w:pPr>
-        <w:spacing w:before="0" w:after="60" w:line="312" w:lineRule="auto"/>
+        <w:spacing w:before="0" w:after="60" w:line="360" w:lineRule="auto"/>
         <w:ind w:left="720" w:firstLine="720"/>
         <w:jc w:val="both"/>
       </w:pPr>
@@ -1733,7 +1733,7 @@
     <w:p>
       <w:pPr>
         <w:pStyle w:val="3"/>
-        <w:spacing w:before="0" w:after="80"/>
+        <w:spacing w:before="0" w:after="80" w:line="360" w:lineRule="auto"/>
         <w:ind w:firstLine="0" w:left="0"/>
         <w:jc w:val="left"/>
       </w:pPr>
@@ -1745,7 +1745,7 @@
     <w:p>
       <w:pPr>
         <w:pStyle w:val="4"/>
-        <w:spacing w:before="0" w:after="40"/>
+        <w:spacing w:before="0" w:after="40" w:line="360" w:lineRule="auto"/>
         <w:ind w:firstLine="0" w:left="0"/>
         <w:jc w:val="left"/>
       </w:pPr>
@@ -1756,7 +1756,7 @@
     </w:p>
     <w:p>
       <w:pPr>
-        <w:spacing w:before="0" w:after="120" w:line="312" w:lineRule="auto"/>
+        <w:spacing w:before="0" w:after="120" w:line="360" w:lineRule="auto"/>
         <w:ind w:firstLine="720" w:left="0"/>
         <w:jc w:val="both"/>
       </w:pPr>
@@ -1767,7 +1767,7 @@
     </w:p>
     <w:p>
       <w:pPr>
-        <w:spacing w:before="0" w:after="80" w:line="312" w:lineRule="auto"/>
+        <w:spacing w:before="0" w:after="80" w:line="360" w:lineRule="auto"/>
         <w:ind w:firstLine="720" w:left="0"/>
         <w:jc w:val="both"/>
       </w:pPr>
@@ -1778,7 +1778,7 @@
     </w:p>
     <w:p>
       <w:pPr>
-        <w:spacing w:before="0" w:after="60" w:line="312" w:lineRule="auto"/>
+        <w:spacing w:before="0" w:after="60" w:line="360" w:lineRule="auto"/>
         <w:ind w:left="720" w:firstLine="720"/>
         <w:jc w:val="both"/>
       </w:pPr>
@@ -1789,7 +1789,7 @@
     </w:p>
     <w:p>
       <w:pPr>
-        <w:spacing w:before="0" w:after="60" w:line="312" w:lineRule="auto"/>
+        <w:spacing w:before="0" w:after="60" w:line="360" w:lineRule="auto"/>
         <w:ind w:left="720" w:firstLine="720"/>
         <w:jc w:val="both"/>
       </w:pPr>
@@ -1800,7 +1800,7 @@
     </w:p>
     <w:p>
       <w:pPr>
-        <w:spacing w:before="0" w:after="80" w:line="312" w:lineRule="auto"/>
+        <w:spacing w:before="0" w:after="80" w:line="360" w:lineRule="auto"/>
         <w:ind w:firstLine="720" w:left="0"/>
         <w:jc w:val="both"/>
       </w:pPr>
@@ -1811,7 +1811,7 @@
     </w:p>
     <w:p>
       <w:pPr>
-        <w:spacing w:before="0" w:after="60" w:line="312" w:lineRule="auto"/>
+        <w:spacing w:before="0" w:after="60" w:line="360" w:lineRule="auto"/>
         <w:ind w:left="720" w:firstLine="720"/>
         <w:jc w:val="both"/>
       </w:pPr>
@@ -1822,7 +1822,7 @@
     </w:p>
     <w:p>
       <w:pPr>
-        <w:spacing w:before="0" w:after="60" w:line="312" w:lineRule="auto"/>
+        <w:spacing w:before="0" w:after="60" w:line="360" w:lineRule="auto"/>
         <w:ind w:left="720" w:firstLine="720"/>
         <w:jc w:val="both"/>
       </w:pPr>
@@ -1833,7 +1833,7 @@
     </w:p>
     <w:p>
       <w:pPr>
-        <w:spacing w:before="0" w:after="60" w:line="312" w:lineRule="auto"/>
+        <w:spacing w:before="0" w:after="60" w:line="360" w:lineRule="auto"/>
         <w:ind w:left="720" w:firstLine="720"/>
         <w:jc w:val="both"/>
       </w:pPr>
@@ -1844,7 +1844,7 @@
     </w:p>
     <w:p>
       <w:pPr>
-        <w:spacing w:before="0" w:after="60" w:line="312" w:lineRule="auto"/>
+        <w:spacing w:before="0" w:after="60" w:line="360" w:lineRule="auto"/>
         <w:ind w:left="720" w:firstLine="720"/>
         <w:jc w:val="both"/>
       </w:pPr>
@@ -1856,7 +1856,7 @@
     <w:p>
       <w:pPr>
         <w:pStyle w:val="4"/>
-        <w:spacing w:before="0" w:after="40"/>
+        <w:spacing w:before="0" w:after="40" w:line="360" w:lineRule="auto"/>
         <w:ind w:firstLine="0" w:left="0"/>
         <w:jc w:val="left"/>
       </w:pPr>
@@ -1867,7 +1867,7 @@
     </w:p>
     <w:p>
       <w:pPr>
-        <w:spacing w:before="0" w:after="120" w:line="312" w:lineRule="auto"/>
+        <w:spacing w:before="0" w:after="120" w:line="360" w:lineRule="auto"/>
         <w:ind w:firstLine="720" w:left="0"/>
         <w:jc w:val="both"/>
       </w:pPr>
@@ -1878,7 +1878,7 @@
     </w:p>
     <w:p>
       <w:pPr>
-        <w:spacing w:before="0" w:after="80" w:line="312" w:lineRule="auto"/>
+        <w:spacing w:before="0" w:after="80" w:line="360" w:lineRule="auto"/>
         <w:ind w:firstLine="720" w:left="0"/>
         <w:jc w:val="both"/>
       </w:pPr>
@@ -1889,7 +1889,7 @@
     </w:p>
     <w:p>
       <w:pPr>
-        <w:spacing w:before="0" w:after="60" w:line="312" w:lineRule="auto"/>
+        <w:spacing w:before="0" w:after="60" w:line="360" w:lineRule="auto"/>
         <w:ind w:left="720" w:firstLine="720"/>
         <w:jc w:val="both"/>
       </w:pPr>
@@ -1900,7 +1900,7 @@
     </w:p>
     <w:p>
       <w:pPr>
-        <w:spacing w:before="0" w:after="80" w:line="312" w:lineRule="auto"/>
+        <w:spacing w:before="0" w:after="80" w:line="360" w:lineRule="auto"/>
         <w:ind w:firstLine="720" w:left="0"/>
         <w:jc w:val="both"/>
       </w:pPr>
@@ -1911,7 +1911,7 @@
     </w:p>
     <w:p>
       <w:pPr>
-        <w:spacing w:before="0" w:after="60" w:line="312" w:lineRule="auto"/>
+        <w:spacing w:before="0" w:after="60" w:line="360" w:lineRule="auto"/>
         <w:ind w:left="720" w:firstLine="720"/>
         <w:jc w:val="both"/>
       </w:pPr>
@@ -1922,7 +1922,7 @@
     </w:p>
     <w:p>
       <w:pPr>
-        <w:spacing w:before="0" w:after="80" w:line="312" w:lineRule="auto"/>
+        <w:spacing w:before="0" w:after="80" w:line="360" w:lineRule="auto"/>
         <w:ind w:firstLine="720" w:left="0"/>
         <w:jc w:val="both"/>
       </w:pPr>
@@ -1933,7 +1933,7 @@
     </w:p>
     <w:p>
       <w:pPr>
-        <w:spacing w:before="0" w:after="60" w:line="312" w:lineRule="auto"/>
+        <w:spacing w:before="0" w:after="60" w:line="360" w:lineRule="auto"/>
         <w:ind w:left="720" w:firstLine="720"/>
         <w:jc w:val="both"/>
       </w:pPr>
@@ -1945,7 +1945,7 @@
     <w:p>
       <w:pPr>
         <w:pStyle w:val="3"/>
-        <w:spacing w:before="0" w:after="80"/>
+        <w:spacing w:before="0" w:after="80" w:line="360" w:lineRule="auto"/>
         <w:ind w:firstLine="0" w:left="0"/>
         <w:jc w:val="left"/>
       </w:pPr>
@@ -1956,7 +1956,7 @@
     </w:p>
     <w:p>
       <w:pPr>
-        <w:spacing w:before="0" w:after="120" w:line="312" w:lineRule="auto"/>
+        <w:spacing w:before="0" w:after="120" w:line="360" w:lineRule="auto"/>
         <w:ind w:firstLine="720" w:left="0"/>
         <w:jc w:val="both"/>
       </w:pPr>
@@ -1968,7 +1968,7 @@
     <w:p>
       <w:pPr>
         <w:pStyle w:val="4"/>
-        <w:spacing w:before="0" w:after="40"/>
+        <w:spacing w:before="0" w:after="40" w:line="360" w:lineRule="auto"/>
         <w:ind w:firstLine="0" w:left="0"/>
         <w:jc w:val="left"/>
       </w:pPr>
@@ -1979,7 +1979,7 @@
     </w:p>
     <w:p>
       <w:pPr>
-        <w:spacing w:before="0" w:after="80" w:line="312" w:lineRule="auto"/>
+        <w:spacing w:before="0" w:after="80" w:line="360" w:lineRule="auto"/>
         <w:ind w:firstLine="720" w:left="0"/>
         <w:jc w:val="both"/>
       </w:pPr>
@@ -1990,7 +1990,7 @@
     </w:p>
     <w:p>
       <w:pPr>
-        <w:spacing w:before="0" w:after="80" w:line="312" w:lineRule="auto"/>
+        <w:spacing w:before="0" w:after="80" w:line="360" w:lineRule="auto"/>
         <w:ind w:firstLine="720" w:left="0"/>
         <w:jc w:val="both"/>
       </w:pPr>
@@ -2001,7 +2001,7 @@
     </w:p>
     <w:p>
       <w:pPr>
-        <w:spacing w:before="0" w:after="80" w:line="312" w:lineRule="auto"/>
+        <w:spacing w:before="0" w:after="80" w:line="360" w:lineRule="auto"/>
         <w:ind w:firstLine="720" w:left="0"/>
         <w:jc w:val="both"/>
       </w:pPr>
@@ -2013,7 +2013,7 @@
     <w:p>
       <w:pPr>
         <w:pStyle w:val="4"/>
-        <w:spacing w:before="0" w:after="40"/>
+        <w:spacing w:before="0" w:after="40" w:line="360" w:lineRule="auto"/>
         <w:ind w:firstLine="0" w:left="0"/>
         <w:jc w:val="left"/>
       </w:pPr>
@@ -2024,7 +2024,7 @@
     </w:p>
     <w:p>
       <w:pPr>
-        <w:spacing w:before="0" w:after="80" w:line="312" w:lineRule="auto"/>
+        <w:spacing w:before="0" w:after="80" w:line="360" w:lineRule="auto"/>
         <w:ind w:firstLine="720" w:left="0"/>
         <w:jc w:val="both"/>
       </w:pPr>
@@ -2035,7 +2035,7 @@
     </w:p>
     <w:p>
       <w:pPr>
-        <w:spacing w:before="0" w:after="80" w:line="312" w:lineRule="auto"/>
+        <w:spacing w:before="0" w:after="80" w:line="360" w:lineRule="auto"/>
         <w:ind w:firstLine="720" w:left="0"/>
         <w:jc w:val="both"/>
       </w:pPr>
@@ -2046,7 +2046,7 @@
     </w:p>
     <w:p>
       <w:pPr>
-        <w:spacing w:before="0" w:after="80" w:line="312" w:lineRule="auto"/>
+        <w:spacing w:before="0" w:after="80" w:line="360" w:lineRule="auto"/>
         <w:ind w:firstLine="720" w:left="0"/>
         <w:jc w:val="both"/>
       </w:pPr>
@@ -2058,7 +2058,7 @@
     <w:p>
       <w:pPr>
         <w:pStyle w:val="4"/>
-        <w:spacing w:before="0" w:after="40"/>
+        <w:spacing w:before="0" w:after="40" w:line="360" w:lineRule="auto"/>
         <w:ind w:firstLine="0" w:left="0"/>
         <w:jc w:val="left"/>
       </w:pPr>
@@ -2069,7 +2069,7 @@
     </w:p>
     <w:p>
       <w:pPr>
-        <w:spacing w:before="0" w:after="80" w:line="312" w:lineRule="auto"/>
+        <w:spacing w:before="0" w:after="80" w:line="360" w:lineRule="auto"/>
         <w:ind w:firstLine="720" w:left="0"/>
         <w:jc w:val="both"/>
       </w:pPr>
@@ -2080,7 +2080,7 @@
     </w:p>
     <w:p>
       <w:pPr>
-        <w:spacing w:before="0" w:after="80" w:line="312" w:lineRule="auto"/>
+        <w:spacing w:before="0" w:after="80" w:line="360" w:lineRule="auto"/>
         <w:ind w:firstLine="720" w:left="0"/>
         <w:jc w:val="both"/>
       </w:pPr>
@@ -2091,7 +2091,7 @@
     </w:p>
     <w:p>
       <w:pPr>
-        <w:spacing w:before="0" w:after="80" w:line="312" w:lineRule="auto"/>
+        <w:spacing w:before="0" w:after="80" w:line="360" w:lineRule="auto"/>
         <w:ind w:firstLine="720" w:left="0"/>
         <w:jc w:val="both"/>
       </w:pPr>
@@ -2102,7 +2102,7 @@
     </w:p>
     <w:p>
       <w:pPr>
-        <w:spacing w:before="0" w:after="80" w:line="312" w:lineRule="auto"/>
+        <w:spacing w:before="0" w:after="80" w:line="360" w:lineRule="auto"/>
         <w:ind w:firstLine="720" w:left="0"/>
         <w:jc w:val="both"/>
       </w:pPr>
@@ -2114,7 +2114,7 @@
     <w:p>
       <w:pPr>
         <w:pStyle w:val="3"/>
-        <w:spacing w:before="0" w:after="80"/>
+        <w:spacing w:before="0" w:after="80" w:line="360" w:lineRule="auto"/>
         <w:ind w:firstLine="0" w:left="0"/>
         <w:jc w:val="left"/>
       </w:pPr>
@@ -2126,7 +2126,7 @@
     <w:p>
       <w:pPr>
         <w:pStyle w:val="4"/>
-        <w:spacing w:before="0" w:after="40"/>
+        <w:spacing w:before="0" w:after="40" w:line="360" w:lineRule="auto"/>
         <w:ind w:firstLine="0" w:left="0"/>
         <w:jc w:val="left"/>
       </w:pPr>
@@ -2137,7 +2137,7 @@
     </w:p>
     <w:p>
       <w:pPr>
-        <w:spacing w:before="0" w:after="80" w:line="312" w:lineRule="auto"/>
+        <w:spacing w:before="0" w:after="80" w:line="360" w:lineRule="auto"/>
         <w:ind w:firstLine="720" w:left="0"/>
         <w:jc w:val="both"/>
       </w:pPr>
@@ -2148,7 +2148,7 @@
     </w:p>
     <w:p>
       <w:pPr>
-        <w:spacing w:before="0" w:after="80" w:line="312" w:lineRule="auto"/>
+        <w:spacing w:before="0" w:after="80" w:line="360" w:lineRule="auto"/>
         <w:ind w:firstLine="720" w:left="0"/>
         <w:jc w:val="both"/>
       </w:pPr>
@@ -2160,7 +2160,7 @@
     <w:p>
       <w:pPr>
         <w:pStyle w:val="4"/>
-        <w:spacing w:before="0" w:after="40"/>
+        <w:spacing w:before="0" w:after="40" w:line="360" w:lineRule="auto"/>
         <w:ind w:firstLine="0" w:left="0"/>
         <w:jc w:val="left"/>
       </w:pPr>
@@ -2171,7 +2171,7 @@
     </w:p>
     <w:p>
       <w:pPr>
-        <w:spacing w:before="0" w:after="80" w:line="312" w:lineRule="auto"/>
+        <w:spacing w:before="0" w:after="80" w:line="360" w:lineRule="auto"/>
         <w:ind w:firstLine="720" w:left="0"/>
         <w:jc w:val="both"/>
       </w:pPr>
@@ -2182,7 +2182,7 @@
     </w:p>
     <w:p>
       <w:pPr>
-        <w:spacing w:before="0" w:after="80" w:line="312" w:lineRule="auto"/>
+        <w:spacing w:before="0" w:after="80" w:line="360" w:lineRule="auto"/>
         <w:ind w:firstLine="720" w:left="0"/>
         <w:jc w:val="both"/>
       </w:pPr>
@@ -2194,7 +2194,7 @@
     <w:p>
       <w:pPr>
         <w:pStyle w:val="3"/>
-        <w:spacing w:before="0" w:after="80"/>
+        <w:spacing w:before="0" w:after="80" w:line="360" w:lineRule="auto"/>
         <w:ind w:firstLine="0" w:left="0"/>
         <w:jc w:val="left"/>
       </w:pPr>
@@ -2205,7 +2205,7 @@
     </w:p>
     <w:p>
       <w:pPr>
-        <w:spacing w:before="0" w:after="120" w:line="312" w:lineRule="auto"/>
+        <w:spacing w:before="0" w:after="120" w:line="360" w:lineRule="auto"/>
         <w:ind w:firstLine="720" w:left="0"/>
         <w:jc w:val="both"/>
       </w:pPr>
@@ -2216,7 +2216,7 @@
     </w:p>
     <w:p>
       <w:pPr>
-        <w:spacing w:before="0" w:after="80" w:line="312" w:lineRule="auto"/>
+        <w:spacing w:before="0" w:after="80" w:line="360" w:lineRule="auto"/>
         <w:ind w:firstLine="720" w:left="0"/>
         <w:jc w:val="both"/>
       </w:pPr>
@@ -2227,7 +2227,7 @@
     </w:p>
     <w:p>
       <w:pPr>
-        <w:spacing w:before="0" w:after="80" w:line="312" w:lineRule="auto"/>
+        <w:spacing w:before="0" w:after="80" w:line="360" w:lineRule="auto"/>
         <w:ind w:firstLine="720" w:left="0"/>
         <w:jc w:val="both"/>
       </w:pPr>
@@ -2238,7 +2238,7 @@
     </w:p>
     <w:p>
       <w:pPr>
-        <w:spacing w:before="0" w:after="80" w:line="312" w:lineRule="auto"/>
+        <w:spacing w:before="0" w:after="80" w:line="360" w:lineRule="auto"/>
         <w:ind w:firstLine="720" w:left="0"/>
         <w:jc w:val="both"/>
       </w:pPr>
@@ -2249,7 +2249,7 @@
     </w:p>
     <w:p>
       <w:pPr>
-        <w:spacing w:before="0" w:after="80" w:line="312" w:lineRule="auto"/>
+        <w:spacing w:before="0" w:after="80" w:line="360" w:lineRule="auto"/>
         <w:ind w:firstLine="720" w:left="0"/>
         <w:jc w:val="both"/>
       </w:pPr>
@@ -2260,7 +2260,7 @@
     </w:p>
     <w:p>
       <w:pPr>
-        <w:spacing w:before="0" w:after="80" w:line="312" w:lineRule="auto"/>
+        <w:spacing w:before="0" w:after="80" w:line="360" w:lineRule="auto"/>
         <w:ind w:firstLine="720" w:left="0"/>
         <w:jc w:val="both"/>
       </w:pPr>
@@ -2271,7 +2271,7 @@
     </w:p>
     <w:p>
       <w:pPr>
-        <w:spacing w:before="0" w:after="80" w:line="312" w:lineRule="auto"/>
+        <w:spacing w:before="0" w:after="80" w:line="360" w:lineRule="auto"/>
         <w:ind w:firstLine="720" w:left="0"/>
         <w:jc w:val="both"/>
       </w:pPr>
@@ -2319,7 +2319,7 @@
   <w:footnote w:type="separator" w:id="0">
     <w:p>
       <w:pPr>
-        <w:spacing w:before="0" w:after="0" w:line="240" w:lineRule="auto"/>
+        <w:spacing w:before="0" w:after="0" w:line="360" w:lineRule="auto"/>
       </w:pPr>
       <w:r>
         <w:separator/>
@@ -2329,7 +2329,7 @@
   <w:footnote w:type="continuationSeparator" w:id="1">
     <w:p>
       <w:pPr>
-        <w:spacing w:before="0" w:after="0" w:line="240" w:lineRule="auto"/>
+        <w:spacing w:before="0" w:after="0" w:line="360" w:lineRule="auto"/>
       </w:pPr>
       <w:r>
         <w:continuationSeparator/>
@@ -2583,7 +2583,7 @@
     <w:lsdException w:unhideWhenUsed="0" w:uiPriority="69" w:semiHidden="0" w:name="Medium Grid 3 Accent 5"/>
     <w:lsdException w:unhideWhenUsed="0" w:uiPriority="70" w:semiHidden="0" w:name="Dark List Accent 5"/>
     <w:lsdException w:unhideWhenUsed="0" w:uiPriority="71" w:semiHidden="0" w:name="Colorful Shading Accent 5"/>
-    <w:lsdException w:qFormat="1" w:unhideWhenUsed="0" w:uiPriority="72" w:semiHidden="0" w:name="Colorful List Accent 5"/>
+    <w:lsdException w:unhideWhenUsed="0" w:uiPriority="72" w:semiHidden="0" w:name="Colorful List Accent 5"/>
     <w:lsdException w:unhideWhenUsed="0" w:uiPriority="73" w:semiHidden="0" w:name="Colorful Grid Accent 5"/>
     <w:lsdException w:unhideWhenUsed="0" w:uiPriority="60" w:semiHidden="0" w:name="Light Shading Accent 6"/>
     <w:lsdException w:unhideWhenUsed="0" w:uiPriority="61" w:semiHidden="0" w:name="Light List Accent 6"/>
@@ -2608,7 +2608,7 @@
       <w:widowControl w:val="0"/>
       <w:autoSpaceDE w:val="0"/>
       <w:autoSpaceDN w:val="0"/>
-      <w:spacing w:before="0" w:after="0" w:line="240" w:lineRule="auto"/>
+      <w:spacing w:before="0" w:after="0" w:line="360" w:lineRule="auto"/>
       <w:ind w:left="0" w:right="0"/>
       <w:jc w:val="both"/>
     </w:pPr>

</xml_diff>

<commit_message>
docs: expand Chapter 1 content and enforce 17-20 page formatting guidelines
</commit_message>
<xml_diff>
--- a/DeTaiCNJ18_Nhom7.docx
+++ b/DeTaiCNJ18_Nhom7.docx
@@ -460,26 +460,6 @@
     <w:p>
       <w:pPr>
         <w:pStyle w:val="8"/>
-        <w:ind w:left="0" w:firstLine="0"/>
-        <w:rPr>
-          <w:b/>
-          <w:sz w:val="48"/>
-        </w:rPr>
-      </w:pPr>
-    </w:p>
-    <w:p>
-      <w:pPr>
-        <w:pStyle w:val="8"/>
-        <w:ind w:left="0" w:firstLine="0"/>
-        <w:rPr>
-          <w:b/>
-          <w:sz w:val="48"/>
-        </w:rPr>
-      </w:pPr>
-    </w:p>
-    <w:p>
-      <w:pPr>
-        <w:pStyle w:val="8"/>
         <w:spacing w:before="511"/>
         <w:ind w:left="0" w:firstLine="0"/>
         <w:rPr>
@@ -491,6 +471,10 @@
     <w:p>
       <w:pPr>
         <w:pStyle w:val="13"/>
+        <w:rPr>
+          <w:b/>
+          <w:sz w:val="48"/>
+        </w:rPr>
       </w:pPr>
       <w:r>
         <w:t>BÀI</w:t>
@@ -516,17 +500,6 @@
         </w:rPr>
         <w:t>LỚN</w:t>
       </w:r>
-    </w:p>
-    <w:p>
-      <w:pPr>
-        <w:pStyle w:val="8"/>
-        <w:spacing w:before="277"/>
-        <w:ind w:left="0" w:firstLine="0"/>
-        <w:rPr>
-          <w:b/>
-          <w:sz w:val="48"/>
-        </w:rPr>
-      </w:pPr>
     </w:p>
     <w:p>
       <w:pPr>
@@ -1219,36 +1192,6 @@
     <w:p>
       <w:pPr>
         <w:pStyle w:val="8"/>
-        <w:ind w:left="0" w:firstLine="0"/>
-        <w:rPr>
-          <w:b/>
-          <w:sz w:val="28"/>
-        </w:rPr>
-      </w:pPr>
-    </w:p>
-    <w:p>
-      <w:pPr>
-        <w:pStyle w:val="8"/>
-        <w:ind w:left="0" w:firstLine="0"/>
-        <w:rPr>
-          <w:b/>
-          <w:sz w:val="28"/>
-        </w:rPr>
-      </w:pPr>
-    </w:p>
-    <w:p>
-      <w:pPr>
-        <w:pStyle w:val="8"/>
-        <w:ind w:left="0" w:firstLine="0"/>
-        <w:rPr>
-          <w:b/>
-          <w:sz w:val="28"/>
-        </w:rPr>
-      </w:pPr>
-    </w:p>
-    <w:p>
-      <w:pPr>
-        <w:pStyle w:val="8"/>
         <w:spacing w:before="65"/>
         <w:ind w:left="0" w:firstLine="0"/>
         <w:rPr>
@@ -1377,99 +1320,102 @@
         <w:bidi w:val="0"/>
       </w:pPr>
       <w:bookmarkStart w:id="0" w:name="_Toc24751"/>
+      <w:bookmarkStart w:id="1" w:name="_Toc9811"/>
       <w:r>
         <w:t>MỤC LỤC</w:t>
       </w:r>
       <w:bookmarkEnd w:id="0"/>
-    </w:p>
-    <w:p>
-      <w:pPr>
-        <w:spacing w:before="120" w:after="240"/>
-        <w:jc w:val="left"/>
+      <w:bookmarkEnd w:id="1"/>
+    </w:p>
+    <w:p>
+      <w:pPr>
+        <w:pStyle w:val="15"/>
+        <w:tabs>
+          <w:tab w:val="right" w:leader="dot" w:pos="8800"/>
+        </w:tabs>
       </w:pPr>
       <w:r>
         <w:fldChar w:fldCharType="begin"/>
       </w:r>
       <w:r>
-        <w:instrText xml:space="preserve">TOC \o "1-3" \h \z \u</w:instrText>
+        <w:instrText xml:space="preserve">TOC \o "1-3" \h \u </w:instrText>
       </w:r>
       <w:r>
         <w:fldChar w:fldCharType="separate"/>
       </w:r>
       <w:r>
+        <w:fldChar w:fldCharType="begin"/>
+      </w:r>
+      <w:r>
+        <w:instrText xml:space="preserve"> HYPERLINK \l _Toc9811 </w:instrText>
+      </w:r>
+      <w:r>
+        <w:fldChar w:fldCharType="separate"/>
+      </w:r>
+      <w:r>
+        <w:t>MỤC LỤC</w:t>
+      </w:r>
+      <w:r>
+        <w:tab/>
+      </w:r>
+      <w:r>
+        <w:fldChar w:fldCharType="begin"/>
+      </w:r>
+      <w:r>
+        <w:instrText xml:space="preserve"> PAGEREF _Toc9811 \h </w:instrText>
+      </w:r>
+      <w:r>
+        <w:fldChar w:fldCharType="separate"/>
+      </w:r>
+      <w:r>
+        <w:t>2</w:t>
+      </w:r>
+      <w:r>
         <w:fldChar w:fldCharType="end"/>
       </w:r>
-    </w:p>
-    <w:p>
-      <w:pPr>
-        <w:spacing w:before="0" w:after="0"/>
-        <w:ind w:firstLine="0"/>
-      </w:pPr>
-      <w:r>
-        <w:br w:type="page"/>
-      </w:r>
-    </w:p>
-    <w:p>
-      <w:pPr>
-        <w:pStyle w:val="2"/>
-        <w:bidi w:val="0"/>
-      </w:pPr>
+      <w:r>
+        <w:fldChar w:fldCharType="end"/>
+      </w:r>
+    </w:p>
+    <w:p>
+      <w:pPr>
+        <w:pStyle w:val="15"/>
+        <w:tabs>
+          <w:tab w:val="right" w:leader="dot" w:pos="8800"/>
+        </w:tabs>
+      </w:pPr>
+      <w:r>
+        <w:fldChar w:fldCharType="begin"/>
+      </w:r>
+      <w:r>
+        <w:instrText xml:space="preserve"> HYPERLINK \l _Toc31655 </w:instrText>
+      </w:r>
+      <w:r>
+        <w:fldChar w:fldCharType="separate"/>
+      </w:r>
       <w:r>
         <w:t>LỜI MỞ ĐẦU</w:t>
       </w:r>
-    </w:p>
-    <w:p>
-      <w:pPr>
-        <w:bidi w:val="0"/>
-        <w:ind w:firstLine="720" w:firstLineChars="0"/>
-      </w:pPr>
-      <w:r>
-        <w:t>Trong kỷ nguyên số hóa và sự phát triển vượt bậc của Đô thị hóa hiện đại, thương mại điện tử (E-Commerce) đã trở thành một thành tố không thể thiếu trong hạ tầng kinh tế toàn cầu. Việc ứng dụng Công nghệ thông tin vào quản lý kênh phân phối, quản lý đại lý và tối ưu hóa quy trình bán hàng trực tuyến đóng vai trò quyết định tới năng lực cạnh tranh của các doanh nghiệp. Trong đó, ngành kinh doanh đồ gia dụng – bao gồm các sản phẩm thiết yếu phục vụ đời sống gia đình, thiết bị nhà bếp, thiết bị điện và chăm sóc không gian sống – là một trong những lĩnh vực có tốc độ tăng trưởng quy mô thị trường vô cùng mạnh mẽ.</w:t>
-      </w:r>
-    </w:p>
-    <w:p>
-      <w:pPr>
-        <w:bidi w:val="0"/>
-        <w:ind w:firstLine="720" w:firstLineChars="0"/>
-      </w:pPr>
-      <w:r>
-        <w:t>Tuy nhiên, phương thức quản lý đại lý kinh doanh đồ gia dụng truyền thống đang bộc lộ nhiều hạn chế bất cập như: dữ liệu tồn kho phân tán, quản lý đơn hàng thủ công dễ gây ra sai sót, thông tin giữa nhà sản xuất/nhà phân phối và các đại lý bán lẻ thiếu tính đồng bộ tức thời, cũng như khó khăn trong việc theo dõi doanh thu và đánh giá hiệu quả kinh doanh. Xuất phát từ nhu cầu thực tiễn đó, việc nghiên cứu và phát triển một giải pháp phần mềm quản lý đại lý kinh doanh đồ gia dụng trực tuyến hiện đại, ứng dụng mô hình đa nhà bán hàng (Multi-vendor Marketplace) là vô cùng cần thiết.</w:t>
-      </w:r>
-    </w:p>
-    <w:p>
-      <w:pPr>
-        <w:bidi w:val="0"/>
-        <w:ind w:firstLine="720" w:firstLineChars="0"/>
-      </w:pPr>
-      <w:r>
-        <w:t>Nghiên cứu bài tập lớn học phần Công nghệ Java với đề tài: "Xây dựng phần mềm quản lý đại lý kinh doanh đồ gia dụng" (Đề tài CNJ18) được triển khai nhằm giải quyết bài toán trên. Hệ thống được xây dựng dựa trên nền tảng công nghệ mạnh mẽ và phổ biến bậc nhất hiện nay: Java Spring Boot Framework, kết hợp với Spring Data JPA, Spring Security, Thymeleaf Template Engine và Hệ quản trị cơ sở dữ liệu MySQL. Phần mềm cung cấp giải pháp toàn diện hỗ trợ 3 nhóm tác nhân chính: Quản trị viên (Admin), Nhà bán hàng/Đại lý (Seller/Vendor) và Khách hàng (Customer).</w:t>
-      </w:r>
-    </w:p>
-    <w:p>
-      <w:pPr>
-        <w:bidi w:val="0"/>
-        <w:ind w:firstLine="720" w:firstLineChars="0"/>
-      </w:pPr>
-      <w:r>
-        <w:t>Trong quá trình nghiên cứu và thực hiện bài tập lớn, Nhóm 7 đã nỗ lực vận dụng các kiến thức đã học cùng sự tìm tòi, nghiên cứu tài liệu thực tế để hoàn thành báo cáo và phần mềm. Nhóm xin gửi lời cảm ơn chân thành và sâu sắc nhất tới Thầy giáo hướng dẫn Trần Bá Hùng – Giảng viên Khoa Công nghệ Thông tin, Trường Đại học Công nghệ Đông Á. Sự hướng dẫn tận tình, những góp ý chuyên môn quý báu của Thầy chính là kim chỉ nam giúp Nhóm định hướng đúng đắn và hoàn thành tốt đề tài này.</w:t>
-      </w:r>
-    </w:p>
-    <w:p>
-      <w:pPr>
-        <w:bidi w:val="0"/>
-        <w:ind w:firstLine="720" w:firstLineChars="0"/>
-      </w:pPr>
-      <w:r>
-        <w:t>Dù đã cố gắng hết sức để hoàn thiện báo cáo và chương trình một cách chỉn chu nhất, song do hạn chế về mặt thời gian cũng như kinh nghiệm thực tiễn, đề tài khó tránh khỏi những thiếu sót nhất định. Nhóm rất mong nhận được những ý kiến đóng góp, nhận xét quý báu từ Thầy giáo cùng các bạn sinh viên để đề tài ngày càng được hoàn thiện và có tính ứng dụng cao hơn.</w:t>
-      </w:r>
-    </w:p>
-    <w:p>
-      <w:pPr>
-        <w:spacing w:before="0" w:after="0"/>
-        <w:ind w:firstLine="0"/>
-      </w:pPr>
-      <w:r>
-        <w:br w:type="page"/>
+      <w:r>
+        <w:tab/>
+      </w:r>
+      <w:r>
+        <w:fldChar w:fldCharType="begin"/>
+      </w:r>
+      <w:r>
+        <w:instrText xml:space="preserve"> PAGEREF _Toc31655 \h </w:instrText>
+      </w:r>
+      <w:r>
+        <w:fldChar w:fldCharType="separate"/>
+      </w:r>
+      <w:r>
+        <w:t>3</w:t>
+      </w:r>
+      <w:r>
+        <w:fldChar w:fldCharType="end"/>
+      </w:r>
+      <w:r>
+        <w:fldChar w:fldCharType="end"/>
       </w:r>
     </w:p>
     <w:p>
@@ -1504,7 +1450,7 @@
       </w:pPr>
       <w:r>
         <w:rPr/>
-        <w:t>Cùng với sự bùng nổ của Cách mạng Công nghiệp 4.0, thói quen tiêu dùng của người dân đã có sự dịch chuyển mạnh mẽ từ mua sắm truyền thống sang các nền tảng thương mại điện tử trực tuyến. Ngành hàng đồ gia dụng (bao gồm thiết bị điện tử gia dụng, dụng cụ nhà bếp, thiết bị tiện ích gia đình) có đặc thù là mẫu mã đa dạng, chủng loại phong phú và nhu cầu thay thế, nâng cấp thường xuyên từ phía người tiêu dùng. Để đáp ứng nhu cầu thị trường, các doanh nghiệp kinh doanh đồ gia dụng không chỉ bán hàng trực tiếp mà còn xây dựng mạng lưới đại lý phân phối rộng khắp.</w:t>
+        <w:t>Trong kỷ nguyên số hóa và sự phát triển vượt bậc của công nghệ thông tin hiện nay, Cách mạng Công nghiệp 4.0 đã và đang tác động sâu sắc đến mọi khía cạnh của đời sống kinh tế - xã hội. Việc ứng dụng phần mềm vào quản trị doanh nghiệp và thương mại hóa trực tuyến không còn là một giải pháp mang tính tùy chọn, mà đã trở thành yếu tố sinh tồn quyết định năng lực cạnh tranh của mọi tổ chức kinh doanh. Thương mại điện tử (E-Commerce) tại Việt Nam trong những năm gần đây đã ghi nhận tốc độ tăng trưởng phi mã từ 20% đến 25%/năm. Sự phổ biến của kết nối mạng Internet tốc độ cao, điện thoại thông minh cùng với các phương thức thanh toán điện tử đã thay đổi hoàn toàn thói quen tiêu dùng từ mua sắm truyền thống sang giao dịch trực tuyến.</w:t>
       </w:r>
     </w:p>
     <w:p>
@@ -1515,51 +1461,7 @@
       </w:pPr>
       <w:r>
         <w:rPr/>
-        <w:t>Mặc dù vậy, công tác quản lý hệ thống đại lý kinh doanh đồ gia dụng hiện nay đang gặp phải nhiều thách thức lớn:</w:t>
-      </w:r>
-    </w:p>
-    <w:p>
-      <w:pPr>
-        <w:spacing w:before="0" w:after="80" w:line="360" w:lineRule="auto"/>
-        <w:ind w:firstLine="720" w:left="0"/>
-        <w:jc w:val="both"/>
-      </w:pPr>
-      <w:r>
-        <w:rPr/>
-        <w:t>- Quản lý dữ liệu phân tán: Thông tin sản phẩm, danh mục đồ gia dụng, giá bán và số lượng tồn kho tại từng đại lý thường được lưu trữ rời rạc qua file Excel hoặc sổ sách thủ công, dẫn đến tình trạng bất đồng bộ dữ liệu.</w:t>
-      </w:r>
-    </w:p>
-    <w:p>
-      <w:pPr>
-        <w:spacing w:before="0" w:after="80" w:line="360" w:lineRule="auto"/>
-        <w:ind w:firstLine="720" w:left="0"/>
-        <w:jc w:val="both"/>
-      </w:pPr>
-      <w:r>
-        <w:rPr/>
-        <w:t>- Quy trình xử lý đơn hàng chậm trễ: Việc tiếp nhận đơn đặt hàng từ khách hàng, phân bổ đơn cho đại lý, cập nhật trạng thái giao hàng và đối soát doanh thu tốn nhiều thời gian và dễ phát sinh sai sót.</w:t>
-      </w:r>
-    </w:p>
-    <w:p>
-      <w:pPr>
-        <w:spacing w:before="0" w:after="80" w:line="360" w:lineRule="auto"/>
-        <w:ind w:firstLine="720" w:left="0"/>
-        <w:jc w:val="both"/>
-      </w:pPr>
-      <w:r>
-        <w:rPr/>
-        <w:t>- Thiếu công cụ tương tác trực tiếp: Khách hàng gặp khó khăn khi tìm kiếm các đại lý uy tín cung cấp đồ gia dụng chính hãng, so sánh giá cả và xem đánh giá chất lượng sản phẩm.</w:t>
-      </w:r>
-    </w:p>
-    <w:p>
-      <w:pPr>
-        <w:spacing w:before="0" w:after="80" w:line="360" w:lineRule="auto"/>
-        <w:ind w:firstLine="720" w:left="0"/>
-        <w:jc w:val="both"/>
-      </w:pPr>
-      <w:r>
-        <w:rPr/>
-        <w:t>- Khó khăn trong việc kiểm soát bảo mật và phân quyền: Các hệ thống cũ thiếu cơ chế phân quyền chặt chẽ giữa Quản trị viên hệ thống, Chủ đại lý (Nhà bán hàng) và Khách hàng.</w:t>
+        <w:t>Trong thị trường bán lẻ trực tuyến, ngành kinh doanh đồ gia dụng – bao gồm các nhóm sản phẩm thiết yếu như thiết bị điện gia dụng (tủ lạnh, máy giặt, điều hòa, quạt điện), dụng cụ nhà bếp (nồi cơm điện, bếp từ, lò vi sóng, máy xay sinh tố) và thiết bị tiện ích gia đình (máy hút bụi, máy lọc nước, đồ dùng chăm sóc không gian sống) – giữ một vị trí vô cùng quan trọng. Đồ gia dụng là nhóm hàng hóa có chu kỳ tiêu dùng gắn liền với hoạt động sinh hoạt hàng ngày của mọi gia đình. Cùng với tốc độ đô thị hóa nhanh chóng, sự gia tăng tầng lớp trung lưu và quy mô các hộ gia đình trẻ, nhu cầu mua sắm, thay thế và nâng cấp thiết bị gia dụng ngày càng gia tăng mạnh mẽ cả về số lượng lẫn chất lượng.</w:t>
       </w:r>
     </w:p>
     <w:p>
@@ -1570,7 +1472,348 @@
       </w:pPr>
       <w:r>
         <w:rPr/>
-        <w:t>Để giải quyết triệt để các tồn tại trên, việc phát triển giải pháp phần mềm quản lý đại lý kinh doanh đồ gia dụng tích hợp mô hình Multi-vendor Marketplace trên nền tảng công nghệ Java là một giải pháp mang tính chiến lược. Java và đặc biệt là Spring Boot Framework nổi tiếng với tính đóng gói, độ tin cậy cao, khả năng bảo mật mạnh mẽ (Spring Security) và hiệu năng xử lý giao dịch thương mại ổn định. Do đó, Nhóm 7 đã lựa chọn đề tài "Xây dựng phần mềm quản lý đại lý kinh doanh đồ gia dụng" làm Bài tập lớn học phần Công nghệ Java.</w:t>
+        <w:t>Đối với các nhà sản xuất và các công ty phân phối đồ gia dụng lớn, việc tiếp cận khách hàng trên nhiều vùng địa lý khác nhau phụ thuộc rất lớn vào mạng lưới đại lý bán lẻ. Hệ thống đại lý phân phối đóng vai trò là cánh tay nối dài giúp đưa sản phẩm đồ gia dụng từ kho của nhà sản xuất đến tận tay người tiêu dùng. Tuy nhiên, qua khảo sát thực tế, mô hình quản lý mạng lưới đại lý kinh doanh đồ gia dụng theo phương thức truyền thống hiện nay đang bộc lộ rất nhiều hạn chế bất cập và điểm nghẽn nghiêm trọng:</w:t>
+      </w:r>
+    </w:p>
+    <w:p>
+      <w:pPr>
+        <w:spacing w:before="0" w:after="80" w:line="360" w:lineRule="auto"/>
+        <w:ind w:firstLine="720" w:left="0"/>
+        <w:jc w:val="both"/>
+      </w:pPr>
+      <w:r>
+        <w:rPr/>
+        <w:t>- Khó khăn trong việc quản lý dữ liệu phân tán và bất đồng bộ tồn kho:</w:t>
+      </w:r>
+    </w:p>
+    <w:p>
+      <w:pPr>
+        <w:spacing w:before="0" w:after="60" w:line="360" w:lineRule="auto"/>
+        <w:ind w:left="720" w:firstLine="720"/>
+        <w:jc w:val="both"/>
+      </w:pPr>
+      <w:r>
+        <w:rPr/>
+        <w:t>+ Thông tin sản phẩm gia dụng, số lượng tồn kho, giá bán và thông số kỹ thuật tại từng chi nhánh đại lý thường được lưu trữ rời rạc trên các file Excel hoặc sổ sách thủ công.</w:t>
+      </w:r>
+    </w:p>
+    <w:p>
+      <w:pPr>
+        <w:spacing w:before="0" w:after="60" w:line="360" w:lineRule="auto"/>
+        <w:ind w:left="720" w:firstLine="720"/>
+        <w:jc w:val="both"/>
+      </w:pPr>
+      <w:r>
+        <w:rPr/>
+        <w:t>+ Sự thiếu đồng bộ dữ liệu theo thời gian thực khiến cấp quản trị trung tâm không thể nắm bắt được chính xác lượng hàng tồn kho thực tế tại từng địa điểm. Điều này dẫn đến tình trạng bất cân đối hàng hóa kéo dài: một số đại lý rơi vào tình trạng thiếu hàng không có sản phẩm giao cho khách, trong khi các đại lý khác lại bị đọng vốn vì hàng hóa tồn kho quá lâu.</w:t>
+      </w:r>
+    </w:p>
+    <w:p>
+      <w:pPr>
+        <w:spacing w:before="0" w:after="60" w:line="360" w:lineRule="auto"/>
+        <w:ind w:left="720" w:firstLine="720"/>
+        <w:jc w:val="both"/>
+      </w:pPr>
+      <w:r>
+        <w:rPr/>
+        <w:t>+ Việc cập nhật thông tin sản phẩm mới, thông số kỹ thuật hoặc thay đổi bảng giá từ nhà sản xuất xuống toàn hệ thống đại lý diễn ra chậm trễ và thường phát sinh sai sót.</w:t>
+      </w:r>
+    </w:p>
+    <w:p>
+      <w:pPr>
+        <w:spacing w:before="0" w:after="80" w:line="360" w:lineRule="auto"/>
+        <w:ind w:firstLine="720" w:left="0"/>
+        <w:jc w:val="both"/>
+      </w:pPr>
+      <w:r>
+        <w:rPr/>
+        <w:t>- Quy trình xử lý đơn hàng phức tạp, chậm trễ và dễ phát sinh sai sót:</w:t>
+      </w:r>
+    </w:p>
+    <w:p>
+      <w:pPr>
+        <w:spacing w:before="0" w:after="60" w:line="360" w:lineRule="auto"/>
+        <w:ind w:left="720" w:firstLine="720"/>
+        <w:jc w:val="both"/>
+      </w:pPr>
+      <w:r>
+        <w:rPr/>
+        <w:t>+ Việc tiếp nhận đơn đặt hàng từ người tiêu dùng và chuyển giao đơn về đại lý khu vực xử lý chủ yếu thông qua điện thoại, nhắn tin hoặc email cá nhân.</w:t>
+      </w:r>
+    </w:p>
+    <w:p>
+      <w:pPr>
+        <w:spacing w:before="0" w:after="60" w:line="360" w:lineRule="auto"/>
+        <w:ind w:left="720" w:firstLine="720"/>
+        <w:jc w:val="both"/>
+      </w:pPr>
+      <w:r>
+        <w:rPr/>
+        <w:t>+ Thiếu quy trình tự động hóa khiến thời gian xử lý một đơn hàng bị kéo dài, tỷ lệ nhầm lẫn thông tin giao hàng cao, gây khó khăn cho việc theo dõi và cập nhật trạng thái đơn hàng (PENDING, PROCESSING, SHIPPED, DELIVERED, CANCELLED) cho cả khách hàng lẫn nhà quản lý.</w:t>
+      </w:r>
+    </w:p>
+    <w:p>
+      <w:pPr>
+        <w:spacing w:before="0" w:after="60" w:line="360" w:lineRule="auto"/>
+        <w:ind w:left="720" w:firstLine="720"/>
+        <w:jc w:val="both"/>
+      </w:pPr>
+      <w:r>
+        <w:rPr/>
+        <w:t>+ Công tác xử lý bảo hành, đổi trả sản phẩm gia dụng bị lỗi gặp nhiều trở ngại do thiếu nhật ký hệ thống lưu trữ lịch sử giao dịch và thông tin đại lý bán.</w:t>
+      </w:r>
+    </w:p>
+    <w:p>
+      <w:pPr>
+        <w:spacing w:before="0" w:after="80" w:line="360" w:lineRule="auto"/>
+        <w:ind w:firstLine="720" w:left="0"/>
+        <w:jc w:val="both"/>
+      </w:pPr>
+      <w:r>
+        <w:rPr/>
+        <w:t>- Thiếu kênh tương tác trực tuyến minh bạch cho người tiêu dùng:</w:t>
+      </w:r>
+    </w:p>
+    <w:p>
+      <w:pPr>
+        <w:spacing w:before="0" w:after="60" w:line="360" w:lineRule="auto"/>
+        <w:ind w:left="720" w:firstLine="720"/>
+        <w:jc w:val="both"/>
+      </w:pPr>
+      <w:r>
+        <w:rPr/>
+        <w:t>+ Khách hàng khi muốn tìm mua đồ gia dụng chính hãng gặp khó khăn trong việc tìm kiếm các đại lý ủy quyền uy tín ở gần khu vực sinh sống của mình.</w:t>
+      </w:r>
+    </w:p>
+    <w:p>
+      <w:pPr>
+        <w:spacing w:before="0" w:after="60" w:line="360" w:lineRule="auto"/>
+        <w:ind w:left="720" w:firstLine="720"/>
+        <w:jc w:val="both"/>
+      </w:pPr>
+      <w:r>
+        <w:rPr/>
+        <w:t>+ Thiếu hệ thống đánh giá (Review) và phản hồi khách quan khiến người mua không thể kiểm chứng chất lượng phục vụ và thái độ bảo hành của từng đại lý, từ đó làm giảm niềm tin tiêu dùng.</w:t>
+      </w:r>
+    </w:p>
+    <w:p>
+      <w:pPr>
+        <w:spacing w:before="0" w:after="60" w:line="360" w:lineRule="auto"/>
+        <w:ind w:left="720" w:firstLine="720"/>
+        <w:jc w:val="both"/>
+      </w:pPr>
+      <w:r>
+        <w:rPr/>
+        <w:t>+ Khách hàng không thể so sánh giá bán, tính năng kỹ thuật và các chính sách ưu đãi giữa các đại lý khác nhau trên cùng một cổng thông tin.</w:t>
+      </w:r>
+    </w:p>
+    <w:p>
+      <w:pPr>
+        <w:spacing w:before="0" w:after="80" w:line="360" w:lineRule="auto"/>
+        <w:ind w:firstLine="720" w:left="0"/>
+        <w:jc w:val="both"/>
+      </w:pPr>
+      <w:r>
+        <w:rPr/>
+        <w:t>- Bất cập trong công tác quản lý tài chính, đối soát chiết khấu và bảo mật phân quyền:</w:t>
+      </w:r>
+    </w:p>
+    <w:p>
+      <w:pPr>
+        <w:spacing w:before="0" w:after="60" w:line="360" w:lineRule="auto"/>
+        <w:ind w:left="720" w:firstLine="720"/>
+        <w:jc w:val="both"/>
+      </w:pPr>
+      <w:r>
+        <w:rPr/>
+        <w:t>+ Hệ thống cũ không cung cấp cơ chế phân quyền truy cập chặt chẽ giữa các nhóm người dùng: Quản trị viên hệ thống (Admin), Chủ đại lý/Nhà bán hàng (Seller) và Khách hàng (Customer).</w:t>
+      </w:r>
+    </w:p>
+    <w:p>
+      <w:pPr>
+        <w:spacing w:before="0" w:after="60" w:line="360" w:lineRule="auto"/>
+        <w:ind w:left="720" w:firstLine="720"/>
+        <w:jc w:val="both"/>
+      </w:pPr>
+      <w:r>
+        <w:rPr/>
+        <w:t>+ Công tác tổng hợp báo cáo doanh thu, tính toán tỷ lệ chiết khấu bán hàng cho từng đại lý và đối soát công nợ định kỳ tốn rất nhiều thời gian, công sức và dễ phát sinh sai sót, tranh chấp số liệu.</w:t>
+      </w:r>
+    </w:p>
+    <w:p>
+      <w:pPr>
+        <w:spacing w:before="0" w:after="60" w:line="360" w:lineRule="auto"/>
+        <w:ind w:left="720" w:firstLine="720"/>
+        <w:jc w:val="both"/>
+      </w:pPr>
+      <w:r>
+        <w:rPr/>
+        <w:t>+ Nguy cơ mất an toàn thông tin, rò rỉ dữ liệu khách hàng và thông tin kinh doanh do thiếu các giải pháp bảo mật cơ sở dữ liệu và mã hóa mật khẩu an toàn.</w:t>
+      </w:r>
+    </w:p>
+    <w:p>
+      <w:pPr>
+        <w:spacing w:before="0" w:after="120" w:line="360" w:lineRule="auto"/>
+        <w:ind w:firstLine="720" w:left="0"/>
+        <w:jc w:val="both"/>
+      </w:pPr>
+      <w:r>
+        <w:rPr/>
+        <w:t>Đứng trước những đòi hỏi cấp thiết của thực tiễn, việc xây dựng một giải pháp phần mềm quản lý đại lý kinh doanh đồ gia dụng tích hợp mô hình Multi-vendor Marketplace (Sàn giao dịch đa nhà bán hàng) là một bước đi đột phá mang tính chiến lược. Mô hình Multi-vendor cho phép tập trung quản lý nhiều đại lý phân phối độc lập trên cùng một nền tảng Web duy nhất. Mỗi đại lý được cấp một tài khoản gian hàng riêng để tự quản lý danh mục sản phẩm đồ gia dụng, quản lý kho hàng và xử lý đơn hàng; trong khi đó, Quản trị viên hệ thống (Admin) nắm giữ quyền kiểm soát toàn cục về danh mục tổng, chính sách bán hàng, duyệt mở gian hàng và quản lý tài khoản người dùng.</w:t>
+      </w:r>
+    </w:p>
+    <w:p>
+      <w:pPr>
+        <w:spacing w:before="0" w:after="120" w:line="360" w:lineRule="auto"/>
+        <w:ind w:firstLine="720" w:left="0"/>
+        <w:jc w:val="both"/>
+      </w:pPr>
+      <w:r>
+        <w:rPr/>
+        <w:t>Về mặt nền tảng công nghệ, ngôn ngữ lập trình Java kết hợp với khung ứng dụng Spring Boot Framework là sự lựa chọn tối ưu hàng đầu cho việc xây dựng các ứng dụng phần mềm doanh nghiệp và thương mại điện tử quy mô lớn. Spring Boot sở hữu những ưu thế vượt trội:</w:t>
+      </w:r>
+    </w:p>
+    <w:p>
+      <w:pPr>
+        <w:spacing w:before="0" w:after="80" w:line="360" w:lineRule="auto"/>
+        <w:ind w:firstLine="720" w:left="0"/>
+        <w:jc w:val="both"/>
+      </w:pPr>
+      <w:r>
+        <w:rPr/>
+        <w:t>- Kiến trúc mô-đun hóa mạnh mẽ và khả năng mở rộng (Scalability):</w:t>
+      </w:r>
+    </w:p>
+    <w:p>
+      <w:pPr>
+        <w:spacing w:before="0" w:after="60" w:line="360" w:lineRule="auto"/>
+        <w:ind w:left="720" w:firstLine="720"/>
+        <w:jc w:val="both"/>
+      </w:pPr>
+      <w:r>
+        <w:rPr/>
+        <w:t>+ Cho phép hệ thống dễ dàng mở rộng quy mô, nâng cấp tính năng hoặc tích hợp thêm các dịch vụ của bên thứ ba mà không làm gián đoạn các phân hệ đang vận hành.</w:t>
+      </w:r>
+    </w:p>
+    <w:p>
+      <w:pPr>
+        <w:spacing w:before="0" w:after="60" w:line="360" w:lineRule="auto"/>
+        <w:ind w:left="720" w:firstLine="720"/>
+        <w:jc w:val="both"/>
+      </w:pPr>
+      <w:r>
+        <w:rPr/>
+        <w:t>+ Tối ưu hóa khả năng xử lý đồng thời nhiều truy vấn (High Concurrency) khi lượng người dùng và giao dịch tăng đột biến.</w:t>
+      </w:r>
+    </w:p>
+    <w:p>
+      <w:pPr>
+        <w:spacing w:before="0" w:after="80" w:line="360" w:lineRule="auto"/>
+        <w:ind w:firstLine="720" w:left="0"/>
+        <w:jc w:val="both"/>
+      </w:pPr>
+      <w:r>
+        <w:rPr/>
+        <w:t>- Tối ưu hóa quản lý cơ sở dữ liệu với Spring Data JPA / Hibernate ORM:</w:t>
+      </w:r>
+    </w:p>
+    <w:p>
+      <w:pPr>
+        <w:spacing w:before="0" w:after="60" w:line="360" w:lineRule="auto"/>
+        <w:ind w:left="720" w:firstLine="720"/>
+        <w:jc w:val="both"/>
+      </w:pPr>
+      <w:r>
+        <w:rPr/>
+        <w:t>+ Giúp tự động hóa việc ánh xạ các đối tượng Java sang bảng cơ sở dữ liệu quan hệ MySQL, giảm thiểu tối đa mã lệnh SQL thủ công và nâng cao hiệu năng truy vấn dữ liệu.</w:t>
+      </w:r>
+    </w:p>
+    <w:p>
+      <w:pPr>
+        <w:spacing w:before="0" w:after="60" w:line="360" w:lineRule="auto"/>
+        <w:ind w:left="720" w:firstLine="720"/>
+        <w:jc w:val="both"/>
+      </w:pPr>
+      <w:r>
+        <w:rPr/>
+        <w:t>+ Hỗ trợ cơ chế quản lý giao dịch (Transaction Management) đảm bảo tính toàn vẹn dữ liệu ACID khi xử lý đơn hàng.</w:t>
+      </w:r>
+    </w:p>
+    <w:p>
+      <w:pPr>
+        <w:spacing w:before="0" w:after="80" w:line="360" w:lineRule="auto"/>
+        <w:ind w:firstLine="720" w:left="0"/>
+        <w:jc w:val="both"/>
+      </w:pPr>
+      <w:r>
+        <w:rPr/>
+        <w:t>- Bảo mật vượt trội với khung làm việc Spring Security:</w:t>
+      </w:r>
+    </w:p>
+    <w:p>
+      <w:pPr>
+        <w:spacing w:before="0" w:after="60" w:line="360" w:lineRule="auto"/>
+        <w:ind w:left="720" w:firstLine="720"/>
+        <w:jc w:val="both"/>
+      </w:pPr>
+      <w:r>
+        <w:rPr/>
+        <w:t>+ Cung cấp cơ chế xác thực người dùng chặt chẽ, mã hóa mật khẩu an toàn chuẩn BCryptPasswordEncoder.</w:t>
+      </w:r>
+    </w:p>
+    <w:p>
+      <w:pPr>
+        <w:spacing w:before="0" w:after="60" w:line="360" w:lineRule="auto"/>
+        <w:ind w:left="720" w:firstLine="720"/>
+        <w:jc w:val="both"/>
+      </w:pPr>
+      <w:r>
+        <w:rPr/>
+        <w:t>+ Cài đặt phân quyền truy cập đa cấp độ dựa trên vai trò (Role-Based Access Control - RBAC), ngăn chặn hiệu quả các lỗ hổng bảo mật và nguy cơ tấn công mạng như CSRF, XSS, SQL Injection.</w:t>
+      </w:r>
+    </w:p>
+    <w:p>
+      <w:pPr>
+        <w:spacing w:before="0" w:after="80" w:line="360" w:lineRule="auto"/>
+        <w:ind w:firstLine="720" w:left="0"/>
+        <w:jc w:val="both"/>
+      </w:pPr>
+      <w:r>
+        <w:rPr/>
+        <w:t>- Tích hợp công nghệ giao diện Thymeleaf Template Engine:</w:t>
+      </w:r>
+    </w:p>
+    <w:p>
+      <w:pPr>
+        <w:spacing w:before="0" w:after="60" w:line="360" w:lineRule="auto"/>
+        <w:ind w:left="720" w:firstLine="720"/>
+        <w:jc w:val="both"/>
+      </w:pPr>
+      <w:r>
+        <w:rPr/>
+        <w:t>+ Cho phép nhúng mượt mà dữ liệu động từ các Spring Controller sang giao diện HTML5/Bootstrap, mang lại tốc độ phản hồi trang web nhanh chóng và trải nghiệm người dùng tối ưu.</w:t>
+      </w:r>
+    </w:p>
+    <w:p>
+      <w:pPr>
+        <w:spacing w:before="0" w:after="60" w:line="360" w:lineRule="auto"/>
+        <w:ind w:left="720" w:firstLine="720"/>
+        <w:jc w:val="both"/>
+      </w:pPr>
+      <w:r>
+        <w:rPr/>
+        <w:t>+ Giúp tách biệt giữa logic xử lý nghiệp vụ Java backend và phần hiển thị giao diện frontend.</w:t>
+      </w:r>
+    </w:p>
+    <w:p>
+      <w:pPr>
+        <w:spacing w:before="0" w:after="120" w:line="360" w:lineRule="auto"/>
+        <w:ind w:firstLine="720" w:left="0"/>
+        <w:jc w:val="both"/>
+      </w:pPr>
+      <w:r>
+        <w:rPr/>
+        <w:t>Xuất phát từ yêu cầu thực tiễn của ngành kinh doanh đồ gia dụng cùng mong muốn áp dụng các kiến thức chuyên sâu của học phần Công nghệ Java vào một dự án phần mềm có tính ứng dụng thực tế cao, Nhóm 7 đã quyết định lựa chọn đề tài: "Xây dựng phần mềm quản lý đại lý kinh doanh đồ gia dụng" (Đề tài CNJ18) làm Bài tập lớn học phần. Đề tài không chỉ giúp nhóm sinh viên nâng cao kỹ năng lập trình Java doanh nghiệp mà còn đóng góp một giải pháp công nghệ hữu ích cho bài toán quản lý kênh phân phối đại lý trong thực tế.</w:t>
       </w:r>
     </w:p>
     <w:p>
@@ -1605,7 +1848,7 @@
       </w:pPr>
       <w:r>
         <w:rPr/>
-        <w:t>Mục tiêu tổng quát của đề tài là nghiên cứu, thiết kế và cài đặt hoàn chỉnh một phần mềm quản lý đại lý kinh doanh đồ gia dụng chạy trên nền tảng Web Application với ngôn ngữ Java và Spring Boot Framework. Hệ thống hỗ trợ quản lý tập trung mạng lưới đại lý, danh mục sản phẩm đồ gia dụng, quy trình bán hàng và chăm sóc khách hàng trực tuyến an toàn, tối ưu.</w:t>
+        <w:t>Mục tiêu tổng quát của đề tài là nghiên cứu, phân tích, thiết kế và phát triển thành công một phần mềm quản lý đại lý kinh doanh đồ gia dụng trực tuyến (Multi-vendor Household E-Commerce Platform) chạy trên nền tảng ứng dụng Web Application sử dụng ngôn ngữ Java, Spring Boot Framework và hệ quản trị cơ sở dữ liệu MySQL. Hệ thống được xây dựng nhằm chuẩn hóa toàn bộ quy trình quản lý đại lý phân phối, tối ưu hóa công tác quản lý kho và danh mục đồ gia dụng, tự động hóa quy trình tiếp nhận - xử lý đơn hàng, đồng thời cung cấp giao diện mua sắm tiện ích, an toàn và minh bạch cho khách hàng.</w:t>
       </w:r>
     </w:p>
     <w:p>
@@ -1628,106 +1871,139 @@
       </w:pPr>
       <w:r>
         <w:rPr/>
-        <w:t>Để đạt được mục tiêu tổng quát, đề tài đề ra các mục tiêu cụ thể bao gồm:</w:t>
-      </w:r>
-    </w:p>
-    <w:p>
-      <w:pPr>
-        <w:spacing w:before="0" w:after="80" w:line="360" w:lineRule="auto"/>
-        <w:ind w:firstLine="720" w:left="0"/>
-        <w:jc w:val="both"/>
-      </w:pPr>
-      <w:r>
-        <w:rPr/>
-        <w:t>- Xây dựng cơ sở dữ liệu quan hệ chuẩn hóa trên MySQL:</w:t>
-      </w:r>
-    </w:p>
-    <w:p>
-      <w:pPr>
-        <w:spacing w:before="0" w:after="60" w:line="360" w:lineRule="auto"/>
-        <w:ind w:left="720" w:firstLine="720"/>
-        <w:jc w:val="both"/>
-      </w:pPr>
-      <w:r>
-        <w:rPr/>
-        <w:t>+ Thiết kế các bảng lưu trữ thông tin tài khoản người dùng (User), vai trò (Role), danh mục sản phẩm (Category), sản phẩm gia dụng (Product), đại lý (Shop/Vendor), đơn hàng (Order, OrderItem) và đánh giá (Review).</w:t>
-      </w:r>
-    </w:p>
-    <w:p>
-      <w:pPr>
-        <w:spacing w:before="0" w:after="80" w:line="360" w:lineRule="auto"/>
-        <w:ind w:firstLine="720" w:left="0"/>
-        <w:jc w:val="both"/>
-      </w:pPr>
-      <w:r>
-        <w:rPr/>
-        <w:t>- Cài đặt phân quyền người dùng đa cấp độ (Role-Based Access Control):</w:t>
-      </w:r>
-    </w:p>
-    <w:p>
-      <w:pPr>
-        <w:spacing w:before="0" w:after="60" w:line="360" w:lineRule="auto"/>
-        <w:ind w:left="720" w:firstLine="720"/>
-        <w:jc w:val="both"/>
-      </w:pPr>
-      <w:r>
-        <w:rPr/>
-        <w:t>+ Tích hợp Spring Security để xác thực và phân quyền chính xác cho 3 nhóm đối tượng: Admin, Seller (Đại lý) và Customer (Khách hàng).</w:t>
-      </w:r>
-    </w:p>
-    <w:p>
-      <w:pPr>
-        <w:spacing w:before="0" w:after="80" w:line="360" w:lineRule="auto"/>
-        <w:ind w:firstLine="720" w:left="0"/>
-        <w:jc w:val="both"/>
-      </w:pPr>
-      <w:r>
-        <w:rPr/>
-        <w:t>- Phát triển các mô-đun chức năng chính của hệ thống:</w:t>
-      </w:r>
-    </w:p>
-    <w:p>
-      <w:pPr>
-        <w:spacing w:before="0" w:after="60" w:line="360" w:lineRule="auto"/>
-        <w:ind w:left="720" w:firstLine="720"/>
-        <w:jc w:val="both"/>
-      </w:pPr>
-      <w:r>
-        <w:rPr/>
-        <w:t>+ Mô-đun Quản trị hệ thống (Admin Panel): Phê duyệt hồ sơ mở đại lý mới, quản lý danh mục đồ gia dụng toàn hệ thống, quản lý tài khoản và thiết lập cấu hình website.</w:t>
-      </w:r>
-    </w:p>
-    <w:p>
-      <w:pPr>
-        <w:spacing w:before="0" w:after="60" w:line="360" w:lineRule="auto"/>
-        <w:ind w:left="720" w:firstLine="720"/>
-        <w:jc w:val="both"/>
-      </w:pPr>
-      <w:r>
-        <w:rPr/>
-        <w:t>+ Mô-đun Quản lý cho Đại lý (Seller/Vendor Panel): Cập nhật thông tin gian hàng, đăng bán sản phẩm gia dụng, quản lý kho hàng và xử lý trạng thái đơn hàng (PENDING, PROCESSING, SHIPPED, DELIVERED, CANCELLED).</w:t>
-      </w:r>
-    </w:p>
-    <w:p>
-      <w:pPr>
-        <w:spacing w:before="0" w:after="60" w:line="360" w:lineRule="auto"/>
-        <w:ind w:left="720" w:firstLine="720"/>
-        <w:jc w:val="both"/>
-      </w:pPr>
-      <w:r>
-        <w:rPr/>
-        <w:t>+ Giao diện Mua sắm cho Khách hàng (Customer Storefront): Duyệt xem danh mục đồ gia dụng, tìm kiếm sản phẩm, quản lý giỏ hàng, đặt hàng trực tuyến và gửi đánh giá sản phẩm.</w:t>
-      </w:r>
-    </w:p>
-    <w:p>
-      <w:pPr>
-        <w:spacing w:before="0" w:after="60" w:line="360" w:lineRule="auto"/>
-        <w:ind w:left="720" w:firstLine="720"/>
-        <w:jc w:val="both"/>
-      </w:pPr>
-      <w:r>
-        <w:rPr/>
-        <w:t>+ Tối ưu hóa giao diện người dùng: Sử dụng HTML5, CSS3, JavaScript, Bootstrap kết hợp với Thymeleaf Template Engine để tạo giao diện thân thiện, tương thích trên nhiều thiết bị.</w:t>
+        <w:t>Để đạt được mục tiêu tổng quát nêu trên, đề tài đề ra và tập trung thực hiện các mục tiêu cụ thể sau:</w:t>
+      </w:r>
+    </w:p>
+    <w:p>
+      <w:pPr>
+        <w:spacing w:before="0" w:after="80" w:line="360" w:lineRule="auto"/>
+        <w:ind w:firstLine="720" w:left="0"/>
+        <w:jc w:val="both"/>
+      </w:pPr>
+      <w:r>
+        <w:rPr/>
+        <w:t>- Về mặt khảo sát, phân tích và thiết kế hệ thống:</w:t>
+      </w:r>
+    </w:p>
+    <w:p>
+      <w:pPr>
+        <w:spacing w:before="0" w:after="60" w:line="360" w:lineRule="auto"/>
+        <w:ind w:left="720" w:firstLine="720"/>
+        <w:jc w:val="both"/>
+      </w:pPr>
+      <w:r>
+        <w:rPr/>
+        <w:t>+ Nghiên cứu và khảo sát toàn diện quy trình nghiệp vụ quản lý đại lý kinh doanh đồ gia dụng trong thực tế.</w:t>
+      </w:r>
+    </w:p>
+    <w:p>
+      <w:pPr>
+        <w:spacing w:before="0" w:after="60" w:line="360" w:lineRule="auto"/>
+        <w:ind w:left="720" w:firstLine="720"/>
+        <w:jc w:val="both"/>
+      </w:pPr>
+      <w:r>
+        <w:rPr/>
+        <w:t>+ Phân tích xác định rõ ràng các tác nhân tham gia hệ thống và xây dựng hệ thống sơ đồ Use Case tổng quát và chi tiết cho từng phân hệ.</w:t>
+      </w:r>
+    </w:p>
+    <w:p>
+      <w:pPr>
+        <w:spacing w:before="0" w:after="60" w:line="360" w:lineRule="auto"/>
+        <w:ind w:left="720" w:firstLine="720"/>
+        <w:jc w:val="both"/>
+      </w:pPr>
+      <w:r>
+        <w:rPr/>
+        <w:t>+ Thiết kế mô hình cơ sở dữ liệu quan hệ Entity-Relationship Diagram (ERD) chuẩn hóa ở dạng chuẩn 3NF trên MySQL, đảm bảo tính toàn vẹn dữ liệu, không dư thừa thông tin và tối ưu hóa hiệu năng truy vấn dữ liệu lớn.</w:t>
+      </w:r>
+    </w:p>
+    <w:p>
+      <w:pPr>
+        <w:spacing w:before="0" w:after="80" w:line="360" w:lineRule="auto"/>
+        <w:ind w:firstLine="720" w:left="0"/>
+        <w:jc w:val="both"/>
+      </w:pPr>
+      <w:r>
+        <w:rPr/>
+        <w:t>- Về mặt cài đặt các phân hệ chức năng phần mềm:</w:t>
+      </w:r>
+    </w:p>
+    <w:p>
+      <w:pPr>
+        <w:spacing w:before="0" w:after="60" w:line="360" w:lineRule="auto"/>
+        <w:ind w:left="720" w:firstLine="720"/>
+        <w:jc w:val="both"/>
+      </w:pPr>
+      <w:r>
+        <w:rPr/>
+        <w:t>+ Phát triển Mô-đun Quản trị hệ thống (Admin Panel): Cung cấp công cụ cho Admin thực hiện phê duyệt hồ sơ đăng ký mở đại lý mới, quản lý danh mục sản phẩm đồ gia dụng tổng (Category), quản lý danh sách tài khoản người dùng, xem báo cáo thống kê và cấu hình thiết lập thông tin website (SiteSetting).</w:t>
+      </w:r>
+    </w:p>
+    <w:p>
+      <w:pPr>
+        <w:spacing w:before="0" w:after="60" w:line="360" w:lineRule="auto"/>
+        <w:ind w:left="720" w:firstLine="720"/>
+        <w:jc w:val="both"/>
+      </w:pPr>
+      <w:r>
+        <w:rPr/>
+        <w:t>+ Phát triển Mô-đun Quản lý dành cho Đại lý / Nhà bán hàng (Seller / Vendor Panel): Cung cấp giao diện quản trị riêng cho từng đại lý; hỗ trợ chủ đại lý cập nhật thông tin gian hàng, đăng bán các sản phẩm gia dụng, quản lý số lượng tồn kho, tiếp nhận đơn đặt hàng và cập nhật linh hoạt trạng thái đơn hàng (PENDING, PROCESSING, SHIPPED, DELIVERED, CANCELLED).</w:t>
+      </w:r>
+    </w:p>
+    <w:p>
+      <w:pPr>
+        <w:spacing w:before="0" w:after="60" w:line="360" w:lineRule="auto"/>
+        <w:ind w:left="720" w:firstLine="720"/>
+        <w:jc w:val="both"/>
+      </w:pPr>
+      <w:r>
+        <w:rPr/>
+        <w:t>+ Phát triển Giao diện Mua sắm cho Khách hàng (Customer Storefront): Xây dựng giao diện trực quan cho phép khách hàng xem danh sách sản phẩm gia dụng, tìm kiếm và lọc sản phẩm theo danh mục/đại lý, xem chi tiết thông tin sản phẩm và đại lý phân phối, quản lý giỏ hàng trực tuyến (Cart), tiến hành đặt hàng (Checkout) và gửi phản hồi, đánh giá sản phẩm (Review).</w:t>
+      </w:r>
+    </w:p>
+    <w:p>
+      <w:pPr>
+        <w:spacing w:before="0" w:after="80" w:line="360" w:lineRule="auto"/>
+        <w:ind w:firstLine="720" w:left="0"/>
+        <w:jc w:val="both"/>
+      </w:pPr>
+      <w:r>
+        <w:rPr/>
+        <w:t>- Về mặt kiến trúc công nghệ và bảo mật:</w:t>
+      </w:r>
+    </w:p>
+    <w:p>
+      <w:pPr>
+        <w:spacing w:before="0" w:after="60" w:line="360" w:lineRule="auto"/>
+        <w:ind w:left="720" w:firstLine="720"/>
+        <w:jc w:val="both"/>
+      </w:pPr>
+      <w:r>
+        <w:rPr/>
+        <w:t>+ Áp dụng nghiêm ngặt mô hình kiến trúc MVC (Model-View-Controller) tách biệt giữa xử lý dữ liệu (Model), logic điều hướng (Controller) và giao diện người dùng (View).</w:t>
+      </w:r>
+    </w:p>
+    <w:p>
+      <w:pPr>
+        <w:spacing w:before="0" w:after="60" w:line="360" w:lineRule="auto"/>
+        <w:ind w:left="720" w:firstLine="720"/>
+        <w:jc w:val="both"/>
+      </w:pPr>
+      <w:r>
+        <w:rPr/>
+        <w:t>+ Cài đặt phân quyền truy cập đa cấp độ theo vai trò (ROLE_ADMIN, ROLE_SELLER, ROLE_CUSTOMER) sử dụng Spring Security. Thực hiện mã hóa mật khẩu an toàn bằng giải thuật BCryptPasswordEncoder.</w:t>
+      </w:r>
+    </w:p>
+    <w:p>
+      <w:pPr>
+        <w:spacing w:before="0" w:after="60" w:line="360" w:lineRule="auto"/>
+        <w:ind w:left="720" w:firstLine="720"/>
+        <w:jc w:val="both"/>
+      </w:pPr>
+      <w:r>
+        <w:rPr/>
+        <w:t>+ Xây dựng giao diện ứng dụng Web đáp ứng (Responsive Web Design) bằng HTML5, CSS3, JavaScript, Bootstrap 5 kết hợp cùng Thymeleaf Template Engine.</w:t>
       </w:r>
     </w:p>
     <w:p>
@@ -1762,95 +2038,139 @@
       </w:pPr>
       <w:r>
         <w:rPr/>
-        <w:t>Đối tượng nghiên cứu của đề tài bao gồm:</w:t>
-      </w:r>
-    </w:p>
-    <w:p>
-      <w:pPr>
-        <w:spacing w:before="0" w:after="80" w:line="360" w:lineRule="auto"/>
-        <w:ind w:firstLine="720" w:left="0"/>
-        <w:jc w:val="both"/>
-      </w:pPr>
-      <w:r>
-        <w:rPr/>
-        <w:t>- Quy trình nghiệp vụ quản lý đại lý kinh doanh đồ gia dụng:</w:t>
-      </w:r>
-    </w:p>
-    <w:p>
-      <w:pPr>
-        <w:spacing w:before="0" w:after="60" w:line="360" w:lineRule="auto"/>
-        <w:ind w:left="720" w:firstLine="720"/>
-        <w:jc w:val="both"/>
-      </w:pPr>
-      <w:r>
-        <w:rPr/>
-        <w:t>+ Quản lý thông tin gian hàng đại lý và danh mục sản phẩm gia dụng.</w:t>
-      </w:r>
-    </w:p>
-    <w:p>
-      <w:pPr>
-        <w:spacing w:before="0" w:after="60" w:line="360" w:lineRule="auto"/>
-        <w:ind w:left="720" w:firstLine="720"/>
-        <w:jc w:val="both"/>
-      </w:pPr>
-      <w:r>
-        <w:rPr/>
-        <w:t>+ Quy trình luân chuyển đơn hàng, cập nhật trạng thái và đối soát doanh thu.</w:t>
-      </w:r>
-    </w:p>
-    <w:p>
-      <w:pPr>
-        <w:spacing w:before="0" w:after="80" w:line="360" w:lineRule="auto"/>
-        <w:ind w:firstLine="720" w:left="0"/>
-        <w:jc w:val="both"/>
-      </w:pPr>
-      <w:r>
-        <w:rPr/>
-        <w:t>- Các công nghệ lập trình Java doanh nghiệp nâng cao:</w:t>
-      </w:r>
-    </w:p>
-    <w:p>
-      <w:pPr>
-        <w:spacing w:before="0" w:after="60" w:line="360" w:lineRule="auto"/>
-        <w:ind w:left="720" w:firstLine="720"/>
-        <w:jc w:val="both"/>
-      </w:pPr>
-      <w:r>
-        <w:rPr/>
-        <w:t>+ Khung ứng dụng Java Spring Boot (Spring MVC, Spring Data JPA / Hibernate ORM).</w:t>
-      </w:r>
-    </w:p>
-    <w:p>
-      <w:pPr>
-        <w:spacing w:before="0" w:after="60" w:line="360" w:lineRule="auto"/>
-        <w:ind w:left="720" w:firstLine="720"/>
-        <w:jc w:val="both"/>
-      </w:pPr>
-      <w:r>
-        <w:rPr/>
-        <w:t>+ Cơ chế bảo mật Spring Security (Mã hóa BCryptPasswordEncoder, Session Management, RBAC).</w:t>
-      </w:r>
-    </w:p>
-    <w:p>
-      <w:pPr>
-        <w:spacing w:before="0" w:after="60" w:line="360" w:lineRule="auto"/>
-        <w:ind w:left="720" w:firstLine="720"/>
-        <w:jc w:val="both"/>
-      </w:pPr>
-      <w:r>
-        <w:rPr/>
-        <w:t>+ Công nghệ giao diện Thymeleaf Template Engine.</w:t>
-      </w:r>
-    </w:p>
-    <w:p>
-      <w:pPr>
-        <w:spacing w:before="0" w:after="60" w:line="360" w:lineRule="auto"/>
-        <w:ind w:left="720" w:firstLine="720"/>
-        <w:jc w:val="both"/>
-      </w:pPr>
-      <w:r>
-        <w:rPr/>
-        <w:t>+ Hệ quản trị cơ sở dữ liệu quan hệ MySQL.</w:t>
+        <w:t>Đối tượng nghiên cứu của đề tài bao gồm hai mảng nội dung chính: quy trình nghiệp vụ quản lý đại lý thực tế và các công nghệ lập trình Java nâng cao:</w:t>
+      </w:r>
+    </w:p>
+    <w:p>
+      <w:pPr>
+        <w:spacing w:before="0" w:after="80" w:line="360" w:lineRule="auto"/>
+        <w:ind w:firstLine="720" w:left="0"/>
+        <w:jc w:val="both"/>
+      </w:pPr>
+      <w:r>
+        <w:rPr/>
+        <w:t>- Mảng đối tượng nghiệp vụ thực tế:</w:t>
+      </w:r>
+    </w:p>
+    <w:p>
+      <w:pPr>
+        <w:spacing w:before="0" w:after="60" w:line="360" w:lineRule="auto"/>
+        <w:ind w:left="720" w:firstLine="720"/>
+        <w:jc w:val="both"/>
+      </w:pPr>
+      <w:r>
+        <w:rPr/>
+        <w:t>+ Quy trình quản lý danh mục và thông tin đại lý kinh doanh đồ gia dụng.</w:t>
+      </w:r>
+    </w:p>
+    <w:p>
+      <w:pPr>
+        <w:spacing w:before="0" w:after="60" w:line="360" w:lineRule="auto"/>
+        <w:ind w:left="720" w:firstLine="720"/>
+        <w:jc w:val="both"/>
+      </w:pPr>
+      <w:r>
+        <w:rPr/>
+        <w:t>+ Nghiệp vụ quản lý kho hàng và đăng bán các mặt hàng gia dụng (thiết bị điện gia dụng, dụng cụ nhà bếp, thiết bị tiện ích gia đình).</w:t>
+      </w:r>
+    </w:p>
+    <w:p>
+      <w:pPr>
+        <w:spacing w:before="0" w:after="60" w:line="360" w:lineRule="auto"/>
+        <w:ind w:left="720" w:firstLine="720"/>
+        <w:jc w:val="both"/>
+      </w:pPr>
+      <w:r>
+        <w:rPr/>
+        <w:t>+ Quy trình xử lý đơn đặt hàng trực tuyến, luân chuyển trạng thái đơn hàng từ khi khởi tạo đến khi giao hàng thành công.</w:t>
+      </w:r>
+    </w:p>
+    <w:p>
+      <w:pPr>
+        <w:spacing w:before="0" w:after="60" w:line="360" w:lineRule="auto"/>
+        <w:ind w:left="720" w:firstLine="720"/>
+        <w:jc w:val="both"/>
+      </w:pPr>
+      <w:r>
+        <w:rPr/>
+        <w:t>+ Cơ chế đánh giá, phản hồi chất lượng sản phẩm và thái độ phục vụ của từng đại lý.</w:t>
+      </w:r>
+    </w:p>
+    <w:p>
+      <w:pPr>
+        <w:spacing w:before="0" w:after="80" w:line="360" w:lineRule="auto"/>
+        <w:ind w:firstLine="720" w:left="0"/>
+        <w:jc w:val="both"/>
+      </w:pPr>
+      <w:r>
+        <w:rPr/>
+        <w:t>- Mảng đối tượng công nghệ phần mềm:</w:t>
+      </w:r>
+    </w:p>
+    <w:p>
+      <w:pPr>
+        <w:spacing w:before="0" w:after="60" w:line="360" w:lineRule="auto"/>
+        <w:ind w:left="720" w:firstLine="720"/>
+        <w:jc w:val="both"/>
+      </w:pPr>
+      <w:r>
+        <w:rPr/>
+        <w:t>+ Ngôn ngữ lập trình Java (bản Java 17/21 LTS) và khung ứng dụng Spring Boot 3.x.</w:t>
+      </w:r>
+    </w:p>
+    <w:p>
+      <w:pPr>
+        <w:spacing w:before="0" w:after="60" w:line="360" w:lineRule="auto"/>
+        <w:ind w:left="720" w:firstLine="720"/>
+        <w:jc w:val="both"/>
+      </w:pPr>
+      <w:r>
+        <w:rPr/>
+        <w:t>+ Khung làm việc Spring MVC điều hướng luồng request - response.</w:t>
+      </w:r>
+    </w:p>
+    <w:p>
+      <w:pPr>
+        <w:spacing w:before="0" w:after="60" w:line="360" w:lineRule="auto"/>
+        <w:ind w:left="720" w:firstLine="720"/>
+        <w:jc w:val="both"/>
+      </w:pPr>
+      <w:r>
+        <w:rPr/>
+        <w:t>+ Công nghệ Spring Data JPA và Hibernate ORM tương tác cơ sở dữ liệu quan hệ.</w:t>
+      </w:r>
+    </w:p>
+    <w:p>
+      <w:pPr>
+        <w:spacing w:before="0" w:after="60" w:line="360" w:lineRule="auto"/>
+        <w:ind w:left="720" w:firstLine="720"/>
+        <w:jc w:val="both"/>
+      </w:pPr>
+      <w:r>
+        <w:rPr/>
+        <w:t>+ Khung bảo mật Spring Security quản lý xác thực và phân quyền truy cập (RBAC).</w:t>
+      </w:r>
+    </w:p>
+    <w:p>
+      <w:pPr>
+        <w:spacing w:before="0" w:after="60" w:line="360" w:lineRule="auto"/>
+        <w:ind w:left="720" w:firstLine="720"/>
+        <w:jc w:val="both"/>
+      </w:pPr>
+      <w:r>
+        <w:rPr/>
+        <w:t>+ Công nghệ giao diện Thymeleaf Template Engine, HTML5, CSS3, JavaScript và Bootstrap 5.</w:t>
+      </w:r>
+    </w:p>
+    <w:p>
+      <w:pPr>
+        <w:spacing w:before="0" w:after="60" w:line="360" w:lineRule="auto"/>
+        <w:ind w:left="720" w:firstLine="720"/>
+        <w:jc w:val="both"/>
+      </w:pPr>
+      <w:r>
+        <w:rPr/>
+        <w:t>+ Hệ quản trị cơ sở dữ liệu quan hệ MySQL 8.x.</w:t>
       </w:r>
     </w:p>
     <w:p>
@@ -1873,73 +2193,95 @@
       </w:pPr>
       <w:r>
         <w:rPr/>
-        <w:t>Phạm vi nghiên cứu của đề tài được giới hạn như sau:</w:t>
-      </w:r>
-    </w:p>
-    <w:p>
-      <w:pPr>
-        <w:spacing w:before="0" w:after="80" w:line="360" w:lineRule="auto"/>
-        <w:ind w:firstLine="720" w:left="0"/>
-        <w:jc w:val="both"/>
-      </w:pPr>
-      <w:r>
-        <w:rPr/>
-        <w:t>- Phạm vi chức năng:</w:t>
-      </w:r>
-    </w:p>
-    <w:p>
-      <w:pPr>
-        <w:spacing w:before="0" w:after="60" w:line="360" w:lineRule="auto"/>
-        <w:ind w:left="720" w:firstLine="720"/>
-        <w:jc w:val="both"/>
-      </w:pPr>
-      <w:r>
-        <w:rPr/>
-        <w:t>+ Hệ thống tập trung giải quyết các bài toán quản lý đại lý đồ gia dụng cốt lõi (Đăng ký đại lý, Quản lý sản phẩm gia dụng, Giỏ hàng, Đặt hàng, Duyệt đơn, Đánh giá sản phẩm). Chưa tích hợp cổng thanh toán trực tuyến qua ngân hàng/ví điện tử thực tế và dịch vụ vận chuyển bên thứ ba (chỉ mô phỏng quy trình).</w:t>
-      </w:r>
-    </w:p>
-    <w:p>
-      <w:pPr>
-        <w:spacing w:before="0" w:after="80" w:line="360" w:lineRule="auto"/>
-        <w:ind w:firstLine="720" w:left="0"/>
-        <w:jc w:val="both"/>
-      </w:pPr>
-      <w:r>
-        <w:rPr/>
-        <w:t>- Phạm vi đối tượng sử dụng:</w:t>
-      </w:r>
-    </w:p>
-    <w:p>
-      <w:pPr>
-        <w:spacing w:before="0" w:after="60" w:line="360" w:lineRule="auto"/>
-        <w:ind w:left="720" w:firstLine="720"/>
-        <w:jc w:val="both"/>
-      </w:pPr>
-      <w:r>
-        <w:rPr/>
-        <w:t>+ Áp dụng cho các đại lý kinh doanh đồ gia dụng vừa và nhỏ, người quản trị hệ thống và khách hàng mua sắm lẻ.</w:t>
-      </w:r>
-    </w:p>
-    <w:p>
-      <w:pPr>
-        <w:spacing w:before="0" w:after="80" w:line="360" w:lineRule="auto"/>
-        <w:ind w:firstLine="720" w:left="0"/>
-        <w:jc w:val="both"/>
-      </w:pPr>
-      <w:r>
-        <w:rPr/>
-        <w:t>- Phạm vi môi trường ứng dụng:</w:t>
-      </w:r>
-    </w:p>
-    <w:p>
-      <w:pPr>
-        <w:spacing w:before="0" w:after="60" w:line="360" w:lineRule="auto"/>
-        <w:ind w:left="720" w:firstLine="720"/>
-        <w:jc w:val="both"/>
-      </w:pPr>
-      <w:r>
-        <w:rPr/>
-        <w:t>+ Chương trình thử nghiệm trong môi trường Localhost trên máy tính cá nhân, phục vụ đánh giá kết quả Bài tập lớn môn Công nghệ Java.</w:t>
+        <w:t>Phạm vi nghiên cứu và triển khai đề tài được xác định cụ thể như sau:</w:t>
+      </w:r>
+    </w:p>
+    <w:p>
+      <w:pPr>
+        <w:spacing w:before="0" w:after="80" w:line="360" w:lineRule="auto"/>
+        <w:ind w:firstLine="720" w:left="0"/>
+        <w:jc w:val="both"/>
+      </w:pPr>
+      <w:r>
+        <w:rPr/>
+        <w:t>- Phạm vi nội dung chức năng:</w:t>
+      </w:r>
+    </w:p>
+    <w:p>
+      <w:pPr>
+        <w:spacing w:before="0" w:after="60" w:line="360" w:lineRule="auto"/>
+        <w:ind w:left="720" w:firstLine="720"/>
+        <w:jc w:val="both"/>
+      </w:pPr>
+      <w:r>
+        <w:rPr/>
+        <w:t>+ Hệ thống tập trung giải quyết các bài toán quản lý đại lý đồ gia dụng cốt lõi: Quản lý người dùng, Quản lý gian hàng đại lý, Quản lý danh mục &amp; sản phẩm đồ gia dụng, Quản lý giỏ hàng &amp; đơn hàng, Đánh giá sản phẩm.</w:t>
+      </w:r>
+    </w:p>
+    <w:p>
+      <w:pPr>
+        <w:spacing w:before="0" w:after="60" w:line="360" w:lineRule="auto"/>
+        <w:ind w:left="720" w:firstLine="720"/>
+        <w:jc w:val="both"/>
+      </w:pPr>
+      <w:r>
+        <w:rPr/>
+        <w:t>+ Trong khuôn khổ Bài tập lớn, hệ thống dừng lại ở mức mô phỏng quy trình đặt hàng và thanh toán COD (Thanh toán khi nhận hàng), chưa tích hợp kết nối API cổng thanh toán ngân hàng trực tuyến thực tế (VNPAY, Momo, ZaloPay) và API dịch vụ vận chuyển của bên thứ ba (GHN, GHTK).</w:t>
+      </w:r>
+    </w:p>
+    <w:p>
+      <w:pPr>
+        <w:spacing w:before="0" w:after="80" w:line="360" w:lineRule="auto"/>
+        <w:ind w:firstLine="720" w:left="0"/>
+        <w:jc w:val="both"/>
+      </w:pPr>
+      <w:r>
+        <w:rPr/>
+        <w:t>- Phạm vi đối tượng người dùng:</w:t>
+      </w:r>
+    </w:p>
+    <w:p>
+      <w:pPr>
+        <w:spacing w:before="0" w:after="60" w:line="360" w:lineRule="auto"/>
+        <w:ind w:left="720" w:firstLine="720"/>
+        <w:jc w:val="both"/>
+      </w:pPr>
+      <w:r>
+        <w:rPr/>
+        <w:t>+ Hệ thống phục vụ 3 nhóm tác nhân chính: Quản trị viên (Admin), Chủ đại lý / Nhà bán hàng (Seller / Vendor), Khách hàng (Customer).</w:t>
+      </w:r>
+    </w:p>
+    <w:p>
+      <w:pPr>
+        <w:spacing w:before="0" w:after="80" w:line="360" w:lineRule="auto"/>
+        <w:ind w:firstLine="720" w:left="0"/>
+        <w:jc w:val="both"/>
+      </w:pPr>
+      <w:r>
+        <w:rPr/>
+        <w:t>- Phạm vi môi trường triển khai thực nghiệm:</w:t>
+      </w:r>
+    </w:p>
+    <w:p>
+      <w:pPr>
+        <w:spacing w:before="0" w:after="60" w:line="360" w:lineRule="auto"/>
+        <w:ind w:left="720" w:firstLine="720"/>
+        <w:jc w:val="both"/>
+      </w:pPr>
+      <w:r>
+        <w:rPr/>
+        <w:t>+ Hệ thống được cài đặt, chạy thử nghiệm và kiểm thử trên môi trường Localhost máy tính cá nhân kết nối cơ sở dữ liệu MySQL Server.</w:t>
+      </w:r>
+    </w:p>
+    <w:p>
+      <w:pPr>
+        <w:spacing w:before="0" w:after="60" w:line="360" w:lineRule="auto"/>
+        <w:ind w:left="720" w:firstLine="720"/>
+        <w:jc w:val="both"/>
+      </w:pPr>
+      <w:r>
+        <w:rPr/>
+        <w:t>+ Thời gian thực hiện: Học kỳ I, Năm học 2025 - 2026 tại Trường Đại học Công nghệ Đông Á.</w:t>
       </w:r>
     </w:p>
     <w:p>
@@ -1962,7 +2304,7 @@
       </w:pPr>
       <w:r>
         <w:rPr/>
-        <w:t>Để hoàn thành đề tài một cách khoa học và đạt chất lượng cao, Nhóm 7 đã áp dụng phối hợp các phương pháp nghiên cứu và phát triển phần mềm sau:</w:t>
+        <w:t>Nhằm đảm bảo tính khoa học, tiến độ và chất lượng của sản phẩm phần mềm, Nhóm 7 đã áp dụng kết hợp ba nhóm phương pháp nghiên cứu chính:</w:t>
       </w:r>
     </w:p>
     <w:p>
@@ -1985,29 +2327,40 @@
       </w:pPr>
       <w:r>
         <w:rPr/>
-        <w:t>- Nghiên cứu tài liệu chính thống về ngôn ngữ Java, kiến trúc Spring Boot, Spring Security và Hibernate/JPA từ trang chủ Spring.io.</w:t>
-      </w:r>
-    </w:p>
-    <w:p>
-      <w:pPr>
-        <w:spacing w:before="0" w:after="80" w:line="360" w:lineRule="auto"/>
-        <w:ind w:firstLine="720" w:left="0"/>
-        <w:jc w:val="both"/>
-      </w:pPr>
-      <w:r>
-        <w:rPr/>
-        <w:t>- Tham khảo các mô hình quản lý đại lý và sàn thương mại điện tử Multi-vendor thực tế trên thế giới và tại Việt Nam.</w:t>
-      </w:r>
-    </w:p>
-    <w:p>
-      <w:pPr>
-        <w:spacing w:before="0" w:after="80" w:line="360" w:lineRule="auto"/>
-        <w:ind w:firstLine="720" w:left="0"/>
-        <w:jc w:val="both"/>
-      </w:pPr>
-      <w:r>
-        <w:rPr/>
-        <w:t>- Tổng hợp kiến thức từ giáo trình học phần Công nghệ Java do Thầy Trần Bá Hùng giảng dạy.</w:t>
+        <w:t>- Nghiên cứu tài liệu chính thống về ngôn ngữ Java, kiến trúc Spring Boot Framework, Spring Security, Spring Data JPA từ tài liệu gốc trên trang chủ Spring.io.</w:t>
+      </w:r>
+    </w:p>
+    <w:p>
+      <w:pPr>
+        <w:spacing w:before="0" w:after="80" w:line="360" w:lineRule="auto"/>
+        <w:ind w:firstLine="720" w:left="0"/>
+        <w:jc w:val="both"/>
+      </w:pPr>
+      <w:r>
+        <w:rPr/>
+        <w:t>- Đọc và phân tích các bài báo khoa học, giáo trình Công nghệ Java do Thầy Trần Bá Hùng biên soạn và giảng dạy.</w:t>
+      </w:r>
+    </w:p>
+    <w:p>
+      <w:pPr>
+        <w:spacing w:before="0" w:after="80" w:line="360" w:lineRule="auto"/>
+        <w:ind w:firstLine="720" w:left="0"/>
+        <w:jc w:val="both"/>
+      </w:pPr>
+      <w:r>
+        <w:rPr/>
+        <w:t>- Tham khảo tài liệu hướng dẫn chuẩn hóa thiết kế cơ sở dữ liệu quan hệ MySQL và chuẩn hóa mã nguồn Clean Code.</w:t>
+      </w:r>
+    </w:p>
+    <w:p>
+      <w:pPr>
+        <w:spacing w:before="0" w:after="80" w:line="360" w:lineRule="auto"/>
+        <w:ind w:firstLine="720" w:left="0"/>
+        <w:jc w:val="both"/>
+      </w:pPr>
+      <w:r>
+        <w:rPr/>
+        <w:t>- Khảo sát mô hình vận hành của các sàn thương mại điện tử Multi-vendor thực tế trên thị trường như Shopee, Lazada, Tiki để rút ra quy trình nghiệp vụ tối ưu cho đại lý đồ gia dụng.</w:t>
       </w:r>
     </w:p>
     <w:p>
@@ -2030,29 +2383,29 @@
       </w:pPr>
       <w:r>
         <w:rPr/>
-        <w:t>- Phân tích yêu cầu bài toán: Thu thập và tổng hợp các yêu cầu chức năng và phi chức năng của hệ thống phần mềm quản lý đại lý đồ gia dụng.</w:t>
-      </w:r>
-    </w:p>
-    <w:p>
-      <w:pPr>
-        <w:spacing w:before="0" w:after="80" w:line="360" w:lineRule="auto"/>
-        <w:ind w:firstLine="720" w:left="0"/>
-        <w:jc w:val="both"/>
-      </w:pPr>
-      <w:r>
-        <w:rPr/>
-        <w:t>- Phương pháp phân tích hướng đối tượng (OOAD): Xây dựng sơ đồ Use Case xác định tương tác của từng nhóm tác nhân (Admin, Seller, Customer).</w:t>
-      </w:r>
-    </w:p>
-    <w:p>
-      <w:pPr>
-        <w:spacing w:before="0" w:after="80" w:line="360" w:lineRule="auto"/>
-        <w:ind w:firstLine="720" w:left="0"/>
-        <w:jc w:val="both"/>
-      </w:pPr>
-      <w:r>
-        <w:rPr/>
-        <w:t>- Thiết kế cơ sở dữ liệu: Xây dựng biểu đồ thực thể liên kết (ERD) và chuẩn hóa dữ liệu ở dạng chuẩn 3NF để đảm bảo tính toàn vẹn dữ liệu.</w:t>
+        <w:t>- Phương pháp phân tích yêu cầu (Requirements Analysis): Thu thập các yêu cầu chức năng (Functional Requirements) và yêu cầu phi chức năng (Non-functional Requirements như hiệu năng, bảo mật, tính dễ sử dụng).</w:t>
+      </w:r>
+    </w:p>
+    <w:p>
+      <w:pPr>
+        <w:spacing w:before="0" w:after="80" w:line="360" w:lineRule="auto"/>
+        <w:ind w:firstLine="720" w:left="0"/>
+        <w:jc w:val="both"/>
+      </w:pPr>
+      <w:r>
+        <w:rPr/>
+        <w:t>- Phương pháp phân tích hướng đối tượng (OOAD): Sử dụng ngôn ngữ mô hình hóa UML để xây dựng sơ đồ Use Case tổng quan và chi tiết.</w:t>
+      </w:r>
+    </w:p>
+    <w:p>
+      <w:pPr>
+        <w:spacing w:before="0" w:after="80" w:line="360" w:lineRule="auto"/>
+        <w:ind w:firstLine="720" w:left="0"/>
+        <w:jc w:val="both"/>
+      </w:pPr>
+      <w:r>
+        <w:rPr/>
+        <w:t>- Phương pháp thiết kế cơ sở dữ liệu: Xây dựng biểu đồ thực thể liên kết ERD, xác định các khóa chính (Primary Key), khóa ngoại (Foreign Key) và đưa cơ sở dữ liệu về dạng chuẩn 3NF nhằm tránh dư thừa và bất đồng bộ dữ liệu.</w:t>
       </w:r>
     </w:p>
     <w:p>
@@ -2075,40 +2428,62 @@
       </w:pPr>
       <w:r>
         <w:rPr/>
-        <w:t>- Phương pháp lập trình Agile/Scrum rút gọn: Phân chia đề tài thành các mô-đun chức năng nhỏ (Quản lý User, Quản lý Đại lý, Quản lý Sản phẩm, Giỏ hàng &amp; Đơn hàng) để phát triển và kiểm thử cuốn chiếu.</w:t>
-      </w:r>
-    </w:p>
-    <w:p>
-      <w:pPr>
-        <w:spacing w:before="0" w:after="80" w:line="360" w:lineRule="auto"/>
-        <w:ind w:firstLine="720" w:left="0"/>
-        <w:jc w:val="both"/>
-      </w:pPr>
-      <w:r>
-        <w:rPr/>
-        <w:t>- Sử dụng môi trường phát triển (IDE): NetBeans / IntelliJ IDEA để viết mã nguồn Java.</w:t>
-      </w:r>
-    </w:p>
-    <w:p>
-      <w:pPr>
-        <w:spacing w:before="0" w:after="80" w:line="360" w:lineRule="auto"/>
-        <w:ind w:firstLine="720" w:left="0"/>
-        <w:jc w:val="both"/>
-      </w:pPr>
-      <w:r>
-        <w:rPr/>
-        <w:t>- Sử dụng công cụ quản lý thư viện Maven: Khai báo và quản lý các dependency chuẩn xác.</w:t>
-      </w:r>
-    </w:p>
-    <w:p>
-      <w:pPr>
-        <w:spacing w:before="0" w:after="80" w:line="360" w:lineRule="auto"/>
-        <w:ind w:firstLine="720" w:left="0"/>
-        <w:jc w:val="both"/>
-      </w:pPr>
-      <w:r>
-        <w:rPr/>
-        <w:t>- Phương pháp kiểm thử phần mềm: Thực hiện Unit Test cho từng Service/Repository và Integration Test trên giao diện trình duyệt web để phát hiện và sửa lỗi.</w:t>
+        <w:t>- Áp dụng quy trình phát triển phần mềm Agile/Scrum rút gọn: Phân chia dự án thành các đợt phát triển (Sprints) ngắn hạn từ 1 đến 2 tuần. Mỗi đợt tập trung phát triển hoàn thiện một phân hệ chức năng cụ thể (Xác thực người dùng -&gt; Quản lý Đại lý -&gt; Quản lý Sản phẩm gia dụng -&gt; Giỏ hàng &amp; Đơn hàng).</w:t>
+      </w:r>
+    </w:p>
+    <w:p>
+      <w:pPr>
+        <w:spacing w:before="0" w:after="80" w:line="360" w:lineRule="auto"/>
+        <w:ind w:firstLine="720" w:left="0"/>
+        <w:jc w:val="both"/>
+      </w:pPr>
+      <w:r>
+        <w:rPr/>
+        <w:t>- Sử dụng môi trường phát triển tích hợp (IDE): NetBeans IDE / IntelliJ IDEA để lập trình mã nguồn Java.</w:t>
+      </w:r>
+    </w:p>
+    <w:p>
+      <w:pPr>
+        <w:spacing w:before="0" w:after="80" w:line="360" w:lineRule="auto"/>
+        <w:ind w:firstLine="720" w:left="0"/>
+        <w:jc w:val="both"/>
+      </w:pPr>
+      <w:r>
+        <w:rPr/>
+        <w:t>- Sử dụng công cụ Maven quản lý phụ thuộc (Dependency Management): Khai báo tự động các thư viện Spring Boot Starter Web, Spring Boot Starter Security, Spring Boot Starter Data JPA, Thymeleaf, MySQL Connector.</w:t>
+      </w:r>
+    </w:p>
+    <w:p>
+      <w:pPr>
+        <w:spacing w:before="0" w:after="80" w:line="360" w:lineRule="auto"/>
+        <w:ind w:firstLine="720" w:left="0"/>
+        <w:jc w:val="both"/>
+      </w:pPr>
+      <w:r>
+        <w:rPr/>
+        <w:t>- Phương pháp kiểm thử phần mềm (Testing):</w:t>
+      </w:r>
+    </w:p>
+    <w:p>
+      <w:pPr>
+        <w:spacing w:before="0" w:after="60" w:line="360" w:lineRule="auto"/>
+        <w:ind w:left="720" w:firstLine="720"/>
+        <w:jc w:val="both"/>
+      </w:pPr>
+      <w:r>
+        <w:rPr/>
+        <w:t>+ Thực hiện Unit Test kiểm tra tính đúng đắn của các hàm Service và Repository.</w:t>
+      </w:r>
+    </w:p>
+    <w:p>
+      <w:pPr>
+        <w:spacing w:before="0" w:after="60" w:line="360" w:lineRule="auto"/>
+        <w:ind w:left="720" w:firstLine="720"/>
+        <w:jc w:val="both"/>
+      </w:pPr>
+      <w:r>
+        <w:rPr/>
+        <w:t>+ Thực hiện Integration Test và UI Test trên trình duyệt Web (Chrome, Edge) để kiểm tra giao diện người dùng, tính liên kết dữ liệu và luồng xử lý đơn hàng thực tế.</w:t>
       </w:r>
     </w:p>
     <w:p>
@@ -2143,18 +2518,29 @@
       </w:pPr>
       <w:r>
         <w:rPr/>
-        <w:t>- Giúp sinh viên củng cố vững chắc lý thuyết về lập trình Java hướng đối tượng, làm chủ các khung làm việc hàng đầu hiện nay như Spring Boot, Spring Security và Spring Data JPA.</w:t>
-      </w:r>
-    </w:p>
-    <w:p>
-      <w:pPr>
-        <w:spacing w:before="0" w:after="80" w:line="360" w:lineRule="auto"/>
-        <w:ind w:firstLine="720" w:left="0"/>
-        <w:jc w:val="both"/>
-      </w:pPr>
-      <w:r>
-        <w:rPr/>
-        <w:t>- Tiếp cận phương pháp thiết kế phần mềm doanh nghiệp theo mô hình MVC, nâng cao tư duy thiết kế cơ sở dữ liệu và bảo mật ứng dụng Web.</w:t>
+        <w:t>- Giúp sinh viên hệ thống hóa và vận dụng thành thạo các kiến thức lý thuyết đã học trong học phần Công nghệ Java vào một sản phẩm thực tế có quy mô doanh nghiệp.</w:t>
+      </w:r>
+    </w:p>
+    <w:p>
+      <w:pPr>
+        <w:spacing w:before="0" w:after="80" w:line="360" w:lineRule="auto"/>
+        <w:ind w:firstLine="720" w:left="0"/>
+        <w:jc w:val="both"/>
+      </w:pPr>
+      <w:r>
+        <w:rPr/>
+        <w:t>- Làm chủ công nghệ phát triển Web hiện đại với Spring Boot – một trong những khung làm việc Java phổ biến và mạnh mẽ nhất trên thế giới hiện nay.</w:t>
+      </w:r>
+    </w:p>
+    <w:p>
+      <w:pPr>
+        <w:spacing w:before="0" w:after="80" w:line="360" w:lineRule="auto"/>
+        <w:ind w:firstLine="720" w:left="0"/>
+        <w:jc w:val="both"/>
+      </w:pPr>
+      <w:r>
+        <w:rPr/>
+        <w:t>- Nâng cao tư duy thiết kế phần mềm hướng đối tượng, tư duy thiết kế cơ sở dữ liệu quan hệ tối ưu và kỹ năng bảo mật ứng dụng Web với Spring Security.</w:t>
       </w:r>
     </w:p>
     <w:p>
@@ -2177,18 +2563,29 @@
       </w:pPr>
       <w:r>
         <w:rPr/>
-        <w:t>- Cung cấp một giải pháp phần mềm quản lý đại lý đồ gia dụng có tính ứng dụng thực tiễn cao, giúp các nhà kinh doanh số hóa quy trình quản lý đại lý và kênh bán hàng.</w:t>
-      </w:r>
-    </w:p>
-    <w:p>
-      <w:pPr>
-        <w:spacing w:before="0" w:after="80" w:line="360" w:lineRule="auto"/>
-        <w:ind w:firstLine="720" w:left="0"/>
-        <w:jc w:val="both"/>
-      </w:pPr>
-      <w:r>
-        <w:rPr/>
-        <w:t>- Tạo tiền đề vững chắc cho nhóm phát triển mở rộng ứng dụng thành hệ thống E-Commerce quy mô lớn thương mại hóa trong tương lai.</w:t>
+        <w:t>- Cung cấp một giải pháp phần mềm quản lý đại lý đồ gia dụng có tính thực tiễn cao, giúp các nhà kinh doanh và chủ đại lý dễ dàng số hóa quy trình quản lý bán hàng.</w:t>
+      </w:r>
+    </w:p>
+    <w:p>
+      <w:pPr>
+        <w:spacing w:before="0" w:after="80" w:line="360" w:lineRule="auto"/>
+        <w:ind w:firstLine="720" w:left="0"/>
+        <w:jc w:val="both"/>
+      </w:pPr>
+      <w:r>
+        <w:rPr/>
+        <w:t>- Tạo ra môi trường kết nối minh bạch giữa nhà phân phối, đại lý bán lẻ và người tiêu dùng đồ gia dụng; góp phần tiết kiệm chi phí vận hành và nâng cao năng suất kinh doanh.</w:t>
+      </w:r>
+    </w:p>
+    <w:p>
+      <w:pPr>
+        <w:spacing w:before="0" w:after="80" w:line="360" w:lineRule="auto"/>
+        <w:ind w:firstLine="720" w:left="0"/>
+        <w:jc w:val="both"/>
+      </w:pPr>
+      <w:r>
+        <w:rPr/>
+        <w:t>- Đóng vai trò là nền tảng vững chắc để nhóm phát triển tiếp tục mở rộng, tích hợp thêm các công nghệ tiên tiến (thanh toán điện tử, trí tuệ nhân tạo gợi ý sản phẩm) nhằm thương mại hóa sản phẩm trong tương lai.</w:t>
       </w:r>
     </w:p>
     <w:p>
@@ -2211,73 +2608,73 @@
       </w:pPr>
       <w:r>
         <w:rPr/>
-        <w:t>Báo cáo bài tập lớn được cấu trúc thành 5 chương chính cùng các phần bổ trợ như sau:</w:t>
-      </w:r>
-    </w:p>
-    <w:p>
-      <w:pPr>
-        <w:spacing w:before="0" w:after="80" w:line="360" w:lineRule="auto"/>
-        <w:ind w:firstLine="720" w:left="0"/>
-        <w:jc w:val="both"/>
-      </w:pPr>
-      <w:r>
-        <w:rPr/>
-        <w:t>- Lời mở đầu: Trình bày bối cảnh, lý do thực hiện đề tài và lời cảm ơn.</w:t>
-      </w:r>
-    </w:p>
-    <w:p>
-      <w:pPr>
-        <w:spacing w:before="0" w:after="80" w:line="360" w:lineRule="auto"/>
-        <w:ind w:firstLine="720" w:left="0"/>
-        <w:jc w:val="both"/>
-      </w:pPr>
-      <w:r>
-        <w:rPr/>
-        <w:t>- Chương 1: Tổng quan về đề tài: Giới thiệu lý do chọn đề tài, mục tiêu tổng quát và cụ thể, đối tượng và phạm vi nghiên cứu, phương pháp thực hiện, ý nghĩa đề tài và bố cục báo cáo.</w:t>
-      </w:r>
-    </w:p>
-    <w:p>
-      <w:pPr>
-        <w:spacing w:before="0" w:after="80" w:line="360" w:lineRule="auto"/>
-        <w:ind w:firstLine="720" w:left="0"/>
-        <w:jc w:val="both"/>
-      </w:pPr>
-      <w:r>
-        <w:rPr/>
-        <w:t>- Chương 2: Cơ sở lý thuyết: Giới thiệu tổng quan về thương mại điện tử, mô hình Multi-vendor, ngôn ngữ Java, Spring Boot Framework, Spring Security, Hibernate/JPA, Thymeleaf, MySQL và kiến trúc MVC.</w:t>
-      </w:r>
-    </w:p>
-    <w:p>
-      <w:pPr>
-        <w:spacing w:before="0" w:after="80" w:line="360" w:lineRule="auto"/>
-        <w:ind w:firstLine="720" w:left="0"/>
-        <w:jc w:val="both"/>
-      </w:pPr>
-      <w:r>
-        <w:rPr/>
-        <w:t>- Chương 3: Phân tích và thiết kế hệ thống: Khảo sát yêu cầu, phân tích tác nhân (Admin, Seller, Customer), yêu cầu chức năng/phi chức năng, sơ đồ Use Case và thiết kế cơ sở dữ liệu ERD.</w:t>
-      </w:r>
-    </w:p>
-    <w:p>
-      <w:pPr>
-        <w:spacing w:before="0" w:after="80" w:line="360" w:lineRule="auto"/>
-        <w:ind w:firstLine="720" w:left="0"/>
-        <w:jc w:val="both"/>
-      </w:pPr>
-      <w:r>
-        <w:rPr/>
-        <w:t>- Chương 4: Cài đặt và triển khai hệ thống: Mô tả cấu trúc dự án Java, hiện thực các dịch vụ cốt lõi, minh họa giao diện điều khiển và các chức năng chính của chương trình.</w:t>
-      </w:r>
-    </w:p>
-    <w:p>
-      <w:pPr>
-        <w:spacing w:before="0" w:after="80" w:line="360" w:lineRule="auto"/>
-        <w:ind w:firstLine="720" w:left="0"/>
-        <w:jc w:val="both"/>
-      </w:pPr>
-      <w:r>
-        <w:rPr/>
-        <w:t>- Chương 5: Kết luận và hướng phát triển: Tổng kết các kết quả đã đạt được của đề tài, thẳng thắn nhìn nhận những mặt hạn chế và đề xuất các hướng nâng cấp phát triển trong tương lai.</w:t>
+        <w:t>Báo cáo bài tập lớn học phần Công nghệ Java với đề tài "Xây dựng phần mềm quản lý đại lý kinh doanh đồ gia dụng" được cấu trúc thành 5 chương chính cùng các phần bổ trợ theo thứ tự logic như sau:</w:t>
+      </w:r>
+    </w:p>
+    <w:p>
+      <w:pPr>
+        <w:spacing w:before="0" w:after="80" w:line="360" w:lineRule="auto"/>
+        <w:ind w:firstLine="720" w:left="0"/>
+        <w:jc w:val="both"/>
+      </w:pPr>
+      <w:r>
+        <w:rPr/>
+        <w:t>- Lời mở đầu: Trình bày bối cảnh chung, lý do lựa chọn đề tài, lời cảm ơn gửi tới Giảng viên hướng dẫn và tập thể lớp.</w:t>
+      </w:r>
+    </w:p>
+    <w:p>
+      <w:pPr>
+        <w:spacing w:before="0" w:after="80" w:line="360" w:lineRule="auto"/>
+        <w:ind w:firstLine="720" w:left="0"/>
+        <w:jc w:val="both"/>
+      </w:pPr>
+      <w:r>
+        <w:rPr/>
+        <w:t>- Chương 1: Tổng quan về đề tài: Giới thiệu toàn diện về lý do chọn đề tài, mục tiêu tổng quát và cụ thể, đối tượng và phạm vi nghiên cứu, phương pháp thực hiện, ý nghĩa khoa học - thực tiễn và bố cục chung của báo cáo.</w:t>
+      </w:r>
+    </w:p>
+    <w:p>
+      <w:pPr>
+        <w:spacing w:before="0" w:after="80" w:line="360" w:lineRule="auto"/>
+        <w:ind w:firstLine="720" w:left="0"/>
+        <w:jc w:val="both"/>
+      </w:pPr>
+      <w:r>
+        <w:rPr/>
+        <w:t>- Chương 2: Cơ sở lý thuyết: Trình bày chi tiết nền tảng lý thuyết về thương mại điện tử, mô hình Multi-vendor Marketplace, ngôn ngữ Java, Spring Boot Framework, Spring Security, Spring Data JPA / Hibernate ORM, Thymeleaf Template Engine, hệ quản trị cơ sở dữ liệu MySQL và mô hình kiến trúc MVC.</w:t>
+      </w:r>
+    </w:p>
+    <w:p>
+      <w:pPr>
+        <w:spacing w:before="0" w:after="80" w:line="360" w:lineRule="auto"/>
+        <w:ind w:firstLine="720" w:left="0"/>
+        <w:jc w:val="both"/>
+      </w:pPr>
+      <w:r>
+        <w:rPr/>
+        <w:t>- Chương 3: Phân tích và thiết kế hệ thống: Trình bày kết quả khảo sát yêu cầu hệ thống, phân tích các tác nhân (Admin, Seller, Customer), chi tiết các yêu cầu chức năng và phi chức năng, sơ đồ Use Case và thiết kế mô hình cơ sở dữ liệu ERD chuẩn 3NF.</w:t>
+      </w:r>
+    </w:p>
+    <w:p>
+      <w:pPr>
+        <w:spacing w:before="0" w:after="80" w:line="360" w:lineRule="auto"/>
+        <w:ind w:firstLine="720" w:left="0"/>
+        <w:jc w:val="both"/>
+      </w:pPr>
+      <w:r>
+        <w:rPr/>
+        <w:t>- Chương 4: Cài đặt và triển khai hệ thống: Mô tả chi tiết cấu trúc thư mục dự án Java Spring Boot, hiện thực các dịch vụ cốt lõi, minh họa giao diện và kết quả hoạt động của các phân hệ Admin, Seller và Customer.</w:t>
+      </w:r>
+    </w:p>
+    <w:p>
+      <w:pPr>
+        <w:spacing w:before="0" w:after="80" w:line="360" w:lineRule="auto"/>
+        <w:ind w:firstLine="720" w:left="0"/>
+        <w:jc w:val="both"/>
+      </w:pPr>
+      <w:r>
+        <w:rPr/>
+        <w:t>- Chương 5: Kết luận và hướng phát triển: Tổng kết những kết quả đã đạt được của đề tài, thẳng thắn đánh giá các mặt hạn chế còn tồn tại và đề xuất các hướng nâng cấp, hoàn thiện phần mềm trong tương lai.</w:t>
       </w:r>
     </w:p>
     <w:sectPr>

</xml_diff>

<commit_message>
docs: restore Lời mở đầu section before Chapter 1
</commit_message>
<xml_diff>
--- a/DeTaiCNJ18_Nhom7.docx
+++ b/DeTaiCNJ18_Nhom7.docx
@@ -1416,6 +1416,105 @@
       </w:r>
       <w:r>
         <w:fldChar w:fldCharType="end"/>
+      </w:r>
+    </w:p>
+    <w:p>
+      <w:pPr>
+        <w:pStyle w:val="2"/>
+        <w:spacing w:before="240" w:after="240" w:line="360" w:lineRule="auto"/>
+        <w:ind w:firstLine="0" w:left="0"/>
+        <w:jc w:val="center"/>
+      </w:pPr>
+      <w:r>
+        <w:rPr/>
+        <w:t>LỜI MỞ ĐẦU</w:t>
+      </w:r>
+    </w:p>
+    <w:p>
+      <w:pPr>
+        <w:spacing w:before="0" w:after="120" w:line="360" w:lineRule="auto"/>
+        <w:ind w:firstLine="720" w:left="0"/>
+        <w:jc w:val="both"/>
+      </w:pPr>
+      <w:r>
+        <w:rPr>
+          <w:i w:val="0"/>
+        </w:rPr>
+        <w:t>Trong kỷ nguyên số hóa và sự phát triển vượt bậc của Đô thị hóa hiện đại, thương mại điện tử (E-Commerce) đã trở thành một thành tố không thể thiếu trong hạ tầng kinh tế toàn cầu. Việc ứng dụng Công nghệ thông tin vào quản lý kênh phân phối, quản lý đại lý và tối ưu hóa quy trình bán hàng trực tuyến đóng vai trò quyết định tới năng lực cạnh tranh của các doanh nghiệp. Trong đó, ngành kinh doanh đồ gia dụng – bao gồm các sản phẩm thiết yếu phục vụ đời sống gia đình, thiết bị nhà bếp, thiết bị điện và chăm sóc không gian sống – là một trong những lĩnh vực có tốc độ tăng trưởng quy mô thị trường vô cùng mạnh mẽ.</w:t>
+      </w:r>
+    </w:p>
+    <w:p>
+      <w:pPr>
+        <w:spacing w:before="0" w:after="120" w:line="360" w:lineRule="auto"/>
+        <w:ind w:firstLine="720" w:left="0"/>
+        <w:jc w:val="both"/>
+      </w:pPr>
+      <w:r>
+        <w:rPr>
+          <w:i w:val="0"/>
+        </w:rPr>
+        <w:t>Tuy nhiên, phương thức quản lý đại lý kinh doanh đồ gia dụng truyền thống đang bộc lộ nhiều hạn chế bất cập như: dữ liệu tồn kho phân tán, quản lý đơn hàng thủ công dễ gây ra sai sót, thông tin giữa nhà sản xuất/nhà phân phối và các đại lý bán lẻ thiếu tính đồng bộ tức thời, cũng như khó khăn trong việc theo dõi doanh thu và đánh giá hiệu quả kinh doanh. Xuất phát từ nhu cầu thực tiễn đó, việc nghiên cứu và phát triển một giải pháp phần mềm quản lý đại lý kinh doanh đồ gia dụng trực tuyến hiện đại, ứng dụng mô hình đa nhà bán hàng (Multi-vendor Marketplace) là vô cùng cần thiết.</w:t>
+      </w:r>
+    </w:p>
+    <w:p>
+      <w:pPr>
+        <w:spacing w:before="0" w:after="120" w:line="360" w:lineRule="auto"/>
+        <w:ind w:firstLine="720" w:left="0"/>
+        <w:jc w:val="both"/>
+      </w:pPr>
+      <w:r>
+        <w:rPr>
+          <w:i w:val="0"/>
+        </w:rPr>
+        <w:t>Nghiên cứu bài tập lớn học phần Công nghệ Java với đề tài: "Xây dựng phần mềm quản lý đại lý kinh doanh đồ gia dụng" (Đề tài CNJ18) được triển khai nhằm giải quyết bài toán trên. Hệ thống được xây dựng dựa trên nền tảng công nghệ mạnh mẽ và phổ biến bậc nhất hiện nay: Java Spring Boot Framework, kết hợp với Spring Data JPA, Spring Security, Thymeleaf Template Engine và Hệ quản trị cơ sở dữ liệu MySQL. Phần mềm cung cấp giải pháp toàn diện hỗ trợ 3 nhóm tác nhân chính: Quản trị viên (Admin), Nhà bán hàng/Đại lý (Seller/Vendor) và Khách hàng (Customer).</w:t>
+      </w:r>
+    </w:p>
+    <w:p>
+      <w:pPr>
+        <w:spacing w:before="0" w:after="120" w:line="360" w:lineRule="auto"/>
+        <w:ind w:firstLine="720" w:left="0"/>
+        <w:jc w:val="both"/>
+      </w:pPr>
+      <w:r>
+        <w:rPr>
+          <w:i w:val="0"/>
+        </w:rPr>
+        <w:t>Trong quá trình nghiên cứu và thực hiện bài tập lớn, Nhóm 7 đã nỗ lực vận dụng các kiến thức đã học cùng sự tìm tòi, nghiên cứu tài liệu thực tế để hoàn thành báo cáo và phần mềm. Nhóm xin gửi lời cảm ơn chân thành và sâu sắc nhất tới Thầy giáo hướng dẫn Trần Bá Hùng – Giảng viên Khoa Công nghệ Thông tin, Trường Đại học Công nghệ Đông Á. Sự hướng dẫn tận tình, những góp ý chuyên môn quý báu của Thầy chính là kim chỉ nam giúp Nhóm định hướng đúng đắn và hoàn thành tốt đề tài này.</w:t>
+      </w:r>
+    </w:p>
+    <w:p>
+      <w:pPr>
+        <w:spacing w:before="0" w:after="120" w:line="360" w:lineRule="auto"/>
+        <w:ind w:firstLine="720" w:left="0"/>
+        <w:jc w:val="both"/>
+      </w:pPr>
+      <w:r>
+        <w:rPr>
+          <w:i w:val="0"/>
+        </w:rPr>
+        <w:t>Dù đã cố gắng hết sức để hoàn thiện báo cáo và chương trình một cách chỉn chu nhất, song do hạn chế về mặt thời gian cũng như kinh nghiệm thực tiễn, đề tài khó tránh khỏi những thiếu sót nhất định. Nhóm rất mong nhận được những ý kiến đóng góp, nhận xét quý báu từ Thầy giáo cùng các bạn sinh viên để đề tài ngày càng được hoàn thiện và có tính ứng dụng cao hơn.</w:t>
+      </w:r>
+    </w:p>
+    <w:p>
+      <w:pPr>
+        <w:spacing w:before="0" w:after="120" w:line="360" w:lineRule="auto"/>
+        <w:ind w:firstLine="720" w:left="0"/>
+        <w:jc w:val="both"/>
+      </w:pPr>
+      <w:r>
+        <w:rPr>
+          <w:i/>
+        </w:rPr>
+        <w:t>Nhóm sinh viên thực hiện – Nhóm 7.</w:t>
+      </w:r>
+    </w:p>
+    <w:p>
+      <w:pPr>
+        <w:spacing w:before="0" w:after="0"/>
+        <w:ind w:firstLine="0"/>
+      </w:pPr>
+      <w:r>
+        <w:br w:type="page"/>
       </w:r>
     </w:p>
     <w:p>

</xml_diff>

<commit_message>
docs: remove section 1.6 and expand Chapter 1 content up to 18 pages
</commit_message>
<xml_diff>
--- a/DeTaiCNJ18_Nhom7.docx
+++ b/DeTaiCNJ18_Nhom7.docx
@@ -1321,11 +1321,13 @@
       </w:pPr>
       <w:bookmarkStart w:id="0" w:name="_Toc24751"/>
       <w:bookmarkStart w:id="1" w:name="_Toc9811"/>
+      <w:bookmarkStart w:id="2" w:name="_Toc36"/>
       <w:r>
         <w:t>MỤC LỤC</w:t>
       </w:r>
       <w:bookmarkEnd w:id="0"/>
       <w:bookmarkEnd w:id="1"/>
+      <w:bookmarkEnd w:id="2"/>
     </w:p>
     <w:p>
       <w:pPr>
@@ -1347,7 +1349,7 @@
         <w:fldChar w:fldCharType="begin"/>
       </w:r>
       <w:r>
-        <w:instrText xml:space="preserve"> HYPERLINK \l _Toc9811 </w:instrText>
+        <w:instrText xml:space="preserve"> HYPERLINK \l _Toc36 </w:instrText>
       </w:r>
       <w:r>
         <w:fldChar w:fldCharType="separate"/>
@@ -1362,7 +1364,7 @@
         <w:fldChar w:fldCharType="begin"/>
       </w:r>
       <w:r>
-        <w:instrText xml:space="preserve"> PAGEREF _Toc9811 \h </w:instrText>
+        <w:instrText xml:space="preserve"> PAGEREF _Toc36 \h </w:instrText>
       </w:r>
       <w:r>
         <w:fldChar w:fldCharType="separate"/>
@@ -1388,7 +1390,7 @@
         <w:fldChar w:fldCharType="begin"/>
       </w:r>
       <w:r>
-        <w:instrText xml:space="preserve"> HYPERLINK \l _Toc31655 </w:instrText>
+        <w:instrText xml:space="preserve"> HYPERLINK \l _Toc21493 </w:instrText>
       </w:r>
       <w:r>
         <w:fldChar w:fldCharType="separate"/>
@@ -1403,7 +1405,7 @@
         <w:fldChar w:fldCharType="begin"/>
       </w:r>
       <w:r>
-        <w:instrText xml:space="preserve"> PAGEREF _Toc31655 \h </w:instrText>
+        <w:instrText xml:space="preserve"> PAGEREF _Toc21493 \h </w:instrText>
       </w:r>
       <w:r>
         <w:fldChar w:fldCharType="separate"/>
@@ -1416,6 +1418,761 @@
       </w:r>
       <w:r>
         <w:fldChar w:fldCharType="end"/>
+      </w:r>
+    </w:p>
+    <w:p>
+      <w:pPr>
+        <w:pStyle w:val="15"/>
+        <w:tabs>
+          <w:tab w:val="right" w:leader="dot" w:pos="8800"/>
+        </w:tabs>
+      </w:pPr>
+      <w:r>
+        <w:fldChar w:fldCharType="begin"/>
+      </w:r>
+      <w:r>
+        <w:instrText xml:space="preserve"> HYPERLINK \l _Toc9666 </w:instrText>
+      </w:r>
+      <w:r>
+        <w:fldChar w:fldCharType="separate"/>
+      </w:r>
+      <w:r>
+        <w:t>CHƯƠNG 1: TỔNG QUAN VỀ ĐỀ TÀI</w:t>
+      </w:r>
+      <w:r>
+        <w:tab/>
+      </w:r>
+      <w:r>
+        <w:fldChar w:fldCharType="begin"/>
+      </w:r>
+      <w:r>
+        <w:instrText xml:space="preserve"> PAGEREF _Toc9666 \h </w:instrText>
+      </w:r>
+      <w:r>
+        <w:fldChar w:fldCharType="separate"/>
+      </w:r>
+      <w:r>
+        <w:t>5</w:t>
+      </w:r>
+      <w:r>
+        <w:fldChar w:fldCharType="end"/>
+      </w:r>
+      <w:r>
+        <w:fldChar w:fldCharType="end"/>
+      </w:r>
+    </w:p>
+    <w:p>
+      <w:pPr>
+        <w:pStyle w:val="15"/>
+        <w:tabs>
+          <w:tab w:val="right" w:leader="dot" w:pos="8800"/>
+        </w:tabs>
+      </w:pPr>
+      <w:r>
+        <w:fldChar w:fldCharType="begin"/>
+      </w:r>
+      <w:r>
+        <w:instrText xml:space="preserve"> HYPERLINK \l _Toc13257 </w:instrText>
+      </w:r>
+      <w:r>
+        <w:fldChar w:fldCharType="separate"/>
+      </w:r>
+      <w:r>
+        <w:t>1.1. Lý do chọn đề tài</w:t>
+      </w:r>
+      <w:r>
+        <w:tab/>
+      </w:r>
+      <w:r>
+        <w:fldChar w:fldCharType="begin"/>
+      </w:r>
+      <w:r>
+        <w:instrText xml:space="preserve"> PAGEREF _Toc13257 \h </w:instrText>
+      </w:r>
+      <w:r>
+        <w:fldChar w:fldCharType="separate"/>
+      </w:r>
+      <w:r>
+        <w:t>5</w:t>
+      </w:r>
+      <w:r>
+        <w:fldChar w:fldCharType="end"/>
+      </w:r>
+      <w:r>
+        <w:fldChar w:fldCharType="end"/>
+      </w:r>
+    </w:p>
+    <w:p>
+      <w:pPr>
+        <w:pStyle w:val="15"/>
+        <w:tabs>
+          <w:tab w:val="right" w:leader="dot" w:pos="8800"/>
+        </w:tabs>
+      </w:pPr>
+      <w:r>
+        <w:fldChar w:fldCharType="begin"/>
+      </w:r>
+      <w:r>
+        <w:instrText xml:space="preserve"> HYPERLINK \l _Toc32223 </w:instrText>
+      </w:r>
+      <w:r>
+        <w:fldChar w:fldCharType="separate"/>
+      </w:r>
+      <w:r>
+        <w:t>1.2. Mục tiêu của đề tài</w:t>
+      </w:r>
+      <w:r>
+        <w:tab/>
+      </w:r>
+      <w:r>
+        <w:fldChar w:fldCharType="begin"/>
+      </w:r>
+      <w:r>
+        <w:instrText xml:space="preserve"> PAGEREF _Toc32223 \h </w:instrText>
+      </w:r>
+      <w:r>
+        <w:fldChar w:fldCharType="separate"/>
+      </w:r>
+      <w:r>
+        <w:t>8</w:t>
+      </w:r>
+      <w:r>
+        <w:fldChar w:fldCharType="end"/>
+      </w:r>
+      <w:r>
+        <w:fldChar w:fldCharType="end"/>
+      </w:r>
+    </w:p>
+    <w:p>
+      <w:pPr>
+        <w:pStyle w:val="16"/>
+        <w:tabs>
+          <w:tab w:val="right" w:leader="dot" w:pos="8800"/>
+        </w:tabs>
+      </w:pPr>
+      <w:r>
+        <w:fldChar w:fldCharType="begin"/>
+      </w:r>
+      <w:r>
+        <w:instrText xml:space="preserve"> HYPERLINK \l _Toc1999 </w:instrText>
+      </w:r>
+      <w:r>
+        <w:fldChar w:fldCharType="separate"/>
+      </w:r>
+      <w:r>
+        <w:t>1.2.1. Mục tiêu tổng quát</w:t>
+      </w:r>
+      <w:r>
+        <w:tab/>
+      </w:r>
+      <w:r>
+        <w:fldChar w:fldCharType="begin"/>
+      </w:r>
+      <w:r>
+        <w:instrText xml:space="preserve"> PAGEREF _Toc1999 \h </w:instrText>
+      </w:r>
+      <w:r>
+        <w:fldChar w:fldCharType="separate"/>
+      </w:r>
+      <w:r>
+        <w:t>8</w:t>
+      </w:r>
+      <w:r>
+        <w:fldChar w:fldCharType="end"/>
+      </w:r>
+      <w:r>
+        <w:fldChar w:fldCharType="end"/>
+      </w:r>
+    </w:p>
+    <w:p>
+      <w:pPr>
+        <w:pStyle w:val="16"/>
+        <w:tabs>
+          <w:tab w:val="right" w:leader="dot" w:pos="8800"/>
+        </w:tabs>
+      </w:pPr>
+      <w:r>
+        <w:fldChar w:fldCharType="begin"/>
+      </w:r>
+      <w:r>
+        <w:instrText xml:space="preserve"> HYPERLINK \l _Toc9044 </w:instrText>
+      </w:r>
+      <w:r>
+        <w:fldChar w:fldCharType="separate"/>
+      </w:r>
+      <w:r>
+        <w:t>1.2.2. Mục tiêu cụ thể</w:t>
+      </w:r>
+      <w:r>
+        <w:tab/>
+      </w:r>
+      <w:r>
+        <w:fldChar w:fldCharType="begin"/>
+      </w:r>
+      <w:r>
+        <w:instrText xml:space="preserve"> PAGEREF _Toc9044 \h </w:instrText>
+      </w:r>
+      <w:r>
+        <w:fldChar w:fldCharType="separate"/>
+      </w:r>
+      <w:r>
+        <w:t>9</w:t>
+      </w:r>
+      <w:r>
+        <w:fldChar w:fldCharType="end"/>
+      </w:r>
+      <w:r>
+        <w:fldChar w:fldCharType="end"/>
+      </w:r>
+    </w:p>
+    <w:p>
+      <w:pPr>
+        <w:pStyle w:val="15"/>
+        <w:tabs>
+          <w:tab w:val="right" w:leader="dot" w:pos="8800"/>
+        </w:tabs>
+      </w:pPr>
+      <w:r>
+        <w:fldChar w:fldCharType="begin"/>
+      </w:r>
+      <w:r>
+        <w:instrText xml:space="preserve"> HYPERLINK \l _Toc3830 </w:instrText>
+      </w:r>
+      <w:r>
+        <w:fldChar w:fldCharType="separate"/>
+      </w:r>
+      <w:r>
+        <w:t>1.3. Đối tượng và phạm vi nghiên cứu</w:t>
+      </w:r>
+      <w:r>
+        <w:tab/>
+      </w:r>
+      <w:r>
+        <w:fldChar w:fldCharType="begin"/>
+      </w:r>
+      <w:r>
+        <w:instrText xml:space="preserve"> PAGEREF _Toc3830 \h </w:instrText>
+      </w:r>
+      <w:r>
+        <w:fldChar w:fldCharType="separate"/>
+      </w:r>
+      <w:r>
+        <w:t>10</w:t>
+      </w:r>
+      <w:r>
+        <w:fldChar w:fldCharType="end"/>
+      </w:r>
+      <w:r>
+        <w:fldChar w:fldCharType="end"/>
+      </w:r>
+    </w:p>
+    <w:p>
+      <w:pPr>
+        <w:pStyle w:val="16"/>
+        <w:tabs>
+          <w:tab w:val="right" w:leader="dot" w:pos="8800"/>
+        </w:tabs>
+      </w:pPr>
+      <w:r>
+        <w:fldChar w:fldCharType="begin"/>
+      </w:r>
+      <w:r>
+        <w:instrText xml:space="preserve"> HYPERLINK \l _Toc4844 </w:instrText>
+      </w:r>
+      <w:r>
+        <w:fldChar w:fldCharType="separate"/>
+      </w:r>
+      <w:r>
+        <w:t>1.3.1. Đối tượng nghiên cứu</w:t>
+      </w:r>
+      <w:r>
+        <w:tab/>
+      </w:r>
+      <w:r>
+        <w:fldChar w:fldCharType="begin"/>
+      </w:r>
+      <w:r>
+        <w:instrText xml:space="preserve"> PAGEREF _Toc4844 \h </w:instrText>
+      </w:r>
+      <w:r>
+        <w:fldChar w:fldCharType="separate"/>
+      </w:r>
+      <w:r>
+        <w:t>10</w:t>
+      </w:r>
+      <w:r>
+        <w:fldChar w:fldCharType="end"/>
+      </w:r>
+      <w:r>
+        <w:fldChar w:fldCharType="end"/>
+      </w:r>
+    </w:p>
+    <w:p>
+      <w:pPr>
+        <w:pStyle w:val="16"/>
+        <w:tabs>
+          <w:tab w:val="right" w:leader="dot" w:pos="8800"/>
+        </w:tabs>
+      </w:pPr>
+      <w:r>
+        <w:fldChar w:fldCharType="begin"/>
+      </w:r>
+      <w:r>
+        <w:instrText xml:space="preserve"> HYPERLINK \l _Toc28201 </w:instrText>
+      </w:r>
+      <w:r>
+        <w:fldChar w:fldCharType="separate"/>
+      </w:r>
+      <w:r>
+        <w:t>1.3.2. Phạm vi nghiên cứu</w:t>
+      </w:r>
+      <w:r>
+        <w:tab/>
+      </w:r>
+      <w:r>
+        <w:fldChar w:fldCharType="begin"/>
+      </w:r>
+      <w:r>
+        <w:instrText xml:space="preserve"> PAGEREF _Toc28201 \h </w:instrText>
+      </w:r>
+      <w:r>
+        <w:fldChar w:fldCharType="separate"/>
+      </w:r>
+      <w:r>
+        <w:t>11</w:t>
+      </w:r>
+      <w:r>
+        <w:fldChar w:fldCharType="end"/>
+      </w:r>
+      <w:r>
+        <w:fldChar w:fldCharType="end"/>
+      </w:r>
+    </w:p>
+    <w:p>
+      <w:pPr>
+        <w:pStyle w:val="15"/>
+        <w:tabs>
+          <w:tab w:val="right" w:leader="dot" w:pos="8800"/>
+        </w:tabs>
+      </w:pPr>
+      <w:r>
+        <w:fldChar w:fldCharType="begin"/>
+      </w:r>
+      <w:r>
+        <w:instrText xml:space="preserve"> HYPERLINK \l _Toc13319 </w:instrText>
+      </w:r>
+      <w:r>
+        <w:fldChar w:fldCharType="separate"/>
+      </w:r>
+      <w:r>
+        <w:t>1.4. Phương pháp thực hiện</w:t>
+      </w:r>
+      <w:r>
+        <w:tab/>
+      </w:r>
+      <w:r>
+        <w:fldChar w:fldCharType="begin"/>
+      </w:r>
+      <w:r>
+        <w:instrText xml:space="preserve"> PAGEREF _Toc13319 \h </w:instrText>
+      </w:r>
+      <w:r>
+        <w:fldChar w:fldCharType="separate"/>
+      </w:r>
+      <w:r>
+        <w:t>11</w:t>
+      </w:r>
+      <w:r>
+        <w:fldChar w:fldCharType="end"/>
+      </w:r>
+      <w:r>
+        <w:fldChar w:fldCharType="end"/>
+      </w:r>
+    </w:p>
+    <w:p>
+      <w:pPr>
+        <w:pStyle w:val="16"/>
+        <w:tabs>
+          <w:tab w:val="right" w:leader="dot" w:pos="8800"/>
+        </w:tabs>
+      </w:pPr>
+      <w:r>
+        <w:fldChar w:fldCharType="begin"/>
+      </w:r>
+      <w:r>
+        <w:instrText xml:space="preserve"> HYPERLINK \l _Toc29919 </w:instrText>
+      </w:r>
+      <w:r>
+        <w:fldChar w:fldCharType="separate"/>
+      </w:r>
+      <w:r>
+        <w:t>1.4.1. Phương pháp nghiên cứu lý thuyết</w:t>
+      </w:r>
+      <w:r>
+        <w:tab/>
+      </w:r>
+      <w:r>
+        <w:fldChar w:fldCharType="begin"/>
+      </w:r>
+      <w:r>
+        <w:instrText xml:space="preserve"> PAGEREF _Toc29919 \h </w:instrText>
+      </w:r>
+      <w:r>
+        <w:fldChar w:fldCharType="separate"/>
+      </w:r>
+      <w:r>
+        <w:t>11</w:t>
+      </w:r>
+      <w:r>
+        <w:fldChar w:fldCharType="end"/>
+      </w:r>
+      <w:r>
+        <w:fldChar w:fldCharType="end"/>
+      </w:r>
+    </w:p>
+    <w:p>
+      <w:pPr>
+        <w:pStyle w:val="16"/>
+        <w:tabs>
+          <w:tab w:val="right" w:leader="dot" w:pos="8800"/>
+        </w:tabs>
+      </w:pPr>
+      <w:r>
+        <w:fldChar w:fldCharType="begin"/>
+      </w:r>
+      <w:r>
+        <w:instrText xml:space="preserve"> HYPERLINK \l _Toc28526 </w:instrText>
+      </w:r>
+      <w:r>
+        <w:fldChar w:fldCharType="separate"/>
+      </w:r>
+      <w:r>
+        <w:t>1.4.2. Phương pháp phân tích và thiết kế hệ thống</w:t>
+      </w:r>
+      <w:r>
+        <w:tab/>
+      </w:r>
+      <w:r>
+        <w:fldChar w:fldCharType="begin"/>
+      </w:r>
+      <w:r>
+        <w:instrText xml:space="preserve"> PAGEREF _Toc28526 \h </w:instrText>
+      </w:r>
+      <w:r>
+        <w:fldChar w:fldCharType="separate"/>
+      </w:r>
+      <w:r>
+        <w:t>12</w:t>
+      </w:r>
+      <w:r>
+        <w:fldChar w:fldCharType="end"/>
+      </w:r>
+      <w:r>
+        <w:fldChar w:fldCharType="end"/>
+      </w:r>
+    </w:p>
+    <w:p>
+      <w:pPr>
+        <w:pStyle w:val="16"/>
+        <w:tabs>
+          <w:tab w:val="right" w:leader="dot" w:pos="8800"/>
+        </w:tabs>
+      </w:pPr>
+      <w:r>
+        <w:fldChar w:fldCharType="begin"/>
+      </w:r>
+      <w:r>
+        <w:instrText xml:space="preserve"> HYPERLINK \l _Toc11047 </w:instrText>
+      </w:r>
+      <w:r>
+        <w:fldChar w:fldCharType="separate"/>
+      </w:r>
+      <w:r>
+        <w:t>1.4.3. Phương pháp thực nghiệm và phát triển phần mềm</w:t>
+      </w:r>
+      <w:r>
+        <w:tab/>
+      </w:r>
+      <w:r>
+        <w:fldChar w:fldCharType="begin"/>
+      </w:r>
+      <w:r>
+        <w:instrText xml:space="preserve"> PAGEREF _Toc11047 \h </w:instrText>
+      </w:r>
+      <w:r>
+        <w:fldChar w:fldCharType="separate"/>
+      </w:r>
+      <w:r>
+        <w:t>12</w:t>
+      </w:r>
+      <w:r>
+        <w:fldChar w:fldCharType="end"/>
+      </w:r>
+      <w:r>
+        <w:fldChar w:fldCharType="end"/>
+      </w:r>
+    </w:p>
+    <w:p>
+      <w:pPr>
+        <w:pStyle w:val="15"/>
+        <w:tabs>
+          <w:tab w:val="right" w:leader="dot" w:pos="8800"/>
+        </w:tabs>
+      </w:pPr>
+      <w:r>
+        <w:fldChar w:fldCharType="begin"/>
+      </w:r>
+      <w:r>
+        <w:instrText xml:space="preserve"> HYPERLINK \l _Toc3517 </w:instrText>
+      </w:r>
+      <w:r>
+        <w:fldChar w:fldCharType="separate"/>
+      </w:r>
+      <w:r>
+        <w:t>1.5. Ý nghĩa của đề tài</w:t>
+      </w:r>
+      <w:r>
+        <w:tab/>
+      </w:r>
+      <w:r>
+        <w:fldChar w:fldCharType="begin"/>
+      </w:r>
+      <w:r>
+        <w:instrText xml:space="preserve"> PAGEREF _Toc3517 \h </w:instrText>
+      </w:r>
+      <w:r>
+        <w:fldChar w:fldCharType="separate"/>
+      </w:r>
+      <w:r>
+        <w:t>13</w:t>
+      </w:r>
+      <w:r>
+        <w:fldChar w:fldCharType="end"/>
+      </w:r>
+      <w:r>
+        <w:fldChar w:fldCharType="end"/>
+      </w:r>
+    </w:p>
+    <w:p>
+      <w:pPr>
+        <w:pStyle w:val="16"/>
+        <w:tabs>
+          <w:tab w:val="right" w:leader="dot" w:pos="8800"/>
+        </w:tabs>
+      </w:pPr>
+      <w:r>
+        <w:fldChar w:fldCharType="begin"/>
+      </w:r>
+      <w:r>
+        <w:instrText xml:space="preserve"> HYPERLINK \l _Toc7404 </w:instrText>
+      </w:r>
+      <w:r>
+        <w:fldChar w:fldCharType="separate"/>
+      </w:r>
+      <w:r>
+        <w:t>1.5.1. Ý nghĩa khoa học và công nghệ</w:t>
+      </w:r>
+      <w:r>
+        <w:tab/>
+      </w:r>
+      <w:r>
+        <w:fldChar w:fldCharType="begin"/>
+      </w:r>
+      <w:r>
+        <w:instrText xml:space="preserve"> PAGEREF _Toc7404 \h </w:instrText>
+      </w:r>
+      <w:r>
+        <w:fldChar w:fldCharType="separate"/>
+      </w:r>
+      <w:r>
+        <w:t>13</w:t>
+      </w:r>
+      <w:r>
+        <w:fldChar w:fldCharType="end"/>
+      </w:r>
+      <w:r>
+        <w:fldChar w:fldCharType="end"/>
+      </w:r>
+    </w:p>
+    <w:p>
+      <w:pPr>
+        <w:pStyle w:val="16"/>
+        <w:tabs>
+          <w:tab w:val="right" w:leader="dot" w:pos="8800"/>
+        </w:tabs>
+      </w:pPr>
+      <w:r>
+        <w:fldChar w:fldCharType="begin"/>
+      </w:r>
+      <w:r>
+        <w:instrText xml:space="preserve"> HYPERLINK \l _Toc8705 </w:instrText>
+      </w:r>
+      <w:r>
+        <w:fldChar w:fldCharType="separate"/>
+      </w:r>
+      <w:r>
+        <w:t>1.5.2. Ý nghĩa thực tiễn</w:t>
+      </w:r>
+      <w:r>
+        <w:tab/>
+      </w:r>
+      <w:r>
+        <w:fldChar w:fldCharType="begin"/>
+      </w:r>
+      <w:r>
+        <w:instrText xml:space="preserve"> PAGEREF _Toc8705 \h </w:instrText>
+      </w:r>
+      <w:r>
+        <w:fldChar w:fldCharType="separate"/>
+      </w:r>
+      <w:r>
+        <w:t>13</w:t>
+      </w:r>
+      <w:r>
+        <w:fldChar w:fldCharType="end"/>
+      </w:r>
+      <w:r>
+        <w:fldChar w:fldCharType="end"/>
+      </w:r>
+    </w:p>
+    <w:p>
+      <w:pPr>
+        <w:pStyle w:val="15"/>
+        <w:tabs>
+          <w:tab w:val="right" w:leader="dot" w:pos="8800"/>
+        </w:tabs>
+      </w:pPr>
+      <w:r>
+        <w:fldChar w:fldCharType="begin"/>
+      </w:r>
+      <w:r>
+        <w:instrText xml:space="preserve"> HYPERLINK \l _Toc13449 </w:instrText>
+      </w:r>
+      <w:r>
+        <w:fldChar w:fldCharType="separate"/>
+      </w:r>
+      <w:r>
+        <w:t>1.6. Bố cục báo cáo</w:t>
+      </w:r>
+      <w:bookmarkStart w:id="20" w:name="_GoBack"/>
+      <w:bookmarkEnd w:id="20"/>
+      <w:r>
+        <w:tab/>
+      </w:r>
+      <w:r>
+        <w:fldChar w:fldCharType="begin"/>
+      </w:r>
+      <w:r>
+        <w:instrText xml:space="preserve"> PAGEREF _Toc13449 \h </w:instrText>
+      </w:r>
+      <w:r>
+        <w:fldChar w:fldCharType="separate"/>
+      </w:r>
+      <w:r>
+        <w:t>13</w:t>
+      </w:r>
+      <w:r>
+        <w:fldChar w:fldCharType="end"/>
+      </w:r>
+      <w:r>
+        <w:fldChar w:fldCharType="end"/>
+      </w:r>
+    </w:p>
+    <w:p>
+      <w:r>
+        <w:fldChar w:fldCharType="end"/>
+      </w:r>
+    </w:p>
+    <w:p>
+      <w:r>
+        <w:br w:type="page"/>
+      </w:r>
+    </w:p>
+    <w:p>
+      <w:pPr>
+        <w:pStyle w:val="2"/>
+        <w:spacing w:before="240" w:after="240" w:line="360" w:lineRule="auto"/>
+        <w:ind w:left="0" w:firstLine="0"/>
+        <w:jc w:val="center"/>
+      </w:pPr>
+      <w:bookmarkStart w:id="3" w:name="_Toc21493"/>
+      <w:r>
+        <w:t>LỜI MỞ ĐẦU</w:t>
+      </w:r>
+      <w:bookmarkEnd w:id="3"/>
+    </w:p>
+    <w:p>
+      <w:pPr>
+        <w:spacing w:before="0" w:after="120" w:line="360" w:lineRule="auto"/>
+        <w:ind w:left="0" w:firstLine="720"/>
+        <w:jc w:val="both"/>
+      </w:pPr>
+      <w:r>
+        <w:rPr>
+          <w:i w:val="0"/>
+        </w:rPr>
+        <w:t>Trong kỷ nguyên số hóa và sự phát triển vượt bậc của Đô thị hóa hiện đại, thương mại điện tử (E-Commerce) đã trở thành một thành tố không thể thiếu trong hạ tầng kinh tế toàn cầu. Việc ứng dụng Công nghệ thông tin vào quản lý kênh phân phối, quản lý đại lý và tối ưu hóa quy trình bán hàng trực tuyến đóng vai trò quyết định tới năng lực cạnh tranh của các doanh nghiệp. Trong đó, ngành kinh doanh đồ gia dụng – bao gồm các sản phẩm thiết yếu phục vụ đời sống gia đình, thiết bị nhà bếp, thiết bị điện và chăm sóc không gian sống – là một trong những lĩnh vực có tốc độ tăng trưởng quy mô thị trường vô cùng mạnh mẽ.</w:t>
+      </w:r>
+    </w:p>
+    <w:p>
+      <w:pPr>
+        <w:spacing w:before="0" w:after="120" w:line="360" w:lineRule="auto"/>
+        <w:ind w:left="0" w:firstLine="720"/>
+        <w:jc w:val="both"/>
+      </w:pPr>
+      <w:r>
+        <w:rPr>
+          <w:i w:val="0"/>
+        </w:rPr>
+        <w:t>Tuy nhiên, phương thức quản lý đại lý kinh doanh đồ gia dụng truyền thống đang bộc lộ nhiều hạn chế bất cập như: dữ liệu tồn kho phân tán, quản lý đơn hàng thủ công dễ gây ra sai sót, thông tin giữa nhà sản xuất/nhà phân phối và các đại lý bán lẻ thiếu tính đồng bộ tức thời, cũng như khó khăn trong việc theo dõi doanh thu và đánh giá hiệu quả kinh doanh. Xuất phát từ nhu cầu thực tiễn đó, việc nghiên cứu và phát triển một giải pháp phần mềm quản lý đại lý kinh doanh đồ gia dụng trực tuyến hiện đại, ứng dụng mô hình đa nhà bán hàng (Multi-vendor Marketplace) là vô cùng cần thiết.</w:t>
+      </w:r>
+    </w:p>
+    <w:p>
+      <w:pPr>
+        <w:spacing w:before="0" w:after="120" w:line="360" w:lineRule="auto"/>
+        <w:ind w:left="0" w:firstLine="720"/>
+        <w:jc w:val="both"/>
+      </w:pPr>
+      <w:r>
+        <w:rPr>
+          <w:i w:val="0"/>
+        </w:rPr>
+        <w:t>Nghiên cứu bài tập lớn học phần Công nghệ Java với đề tài: "Xây dựng phần mềm quản lý đại lý kinh doanh đồ gia dụng" (Đề tài CNJ18) được triển khai nhằm giải quyết bài toán trên. Hệ thống được xây dựng dựa trên nền tảng công nghệ mạnh mẽ và phổ biến bậc nhất hiện nay: Java Spring Boot Framework, kết hợp với Spring Data JPA, Spring Security, Thymeleaf Template Engine và Hệ quản trị cơ sở dữ liệu MySQL. Phần mềm cung cấp giải pháp toàn diện hỗ trợ 3 nhóm tác nhân chính: Quản trị viên (Admin), Nhà bán hàng/Đại lý (Seller/Vendor) và Khách hàng (Customer).</w:t>
+      </w:r>
+    </w:p>
+    <w:p>
+      <w:pPr>
+        <w:spacing w:before="0" w:after="120" w:line="360" w:lineRule="auto"/>
+        <w:ind w:left="0" w:firstLine="720"/>
+        <w:jc w:val="both"/>
+      </w:pPr>
+      <w:r>
+        <w:rPr>
+          <w:i w:val="0"/>
+        </w:rPr>
+        <w:t>Trong quá trình nghiên cứu và thực hiện bài tập lớn, Nhóm 7 đã nỗ lực vận dụng các kiến thức đã học cùng sự tìm tòi, nghiên cứu tài liệu thực tế để hoàn thành báo cáo và phần mềm. Nhóm xin gửi lời cảm ơn chân thành và sâu sắc nhất tới Thầy giáo hướng dẫn Trần Bá Hùng – Giảng viên Khoa Công nghệ Thông tin, Trường Đại học Công nghệ Đông Á. Sự hướng dẫn tận tình, những góp ý chuyên môn quý báu của Thầy chính là kim chỉ nam giúp Nhóm định hướng đúng đắn và hoàn thành tốt đề tài này.</w:t>
+      </w:r>
+    </w:p>
+    <w:p>
+      <w:pPr>
+        <w:spacing w:before="0" w:after="120" w:line="360" w:lineRule="auto"/>
+        <w:ind w:left="0" w:firstLine="720"/>
+        <w:jc w:val="both"/>
+      </w:pPr>
+      <w:r>
+        <w:rPr>
+          <w:i w:val="0"/>
+        </w:rPr>
+        <w:t>Dù đã cố gắng hết sức để hoàn thiện báo cáo và chương trình một cách chỉn chu nhất, song do hạn chế về mặt thời gian cũng như kinh nghiệm thực tiễn, đề tài khó tránh khỏi những thiếu sót nhất định. Nhóm rất mong nhận được những ý kiến đóng góp, nhận xét quý báu từ Thầy giáo cùng các bạn sinh viên để đề tài ngày càng được hoàn thiện và có tính ứng dụng cao hơn.</w:t>
+      </w:r>
+    </w:p>
+    <w:p>
+      <w:pPr>
+        <w:spacing w:before="0" w:after="0"/>
+        <w:ind w:firstLine="0"/>
+      </w:pPr>
+      <w:r>
+        <w:br w:type="page"/>
       </w:r>
     </w:p>
     <w:p>
@@ -1427,105 +2184,6 @@
       </w:pPr>
       <w:r>
         <w:rPr/>
-        <w:t>LỜI MỞ ĐẦU</w:t>
-      </w:r>
-    </w:p>
-    <w:p>
-      <w:pPr>
-        <w:spacing w:before="0" w:after="120" w:line="360" w:lineRule="auto"/>
-        <w:ind w:firstLine="720" w:left="0"/>
-        <w:jc w:val="both"/>
-      </w:pPr>
-      <w:r>
-        <w:rPr>
-          <w:i w:val="0"/>
-        </w:rPr>
-        <w:t>Trong kỷ nguyên số hóa và sự phát triển vượt bậc của Đô thị hóa hiện đại, thương mại điện tử (E-Commerce) đã trở thành một thành tố không thể thiếu trong hạ tầng kinh tế toàn cầu. Việc ứng dụng Công nghệ thông tin vào quản lý kênh phân phối, quản lý đại lý và tối ưu hóa quy trình bán hàng trực tuyến đóng vai trò quyết định tới năng lực cạnh tranh của các doanh nghiệp. Trong đó, ngành kinh doanh đồ gia dụng – bao gồm các sản phẩm thiết yếu phục vụ đời sống gia đình, thiết bị nhà bếp, thiết bị điện và chăm sóc không gian sống – là một trong những lĩnh vực có tốc độ tăng trưởng quy mô thị trường vô cùng mạnh mẽ.</w:t>
-      </w:r>
-    </w:p>
-    <w:p>
-      <w:pPr>
-        <w:spacing w:before="0" w:after="120" w:line="360" w:lineRule="auto"/>
-        <w:ind w:firstLine="720" w:left="0"/>
-        <w:jc w:val="both"/>
-      </w:pPr>
-      <w:r>
-        <w:rPr>
-          <w:i w:val="0"/>
-        </w:rPr>
-        <w:t>Tuy nhiên, phương thức quản lý đại lý kinh doanh đồ gia dụng truyền thống đang bộc lộ nhiều hạn chế bất cập như: dữ liệu tồn kho phân tán, quản lý đơn hàng thủ công dễ gây ra sai sót, thông tin giữa nhà sản xuất/nhà phân phối và các đại lý bán lẻ thiếu tính đồng bộ tức thời, cũng như khó khăn trong việc theo dõi doanh thu và đánh giá hiệu quả kinh doanh. Xuất phát từ nhu cầu thực tiễn đó, việc nghiên cứu và phát triển một giải pháp phần mềm quản lý đại lý kinh doanh đồ gia dụng trực tuyến hiện đại, ứng dụng mô hình đa nhà bán hàng (Multi-vendor Marketplace) là vô cùng cần thiết.</w:t>
-      </w:r>
-    </w:p>
-    <w:p>
-      <w:pPr>
-        <w:spacing w:before="0" w:after="120" w:line="360" w:lineRule="auto"/>
-        <w:ind w:firstLine="720" w:left="0"/>
-        <w:jc w:val="both"/>
-      </w:pPr>
-      <w:r>
-        <w:rPr>
-          <w:i w:val="0"/>
-        </w:rPr>
-        <w:t>Nghiên cứu bài tập lớn học phần Công nghệ Java với đề tài: "Xây dựng phần mềm quản lý đại lý kinh doanh đồ gia dụng" (Đề tài CNJ18) được triển khai nhằm giải quyết bài toán trên. Hệ thống được xây dựng dựa trên nền tảng công nghệ mạnh mẽ và phổ biến bậc nhất hiện nay: Java Spring Boot Framework, kết hợp với Spring Data JPA, Spring Security, Thymeleaf Template Engine và Hệ quản trị cơ sở dữ liệu MySQL. Phần mềm cung cấp giải pháp toàn diện hỗ trợ 3 nhóm tác nhân chính: Quản trị viên (Admin), Nhà bán hàng/Đại lý (Seller/Vendor) và Khách hàng (Customer).</w:t>
-      </w:r>
-    </w:p>
-    <w:p>
-      <w:pPr>
-        <w:spacing w:before="0" w:after="120" w:line="360" w:lineRule="auto"/>
-        <w:ind w:firstLine="720" w:left="0"/>
-        <w:jc w:val="both"/>
-      </w:pPr>
-      <w:r>
-        <w:rPr>
-          <w:i w:val="0"/>
-        </w:rPr>
-        <w:t>Trong quá trình nghiên cứu và thực hiện bài tập lớn, Nhóm 7 đã nỗ lực vận dụng các kiến thức đã học cùng sự tìm tòi, nghiên cứu tài liệu thực tế để hoàn thành báo cáo và phần mềm. Nhóm xin gửi lời cảm ơn chân thành và sâu sắc nhất tới Thầy giáo hướng dẫn Trần Bá Hùng – Giảng viên Khoa Công nghệ Thông tin, Trường Đại học Công nghệ Đông Á. Sự hướng dẫn tận tình, những góp ý chuyên môn quý báu của Thầy chính là kim chỉ nam giúp Nhóm định hướng đúng đắn và hoàn thành tốt đề tài này.</w:t>
-      </w:r>
-    </w:p>
-    <w:p>
-      <w:pPr>
-        <w:spacing w:before="0" w:after="120" w:line="360" w:lineRule="auto"/>
-        <w:ind w:firstLine="720" w:left="0"/>
-        <w:jc w:val="both"/>
-      </w:pPr>
-      <w:r>
-        <w:rPr>
-          <w:i w:val="0"/>
-        </w:rPr>
-        <w:t>Dù đã cố gắng hết sức để hoàn thiện báo cáo và chương trình một cách chỉn chu nhất, song do hạn chế về mặt thời gian cũng như kinh nghiệm thực tiễn, đề tài khó tránh khỏi những thiếu sót nhất định. Nhóm rất mong nhận được những ý kiến đóng góp, nhận xét quý báu từ Thầy giáo cùng các bạn sinh viên để đề tài ngày càng được hoàn thiện và có tính ứng dụng cao hơn.</w:t>
-      </w:r>
-    </w:p>
-    <w:p>
-      <w:pPr>
-        <w:spacing w:before="0" w:after="120" w:line="360" w:lineRule="auto"/>
-        <w:ind w:firstLine="720" w:left="0"/>
-        <w:jc w:val="both"/>
-      </w:pPr>
-      <w:r>
-        <w:rPr>
-          <w:i/>
-        </w:rPr>
-        <w:t>Nhóm sinh viên thực hiện – Nhóm 7.</w:t>
-      </w:r>
-    </w:p>
-    <w:p>
-      <w:pPr>
-        <w:spacing w:before="0" w:after="0"/>
-        <w:ind w:firstLine="0"/>
-      </w:pPr>
-      <w:r>
-        <w:br w:type="page"/>
-      </w:r>
-    </w:p>
-    <w:p>
-      <w:pPr>
-        <w:pStyle w:val="2"/>
-        <w:spacing w:before="240" w:after="240" w:line="360" w:lineRule="auto"/>
-        <w:ind w:firstLine="0" w:left="0"/>
-        <w:jc w:val="center"/>
-      </w:pPr>
-      <w:r>
-        <w:rPr/>
         <w:t>CHƯƠNG 1: TỔNG QUAN VỀ ĐỀ TÀI</w:t>
       </w:r>
     </w:p>
@@ -1549,7 +2207,7 @@
       </w:pPr>
       <w:r>
         <w:rPr/>
-        <w:t>Trong kỷ nguyên số hóa và sự phát triển vượt bậc của công nghệ thông tin hiện nay, Cách mạng Công nghiệp 4.0 đã và đang tác động sâu sắc đến mọi khía cạnh của đời sống kinh tế - xã hội. Việc ứng dụng phần mềm vào quản trị doanh nghiệp và thương mại hóa trực tuyến không còn là một giải pháp mang tính tùy chọn, mà đã trở thành yếu tố sinh tồn quyết định năng lực cạnh tranh của mọi tổ chức kinh doanh. Thương mại điện tử (E-Commerce) tại Việt Nam trong những năm gần đây đã ghi nhận tốc độ tăng trưởng phi mã từ 20% đến 25%/năm. Sự phổ biến của kết nối mạng Internet tốc độ cao, điện thoại thông minh cùng với các phương thức thanh toán điện tử đã thay đổi hoàn toàn thói quen tiêu dùng từ mua sắm truyền thống sang giao dịch trực tuyến.</w:t>
+        <w:t>Trong kỷ nguyên số hóa và sự phát triển vượt bậc của công nghệ thông tin hiện nay, Cuộc cách mạng Công nghiệp 4.0 đã và đang làm thay đổi toàn diện mọi phương thức vận hành doanh nghiệp, mô hình kinh doanh cũng như hành vi mua sắm của người tiêu dùng trên phạm vi toàn thế giới. Việc ứng dụng công nghệ thông tin vào quản trị hệ thống, tự động hóa quy trình nghiệp vụ và thương mại hóa sản phẩm trên không gian mạng không còn dừng lại ở một giải pháp mang tính thử nghiệm hay bổ trợ, mà đã vươn lên trở thành yếu tố sinh tồn quyết định năng lực cạnh tranh cốt lõi của mọi tổ chức kinh doanh.</w:t>
       </w:r>
     </w:p>
     <w:p>
@@ -1560,7 +2218,7 @@
       </w:pPr>
       <w:r>
         <w:rPr/>
-        <w:t>Trong thị trường bán lẻ trực tuyến, ngành kinh doanh đồ gia dụng – bao gồm các nhóm sản phẩm thiết yếu như thiết bị điện gia dụng (tủ lạnh, máy giặt, điều hòa, quạt điện), dụng cụ nhà bếp (nồi cơm điện, bếp từ, lò vi sóng, máy xay sinh tố) và thiết bị tiện ích gia đình (máy hút bụi, máy lọc nước, đồ dùng chăm sóc không gian sống) – giữ một vị trí vô cùng quan trọng. Đồ gia dụng là nhóm hàng hóa có chu kỳ tiêu dùng gắn liền với hoạt động sinh hoạt hàng ngày của mọi gia đình. Cùng với tốc độ đô thị hóa nhanh chóng, sự gia tăng tầng lớp trung lưu và quy mô các hộ gia đình trẻ, nhu cầu mua sắm, thay thế và nâng cấp thiết bị gia dụng ngày càng gia tăng mạnh mẽ cả về số lượng lẫn chất lượng.</w:t>
+        <w:t>Thương mại điện tử (E-Commerce) tại Việt Nam trong những năm gần đây đã chứng kiến sự bứt phá vượt bậc với tốc độ tăng trưởng quy mô thị trường trung bình đạt từ 20% đến 25%/năm, đưa Việt Nam trở thành một trong những quốc gia có tốc độ phát triển thương mại điện tử nhanh nhất khu vực Đông Nam Á. Sự phổ cập của hạ tầng viễn thông di động băng rộng 4G/5G, Internet cáp quang cùng với việc sử dụng phổ biến các thiết bị di động thông minh (Smartphone, Tablet) đã tạo điều kiện thuận lợi thúc đẩy người dân chuyển dịch mạnh mẽ từ phương thức mua sắm truyền thống sang các giao dịch trực tuyến.</w:t>
       </w:r>
     </w:p>
     <w:p>
@@ -1571,7 +2229,18 @@
       </w:pPr>
       <w:r>
         <w:rPr/>
-        <w:t>Đối với các nhà sản xuất và các công ty phân phối đồ gia dụng lớn, việc tiếp cận khách hàng trên nhiều vùng địa lý khác nhau phụ thuộc rất lớn vào mạng lưới đại lý bán lẻ. Hệ thống đại lý phân phối đóng vai trò là cánh tay nối dài giúp đưa sản phẩm đồ gia dụng từ kho của nhà sản xuất đến tận tay người tiêu dùng. Tuy nhiên, qua khảo sát thực tế, mô hình quản lý mạng lưới đại lý kinh doanh đồ gia dụng theo phương thức truyền thống hiện nay đang bộc lộ rất nhiều hạn chế bất cập và điểm nghẽn nghiêm trọng:</w:t>
+        <w:t>Trong bức tranh tổng thể của thị trường bán lẻ thương mại điện tử, ngành kinh doanh đồ gia dụng – bao gồm các nhóm sản phẩm thiết yếu phục vụ đời sống gia đình như thiết bị điện gia dụng (tủ lạnh, máy giặt, điều hòa, quạt điện), dụng cụ nhà bếp (nồi cơm điện, bếp từ, lò vi sóng, máy xay sinh tố, bộ nồi chảo) và các thiết bị chăm sóc không gian sống (máy hút bụi, máy lọc nước, máy lọc không khí, thiết bị vệ sinh thông minh) – đóng một vai trò vô cùng chiến lược. Đồ gia dụng là nhóm hàng hóa có nhu cầu tiêu dùng thường xuyên, gắn liền trực tiếp với hoạt động sinh hoạt hàng ngày của mọi hộ gia đình. Cùng với tốc độ đô thị hóa nhanh chóng, gia tăng thu nhập bình quân đầu người và sự hình thành các hộ gia đình trẻ hiện đại, nhu cầu trang bị mới, thay thế và nâng cấp các thiết bị gia dụng ngày càng gia tăng mạnh mẽ cả về số lượng lẫn chất lượng.</w:t>
+      </w:r>
+    </w:p>
+    <w:p>
+      <w:pPr>
+        <w:spacing w:before="0" w:after="120" w:line="360" w:lineRule="auto"/>
+        <w:ind w:firstLine="720" w:left="0"/>
+        <w:jc w:val="both"/>
+      </w:pPr>
+      <w:r>
+        <w:rPr/>
+        <w:t>Đối với các nhà sản xuất và các doanh nghiệp phân phối đồ gia dụng lớn, việc mở rộng phủ sóng thị phần tới các vùng miền địa lý đòi hỏi phải thiết lập và vận hành một mạng lưới đại lý phân phối bán lẻ rộng khắp. Mạng lưới đại lý đóng vai trò là cầu nối trực tiếp mang sản phẩm từ kho của nhà cung cấp đến tận tay người tiêu dùng cuối cùng. Tuy nhiên, qua khảo sát thực tế tại các doanh nghiệp và đại lý kinh doanh đồ gia dụng hiện nay, công tác quản lý mạng lưới đại lý phân phối theo mô hình truyền thống đang đối mặt với rất nhiều khó khăn, bất cập và điểm nghẽn nghiêm trọng:</w:t>
       </w:r>
     </w:p>
     <w:p>
@@ -1582,40 +2251,40 @@
       </w:pPr>
       <w:r>
         <w:rPr/>
-        <w:t>- Khó khăn trong việc quản lý dữ liệu phân tán và bất đồng bộ tồn kho:</w:t>
-      </w:r>
-    </w:p>
-    <w:p>
-      <w:pPr>
-        <w:spacing w:before="0" w:after="60" w:line="360" w:lineRule="auto"/>
-        <w:ind w:left="720" w:firstLine="720"/>
-        <w:jc w:val="both"/>
-      </w:pPr>
-      <w:r>
-        <w:rPr/>
-        <w:t>+ Thông tin sản phẩm gia dụng, số lượng tồn kho, giá bán và thông số kỹ thuật tại từng chi nhánh đại lý thường được lưu trữ rời rạc trên các file Excel hoặc sổ sách thủ công.</w:t>
-      </w:r>
-    </w:p>
-    <w:p>
-      <w:pPr>
-        <w:spacing w:before="0" w:after="60" w:line="360" w:lineRule="auto"/>
-        <w:ind w:left="720" w:firstLine="720"/>
-        <w:jc w:val="both"/>
-      </w:pPr>
-      <w:r>
-        <w:rPr/>
-        <w:t>+ Sự thiếu đồng bộ dữ liệu theo thời gian thực khiến cấp quản trị trung tâm không thể nắm bắt được chính xác lượng hàng tồn kho thực tế tại từng địa điểm. Điều này dẫn đến tình trạng bất cân đối hàng hóa kéo dài: một số đại lý rơi vào tình trạng thiếu hàng không có sản phẩm giao cho khách, trong khi các đại lý khác lại bị đọng vốn vì hàng hóa tồn kho quá lâu.</w:t>
-      </w:r>
-    </w:p>
-    <w:p>
-      <w:pPr>
-        <w:spacing w:before="0" w:after="60" w:line="360" w:lineRule="auto"/>
-        <w:ind w:left="720" w:firstLine="720"/>
-        <w:jc w:val="both"/>
-      </w:pPr>
-      <w:r>
-        <w:rPr/>
-        <w:t>+ Việc cập nhật thông tin sản phẩm mới, thông số kỹ thuật hoặc thay đổi bảng giá từ nhà sản xuất xuống toàn hệ thống đại lý diễn ra chậm trễ và thường phát sinh sai sót.</w:t>
+        <w:t>- Thách thức trong việc quản lý dữ liệu phân tán và bất đồng bộ tồn kho:</w:t>
+      </w:r>
+    </w:p>
+    <w:p>
+      <w:pPr>
+        <w:spacing w:before="0" w:after="60" w:line="360" w:lineRule="auto"/>
+        <w:ind w:left="720" w:firstLine="720"/>
+        <w:jc w:val="both"/>
+      </w:pPr>
+      <w:r>
+        <w:rPr/>
+        <w:t>+ Thông tin sản phẩm gia dụng, số lượng tồn kho, giá bán và chính sách chiết khấu tại từng chi nhánh đại lý thường được lưu trữ rời rạc trên các file Excel cá nhân hoặc sổ sách ghi chép thủ công.</w:t>
+      </w:r>
+    </w:p>
+    <w:p>
+      <w:pPr>
+        <w:spacing w:before="0" w:after="60" w:line="360" w:lineRule="auto"/>
+        <w:ind w:left="720" w:firstLine="720"/>
+        <w:jc w:val="both"/>
+      </w:pPr>
+      <w:r>
+        <w:rPr/>
+        <w:t>+ Sự thiếu đồng bộ dữ liệu theo thời gian thực khiến cấp quản trị trung tâm không thể nắm bắt được chính xác lượng hàng tồn kho thực tế tại từng địa điểm đại lý. Điều này dẫn đến tình trạng bất cân đối hàng hóa kéo dài: một số đại lý rơi vào tình trạng thiếu hàng không có sản phẩm giao cho khách, trong khi các đại lý khác lại bị đọng vốn vì hàng hóa tồn kho quá lâu.</w:t>
+      </w:r>
+    </w:p>
+    <w:p>
+      <w:pPr>
+        <w:spacing w:before="0" w:after="60" w:line="360" w:lineRule="auto"/>
+        <w:ind w:left="720" w:firstLine="720"/>
+        <w:jc w:val="both"/>
+      </w:pPr>
+      <w:r>
+        <w:rPr/>
+        <w:t>+ Việc cập nhật thông tin sản phẩm mới, thông số kỹ thuật hoặc thay đổi bảng giá từ nhà sản xuất xuống toàn hệ thống đại lý diễn ra chậm trễ và thường phát sinh sai sót số liệu.</w:t>
       </w:r>
     </w:p>
     <w:p>
@@ -1626,29 +2295,29 @@
       </w:pPr>
       <w:r>
         <w:rPr/>
-        <w:t>- Quy trình xử lý đơn hàng phức tạp, chậm trễ và dễ phát sinh sai sót:</w:t>
-      </w:r>
-    </w:p>
-    <w:p>
-      <w:pPr>
-        <w:spacing w:before="0" w:after="60" w:line="360" w:lineRule="auto"/>
-        <w:ind w:left="720" w:firstLine="720"/>
-        <w:jc w:val="both"/>
-      </w:pPr>
-      <w:r>
-        <w:rPr/>
-        <w:t>+ Việc tiếp nhận đơn đặt hàng từ người tiêu dùng và chuyển giao đơn về đại lý khu vực xử lý chủ yếu thông qua điện thoại, nhắn tin hoặc email cá nhân.</w:t>
-      </w:r>
-    </w:p>
-    <w:p>
-      <w:pPr>
-        <w:spacing w:before="0" w:after="60" w:line="360" w:lineRule="auto"/>
-        <w:ind w:left="720" w:firstLine="720"/>
-        <w:jc w:val="both"/>
-      </w:pPr>
-      <w:r>
-        <w:rPr/>
-        <w:t>+ Thiếu quy trình tự động hóa khiến thời gian xử lý một đơn hàng bị kéo dài, tỷ lệ nhầm lẫn thông tin giao hàng cao, gây khó khăn cho việc theo dõi và cập nhật trạng thái đơn hàng (PENDING, PROCESSING, SHIPPED, DELIVERED, CANCELLED) cho cả khách hàng lẫn nhà quản lý.</w:t>
+        <w:t>- Quy trình xử lý đơn hàng phức tạp, thủ công và hiệu suất thấp:</w:t>
+      </w:r>
+    </w:p>
+    <w:p>
+      <w:pPr>
+        <w:spacing w:before="0" w:after="60" w:line="360" w:lineRule="auto"/>
+        <w:ind w:left="720" w:firstLine="720"/>
+        <w:jc w:val="both"/>
+      </w:pPr>
+      <w:r>
+        <w:rPr/>
+        <w:t>+ Việc tiếp nhận đơn đặt hàng từ khách hàng và chuyển giao đơn về đại lý khu vực xử lý chủ yếu thực hiện qua các kênh thủ công như điện thoại, nhắn tin hoặc email cá nhân.</w:t>
+      </w:r>
+    </w:p>
+    <w:p>
+      <w:pPr>
+        <w:spacing w:before="0" w:after="60" w:line="360" w:lineRule="auto"/>
+        <w:ind w:left="720" w:firstLine="720"/>
+        <w:jc w:val="both"/>
+      </w:pPr>
+      <w:r>
+        <w:rPr/>
+        <w:t>+ Thiếu sự kết nối tự động khiến thời gian xử lý đơn hàng bị kéo dài, tỷ lệ nhầm lẫn thông tin giao hàng cao, gây khó khăn cho việc theo dõi và cập nhật trạng thái đơn hàng (PENDING, PROCESSING, SHIPPED, DELIVERED, CANCELLED) cho cả khách hàng lẫn nhà quản lý.</w:t>
       </w:r>
     </w:p>
     <w:p>
@@ -1681,7 +2350,7 @@
       </w:pPr>
       <w:r>
         <w:rPr/>
-        <w:t>+ Khách hàng khi muốn tìm mua đồ gia dụng chính hãng gặp khó khăn trong việc tìm kiếm các đại lý ủy quyền uy tín ở gần khu vực sinh sống của mình.</w:t>
+        <w:t>+ Khách hàng khi muốn tìm mua các sản phẩm đồ gia dụng chính hãng gặp khó khăn trong việc tìm kiếm thông tin các đại lý ủy quyền uy tín ở gần khu vực sinh sống của mình.</w:t>
       </w:r>
     </w:p>
     <w:p>
@@ -1758,7 +2427,7 @@
       </w:pPr>
       <w:r>
         <w:rPr/>
-        <w:t>Đứng trước những đòi hỏi cấp thiết của thực tiễn, việc xây dựng một giải pháp phần mềm quản lý đại lý kinh doanh đồ gia dụng tích hợp mô hình Multi-vendor Marketplace (Sàn giao dịch đa nhà bán hàng) là một bước đi đột phá mang tính chiến lược. Mô hình Multi-vendor cho phép tập trung quản lý nhiều đại lý phân phối độc lập trên cùng một nền tảng Web duy nhất. Mỗi đại lý được cấp một tài khoản gian hàng riêng để tự quản lý danh mục sản phẩm đồ gia dụng, quản lý kho hàng và xử lý đơn hàng; trong khi đó, Quản trị viên hệ thống (Admin) nắm giữ quyền kiểm soát toàn cục về danh mục tổng, chính sách bán hàng, duyệt mở gian hàng và quản lý tài khoản người dùng.</w:t>
+        <w:t>Đứng trước những đòi hỏi cấp thiết của thực tiễn, việc ứng dụng công nghệ thông tin để phát triển một phần mềm quản lý đại lý kinh doanh đồ gia dụng tích hợp mô hình Multi-vendor Marketplace (Sàn giao dịch đa nhà bán hàng) là một bước đi đột phá mang tính chiến lược. Mô hình Multi-vendor cho phép tập trung quản lý nhiều đại lý phân phối độc lập trên cùng một nền tảng Web duy nhất. Mỗi đại lý được cấp một tài khoản gian hàng riêng để tự quản lý danh mục sản phẩm đồ gia dụng, quản lý kho hàng và xử lý đơn hàng; trong khi đó, Quản trị viên hệ thống (Admin) nắm giữ quyền kiểm soát toàn cục về danh mục, chính sách, phê duyệt gian hàng và quản lý tài khoản người dùng.</w:t>
       </w:r>
     </w:p>
     <w:p>
@@ -2685,95 +3354,6 @@
       <w:r>
         <w:rPr/>
         <w:t>- Đóng vai trò là nền tảng vững chắc để nhóm phát triển tiếp tục mở rộng, tích hợp thêm các công nghệ tiên tiến (thanh toán điện tử, trí tuệ nhân tạo gợi ý sản phẩm) nhằm thương mại hóa sản phẩm trong tương lai.</w:t>
-      </w:r>
-    </w:p>
-    <w:p>
-      <w:pPr>
-        <w:pStyle w:val="3"/>
-        <w:spacing w:before="0" w:after="80" w:line="360" w:lineRule="auto"/>
-        <w:ind w:firstLine="0" w:left="0"/>
-        <w:jc w:val="left"/>
-      </w:pPr>
-      <w:r>
-        <w:rPr/>
-        <w:t>1.6. Bố cục báo cáo</w:t>
-      </w:r>
-    </w:p>
-    <w:p>
-      <w:pPr>
-        <w:spacing w:before="0" w:after="120" w:line="360" w:lineRule="auto"/>
-        <w:ind w:firstLine="720" w:left="0"/>
-        <w:jc w:val="both"/>
-      </w:pPr>
-      <w:r>
-        <w:rPr/>
-        <w:t>Báo cáo bài tập lớn học phần Công nghệ Java với đề tài "Xây dựng phần mềm quản lý đại lý kinh doanh đồ gia dụng" được cấu trúc thành 5 chương chính cùng các phần bổ trợ theo thứ tự logic như sau:</w:t>
-      </w:r>
-    </w:p>
-    <w:p>
-      <w:pPr>
-        <w:spacing w:before="0" w:after="80" w:line="360" w:lineRule="auto"/>
-        <w:ind w:firstLine="720" w:left="0"/>
-        <w:jc w:val="both"/>
-      </w:pPr>
-      <w:r>
-        <w:rPr/>
-        <w:t>- Lời mở đầu: Trình bày bối cảnh chung, lý do lựa chọn đề tài, lời cảm ơn gửi tới Giảng viên hướng dẫn và tập thể lớp.</w:t>
-      </w:r>
-    </w:p>
-    <w:p>
-      <w:pPr>
-        <w:spacing w:before="0" w:after="80" w:line="360" w:lineRule="auto"/>
-        <w:ind w:firstLine="720" w:left="0"/>
-        <w:jc w:val="both"/>
-      </w:pPr>
-      <w:r>
-        <w:rPr/>
-        <w:t>- Chương 1: Tổng quan về đề tài: Giới thiệu toàn diện về lý do chọn đề tài, mục tiêu tổng quát và cụ thể, đối tượng và phạm vi nghiên cứu, phương pháp thực hiện, ý nghĩa khoa học - thực tiễn và bố cục chung của báo cáo.</w:t>
-      </w:r>
-    </w:p>
-    <w:p>
-      <w:pPr>
-        <w:spacing w:before="0" w:after="80" w:line="360" w:lineRule="auto"/>
-        <w:ind w:firstLine="720" w:left="0"/>
-        <w:jc w:val="both"/>
-      </w:pPr>
-      <w:r>
-        <w:rPr/>
-        <w:t>- Chương 2: Cơ sở lý thuyết: Trình bày chi tiết nền tảng lý thuyết về thương mại điện tử, mô hình Multi-vendor Marketplace, ngôn ngữ Java, Spring Boot Framework, Spring Security, Spring Data JPA / Hibernate ORM, Thymeleaf Template Engine, hệ quản trị cơ sở dữ liệu MySQL và mô hình kiến trúc MVC.</w:t>
-      </w:r>
-    </w:p>
-    <w:p>
-      <w:pPr>
-        <w:spacing w:before="0" w:after="80" w:line="360" w:lineRule="auto"/>
-        <w:ind w:firstLine="720" w:left="0"/>
-        <w:jc w:val="both"/>
-      </w:pPr>
-      <w:r>
-        <w:rPr/>
-        <w:t>- Chương 3: Phân tích và thiết kế hệ thống: Trình bày kết quả khảo sát yêu cầu hệ thống, phân tích các tác nhân (Admin, Seller, Customer), chi tiết các yêu cầu chức năng và phi chức năng, sơ đồ Use Case và thiết kế mô hình cơ sở dữ liệu ERD chuẩn 3NF.</w:t>
-      </w:r>
-    </w:p>
-    <w:p>
-      <w:pPr>
-        <w:spacing w:before="0" w:after="80" w:line="360" w:lineRule="auto"/>
-        <w:ind w:firstLine="720" w:left="0"/>
-        <w:jc w:val="both"/>
-      </w:pPr>
-      <w:r>
-        <w:rPr/>
-        <w:t>- Chương 4: Cài đặt và triển khai hệ thống: Mô tả chi tiết cấu trúc thư mục dự án Java Spring Boot, hiện thực các dịch vụ cốt lõi, minh họa giao diện và kết quả hoạt động của các phân hệ Admin, Seller và Customer.</w:t>
-      </w:r>
-    </w:p>
-    <w:p>
-      <w:pPr>
-        <w:spacing w:before="0" w:after="80" w:line="360" w:lineRule="auto"/>
-        <w:ind w:firstLine="720" w:left="0"/>
-        <w:jc w:val="both"/>
-      </w:pPr>
-      <w:r>
-        <w:rPr/>
-        <w:t>- Chương 5: Kết luận và hướng phát triển: Tổng kết những kết quả đã đạt được của đề tài, thẳng thắn đánh giá các mặt hạn chế còn tồn tại và đề xuất các hướng nâng cấp, hoàn thiện phần mềm trong tương lai.</w:t>
       </w:r>
     </w:p>
     <w:sectPr>

</xml_diff>

<commit_message>
docs: expand Chapter 1 to 15-18 pages without section 1.6 with exact formatting rules
</commit_message>
<xml_diff>
--- a/DeTaiCNJ18_Nhom7.docx
+++ b/DeTaiCNJ18_Nhom7.docx
@@ -170,7 +170,7 @@
                           <pic:cNvPicPr/>
                         </pic:nvPicPr>
                         <pic:blipFill>
-                          <a:blip r:embed="rId6" cstate="print"/>
+                          <a:blip r:embed="rId7" cstate="print"/>
                           <a:stretch>
                             <a:fillRect/>
                           </a:stretch>
@@ -248,7 +248,7 @@
                 <v:shape id="Image 3" o:spid="_x0000_s1026" o:spt="75" type="#_x0000_t75" style="position:absolute;left:2185352;top:933450;height:1323799;width:1323799;" filled="f" o:preferrelative="t" stroked="f" coordsize="21600,21600" o:gfxdata="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">
                   <v:fill on="f" focussize="0,0"/>
                   <v:stroke on="f"/>
-                  <v:imagedata r:id="rId6" o:title=""/>
+                  <v:imagedata r:id="rId7" o:title=""/>
                   <o:lock v:ext="edit" aspectratio="f"/>
                 </v:shape>
                 <v:shape id="Graphic 4" o:spid="_x0000_s1026" o:spt="100" style="position:absolute;left:2171065;top:8602345;height:12700;width:1398905;" fillcolor="#000000" filled="t" stroked="f" coordsize="1398905,12700" o:gfxdata="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" path="m1398904,12700l0,12700,0,0,1398904,0,1398904,12700xe">
@@ -470,7 +470,7 @@
     </w:p>
     <w:p>
       <w:pPr>
-        <w:pStyle w:val="13"/>
+        <w:pStyle w:val="15"/>
         <w:rPr>
           <w:b/>
           <w:sz w:val="48"/>
@@ -1319,9 +1319,9 @@
         <w:pStyle w:val="2"/>
         <w:bidi w:val="0"/>
       </w:pPr>
-      <w:bookmarkStart w:id="0" w:name="_Toc24751"/>
-      <w:bookmarkStart w:id="1" w:name="_Toc9811"/>
-      <w:bookmarkStart w:id="2" w:name="_Toc36"/>
+      <w:bookmarkStart w:id="0" w:name="_Toc9811"/>
+      <w:bookmarkStart w:id="1" w:name="_Toc29089"/>
+      <w:bookmarkStart w:id="2" w:name="_Toc24751"/>
       <w:r>
         <w:t>MỤC LỤC</w:t>
       </w:r>
@@ -1331,7 +1331,7 @@
     </w:p>
     <w:p>
       <w:pPr>
-        <w:pStyle w:val="15"/>
+        <w:pStyle w:val="17"/>
         <w:tabs>
           <w:tab w:val="right" w:leader="dot" w:pos="8800"/>
         </w:tabs>
@@ -1349,7 +1349,7 @@
         <w:fldChar w:fldCharType="begin"/>
       </w:r>
       <w:r>
-        <w:instrText xml:space="preserve"> HYPERLINK \l _Toc36 </w:instrText>
+        <w:instrText xml:space="preserve"> HYPERLINK \l _Toc29089 </w:instrText>
       </w:r>
       <w:r>
         <w:fldChar w:fldCharType="separate"/>
@@ -1364,13 +1364,13 @@
         <w:fldChar w:fldCharType="begin"/>
       </w:r>
       <w:r>
-        <w:instrText xml:space="preserve"> PAGEREF _Toc36 \h </w:instrText>
+        <w:instrText xml:space="preserve"> PAGEREF _Toc29089 \h </w:instrText>
       </w:r>
       <w:r>
         <w:fldChar w:fldCharType="separate"/>
       </w:r>
       <w:r>
-        <w:t>2</w:t>
+        <w:t>1</w:t>
       </w:r>
       <w:r>
         <w:fldChar w:fldCharType="end"/>
@@ -1381,7 +1381,7 @@
     </w:p>
     <w:p>
       <w:pPr>
-        <w:pStyle w:val="15"/>
+        <w:pStyle w:val="17"/>
         <w:tabs>
           <w:tab w:val="right" w:leader="dot" w:pos="8800"/>
         </w:tabs>
@@ -1390,7 +1390,7 @@
         <w:fldChar w:fldCharType="begin"/>
       </w:r>
       <w:r>
-        <w:instrText xml:space="preserve"> HYPERLINK \l _Toc21493 </w:instrText>
+        <w:instrText xml:space="preserve"> HYPERLINK \l _Toc5002 </w:instrText>
       </w:r>
       <w:r>
         <w:fldChar w:fldCharType="separate"/>
@@ -1405,13 +1405,13 @@
         <w:fldChar w:fldCharType="begin"/>
       </w:r>
       <w:r>
-        <w:instrText xml:space="preserve"> PAGEREF _Toc21493 \h </w:instrText>
+        <w:instrText xml:space="preserve"> PAGEREF _Toc5002 \h </w:instrText>
       </w:r>
       <w:r>
         <w:fldChar w:fldCharType="separate"/>
       </w:r>
       <w:r>
-        <w:t>3</w:t>
+        <w:t>2</w:t>
       </w:r>
       <w:r>
         <w:fldChar w:fldCharType="end"/>
@@ -1422,7 +1422,7 @@
     </w:p>
     <w:p>
       <w:pPr>
-        <w:pStyle w:val="15"/>
+        <w:pStyle w:val="17"/>
         <w:tabs>
           <w:tab w:val="right" w:leader="dot" w:pos="8800"/>
         </w:tabs>
@@ -1431,7 +1431,7 @@
         <w:fldChar w:fldCharType="begin"/>
       </w:r>
       <w:r>
-        <w:instrText xml:space="preserve"> HYPERLINK \l _Toc9666 </w:instrText>
+        <w:instrText xml:space="preserve"> HYPERLINK \l _Toc5201 </w:instrText>
       </w:r>
       <w:r>
         <w:fldChar w:fldCharType="separate"/>
@@ -1446,13 +1446,13 @@
         <w:fldChar w:fldCharType="begin"/>
       </w:r>
       <w:r>
-        <w:instrText xml:space="preserve"> PAGEREF _Toc9666 \h </w:instrText>
+        <w:instrText xml:space="preserve"> PAGEREF _Toc5201 \h </w:instrText>
       </w:r>
       <w:r>
         <w:fldChar w:fldCharType="separate"/>
       </w:r>
       <w:r>
-        <w:t>5</w:t>
+        <w:t>4</w:t>
       </w:r>
       <w:r>
         <w:fldChar w:fldCharType="end"/>
@@ -1463,7 +1463,7 @@
     </w:p>
     <w:p>
       <w:pPr>
-        <w:pStyle w:val="15"/>
+        <w:pStyle w:val="17"/>
         <w:tabs>
           <w:tab w:val="right" w:leader="dot" w:pos="8800"/>
         </w:tabs>
@@ -1472,7 +1472,7 @@
         <w:fldChar w:fldCharType="begin"/>
       </w:r>
       <w:r>
-        <w:instrText xml:space="preserve"> HYPERLINK \l _Toc13257 </w:instrText>
+        <w:instrText xml:space="preserve"> HYPERLINK \l _Toc25572 </w:instrText>
       </w:r>
       <w:r>
         <w:fldChar w:fldCharType="separate"/>
@@ -1487,13 +1487,13 @@
         <w:fldChar w:fldCharType="begin"/>
       </w:r>
       <w:r>
-        <w:instrText xml:space="preserve"> PAGEREF _Toc13257 \h </w:instrText>
+        <w:instrText xml:space="preserve"> PAGEREF _Toc25572 \h </w:instrText>
       </w:r>
       <w:r>
         <w:fldChar w:fldCharType="separate"/>
       </w:r>
       <w:r>
-        <w:t>5</w:t>
+        <w:t>4</w:t>
       </w:r>
       <w:r>
         <w:fldChar w:fldCharType="end"/>
@@ -1504,7 +1504,7 @@
     </w:p>
     <w:p>
       <w:pPr>
-        <w:pStyle w:val="15"/>
+        <w:pStyle w:val="17"/>
         <w:tabs>
           <w:tab w:val="right" w:leader="dot" w:pos="8800"/>
         </w:tabs>
@@ -1513,7 +1513,7 @@
         <w:fldChar w:fldCharType="begin"/>
       </w:r>
       <w:r>
-        <w:instrText xml:space="preserve"> HYPERLINK \l _Toc32223 </w:instrText>
+        <w:instrText xml:space="preserve"> HYPERLINK \l _Toc12067 </w:instrText>
       </w:r>
       <w:r>
         <w:fldChar w:fldCharType="separate"/>
@@ -1528,7 +1528,7 @@
         <w:fldChar w:fldCharType="begin"/>
       </w:r>
       <w:r>
-        <w:instrText xml:space="preserve"> PAGEREF _Toc32223 \h </w:instrText>
+        <w:instrText xml:space="preserve"> PAGEREF _Toc12067 \h </w:instrText>
       </w:r>
       <w:r>
         <w:fldChar w:fldCharType="separate"/>
@@ -1545,7 +1545,7 @@
     </w:p>
     <w:p>
       <w:pPr>
-        <w:pStyle w:val="16"/>
+        <w:pStyle w:val="18"/>
         <w:tabs>
           <w:tab w:val="right" w:leader="dot" w:pos="8800"/>
         </w:tabs>
@@ -1554,7 +1554,7 @@
         <w:fldChar w:fldCharType="begin"/>
       </w:r>
       <w:r>
-        <w:instrText xml:space="preserve"> HYPERLINK \l _Toc1999 </w:instrText>
+        <w:instrText xml:space="preserve"> HYPERLINK \l _Toc20591 </w:instrText>
       </w:r>
       <w:r>
         <w:fldChar w:fldCharType="separate"/>
@@ -1569,7 +1569,7 @@
         <w:fldChar w:fldCharType="begin"/>
       </w:r>
       <w:r>
-        <w:instrText xml:space="preserve"> PAGEREF _Toc1999 \h </w:instrText>
+        <w:instrText xml:space="preserve"> PAGEREF _Toc20591 \h </w:instrText>
       </w:r>
       <w:r>
         <w:fldChar w:fldCharType="separate"/>
@@ -1586,7 +1586,7 @@
     </w:p>
     <w:p>
       <w:pPr>
-        <w:pStyle w:val="16"/>
+        <w:pStyle w:val="18"/>
         <w:tabs>
           <w:tab w:val="right" w:leader="dot" w:pos="8800"/>
         </w:tabs>
@@ -1595,7 +1595,7 @@
         <w:fldChar w:fldCharType="begin"/>
       </w:r>
       <w:r>
-        <w:instrText xml:space="preserve"> HYPERLINK \l _Toc9044 </w:instrText>
+        <w:instrText xml:space="preserve"> HYPERLINK \l _Toc4255 </w:instrText>
       </w:r>
       <w:r>
         <w:fldChar w:fldCharType="separate"/>
@@ -1610,13 +1610,13 @@
         <w:fldChar w:fldCharType="begin"/>
       </w:r>
       <w:r>
-        <w:instrText xml:space="preserve"> PAGEREF _Toc9044 \h </w:instrText>
+        <w:instrText xml:space="preserve"> PAGEREF _Toc4255 \h </w:instrText>
       </w:r>
       <w:r>
         <w:fldChar w:fldCharType="separate"/>
       </w:r>
       <w:r>
-        <w:t>9</w:t>
+        <w:t>8</w:t>
       </w:r>
       <w:r>
         <w:fldChar w:fldCharType="end"/>
@@ -1627,7 +1627,7 @@
     </w:p>
     <w:p>
       <w:pPr>
-        <w:pStyle w:val="15"/>
+        <w:pStyle w:val="17"/>
         <w:tabs>
           <w:tab w:val="right" w:leader="dot" w:pos="8800"/>
         </w:tabs>
@@ -1636,7 +1636,7 @@
         <w:fldChar w:fldCharType="begin"/>
       </w:r>
       <w:r>
-        <w:instrText xml:space="preserve"> HYPERLINK \l _Toc3830 </w:instrText>
+        <w:instrText xml:space="preserve"> HYPERLINK \l _Toc7237 </w:instrText>
       </w:r>
       <w:r>
         <w:fldChar w:fldCharType="separate"/>
@@ -1651,13 +1651,13 @@
         <w:fldChar w:fldCharType="begin"/>
       </w:r>
       <w:r>
-        <w:instrText xml:space="preserve"> PAGEREF _Toc3830 \h </w:instrText>
+        <w:instrText xml:space="preserve"> PAGEREF _Toc7237 \h </w:instrText>
       </w:r>
       <w:r>
         <w:fldChar w:fldCharType="separate"/>
       </w:r>
       <w:r>
-        <w:t>10</w:t>
+        <w:t>9</w:t>
       </w:r>
       <w:r>
         <w:fldChar w:fldCharType="end"/>
@@ -1668,7 +1668,7 @@
     </w:p>
     <w:p>
       <w:pPr>
-        <w:pStyle w:val="16"/>
+        <w:pStyle w:val="18"/>
         <w:tabs>
           <w:tab w:val="right" w:leader="dot" w:pos="8800"/>
         </w:tabs>
@@ -1677,7 +1677,7 @@
         <w:fldChar w:fldCharType="begin"/>
       </w:r>
       <w:r>
-        <w:instrText xml:space="preserve"> HYPERLINK \l _Toc4844 </w:instrText>
+        <w:instrText xml:space="preserve"> HYPERLINK \l _Toc11105 </w:instrText>
       </w:r>
       <w:r>
         <w:fldChar w:fldCharType="separate"/>
@@ -1692,13 +1692,13 @@
         <w:fldChar w:fldCharType="begin"/>
       </w:r>
       <w:r>
-        <w:instrText xml:space="preserve"> PAGEREF _Toc4844 \h </w:instrText>
+        <w:instrText xml:space="preserve"> PAGEREF _Toc11105 \h </w:instrText>
       </w:r>
       <w:r>
         <w:fldChar w:fldCharType="separate"/>
       </w:r>
       <w:r>
-        <w:t>10</w:t>
+        <w:t>9</w:t>
       </w:r>
       <w:r>
         <w:fldChar w:fldCharType="end"/>
@@ -1709,7 +1709,7 @@
     </w:p>
     <w:p>
       <w:pPr>
-        <w:pStyle w:val="16"/>
+        <w:pStyle w:val="18"/>
         <w:tabs>
           <w:tab w:val="right" w:leader="dot" w:pos="8800"/>
         </w:tabs>
@@ -1718,7 +1718,7 @@
         <w:fldChar w:fldCharType="begin"/>
       </w:r>
       <w:r>
-        <w:instrText xml:space="preserve"> HYPERLINK \l _Toc28201 </w:instrText>
+        <w:instrText xml:space="preserve"> HYPERLINK \l _Toc25556 </w:instrText>
       </w:r>
       <w:r>
         <w:fldChar w:fldCharType="separate"/>
@@ -1733,13 +1733,13 @@
         <w:fldChar w:fldCharType="begin"/>
       </w:r>
       <w:r>
-        <w:instrText xml:space="preserve"> PAGEREF _Toc28201 \h </w:instrText>
+        <w:instrText xml:space="preserve"> PAGEREF _Toc25556 \h </w:instrText>
       </w:r>
       <w:r>
         <w:fldChar w:fldCharType="separate"/>
       </w:r>
       <w:r>
-        <w:t>11</w:t>
+        <w:t>10</w:t>
       </w:r>
       <w:r>
         <w:fldChar w:fldCharType="end"/>
@@ -1750,7 +1750,7 @@
     </w:p>
     <w:p>
       <w:pPr>
-        <w:pStyle w:val="15"/>
+        <w:pStyle w:val="17"/>
         <w:tabs>
           <w:tab w:val="right" w:leader="dot" w:pos="8800"/>
         </w:tabs>
@@ -1759,7 +1759,7 @@
         <w:fldChar w:fldCharType="begin"/>
       </w:r>
       <w:r>
-        <w:instrText xml:space="preserve"> HYPERLINK \l _Toc13319 </w:instrText>
+        <w:instrText xml:space="preserve"> HYPERLINK \l _Toc21849 </w:instrText>
       </w:r>
       <w:r>
         <w:fldChar w:fldCharType="separate"/>
@@ -1774,7 +1774,7 @@
         <w:fldChar w:fldCharType="begin"/>
       </w:r>
       <w:r>
-        <w:instrText xml:space="preserve"> PAGEREF _Toc13319 \h </w:instrText>
+        <w:instrText xml:space="preserve"> PAGEREF _Toc21849 \h </w:instrText>
       </w:r>
       <w:r>
         <w:fldChar w:fldCharType="separate"/>
@@ -1791,7 +1791,7 @@
     </w:p>
     <w:p>
       <w:pPr>
-        <w:pStyle w:val="16"/>
+        <w:pStyle w:val="18"/>
         <w:tabs>
           <w:tab w:val="right" w:leader="dot" w:pos="8800"/>
         </w:tabs>
@@ -1800,7 +1800,7 @@
         <w:fldChar w:fldCharType="begin"/>
       </w:r>
       <w:r>
-        <w:instrText xml:space="preserve"> HYPERLINK \l _Toc29919 </w:instrText>
+        <w:instrText xml:space="preserve"> HYPERLINK \l _Toc2969 </w:instrText>
       </w:r>
       <w:r>
         <w:fldChar w:fldCharType="separate"/>
@@ -1815,7 +1815,7 @@
         <w:fldChar w:fldCharType="begin"/>
       </w:r>
       <w:r>
-        <w:instrText xml:space="preserve"> PAGEREF _Toc29919 \h </w:instrText>
+        <w:instrText xml:space="preserve"> PAGEREF _Toc2969 \h </w:instrText>
       </w:r>
       <w:r>
         <w:fldChar w:fldCharType="separate"/>
@@ -1832,7 +1832,7 @@
     </w:p>
     <w:p>
       <w:pPr>
-        <w:pStyle w:val="16"/>
+        <w:pStyle w:val="18"/>
         <w:tabs>
           <w:tab w:val="right" w:leader="dot" w:pos="8800"/>
         </w:tabs>
@@ -1841,7 +1841,7 @@
         <w:fldChar w:fldCharType="begin"/>
       </w:r>
       <w:r>
-        <w:instrText xml:space="preserve"> HYPERLINK \l _Toc28526 </w:instrText>
+        <w:instrText xml:space="preserve"> HYPERLINK \l _Toc30234 </w:instrText>
       </w:r>
       <w:r>
         <w:fldChar w:fldCharType="separate"/>
@@ -1856,13 +1856,13 @@
         <w:fldChar w:fldCharType="begin"/>
       </w:r>
       <w:r>
-        <w:instrText xml:space="preserve"> PAGEREF _Toc28526 \h </w:instrText>
+        <w:instrText xml:space="preserve"> PAGEREF _Toc30234 \h </w:instrText>
       </w:r>
       <w:r>
         <w:fldChar w:fldCharType="separate"/>
       </w:r>
       <w:r>
-        <w:t>12</w:t>
+        <w:t>11</w:t>
       </w:r>
       <w:r>
         <w:fldChar w:fldCharType="end"/>
@@ -1873,7 +1873,7 @@
     </w:p>
     <w:p>
       <w:pPr>
-        <w:pStyle w:val="16"/>
+        <w:pStyle w:val="18"/>
         <w:tabs>
           <w:tab w:val="right" w:leader="dot" w:pos="8800"/>
         </w:tabs>
@@ -1882,7 +1882,7 @@
         <w:fldChar w:fldCharType="begin"/>
       </w:r>
       <w:r>
-        <w:instrText xml:space="preserve"> HYPERLINK \l _Toc11047 </w:instrText>
+        <w:instrText xml:space="preserve"> HYPERLINK \l _Toc17861 </w:instrText>
       </w:r>
       <w:r>
         <w:fldChar w:fldCharType="separate"/>
@@ -1897,13 +1897,13 @@
         <w:fldChar w:fldCharType="begin"/>
       </w:r>
       <w:r>
-        <w:instrText xml:space="preserve"> PAGEREF _Toc11047 \h </w:instrText>
+        <w:instrText xml:space="preserve"> PAGEREF _Toc17861 \h </w:instrText>
       </w:r>
       <w:r>
         <w:fldChar w:fldCharType="separate"/>
       </w:r>
       <w:r>
-        <w:t>12</w:t>
+        <w:t>11</w:t>
       </w:r>
       <w:r>
         <w:fldChar w:fldCharType="end"/>
@@ -1914,7 +1914,7 @@
     </w:p>
     <w:p>
       <w:pPr>
-        <w:pStyle w:val="15"/>
+        <w:pStyle w:val="17"/>
         <w:tabs>
           <w:tab w:val="right" w:leader="dot" w:pos="8800"/>
         </w:tabs>
@@ -1923,7 +1923,7 @@
         <w:fldChar w:fldCharType="begin"/>
       </w:r>
       <w:r>
-        <w:instrText xml:space="preserve"> HYPERLINK \l _Toc3517 </w:instrText>
+        <w:instrText xml:space="preserve"> HYPERLINK \l _Toc17519 </w:instrText>
       </w:r>
       <w:r>
         <w:fldChar w:fldCharType="separate"/>
@@ -1938,13 +1938,13 @@
         <w:fldChar w:fldCharType="begin"/>
       </w:r>
       <w:r>
-        <w:instrText xml:space="preserve"> PAGEREF _Toc3517 \h </w:instrText>
+        <w:instrText xml:space="preserve"> PAGEREF _Toc17519 \h </w:instrText>
       </w:r>
       <w:r>
         <w:fldChar w:fldCharType="separate"/>
       </w:r>
       <w:r>
-        <w:t>13</w:t>
+        <w:t>12</w:t>
       </w:r>
       <w:r>
         <w:fldChar w:fldCharType="end"/>
@@ -1955,7 +1955,7 @@
     </w:p>
     <w:p>
       <w:pPr>
-        <w:pStyle w:val="16"/>
+        <w:pStyle w:val="18"/>
         <w:tabs>
           <w:tab w:val="right" w:leader="dot" w:pos="8800"/>
         </w:tabs>
@@ -1964,7 +1964,7 @@
         <w:fldChar w:fldCharType="begin"/>
       </w:r>
       <w:r>
-        <w:instrText xml:space="preserve"> HYPERLINK \l _Toc7404 </w:instrText>
+        <w:instrText xml:space="preserve"> HYPERLINK \l _Toc28134 </w:instrText>
       </w:r>
       <w:r>
         <w:fldChar w:fldCharType="separate"/>
@@ -1979,13 +1979,13 @@
         <w:fldChar w:fldCharType="begin"/>
       </w:r>
       <w:r>
-        <w:instrText xml:space="preserve"> PAGEREF _Toc7404 \h </w:instrText>
+        <w:instrText xml:space="preserve"> PAGEREF _Toc28134 \h </w:instrText>
       </w:r>
       <w:r>
         <w:fldChar w:fldCharType="separate"/>
       </w:r>
       <w:r>
-        <w:t>13</w:t>
+        <w:t>12</w:t>
       </w:r>
       <w:r>
         <w:fldChar w:fldCharType="end"/>
@@ -1996,7 +1996,7 @@
     </w:p>
     <w:p>
       <w:pPr>
-        <w:pStyle w:val="16"/>
+        <w:pStyle w:val="18"/>
         <w:tabs>
           <w:tab w:val="right" w:leader="dot" w:pos="8800"/>
         </w:tabs>
@@ -2005,7 +2005,7 @@
         <w:fldChar w:fldCharType="begin"/>
       </w:r>
       <w:r>
-        <w:instrText xml:space="preserve"> HYPERLINK \l _Toc8705 </w:instrText>
+        <w:instrText xml:space="preserve"> HYPERLINK \l _Toc30161 </w:instrText>
       </w:r>
       <w:r>
         <w:fldChar w:fldCharType="separate"/>
@@ -2020,56 +2020,13 @@
         <w:fldChar w:fldCharType="begin"/>
       </w:r>
       <w:r>
-        <w:instrText xml:space="preserve"> PAGEREF _Toc8705 \h </w:instrText>
+        <w:instrText xml:space="preserve"> PAGEREF _Toc30161 \h </w:instrText>
       </w:r>
       <w:r>
         <w:fldChar w:fldCharType="separate"/>
       </w:r>
       <w:r>
-        <w:t>13</w:t>
-      </w:r>
-      <w:r>
-        <w:fldChar w:fldCharType="end"/>
-      </w:r>
-      <w:r>
-        <w:fldChar w:fldCharType="end"/>
-      </w:r>
-    </w:p>
-    <w:p>
-      <w:pPr>
-        <w:pStyle w:val="15"/>
-        <w:tabs>
-          <w:tab w:val="right" w:leader="dot" w:pos="8800"/>
-        </w:tabs>
-      </w:pPr>
-      <w:r>
-        <w:fldChar w:fldCharType="begin"/>
-      </w:r>
-      <w:r>
-        <w:instrText xml:space="preserve"> HYPERLINK \l _Toc13449 </w:instrText>
-      </w:r>
-      <w:r>
-        <w:fldChar w:fldCharType="separate"/>
-      </w:r>
-      <w:r>
-        <w:t>1.6. Bố cục báo cáo</w:t>
-      </w:r>
-      <w:bookmarkStart w:id="20" w:name="_GoBack"/>
-      <w:bookmarkEnd w:id="20"/>
-      <w:r>
-        <w:tab/>
-      </w:r>
-      <w:r>
-        <w:fldChar w:fldCharType="begin"/>
-      </w:r>
-      <w:r>
-        <w:instrText xml:space="preserve"> PAGEREF _Toc13449 \h </w:instrText>
-      </w:r>
-      <w:r>
-        <w:fldChar w:fldCharType="separate"/>
-      </w:r>
-      <w:r>
-        <w:t>13</w:t>
+        <w:t>12</w:t>
       </w:r>
       <w:r>
         <w:fldChar w:fldCharType="end"/>
@@ -2095,7 +2052,7 @@
         <w:ind w:left="0" w:firstLine="0"/>
         <w:jc w:val="center"/>
       </w:pPr>
-      <w:bookmarkStart w:id="3" w:name="_Toc21493"/>
+      <w:bookmarkStart w:id="3" w:name="_Toc5002"/>
       <w:r>
         <w:t>LỜI MỞ ĐẦU</w:t>
       </w:r>
@@ -2179,1186 +2136,1535 @@
       <w:pPr>
         <w:pStyle w:val="2"/>
         <w:spacing w:before="240" w:after="240" w:line="360" w:lineRule="auto"/>
-        <w:ind w:firstLine="0" w:left="0"/>
+        <w:ind w:firstLine="0"/>
         <w:jc w:val="center"/>
       </w:pPr>
       <w:r>
-        <w:rPr/>
-        <w:t>CHƯƠNG 1: TỔNG QUAN VỀ ĐỀ TÀI</w:t>
+        <w:rPr>
+          <w:rFonts w:ascii="Times New Roman" w:hAnsi="Times New Roman"/>
+          <w:b/>
+          <w:sz w:val="32"/>
+        </w:rPr>
+        <w:t>CHƯƠNG 1. TỔNG QUAN ĐỀ TÀI</w:t>
       </w:r>
     </w:p>
     <w:p>
       <w:pPr>
         <w:pStyle w:val="3"/>
-        <w:spacing w:before="0" w:after="80" w:line="360" w:lineRule="auto"/>
-        <w:ind w:firstLine="0" w:left="0"/>
+        <w:spacing w:before="0" w:after="120" w:line="360" w:lineRule="auto"/>
+        <w:ind w:firstLine="0"/>
         <w:jc w:val="left"/>
       </w:pPr>
       <w:r>
-        <w:rPr/>
+        <w:rPr>
+          <w:rFonts w:ascii="Times New Roman" w:hAnsi="Times New Roman"/>
+          <w:b/>
+          <w:sz w:val="26"/>
+        </w:rPr>
         <w:t>1.1. Lý do chọn đề tài</w:t>
       </w:r>
     </w:p>
     <w:p>
       <w:pPr>
         <w:spacing w:before="0" w:after="120" w:line="360" w:lineRule="auto"/>
-        <w:ind w:firstLine="720" w:left="0"/>
-        <w:jc w:val="both"/>
-      </w:pPr>
-      <w:r>
-        <w:rPr/>
-        <w:t>Trong kỷ nguyên số hóa và sự phát triển vượt bậc của công nghệ thông tin hiện nay, Cuộc cách mạng Công nghiệp 4.0 đã và đang làm thay đổi toàn diện mọi phương thức vận hành doanh nghiệp, mô hình kinh doanh cũng như hành vi mua sắm của người tiêu dùng trên phạm vi toàn thế giới. Việc ứng dụng công nghệ thông tin vào quản trị hệ thống, tự động hóa quy trình nghiệp vụ và thương mại hóa sản phẩm trên không gian mạng không còn dừng lại ở một giải pháp mang tính thử nghiệm hay bổ trợ, mà đã vươn lên trở thành yếu tố sinh tồn quyết định năng lực cạnh tranh cốt lõi của mọi tổ chức kinh doanh.</w:t>
-      </w:r>
-    </w:p>
-    <w:p>
-      <w:pPr>
-        <w:spacing w:before="0" w:after="120" w:line="360" w:lineRule="auto"/>
-        <w:ind w:firstLine="720" w:left="0"/>
-        <w:jc w:val="both"/>
-      </w:pPr>
-      <w:r>
-        <w:rPr/>
-        <w:t>Thương mại điện tử (E-Commerce) tại Việt Nam trong những năm gần đây đã chứng kiến sự bứt phá vượt bậc với tốc độ tăng trưởng quy mô thị trường trung bình đạt từ 20% đến 25%/năm, đưa Việt Nam trở thành một trong những quốc gia có tốc độ phát triển thương mại điện tử nhanh nhất khu vực Đông Nam Á. Sự phổ cập của hạ tầng viễn thông di động băng rộng 4G/5G, Internet cáp quang cùng với việc sử dụng phổ biến các thiết bị di động thông minh (Smartphone, Tablet) đã tạo điều kiện thuận lợi thúc đẩy người dân chuyển dịch mạnh mẽ từ phương thức mua sắm truyền thống sang các giao dịch trực tuyến.</w:t>
-      </w:r>
-    </w:p>
-    <w:p>
-      <w:pPr>
-        <w:spacing w:before="0" w:after="120" w:line="360" w:lineRule="auto"/>
-        <w:ind w:firstLine="720" w:left="0"/>
-        <w:jc w:val="both"/>
-      </w:pPr>
-      <w:r>
-        <w:rPr/>
-        <w:t>Trong bức tranh tổng thể của thị trường bán lẻ thương mại điện tử, ngành kinh doanh đồ gia dụng – bao gồm các nhóm sản phẩm thiết yếu phục vụ đời sống gia đình như thiết bị điện gia dụng (tủ lạnh, máy giặt, điều hòa, quạt điện), dụng cụ nhà bếp (nồi cơm điện, bếp từ, lò vi sóng, máy xay sinh tố, bộ nồi chảo) và các thiết bị chăm sóc không gian sống (máy hút bụi, máy lọc nước, máy lọc không khí, thiết bị vệ sinh thông minh) – đóng một vai trò vô cùng chiến lược. Đồ gia dụng là nhóm hàng hóa có nhu cầu tiêu dùng thường xuyên, gắn liền trực tiếp với hoạt động sinh hoạt hàng ngày của mọi hộ gia đình. Cùng với tốc độ đô thị hóa nhanh chóng, gia tăng thu nhập bình quân đầu người và sự hình thành các hộ gia đình trẻ hiện đại, nhu cầu trang bị mới, thay thế và nâng cấp các thiết bị gia dụng ngày càng gia tăng mạnh mẽ cả về số lượng lẫn chất lượng.</w:t>
-      </w:r>
-    </w:p>
-    <w:p>
-      <w:pPr>
-        <w:spacing w:before="0" w:after="120" w:line="360" w:lineRule="auto"/>
-        <w:ind w:firstLine="720" w:left="0"/>
-        <w:jc w:val="both"/>
-      </w:pPr>
-      <w:r>
-        <w:rPr/>
-        <w:t>Đối với các nhà sản xuất và các doanh nghiệp phân phối đồ gia dụng lớn, việc mở rộng phủ sóng thị phần tới các vùng miền địa lý đòi hỏi phải thiết lập và vận hành một mạng lưới đại lý phân phối bán lẻ rộng khắp. Mạng lưới đại lý đóng vai trò là cầu nối trực tiếp mang sản phẩm từ kho của nhà cung cấp đến tận tay người tiêu dùng cuối cùng. Tuy nhiên, qua khảo sát thực tế tại các doanh nghiệp và đại lý kinh doanh đồ gia dụng hiện nay, công tác quản lý mạng lưới đại lý phân phối theo mô hình truyền thống đang đối mặt với rất nhiều khó khăn, bất cập và điểm nghẽn nghiêm trọng:</w:t>
-      </w:r>
-    </w:p>
-    <w:p>
-      <w:pPr>
-        <w:spacing w:before="0" w:after="80" w:line="360" w:lineRule="auto"/>
-        <w:ind w:firstLine="720" w:left="0"/>
-        <w:jc w:val="both"/>
-      </w:pPr>
-      <w:r>
-        <w:rPr/>
-        <w:t>- Thách thức trong việc quản lý dữ liệu phân tán và bất đồng bộ tồn kho:</w:t>
-      </w:r>
-    </w:p>
-    <w:p>
-      <w:pPr>
-        <w:spacing w:before="0" w:after="60" w:line="360" w:lineRule="auto"/>
-        <w:ind w:left="720" w:firstLine="720"/>
-        <w:jc w:val="both"/>
-      </w:pPr>
-      <w:r>
-        <w:rPr/>
-        <w:t>+ Thông tin sản phẩm gia dụng, số lượng tồn kho, giá bán và chính sách chiết khấu tại từng chi nhánh đại lý thường được lưu trữ rời rạc trên các file Excel cá nhân hoặc sổ sách ghi chép thủ công.</w:t>
-      </w:r>
-    </w:p>
-    <w:p>
-      <w:pPr>
-        <w:spacing w:before="0" w:after="60" w:line="360" w:lineRule="auto"/>
-        <w:ind w:left="720" w:firstLine="720"/>
-        <w:jc w:val="both"/>
-      </w:pPr>
-      <w:r>
-        <w:rPr/>
-        <w:t>+ Sự thiếu đồng bộ dữ liệu theo thời gian thực khiến cấp quản trị trung tâm không thể nắm bắt được chính xác lượng hàng tồn kho thực tế tại từng địa điểm đại lý. Điều này dẫn đến tình trạng bất cân đối hàng hóa kéo dài: một số đại lý rơi vào tình trạng thiếu hàng không có sản phẩm giao cho khách, trong khi các đại lý khác lại bị đọng vốn vì hàng hóa tồn kho quá lâu.</w:t>
-      </w:r>
-    </w:p>
-    <w:p>
-      <w:pPr>
-        <w:spacing w:before="0" w:after="60" w:line="360" w:lineRule="auto"/>
-        <w:ind w:left="720" w:firstLine="720"/>
-        <w:jc w:val="both"/>
-      </w:pPr>
-      <w:r>
-        <w:rPr/>
-        <w:t>+ Việc cập nhật thông tin sản phẩm mới, thông số kỹ thuật hoặc thay đổi bảng giá từ nhà sản xuất xuống toàn hệ thống đại lý diễn ra chậm trễ và thường phát sinh sai sót số liệu.</w:t>
-      </w:r>
-    </w:p>
-    <w:p>
-      <w:pPr>
-        <w:spacing w:before="0" w:after="80" w:line="360" w:lineRule="auto"/>
-        <w:ind w:firstLine="720" w:left="0"/>
-        <w:jc w:val="both"/>
-      </w:pPr>
-      <w:r>
-        <w:rPr/>
-        <w:t>- Quy trình xử lý đơn hàng phức tạp, thủ công và hiệu suất thấp:</w:t>
-      </w:r>
-    </w:p>
-    <w:p>
-      <w:pPr>
-        <w:spacing w:before="0" w:after="60" w:line="360" w:lineRule="auto"/>
-        <w:ind w:left="720" w:firstLine="720"/>
-        <w:jc w:val="both"/>
-      </w:pPr>
-      <w:r>
-        <w:rPr/>
-        <w:t>+ Việc tiếp nhận đơn đặt hàng từ khách hàng và chuyển giao đơn về đại lý khu vực xử lý chủ yếu thực hiện qua các kênh thủ công như điện thoại, nhắn tin hoặc email cá nhân.</w:t>
-      </w:r>
-    </w:p>
-    <w:p>
-      <w:pPr>
-        <w:spacing w:before="0" w:after="60" w:line="360" w:lineRule="auto"/>
-        <w:ind w:left="720" w:firstLine="720"/>
-        <w:jc w:val="both"/>
-      </w:pPr>
-      <w:r>
-        <w:rPr/>
-        <w:t>+ Thiếu sự kết nối tự động khiến thời gian xử lý đơn hàng bị kéo dài, tỷ lệ nhầm lẫn thông tin giao hàng cao, gây khó khăn cho việc theo dõi và cập nhật trạng thái đơn hàng (PENDING, PROCESSING, SHIPPED, DELIVERED, CANCELLED) cho cả khách hàng lẫn nhà quản lý.</w:t>
-      </w:r>
-    </w:p>
-    <w:p>
-      <w:pPr>
-        <w:spacing w:before="0" w:after="60" w:line="360" w:lineRule="auto"/>
-        <w:ind w:left="720" w:firstLine="720"/>
-        <w:jc w:val="both"/>
-      </w:pPr>
-      <w:r>
-        <w:rPr/>
-        <w:t>+ Công tác xử lý bảo hành, đổi trả sản phẩm gia dụng bị lỗi gặp nhiều trở ngại do thiếu nhật ký hệ thống lưu trữ lịch sử giao dịch và thông tin đại lý bán.</w:t>
-      </w:r>
-    </w:p>
-    <w:p>
-      <w:pPr>
-        <w:spacing w:before="0" w:after="80" w:line="360" w:lineRule="auto"/>
-        <w:ind w:firstLine="720" w:left="0"/>
-        <w:jc w:val="both"/>
-      </w:pPr>
-      <w:r>
-        <w:rPr/>
-        <w:t>- Thiếu kênh tương tác trực tuyến minh bạch cho người tiêu dùng:</w:t>
-      </w:r>
-    </w:p>
-    <w:p>
-      <w:pPr>
-        <w:spacing w:before="0" w:after="60" w:line="360" w:lineRule="auto"/>
-        <w:ind w:left="720" w:firstLine="720"/>
-        <w:jc w:val="both"/>
-      </w:pPr>
-      <w:r>
-        <w:rPr/>
-        <w:t>+ Khách hàng khi muốn tìm mua các sản phẩm đồ gia dụng chính hãng gặp khó khăn trong việc tìm kiếm thông tin các đại lý ủy quyền uy tín ở gần khu vực sinh sống của mình.</w:t>
-      </w:r>
-    </w:p>
-    <w:p>
-      <w:pPr>
-        <w:spacing w:before="0" w:after="60" w:line="360" w:lineRule="auto"/>
-        <w:ind w:left="720" w:firstLine="720"/>
-        <w:jc w:val="both"/>
-      </w:pPr>
-      <w:r>
-        <w:rPr/>
-        <w:t>+ Thiếu hệ thống đánh giá (Review) và phản hồi khách quan khiến người mua không thể kiểm chứng chất lượng phục vụ và thái độ bảo hành của từng đại lý, từ đó làm giảm niềm tin tiêu dùng.</w:t>
-      </w:r>
-    </w:p>
-    <w:p>
-      <w:pPr>
-        <w:spacing w:before="0" w:after="60" w:line="360" w:lineRule="auto"/>
-        <w:ind w:left="720" w:firstLine="720"/>
-        <w:jc w:val="both"/>
-      </w:pPr>
-      <w:r>
-        <w:rPr/>
-        <w:t>+ Khách hàng không thể so sánh giá bán, tính năng kỹ thuật và các chính sách ưu đãi giữa các đại lý khác nhau trên cùng một cổng thông tin.</w:t>
-      </w:r>
-    </w:p>
-    <w:p>
-      <w:pPr>
-        <w:spacing w:before="0" w:after="80" w:line="360" w:lineRule="auto"/>
-        <w:ind w:firstLine="720" w:left="0"/>
-        <w:jc w:val="both"/>
-      </w:pPr>
-      <w:r>
-        <w:rPr/>
-        <w:t>- Bất cập trong công tác quản lý tài chính, đối soát chiết khấu và bảo mật phân quyền:</w:t>
-      </w:r>
-    </w:p>
-    <w:p>
-      <w:pPr>
-        <w:spacing w:before="0" w:after="60" w:line="360" w:lineRule="auto"/>
-        <w:ind w:left="720" w:firstLine="720"/>
-        <w:jc w:val="both"/>
-      </w:pPr>
-      <w:r>
-        <w:rPr/>
-        <w:t>+ Hệ thống cũ không cung cấp cơ chế phân quyền truy cập chặt chẽ giữa các nhóm người dùng: Quản trị viên hệ thống (Admin), Chủ đại lý/Nhà bán hàng (Seller) và Khách hàng (Customer).</w:t>
-      </w:r>
-    </w:p>
-    <w:p>
-      <w:pPr>
-        <w:spacing w:before="0" w:after="60" w:line="360" w:lineRule="auto"/>
-        <w:ind w:left="720" w:firstLine="720"/>
-        <w:jc w:val="both"/>
-      </w:pPr>
-      <w:r>
-        <w:rPr/>
-        <w:t>+ Công tác tổng hợp báo cáo doanh thu, tính toán tỷ lệ chiết khấu bán hàng cho từng đại lý và đối soát công nợ định kỳ tốn rất nhiều thời gian, công sức và dễ phát sinh sai sót, tranh chấp số liệu.</w:t>
-      </w:r>
-    </w:p>
-    <w:p>
-      <w:pPr>
-        <w:spacing w:before="0" w:after="60" w:line="360" w:lineRule="auto"/>
-        <w:ind w:left="720" w:firstLine="720"/>
-        <w:jc w:val="both"/>
-      </w:pPr>
-      <w:r>
-        <w:rPr/>
-        <w:t>+ Nguy cơ mất an toàn thông tin, rò rỉ dữ liệu khách hàng và thông tin kinh doanh do thiếu các giải pháp bảo mật cơ sở dữ liệu và mã hóa mật khẩu an toàn.</w:t>
-      </w:r>
-    </w:p>
-    <w:p>
-      <w:pPr>
-        <w:spacing w:before="0" w:after="120" w:line="360" w:lineRule="auto"/>
-        <w:ind w:firstLine="720" w:left="0"/>
-        <w:jc w:val="both"/>
-      </w:pPr>
-      <w:r>
-        <w:rPr/>
-        <w:t>Đứng trước những đòi hỏi cấp thiết của thực tiễn, việc ứng dụng công nghệ thông tin để phát triển một phần mềm quản lý đại lý kinh doanh đồ gia dụng tích hợp mô hình Multi-vendor Marketplace (Sàn giao dịch đa nhà bán hàng) là một bước đi đột phá mang tính chiến lược. Mô hình Multi-vendor cho phép tập trung quản lý nhiều đại lý phân phối độc lập trên cùng một nền tảng Web duy nhất. Mỗi đại lý được cấp một tài khoản gian hàng riêng để tự quản lý danh mục sản phẩm đồ gia dụng, quản lý kho hàng và xử lý đơn hàng; trong khi đó, Quản trị viên hệ thống (Admin) nắm giữ quyền kiểm soát toàn cục về danh mục, chính sách, phê duyệt gian hàng và quản lý tài khoản người dùng.</w:t>
-      </w:r>
-    </w:p>
-    <w:p>
-      <w:pPr>
-        <w:spacing w:before="0" w:after="120" w:line="360" w:lineRule="auto"/>
-        <w:ind w:firstLine="720" w:left="0"/>
-        <w:jc w:val="both"/>
-      </w:pPr>
-      <w:r>
-        <w:rPr/>
-        <w:t>Về mặt nền tảng công nghệ, ngôn ngữ lập trình Java kết hợp với khung ứng dụng Spring Boot Framework là sự lựa chọn tối ưu hàng đầu cho việc xây dựng các ứng dụng phần mềm doanh nghiệp và thương mại điện tử quy mô lớn. Spring Boot sở hữu những ưu thế vượt trội:</w:t>
-      </w:r>
-    </w:p>
-    <w:p>
-      <w:pPr>
-        <w:spacing w:before="0" w:after="80" w:line="360" w:lineRule="auto"/>
-        <w:ind w:firstLine="720" w:left="0"/>
-        <w:jc w:val="both"/>
-      </w:pPr>
-      <w:r>
-        <w:rPr/>
-        <w:t>- Kiến trúc mô-đun hóa mạnh mẽ và khả năng mở rộng (Scalability):</w:t>
-      </w:r>
-    </w:p>
-    <w:p>
-      <w:pPr>
-        <w:spacing w:before="0" w:after="60" w:line="360" w:lineRule="auto"/>
-        <w:ind w:left="720" w:firstLine="720"/>
-        <w:jc w:val="both"/>
-      </w:pPr>
-      <w:r>
-        <w:rPr/>
-        <w:t>+ Cho phép hệ thống dễ dàng mở rộng quy mô, nâng cấp tính năng hoặc tích hợp thêm các dịch vụ của bên thứ ba mà không làm gián đoạn các phân hệ đang vận hành.</w:t>
-      </w:r>
-    </w:p>
-    <w:p>
-      <w:pPr>
-        <w:spacing w:before="0" w:after="60" w:line="360" w:lineRule="auto"/>
-        <w:ind w:left="720" w:firstLine="720"/>
-        <w:jc w:val="both"/>
-      </w:pPr>
-      <w:r>
-        <w:rPr/>
-        <w:t>+ Tối ưu hóa khả năng xử lý đồng thời nhiều truy vấn (High Concurrency) khi lượng người dùng và giao dịch tăng đột biến.</w:t>
-      </w:r>
-    </w:p>
-    <w:p>
-      <w:pPr>
-        <w:spacing w:before="0" w:after="80" w:line="360" w:lineRule="auto"/>
-        <w:ind w:firstLine="720" w:left="0"/>
-        <w:jc w:val="both"/>
-      </w:pPr>
-      <w:r>
-        <w:rPr/>
-        <w:t>- Tối ưu hóa quản lý cơ sở dữ liệu với Spring Data JPA / Hibernate ORM:</w:t>
-      </w:r>
-    </w:p>
-    <w:p>
-      <w:pPr>
-        <w:spacing w:before="0" w:after="60" w:line="360" w:lineRule="auto"/>
-        <w:ind w:left="720" w:firstLine="720"/>
-        <w:jc w:val="both"/>
-      </w:pPr>
-      <w:r>
-        <w:rPr/>
-        <w:t>+ Giúp tự động hóa việc ánh xạ các đối tượng Java sang bảng cơ sở dữ liệu quan hệ MySQL, giảm thiểu tối đa mã lệnh SQL thủ công và nâng cao hiệu năng truy vấn dữ liệu.</w:t>
-      </w:r>
-    </w:p>
-    <w:p>
-      <w:pPr>
-        <w:spacing w:before="0" w:after="60" w:line="360" w:lineRule="auto"/>
-        <w:ind w:left="720" w:firstLine="720"/>
-        <w:jc w:val="both"/>
-      </w:pPr>
-      <w:r>
-        <w:rPr/>
-        <w:t>+ Hỗ trợ cơ chế quản lý giao dịch (Transaction Management) đảm bảo tính toàn vẹn dữ liệu ACID khi xử lý đơn hàng.</w:t>
-      </w:r>
-    </w:p>
-    <w:p>
-      <w:pPr>
-        <w:spacing w:before="0" w:after="80" w:line="360" w:lineRule="auto"/>
-        <w:ind w:firstLine="720" w:left="0"/>
-        <w:jc w:val="both"/>
-      </w:pPr>
-      <w:r>
-        <w:rPr/>
-        <w:t>- Bảo mật vượt trội với khung làm việc Spring Security:</w:t>
-      </w:r>
-    </w:p>
-    <w:p>
-      <w:pPr>
-        <w:spacing w:before="0" w:after="60" w:line="360" w:lineRule="auto"/>
-        <w:ind w:left="720" w:firstLine="720"/>
-        <w:jc w:val="both"/>
-      </w:pPr>
-      <w:r>
-        <w:rPr/>
-        <w:t>+ Cung cấp cơ chế xác thực người dùng chặt chẽ, mã hóa mật khẩu an toàn chuẩn BCryptPasswordEncoder.</w:t>
-      </w:r>
-    </w:p>
-    <w:p>
-      <w:pPr>
-        <w:spacing w:before="0" w:after="60" w:line="360" w:lineRule="auto"/>
-        <w:ind w:left="720" w:firstLine="720"/>
-        <w:jc w:val="both"/>
-      </w:pPr>
-      <w:r>
-        <w:rPr/>
-        <w:t>+ Cài đặt phân quyền truy cập đa cấp độ dựa trên vai trò (Role-Based Access Control - RBAC), ngăn chặn hiệu quả các lỗ hổng bảo mật và nguy cơ tấn công mạng như CSRF, XSS, SQL Injection.</w:t>
-      </w:r>
-    </w:p>
-    <w:p>
-      <w:pPr>
-        <w:spacing w:before="0" w:after="80" w:line="360" w:lineRule="auto"/>
-        <w:ind w:firstLine="720" w:left="0"/>
-        <w:jc w:val="both"/>
-      </w:pPr>
-      <w:r>
-        <w:rPr/>
-        <w:t>- Tích hợp công nghệ giao diện Thymeleaf Template Engine:</w:t>
-      </w:r>
-    </w:p>
-    <w:p>
-      <w:pPr>
-        <w:spacing w:before="0" w:after="60" w:line="360" w:lineRule="auto"/>
-        <w:ind w:left="720" w:firstLine="720"/>
-        <w:jc w:val="both"/>
-      </w:pPr>
-      <w:r>
-        <w:rPr/>
-        <w:t>+ Cho phép nhúng mượt mà dữ liệu động từ các Spring Controller sang giao diện HTML5/Bootstrap, mang lại tốc độ phản hồi trang web nhanh chóng và trải nghiệm người dùng tối ưu.</w:t>
-      </w:r>
-    </w:p>
-    <w:p>
-      <w:pPr>
-        <w:spacing w:before="0" w:after="60" w:line="360" w:lineRule="auto"/>
-        <w:ind w:left="720" w:firstLine="720"/>
-        <w:jc w:val="both"/>
-      </w:pPr>
-      <w:r>
-        <w:rPr/>
-        <w:t>+ Giúp tách biệt giữa logic xử lý nghiệp vụ Java backend và phần hiển thị giao diện frontend.</w:t>
-      </w:r>
-    </w:p>
-    <w:p>
-      <w:pPr>
-        <w:spacing w:before="0" w:after="120" w:line="360" w:lineRule="auto"/>
-        <w:ind w:firstLine="720" w:left="0"/>
-        <w:jc w:val="both"/>
-      </w:pPr>
-      <w:r>
-        <w:rPr/>
-        <w:t>Xuất phát từ yêu cầu thực tiễn của ngành kinh doanh đồ gia dụng cùng mong muốn áp dụng các kiến thức chuyên sâu của học phần Công nghệ Java vào một dự án phần mềm có tính ứng dụng thực tế cao, Nhóm 7 đã quyết định lựa chọn đề tài: "Xây dựng phần mềm quản lý đại lý kinh doanh đồ gia dụng" (Đề tài CNJ18) làm Bài tập lớn học phần. Đề tài không chỉ giúp nhóm sinh viên nâng cao kỹ năng lập trình Java doanh nghiệp mà còn đóng góp một giải pháp công nghệ hữu ích cho bài toán quản lý kênh phân phối đại lý trong thực tế.</w:t>
+        <w:ind w:firstLine="720"/>
+        <w:jc w:val="both"/>
+      </w:pPr>
+      <w:r>
+        <w:rPr>
+          <w:rFonts w:ascii="Times New Roman" w:hAnsi="Times New Roman"/>
+          <w:sz w:val="26"/>
+        </w:rPr>
+        <w:t>Trong kỷ nguyên số hóa toàn cầu và sự bùng nổ của cuộc Cách mạng Công nghiệp 4.0, sự phát triển vượt bậc của công nghệ thông tin và truyền thông đã tạo ra những bước ngoặt lịch sử làm thay đổi căn bản cấu trúc nền kinh tế thế giới. Trong đó, Thương mại điện tử (E-Commerce) đã vươn lên trở thành một trong những động lực tăng trưởng kinh tế quan trọng nhất, đóng vai trò cầu nối chiến lược giữa sản xuất và tiêu dùng số. Thương mại điện tử không đơn thuần là việc số hóa các giao dịch mua bán truyền thống lên nền tảng Internet, mà đã tiến hóa thành một hệ sinh thái kinh tế số đa chiều, tích hợp các công nghệ xử lý dữ liệu lớn (Big Data), trí tuệ nhân tạo (AI), điện toán đám mây (Cloud Computing) và hệ thống thanh toán không dùng tiền mặt (Cashless Payment Systems).</w:t>
+      </w:r>
+    </w:p>
+    <w:p>
+      <w:pPr>
+        <w:spacing w:before="0" w:after="120" w:line="360" w:lineRule="auto"/>
+        <w:ind w:firstLine="720"/>
+        <w:jc w:val="both"/>
+      </w:pPr>
+      <w:r>
+        <w:rPr>
+          <w:rFonts w:ascii="Times New Roman" w:hAnsi="Times New Roman"/>
+          <w:sz w:val="26"/>
+        </w:rPr>
+        <w:t>Tại Việt Nam, với hơn 75% dân số sử dụng Internet và tỷ lệ người dùng thiết bị di động thông minh chiếm đa số, thị trường thương mại điện tử đã chứng kiến tốc độ tăng trưởng phi thường trong những năm gần đây. Thói quen mua sắm của người tiêu dùng Việt Nam đã dịch chuyển mạnh mẽ từ hình thức mua hàng trực tiếp tại các cửa hàng truyền thống sang tìm kiếm, so sánh và đặt hàng trực tuyến trên các nền tảng số. Khách hàng ngày nay yêu cầu cao hơn bao giờ hết về tính minh bạch của thông tin sản phẩm, sự phong phú về chủng loại hàng hóa, tốc độ phản hồi của hệ thống, sự an toàn trong giao dịch thanh toán cũng như dịch vụ giao hàng nhanh chóng, chính xác. Điều này đặt ra áp lực chuyển đổi số toàn diện cho tất cả các doanh nghiệp bán lẻ, từ các tập đoàn lớn cho đến các doanh nghiệp vừa và nhỏ (SMEs) và hộ kinh doanh cá thể.</w:t>
+      </w:r>
+    </w:p>
+    <w:p>
+      <w:pPr>
+        <w:spacing w:before="0" w:after="120" w:line="360" w:lineRule="auto"/>
+        <w:ind w:firstLine="720"/>
+        <w:jc w:val="both"/>
+      </w:pPr>
+      <w:r>
+        <w:rPr>
+          <w:rFonts w:ascii="Times New Roman" w:hAnsi="Times New Roman"/>
+          <w:sz w:val="26"/>
+        </w:rPr>
+        <w:t>Trong bối cảnh đó, mô hình sàn thương mại điện tử đơn gian hàng (Single-vendor E-Commerce) bộc lộ nhiều hạn chế cố hữu. Ở mô hình truyền thống này, một doanh nghiệp phải tự chịu trách nhiệm toàn bộ các khâu từ đầu tư hạ tầng công nghệ, tìm kiếm nguồn hàng, quản lý kho bãi, nhân sự vận hành, marketing tìm kiếm khách hàng cho đến xử lý giao vận và chăm sóc khách hàng. Điều này tạo ra rào cản chi phí khổng lồ và rủi ro vận hành tích tụ đối với các doanh nghiệp vừa và nhỏ. Trái lại, mô hình sàn thương mại điện tử đa gian hàng (Multi-vendor E-Commerce Platform) ra đời như một giải pháp kinh tế chia sẻ (Sharing Economy) đột phá và tối ưu. Trên mô hình này, đơn vị quản trị nền tảng (Admin) đứng ra đầu tư và duy trì hạ tầng công nghệ, hệ thống quản lý tập trung và giải pháp thanh toán chung. Trong khi đó, hàng ngàn nhà bán hàng độc lập (Vendors) có thể nhanh chóng đăng ký mở gian hàng, tự đưa sản phẩm lên sàn, thiết lập giá bán, quản lý tồn kho và xử lý đơn hàng của riêng mình.</w:t>
+      </w:r>
+    </w:p>
+    <w:p>
+      <w:pPr>
+        <w:spacing w:before="0" w:after="120" w:line="360" w:lineRule="auto"/>
+        <w:ind w:firstLine="720"/>
+        <w:jc w:val="both"/>
+      </w:pPr>
+      <w:r>
+        <w:rPr>
+          <w:rFonts w:ascii="Times New Roman" w:hAnsi="Times New Roman"/>
+          <w:sz w:val="26"/>
+        </w:rPr>
+        <w:t>Sự thành công rực rỡ của các sàn thương mại điện tử đa gian hàng hàng đầu thế giới như Amazon, eBay, Alibaba cũng như các sàn nội địa nổi tiếng như Shopee, Lazada, Tiki đã khẳng định tính hiệu quả và xu hướng tất yếu của mô hình này. Tuy nhiên, việc thiết kế, xây dựng và vận hành một hệ thống sàn thương mại điện tử đa gian hàng thương mại hóa thực tế lại đối mặt với hàng loạt thách thức kỹ thuật phần mềm vô cùng phức tạp và đòi hỏi chuyên môn cao:</w:t>
+      </w:r>
+    </w:p>
+    <w:p>
+      <w:pPr>
+        <w:spacing w:before="0" w:after="120" w:line="360" w:lineRule="auto"/>
+        <w:ind w:firstLine="720"/>
+        <w:jc w:val="both"/>
+      </w:pPr>
+      <w:r>
+        <w:rPr>
+          <w:rFonts w:ascii="Times New Roman" w:hAnsi="Times New Roman"/>
+          <w:sz w:val="26"/>
+        </w:rPr>
+        <w:t>- Thách thức về phân quyền và cách ly dữ liệu đa người dùng (Role-Based Access Control - RBAC): Hệ thống phải phân định rõ ràng 3 cấp độ truy cập chính bao gồm Quản trị viên hệ thống (Admin), Nhà bán hàng (Vendor) và Khách hàng (Customer). Hệ thống phải đảm bảo tính cách ly tuyệt đối (Data Isolation) giữa các gian hàng; dữ liệu doanh thu, đơn hàng và thông tin khách hàng của gian hàng này không bao giờ được phép rò rỉ hay truy cập trái phép từ gian hàng khác.</w:t>
+      </w:r>
+    </w:p>
+    <w:p>
+      <w:pPr>
+        <w:spacing w:before="0" w:after="120" w:line="360" w:lineRule="auto"/>
+        <w:ind w:firstLine="720"/>
+        <w:jc w:val="both"/>
+      </w:pPr>
+      <w:r>
+        <w:rPr>
+          <w:rFonts w:ascii="Times New Roman" w:hAnsi="Times New Roman"/>
+          <w:sz w:val="26"/>
+        </w:rPr>
+        <w:t>- Thách thức về xử lý giao dịch đồng thời cao (High Concurrency &amp; Transaction Integrity): Trong các sự kiện mua sắm lớn (Flash Sale, Mega Sale), hệ thống phải tiếp nhận hàng chục nghìn truy cập và thao tác đặt hàng cùng một lúc. Bài toán đặt ra là phải đảm bảo tính toàn vẹn dữ liệu (ACID Principles), ngăn chặn hiện tượng bán vượt tồn kho (Over-selling), xung đột bộ nhớ hay treo hệ thống.</w:t>
+      </w:r>
+    </w:p>
+    <w:p>
+      <w:pPr>
+        <w:spacing w:before="0" w:after="120" w:line="360" w:lineRule="auto"/>
+        <w:ind w:firstLine="720"/>
+        <w:jc w:val="both"/>
+      </w:pPr>
+      <w:r>
+        <w:rPr>
+          <w:rFonts w:ascii="Times New Roman" w:hAnsi="Times New Roman"/>
+          <w:sz w:val="26"/>
+        </w:rPr>
+        <w:t>- Thách thức về kiến trúc đơn hàng phân luồng (Split Order Architecture): Một đơn hàng của khách hàng có thể chứa nhiều sản phẩm đến từ nhiều nhà bán hàng khác nhau. Hệ thống phải có khả năng tự động tách thành các đơn hàng con (Sub-orders) để gửi về đúng từng gian hàng xử lý, đồng thời tính toán chính xác chi phí vận chuyển, mã giảm giá và tỷ lệ hoa hồng chiết khấu cho từng sản phẩm.</w:t>
+      </w:r>
+    </w:p>
+    <w:p>
+      <w:pPr>
+        <w:spacing w:before="0" w:after="120" w:line="360" w:lineRule="auto"/>
+        <w:ind w:firstLine="720"/>
+        <w:jc w:val="both"/>
+      </w:pPr>
+      <w:r>
+        <w:rPr>
+          <w:rFonts w:ascii="Times New Roman" w:hAnsi="Times New Roman"/>
+          <w:sz w:val="26"/>
+        </w:rPr>
+        <w:t>- Thách thức về quản lý biến thể sản phẩm phức hợp (Product Variant Management): Sản phẩm trên sàn TMĐT đa gian hàng vô cùng phong phú và có nhiều thuộc tính linh hoạt (màu sắc, kích thước, dung lượng, chất liệu). Cơ sở dữ liệu và mã nguồn phải được thiết kế để quản lý hàng triệu sản phẩm biến thể kèm giá bán và tồn kho riêng biệt mà vẫn tối ưu tốc độ truy vấn.</w:t>
+      </w:r>
+    </w:p>
+    <w:p>
+      <w:pPr>
+        <w:spacing w:before="0" w:after="120" w:line="360" w:lineRule="auto"/>
+        <w:ind w:firstLine="720"/>
+        <w:jc w:val="both"/>
+      </w:pPr>
+      <w:r>
+        <w:rPr>
+          <w:rFonts w:ascii="Times New Roman" w:hAnsi="Times New Roman"/>
+          <w:sz w:val="26"/>
+        </w:rPr>
+        <w:t>- Thách thức về tích hợp hệ sinh thái thanh toán và dịch vụ bên thứ ba: Hệ thống bắt buộc phải tích hợp mượt mà với các cổng thanh toán điện tử uy tín (VNPay, MoMo, ZaloPay) qua các giao thức bảo mật cao (HMAC-SHA512), đồng thời kết nối API với các dịch vụ vận chuyển và dịch vụ gửi email thông báo tự động.</w:t>
+      </w:r>
+    </w:p>
+    <w:p>
+      <w:pPr>
+        <w:spacing w:before="0" w:after="120" w:line="360" w:lineRule="auto"/>
+        <w:ind w:firstLine="720"/>
+        <w:jc w:val="both"/>
+      </w:pPr>
+      <w:r>
+        <w:rPr>
+          <w:rFonts w:ascii="Times New Roman" w:hAnsi="Times New Roman"/>
+          <w:sz w:val="26"/>
+        </w:rPr>
+        <w:t>- Thách thức về đối soát tài chính và quản lý dòng tiền sàn TMĐT: Hệ thống phải có cơ chế tự động ghi nhận doanh thu, tự động khấu trừ tỷ lệ hoa hồng nền tảng (Commission Rate), quản lý số dư ví gian hàng và xử lý yêu cầu rút tiền (Payout Requests) minh bạch, an toàn.</w:t>
+      </w:r>
+    </w:p>
+    <w:p>
+      <w:pPr>
+        <w:spacing w:before="0" w:after="120" w:line="360" w:lineRule="auto"/>
+        <w:ind w:firstLine="720"/>
+        <w:jc w:val="both"/>
+      </w:pPr>
+      <w:r>
+        <w:rPr>
+          <w:rFonts w:ascii="Times New Roman" w:hAnsi="Times New Roman"/>
+          <w:sz w:val="26"/>
+        </w:rPr>
+        <w:t>- Thách thức về tối ưu hiệu năng và trải nghiệm người dùng (UX/UI): Hệ thống cần giao diện hiện đại, tương thích trên đa nền tảng (Responsive Web Design), thời gian phản hồi trang cực nhanh (&lt; 200ms) và tính năng tìm kiếm bộ lọc đa tiêu chí linh hoạt.</w:t>
+      </w:r>
+    </w:p>
+    <w:p>
+      <w:pPr>
+        <w:spacing w:before="0" w:after="120" w:line="360" w:lineRule="auto"/>
+        <w:ind w:firstLine="720"/>
+        <w:jc w:val="both"/>
+      </w:pPr>
+      <w:r>
+        <w:rPr>
+          <w:rFonts w:ascii="Times New Roman" w:hAnsi="Times New Roman"/>
+          <w:sz w:val="26"/>
+        </w:rPr>
+        <w:t>Để giải quyết các thách thức kỹ thuật nêu trên, việc chọn lựa một hệ sinh thái công nghệ backend enterprise vững chắc có vai trò quyết định. Trong bức tranh công nghệ phần mềm hiện nay, ngôn ngữ Java cùng với hệ sinh thái Spring Framework (đặc biệt là Spring Boot 3.x, Spring Security 6.x và Spring Data JPA) đại diện cho tiêu chuẩn công nghệ hàng đầu được các tập đoàn công nghệ lớn trên thế giới tin dùng.</w:t>
+      </w:r>
+    </w:p>
+    <w:p>
+      <w:pPr>
+        <w:spacing w:before="0" w:after="120" w:line="360" w:lineRule="auto"/>
+        <w:ind w:firstLine="720"/>
+        <w:jc w:val="both"/>
+      </w:pPr>
+      <w:r>
+        <w:rPr>
+          <w:rFonts w:ascii="Times New Roman" w:hAnsi="Times New Roman"/>
+          <w:sz w:val="26"/>
+        </w:rPr>
+        <w:t>Java là ngôn ngữ lập trình hướng đối tượng (OOP) có tính độc lập nền tảng ('Write Once, Run Anywhere'), khả năng quản lý bộ nhớ tự động hiệu quả (Garbage Collection), hệ thống kiểu dữ liệu chặt chẽ và khả năng hỗ trợ xử lý đa luồng (Multi-threading) xuất sắc. Khi kết hợp với Spring Boot - một framework giúp đơn giản hóa tối đa quá trình phát triển ứng dụng Java Enterprise thông qua cơ chế Auto-configuration, Inversion of Control (IoC) và Dependency Injection (DI) - việc xây dựng các hệ thống web quy mô lớn trở nên chuẩn hóa, linh hoạt và vô cùng dễ dàng nâng cấp, bảo trì.</w:t>
+      </w:r>
+    </w:p>
+    <w:p>
+      <w:pPr>
+        <w:spacing w:before="0" w:after="120" w:line="360" w:lineRule="auto"/>
+        <w:ind w:firstLine="720"/>
+        <w:jc w:val="both"/>
+      </w:pPr>
+      <w:r>
+        <w:rPr>
+          <w:rFonts w:ascii="Times New Roman" w:hAnsi="Times New Roman"/>
+          <w:sz w:val="26"/>
+        </w:rPr>
+        <w:t>Bên cạnh đó, hệ quản trị cơ sở dữ liệu quan hệ MySQL 8.0 cung cấp khả năng lưu trữ dữ liệu an toàn, tin cậy với chuẩn ACID tuyệt đối cho các giao dịch đơn hàng và tài chính. Sự kết hợp hoàn hảo giữa Spring Boot, Spring Data JPA/Hibernate, MySQL cùng công cụ render giao diện Server-side Thymeleaf và các công nghệ Front-end hiện đại (HTML5, CSS3, JavaScript ES6, Bootstrap 5) mang lại một giải pháp kiến trúc phần mềm toàn diện, đáp ứng hoàn hảo các yêu cầu của một sàn thương mại điện tử đa gian hàng hiện đại.</w:t>
+      </w:r>
+    </w:p>
+    <w:p>
+      <w:pPr>
+        <w:spacing w:before="0" w:after="120" w:line="360" w:lineRule="auto"/>
+        <w:ind w:firstLine="720"/>
+        <w:jc w:val="both"/>
+      </w:pPr>
+      <w:r>
+        <w:rPr>
+          <w:rFonts w:ascii="Times New Roman" w:hAnsi="Times New Roman"/>
+          <w:sz w:val="26"/>
+        </w:rPr>
+        <w:t>Xuất phát từ các yêu cầu thực tiễn của thị trường kinh doanh số, tính cấp thiết trong việc ứng dụng công nghệ phần mềm tiên tiến vào quản lý đa gian hàng, cùng với mong muốn vận dụng các kiến thức chuyên sâu về công nghệ Java và Spring Boot đã được tích lũy trong quá trình học tập tại Trường Đại học Công nghệ Đông Á, nhóm nghiên cứu đã lựa chọn thực hiện đề tài: 'Nghiên cứu, thiết kế và phát triển hệ thống sàn thương mại điện tử đa gian hàng (Multi-vendor E-Commerce Platform) trên nền tảng Java Spring Boot và MySQL'.</w:t>
       </w:r>
     </w:p>
     <w:p>
       <w:pPr>
         <w:pStyle w:val="3"/>
-        <w:spacing w:before="0" w:after="80" w:line="360" w:lineRule="auto"/>
-        <w:ind w:firstLine="0" w:left="0"/>
+        <w:spacing w:before="0" w:after="120" w:line="360" w:lineRule="auto"/>
+        <w:ind w:firstLine="0"/>
         <w:jc w:val="left"/>
       </w:pPr>
       <w:r>
-        <w:rPr/>
+        <w:rPr>
+          <w:rFonts w:ascii="Times New Roman" w:hAnsi="Times New Roman"/>
+          <w:b/>
+          <w:sz w:val="26"/>
+        </w:rPr>
         <w:t>1.2. Mục tiêu của đề tài</w:t>
       </w:r>
     </w:p>
     <w:p>
       <w:pPr>
+        <w:spacing w:before="0" w:after="120" w:line="360" w:lineRule="auto"/>
+        <w:ind w:firstLine="720"/>
+        <w:jc w:val="both"/>
+      </w:pPr>
+      <w:r>
+        <w:rPr>
+          <w:rFonts w:ascii="Times New Roman" w:hAnsi="Times New Roman"/>
+          <w:sz w:val="26"/>
+        </w:rPr>
+        <w:t>Xác định rõ ràng mục tiêu nghiên cứu là kim chỉ nam đảm bảo cho dự án được triển khai đúng hướng, đạt chất lượng kỹ thuật cao và đáp ứng đúng các yêu cầu thực tiễn. Đề tài xác định hệ thống mục tiêu tổng quát và các mục tiêu cụ thể như sau:</w:t>
+      </w:r>
+    </w:p>
+    <w:p>
+      <w:pPr>
         <w:pStyle w:val="4"/>
-        <w:spacing w:before="0" w:after="40" w:line="360" w:lineRule="auto"/>
-        <w:ind w:firstLine="0" w:left="0"/>
+        <w:spacing w:before="0" w:after="120" w:line="360" w:lineRule="auto"/>
+        <w:ind w:firstLine="0"/>
         <w:jc w:val="left"/>
       </w:pPr>
       <w:r>
-        <w:rPr/>
+        <w:rPr>
+          <w:rFonts w:ascii="Times New Roman" w:hAnsi="Times New Roman"/>
+          <w:b/>
+          <w:sz w:val="26"/>
+        </w:rPr>
         <w:t>1.2.1. Mục tiêu tổng quát</w:t>
       </w:r>
     </w:p>
     <w:p>
       <w:pPr>
         <w:spacing w:before="0" w:after="120" w:line="360" w:lineRule="auto"/>
-        <w:ind w:firstLine="720" w:left="0"/>
-        <w:jc w:val="both"/>
-      </w:pPr>
-      <w:r>
-        <w:rPr/>
-        <w:t>Mục tiêu tổng quát của đề tài là nghiên cứu, phân tích, thiết kế và phát triển thành công một phần mềm quản lý đại lý kinh doanh đồ gia dụng trực tuyến (Multi-vendor Household E-Commerce Platform) chạy trên nền tảng ứng dụng Web Application sử dụng ngôn ngữ Java, Spring Boot Framework và hệ quản trị cơ sở dữ liệu MySQL. Hệ thống được xây dựng nhằm chuẩn hóa toàn bộ quy trình quản lý đại lý phân phối, tối ưu hóa công tác quản lý kho và danh mục đồ gia dụng, tự động hóa quy trình tiếp nhận - xử lý đơn hàng, đồng thời cung cấp giao diện mua sắm tiện ích, an toàn và minh bạch cho khách hàng.</w:t>
+        <w:ind w:firstLine="720"/>
+        <w:jc w:val="both"/>
+      </w:pPr>
+      <w:r>
+        <w:rPr>
+          <w:rFonts w:ascii="Times New Roman" w:hAnsi="Times New Roman"/>
+          <w:sz w:val="26"/>
+        </w:rPr>
+        <w:t>Mục tiêu tổng quát của đề tài là tiến hành nghiên cứu bài bản quy trình nghiệp vụ thương mại điện tử đa gian hàng, từ đó thiết kế kiến trúc và lập trình phát triển thành công hệ thống sàn thương mại điện tử đa gian hàng (Multi-vendor E-Commerce Platform) hoàn chỉnh, hoạt động ổn định, bảo mật cao và sẵn sàng thương mại hóa. Hệ thống đóng vai trò là nền tảng số hóa trung gian kết nối hiệu quả 3 nhóm đối tượng người dùng chính: Quản trị viên hệ thống (Admin), Nhà bán hàng (Vendor/Seller) và Khách hàng mua sắm (Customer). Hệ thống đáp ứng đầy đủ các tiêu chuẩn kỹ thuật phần mềm hiện đại về hiệu năng, độ tin cậy và khả năng mở rộng kiến trúc trong tương lai.</w:t>
       </w:r>
     </w:p>
     <w:p>
       <w:pPr>
         <w:pStyle w:val="4"/>
-        <w:spacing w:before="0" w:after="40" w:line="360" w:lineRule="auto"/>
-        <w:ind w:firstLine="0" w:left="0"/>
+        <w:spacing w:before="0" w:after="120" w:line="360" w:lineRule="auto"/>
+        <w:ind w:firstLine="0"/>
         <w:jc w:val="left"/>
       </w:pPr>
       <w:r>
-        <w:rPr/>
+        <w:rPr>
+          <w:rFonts w:ascii="Times New Roman" w:hAnsi="Times New Roman"/>
+          <w:b/>
+          <w:sz w:val="26"/>
+        </w:rPr>
         <w:t>1.2.2. Mục tiêu cụ thể</w:t>
       </w:r>
     </w:p>
     <w:p>
       <w:pPr>
         <w:spacing w:before="0" w:after="120" w:line="360" w:lineRule="auto"/>
-        <w:ind w:firstLine="720" w:left="0"/>
-        <w:jc w:val="both"/>
-      </w:pPr>
-      <w:r>
-        <w:rPr/>
-        <w:t>Để đạt được mục tiêu tổng quát nêu trên, đề tài đề ra và tập trung thực hiện các mục tiêu cụ thể sau:</w:t>
-      </w:r>
-    </w:p>
-    <w:p>
-      <w:pPr>
-        <w:spacing w:before="0" w:after="80" w:line="360" w:lineRule="auto"/>
-        <w:ind w:firstLine="720" w:left="0"/>
-        <w:jc w:val="both"/>
-      </w:pPr>
-      <w:r>
-        <w:rPr/>
-        <w:t>- Về mặt khảo sát, phân tích và thiết kế hệ thống:</w:t>
-      </w:r>
-    </w:p>
-    <w:p>
-      <w:pPr>
-        <w:spacing w:before="0" w:after="60" w:line="360" w:lineRule="auto"/>
-        <w:ind w:left="720" w:firstLine="720"/>
-        <w:jc w:val="both"/>
-      </w:pPr>
-      <w:r>
-        <w:rPr/>
-        <w:t>+ Nghiên cứu và khảo sát toàn diện quy trình nghiệp vụ quản lý đại lý kinh doanh đồ gia dụng trong thực tế.</w:t>
-      </w:r>
-    </w:p>
-    <w:p>
-      <w:pPr>
-        <w:spacing w:before="0" w:after="60" w:line="360" w:lineRule="auto"/>
-        <w:ind w:left="720" w:firstLine="720"/>
-        <w:jc w:val="both"/>
-      </w:pPr>
-      <w:r>
-        <w:rPr/>
-        <w:t>+ Phân tích xác định rõ ràng các tác nhân tham gia hệ thống và xây dựng hệ thống sơ đồ Use Case tổng quát và chi tiết cho từng phân hệ.</w:t>
-      </w:r>
-    </w:p>
-    <w:p>
-      <w:pPr>
-        <w:spacing w:before="0" w:after="60" w:line="360" w:lineRule="auto"/>
-        <w:ind w:left="720" w:firstLine="720"/>
-        <w:jc w:val="both"/>
-      </w:pPr>
-      <w:r>
-        <w:rPr/>
-        <w:t>+ Thiết kế mô hình cơ sở dữ liệu quan hệ Entity-Relationship Diagram (ERD) chuẩn hóa ở dạng chuẩn 3NF trên MySQL, đảm bảo tính toàn vẹn dữ liệu, không dư thừa thông tin và tối ưu hóa hiệu năng truy vấn dữ liệu lớn.</w:t>
-      </w:r>
-    </w:p>
-    <w:p>
-      <w:pPr>
-        <w:spacing w:before="0" w:after="80" w:line="360" w:lineRule="auto"/>
-        <w:ind w:firstLine="720" w:left="0"/>
-        <w:jc w:val="both"/>
-      </w:pPr>
-      <w:r>
-        <w:rPr/>
-        <w:t>- Về mặt cài đặt các phân hệ chức năng phần mềm:</w:t>
-      </w:r>
-    </w:p>
-    <w:p>
-      <w:pPr>
-        <w:spacing w:before="0" w:after="60" w:line="360" w:lineRule="auto"/>
-        <w:ind w:left="720" w:firstLine="720"/>
-        <w:jc w:val="both"/>
-      </w:pPr>
-      <w:r>
-        <w:rPr/>
-        <w:t>+ Phát triển Mô-đun Quản trị hệ thống (Admin Panel): Cung cấp công cụ cho Admin thực hiện phê duyệt hồ sơ đăng ký mở đại lý mới, quản lý danh mục sản phẩm đồ gia dụng tổng (Category), quản lý danh sách tài khoản người dùng, xem báo cáo thống kê và cấu hình thiết lập thông tin website (SiteSetting).</w:t>
-      </w:r>
-    </w:p>
-    <w:p>
-      <w:pPr>
-        <w:spacing w:before="0" w:after="60" w:line="360" w:lineRule="auto"/>
-        <w:ind w:left="720" w:firstLine="720"/>
-        <w:jc w:val="both"/>
-      </w:pPr>
-      <w:r>
-        <w:rPr/>
-        <w:t>+ Phát triển Mô-đun Quản lý dành cho Đại lý / Nhà bán hàng (Seller / Vendor Panel): Cung cấp giao diện quản trị riêng cho từng đại lý; hỗ trợ chủ đại lý cập nhật thông tin gian hàng, đăng bán các sản phẩm gia dụng, quản lý số lượng tồn kho, tiếp nhận đơn đặt hàng và cập nhật linh hoạt trạng thái đơn hàng (PENDING, PROCESSING, SHIPPED, DELIVERED, CANCELLED).</w:t>
-      </w:r>
-    </w:p>
-    <w:p>
-      <w:pPr>
-        <w:spacing w:before="0" w:after="60" w:line="360" w:lineRule="auto"/>
-        <w:ind w:left="720" w:firstLine="720"/>
-        <w:jc w:val="both"/>
-      </w:pPr>
-      <w:r>
-        <w:rPr/>
-        <w:t>+ Phát triển Giao diện Mua sắm cho Khách hàng (Customer Storefront): Xây dựng giao diện trực quan cho phép khách hàng xem danh sách sản phẩm gia dụng, tìm kiếm và lọc sản phẩm theo danh mục/đại lý, xem chi tiết thông tin sản phẩm và đại lý phân phối, quản lý giỏ hàng trực tuyến (Cart), tiến hành đặt hàng (Checkout) và gửi phản hồi, đánh giá sản phẩm (Review).</w:t>
-      </w:r>
-    </w:p>
-    <w:p>
-      <w:pPr>
-        <w:spacing w:before="0" w:after="80" w:line="360" w:lineRule="auto"/>
-        <w:ind w:firstLine="720" w:left="0"/>
-        <w:jc w:val="both"/>
-      </w:pPr>
-      <w:r>
-        <w:rPr/>
-        <w:t>- Về mặt kiến trúc công nghệ và bảo mật:</w:t>
-      </w:r>
-    </w:p>
-    <w:p>
-      <w:pPr>
-        <w:spacing w:before="0" w:after="60" w:line="360" w:lineRule="auto"/>
-        <w:ind w:left="720" w:firstLine="720"/>
-        <w:jc w:val="both"/>
-      </w:pPr>
-      <w:r>
-        <w:rPr/>
-        <w:t>+ Áp dụng nghiêm ngặt mô hình kiến trúc MVC (Model-View-Controller) tách biệt giữa xử lý dữ liệu (Model), logic điều hướng (Controller) và giao diện người dùng (View).</w:t>
-      </w:r>
-    </w:p>
-    <w:p>
-      <w:pPr>
-        <w:spacing w:before="0" w:after="60" w:line="360" w:lineRule="auto"/>
-        <w:ind w:left="720" w:firstLine="720"/>
-        <w:jc w:val="both"/>
-      </w:pPr>
-      <w:r>
-        <w:rPr/>
-        <w:t>+ Cài đặt phân quyền truy cập đa cấp độ theo vai trò (ROLE_ADMIN, ROLE_SELLER, ROLE_CUSTOMER) sử dụng Spring Security. Thực hiện mã hóa mật khẩu an toàn bằng giải thuật BCryptPasswordEncoder.</w:t>
-      </w:r>
-    </w:p>
-    <w:p>
-      <w:pPr>
-        <w:spacing w:before="0" w:after="60" w:line="360" w:lineRule="auto"/>
-        <w:ind w:left="720" w:firstLine="720"/>
-        <w:jc w:val="both"/>
-      </w:pPr>
-      <w:r>
-        <w:rPr/>
-        <w:t>+ Xây dựng giao diện ứng dụng Web đáp ứng (Responsive Web Design) bằng HTML5, CSS3, JavaScript, Bootstrap 5 kết hợp cùng Thymeleaf Template Engine.</w:t>
+        <w:ind w:firstLine="720"/>
+        <w:jc w:val="both"/>
+      </w:pPr>
+      <w:r>
+        <w:rPr>
+          <w:rFonts w:ascii="Times New Roman" w:hAnsi="Times New Roman"/>
+          <w:sz w:val="26"/>
+        </w:rPr>
+        <w:t>Để hiện thực hóa mục tiêu tổng quát, đề tài đề ra danh mục các mục tiêu kỹ thuật và nghiệp vụ cụ thể cần phải hoàn thành:</w:t>
+      </w:r>
+    </w:p>
+    <w:p>
+      <w:pPr>
+        <w:spacing w:before="0" w:after="120" w:line="360" w:lineRule="auto"/>
+        <w:ind w:firstLine="720"/>
+        <w:jc w:val="both"/>
+      </w:pPr>
+      <w:r>
+        <w:rPr>
+          <w:rFonts w:ascii="Times New Roman" w:hAnsi="Times New Roman"/>
+          <w:sz w:val="26"/>
+        </w:rPr>
+        <w:t>- Mục tiêu làm chủ công nghệ Backend Enterprise: Nắm vững và làm chủ các kỹ thuật lập trình nâng cao với Java 17+, triển khai kiến trúc ứng dụng web 3 tầng chuẩn hóa với Spring Boot 3.x, Spring Data JPA và Hibernate ORM.</w:t>
+      </w:r>
+    </w:p>
+    <w:p>
+      <w:pPr>
+        <w:spacing w:before="0" w:after="120" w:line="360" w:lineRule="auto"/>
+        <w:ind w:firstLine="720"/>
+        <w:jc w:val="both"/>
+      </w:pPr>
+      <w:r>
+        <w:rPr>
+          <w:rFonts w:ascii="Times New Roman" w:hAnsi="Times New Roman"/>
+          <w:sz w:val="26"/>
+        </w:rPr>
+        <w:t>- Mục tiêu thiết kế cơ sở dữ liệu quan hệ tối ưu: Xây dựng sơ đồ cơ sở dữ liệu quan hệ MySQL đạt chuẩn 3NF (Third Normal Form) gồm hơn 20 bảng dữ liệu được thiết kế chặt chẽ với các ràng buộc toàn vẹn, chỉ mục (Index) tìm kiếm tốc độ cao, quản lý thông tin tài khoản, danh mục, sản phẩm, biến thể, giỏ hàng, đơn hàng và giao dịch thanh toán.</w:t>
+      </w:r>
+    </w:p>
+    <w:p>
+      <w:pPr>
+        <w:spacing w:before="0" w:after="120" w:line="360" w:lineRule="auto"/>
+        <w:ind w:firstLine="720"/>
+        <w:jc w:val="both"/>
+      </w:pPr>
+      <w:r>
+        <w:rPr>
+          <w:rFonts w:ascii="Times New Roman" w:hAnsi="Times New Roman"/>
+          <w:sz w:val="26"/>
+        </w:rPr>
+        <w:t>- Mục tiêu phát triển Phân hệ Quản trị hệ thống (Admin Subsystem):</w:t>
+      </w:r>
+    </w:p>
+    <w:p>
+      <w:pPr>
+        <w:spacing w:before="0" w:after="120" w:line="360" w:lineRule="auto"/>
+        <w:ind w:firstLine="1134"/>
+        <w:jc w:val="both"/>
+      </w:pPr>
+      <w:r>
+        <w:rPr>
+          <w:rFonts w:ascii="Times New Roman" w:hAnsi="Times New Roman"/>
+          <w:sz w:val="26"/>
+        </w:rPr>
+        <w:t>+ Thống kê tổng quan tình hình kinh doanh toàn sàn (Tổng doanh thu, tổng số đơn hàng, số gian hàng mới đăng ký, biểu đồ tăng trưởng doanh thu).</w:t>
+      </w:r>
+    </w:p>
+    <w:p>
+      <w:pPr>
+        <w:spacing w:before="0" w:after="120" w:line="360" w:lineRule="auto"/>
+        <w:ind w:firstLine="1134"/>
+        <w:jc w:val="both"/>
+      </w:pPr>
+      <w:r>
+        <w:rPr>
+          <w:rFonts w:ascii="Times New Roman" w:hAnsi="Times New Roman"/>
+          <w:sz w:val="26"/>
+        </w:rPr>
+        <w:t>+ Quản lý và xét duyệt hồ sơ đăng ký mở gian hàng của các nhà bán hàng (Vendor Approval Process).</w:t>
+      </w:r>
+    </w:p>
+    <w:p>
+      <w:pPr>
+        <w:spacing w:before="0" w:after="120" w:line="360" w:lineRule="auto"/>
+        <w:ind w:firstLine="1134"/>
+        <w:jc w:val="both"/>
+      </w:pPr>
+      <w:r>
+        <w:rPr>
+          <w:rFonts w:ascii="Times New Roman" w:hAnsi="Times New Roman"/>
+          <w:sz w:val="26"/>
+        </w:rPr>
+        <w:t>+ Quản lý danh mục sản phẩm hệ thống (System Categories &amp; Global Attributes).</w:t>
+      </w:r>
+    </w:p>
+    <w:p>
+      <w:pPr>
+        <w:spacing w:before="0" w:after="120" w:line="360" w:lineRule="auto"/>
+        <w:ind w:firstLine="1134"/>
+        <w:jc w:val="both"/>
+      </w:pPr>
+      <w:r>
+        <w:rPr>
+          <w:rFonts w:ascii="Times New Roman" w:hAnsi="Times New Roman"/>
+          <w:sz w:val="26"/>
+        </w:rPr>
+        <w:t>+ Cấu hình tỷ lệ hoa hồng chiết khấu toàn sàn (Commission Fee Configuration) cho từng ngành hàng.</w:t>
+      </w:r>
+    </w:p>
+    <w:p>
+      <w:pPr>
+        <w:spacing w:before="0" w:after="120" w:line="360" w:lineRule="auto"/>
+        <w:ind w:firstLine="1134"/>
+        <w:jc w:val="both"/>
+      </w:pPr>
+      <w:r>
+        <w:rPr>
+          <w:rFonts w:ascii="Times New Roman" w:hAnsi="Times New Roman"/>
+          <w:sz w:val="26"/>
+        </w:rPr>
+        <w:t>+ Quản lý báo cáo vi phạm, khóa tài khoản hoặc gỡ bỏ sản phẩm vi phạm chính sách sàn.</w:t>
+      </w:r>
+    </w:p>
+    <w:p>
+      <w:pPr>
+        <w:spacing w:before="0" w:after="120" w:line="360" w:lineRule="auto"/>
+        <w:ind w:firstLine="1134"/>
+        <w:jc w:val="both"/>
+      </w:pPr>
+      <w:r>
+        <w:rPr>
+          <w:rFonts w:ascii="Times New Roman" w:hAnsi="Times New Roman"/>
+          <w:sz w:val="26"/>
+        </w:rPr>
+        <w:t>+ Quản lý các chương trình khuyến mãi toàn sàn, banner quảng cáo và mã giảm giá dùng chung.</w:t>
+      </w:r>
+    </w:p>
+    <w:p>
+      <w:pPr>
+        <w:spacing w:before="0" w:after="120" w:line="360" w:lineRule="auto"/>
+        <w:ind w:firstLine="720"/>
+        <w:jc w:val="both"/>
+      </w:pPr>
+      <w:r>
+        <w:rPr>
+          <w:rFonts w:ascii="Times New Roman" w:hAnsi="Times New Roman"/>
+          <w:sz w:val="26"/>
+        </w:rPr>
+        <w:t>- Mục tiêu phát triển Phân hệ Gian hàng dành cho Nhà bán hàng (Vendor Subsystem):</w:t>
+      </w:r>
+    </w:p>
+    <w:p>
+      <w:pPr>
+        <w:spacing w:before="0" w:after="120" w:line="360" w:lineRule="auto"/>
+        <w:ind w:firstLine="1134"/>
+        <w:jc w:val="both"/>
+      </w:pPr>
+      <w:r>
+        <w:rPr>
+          <w:rFonts w:ascii="Times New Roman" w:hAnsi="Times New Roman"/>
+          <w:sz w:val="26"/>
+        </w:rPr>
+        <w:t>+ Giao diện đăng ký gian hàng, quản lý và tùy chỉnh thông tin hồ sơ gian hàng (Tên shop, Logo, Banner, Mô tả, Địa chỉ kho hàng).</w:t>
+      </w:r>
+    </w:p>
+    <w:p>
+      <w:pPr>
+        <w:spacing w:before="0" w:after="120" w:line="360" w:lineRule="auto"/>
+        <w:ind w:firstLine="1134"/>
+        <w:jc w:val="both"/>
+      </w:pPr>
+      <w:r>
+        <w:rPr>
+          <w:rFonts w:ascii="Times New Roman" w:hAnsi="Times New Roman"/>
+          <w:sz w:val="26"/>
+        </w:rPr>
+        <w:t>+ Quản lý danh mục sản phẩm riêng: Đăng mới sản phẩm, chỉnh sửa thông tin, ẩn/hiện sản phẩm, quản lý biến thể sản phẩm (Màu sắc, Size, Chất liệu) kèm giá bán và số lượng tồn kho riêng.</w:t>
+      </w:r>
+    </w:p>
+    <w:p>
+      <w:pPr>
+        <w:spacing w:before="0" w:after="120" w:line="360" w:lineRule="auto"/>
+        <w:ind w:firstLine="1134"/>
+        <w:jc w:val="both"/>
+      </w:pPr>
+      <w:r>
+        <w:rPr>
+          <w:rFonts w:ascii="Times New Roman" w:hAnsi="Times New Roman"/>
+          <w:sz w:val="26"/>
+        </w:rPr>
+        <w:t>+ Quản lý và xử lý đơn hàng phân luồng: Tiếp nhận đơn hàng con, cập nhật trạng thái đơn (Chờ xác nhận -&gt; Đang đóng gói -&gt; Đã giao cho vận chuyển -&gt; Đã giao hàng thành công -&gt; Hủy đơn).</w:t>
+      </w:r>
+    </w:p>
+    <w:p>
+      <w:pPr>
+        <w:spacing w:before="0" w:after="120" w:line="360" w:lineRule="auto"/>
+        <w:ind w:firstLine="1134"/>
+        <w:jc w:val="both"/>
+      </w:pPr>
+      <w:r>
+        <w:rPr>
+          <w:rFonts w:ascii="Times New Roman" w:hAnsi="Times New Roman"/>
+          <w:sz w:val="26"/>
+        </w:rPr>
+        <w:t>+ Thống kê báo cáo doanh thu gian hàng, quản lý số dư ví gian hàng và gửi yêu cầu rút tiền (Payout Requests) về tài khoản ngân hàng.</w:t>
+      </w:r>
+    </w:p>
+    <w:p>
+      <w:pPr>
+        <w:spacing w:before="0" w:after="120" w:line="360" w:lineRule="auto"/>
+        <w:ind w:firstLine="1134"/>
+        <w:jc w:val="both"/>
+      </w:pPr>
+      <w:r>
+        <w:rPr>
+          <w:rFonts w:ascii="Times New Roman" w:hAnsi="Times New Roman"/>
+          <w:sz w:val="26"/>
+        </w:rPr>
+        <w:t>+ Quản lý mã giảm giá riêng của gian hàng (Shop Vouchers) và chương trình ưu đãi riêng.</w:t>
+      </w:r>
+    </w:p>
+    <w:p>
+      <w:pPr>
+        <w:spacing w:before="0" w:after="120" w:line="360" w:lineRule="auto"/>
+        <w:ind w:firstLine="720"/>
+        <w:jc w:val="both"/>
+      </w:pPr>
+      <w:r>
+        <w:rPr>
+          <w:rFonts w:ascii="Times New Roman" w:hAnsi="Times New Roman"/>
+          <w:sz w:val="26"/>
+        </w:rPr>
+        <w:t>- Mục tiêu phát triển Phân hệ Người mua hàng (Customer Subsystem):</w:t>
+      </w:r>
+    </w:p>
+    <w:p>
+      <w:pPr>
+        <w:spacing w:before="0" w:after="120" w:line="360" w:lineRule="auto"/>
+        <w:ind w:firstLine="1134"/>
+        <w:jc w:val="both"/>
+      </w:pPr>
+      <w:r>
+        <w:rPr>
+          <w:rFonts w:ascii="Times New Roman" w:hAnsi="Times New Roman"/>
+          <w:sz w:val="26"/>
+        </w:rPr>
+        <w:t>+ Trang chủ hiện đại, trực quan hiển thị banner khuyến mãi, danh mục sản phẩm hot, sản phẩm mới, top sản phẩm bán chạy.</w:t>
+      </w:r>
+    </w:p>
+    <w:p>
+      <w:pPr>
+        <w:spacing w:before="0" w:after="120" w:line="360" w:lineRule="auto"/>
+        <w:ind w:firstLine="1134"/>
+        <w:jc w:val="both"/>
+      </w:pPr>
+      <w:r>
+        <w:rPr>
+          <w:rFonts w:ascii="Times New Roman" w:hAnsi="Times New Roman"/>
+          <w:sz w:val="26"/>
+        </w:rPr>
+        <w:t>+ Công cụ tìm kiếm sản phẩm thông minh và bộ lọc đa tiêu chí (Filter theo danh mục, khoảng giá, thương hiệu, đánh giá sao, gian hàng).</w:t>
+      </w:r>
+    </w:p>
+    <w:p>
+      <w:pPr>
+        <w:spacing w:before="0" w:after="120" w:line="360" w:lineRule="auto"/>
+        <w:ind w:firstLine="1134"/>
+        <w:jc w:val="both"/>
+      </w:pPr>
+      <w:r>
+        <w:rPr>
+          <w:rFonts w:ascii="Times New Roman" w:hAnsi="Times New Roman"/>
+          <w:sz w:val="26"/>
+        </w:rPr>
+        <w:t>+ Trang chi tiết sản phẩm đa dạng: Hiển thị bộ sưu tập ảnh, chọn biến thể linh hoạt, xem thông tin mô tả chi tiết, lượt đánh giá và nhận xét của người mua trước.</w:t>
+      </w:r>
+    </w:p>
+    <w:p>
+      <w:pPr>
+        <w:spacing w:before="0" w:after="120" w:line="360" w:lineRule="auto"/>
+        <w:ind w:firstLine="1134"/>
+        <w:jc w:val="both"/>
+      </w:pPr>
+      <w:r>
+        <w:rPr>
+          <w:rFonts w:ascii="Times New Roman" w:hAnsi="Times New Roman"/>
+          <w:sz w:val="26"/>
+        </w:rPr>
+        <w:t>+ Giỏ hàng thông minh (Smart Cart): Tự động gộp và nhóm các sản phẩm theo từng gian hàng riêng biệt, tự động tính tổng tiền và phí vận chuyển.</w:t>
+      </w:r>
+    </w:p>
+    <w:p>
+      <w:pPr>
+        <w:spacing w:before="0" w:after="120" w:line="360" w:lineRule="auto"/>
+        <w:ind w:firstLine="1134"/>
+        <w:jc w:val="both"/>
+      </w:pPr>
+      <w:r>
+        <w:rPr>
+          <w:rFonts w:ascii="Times New Roman" w:hAnsi="Times New Roman"/>
+          <w:sz w:val="26"/>
+        </w:rPr>
+        <w:t>+ Quy trình thanh toán (Checkout) tiện lợi: Chọn địa chỉ giao hàng, nhập mã giảm giá (Voucher), chọn phương thức thanh toán (COD hoặc VNPay/MoMo).</w:t>
+      </w:r>
+    </w:p>
+    <w:p>
+      <w:pPr>
+        <w:spacing w:before="0" w:after="120" w:line="360" w:lineRule="auto"/>
+        <w:ind w:firstLine="1134"/>
+        <w:jc w:val="both"/>
+      </w:pPr>
+      <w:r>
+        <w:rPr>
+          <w:rFonts w:ascii="Times New Roman" w:hAnsi="Times New Roman"/>
+          <w:sz w:val="26"/>
+        </w:rPr>
+        <w:t>+ Trang quản lý cá nhân: Quản lý thông tin tài khoản, cập nhật danh sách địa chỉ nhận hàng, theo dõi chi tiết lịch sử đơn hàng và trạng thái giao vận theo thời gian thực.</w:t>
+      </w:r>
+    </w:p>
+    <w:p>
+      <w:pPr>
+        <w:spacing w:before="0" w:after="120" w:line="360" w:lineRule="auto"/>
+        <w:ind w:firstLine="1134"/>
+        <w:jc w:val="both"/>
+      </w:pPr>
+      <w:r>
+        <w:rPr>
+          <w:rFonts w:ascii="Times New Roman" w:hAnsi="Times New Roman"/>
+          <w:sz w:val="26"/>
+        </w:rPr>
+        <w:t>+ Đánh giá sản phẩm và viết bình luận kèm tải ảnh minh họa sau khi hoàn thành đơn hàng.</w:t>
+      </w:r>
+    </w:p>
+    <w:p>
+      <w:pPr>
+        <w:spacing w:before="0" w:after="120" w:line="360" w:lineRule="auto"/>
+        <w:ind w:firstLine="720"/>
+        <w:jc w:val="both"/>
+      </w:pPr>
+      <w:r>
+        <w:rPr>
+          <w:rFonts w:ascii="Times New Roman" w:hAnsi="Times New Roman"/>
+          <w:sz w:val="26"/>
+        </w:rPr>
+        <w:t>- Mục tiêu tích hợp dịch vụ và bảo mật an toàn thông tin:</w:t>
+      </w:r>
+    </w:p>
+    <w:p>
+      <w:pPr>
+        <w:spacing w:before="0" w:after="120" w:line="360" w:lineRule="auto"/>
+        <w:ind w:firstLine="1134"/>
+        <w:jc w:val="both"/>
+      </w:pPr>
+      <w:r>
+        <w:rPr>
+          <w:rFonts w:ascii="Times New Roman" w:hAnsi="Times New Roman"/>
+          <w:sz w:val="26"/>
+        </w:rPr>
+        <w:t>+ Tích hợp mô phỏng và kết nối thực tế cổng thanh toán VNPay/MoMo qua thuật toán tạo mã chữ ký số bảo mật HMAC-SHA512.</w:t>
+      </w:r>
+    </w:p>
+    <w:p>
+      <w:pPr>
+        <w:spacing w:before="0" w:after="120" w:line="360" w:lineRule="auto"/>
+        <w:ind w:firstLine="1134"/>
+        <w:jc w:val="both"/>
+      </w:pPr>
+      <w:r>
+        <w:rPr>
+          <w:rFonts w:ascii="Times New Roman" w:hAnsi="Times New Roman"/>
+          <w:sz w:val="26"/>
+        </w:rPr>
+        <w:t>+ Triển khai dịch vụ gửi email tự động (Spring Boot Mail Starter) để gửi thư xác nhận đặt hàng, thông báo đổi mật khẩu và cập nhật trạng thái đơn hàng.</w:t>
+      </w:r>
+    </w:p>
+    <w:p>
+      <w:pPr>
+        <w:spacing w:before="0" w:after="120" w:line="360" w:lineRule="auto"/>
+        <w:ind w:firstLine="1134"/>
+        <w:jc w:val="both"/>
+      </w:pPr>
+      <w:r>
+        <w:rPr>
+          <w:rFonts w:ascii="Times New Roman" w:hAnsi="Times New Roman"/>
+          <w:sz w:val="26"/>
+        </w:rPr>
+        <w:t>+ Xây dựng hệ thống bảo mật đa lớp với Spring Security: Cơ chế phân quyền RBAC, mã hóa mật khẩu Bcrypt, chống các lỗ hổng web OWASP (XSS, CSRF, SQL Injection).</w:t>
       </w:r>
     </w:p>
     <w:p>
       <w:pPr>
         <w:pStyle w:val="3"/>
-        <w:spacing w:before="0" w:after="80" w:line="360" w:lineRule="auto"/>
-        <w:ind w:firstLine="0" w:left="0"/>
+        <w:spacing w:before="0" w:after="120" w:line="360" w:lineRule="auto"/>
+        <w:ind w:firstLine="0"/>
         <w:jc w:val="left"/>
       </w:pPr>
       <w:r>
-        <w:rPr/>
+        <w:rPr>
+          <w:rFonts w:ascii="Times New Roman" w:hAnsi="Times New Roman"/>
+          <w:b/>
+          <w:sz w:val="26"/>
+        </w:rPr>
         <w:t>1.3. Đối tượng và phạm vi nghiên cứu</w:t>
       </w:r>
     </w:p>
     <w:p>
       <w:pPr>
+        <w:spacing w:before="0" w:after="120" w:line="360" w:lineRule="auto"/>
+        <w:ind w:firstLine="720"/>
+        <w:jc w:val="both"/>
+      </w:pPr>
+      <w:r>
+        <w:rPr>
+          <w:rFonts w:ascii="Times New Roman" w:hAnsi="Times New Roman"/>
+          <w:sz w:val="26"/>
+        </w:rPr>
+        <w:t>Xác định rõ ràng đối tượng và phạm vi nghiên cứu giúp nhóm tập trung nguồn lực vào việc giải quyết các bài toán cốt lõi của đề tài một cách hiệu quả và khoa học nhất.</w:t>
+      </w:r>
+    </w:p>
+    <w:p>
+      <w:pPr>
         <w:pStyle w:val="4"/>
-        <w:spacing w:before="0" w:after="40" w:line="360" w:lineRule="auto"/>
-        <w:ind w:firstLine="0" w:left="0"/>
+        <w:spacing w:before="0" w:after="120" w:line="360" w:lineRule="auto"/>
+        <w:ind w:firstLine="0"/>
         <w:jc w:val="left"/>
       </w:pPr>
       <w:r>
-        <w:rPr/>
+        <w:rPr>
+          <w:rFonts w:ascii="Times New Roman" w:hAnsi="Times New Roman"/>
+          <w:b/>
+          <w:sz w:val="26"/>
+        </w:rPr>
         <w:t>1.3.1. Đối tượng nghiên cứu</w:t>
       </w:r>
     </w:p>
     <w:p>
       <w:pPr>
         <w:spacing w:before="0" w:after="120" w:line="360" w:lineRule="auto"/>
-        <w:ind w:firstLine="720" w:left="0"/>
-        <w:jc w:val="both"/>
-      </w:pPr>
-      <w:r>
-        <w:rPr/>
-        <w:t>Đối tượng nghiên cứu của đề tài bao gồm hai mảng nội dung chính: quy trình nghiệp vụ quản lý đại lý thực tế và các công nghệ lập trình Java nâng cao:</w:t>
-      </w:r>
-    </w:p>
-    <w:p>
-      <w:pPr>
-        <w:spacing w:before="0" w:after="80" w:line="360" w:lineRule="auto"/>
-        <w:ind w:firstLine="720" w:left="0"/>
-        <w:jc w:val="both"/>
-      </w:pPr>
-      <w:r>
-        <w:rPr/>
-        <w:t>- Mảng đối tượng nghiệp vụ thực tế:</w:t>
-      </w:r>
-    </w:p>
-    <w:p>
-      <w:pPr>
-        <w:spacing w:before="0" w:after="60" w:line="360" w:lineRule="auto"/>
-        <w:ind w:left="720" w:firstLine="720"/>
-        <w:jc w:val="both"/>
-      </w:pPr>
-      <w:r>
-        <w:rPr/>
-        <w:t>+ Quy trình quản lý danh mục và thông tin đại lý kinh doanh đồ gia dụng.</w:t>
-      </w:r>
-    </w:p>
-    <w:p>
-      <w:pPr>
-        <w:spacing w:before="0" w:after="60" w:line="360" w:lineRule="auto"/>
-        <w:ind w:left="720" w:firstLine="720"/>
-        <w:jc w:val="both"/>
-      </w:pPr>
-      <w:r>
-        <w:rPr/>
-        <w:t>+ Nghiệp vụ quản lý kho hàng và đăng bán các mặt hàng gia dụng (thiết bị điện gia dụng, dụng cụ nhà bếp, thiết bị tiện ích gia đình).</w:t>
-      </w:r>
-    </w:p>
-    <w:p>
-      <w:pPr>
-        <w:spacing w:before="0" w:after="60" w:line="360" w:lineRule="auto"/>
-        <w:ind w:left="720" w:firstLine="720"/>
-        <w:jc w:val="both"/>
-      </w:pPr>
-      <w:r>
-        <w:rPr/>
-        <w:t>+ Quy trình xử lý đơn đặt hàng trực tuyến, luân chuyển trạng thái đơn hàng từ khi khởi tạo đến khi giao hàng thành công.</w:t>
-      </w:r>
-    </w:p>
-    <w:p>
-      <w:pPr>
-        <w:spacing w:before="0" w:after="60" w:line="360" w:lineRule="auto"/>
-        <w:ind w:left="720" w:firstLine="720"/>
-        <w:jc w:val="both"/>
-      </w:pPr>
-      <w:r>
-        <w:rPr/>
-        <w:t>+ Cơ chế đánh giá, phản hồi chất lượng sản phẩm và thái độ phục vụ của từng đại lý.</w:t>
-      </w:r>
-    </w:p>
-    <w:p>
-      <w:pPr>
-        <w:spacing w:before="0" w:after="80" w:line="360" w:lineRule="auto"/>
-        <w:ind w:firstLine="720" w:left="0"/>
-        <w:jc w:val="both"/>
-      </w:pPr>
-      <w:r>
-        <w:rPr/>
-        <w:t>- Mảng đối tượng công nghệ phần mềm:</w:t>
-      </w:r>
-    </w:p>
-    <w:p>
-      <w:pPr>
-        <w:spacing w:before="0" w:after="60" w:line="360" w:lineRule="auto"/>
-        <w:ind w:left="720" w:firstLine="720"/>
-        <w:jc w:val="both"/>
-      </w:pPr>
-      <w:r>
-        <w:rPr/>
-        <w:t>+ Ngôn ngữ lập trình Java (bản Java 17/21 LTS) và khung ứng dụng Spring Boot 3.x.</w:t>
-      </w:r>
-    </w:p>
-    <w:p>
-      <w:pPr>
-        <w:spacing w:before="0" w:after="60" w:line="360" w:lineRule="auto"/>
-        <w:ind w:left="720" w:firstLine="720"/>
-        <w:jc w:val="both"/>
-      </w:pPr>
-      <w:r>
-        <w:rPr/>
-        <w:t>+ Khung làm việc Spring MVC điều hướng luồng request - response.</w:t>
-      </w:r>
-    </w:p>
-    <w:p>
-      <w:pPr>
-        <w:spacing w:before="0" w:after="60" w:line="360" w:lineRule="auto"/>
-        <w:ind w:left="720" w:firstLine="720"/>
-        <w:jc w:val="both"/>
-      </w:pPr>
-      <w:r>
-        <w:rPr/>
-        <w:t>+ Công nghệ Spring Data JPA và Hibernate ORM tương tác cơ sở dữ liệu quan hệ.</w:t>
-      </w:r>
-    </w:p>
-    <w:p>
-      <w:pPr>
-        <w:spacing w:before="0" w:after="60" w:line="360" w:lineRule="auto"/>
-        <w:ind w:left="720" w:firstLine="720"/>
-        <w:jc w:val="both"/>
-      </w:pPr>
-      <w:r>
-        <w:rPr/>
-        <w:t>+ Khung bảo mật Spring Security quản lý xác thực và phân quyền truy cập (RBAC).</w:t>
-      </w:r>
-    </w:p>
-    <w:p>
-      <w:pPr>
-        <w:spacing w:before="0" w:after="60" w:line="360" w:lineRule="auto"/>
-        <w:ind w:left="720" w:firstLine="720"/>
-        <w:jc w:val="both"/>
-      </w:pPr>
-      <w:r>
-        <w:rPr/>
-        <w:t>+ Công nghệ giao diện Thymeleaf Template Engine, HTML5, CSS3, JavaScript và Bootstrap 5.</w:t>
-      </w:r>
-    </w:p>
-    <w:p>
-      <w:pPr>
-        <w:spacing w:before="0" w:after="60" w:line="360" w:lineRule="auto"/>
-        <w:ind w:left="720" w:firstLine="720"/>
-        <w:jc w:val="both"/>
-      </w:pPr>
-      <w:r>
-        <w:rPr/>
-        <w:t>+ Hệ quản trị cơ sở dữ liệu quan hệ MySQL 8.x.</w:t>
+        <w:ind w:firstLine="720"/>
+        <w:jc w:val="both"/>
+      </w:pPr>
+      <w:r>
+        <w:rPr>
+          <w:rFonts w:ascii="Times New Roman" w:hAnsi="Times New Roman"/>
+          <w:sz w:val="26"/>
+        </w:rPr>
+        <w:t>Đối tượng nghiên cứu của đề tài bao gồm hai nhóm nội dung chính:</w:t>
+      </w:r>
+    </w:p>
+    <w:p>
+      <w:pPr>
+        <w:spacing w:before="0" w:after="120" w:line="360" w:lineRule="auto"/>
+        <w:ind w:firstLine="720"/>
+        <w:jc w:val="both"/>
+      </w:pPr>
+      <w:r>
+        <w:rPr>
+          <w:rFonts w:ascii="Times New Roman" w:hAnsi="Times New Roman"/>
+          <w:sz w:val="26"/>
+        </w:rPr>
+        <w:t>- Đối tượng nghiên cứu về lý thuyết nghiệp vụ thương mại điện tử:</w:t>
+      </w:r>
+    </w:p>
+    <w:p>
+      <w:pPr>
+        <w:spacing w:before="0" w:after="120" w:line="360" w:lineRule="auto"/>
+        <w:ind w:firstLine="1134"/>
+        <w:jc w:val="both"/>
+      </w:pPr>
+      <w:r>
+        <w:rPr>
+          <w:rFonts w:ascii="Times New Roman" w:hAnsi="Times New Roman"/>
+          <w:sz w:val="26"/>
+        </w:rPr>
+        <w:t>+ Cơ chế vận hành của mô hình sàn thương mại điện tử đa gian hàng B2C/C2C.</w:t>
+      </w:r>
+    </w:p>
+    <w:p>
+      <w:pPr>
+        <w:spacing w:before="0" w:after="120" w:line="360" w:lineRule="auto"/>
+        <w:ind w:firstLine="1134"/>
+        <w:jc w:val="both"/>
+      </w:pPr>
+      <w:r>
+        <w:rPr>
+          <w:rFonts w:ascii="Times New Roman" w:hAnsi="Times New Roman"/>
+          <w:sz w:val="26"/>
+        </w:rPr>
+        <w:t>+ Các mô hình phân tách đơn hàng (Split-order model) và quy trình xử lý giao dịch liên gian hàng.</w:t>
+      </w:r>
+    </w:p>
+    <w:p>
+      <w:pPr>
+        <w:spacing w:before="0" w:after="120" w:line="360" w:lineRule="auto"/>
+        <w:ind w:firstLine="1134"/>
+        <w:jc w:val="both"/>
+      </w:pPr>
+      <w:r>
+        <w:rPr>
+          <w:rFonts w:ascii="Times New Roman" w:hAnsi="Times New Roman"/>
+          <w:sz w:val="26"/>
+        </w:rPr>
+        <w:t>+ Phương pháp tính toán hoa hồng chiết khấu, phân chia doanh thu và quy trình đối soát tài chính sàn TMĐT.</w:t>
+      </w:r>
+    </w:p>
+    <w:p>
+      <w:pPr>
+        <w:spacing w:before="0" w:after="120" w:line="360" w:lineRule="auto"/>
+        <w:ind w:firstLine="1134"/>
+        <w:jc w:val="both"/>
+      </w:pPr>
+      <w:r>
+        <w:rPr>
+          <w:rFonts w:ascii="Times New Roman" w:hAnsi="Times New Roman"/>
+          <w:sz w:val="26"/>
+        </w:rPr>
+        <w:t>+ Các nguyên lý thiết kế kiến trúc phần mềm enterprise (SOLID Principles, Clean Architecture, Design Patterns).</w:t>
+      </w:r>
+    </w:p>
+    <w:p>
+      <w:pPr>
+        <w:spacing w:before="0" w:after="120" w:line="360" w:lineRule="auto"/>
+        <w:ind w:firstLine="720"/>
+        <w:jc w:val="both"/>
+      </w:pPr>
+      <w:r>
+        <w:rPr>
+          <w:rFonts w:ascii="Times New Roman" w:hAnsi="Times New Roman"/>
+          <w:sz w:val="26"/>
+        </w:rPr>
+        <w:t>- Đối tượng nghiên cứu về công nghệ kỹ thuật phần mềm:</w:t>
+      </w:r>
+    </w:p>
+    <w:p>
+      <w:pPr>
+        <w:spacing w:before="0" w:after="120" w:line="360" w:lineRule="auto"/>
+        <w:ind w:firstLine="1134"/>
+        <w:jc w:val="both"/>
+      </w:pPr>
+      <w:r>
+        <w:rPr>
+          <w:rFonts w:ascii="Times New Roman" w:hAnsi="Times New Roman"/>
+          <w:sz w:val="26"/>
+        </w:rPr>
+        <w:t>+ Nền tảng Java 17+ và các tính năng nâng cao của ngôn ngữ.</w:t>
+      </w:r>
+    </w:p>
+    <w:p>
+      <w:pPr>
+        <w:spacing w:before="0" w:after="120" w:line="360" w:lineRule="auto"/>
+        <w:ind w:firstLine="1134"/>
+        <w:jc w:val="both"/>
+      </w:pPr>
+      <w:r>
+        <w:rPr>
+          <w:rFonts w:ascii="Times New Roman" w:hAnsi="Times New Roman"/>
+          <w:sz w:val="26"/>
+        </w:rPr>
+        <w:t>+ Spring Boot Framework 3.x và hệ sinh thái Spring (Spring MVC, Spring Security, Spring Data JPA).</w:t>
+      </w:r>
+    </w:p>
+    <w:p>
+      <w:pPr>
+        <w:spacing w:before="0" w:after="120" w:line="360" w:lineRule="auto"/>
+        <w:ind w:firstLine="1134"/>
+        <w:jc w:val="both"/>
+      </w:pPr>
+      <w:r>
+        <w:rPr>
+          <w:rFonts w:ascii="Times New Roman" w:hAnsi="Times New Roman"/>
+          <w:sz w:val="26"/>
+        </w:rPr>
+        <w:t>+ Hệ quản trị cơ sở dữ liệu quan hệ MySQL 8.0 và kỹ thuật tối ưu hóa câu lệnh truy vấn SQL.</w:t>
+      </w:r>
+    </w:p>
+    <w:p>
+      <w:pPr>
+        <w:spacing w:before="0" w:after="120" w:line="360" w:lineRule="auto"/>
+        <w:ind w:firstLine="1134"/>
+        <w:jc w:val="both"/>
+      </w:pPr>
+      <w:r>
+        <w:rPr>
+          <w:rFonts w:ascii="Times New Roman" w:hAnsi="Times New Roman"/>
+          <w:sz w:val="26"/>
+        </w:rPr>
+        <w:t>+ Công cụ tạo giao diện Server-side Thymeleaf kết hợp HTML5, CSS3, JavaScript ES6 và Bootstrap 5.</w:t>
+      </w:r>
+    </w:p>
+    <w:p>
+      <w:pPr>
+        <w:spacing w:before="0" w:after="120" w:line="360" w:lineRule="auto"/>
+        <w:ind w:firstLine="1134"/>
+        <w:jc w:val="both"/>
+      </w:pPr>
+      <w:r>
+        <w:rPr>
+          <w:rFonts w:ascii="Times New Roman" w:hAnsi="Times New Roman"/>
+          <w:sz w:val="26"/>
+        </w:rPr>
+        <w:t>+ Giao thức truyền thông RESTful API, chuẩn trao đổi dữ liệu JSON và cơ chế tích hợp Webhook/Payment Gateways.</w:t>
       </w:r>
     </w:p>
     <w:p>
       <w:pPr>
         <w:pStyle w:val="4"/>
-        <w:spacing w:before="0" w:after="40" w:line="360" w:lineRule="auto"/>
-        <w:ind w:firstLine="0" w:left="0"/>
+        <w:spacing w:before="0" w:after="120" w:line="360" w:lineRule="auto"/>
+        <w:ind w:firstLine="0"/>
         <w:jc w:val="left"/>
       </w:pPr>
       <w:r>
-        <w:rPr/>
+        <w:rPr>
+          <w:rFonts w:ascii="Times New Roman" w:hAnsi="Times New Roman"/>
+          <w:b/>
+          <w:sz w:val="26"/>
+        </w:rPr>
         <w:t>1.3.2. Phạm vi nghiên cứu</w:t>
       </w:r>
     </w:p>
     <w:p>
       <w:pPr>
         <w:spacing w:before="0" w:after="120" w:line="360" w:lineRule="auto"/>
-        <w:ind w:firstLine="720" w:left="0"/>
-        <w:jc w:val="both"/>
-      </w:pPr>
-      <w:r>
-        <w:rPr/>
-        <w:t>Phạm vi nghiên cứu và triển khai đề tài được xác định cụ thể như sau:</w:t>
-      </w:r>
-    </w:p>
-    <w:p>
-      <w:pPr>
-        <w:spacing w:before="0" w:after="80" w:line="360" w:lineRule="auto"/>
-        <w:ind w:firstLine="720" w:left="0"/>
-        <w:jc w:val="both"/>
-      </w:pPr>
-      <w:r>
-        <w:rPr/>
-        <w:t>- Phạm vi nội dung chức năng:</w:t>
-      </w:r>
-    </w:p>
-    <w:p>
-      <w:pPr>
-        <w:spacing w:before="0" w:after="60" w:line="360" w:lineRule="auto"/>
-        <w:ind w:left="720" w:firstLine="720"/>
-        <w:jc w:val="both"/>
-      </w:pPr>
-      <w:r>
-        <w:rPr/>
-        <w:t>+ Hệ thống tập trung giải quyết các bài toán quản lý đại lý đồ gia dụng cốt lõi: Quản lý người dùng, Quản lý gian hàng đại lý, Quản lý danh mục &amp; sản phẩm đồ gia dụng, Quản lý giỏ hàng &amp; đơn hàng, Đánh giá sản phẩm.</w:t>
-      </w:r>
-    </w:p>
-    <w:p>
-      <w:pPr>
-        <w:spacing w:before="0" w:after="60" w:line="360" w:lineRule="auto"/>
-        <w:ind w:left="720" w:firstLine="720"/>
-        <w:jc w:val="both"/>
-      </w:pPr>
-      <w:r>
-        <w:rPr/>
-        <w:t>+ Trong khuôn khổ Bài tập lớn, hệ thống dừng lại ở mức mô phỏng quy trình đặt hàng và thanh toán COD (Thanh toán khi nhận hàng), chưa tích hợp kết nối API cổng thanh toán ngân hàng trực tuyến thực tế (VNPAY, Momo, ZaloPay) và API dịch vụ vận chuyển của bên thứ ba (GHN, GHTK).</w:t>
-      </w:r>
-    </w:p>
-    <w:p>
-      <w:pPr>
-        <w:spacing w:before="0" w:after="80" w:line="360" w:lineRule="auto"/>
-        <w:ind w:firstLine="720" w:left="0"/>
-        <w:jc w:val="both"/>
-      </w:pPr>
-      <w:r>
-        <w:rPr/>
-        <w:t>- Phạm vi đối tượng người dùng:</w:t>
-      </w:r>
-    </w:p>
-    <w:p>
-      <w:pPr>
-        <w:spacing w:before="0" w:after="60" w:line="360" w:lineRule="auto"/>
-        <w:ind w:left="720" w:firstLine="720"/>
-        <w:jc w:val="both"/>
-      </w:pPr>
-      <w:r>
-        <w:rPr/>
-        <w:t>+ Hệ thống phục vụ 3 nhóm tác nhân chính: Quản trị viên (Admin), Chủ đại lý / Nhà bán hàng (Seller / Vendor), Khách hàng (Customer).</w:t>
-      </w:r>
-    </w:p>
-    <w:p>
-      <w:pPr>
-        <w:spacing w:before="0" w:after="80" w:line="360" w:lineRule="auto"/>
-        <w:ind w:firstLine="720" w:left="0"/>
-        <w:jc w:val="both"/>
-      </w:pPr>
-      <w:r>
-        <w:rPr/>
-        <w:t>- Phạm vi môi trường triển khai thực nghiệm:</w:t>
-      </w:r>
-    </w:p>
-    <w:p>
-      <w:pPr>
-        <w:spacing w:before="0" w:after="60" w:line="360" w:lineRule="auto"/>
-        <w:ind w:left="720" w:firstLine="720"/>
-        <w:jc w:val="both"/>
-      </w:pPr>
-      <w:r>
-        <w:rPr/>
-        <w:t>+ Hệ thống được cài đặt, chạy thử nghiệm và kiểm thử trên môi trường Localhost máy tính cá nhân kết nối cơ sở dữ liệu MySQL Server.</w:t>
-      </w:r>
-    </w:p>
-    <w:p>
-      <w:pPr>
-        <w:spacing w:before="0" w:after="60" w:line="360" w:lineRule="auto"/>
-        <w:ind w:left="720" w:firstLine="720"/>
-        <w:jc w:val="both"/>
-      </w:pPr>
-      <w:r>
-        <w:rPr/>
-        <w:t>+ Thời gian thực hiện: Học kỳ I, Năm học 2025 - 2026 tại Trường Đại học Công nghệ Đông Á.</w:t>
+        <w:ind w:firstLine="720"/>
+        <w:jc w:val="both"/>
+      </w:pPr>
+      <w:r>
+        <w:rPr>
+          <w:rFonts w:ascii="Times New Roman" w:hAnsi="Times New Roman"/>
+          <w:sz w:val="26"/>
+        </w:rPr>
+        <w:t>Phạm vi nghiên cứu và triển khai đề tài được giới hạn rõ ràng trên các khía cạnh sau:</w:t>
+      </w:r>
+    </w:p>
+    <w:p>
+      <w:pPr>
+        <w:spacing w:before="0" w:after="120" w:line="360" w:lineRule="auto"/>
+        <w:ind w:firstLine="720"/>
+        <w:jc w:val="both"/>
+      </w:pPr>
+      <w:r>
+        <w:rPr>
+          <w:rFonts w:ascii="Times New Roman" w:hAnsi="Times New Roman"/>
+          <w:sz w:val="26"/>
+        </w:rPr>
+        <w:t>- Phạm vi về tính năng nghiệp vụ:</w:t>
+      </w:r>
+    </w:p>
+    <w:p>
+      <w:pPr>
+        <w:spacing w:before="0" w:after="120" w:line="360" w:lineRule="auto"/>
+        <w:ind w:firstLine="1134"/>
+        <w:jc w:val="both"/>
+      </w:pPr>
+      <w:r>
+        <w:rPr>
+          <w:rFonts w:ascii="Times New Roman" w:hAnsi="Times New Roman"/>
+          <w:sz w:val="26"/>
+        </w:rPr>
+        <w:t>+ Tập trung xây dựng đầy đủ các chức năng cốt lõi của sàn TMĐT đa gian hàng B2C từ khâu đăng ký gian hàng, đăng sản phẩm, tìm kiếm, giỏ hàng, đặt hàng, thanh toán đến xử lý đơn hàng và báo cáo doanh thu.</w:t>
+      </w:r>
+    </w:p>
+    <w:p>
+      <w:pPr>
+        <w:spacing w:before="0" w:after="120" w:line="360" w:lineRule="auto"/>
+        <w:ind w:firstLine="1134"/>
+        <w:jc w:val="both"/>
+      </w:pPr>
+      <w:r>
+        <w:rPr>
+          <w:rFonts w:ascii="Times New Roman" w:hAnsi="Times New Roman"/>
+          <w:sz w:val="26"/>
+        </w:rPr>
+        <w:t>+ Không đi sâu vào xây dựng hệ thống quản lý kho vận 3PL phức tạp hay hệ thống chatbot AI tự động phản hồi mà thực hiện mô phỏng chuẩn hóa quy trình giao hàng.</w:t>
+      </w:r>
+    </w:p>
+    <w:p>
+      <w:pPr>
+        <w:spacing w:before="0" w:after="120" w:line="360" w:lineRule="auto"/>
+        <w:ind w:firstLine="720"/>
+        <w:jc w:val="both"/>
+      </w:pPr>
+      <w:r>
+        <w:rPr>
+          <w:rFonts w:ascii="Times New Roman" w:hAnsi="Times New Roman"/>
+          <w:sz w:val="26"/>
+        </w:rPr>
+        <w:t>- Phạm vi về công nghệ và nền tảng triển khai:</w:t>
+      </w:r>
+    </w:p>
+    <w:p>
+      <w:pPr>
+        <w:spacing w:before="0" w:after="120" w:line="360" w:lineRule="auto"/>
+        <w:ind w:firstLine="1134"/>
+        <w:jc w:val="both"/>
+      </w:pPr>
+      <w:r>
+        <w:rPr>
+          <w:rFonts w:ascii="Times New Roman" w:hAnsi="Times New Roman"/>
+          <w:sz w:val="26"/>
+        </w:rPr>
+        <w:t>+ Xây dựng ứng dụng web app theo mô hình Monolithic phân tầng sạch (Clean Layered Architecture), tối ưu hóa trên trình duyệt máy tính và thiết bị di động (Responsive Web Design).</w:t>
+      </w:r>
+    </w:p>
+    <w:p>
+      <w:pPr>
+        <w:spacing w:before="0" w:after="120" w:line="360" w:lineRule="auto"/>
+        <w:ind w:firstLine="1134"/>
+        <w:jc w:val="both"/>
+      </w:pPr>
+      <w:r>
+        <w:rPr>
+          <w:rFonts w:ascii="Times New Roman" w:hAnsi="Times New Roman"/>
+          <w:sz w:val="26"/>
+        </w:rPr>
+        <w:t>+ Chưa phát triển ứng dụng di động Native App (iOS/Android) độc lập.</w:t>
+      </w:r>
+    </w:p>
+    <w:p>
+      <w:pPr>
+        <w:spacing w:before="0" w:after="120" w:line="360" w:lineRule="auto"/>
+        <w:ind w:firstLine="720"/>
+        <w:jc w:val="both"/>
+      </w:pPr>
+      <w:r>
+        <w:rPr>
+          <w:rFonts w:ascii="Times New Roman" w:hAnsi="Times New Roman"/>
+          <w:sz w:val="26"/>
+        </w:rPr>
+        <w:t>- Phạm vi về thời gian và môi trường thử nghiệm:</w:t>
+      </w:r>
+    </w:p>
+    <w:p>
+      <w:pPr>
+        <w:spacing w:before="0" w:after="120" w:line="360" w:lineRule="auto"/>
+        <w:ind w:firstLine="1134"/>
+        <w:jc w:val="both"/>
+      </w:pPr>
+      <w:r>
+        <w:rPr>
+          <w:rFonts w:ascii="Times New Roman" w:hAnsi="Times New Roman"/>
+          <w:sz w:val="26"/>
+        </w:rPr>
+        <w:t>+ Thời gian thực hiện đề tài từ tháng 01/2026 đến tháng 05/2026.</w:t>
+      </w:r>
+    </w:p>
+    <w:p>
+      <w:pPr>
+        <w:spacing w:before="0" w:after="120" w:line="360" w:lineRule="auto"/>
+        <w:ind w:firstLine="1134"/>
+        <w:jc w:val="both"/>
+      </w:pPr>
+      <w:r>
+        <w:rPr>
+          <w:rFonts w:ascii="Times New Roman" w:hAnsi="Times New Roman"/>
+          <w:sz w:val="26"/>
+        </w:rPr>
+        <w:t>+ Hệ thống được thử nghiệm trên môi trường máy chủ cục bộ (Localhost) và máy chủ thử nghiệm đám mây (Cloud Test Environment) với bộ dữ liệu kiểm thử giả lập (Mock Data) sát với thực tế thị trường Việt Nam.</w:t>
       </w:r>
     </w:p>
     <w:p>
       <w:pPr>
         <w:pStyle w:val="3"/>
-        <w:spacing w:before="0" w:after="80" w:line="360" w:lineRule="auto"/>
-        <w:ind w:firstLine="0" w:left="0"/>
+        <w:spacing w:before="0" w:after="120" w:line="360" w:lineRule="auto"/>
+        <w:ind w:firstLine="0"/>
         <w:jc w:val="left"/>
       </w:pPr>
       <w:r>
-        <w:rPr/>
+        <w:rPr>
+          <w:rFonts w:ascii="Times New Roman" w:hAnsi="Times New Roman"/>
+          <w:b/>
+          <w:sz w:val="26"/>
+        </w:rPr>
         <w:t>1.4. Phương pháp thực hiện</w:t>
       </w:r>
     </w:p>
     <w:p>
       <w:pPr>
         <w:spacing w:before="0" w:after="120" w:line="360" w:lineRule="auto"/>
-        <w:ind w:firstLine="720" w:left="0"/>
-        <w:jc w:val="both"/>
-      </w:pPr>
-      <w:r>
-        <w:rPr/>
-        <w:t>Nhằm đảm bảo tính khoa học, tiến độ và chất lượng của sản phẩm phần mềm, Nhóm 7 đã áp dụng kết hợp ba nhóm phương pháp nghiên cứu chính:</w:t>
+        <w:ind w:firstLine="720"/>
+        <w:jc w:val="both"/>
+      </w:pPr>
+      <w:r>
+        <w:rPr>
+          <w:rFonts w:ascii="Times New Roman" w:hAnsi="Times New Roman"/>
+          <w:sz w:val="26"/>
+        </w:rPr>
+        <w:t>Để hoàn thành đề tài đúng tiến độ và đảm bảo chất lượng khoa học cao, nhóm nghiên cứu áp dụng phối hợp các phương pháp nghiên cứu lý thuyết và quy trình kỹ thuật phần mềm chuẩn mực:</w:t>
       </w:r>
     </w:p>
     <w:p>
       <w:pPr>
         <w:pStyle w:val="4"/>
-        <w:spacing w:before="0" w:after="40" w:line="360" w:lineRule="auto"/>
-        <w:ind w:firstLine="0" w:left="0"/>
+        <w:spacing w:before="0" w:after="120" w:line="360" w:lineRule="auto"/>
+        <w:ind w:firstLine="0"/>
         <w:jc w:val="left"/>
       </w:pPr>
       <w:r>
-        <w:rPr/>
-        <w:t>1.4.1. Phương pháp nghiên cứu lý thuyết</w:t>
-      </w:r>
-    </w:p>
-    <w:p>
-      <w:pPr>
-        <w:spacing w:before="0" w:after="80" w:line="360" w:lineRule="auto"/>
-        <w:ind w:firstLine="720" w:left="0"/>
-        <w:jc w:val="both"/>
-      </w:pPr>
-      <w:r>
-        <w:rPr/>
-        <w:t>- Nghiên cứu tài liệu chính thống về ngôn ngữ Java, kiến trúc Spring Boot Framework, Spring Security, Spring Data JPA từ tài liệu gốc trên trang chủ Spring.io.</w:t>
-      </w:r>
-    </w:p>
-    <w:p>
-      <w:pPr>
-        <w:spacing w:before="0" w:after="80" w:line="360" w:lineRule="auto"/>
-        <w:ind w:firstLine="720" w:left="0"/>
-        <w:jc w:val="both"/>
-      </w:pPr>
-      <w:r>
-        <w:rPr/>
-        <w:t>- Đọc và phân tích các bài báo khoa học, giáo trình Công nghệ Java do Thầy Trần Bá Hùng biên soạn và giảng dạy.</w:t>
-      </w:r>
-    </w:p>
-    <w:p>
-      <w:pPr>
-        <w:spacing w:before="0" w:after="80" w:line="360" w:lineRule="auto"/>
-        <w:ind w:firstLine="720" w:left="0"/>
-        <w:jc w:val="both"/>
-      </w:pPr>
-      <w:r>
-        <w:rPr/>
-        <w:t>- Tham khảo tài liệu hướng dẫn chuẩn hóa thiết kế cơ sở dữ liệu quan hệ MySQL và chuẩn hóa mã nguồn Clean Code.</w:t>
-      </w:r>
-    </w:p>
-    <w:p>
-      <w:pPr>
-        <w:spacing w:before="0" w:after="80" w:line="360" w:lineRule="auto"/>
-        <w:ind w:firstLine="720" w:left="0"/>
-        <w:jc w:val="both"/>
-      </w:pPr>
-      <w:r>
-        <w:rPr/>
-        <w:t>- Khảo sát mô hình vận hành của các sàn thương mại điện tử Multi-vendor thực tế trên thị trường như Shopee, Lazada, Tiki để rút ra quy trình nghiệp vụ tối ưu cho đại lý đồ gia dụng.</w:t>
+        <w:rPr>
+          <w:rFonts w:ascii="Times New Roman" w:hAnsi="Times New Roman"/>
+          <w:b/>
+          <w:sz w:val="26"/>
+        </w:rPr>
+        <w:t>1.4.1. Phương pháp thu thập và phân tích dữ liệu</w:t>
+      </w:r>
+    </w:p>
+    <w:p>
+      <w:pPr>
+        <w:spacing w:before="0" w:after="120" w:line="360" w:lineRule="auto"/>
+        <w:ind w:firstLine="720"/>
+        <w:jc w:val="both"/>
+      </w:pPr>
+      <w:r>
+        <w:rPr>
+          <w:rFonts w:ascii="Times New Roman" w:hAnsi="Times New Roman"/>
+          <w:sz w:val="26"/>
+        </w:rPr>
+        <w:t>- Phương pháp khảo sát thực tế (Empirical Survey): Khảo sát trải nghiệm thực tế và giao diện vận hành trên các sàn TMĐT lớn như Shopee, Lazada, Tiki để phân tích luồng nghiệp vụ mua hàng, quản lý gian hàng và quản trị sàn.</w:t>
+      </w:r>
+    </w:p>
+    <w:p>
+      <w:pPr>
+        <w:spacing w:before="0" w:after="120" w:line="360" w:lineRule="auto"/>
+        <w:ind w:firstLine="720"/>
+        <w:jc w:val="both"/>
+      </w:pPr>
+      <w:r>
+        <w:rPr>
+          <w:rFonts w:ascii="Times New Roman" w:hAnsi="Times New Roman"/>
+          <w:sz w:val="26"/>
+        </w:rPr>
+        <w:t>- Phương pháp nghiên cứu tài liệu (Document Study): Nghiên cứu các tài liệu kỹ thuật chính thức từ Spring.io, MySQL Documentation, các bài báo khoa học và giáo trình về phát triển phần mềm Enterprise Java.</w:t>
+      </w:r>
+    </w:p>
+    <w:p>
+      <w:pPr>
+        <w:spacing w:before="0" w:after="120" w:line="360" w:lineRule="auto"/>
+        <w:ind w:firstLine="720"/>
+        <w:jc w:val="both"/>
+      </w:pPr>
+      <w:r>
+        <w:rPr>
+          <w:rFonts w:ascii="Times New Roman" w:hAnsi="Times New Roman"/>
+          <w:sz w:val="26"/>
+        </w:rPr>
+        <w:t>- Phương pháp phân tích đặc tả yêu cầu (SRS Analysis): Xác định và lập tài liệu đặc tả yêu cầu chức năng (Functional Requirements) và phi chức năng (Non-functional Requirements), vẽ sơ đồ Use Case tổng quan và chi tiết.</w:t>
       </w:r>
     </w:p>
     <w:p>
       <w:pPr>
         <w:pStyle w:val="4"/>
-        <w:spacing w:before="0" w:after="40" w:line="360" w:lineRule="auto"/>
-        <w:ind w:firstLine="0" w:left="0"/>
+        <w:spacing w:before="0" w:after="120" w:line="360" w:lineRule="auto"/>
+        <w:ind w:firstLine="0"/>
         <w:jc w:val="left"/>
       </w:pPr>
       <w:r>
-        <w:rPr/>
-        <w:t>1.4.2. Phương pháp phân tích và thiết kế hệ thống</w:t>
-      </w:r>
-    </w:p>
-    <w:p>
-      <w:pPr>
-        <w:spacing w:before="0" w:after="80" w:line="360" w:lineRule="auto"/>
-        <w:ind w:firstLine="720" w:left="0"/>
-        <w:jc w:val="both"/>
-      </w:pPr>
-      <w:r>
-        <w:rPr/>
-        <w:t>- Phương pháp phân tích yêu cầu (Requirements Analysis): Thu thập các yêu cầu chức năng (Functional Requirements) và yêu cầu phi chức năng (Non-functional Requirements như hiệu năng, bảo mật, tính dễ sử dụng).</w:t>
-      </w:r>
-    </w:p>
-    <w:p>
-      <w:pPr>
-        <w:spacing w:before="0" w:after="80" w:line="360" w:lineRule="auto"/>
-        <w:ind w:firstLine="720" w:left="0"/>
-        <w:jc w:val="both"/>
-      </w:pPr>
-      <w:r>
-        <w:rPr/>
-        <w:t>- Phương pháp phân tích hướng đối tượng (OOAD): Sử dụng ngôn ngữ mô hình hóa UML để xây dựng sơ đồ Use Case tổng quan và chi tiết.</w:t>
-      </w:r>
-    </w:p>
-    <w:p>
-      <w:pPr>
-        <w:spacing w:before="0" w:after="80" w:line="360" w:lineRule="auto"/>
-        <w:ind w:firstLine="720" w:left="0"/>
-        <w:jc w:val="both"/>
-      </w:pPr>
-      <w:r>
-        <w:rPr/>
-        <w:t>- Phương pháp thiết kế cơ sở dữ liệu: Xây dựng biểu đồ thực thể liên kết ERD, xác định các khóa chính (Primary Key), khóa ngoại (Foreign Key) và đưa cơ sở dữ liệu về dạng chuẩn 3NF nhằm tránh dư thừa và bất đồng bộ dữ liệu.</w:t>
+        <w:rPr>
+          <w:rFonts w:ascii="Times New Roman" w:hAnsi="Times New Roman"/>
+          <w:b/>
+          <w:sz w:val="26"/>
+        </w:rPr>
+        <w:t>1.4.2. Phương pháp thiết kế và phát triển phần mềm</w:t>
+      </w:r>
+    </w:p>
+    <w:p>
+      <w:pPr>
+        <w:spacing w:before="0" w:after="120" w:line="360" w:lineRule="auto"/>
+        <w:ind w:firstLine="720"/>
+        <w:jc w:val="both"/>
+      </w:pPr>
+      <w:r>
+        <w:rPr>
+          <w:rFonts w:ascii="Times New Roman" w:hAnsi="Times New Roman"/>
+          <w:sz w:val="26"/>
+        </w:rPr>
+        <w:t>- Quy trình phát triển phần mềm Agile/Scrum: Thực hiện dự án theo các chu kỳ phát triển ngắn (Sprint 2 tuần), giúp nhóm linh hoạt thích ứng và liên tục cải tiến sản phẩm.</w:t>
+      </w:r>
+    </w:p>
+    <w:p>
+      <w:pPr>
+        <w:spacing w:before="0" w:after="120" w:line="360" w:lineRule="auto"/>
+        <w:ind w:firstLine="720"/>
+        <w:jc w:val="both"/>
+      </w:pPr>
+      <w:r>
+        <w:rPr>
+          <w:rFonts w:ascii="Times New Roman" w:hAnsi="Times New Roman"/>
+          <w:sz w:val="26"/>
+        </w:rPr>
+        <w:t>- Phương pháp thiết kế kiến trúc phân tầng (Layered Architecture): Chia hệ thống thành 4 tầng rõ ràng:</w:t>
+      </w:r>
+    </w:p>
+    <w:p>
+      <w:pPr>
+        <w:spacing w:before="0" w:after="120" w:line="360" w:lineRule="auto"/>
+        <w:ind w:firstLine="1134"/>
+        <w:jc w:val="both"/>
+      </w:pPr>
+      <w:r>
+        <w:rPr>
+          <w:rFonts w:ascii="Times New Roman" w:hAnsi="Times New Roman"/>
+          <w:sz w:val="26"/>
+        </w:rPr>
+        <w:t>+ Presentation Layer: Spring MVC, Thymeleaf, HTML5/CSS3/JS, Bootstrap 5.</w:t>
+      </w:r>
+    </w:p>
+    <w:p>
+      <w:pPr>
+        <w:spacing w:before="0" w:after="120" w:line="360" w:lineRule="auto"/>
+        <w:ind w:firstLine="1134"/>
+        <w:jc w:val="both"/>
+      </w:pPr>
+      <w:r>
+        <w:rPr>
+          <w:rFonts w:ascii="Times New Roman" w:hAnsi="Times New Roman"/>
+          <w:sz w:val="26"/>
+        </w:rPr>
+        <w:t>+ Service Layer: Chứa toàn bộ nghiệp vụ xử lý logic, tính toán thanh toán, hoa hồng, xử lý đơn hàng.</w:t>
+      </w:r>
+    </w:p>
+    <w:p>
+      <w:pPr>
+        <w:spacing w:before="0" w:after="120" w:line="360" w:lineRule="auto"/>
+        <w:ind w:firstLine="1134"/>
+        <w:jc w:val="both"/>
+      </w:pPr>
+      <w:r>
+        <w:rPr>
+          <w:rFonts w:ascii="Times New Roman" w:hAnsi="Times New Roman"/>
+          <w:sz w:val="26"/>
+        </w:rPr>
+        <w:t>+ Repository Layer: Spring Data JPA/Hibernate tương tác trực tiếp với MySQL Database.</w:t>
+      </w:r>
+    </w:p>
+    <w:p>
+      <w:pPr>
+        <w:spacing w:before="0" w:after="120" w:line="360" w:lineRule="auto"/>
+        <w:ind w:firstLine="1134"/>
+        <w:jc w:val="both"/>
+      </w:pPr>
+      <w:r>
+        <w:rPr>
+          <w:rFonts w:ascii="Times New Roman" w:hAnsi="Times New Roman"/>
+          <w:sz w:val="26"/>
+        </w:rPr>
+        <w:t>+ DTO &amp; Entity Layer: Đóng gói và chuyển đổi dữ liệu an toàn giữa các tầng.</w:t>
+      </w:r>
+    </w:p>
+    <w:p>
+      <w:pPr>
+        <w:spacing w:before="0" w:after="120" w:line="360" w:lineRule="auto"/>
+        <w:ind w:firstLine="720"/>
+        <w:jc w:val="both"/>
+      </w:pPr>
+      <w:r>
+        <w:rPr>
+          <w:rFonts w:ascii="Times New Roman" w:hAnsi="Times New Roman"/>
+          <w:sz w:val="26"/>
+        </w:rPr>
+        <w:t>- Phương pháp thiết kế cơ sở dữ liệu quan hệ:</w:t>
+      </w:r>
+    </w:p>
+    <w:p>
+      <w:pPr>
+        <w:spacing w:before="0" w:after="120" w:line="360" w:lineRule="auto"/>
+        <w:ind w:firstLine="1134"/>
+        <w:jc w:val="both"/>
+      </w:pPr>
+      <w:r>
+        <w:rPr>
+          <w:rFonts w:ascii="Times New Roman" w:hAnsi="Times New Roman"/>
+          <w:sz w:val="26"/>
+        </w:rPr>
+        <w:t>+ Vẽ sơ đồ ERD, thực hiện chuẩn hóa dữ liệu 3NF loại bỏ dư thừa.</w:t>
+      </w:r>
+    </w:p>
+    <w:p>
+      <w:pPr>
+        <w:spacing w:before="0" w:after="120" w:line="360" w:lineRule="auto"/>
+        <w:ind w:firstLine="1134"/>
+        <w:jc w:val="both"/>
+      </w:pPr>
+      <w:r>
+        <w:rPr>
+          <w:rFonts w:ascii="Times New Roman" w:hAnsi="Times New Roman"/>
+          <w:sz w:val="26"/>
+        </w:rPr>
+        <w:t>+ Đánh chỉ mục (Index) trên các trường dữ liệu hay tra cứu để nâng cao tốc độ phản hồi.</w:t>
       </w:r>
     </w:p>
     <w:p>
       <w:pPr>
         <w:pStyle w:val="4"/>
-        <w:spacing w:before="0" w:after="40" w:line="360" w:lineRule="auto"/>
-        <w:ind w:firstLine="0" w:left="0"/>
+        <w:spacing w:before="0" w:after="120" w:line="360" w:lineRule="auto"/>
+        <w:ind w:firstLine="0"/>
         <w:jc w:val="left"/>
       </w:pPr>
       <w:r>
-        <w:rPr/>
-        <w:t>1.4.3. Phương pháp thực nghiệm và phát triển phần mềm</w:t>
-      </w:r>
-    </w:p>
-    <w:p>
-      <w:pPr>
-        <w:spacing w:before="0" w:after="80" w:line="360" w:lineRule="auto"/>
-        <w:ind w:firstLine="720" w:left="0"/>
-        <w:jc w:val="both"/>
-      </w:pPr>
-      <w:r>
-        <w:rPr/>
-        <w:t>- Áp dụng quy trình phát triển phần mềm Agile/Scrum rút gọn: Phân chia dự án thành các đợt phát triển (Sprints) ngắn hạn từ 1 đến 2 tuần. Mỗi đợt tập trung phát triển hoàn thiện một phân hệ chức năng cụ thể (Xác thực người dùng -&gt; Quản lý Đại lý -&gt; Quản lý Sản phẩm gia dụng -&gt; Giỏ hàng &amp; Đơn hàng).</w:t>
-      </w:r>
-    </w:p>
-    <w:p>
-      <w:pPr>
-        <w:spacing w:before="0" w:after="80" w:line="360" w:lineRule="auto"/>
-        <w:ind w:firstLine="720" w:left="0"/>
-        <w:jc w:val="both"/>
-      </w:pPr>
-      <w:r>
-        <w:rPr/>
-        <w:t>- Sử dụng môi trường phát triển tích hợp (IDE): NetBeans IDE / IntelliJ IDEA để lập trình mã nguồn Java.</w:t>
-      </w:r>
-    </w:p>
-    <w:p>
-      <w:pPr>
-        <w:spacing w:before="0" w:after="80" w:line="360" w:lineRule="auto"/>
-        <w:ind w:firstLine="720" w:left="0"/>
-        <w:jc w:val="both"/>
-      </w:pPr>
-      <w:r>
-        <w:rPr/>
-        <w:t>- Sử dụng công cụ Maven quản lý phụ thuộc (Dependency Management): Khai báo tự động các thư viện Spring Boot Starter Web, Spring Boot Starter Security, Spring Boot Starter Data JPA, Thymeleaf, MySQL Connector.</w:t>
-      </w:r>
-    </w:p>
-    <w:p>
-      <w:pPr>
-        <w:spacing w:before="0" w:after="80" w:line="360" w:lineRule="auto"/>
-        <w:ind w:firstLine="720" w:left="0"/>
-        <w:jc w:val="both"/>
-      </w:pPr>
-      <w:r>
-        <w:rPr/>
-        <w:t>- Phương pháp kiểm thử phần mềm (Testing):</w:t>
-      </w:r>
-    </w:p>
-    <w:p>
-      <w:pPr>
-        <w:spacing w:before="0" w:after="60" w:line="360" w:lineRule="auto"/>
-        <w:ind w:left="720" w:firstLine="720"/>
-        <w:jc w:val="both"/>
-      </w:pPr>
-      <w:r>
-        <w:rPr/>
-        <w:t>+ Thực hiện Unit Test kiểm tra tính đúng đắn của các hàm Service và Repository.</w:t>
-      </w:r>
-    </w:p>
-    <w:p>
-      <w:pPr>
-        <w:spacing w:before="0" w:after="60" w:line="360" w:lineRule="auto"/>
-        <w:ind w:left="720" w:firstLine="720"/>
-        <w:jc w:val="both"/>
-      </w:pPr>
-      <w:r>
-        <w:rPr/>
-        <w:t>+ Thực hiện Integration Test và UI Test trên trình duyệt Web (Chrome, Edge) để kiểm tra giao diện người dùng, tính liên kết dữ liệu và luồng xử lý đơn hàng thực tế.</w:t>
+        <w:rPr>
+          <w:rFonts w:ascii="Times New Roman" w:hAnsi="Times New Roman"/>
+          <w:b/>
+          <w:sz w:val="26"/>
+        </w:rPr>
+        <w:t>1.4.3. Phương pháp thử nghiệm và đánh giá</w:t>
+      </w:r>
+    </w:p>
+    <w:p>
+      <w:pPr>
+        <w:spacing w:before="0" w:after="120" w:line="360" w:lineRule="auto"/>
+        <w:ind w:firstLine="720"/>
+        <w:jc w:val="both"/>
+      </w:pPr>
+      <w:r>
+        <w:rPr>
+          <w:rFonts w:ascii="Times New Roman" w:hAnsi="Times New Roman"/>
+          <w:sz w:val="26"/>
+        </w:rPr>
+        <w:t>- Kiểm thử đơn vị (Unit Testing): Viết các test case tự động với JUnit 5 và Mockito cho các hàm xử lý logic nghiệp vụ quan trọng.</w:t>
+      </w:r>
+    </w:p>
+    <w:p>
+      <w:pPr>
+        <w:spacing w:before="0" w:after="120" w:line="360" w:lineRule="auto"/>
+        <w:ind w:firstLine="720"/>
+        <w:jc w:val="both"/>
+      </w:pPr>
+      <w:r>
+        <w:rPr>
+          <w:rFonts w:ascii="Times New Roman" w:hAnsi="Times New Roman"/>
+          <w:sz w:val="26"/>
+        </w:rPr>
+        <w:t>- Kiểm thử tích hợp (Integration Testing): Kiểm tra độ chính xác khi kết hợp giữa các tầng Controller, Service, Repository và Database.</w:t>
+      </w:r>
+    </w:p>
+    <w:p>
+      <w:pPr>
+        <w:spacing w:before="0" w:after="120" w:line="360" w:lineRule="auto"/>
+        <w:ind w:firstLine="720"/>
+        <w:jc w:val="both"/>
+      </w:pPr>
+      <w:r>
+        <w:rPr>
+          <w:rFonts w:ascii="Times New Roman" w:hAnsi="Times New Roman"/>
+          <w:sz w:val="26"/>
+        </w:rPr>
+        <w:t>- Kiểm thử hiệu năng (Load Testing): Sử dụng công cụ Apache JMeter giả lập hàng trăm người dùng truy cập đồng thời để đo thời gian phản hồi và khả năng chịu tải của hệ thống.</w:t>
+      </w:r>
+    </w:p>
+    <w:p>
+      <w:pPr>
+        <w:spacing w:before="0" w:after="120" w:line="360" w:lineRule="auto"/>
+        <w:ind w:firstLine="720"/>
+        <w:jc w:val="both"/>
+      </w:pPr>
+      <w:r>
+        <w:rPr>
+          <w:rFonts w:ascii="Times New Roman" w:hAnsi="Times New Roman"/>
+          <w:sz w:val="26"/>
+        </w:rPr>
+        <w:t>- Kiểm thử an toàn bảo mật: Đánh giá khả năng phòng chống các cuộc tấn công web XSS, CSRF, SQL Injection theo chuẩn OWASP.</w:t>
       </w:r>
     </w:p>
     <w:p>
       <w:pPr>
         <w:pStyle w:val="3"/>
-        <w:spacing w:before="0" w:after="80" w:line="360" w:lineRule="auto"/>
-        <w:ind w:firstLine="0" w:left="0"/>
+        <w:spacing w:before="0" w:after="120" w:line="360" w:lineRule="auto"/>
+        <w:ind w:firstLine="0"/>
         <w:jc w:val="left"/>
       </w:pPr>
       <w:r>
-        <w:rPr/>
+        <w:rPr>
+          <w:rFonts w:ascii="Times New Roman" w:hAnsi="Times New Roman"/>
+          <w:b/>
+          <w:sz w:val="26"/>
+        </w:rPr>
         <w:t>1.5. Ý nghĩa của đề tài</w:t>
       </w:r>
     </w:p>
     <w:p>
       <w:pPr>
+        <w:spacing w:before="0" w:after="120" w:line="360" w:lineRule="auto"/>
+        <w:ind w:firstLine="720"/>
+        <w:jc w:val="both"/>
+      </w:pPr>
+      <w:r>
+        <w:rPr>
+          <w:rFonts w:ascii="Times New Roman" w:hAnsi="Times New Roman"/>
+          <w:sz w:val="26"/>
+        </w:rPr>
+        <w:t>Việc nghiên cứu và phát triển thành công đề tài mang lại những đóng góp quan trọng trên cả phương diện khoa học công nghệ và ứng dụng thực tiễn:</w:t>
+      </w:r>
+    </w:p>
+    <w:p>
+      <w:pPr>
         <w:pStyle w:val="4"/>
-        <w:spacing w:before="0" w:after="40" w:line="360" w:lineRule="auto"/>
-        <w:ind w:firstLine="0" w:left="0"/>
+        <w:spacing w:before="0" w:after="120" w:line="360" w:lineRule="auto"/>
+        <w:ind w:firstLine="0"/>
         <w:jc w:val="left"/>
       </w:pPr>
       <w:r>
-        <w:rPr/>
+        <w:rPr>
+          <w:rFonts w:ascii="Times New Roman" w:hAnsi="Times New Roman"/>
+          <w:b/>
+          <w:sz w:val="26"/>
+        </w:rPr>
         <w:t>1.5.1. Ý nghĩa khoa học và công nghệ</w:t>
       </w:r>
     </w:p>
     <w:p>
       <w:pPr>
-        <w:spacing w:before="0" w:after="80" w:line="360" w:lineRule="auto"/>
-        <w:ind w:firstLine="720" w:left="0"/>
-        <w:jc w:val="both"/>
-      </w:pPr>
-      <w:r>
-        <w:rPr/>
-        <w:t>- Giúp sinh viên hệ thống hóa và vận dụng thành thạo các kiến thức lý thuyết đã học trong học phần Công nghệ Java vào một sản phẩm thực tế có quy mô doanh nghiệp.</w:t>
-      </w:r>
-    </w:p>
-    <w:p>
-      <w:pPr>
-        <w:spacing w:before="0" w:after="80" w:line="360" w:lineRule="auto"/>
-        <w:ind w:firstLine="720" w:left="0"/>
-        <w:jc w:val="both"/>
-      </w:pPr>
-      <w:r>
-        <w:rPr/>
-        <w:t>- Làm chủ công nghệ phát triển Web hiện đại với Spring Boot – một trong những khung làm việc Java phổ biến và mạnh mẽ nhất trên thế giới hiện nay.</w:t>
-      </w:r>
-    </w:p>
-    <w:p>
-      <w:pPr>
-        <w:spacing w:before="0" w:after="80" w:line="360" w:lineRule="auto"/>
-        <w:ind w:firstLine="720" w:left="0"/>
-        <w:jc w:val="both"/>
-      </w:pPr>
-      <w:r>
-        <w:rPr/>
-        <w:t>- Nâng cao tư duy thiết kế phần mềm hướng đối tượng, tư duy thiết kế cơ sở dữ liệu quan hệ tối ưu và kỹ năng bảo mật ứng dụng Web với Spring Security.</w:t>
+        <w:spacing w:before="0" w:after="120" w:line="360" w:lineRule="auto"/>
+        <w:ind w:firstLine="720"/>
+        <w:jc w:val="both"/>
+      </w:pPr>
+      <w:r>
+        <w:rPr>
+          <w:rFonts w:ascii="Times New Roman" w:hAnsi="Times New Roman"/>
+          <w:sz w:val="26"/>
+        </w:rPr>
+        <w:t>- Đóng góp tài liệu tham khảo kỹ thuật chuẩn hóa về ứng dụng Java Spring Boot trong bài toán thương mại điện tử đa gian hàng phức tạp.</w:t>
+      </w:r>
+    </w:p>
+    <w:p>
+      <w:pPr>
+        <w:spacing w:before="0" w:after="120" w:line="360" w:lineRule="auto"/>
+        <w:ind w:firstLine="720"/>
+        <w:jc w:val="both"/>
+      </w:pPr>
+      <w:r>
+        <w:rPr>
+          <w:rFonts w:ascii="Times New Roman" w:hAnsi="Times New Roman"/>
+          <w:sz w:val="26"/>
+        </w:rPr>
+        <w:t>- Chứng minh hiệu quả của việc áp dụng các nguyên lý thiết kế phần mềm hiện đại (SOLID, Clean Architecture, Design Patterns) vào việc xây dựng sản phẩm thực tế có khả năng mở rộng tốt.</w:t>
+      </w:r>
+    </w:p>
+    <w:p>
+      <w:pPr>
+        <w:spacing w:before="0" w:after="120" w:line="360" w:lineRule="auto"/>
+        <w:ind w:firstLine="720"/>
+        <w:jc w:val="both"/>
+      </w:pPr>
+      <w:r>
+        <w:rPr>
+          <w:rFonts w:ascii="Times New Roman" w:hAnsi="Times New Roman"/>
+          <w:sz w:val="26"/>
+        </w:rPr>
+        <w:t>- Cung cấp mô hình kiến trúc tham chiếu chất lượng cao cho các hệ thống web enterprise chạy trên nền tảng Java.</w:t>
       </w:r>
     </w:p>
     <w:p>
       <w:pPr>
         <w:pStyle w:val="4"/>
-        <w:spacing w:before="0" w:after="40" w:line="360" w:lineRule="auto"/>
-        <w:ind w:firstLine="0" w:left="0"/>
+        <w:spacing w:before="0" w:after="120" w:line="360" w:lineRule="auto"/>
+        <w:ind w:firstLine="0"/>
         <w:jc w:val="left"/>
       </w:pPr>
       <w:r>
-        <w:rPr/>
+        <w:rPr>
+          <w:rFonts w:ascii="Times New Roman" w:hAnsi="Times New Roman"/>
+          <w:b/>
+          <w:sz w:val="26"/>
+        </w:rPr>
         <w:t>1.5.2. Ý nghĩa thực tiễn</w:t>
       </w:r>
     </w:p>
     <w:p>
       <w:pPr>
-        <w:spacing w:before="0" w:after="80" w:line="360" w:lineRule="auto"/>
-        <w:ind w:firstLine="720" w:left="0"/>
-        <w:jc w:val="both"/>
-      </w:pPr>
-      <w:r>
-        <w:rPr/>
-        <w:t>- Cung cấp một giải pháp phần mềm quản lý đại lý đồ gia dụng có tính thực tiễn cao, giúp các nhà kinh doanh và chủ đại lý dễ dàng số hóa quy trình quản lý bán hàng.</w:t>
-      </w:r>
-    </w:p>
-    <w:p>
-      <w:pPr>
-        <w:spacing w:before="0" w:after="80" w:line="360" w:lineRule="auto"/>
-        <w:ind w:firstLine="720" w:left="0"/>
-        <w:jc w:val="both"/>
-      </w:pPr>
-      <w:r>
-        <w:rPr/>
-        <w:t>- Tạo ra môi trường kết nối minh bạch giữa nhà phân phối, đại lý bán lẻ và người tiêu dùng đồ gia dụng; góp phần tiết kiệm chi phí vận hành và nâng cao năng suất kinh doanh.</w:t>
-      </w:r>
-    </w:p>
-    <w:p>
-      <w:pPr>
-        <w:spacing w:before="0" w:after="80" w:line="360" w:lineRule="auto"/>
-        <w:ind w:firstLine="720" w:left="0"/>
-        <w:jc w:val="both"/>
-      </w:pPr>
-      <w:r>
-        <w:rPr/>
-        <w:t>- Đóng vai trò là nền tảng vững chắc để nhóm phát triển tiếp tục mở rộng, tích hợp thêm các công nghệ tiên tiến (thanh toán điện tử, trí tuệ nhân tạo gợi ý sản phẩm) nhằm thương mại hóa sản phẩm trong tương lai.</w:t>
+        <w:spacing w:before="0" w:after="120" w:line="360" w:lineRule="auto"/>
+        <w:ind w:firstLine="720"/>
+        <w:jc w:val="both"/>
+      </w:pPr>
+      <w:r>
+        <w:rPr>
+          <w:rFonts w:ascii="Times New Roman" w:hAnsi="Times New Roman"/>
+          <w:sz w:val="26"/>
+        </w:rPr>
+        <w:t>- Đối với doanh nghiệp vừa và nhỏ (SMEs): Cung cấp nền tảng giải pháp sàn TMĐT đa gian hàng độc lập, giúp doanh nghiệp tự chủ công nghệ và tối ưu chi phí vận hành.</w:t>
+      </w:r>
+    </w:p>
+    <w:p>
+      <w:pPr>
+        <w:spacing w:before="0" w:after="120" w:line="360" w:lineRule="auto"/>
+        <w:ind w:firstLine="720"/>
+        <w:jc w:val="both"/>
+      </w:pPr>
+      <w:r>
+        <w:rPr>
+          <w:rFonts w:ascii="Times New Roman" w:hAnsi="Times New Roman"/>
+          <w:sz w:val="26"/>
+        </w:rPr>
+        <w:t>- Đối với nhà bán hàng và người tiêu dùng: Mang lại kênh bán hàng hiệu quả cho Vendor và môi trường mua sắm trực tuyến an toàn, đa dạng, tiện lợi cho Customer.</w:t>
+      </w:r>
+    </w:p>
+    <w:p>
+      <w:pPr>
+        <w:spacing w:before="0" w:after="120" w:line="360" w:lineRule="auto"/>
+        <w:ind w:firstLine="720"/>
+        <w:jc w:val="both"/>
+      </w:pPr>
+      <w:r>
+        <w:rPr>
+          <w:rFonts w:ascii="Times New Roman" w:hAnsi="Times New Roman"/>
+          <w:sz w:val="26"/>
+        </w:rPr>
+        <w:t>- Đối với nhóm nghiên cứu: Nâng cao toàn diện tư duy hệ thống, kỹ năng lập trình Java chuyên sâu, quản trị cơ sở dữ liệu và quy trình phát triển phần mềm chuyên nghiệp.</w:t>
       </w:r>
     </w:p>
     <w:sectPr>
+      <w:footerReference r:id="rId5" w:type="default"/>
       <w:pgSz w:w="11910" w:h="16840"/>
       <w:pgMar w:top="1354" w:right="1555" w:bottom="907" w:left="1555" w:header="0" w:footer="715" w:gutter="0"/>
+      <w:pgNumType w:start="1"/>
       <w:cols w:space="720" w:num="1"/>
     </w:sectPr>
   </w:body>
@@ -3388,6 +3694,136 @@
     </w:p>
   </w:endnote>
 </w:endnotes>
+</file>
+
+<file path=word/footer1.xml><?xml version="1.0" encoding="utf-8"?>
+<w:ftr xmlns:wpc="http://schemas.microsoft.com/office/word/2010/wordprocessingCanvas" xmlns:mc="http://schemas.openxmlformats.org/markup-compatibility/2006" xmlns:o="urn:schemas-microsoft-com:office:office" xmlns:r="http://schemas.openxmlformats.org/officeDocument/2006/relationships" xmlns:m="http://schemas.openxmlformats.org/officeDocument/2006/math" xmlns:v="urn:schemas-microsoft-com:vml" xmlns:wp14="http://schemas.microsoft.com/office/word/2010/wordprocessingDrawing" xmlns:wp="http://schemas.openxmlformats.org/drawingml/2006/wordprocessingDrawing" xmlns:w10="urn:schemas-microsoft-com:office:word" xmlns:w="http://schemas.openxmlformats.org/wordprocessingml/2006/main" xmlns:w14="http://schemas.microsoft.com/office/word/2010/wordml" xmlns:w15="http://schemas.microsoft.com/office/word/2012/wordml" xmlns:wpg="http://schemas.microsoft.com/office/word/2010/wordprocessingGroup" xmlns:wpi="http://schemas.microsoft.com/office/word/2010/wordprocessingInk" xmlns:wne="http://schemas.microsoft.com/office/word/2006/wordml" xmlns:wps="http://schemas.microsoft.com/office/word/2010/wordprocessingShape" xmlns:wpsCustomData="http://www.wps.cn/officeDocument/2013/wpsCustomData" mc:Ignorable="w14 w15 wp14">
+  <w:p>
+    <w:pPr>
+      <w:pStyle w:val="10"/>
+    </w:pPr>
+    <w:r>
+      <w:rPr>
+        <w:sz w:val="18"/>
+      </w:rPr>
+      <mc:AlternateContent>
+        <mc:Choice Requires="wps">
+          <w:drawing>
+            <wp:anchor distT="0" distB="0" distL="114300" distR="114300" simplePos="0" relativeHeight="251659264" behindDoc="0" locked="0" layoutInCell="1" allowOverlap="1">
+              <wp:simplePos x="0" y="0"/>
+              <wp:positionH relativeFrom="margin">
+                <wp:align>center</wp:align>
+              </wp:positionH>
+              <wp:positionV relativeFrom="paragraph">
+                <wp:posOffset>0</wp:posOffset>
+              </wp:positionV>
+              <wp:extent cx="1828800" cy="1828800"/>
+              <wp:effectExtent l="0" t="0" r="0" b="0"/>
+              <wp:wrapNone/>
+              <wp:docPr id="6" name="Text Box 6"/>
+              <wp:cNvGraphicFramePr/>
+              <a:graphic xmlns:a="http://schemas.openxmlformats.org/drawingml/2006/main">
+                <a:graphicData uri="http://schemas.microsoft.com/office/word/2010/wordprocessingShape">
+                  <wps:wsp>
+                    <wps:cNvSpPr txBox="1"/>
+                    <wps:spPr>
+                      <a:xfrm>
+                        <a:off x="0" y="0"/>
+                        <a:ext cx="1828800" cy="1828800"/>
+                      </a:xfrm>
+                      <a:prstGeom prst="rect">
+                        <a:avLst/>
+                      </a:prstGeom>
+                      <a:noFill/>
+                      <a:ln w="6350">
+                        <a:noFill/>
+                      </a:ln>
+                    </wps:spPr>
+                    <wps:style>
+                      <a:lnRef idx="0">
+                        <a:schemeClr val="accent1"/>
+                      </a:lnRef>
+                      <a:fillRef idx="0">
+                        <a:schemeClr val="accent1"/>
+                      </a:fillRef>
+                      <a:effectRef idx="0">
+                        <a:schemeClr val="accent1"/>
+                      </a:effectRef>
+                      <a:fontRef idx="minor">
+                        <a:schemeClr val="dk1"/>
+                      </a:fontRef>
+                    </wps:style>
+                    <wps:txbx>
+                      <w:txbxContent>
+                        <w:p>
+                          <w:pPr>
+                            <w:pStyle w:val="10"/>
+                          </w:pPr>
+                          <w:r>
+                            <w:fldChar w:fldCharType="begin"/>
+                          </w:r>
+                          <w:r>
+                            <w:instrText xml:space="preserve"> PAGE  \* MERGEFORMAT </w:instrText>
+                          </w:r>
+                          <w:r>
+                            <w:fldChar w:fldCharType="separate"/>
+                          </w:r>
+                          <w:r>
+                            <w:t>1</w:t>
+                          </w:r>
+                          <w:r>
+                            <w:fldChar w:fldCharType="end"/>
+                          </w:r>
+                        </w:p>
+                      </w:txbxContent>
+                    </wps:txbx>
+                    <wps:bodyPr rot="0" spcFirstLastPara="0" vertOverflow="overflow" horzOverflow="overflow" vert="horz" wrap="none" lIns="0" tIns="0" rIns="0" bIns="0" numCol="1" spcCol="0" rtlCol="0" fromWordArt="0" anchor="t" anchorCtr="0" forceAA="0" upright="0" compatLnSpc="1">
+                      <a:spAutoFit/>
+                    </wps:bodyPr>
+                  </wps:wsp>
+                </a:graphicData>
+              </a:graphic>
+            </wp:anchor>
+          </w:drawing>
+        </mc:Choice>
+        <mc:Fallback>
+          <w:pict>
+            <v:shape id="_x0000_s1026" o:spid="_x0000_s1026" o:spt="202" type="#_x0000_t202" style="position:absolute;left:0pt;margin-top:0pt;height:144pt;width:144pt;mso-position-horizontal:center;mso-position-horizontal-relative:margin;mso-wrap-style:none;z-index:251659264;mso-width-relative:page;mso-height-relative:page;" filled="f" stroked="f" coordsize="21600,21600" o:gfxdata="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">
+              <v:fill on="f" focussize="0,0"/>
+              <v:stroke on="f" weight="0.5pt"/>
+              <v:imagedata o:title=""/>
+              <o:lock v:ext="edit" aspectratio="f"/>
+              <v:textbox inset="0mm,0mm,0mm,0mm" style="mso-fit-shape-to-text:t;">
+                <w:txbxContent>
+                  <w:p>
+                    <w:pPr>
+                      <w:pStyle w:val="10"/>
+                    </w:pPr>
+                    <w:r>
+                      <w:fldChar w:fldCharType="begin"/>
+                    </w:r>
+                    <w:r>
+                      <w:instrText xml:space="preserve"> PAGE  \* MERGEFORMAT </w:instrText>
+                    </w:r>
+                    <w:r>
+                      <w:fldChar w:fldCharType="separate"/>
+                    </w:r>
+                    <w:r>
+                      <w:t>1</w:t>
+                    </w:r>
+                    <w:r>
+                      <w:fldChar w:fldCharType="end"/>
+                    </w:r>
+                  </w:p>
+                </w:txbxContent>
+              </v:textbox>
+            </v:shape>
+          </w:pict>
+        </mc:Fallback>
+      </mc:AlternateContent>
+    </w:r>
+  </w:p>
+</w:ftr>
 </file>
 
 <file path=word/footnotes.xml><?xml version="1.0" encoding="utf-8"?>
@@ -3587,9 +4023,9 @@
     <w:lsdException w:unhideWhenUsed="0" w:uiPriority="68" w:semiHidden="0" w:name="Medium Grid 2"/>
     <w:lsdException w:unhideWhenUsed="0" w:uiPriority="69" w:semiHidden="0" w:name="Medium Grid 3"/>
     <w:lsdException w:unhideWhenUsed="0" w:uiPriority="70" w:semiHidden="0" w:name="Dark List"/>
-    <w:lsdException w:unhideWhenUsed="0" w:uiPriority="71" w:semiHidden="0" w:name="Colorful Shading"/>
-    <w:lsdException w:unhideWhenUsed="0" w:uiPriority="72" w:semiHidden="0" w:name="Colorful List"/>
-    <w:lsdException w:unhideWhenUsed="0" w:uiPriority="73" w:semiHidden="0" w:name="Colorful Grid"/>
+    <w:lsdException w:qFormat="1" w:unhideWhenUsed="0" w:uiPriority="71" w:semiHidden="0" w:name="Colorful Shading"/>
+    <w:lsdException w:qFormat="1" w:unhideWhenUsed="0" w:uiPriority="72" w:semiHidden="0" w:name="Colorful List"/>
+    <w:lsdException w:qFormat="1" w:unhideWhenUsed="0" w:uiPriority="73" w:semiHidden="0" w:name="Colorful Grid"/>
     <w:lsdException w:unhideWhenUsed="0" w:uiPriority="60" w:semiHidden="0" w:name="Light Shading Accent 1"/>
     <w:lsdException w:unhideWhenUsed="0" w:uiPriority="61" w:semiHidden="0" w:name="Light List Accent 1"/>
     <w:lsdException w:unhideWhenUsed="0" w:uiPriority="62" w:semiHidden="0" w:name="Light Grid Accent 1"/>
@@ -3602,9 +4038,9 @@
     <w:lsdException w:unhideWhenUsed="0" w:uiPriority="68" w:semiHidden="0" w:name="Medium Grid 2 Accent 1"/>
     <w:lsdException w:unhideWhenUsed="0" w:uiPriority="69" w:semiHidden="0" w:name="Medium Grid 3 Accent 1"/>
     <w:lsdException w:unhideWhenUsed="0" w:uiPriority="70" w:semiHidden="0" w:name="Dark List Accent 1"/>
-    <w:lsdException w:unhideWhenUsed="0" w:uiPriority="71" w:semiHidden="0" w:name="Colorful Shading Accent 1"/>
-    <w:lsdException w:unhideWhenUsed="0" w:uiPriority="72" w:semiHidden="0" w:name="Colorful List Accent 1"/>
-    <w:lsdException w:unhideWhenUsed="0" w:uiPriority="73" w:semiHidden="0" w:name="Colorful Grid Accent 1"/>
+    <w:lsdException w:qFormat="1" w:unhideWhenUsed="0" w:uiPriority="71" w:semiHidden="0" w:name="Colorful Shading Accent 1"/>
+    <w:lsdException w:qFormat="1" w:unhideWhenUsed="0" w:uiPriority="72" w:semiHidden="0" w:name="Colorful List Accent 1"/>
+    <w:lsdException w:qFormat="1" w:unhideWhenUsed="0" w:uiPriority="73" w:semiHidden="0" w:name="Colorful Grid Accent 1"/>
     <w:lsdException w:unhideWhenUsed="0" w:uiPriority="60" w:semiHidden="0" w:name="Light Shading Accent 2"/>
     <w:lsdException w:unhideWhenUsed="0" w:uiPriority="61" w:semiHidden="0" w:name="Light List Accent 2"/>
     <w:lsdException w:unhideWhenUsed="0" w:uiPriority="62" w:semiHidden="0" w:name="Light Grid Accent 2"/>
@@ -3616,9 +4052,9 @@
     <w:lsdException w:unhideWhenUsed="0" w:uiPriority="68" w:semiHidden="0" w:name="Medium Grid 2 Accent 2"/>
     <w:lsdException w:unhideWhenUsed="0" w:uiPriority="69" w:semiHidden="0" w:name="Medium Grid 3 Accent 2"/>
     <w:lsdException w:unhideWhenUsed="0" w:uiPriority="70" w:semiHidden="0" w:name="Dark List Accent 2"/>
-    <w:lsdException w:unhideWhenUsed="0" w:uiPriority="71" w:semiHidden="0" w:name="Colorful Shading Accent 2"/>
-    <w:lsdException w:unhideWhenUsed="0" w:uiPriority="72" w:semiHidden="0" w:name="Colorful List Accent 2"/>
-    <w:lsdException w:unhideWhenUsed="0" w:uiPriority="73" w:semiHidden="0" w:name="Colorful Grid Accent 2"/>
+    <w:lsdException w:qFormat="1" w:unhideWhenUsed="0" w:uiPriority="71" w:semiHidden="0" w:name="Colorful Shading Accent 2"/>
+    <w:lsdException w:qFormat="1" w:unhideWhenUsed="0" w:uiPriority="72" w:semiHidden="0" w:name="Colorful List Accent 2"/>
+    <w:lsdException w:qFormat="1" w:unhideWhenUsed="0" w:uiPriority="73" w:semiHidden="0" w:name="Colorful Grid Accent 2"/>
     <w:lsdException w:unhideWhenUsed="0" w:uiPriority="60" w:semiHidden="0" w:name="Light Shading Accent 3"/>
     <w:lsdException w:unhideWhenUsed="0" w:uiPriority="61" w:semiHidden="0" w:name="Light List Accent 3"/>
     <w:lsdException w:unhideWhenUsed="0" w:uiPriority="62" w:semiHidden="0" w:name="Light Grid Accent 3"/>
@@ -3630,9 +4066,9 @@
     <w:lsdException w:unhideWhenUsed="0" w:uiPriority="68" w:semiHidden="0" w:name="Medium Grid 2 Accent 3"/>
     <w:lsdException w:unhideWhenUsed="0" w:uiPriority="69" w:semiHidden="0" w:name="Medium Grid 3 Accent 3"/>
     <w:lsdException w:unhideWhenUsed="0" w:uiPriority="70" w:semiHidden="0" w:name="Dark List Accent 3"/>
-    <w:lsdException w:unhideWhenUsed="0" w:uiPriority="71" w:semiHidden="0" w:name="Colorful Shading Accent 3"/>
-    <w:lsdException w:unhideWhenUsed="0" w:uiPriority="72" w:semiHidden="0" w:name="Colorful List Accent 3"/>
-    <w:lsdException w:unhideWhenUsed="0" w:uiPriority="73" w:semiHidden="0" w:name="Colorful Grid Accent 3"/>
+    <w:lsdException w:qFormat="1" w:unhideWhenUsed="0" w:uiPriority="71" w:semiHidden="0" w:name="Colorful Shading Accent 3"/>
+    <w:lsdException w:qFormat="1" w:unhideWhenUsed="0" w:uiPriority="72" w:semiHidden="0" w:name="Colorful List Accent 3"/>
+    <w:lsdException w:qFormat="1" w:unhideWhenUsed="0" w:uiPriority="73" w:semiHidden="0" w:name="Colorful Grid Accent 3"/>
     <w:lsdException w:unhideWhenUsed="0" w:uiPriority="60" w:semiHidden="0" w:name="Light Shading Accent 4"/>
     <w:lsdException w:unhideWhenUsed="0" w:uiPriority="61" w:semiHidden="0" w:name="Light List Accent 4"/>
     <w:lsdException w:unhideWhenUsed="0" w:uiPriority="62" w:semiHidden="0" w:name="Light Grid Accent 4"/>
@@ -3644,9 +4080,9 @@
     <w:lsdException w:unhideWhenUsed="0" w:uiPriority="68" w:semiHidden="0" w:name="Medium Grid 2 Accent 4"/>
     <w:lsdException w:unhideWhenUsed="0" w:uiPriority="69" w:semiHidden="0" w:name="Medium Grid 3 Accent 4"/>
     <w:lsdException w:unhideWhenUsed="0" w:uiPriority="70" w:semiHidden="0" w:name="Dark List Accent 4"/>
-    <w:lsdException w:unhideWhenUsed="0" w:uiPriority="71" w:semiHidden="0" w:name="Colorful Shading Accent 4"/>
-    <w:lsdException w:unhideWhenUsed="0" w:uiPriority="72" w:semiHidden="0" w:name="Colorful List Accent 4"/>
-    <w:lsdException w:unhideWhenUsed="0" w:uiPriority="73" w:semiHidden="0" w:name="Colorful Grid Accent 4"/>
+    <w:lsdException w:qFormat="1" w:unhideWhenUsed="0" w:uiPriority="71" w:semiHidden="0" w:name="Colorful Shading Accent 4"/>
+    <w:lsdException w:qFormat="1" w:unhideWhenUsed="0" w:uiPriority="72" w:semiHidden="0" w:name="Colorful List Accent 4"/>
+    <w:lsdException w:qFormat="1" w:unhideWhenUsed="0" w:uiPriority="73" w:semiHidden="0" w:name="Colorful Grid Accent 4"/>
     <w:lsdException w:unhideWhenUsed="0" w:uiPriority="60" w:semiHidden="0" w:name="Light Shading Accent 5"/>
     <w:lsdException w:unhideWhenUsed="0" w:uiPriority="61" w:semiHidden="0" w:name="Light List Accent 5"/>
     <w:lsdException w:unhideWhenUsed="0" w:uiPriority="62" w:semiHidden="0" w:name="Light Grid Accent 5"/>
@@ -3658,9 +4094,9 @@
     <w:lsdException w:unhideWhenUsed="0" w:uiPriority="68" w:semiHidden="0" w:name="Medium Grid 2 Accent 5"/>
     <w:lsdException w:unhideWhenUsed="0" w:uiPriority="69" w:semiHidden="0" w:name="Medium Grid 3 Accent 5"/>
     <w:lsdException w:unhideWhenUsed="0" w:uiPriority="70" w:semiHidden="0" w:name="Dark List Accent 5"/>
-    <w:lsdException w:unhideWhenUsed="0" w:uiPriority="71" w:semiHidden="0" w:name="Colorful Shading Accent 5"/>
-    <w:lsdException w:unhideWhenUsed="0" w:uiPriority="72" w:semiHidden="0" w:name="Colorful List Accent 5"/>
-    <w:lsdException w:unhideWhenUsed="0" w:uiPriority="73" w:semiHidden="0" w:name="Colorful Grid Accent 5"/>
+    <w:lsdException w:qFormat="1" w:unhideWhenUsed="0" w:uiPriority="71" w:semiHidden="0" w:name="Colorful Shading Accent 5"/>
+    <w:lsdException w:qFormat="1" w:unhideWhenUsed="0" w:uiPriority="72" w:semiHidden="0" w:name="Colorful List Accent 5"/>
+    <w:lsdException w:qFormat="1" w:unhideWhenUsed="0" w:uiPriority="73" w:semiHidden="0" w:name="Colorful Grid Accent 5"/>
     <w:lsdException w:unhideWhenUsed="0" w:uiPriority="60" w:semiHidden="0" w:name="Light Shading Accent 6"/>
     <w:lsdException w:unhideWhenUsed="0" w:uiPriority="61" w:semiHidden="0" w:name="Light List Accent 6"/>
     <w:lsdException w:unhideWhenUsed="0" w:uiPriority="62" w:semiHidden="0" w:name="Light Grid Accent 6"/>
@@ -3672,9 +4108,9 @@
     <w:lsdException w:unhideWhenUsed="0" w:uiPriority="68" w:semiHidden="0" w:name="Medium Grid 2 Accent 6"/>
     <w:lsdException w:unhideWhenUsed="0" w:uiPriority="69" w:semiHidden="0" w:name="Medium Grid 3 Accent 6"/>
     <w:lsdException w:unhideWhenUsed="0" w:uiPriority="70" w:semiHidden="0" w:name="Dark List Accent 6"/>
-    <w:lsdException w:unhideWhenUsed="0" w:uiPriority="71" w:semiHidden="0" w:name="Colorful Shading Accent 6"/>
-    <w:lsdException w:unhideWhenUsed="0" w:uiPriority="72" w:semiHidden="0" w:name="Colorful List Accent 6"/>
-    <w:lsdException w:unhideWhenUsed="0" w:uiPriority="73" w:semiHidden="0" w:name="Colorful Grid Accent 6"/>
+    <w:lsdException w:qFormat="1" w:unhideWhenUsed="0" w:uiPriority="71" w:semiHidden="0" w:name="Colorful Shading Accent 6"/>
+    <w:lsdException w:qFormat="1" w:unhideWhenUsed="0" w:uiPriority="72" w:semiHidden="0" w:name="Colorful List Accent 6"/>
+    <w:lsdException w:qFormat="1" w:unhideWhenUsed="0" w:uiPriority="73" w:semiHidden="0" w:name="Colorful Grid Accent 6"/>
   </w:latentStyles>
   <w:style w:type="paragraph" w:default="1" w:styleId="1">
     <w:name w:val="Normal"/>
@@ -3817,6 +4253,40 @@
     </w:rPr>
   </w:style>
   <w:style w:type="paragraph" w:styleId="10">
+    <w:name w:val="footer"/>
+    <w:basedOn w:val="1"/>
+    <w:qFormat/>
+    <w:uiPriority w:val="0"/>
+    <w:pPr>
+      <w:tabs>
+        <w:tab w:val="center" w:pos="4153"/>
+        <w:tab w:val="right" w:pos="8306"/>
+      </w:tabs>
+      <w:snapToGrid w:val="0"/>
+      <w:jc w:val="left"/>
+    </w:pPr>
+    <w:rPr>
+      <w:sz w:val="18"/>
+      <w:szCs w:val="18"/>
+    </w:rPr>
+  </w:style>
+  <w:style w:type="paragraph" w:styleId="11">
+    <w:name w:val="header"/>
+    <w:basedOn w:val="1"/>
+    <w:uiPriority w:val="0"/>
+    <w:pPr>
+      <w:tabs>
+        <w:tab w:val="center" w:pos="4153"/>
+        <w:tab w:val="right" w:pos="8306"/>
+      </w:tabs>
+      <w:snapToGrid w:val="0"/>
+    </w:pPr>
+    <w:rPr>
+      <w:sz w:val="18"/>
+      <w:szCs w:val="18"/>
+    </w:rPr>
+  </w:style>
+  <w:style w:type="paragraph" w:styleId="12">
     <w:name w:val="Normal (Web)"/>
     <w:qFormat/>
     <w:uiPriority w:val="0"/>
@@ -3833,7 +4303,7 @@
       <w:lang w:val="en-US" w:eastAsia="zh-CN" w:bidi="ar"/>
     </w:rPr>
   </w:style>
-  <w:style w:type="character" w:styleId="11">
+  <w:style w:type="character" w:styleId="13">
     <w:name w:val="Strong"/>
     <w:basedOn w:val="6"/>
     <w:qFormat/>
@@ -3843,7 +4313,7 @@
       <w:bCs/>
     </w:rPr>
   </w:style>
-  <w:style w:type="table" w:styleId="12">
+  <w:style w:type="table" w:styleId="14">
     <w:name w:val="Table Grid"/>
     <w:basedOn w:val="7"/>
     <w:qFormat/>
@@ -3863,7 +4333,7 @@
       </w:tblBorders>
     </w:tblPr>
   </w:style>
-  <w:style w:type="paragraph" w:styleId="13">
+  <w:style w:type="paragraph" w:styleId="15">
     <w:name w:val="Title"/>
     <w:basedOn w:val="1"/>
     <w:qFormat/>
@@ -3881,7 +4351,7 @@
       <w:lang w:val="vi" w:eastAsia="en-US" w:bidi="ar-SA"/>
     </w:rPr>
   </w:style>
-  <w:style w:type="paragraph" w:styleId="14">
+  <w:style w:type="paragraph" w:styleId="16">
     <w:name w:val="toc 1"/>
     <w:basedOn w:val="1"/>
     <w:qFormat/>
@@ -3897,7 +4367,7 @@
       <w:lang w:val="vi" w:eastAsia="en-US" w:bidi="ar-SA"/>
     </w:rPr>
   </w:style>
-  <w:style w:type="paragraph" w:styleId="15">
+  <w:style w:type="paragraph" w:styleId="17">
     <w:name w:val="toc 2"/>
     <w:basedOn w:val="1"/>
     <w:qFormat/>
@@ -3913,7 +4383,7 @@
       <w:lang w:val="vi" w:eastAsia="en-US" w:bidi="ar-SA"/>
     </w:rPr>
   </w:style>
-  <w:style w:type="paragraph" w:styleId="16">
+  <w:style w:type="paragraph" w:styleId="18">
     <w:name w:val="toc 3"/>
     <w:basedOn w:val="1"/>
     <w:qFormat/>
@@ -3929,7 +4399,7 @@
       <w:lang w:val="vi" w:eastAsia="en-US" w:bidi="ar-SA"/>
     </w:rPr>
   </w:style>
-  <w:style w:type="table" w:customStyle="1" w:styleId="17">
+  <w:style w:type="table" w:customStyle="1" w:styleId="19">
     <w:name w:val="Table Normal1"/>
     <w:semiHidden/>
     <w:unhideWhenUsed/>
@@ -3944,7 +4414,7 @@
       </w:tblCellMar>
     </w:tblPr>
   </w:style>
-  <w:style w:type="paragraph" w:styleId="18">
+  <w:style w:type="paragraph" w:styleId="20">
     <w:name w:val="List Paragraph"/>
     <w:basedOn w:val="1"/>
     <w:qFormat/>
@@ -3957,7 +4427,7 @@
       <w:lang w:val="vi" w:eastAsia="en-US" w:bidi="ar-SA"/>
     </w:rPr>
   </w:style>
-  <w:style w:type="paragraph" w:customStyle="1" w:styleId="19">
+  <w:style w:type="paragraph" w:customStyle="1" w:styleId="21">
     <w:name w:val="Table Paragraph"/>
     <w:basedOn w:val="1"/>
     <w:qFormat/>

</xml_diff>

<commit_message>
docs: add Chapter 2 (CƠ SỞ LÝ THUYẾT) with section 2.8 Mô hình MVC and strict formatting
</commit_message>
<xml_diff>
--- a/DeTaiCNJ18_Nhom7.docx
+++ b/DeTaiCNJ18_Nhom7.docx
@@ -1320,8 +1320,8 @@
         <w:bidi w:val="0"/>
       </w:pPr>
       <w:bookmarkStart w:id="0" w:name="_Toc9811"/>
-      <w:bookmarkStart w:id="1" w:name="_Toc29089"/>
-      <w:bookmarkStart w:id="2" w:name="_Toc24751"/>
+      <w:bookmarkStart w:id="1" w:name="_Toc24751"/>
+      <w:bookmarkStart w:id="2" w:name="_Toc2202"/>
       <w:r>
         <w:t>MỤC LỤC</w:t>
       </w:r>
@@ -1349,7 +1349,7 @@
         <w:fldChar w:fldCharType="begin"/>
       </w:r>
       <w:r>
-        <w:instrText xml:space="preserve"> HYPERLINK \l _Toc29089 </w:instrText>
+        <w:instrText xml:space="preserve"> HYPERLINK \l _Toc2202 </w:instrText>
       </w:r>
       <w:r>
         <w:fldChar w:fldCharType="separate"/>
@@ -1364,7 +1364,7 @@
         <w:fldChar w:fldCharType="begin"/>
       </w:r>
       <w:r>
-        <w:instrText xml:space="preserve"> PAGEREF _Toc29089 \h </w:instrText>
+        <w:instrText xml:space="preserve"> PAGEREF _Toc2202 \h </w:instrText>
       </w:r>
       <w:r>
         <w:fldChar w:fldCharType="separate"/>
@@ -1390,7 +1390,7 @@
         <w:fldChar w:fldCharType="begin"/>
       </w:r>
       <w:r>
-        <w:instrText xml:space="preserve"> HYPERLINK \l _Toc5002 </w:instrText>
+        <w:instrText xml:space="preserve"> HYPERLINK \l _Toc25284 </w:instrText>
       </w:r>
       <w:r>
         <w:fldChar w:fldCharType="separate"/>
@@ -1405,7 +1405,7 @@
         <w:fldChar w:fldCharType="begin"/>
       </w:r>
       <w:r>
-        <w:instrText xml:space="preserve"> PAGEREF _Toc5002 \h </w:instrText>
+        <w:instrText xml:space="preserve"> PAGEREF _Toc25284 \h </w:instrText>
       </w:r>
       <w:r>
         <w:fldChar w:fldCharType="separate"/>
@@ -1431,13 +1431,16 @@
         <w:fldChar w:fldCharType="begin"/>
       </w:r>
       <w:r>
-        <w:instrText xml:space="preserve"> HYPERLINK \l _Toc5201 </w:instrText>
+        <w:instrText xml:space="preserve"> HYPERLINK \l _Toc3864 </w:instrText>
       </w:r>
       <w:r>
         <w:fldChar w:fldCharType="separate"/>
       </w:r>
       <w:r>
-        <w:t>CHƯƠNG 1: TỔNG QUAN VỀ ĐỀ TÀI</w:t>
+        <w:rPr>
+          <w:rFonts w:ascii="Times New Roman" w:hAnsi="Times New Roman"/>
+        </w:rPr>
+        <w:t>CHƯƠNG 1. TỔNG QUAN ĐỀ TÀI</w:t>
       </w:r>
       <w:r>
         <w:tab/>
@@ -1446,7 +1449,7 @@
         <w:fldChar w:fldCharType="begin"/>
       </w:r>
       <w:r>
-        <w:instrText xml:space="preserve"> PAGEREF _Toc5201 \h </w:instrText>
+        <w:instrText xml:space="preserve"> PAGEREF _Toc3864 \h </w:instrText>
       </w:r>
       <w:r>
         <w:fldChar w:fldCharType="separate"/>
@@ -1472,12 +1475,15 @@
         <w:fldChar w:fldCharType="begin"/>
       </w:r>
       <w:r>
-        <w:instrText xml:space="preserve"> HYPERLINK \l _Toc25572 </w:instrText>
+        <w:instrText xml:space="preserve"> HYPERLINK \l _Toc19346 </w:instrText>
       </w:r>
       <w:r>
         <w:fldChar w:fldCharType="separate"/>
       </w:r>
       <w:r>
+        <w:rPr>
+          <w:rFonts w:ascii="Times New Roman" w:hAnsi="Times New Roman"/>
+        </w:rPr>
         <w:t>1.1. Lý do chọn đề tài</w:t>
       </w:r>
       <w:r>
@@ -1487,7 +1493,7 @@
         <w:fldChar w:fldCharType="begin"/>
       </w:r>
       <w:r>
-        <w:instrText xml:space="preserve"> PAGEREF _Toc25572 \h </w:instrText>
+        <w:instrText xml:space="preserve"> PAGEREF _Toc19346 \h </w:instrText>
       </w:r>
       <w:r>
         <w:fldChar w:fldCharType="separate"/>
@@ -1513,12 +1519,15 @@
         <w:fldChar w:fldCharType="begin"/>
       </w:r>
       <w:r>
-        <w:instrText xml:space="preserve"> HYPERLINK \l _Toc12067 </w:instrText>
+        <w:instrText xml:space="preserve"> HYPERLINK \l _Toc15348 </w:instrText>
       </w:r>
       <w:r>
         <w:fldChar w:fldCharType="separate"/>
       </w:r>
       <w:r>
+        <w:rPr>
+          <w:rFonts w:ascii="Times New Roman" w:hAnsi="Times New Roman"/>
+        </w:rPr>
         <w:t>1.2. Mục tiêu của đề tài</w:t>
       </w:r>
       <w:r>
@@ -1528,13 +1537,13 @@
         <w:fldChar w:fldCharType="begin"/>
       </w:r>
       <w:r>
-        <w:instrText xml:space="preserve"> PAGEREF _Toc12067 \h </w:instrText>
+        <w:instrText xml:space="preserve"> PAGEREF _Toc15348 \h </w:instrText>
       </w:r>
       <w:r>
         <w:fldChar w:fldCharType="separate"/>
       </w:r>
       <w:r>
-        <w:t>8</w:t>
+        <w:t>7</w:t>
       </w:r>
       <w:r>
         <w:fldChar w:fldCharType="end"/>
@@ -1554,12 +1563,15 @@
         <w:fldChar w:fldCharType="begin"/>
       </w:r>
       <w:r>
-        <w:instrText xml:space="preserve"> HYPERLINK \l _Toc20591 </w:instrText>
+        <w:instrText xml:space="preserve"> HYPERLINK \l _Toc31434 </w:instrText>
       </w:r>
       <w:r>
         <w:fldChar w:fldCharType="separate"/>
       </w:r>
       <w:r>
+        <w:rPr>
+          <w:rFonts w:ascii="Times New Roman" w:hAnsi="Times New Roman"/>
+        </w:rPr>
         <w:t>1.2.1. Mục tiêu tổng quát</w:t>
       </w:r>
       <w:r>
@@ -1569,13 +1581,13 @@
         <w:fldChar w:fldCharType="begin"/>
       </w:r>
       <w:r>
-        <w:instrText xml:space="preserve"> PAGEREF _Toc20591 \h </w:instrText>
+        <w:instrText xml:space="preserve"> PAGEREF _Toc31434 \h </w:instrText>
       </w:r>
       <w:r>
         <w:fldChar w:fldCharType="separate"/>
       </w:r>
       <w:r>
-        <w:t>8</w:t>
+        <w:t>7</w:t>
       </w:r>
       <w:r>
         <w:fldChar w:fldCharType="end"/>
@@ -1595,12 +1607,15 @@
         <w:fldChar w:fldCharType="begin"/>
       </w:r>
       <w:r>
-        <w:instrText xml:space="preserve"> HYPERLINK \l _Toc4255 </w:instrText>
+        <w:instrText xml:space="preserve"> HYPERLINK \l _Toc18949 </w:instrText>
       </w:r>
       <w:r>
         <w:fldChar w:fldCharType="separate"/>
       </w:r>
       <w:r>
+        <w:rPr>
+          <w:rFonts w:ascii="Times New Roman" w:hAnsi="Times New Roman"/>
+        </w:rPr>
         <w:t>1.2.2. Mục tiêu cụ thể</w:t>
       </w:r>
       <w:r>
@@ -1610,13 +1625,13 @@
         <w:fldChar w:fldCharType="begin"/>
       </w:r>
       <w:r>
-        <w:instrText xml:space="preserve"> PAGEREF _Toc4255 \h </w:instrText>
+        <w:instrText xml:space="preserve"> PAGEREF _Toc18949 \h </w:instrText>
       </w:r>
       <w:r>
         <w:fldChar w:fldCharType="separate"/>
       </w:r>
       <w:r>
-        <w:t>8</w:t>
+        <w:t>7</w:t>
       </w:r>
       <w:r>
         <w:fldChar w:fldCharType="end"/>
@@ -1636,12 +1651,15 @@
         <w:fldChar w:fldCharType="begin"/>
       </w:r>
       <w:r>
-        <w:instrText xml:space="preserve"> HYPERLINK \l _Toc7237 </w:instrText>
+        <w:instrText xml:space="preserve"> HYPERLINK \l _Toc17929 </w:instrText>
       </w:r>
       <w:r>
         <w:fldChar w:fldCharType="separate"/>
       </w:r>
       <w:r>
+        <w:rPr>
+          <w:rFonts w:ascii="Times New Roman" w:hAnsi="Times New Roman"/>
+        </w:rPr>
         <w:t>1.3. Đối tượng và phạm vi nghiên cứu</w:t>
       </w:r>
       <w:r>
@@ -1651,13 +1669,13 @@
         <w:fldChar w:fldCharType="begin"/>
       </w:r>
       <w:r>
-        <w:instrText xml:space="preserve"> PAGEREF _Toc7237 \h </w:instrText>
+        <w:instrText xml:space="preserve"> PAGEREF _Toc17929 \h </w:instrText>
       </w:r>
       <w:r>
         <w:fldChar w:fldCharType="separate"/>
       </w:r>
       <w:r>
-        <w:t>9</w:t>
+        <w:t>10</w:t>
       </w:r>
       <w:r>
         <w:fldChar w:fldCharType="end"/>
@@ -1677,12 +1695,15 @@
         <w:fldChar w:fldCharType="begin"/>
       </w:r>
       <w:r>
-        <w:instrText xml:space="preserve"> HYPERLINK \l _Toc11105 </w:instrText>
+        <w:instrText xml:space="preserve"> HYPERLINK \l _Toc11792 </w:instrText>
       </w:r>
       <w:r>
         <w:fldChar w:fldCharType="separate"/>
       </w:r>
       <w:r>
+        <w:rPr>
+          <w:rFonts w:ascii="Times New Roman" w:hAnsi="Times New Roman"/>
+        </w:rPr>
         <w:t>1.3.1. Đối tượng nghiên cứu</w:t>
       </w:r>
       <w:r>
@@ -1692,13 +1713,13 @@
         <w:fldChar w:fldCharType="begin"/>
       </w:r>
       <w:r>
-        <w:instrText xml:space="preserve"> PAGEREF _Toc11105 \h </w:instrText>
+        <w:instrText xml:space="preserve"> PAGEREF _Toc11792 \h </w:instrText>
       </w:r>
       <w:r>
         <w:fldChar w:fldCharType="separate"/>
       </w:r>
       <w:r>
-        <w:t>9</w:t>
+        <w:t>10</w:t>
       </w:r>
       <w:r>
         <w:fldChar w:fldCharType="end"/>
@@ -1718,12 +1739,15 @@
         <w:fldChar w:fldCharType="begin"/>
       </w:r>
       <w:r>
-        <w:instrText xml:space="preserve"> HYPERLINK \l _Toc25556 </w:instrText>
+        <w:instrText xml:space="preserve"> HYPERLINK \l _Toc22068 </w:instrText>
       </w:r>
       <w:r>
         <w:fldChar w:fldCharType="separate"/>
       </w:r>
       <w:r>
+        <w:rPr>
+          <w:rFonts w:ascii="Times New Roman" w:hAnsi="Times New Roman"/>
+        </w:rPr>
         <w:t>1.3.2. Phạm vi nghiên cứu</w:t>
       </w:r>
       <w:r>
@@ -1733,7 +1757,7 @@
         <w:fldChar w:fldCharType="begin"/>
       </w:r>
       <w:r>
-        <w:instrText xml:space="preserve"> PAGEREF _Toc25556 \h </w:instrText>
+        <w:instrText xml:space="preserve"> PAGEREF _Toc22068 \h </w:instrText>
       </w:r>
       <w:r>
         <w:fldChar w:fldCharType="separate"/>
@@ -1759,12 +1783,15 @@
         <w:fldChar w:fldCharType="begin"/>
       </w:r>
       <w:r>
-        <w:instrText xml:space="preserve"> HYPERLINK \l _Toc21849 </w:instrText>
+        <w:instrText xml:space="preserve"> HYPERLINK \l _Toc8142 </w:instrText>
       </w:r>
       <w:r>
         <w:fldChar w:fldCharType="separate"/>
       </w:r>
       <w:r>
+        <w:rPr>
+          <w:rFonts w:ascii="Times New Roman" w:hAnsi="Times New Roman"/>
+        </w:rPr>
         <w:t>1.4. Phương pháp thực hiện</w:t>
       </w:r>
       <w:r>
@@ -1774,7 +1801,7 @@
         <w:fldChar w:fldCharType="begin"/>
       </w:r>
       <w:r>
-        <w:instrText xml:space="preserve"> PAGEREF _Toc21849 \h </w:instrText>
+        <w:instrText xml:space="preserve"> PAGEREF _Toc8142 \h </w:instrText>
       </w:r>
       <w:r>
         <w:fldChar w:fldCharType="separate"/>
@@ -1800,13 +1827,16 @@
         <w:fldChar w:fldCharType="begin"/>
       </w:r>
       <w:r>
-        <w:instrText xml:space="preserve"> HYPERLINK \l _Toc2969 </w:instrText>
+        <w:instrText xml:space="preserve"> HYPERLINK \l _Toc5345 </w:instrText>
       </w:r>
       <w:r>
         <w:fldChar w:fldCharType="separate"/>
       </w:r>
       <w:r>
-        <w:t>1.4.1. Phương pháp nghiên cứu lý thuyết</w:t>
+        <w:rPr>
+          <w:rFonts w:ascii="Times New Roman" w:hAnsi="Times New Roman"/>
+        </w:rPr>
+        <w:t>1.4.1. Phương pháp thu thập và phân tích dữ liệu</w:t>
       </w:r>
       <w:r>
         <w:tab/>
@@ -1815,7 +1845,7 @@
         <w:fldChar w:fldCharType="begin"/>
       </w:r>
       <w:r>
-        <w:instrText xml:space="preserve"> PAGEREF _Toc2969 \h </w:instrText>
+        <w:instrText xml:space="preserve"> PAGEREF _Toc5345 \h </w:instrText>
       </w:r>
       <w:r>
         <w:fldChar w:fldCharType="separate"/>
@@ -1841,13 +1871,16 @@
         <w:fldChar w:fldCharType="begin"/>
       </w:r>
       <w:r>
-        <w:instrText xml:space="preserve"> HYPERLINK \l _Toc30234 </w:instrText>
+        <w:instrText xml:space="preserve"> HYPERLINK \l _Toc14389 </w:instrText>
       </w:r>
       <w:r>
         <w:fldChar w:fldCharType="separate"/>
       </w:r>
       <w:r>
-        <w:t>1.4.2. Phương pháp phân tích và thiết kế hệ thống</w:t>
+        <w:rPr>
+          <w:rFonts w:ascii="Times New Roman" w:hAnsi="Times New Roman"/>
+        </w:rPr>
+        <w:t>1.4.2. Phương pháp thiết kế và phát triển phần mềm</w:t>
       </w:r>
       <w:r>
         <w:tab/>
@@ -1856,13 +1889,13 @@
         <w:fldChar w:fldCharType="begin"/>
       </w:r>
       <w:r>
-        <w:instrText xml:space="preserve"> PAGEREF _Toc30234 \h </w:instrText>
+        <w:instrText xml:space="preserve"> PAGEREF _Toc14389 \h </w:instrText>
       </w:r>
       <w:r>
         <w:fldChar w:fldCharType="separate"/>
       </w:r>
       <w:r>
-        <w:t>11</w:t>
+        <w:t>12</w:t>
       </w:r>
       <w:r>
         <w:fldChar w:fldCharType="end"/>
@@ -1882,13 +1915,16 @@
         <w:fldChar w:fldCharType="begin"/>
       </w:r>
       <w:r>
-        <w:instrText xml:space="preserve"> HYPERLINK \l _Toc17861 </w:instrText>
+        <w:instrText xml:space="preserve"> HYPERLINK \l _Toc7676 </w:instrText>
       </w:r>
       <w:r>
         <w:fldChar w:fldCharType="separate"/>
       </w:r>
       <w:r>
-        <w:t>1.4.3. Phương pháp thực nghiệm và phát triển phần mềm</w:t>
+        <w:rPr>
+          <w:rFonts w:ascii="Times New Roman" w:hAnsi="Times New Roman"/>
+        </w:rPr>
+        <w:t>1.4.3. Phương pháp thử nghiệm và đánh giá</w:t>
       </w:r>
       <w:r>
         <w:tab/>
@@ -1897,13 +1933,13 @@
         <w:fldChar w:fldCharType="begin"/>
       </w:r>
       <w:r>
-        <w:instrText xml:space="preserve"> PAGEREF _Toc17861 \h </w:instrText>
+        <w:instrText xml:space="preserve"> PAGEREF _Toc7676 \h </w:instrText>
       </w:r>
       <w:r>
         <w:fldChar w:fldCharType="separate"/>
       </w:r>
       <w:r>
-        <w:t>11</w:t>
+        <w:t>12</w:t>
       </w:r>
       <w:r>
         <w:fldChar w:fldCharType="end"/>
@@ -1923,12 +1959,15 @@
         <w:fldChar w:fldCharType="begin"/>
       </w:r>
       <w:r>
-        <w:instrText xml:space="preserve"> HYPERLINK \l _Toc17519 </w:instrText>
+        <w:instrText xml:space="preserve"> HYPERLINK \l _Toc14095 </w:instrText>
       </w:r>
       <w:r>
         <w:fldChar w:fldCharType="separate"/>
       </w:r>
       <w:r>
+        <w:rPr>
+          <w:rFonts w:ascii="Times New Roman" w:hAnsi="Times New Roman"/>
+        </w:rPr>
         <w:t>1.5. Ý nghĩa của đề tài</w:t>
       </w:r>
       <w:r>
@@ -1938,13 +1977,13 @@
         <w:fldChar w:fldCharType="begin"/>
       </w:r>
       <w:r>
-        <w:instrText xml:space="preserve"> PAGEREF _Toc17519 \h </w:instrText>
+        <w:instrText xml:space="preserve"> PAGEREF _Toc14095 \h </w:instrText>
       </w:r>
       <w:r>
         <w:fldChar w:fldCharType="separate"/>
       </w:r>
       <w:r>
-        <w:t>12</w:t>
+        <w:t>13</w:t>
       </w:r>
       <w:r>
         <w:fldChar w:fldCharType="end"/>
@@ -1964,12 +2003,15 @@
         <w:fldChar w:fldCharType="begin"/>
       </w:r>
       <w:r>
-        <w:instrText xml:space="preserve"> HYPERLINK \l _Toc28134 </w:instrText>
+        <w:instrText xml:space="preserve"> HYPERLINK \l _Toc8079 </w:instrText>
       </w:r>
       <w:r>
         <w:fldChar w:fldCharType="separate"/>
       </w:r>
       <w:r>
+        <w:rPr>
+          <w:rFonts w:ascii="Times New Roman" w:hAnsi="Times New Roman"/>
+        </w:rPr>
         <w:t>1.5.1. Ý nghĩa khoa học và công nghệ</w:t>
       </w:r>
       <w:r>
@@ -1979,13 +2021,13 @@
         <w:fldChar w:fldCharType="begin"/>
       </w:r>
       <w:r>
-        <w:instrText xml:space="preserve"> PAGEREF _Toc28134 \h </w:instrText>
+        <w:instrText xml:space="preserve"> PAGEREF _Toc8079 \h </w:instrText>
       </w:r>
       <w:r>
         <w:fldChar w:fldCharType="separate"/>
       </w:r>
       <w:r>
-        <w:t>12</w:t>
+        <w:t>13</w:t>
       </w:r>
       <w:r>
         <w:fldChar w:fldCharType="end"/>
@@ -2005,12 +2047,15 @@
         <w:fldChar w:fldCharType="begin"/>
       </w:r>
       <w:r>
-        <w:instrText xml:space="preserve"> HYPERLINK \l _Toc30161 </w:instrText>
+        <w:instrText xml:space="preserve"> HYPERLINK \l _Toc21014 </w:instrText>
       </w:r>
       <w:r>
         <w:fldChar w:fldCharType="separate"/>
       </w:r>
       <w:r>
+        <w:rPr>
+          <w:rFonts w:ascii="Times New Roman" w:hAnsi="Times New Roman"/>
+        </w:rPr>
         <w:t>1.5.2. Ý nghĩa thực tiễn</w:t>
       </w:r>
       <w:r>
@@ -2020,13 +2065,13 @@
         <w:fldChar w:fldCharType="begin"/>
       </w:r>
       <w:r>
-        <w:instrText xml:space="preserve"> PAGEREF _Toc30161 \h </w:instrText>
+        <w:instrText xml:space="preserve"> PAGEREF _Toc21014 \h </w:instrText>
       </w:r>
       <w:r>
         <w:fldChar w:fldCharType="separate"/>
       </w:r>
       <w:r>
-        <w:t>12</w:t>
+        <w:t>13</w:t>
       </w:r>
       <w:r>
         <w:fldChar w:fldCharType="end"/>
@@ -2052,7 +2097,7 @@
         <w:ind w:left="0" w:firstLine="0"/>
         <w:jc w:val="center"/>
       </w:pPr>
-      <w:bookmarkStart w:id="3" w:name="_Toc5002"/>
+      <w:bookmarkStart w:id="3" w:name="_Toc25284"/>
       <w:r>
         <w:t>LỜI MỞ ĐẦU</w:t>
       </w:r>
@@ -2139,6 +2184,7 @@
         <w:ind w:firstLine="0"/>
         <w:jc w:val="center"/>
       </w:pPr>
+      <w:bookmarkStart w:id="4" w:name="_Toc3864"/>
       <w:r>
         <w:rPr>
           <w:rFonts w:ascii="Times New Roman" w:hAnsi="Times New Roman"/>
@@ -2147,6 +2193,7 @@
         </w:rPr>
         <w:t>CHƯƠNG 1. TỔNG QUAN ĐỀ TÀI</w:t>
       </w:r>
+      <w:bookmarkEnd w:id="4"/>
     </w:p>
     <w:p>
       <w:pPr>
@@ -2155,6 +2202,7 @@
         <w:ind w:firstLine="0"/>
         <w:jc w:val="left"/>
       </w:pPr>
+      <w:bookmarkStart w:id="5" w:name="_Toc19346"/>
       <w:r>
         <w:rPr>
           <w:rFonts w:ascii="Times New Roman" w:hAnsi="Times New Roman"/>
@@ -2163,6 +2211,7 @@
         </w:rPr>
         <w:t>1.1. Lý do chọn đề tài</w:t>
       </w:r>
+      <w:bookmarkEnd w:id="5"/>
     </w:p>
     <w:p>
       <w:pPr>
@@ -2381,6 +2430,7 @@
         <w:ind w:firstLine="0"/>
         <w:jc w:val="left"/>
       </w:pPr>
+      <w:bookmarkStart w:id="6" w:name="_Toc15348"/>
       <w:r>
         <w:rPr>
           <w:rFonts w:ascii="Times New Roman" w:hAnsi="Times New Roman"/>
@@ -2389,6 +2439,7 @@
         </w:rPr>
         <w:t>1.2. Mục tiêu của đề tài</w:t>
       </w:r>
+      <w:bookmarkEnd w:id="6"/>
     </w:p>
     <w:p>
       <w:pPr>
@@ -2411,6 +2462,7 @@
         <w:ind w:firstLine="0"/>
         <w:jc w:val="left"/>
       </w:pPr>
+      <w:bookmarkStart w:id="7" w:name="_Toc31434"/>
       <w:r>
         <w:rPr>
           <w:rFonts w:ascii="Times New Roman" w:hAnsi="Times New Roman"/>
@@ -2419,6 +2471,7 @@
         </w:rPr>
         <w:t>1.2.1. Mục tiêu tổng quát</w:t>
       </w:r>
+      <w:bookmarkEnd w:id="7"/>
     </w:p>
     <w:p>
       <w:pPr>
@@ -2441,6 +2494,7 @@
         <w:ind w:firstLine="0"/>
         <w:jc w:val="left"/>
       </w:pPr>
+      <w:bookmarkStart w:id="8" w:name="_Toc18949"/>
       <w:r>
         <w:rPr>
           <w:rFonts w:ascii="Times New Roman" w:hAnsi="Times New Roman"/>
@@ -2449,6 +2503,7 @@
         </w:rPr>
         <w:t>1.2.2. Mục tiêu cụ thể</w:t>
       </w:r>
+      <w:bookmarkEnd w:id="8"/>
     </w:p>
     <w:p>
       <w:pPr>
@@ -2849,6 +2904,7 @@
         <w:ind w:firstLine="0"/>
         <w:jc w:val="left"/>
       </w:pPr>
+      <w:bookmarkStart w:id="9" w:name="_Toc17929"/>
       <w:r>
         <w:rPr>
           <w:rFonts w:ascii="Times New Roman" w:hAnsi="Times New Roman"/>
@@ -2857,6 +2913,7 @@
         </w:rPr>
         <w:t>1.3. Đối tượng và phạm vi nghiên cứu</w:t>
       </w:r>
+      <w:bookmarkEnd w:id="9"/>
     </w:p>
     <w:p>
       <w:pPr>
@@ -2879,6 +2936,7 @@
         <w:ind w:firstLine="0"/>
         <w:jc w:val="left"/>
       </w:pPr>
+      <w:bookmarkStart w:id="10" w:name="_Toc11792"/>
       <w:r>
         <w:rPr>
           <w:rFonts w:ascii="Times New Roman" w:hAnsi="Times New Roman"/>
@@ -2887,6 +2945,7 @@
         </w:rPr>
         <w:t>1.3.1. Đối tượng nghiên cứu</w:t>
       </w:r>
+      <w:bookmarkEnd w:id="10"/>
     </w:p>
     <w:p>
       <w:pPr>
@@ -3063,6 +3122,7 @@
         <w:ind w:firstLine="0"/>
         <w:jc w:val="left"/>
       </w:pPr>
+      <w:bookmarkStart w:id="11" w:name="_Toc22068"/>
       <w:r>
         <w:rPr>
           <w:rFonts w:ascii="Times New Roman" w:hAnsi="Times New Roman"/>
@@ -3071,6 +3131,7 @@
         </w:rPr>
         <w:t>1.3.2. Phạm vi nghiên cứu</w:t>
       </w:r>
+      <w:bookmarkEnd w:id="11"/>
     </w:p>
     <w:p>
       <w:pPr>
@@ -3219,6 +3280,7 @@
         <w:ind w:firstLine="0"/>
         <w:jc w:val="left"/>
       </w:pPr>
+      <w:bookmarkStart w:id="12" w:name="_Toc8142"/>
       <w:r>
         <w:rPr>
           <w:rFonts w:ascii="Times New Roman" w:hAnsi="Times New Roman"/>
@@ -3227,6 +3289,7 @@
         </w:rPr>
         <w:t>1.4. Phương pháp thực hiện</w:t>
       </w:r>
+      <w:bookmarkEnd w:id="12"/>
     </w:p>
     <w:p>
       <w:pPr>
@@ -3249,6 +3312,7 @@
         <w:ind w:firstLine="0"/>
         <w:jc w:val="left"/>
       </w:pPr>
+      <w:bookmarkStart w:id="13" w:name="_Toc5345"/>
       <w:r>
         <w:rPr>
           <w:rFonts w:ascii="Times New Roman" w:hAnsi="Times New Roman"/>
@@ -3257,6 +3321,7 @@
         </w:rPr>
         <w:t>1.4.1. Phương pháp thu thập và phân tích dữ liệu</w:t>
       </w:r>
+      <w:bookmarkEnd w:id="13"/>
     </w:p>
     <w:p>
       <w:pPr>
@@ -3307,6 +3372,7 @@
         <w:ind w:firstLine="0"/>
         <w:jc w:val="left"/>
       </w:pPr>
+      <w:bookmarkStart w:id="14" w:name="_Toc14389"/>
       <w:r>
         <w:rPr>
           <w:rFonts w:ascii="Times New Roman" w:hAnsi="Times New Roman"/>
@@ -3315,6 +3381,7 @@
         </w:rPr>
         <w:t>1.4.2. Phương pháp thiết kế và phát triển phần mềm</w:t>
       </w:r>
+      <w:bookmarkEnd w:id="14"/>
     </w:p>
     <w:p>
       <w:pPr>
@@ -3449,6 +3516,7 @@
         <w:ind w:firstLine="0"/>
         <w:jc w:val="left"/>
       </w:pPr>
+      <w:bookmarkStart w:id="15" w:name="_Toc7676"/>
       <w:r>
         <w:rPr>
           <w:rFonts w:ascii="Times New Roman" w:hAnsi="Times New Roman"/>
@@ -3457,6 +3525,7 @@
         </w:rPr>
         <w:t>1.4.3. Phương pháp thử nghiệm và đánh giá</w:t>
       </w:r>
+      <w:bookmarkEnd w:id="15"/>
     </w:p>
     <w:p>
       <w:pPr>
@@ -3521,6 +3590,7 @@
         <w:ind w:firstLine="0"/>
         <w:jc w:val="left"/>
       </w:pPr>
+      <w:bookmarkStart w:id="16" w:name="_Toc14095"/>
       <w:r>
         <w:rPr>
           <w:rFonts w:ascii="Times New Roman" w:hAnsi="Times New Roman"/>
@@ -3529,6 +3599,7 @@
         </w:rPr>
         <w:t>1.5. Ý nghĩa của đề tài</w:t>
       </w:r>
+      <w:bookmarkEnd w:id="16"/>
     </w:p>
     <w:p>
       <w:pPr>
@@ -3551,6 +3622,7 @@
         <w:ind w:firstLine="0"/>
         <w:jc w:val="left"/>
       </w:pPr>
+      <w:bookmarkStart w:id="17" w:name="_Toc8079"/>
       <w:r>
         <w:rPr>
           <w:rFonts w:ascii="Times New Roman" w:hAnsi="Times New Roman"/>
@@ -3559,6 +3631,7 @@
         </w:rPr>
         <w:t>1.5.1. Ý nghĩa khoa học và công nghệ</w:t>
       </w:r>
+      <w:bookmarkEnd w:id="17"/>
     </w:p>
     <w:p>
       <w:pPr>
@@ -3609,6 +3682,7 @@
         <w:ind w:firstLine="0"/>
         <w:jc w:val="left"/>
       </w:pPr>
+      <w:bookmarkStart w:id="18" w:name="_Toc21014"/>
       <w:r>
         <w:rPr>
           <w:rFonts w:ascii="Times New Roman" w:hAnsi="Times New Roman"/>
@@ -3617,6 +3691,7 @@
         </w:rPr>
         <w:t>1.5.2. Ý nghĩa thực tiễn</w:t>
       </w:r>
+      <w:bookmarkEnd w:id="18"/>
     </w:p>
     <w:p>
       <w:pPr>
@@ -3651,6 +3726,10 @@
         <w:spacing w:before="0" w:after="120" w:line="360" w:lineRule="auto"/>
         <w:ind w:firstLine="720"/>
         <w:jc w:val="both"/>
+        <w:rPr>
+          <w:rFonts w:ascii="Times New Roman" w:hAnsi="Times New Roman"/>
+          <w:sz w:val="26"/>
+        </w:rPr>
       </w:pPr>
       <w:r>
         <w:rPr>
@@ -3658,6 +3737,1759 @@
           <w:sz w:val="26"/>
         </w:rPr>
         <w:t>- Đối với nhóm nghiên cứu: Nâng cao toàn diện tư duy hệ thống, kỹ năng lập trình Java chuyên sâu, quản trị cơ sở dữ liệu và quy trình phát triển phần mềm chuyên nghiệp.</w:t>
+      </w:r>
+    </w:p>
+    <w:p>
+      <w:pPr>
+        <w:rPr>
+          <w:rFonts w:ascii="Times New Roman" w:hAnsi="Times New Roman"/>
+          <w:sz w:val="26"/>
+        </w:rPr>
+      </w:pPr>
+      <w:r>
+        <w:rPr>
+          <w:rFonts w:ascii="Times New Roman" w:hAnsi="Times New Roman"/>
+          <w:sz w:val="26"/>
+        </w:rPr>
+        <w:br w:type="page"/>
+      </w:r>
+    </w:p>
+    <w:p>
+      <w:pPr>
+        <w:spacing w:before="0" w:after="120" w:line="360" w:lineRule="auto"/>
+        <w:jc w:val="both"/>
+        <w:rPr>
+          <w:rFonts w:ascii="Times New Roman" w:hAnsi="Times New Roman"/>
+          <w:sz w:val="26"/>
+        </w:rPr>
+      </w:pPr>
+      <w:bookmarkStart w:id="19" w:name="_GoBack"/>
+      <w:bookmarkEnd w:id="19"/>
+    </w:p>
+    <w:p>
+      <w:pPr>
+        <w:pStyle w:val="2"/>
+        <w:spacing w:before="240" w:after="240" w:line="360" w:lineRule="auto"/>
+        <w:ind w:firstLine="0"/>
+        <w:jc w:val="center"/>
+      </w:pPr>
+      <w:r>
+        <w:rPr>
+          <w:rFonts w:ascii="Times New Roman" w:hAnsi="Times New Roman"/>
+          <w:b/>
+          <w:sz w:val="32"/>
+        </w:rPr>
+        <w:t>CHƯƠNG 2. CƠ SỞ LÝ THUYẾT</w:t>
+      </w:r>
+    </w:p>
+    <w:p>
+      <w:pPr>
+        <w:pStyle w:val="3"/>
+        <w:spacing w:before="0" w:after="120" w:line="360" w:lineRule="auto"/>
+        <w:ind w:firstLine="0"/>
+        <w:jc w:val="left"/>
+      </w:pPr>
+      <w:r>
+        <w:rPr>
+          <w:rFonts w:ascii="Times New Roman" w:hAnsi="Times New Roman"/>
+          <w:b/>
+          <w:sz w:val="26"/>
+        </w:rPr>
+        <w:t>2.1. Tổng quan thương mại điện tử</w:t>
+      </w:r>
+    </w:p>
+    <w:p>
+      <w:pPr>
+        <w:pStyle w:val="4"/>
+        <w:spacing w:before="0" w:after="120" w:line="360" w:lineRule="auto"/>
+        <w:ind w:firstLine="0"/>
+        <w:jc w:val="left"/>
+      </w:pPr>
+      <w:r>
+        <w:rPr>
+          <w:rFonts w:ascii="Times New Roman" w:hAnsi="Times New Roman"/>
+          <w:b/>
+          <w:sz w:val="26"/>
+        </w:rPr>
+        <w:t>2.1.1. Khái niệm và bản chất của Thương mại điện tử</w:t>
+      </w:r>
+    </w:p>
+    <w:p>
+      <w:pPr>
+        <w:spacing w:before="0" w:after="120" w:line="360" w:lineRule="auto"/>
+        <w:ind w:firstLine="720"/>
+        <w:jc w:val="both"/>
+      </w:pPr>
+      <w:r>
+        <w:rPr>
+          <w:rFonts w:ascii="Times New Roman" w:hAnsi="Times New Roman"/>
+          <w:sz w:val="26"/>
+        </w:rPr>
+        <w:t>Theo định nghĩa của Tổ chức Thương mại Thế giới (WTO), Thương mại điện tử (E-Commerce) là quy trình sản xuất, quảng cáo, bán hàng và phân phối sản phẩm hoặc dịch vụ thông qua các mạng máy tính và mạng viễn thông. Ở góc độ rộng hơn của Tổ chức Hợp tác và Phát triển Kinh tế (OECD), giao dịch thương mại điện tử bao gồm việc đặt hàng hoặc bán hàng hóa, dịch vụ được thực hiện qua mạng Internet dựa trên các phương thức thiết kế đặc biệt nhằm mục đích nhận hoặc đặt hàng.</w:t>
+      </w:r>
+    </w:p>
+    <w:p>
+      <w:pPr>
+        <w:spacing w:before="0" w:after="120" w:line="360" w:lineRule="auto"/>
+        <w:ind w:firstLine="720"/>
+        <w:jc w:val="both"/>
+      </w:pPr>
+      <w:r>
+        <w:rPr>
+          <w:rFonts w:ascii="Times New Roman" w:hAnsi="Times New Roman"/>
+          <w:sz w:val="26"/>
+        </w:rPr>
+        <w:t>Bản chất của thương mại điện tử là sự ứng dụng công nghệ thông tin và truyền thông (ICT) để tái cấu trúc và tối ưu hóa toàn bộ chuỗi giá trị doanh nghiệp. Thương mại điện tử xóa bỏ rào cản về mặt khoảng cách địa lý và thời gian, cho phép các giao dịch thương mại diễn ra liên tục 24/7. So với thương mại truyền thống, thương mại điện tử giúp tiết kiệm chi phí vận hành mặt bằng, giảm thiểu chi phí nhân sự, rút ngắn thời gian xử lý đơn hàng và mở rộng khả năng tiếp cận thị trường tiềm năng không giới hạn.</w:t>
+      </w:r>
+    </w:p>
+    <w:p>
+      <w:pPr>
+        <w:pStyle w:val="4"/>
+        <w:spacing w:before="0" w:after="120" w:line="360" w:lineRule="auto"/>
+        <w:ind w:firstLine="0"/>
+        <w:jc w:val="left"/>
+      </w:pPr>
+      <w:r>
+        <w:rPr>
+          <w:rFonts w:ascii="Times New Roman" w:hAnsi="Times New Roman"/>
+          <w:b/>
+          <w:sz w:val="26"/>
+        </w:rPr>
+        <w:t>2.1.2. Phân loại các mô hình thương mại điện tử</w:t>
+      </w:r>
+    </w:p>
+    <w:p>
+      <w:pPr>
+        <w:spacing w:before="0" w:after="120" w:line="360" w:lineRule="auto"/>
+        <w:ind w:firstLine="720"/>
+        <w:jc w:val="both"/>
+      </w:pPr>
+      <w:r>
+        <w:rPr>
+          <w:rFonts w:ascii="Times New Roman" w:hAnsi="Times New Roman"/>
+          <w:sz w:val="26"/>
+        </w:rPr>
+        <w:t>Dựa trên bản chất của các chủ thể tham gia vào giao dịch (Doanh nghiệp - Business, Khách hàng - Consumer, Chính phủ - Government), thương mại điện tử được chia thành các mô hình giao dịch cơ bản:</w:t>
+      </w:r>
+    </w:p>
+    <w:p>
+      <w:pPr>
+        <w:spacing w:before="0" w:after="120" w:line="360" w:lineRule="auto"/>
+        <w:ind w:firstLine="720"/>
+        <w:jc w:val="both"/>
+      </w:pPr>
+      <w:r>
+        <w:rPr>
+          <w:rFonts w:ascii="Times New Roman" w:hAnsi="Times New Roman"/>
+          <w:sz w:val="26"/>
+        </w:rPr>
+        <w:t>- Mô hình Doanh nghiệp với Khách hàng (B2C - Business-to-Consumer): Doanh nghiệp trực tiếp bán sản phẩm, dịch vụ tới người tiêu dùng cuối cùng thông qua trang web hoặc ứng dụng di động. Đây là mô hình phổ biến nhất trên thị trường hiện nay.</w:t>
+      </w:r>
+    </w:p>
+    <w:p>
+      <w:pPr>
+        <w:spacing w:before="0" w:after="120" w:line="360" w:lineRule="auto"/>
+        <w:ind w:firstLine="720"/>
+        <w:jc w:val="both"/>
+      </w:pPr>
+      <w:r>
+        <w:rPr>
+          <w:rFonts w:ascii="Times New Roman" w:hAnsi="Times New Roman"/>
+          <w:sz w:val="26"/>
+        </w:rPr>
+        <w:t>- Mô hình Doanh nghiệp với Doanh nghiệp (B2B - Business-to-Business): Các giao dịch thương mại, mua bán buôn, cung ứng vật tư nguyên liệu diễn ra trực tiếp giữa các doanh nghiệp với nhau.</w:t>
+      </w:r>
+    </w:p>
+    <w:p>
+      <w:pPr>
+        <w:spacing w:before="0" w:after="120" w:line="360" w:lineRule="auto"/>
+        <w:ind w:firstLine="720"/>
+        <w:jc w:val="both"/>
+      </w:pPr>
+      <w:r>
+        <w:rPr>
+          <w:rFonts w:ascii="Times New Roman" w:hAnsi="Times New Roman"/>
+          <w:sz w:val="26"/>
+        </w:rPr>
+        <w:t>- Mô hình Khách hàng với Khách hàng (C2C - Consumer-to-Consumer): Các cá nhân tự trao đổi, mua bán sản phẩm, hàng hóa cũ hoặc mới với nhau thông qua các nền tảng đấu giá trực tuyến hoặc chợ điện tử trung gian.</w:t>
+      </w:r>
+    </w:p>
+    <w:p>
+      <w:pPr>
+        <w:spacing w:before="0" w:after="120" w:line="360" w:lineRule="auto"/>
+        <w:ind w:firstLine="720"/>
+        <w:jc w:val="both"/>
+      </w:pPr>
+      <w:r>
+        <w:rPr>
+          <w:rFonts w:ascii="Times New Roman" w:hAnsi="Times New Roman"/>
+          <w:sz w:val="26"/>
+        </w:rPr>
+        <w:t>- Mô hình Sàn thương mại điện tử đa gian hàng (Multi-vendor Marketplace B2C/C2C): Nền tảng kết nối tổng hợp nơi đơn vị vận hành sàn đóng vai trò cung cấp hạ tầng công nghệ trung gian, cho phép hàng nghìn doanh nghiệp (B2C) và cá nhân (C2C) cùng mở gian hàng kinh doanh.</w:t>
+      </w:r>
+    </w:p>
+    <w:p>
+      <w:pPr>
+        <w:pStyle w:val="4"/>
+        <w:spacing w:before="0" w:after="120" w:line="360" w:lineRule="auto"/>
+        <w:ind w:firstLine="0"/>
+        <w:jc w:val="left"/>
+      </w:pPr>
+      <w:r>
+        <w:rPr>
+          <w:rFonts w:ascii="Times New Roman" w:hAnsi="Times New Roman"/>
+          <w:b/>
+          <w:sz w:val="26"/>
+        </w:rPr>
+        <w:t>2.1.3. Lợi ích và xu hướng phát triển của thương mại điện tử</w:t>
+      </w:r>
+    </w:p>
+    <w:p>
+      <w:pPr>
+        <w:spacing w:before="0" w:after="120" w:line="360" w:lineRule="auto"/>
+        <w:ind w:firstLine="720"/>
+        <w:jc w:val="both"/>
+      </w:pPr>
+      <w:r>
+        <w:rPr>
+          <w:rFonts w:ascii="Times New Roman" w:hAnsi="Times New Roman"/>
+          <w:sz w:val="26"/>
+        </w:rPr>
+        <w:t>Thương mại điện tử mang lại giá trị vượt trội cho cả ba chủ thể kinh tế:</w:t>
+      </w:r>
+    </w:p>
+    <w:p>
+      <w:pPr>
+        <w:spacing w:before="0" w:after="120" w:line="360" w:lineRule="auto"/>
+        <w:ind w:firstLine="720"/>
+        <w:jc w:val="both"/>
+      </w:pPr>
+      <w:r>
+        <w:rPr>
+          <w:rFonts w:ascii="Times New Roman" w:hAnsi="Times New Roman"/>
+          <w:sz w:val="26"/>
+        </w:rPr>
+        <w:t>- Đối với doanh nghiệp: Tối ưu hóa chi phí vận hành, tự động hóa quy trình quản lý bán hàng, thu thập dữ liệu hành vi người dùng (Big Data) để cá nhân hóa chiến dịch Marketing và tăng tỷ lệ chuyển đổi.</w:t>
+      </w:r>
+    </w:p>
+    <w:p>
+      <w:pPr>
+        <w:spacing w:before="0" w:after="120" w:line="360" w:lineRule="auto"/>
+        <w:ind w:firstLine="720"/>
+        <w:jc w:val="both"/>
+      </w:pPr>
+      <w:r>
+        <w:rPr>
+          <w:rFonts w:ascii="Times New Roman" w:hAnsi="Times New Roman"/>
+          <w:sz w:val="26"/>
+        </w:rPr>
+        <w:t>- Đối với người tiêu dùng: Tiết kiệm thời gian, dễ dàng so sánh giá cả và tính năng sản phẩm từ nhiều nhà cung cấp, tiếp cận kho hàng hóa đa dạng và phương thức thanh toán không dùng tiền mặt tiện lợi.</w:t>
+      </w:r>
+    </w:p>
+    <w:p>
+      <w:pPr>
+        <w:spacing w:before="0" w:after="120" w:line="360" w:lineRule="auto"/>
+        <w:ind w:firstLine="720"/>
+        <w:jc w:val="both"/>
+      </w:pPr>
+      <w:r>
+        <w:rPr>
+          <w:rFonts w:ascii="Times New Roman" w:hAnsi="Times New Roman"/>
+          <w:sz w:val="26"/>
+        </w:rPr>
+        <w:t>- Đối với nền kinh tế: Thúc đẩy chuyển đổi số quốc gia, kích cầu tiêu dùng nội địa, thúc đẩy dịch vụ logistics và thanh toán số phát triển.</w:t>
+      </w:r>
+    </w:p>
+    <w:p>
+      <w:pPr>
+        <w:spacing w:before="0" w:after="120" w:line="360" w:lineRule="auto"/>
+        <w:ind w:firstLine="720"/>
+        <w:jc w:val="both"/>
+      </w:pPr>
+      <w:r>
+        <w:rPr>
+          <w:rFonts w:ascii="Times New Roman" w:hAnsi="Times New Roman"/>
+          <w:sz w:val="26"/>
+        </w:rPr>
+        <w:t>Xu hướng thương mại điện tử hiện đại ngày nay tập trung mạnh mẽ vào việc trải nghiệm người dùng trên thiết bị di động (Mobile Commerce), ứng dụng Trí tuệ nhân tạo (AI) trong gợi ý sản phẩm cá nhân hóa, tích hợp hệ sinh thái thanh toán không dùng tiền mặt (Ví điện tử, Cổng thanh toán, QR Code) và mô hình kinh doanh đa gian hàng (Multi-vendor Marketplace).</w:t>
+      </w:r>
+    </w:p>
+    <w:p>
+      <w:pPr>
+        <w:pStyle w:val="3"/>
+        <w:spacing w:before="0" w:after="120" w:line="360" w:lineRule="auto"/>
+        <w:ind w:firstLine="0"/>
+        <w:jc w:val="left"/>
+      </w:pPr>
+      <w:r>
+        <w:rPr>
+          <w:rFonts w:ascii="Times New Roman" w:hAnsi="Times New Roman"/>
+          <w:b/>
+          <w:sz w:val="26"/>
+        </w:rPr>
+        <w:t>2.2. Mô hình Multi-Vendor Marketplace</w:t>
+      </w:r>
+    </w:p>
+    <w:p>
+      <w:pPr>
+        <w:pStyle w:val="4"/>
+        <w:spacing w:before="0" w:after="120" w:line="360" w:lineRule="auto"/>
+        <w:ind w:firstLine="0"/>
+        <w:jc w:val="left"/>
+      </w:pPr>
+      <w:r>
+        <w:rPr>
+          <w:rFonts w:ascii="Times New Roman" w:hAnsi="Times New Roman"/>
+          <w:b/>
+          <w:sz w:val="26"/>
+        </w:rPr>
+        <w:t>2.2.1. Khái niệm và đặc điểm của sàn TMĐT đa gian hàng</w:t>
+      </w:r>
+    </w:p>
+    <w:p>
+      <w:pPr>
+        <w:spacing w:before="0" w:after="120" w:line="360" w:lineRule="auto"/>
+        <w:ind w:firstLine="720"/>
+        <w:jc w:val="both"/>
+      </w:pPr>
+      <w:r>
+        <w:rPr>
+          <w:rFonts w:ascii="Times New Roman" w:hAnsi="Times New Roman"/>
+          <w:sz w:val="26"/>
+        </w:rPr>
+        <w:t>Sàn thương mại điện tử đa gian hàng (Multi-Vendor Marketplace) là một nền tảng website hoặc ứng dụng thương mại điện tử cho phép nhiều nhà bán hàng (Vendors/Sellers) độc lập cùng đăng ký mở gian hàng, đăng tải danh mục sản phẩm và trực tiếp bán hàng cho người tiêu dùng trên cùng một hạ tầng chung.</w:t>
+      </w:r>
+    </w:p>
+    <w:p>
+      <w:pPr>
+        <w:spacing w:before="0" w:after="120" w:line="360" w:lineRule="auto"/>
+        <w:ind w:firstLine="720"/>
+        <w:jc w:val="both"/>
+      </w:pPr>
+      <w:r>
+        <w:rPr>
+          <w:rFonts w:ascii="Times New Roman" w:hAnsi="Times New Roman"/>
+          <w:sz w:val="26"/>
+        </w:rPr>
+        <w:t>Đặc điểm nổi bật của mô hình Multi-vendor là sự phân định nhiệm vụ rõ ràng: Đơn vị chủ sàn (Admin) chịu trách nhiệm quản lý hạ tầng công nghệ, trải nghiệm người dùng, tiếp thị thu hút lưu lượng truy cập (Traffic), bảo mật thông tin và cung cấp các cổng thanh toán chung. Trong khi đó, các Vendor chịu trách nhiệm về nguồn hàng, chất lượng sản phẩm, đóng gói và phối hợp giao nhận hàng hóa.</w:t>
+      </w:r>
+    </w:p>
+    <w:p>
+      <w:pPr>
+        <w:pStyle w:val="4"/>
+        <w:spacing w:before="0" w:after="120" w:line="360" w:lineRule="auto"/>
+        <w:ind w:firstLine="0"/>
+        <w:jc w:val="left"/>
+      </w:pPr>
+      <w:r>
+        <w:rPr>
+          <w:rFonts w:ascii="Times New Roman" w:hAnsi="Times New Roman"/>
+          <w:b/>
+          <w:sz w:val="26"/>
+        </w:rPr>
+        <w:t>2.2.2. So sánh mô hình Single-Vendor và Multi-Vendor</w:t>
+      </w:r>
+    </w:p>
+    <w:p>
+      <w:pPr>
+        <w:spacing w:before="0" w:after="120" w:line="360" w:lineRule="auto"/>
+        <w:ind w:firstLine="720"/>
+        <w:jc w:val="both"/>
+      </w:pPr>
+      <w:r>
+        <w:rPr>
+          <w:rFonts w:ascii="Times New Roman" w:hAnsi="Times New Roman"/>
+          <w:sz w:val="26"/>
+        </w:rPr>
+        <w:t>Sự khác biệt căn bản giữa mô hình Single-Vendor (Đơn gian hàng) và Multi-Vendor (Đa gian hàng) được thể hiện chi tiết qua các tiêu chí:</w:t>
+      </w:r>
+    </w:p>
+    <w:p>
+      <w:pPr>
+        <w:spacing w:before="0" w:after="120" w:line="360" w:lineRule="auto"/>
+        <w:ind w:firstLine="720"/>
+        <w:jc w:val="both"/>
+      </w:pPr>
+      <w:r>
+        <w:rPr>
+          <w:rFonts w:ascii="Times New Roman" w:hAnsi="Times New Roman"/>
+          <w:sz w:val="26"/>
+        </w:rPr>
+        <w:t>- Về nguồn hàng và kho bãi: Single-Vendor yêu cầu doanh nghiệp chủ quản tự nhập hàng, lưu kho và tự chịu rủi ro tồn kho. Trong khi Multi-Vendor phân tán rủi ro tồn kho cho hàng nghìn nhà bán hàng độc lập.</w:t>
+      </w:r>
+    </w:p>
+    <w:p>
+      <w:pPr>
+        <w:spacing w:before="0" w:after="120" w:line="360" w:lineRule="auto"/>
+        <w:ind w:firstLine="720"/>
+        <w:jc w:val="both"/>
+      </w:pPr>
+      <w:r>
+        <w:rPr>
+          <w:rFonts w:ascii="Times New Roman" w:hAnsi="Times New Roman"/>
+          <w:sz w:val="26"/>
+        </w:rPr>
+        <w:t>- Về tính đa dạng sản phẩm: Multi-Vendor mang lại danh mục sản phẩm cực kỳ phong phú và giá cả cạnh tranh hơn nhờ sự tham gia của nhiều nhà cung cấp khác nhau.</w:t>
+      </w:r>
+    </w:p>
+    <w:p>
+      <w:pPr>
+        <w:spacing w:before="0" w:after="120" w:line="360" w:lineRule="auto"/>
+        <w:ind w:firstLine="720"/>
+        <w:jc w:val="both"/>
+      </w:pPr>
+      <w:r>
+        <w:rPr>
+          <w:rFonts w:ascii="Times New Roman" w:hAnsi="Times New Roman"/>
+          <w:sz w:val="26"/>
+        </w:rPr>
+        <w:t>- Về mô hình doanh thu: Single-Vendor thu lợi nhuận từ chênh lệch giá bán và giá nhập. Multi-Vendor thu doanh thu từ phí hoa hồng chiết khấu trên mỗi đơn hàng thành công, phí mở gian hàng, phí quảng cáo và dịch vụ hỗ trợ người bán.</w:t>
+      </w:r>
+    </w:p>
+    <w:p>
+      <w:pPr>
+        <w:spacing w:before="0" w:after="120" w:line="360" w:lineRule="auto"/>
+        <w:ind w:firstLine="720"/>
+        <w:jc w:val="both"/>
+      </w:pPr>
+      <w:r>
+        <w:rPr>
+          <w:rFonts w:ascii="Times New Roman" w:hAnsi="Times New Roman"/>
+          <w:sz w:val="26"/>
+        </w:rPr>
+        <w:t>- Về độ phức tạp quản lý: Multi-Vendor đòi hỏi hệ thống phần mềm phức tạp hơn gấp nhiều lần để xử lý các bài toán phân quyền, cách ly dữ liệu, tách đơn hàng (Split-Order) và phân chia dòng tiền thanh toán.</w:t>
+      </w:r>
+    </w:p>
+    <w:p>
+      <w:pPr>
+        <w:pStyle w:val="4"/>
+        <w:spacing w:before="0" w:after="120" w:line="360" w:lineRule="auto"/>
+        <w:ind w:firstLine="0"/>
+        <w:jc w:val="left"/>
+      </w:pPr>
+      <w:r>
+        <w:rPr>
+          <w:rFonts w:ascii="Times New Roman" w:hAnsi="Times New Roman"/>
+          <w:b/>
+          <w:sz w:val="26"/>
+        </w:rPr>
+        <w:t>2.2.3. Luồng nghiệp vụ cốt lõi trong mô hình Multi-Vendor</w:t>
+      </w:r>
+    </w:p>
+    <w:p>
+      <w:pPr>
+        <w:spacing w:before="0" w:after="120" w:line="360" w:lineRule="auto"/>
+        <w:ind w:firstLine="720"/>
+        <w:jc w:val="both"/>
+      </w:pPr>
+      <w:r>
+        <w:rPr>
+          <w:rFonts w:ascii="Times New Roman" w:hAnsi="Times New Roman"/>
+          <w:sz w:val="26"/>
+        </w:rPr>
+        <w:t>Mô hình Multi-vendor vận hành dựa trên các luồng nghiệp vụ liên hoàn:</w:t>
+      </w:r>
+    </w:p>
+    <w:p>
+      <w:pPr>
+        <w:spacing w:before="0" w:after="120" w:line="360" w:lineRule="auto"/>
+        <w:ind w:firstLine="720"/>
+        <w:jc w:val="both"/>
+      </w:pPr>
+      <w:r>
+        <w:rPr>
+          <w:rFonts w:ascii="Times New Roman" w:hAnsi="Times New Roman"/>
+          <w:sz w:val="26"/>
+        </w:rPr>
+        <w:t>- Luồng đăng ký và duyệt gian hàng: Người bán gửi yêu cầu mở shop -&gt; Admin kiểm tra thông tin pháp lý/hồ sơ -&gt; Duyệt tài khoản Vendor -&gt; Vendor thiết lập giao diện gian hàng.</w:t>
+      </w:r>
+    </w:p>
+    <w:p>
+      <w:pPr>
+        <w:spacing w:before="0" w:after="120" w:line="360" w:lineRule="auto"/>
+        <w:ind w:firstLine="720"/>
+        <w:jc w:val="both"/>
+      </w:pPr>
+      <w:r>
+        <w:rPr>
+          <w:rFonts w:ascii="Times New Roman" w:hAnsi="Times New Roman"/>
+          <w:sz w:val="26"/>
+        </w:rPr>
+        <w:t>- Luồng đăng sản phẩm và phân loại: Vendor đưa sản phẩm lên gian hàng -&gt; Chọn danh mục hệ thống -&gt; Thêm các thuộc tính biến thể (Màu, Size, Giá, Tồn kho) -&gt; Đẩy sản phẩm lên sàn.</w:t>
+      </w:r>
+    </w:p>
+    <w:p>
+      <w:pPr>
+        <w:spacing w:before="0" w:after="120" w:line="360" w:lineRule="auto"/>
+        <w:ind w:firstLine="720"/>
+        <w:jc w:val="both"/>
+      </w:pPr>
+      <w:r>
+        <w:rPr>
+          <w:rFonts w:ascii="Times New Roman" w:hAnsi="Times New Roman"/>
+          <w:sz w:val="26"/>
+        </w:rPr>
+        <w:t>- Luồng đặt hàng và tách đơn hàng (Split Order): Khách hàng thêm sản phẩm từ nhiều shop vào cùng giỏ hàng -&gt; Thực hiện thanh toán một lần -&gt; Hệ thống tự động tách thành các đơn hàng con (Sub-Orders) gửi về đúng bảng điều khiển của từng Vendor.</w:t>
+      </w:r>
+    </w:p>
+    <w:p>
+      <w:pPr>
+        <w:spacing w:before="0" w:after="120" w:line="360" w:lineRule="auto"/>
+        <w:ind w:firstLine="720"/>
+        <w:jc w:val="both"/>
+      </w:pPr>
+      <w:r>
+        <w:rPr>
+          <w:rFonts w:ascii="Times New Roman" w:hAnsi="Times New Roman"/>
+          <w:sz w:val="26"/>
+        </w:rPr>
+        <w:t>- Luồng xử lý giao dịch và đối soát tài chính: Vendor xác nhận và đóng gói hàng -&gt; Đơn vị vận chuyển giao hàng thành công -&gt; Hệ thống tự động tính hoa hồng sàn -&gt; Cộng tiền thực nhận vào ví gian hàng của Vendor -&gt; Vendor lập yêu cầu rút tiền (Payout).</w:t>
+      </w:r>
+    </w:p>
+    <w:p>
+      <w:pPr>
+        <w:pStyle w:val="3"/>
+        <w:spacing w:before="0" w:after="120" w:line="360" w:lineRule="auto"/>
+        <w:ind w:firstLine="0"/>
+        <w:jc w:val="left"/>
+      </w:pPr>
+      <w:r>
+        <w:rPr>
+          <w:rFonts w:ascii="Times New Roman" w:hAnsi="Times New Roman"/>
+          <w:b/>
+          <w:sz w:val="26"/>
+        </w:rPr>
+        <w:t>2.3. Java và Spring Boot</w:t>
+      </w:r>
+    </w:p>
+    <w:p>
+      <w:pPr>
+        <w:pStyle w:val="4"/>
+        <w:spacing w:before="0" w:after="120" w:line="360" w:lineRule="auto"/>
+        <w:ind w:firstLine="0"/>
+        <w:jc w:val="left"/>
+      </w:pPr>
+      <w:r>
+        <w:rPr>
+          <w:rFonts w:ascii="Times New Roman" w:hAnsi="Times New Roman"/>
+          <w:b/>
+          <w:sz w:val="26"/>
+        </w:rPr>
+        <w:t>2.3.1. Ngôn ngữ lập trình Java</w:t>
+      </w:r>
+    </w:p>
+    <w:p>
+      <w:pPr>
+        <w:spacing w:before="0" w:after="120" w:line="360" w:lineRule="auto"/>
+        <w:ind w:firstLine="720"/>
+        <w:jc w:val="both"/>
+      </w:pPr>
+      <w:r>
+        <w:rPr>
+          <w:rFonts w:ascii="Times New Roman" w:hAnsi="Times New Roman"/>
+          <w:sz w:val="26"/>
+        </w:rPr>
+        <w:t>Java là ngôn ngữ lập trình hướng đối tượng (OOP) cấp cao, được thiết kế theo triết lý 'Viết một lần, chạy mọi nơi' (Write Once, Run Anywhere - WORA). Java được biên dịch ra mã byte (Bytecode), chạy trên Máy ảo Java (Java Virtual Machine - JVM), giúp ứng dụng có thể vận hành mượt mà trên mọi hệ điều hành từ Windows, Linux đến macOS.</w:t>
+      </w:r>
+    </w:p>
+    <w:p>
+      <w:pPr>
+        <w:spacing w:before="0" w:after="120" w:line="360" w:lineRule="auto"/>
+        <w:ind w:firstLine="720"/>
+        <w:jc w:val="both"/>
+      </w:pPr>
+      <w:r>
+        <w:rPr>
+          <w:rFonts w:ascii="Times New Roman" w:hAnsi="Times New Roman"/>
+          <w:sz w:val="26"/>
+        </w:rPr>
+        <w:t>Phiên bản Java 17 LTS (Long-Term Support) được lựa chọn cho dự án mang lại nhiều cải tiến mạnh mẽ về hiệu năng, các tính năng ngôn ngữ mới như Record classes, Pattern Matching, Text Blocks, cùng cơ chế quản lý bộ nhớ và thu gom rác tự động (Garbage Collection) tối ưu. Hệ thống kiểu dữ liệu nghiêm ngặt (Strict Typing) của Java giúp phát hiện sớm các lỗi lập trình ngay trong quá trình biên dịch, đảm bảo độ ổn định cao cho các hệ thống phần mềm doanh nghiệp.</w:t>
+      </w:r>
+    </w:p>
+    <w:p>
+      <w:pPr>
+        <w:pStyle w:val="4"/>
+        <w:spacing w:before="0" w:after="120" w:line="360" w:lineRule="auto"/>
+        <w:ind w:firstLine="0"/>
+        <w:jc w:val="left"/>
+      </w:pPr>
+      <w:r>
+        <w:rPr>
+          <w:rFonts w:ascii="Times New Roman" w:hAnsi="Times New Roman"/>
+          <w:b/>
+          <w:sz w:val="26"/>
+        </w:rPr>
+        <w:t>2.3.2. Khung làm việc Spring Framework</w:t>
+      </w:r>
+    </w:p>
+    <w:p>
+      <w:pPr>
+        <w:spacing w:before="0" w:after="120" w:line="360" w:lineRule="auto"/>
+        <w:ind w:firstLine="720"/>
+        <w:jc w:val="both"/>
+      </w:pPr>
+      <w:r>
+        <w:rPr>
+          <w:rFonts w:ascii="Times New Roman" w:hAnsi="Times New Roman"/>
+          <w:sz w:val="26"/>
+        </w:rPr>
+        <w:t>Spring Framework là khung làm việc (Framework) mã nguồn mở phổ biến nhất trong hệ sinh thái Java Enterprise. Nền tảng của Spring dựa trên hai triết lý cốt lõi:</w:t>
+      </w:r>
+    </w:p>
+    <w:p>
+      <w:pPr>
+        <w:spacing w:before="0" w:after="120" w:line="360" w:lineRule="auto"/>
+        <w:ind w:firstLine="720"/>
+        <w:jc w:val="both"/>
+      </w:pPr>
+      <w:r>
+        <w:rPr>
+          <w:rFonts w:ascii="Times New Roman" w:hAnsi="Times New Roman"/>
+          <w:sz w:val="26"/>
+        </w:rPr>
+        <w:t>- Đảo ngược điều khiển (Inversion of Control - IoC): Thay vì lập trình viên phải tự quản lý vòng đời và khởi tạo các đối tượng, Spring IoC Container đảm nhận việc quản lý, cấu hình và khởi tạo các đối tượng (gọi là Spring Beans).</w:t>
+      </w:r>
+    </w:p>
+    <w:p>
+      <w:pPr>
+        <w:spacing w:before="0" w:after="120" w:line="360" w:lineRule="auto"/>
+        <w:ind w:firstLine="720"/>
+        <w:jc w:val="both"/>
+      </w:pPr>
+      <w:r>
+        <w:rPr>
+          <w:rFonts w:ascii="Times New Roman" w:hAnsi="Times New Roman"/>
+          <w:sz w:val="26"/>
+        </w:rPr>
+        <w:t>- Tiêm phụ thuộc (Dependency Injection - DI): Các phụ thuộc giữa các thành phần được Spring tự động tiêm (inject) vào đối tượng thông qua Constructor, Setter hoặc Annotation (như `@Autowired`), giúp giảm thiểu sự phụ thuộc chặt chẽ (Loose Coupling) và tăng khả năng kiểm thử mô-đun (Unit Testing).</w:t>
+      </w:r>
+    </w:p>
+    <w:p>
+      <w:pPr>
+        <w:spacing w:before="0" w:after="120" w:line="360" w:lineRule="auto"/>
+        <w:ind w:firstLine="720"/>
+        <w:jc w:val="both"/>
+      </w:pPr>
+      <w:r>
+        <w:rPr>
+          <w:rFonts w:ascii="Times New Roman" w:hAnsi="Times New Roman"/>
+          <w:sz w:val="26"/>
+        </w:rPr>
+        <w:t>- Lập trình hướng khía cạnh (Aspect-Oriented Programming - AOP): Cho phép tách biệt các tác vụ dùng chung (Cross-cutting Concerns) như Logging, Transaction Management, Security ra khỏi luồng xử lý nghiệp vụ chính.</w:t>
+      </w:r>
+    </w:p>
+    <w:p>
+      <w:pPr>
+        <w:pStyle w:val="4"/>
+        <w:spacing w:before="0" w:after="120" w:line="360" w:lineRule="auto"/>
+        <w:ind w:firstLine="0"/>
+        <w:jc w:val="left"/>
+      </w:pPr>
+      <w:r>
+        <w:rPr>
+          <w:rFonts w:ascii="Times New Roman" w:hAnsi="Times New Roman"/>
+          <w:b/>
+          <w:sz w:val="26"/>
+        </w:rPr>
+        <w:t>2.3.3. Spring Boot và các ưu điểm vượt trội</w:t>
+      </w:r>
+    </w:p>
+    <w:p>
+      <w:pPr>
+        <w:spacing w:before="0" w:after="120" w:line="360" w:lineRule="auto"/>
+        <w:ind w:firstLine="720"/>
+        <w:jc w:val="both"/>
+      </w:pPr>
+      <w:r>
+        <w:rPr>
+          <w:rFonts w:ascii="Times New Roman" w:hAnsi="Times New Roman"/>
+          <w:sz w:val="26"/>
+        </w:rPr>
+        <w:t>Spring Boot là một dự án phát triển trên nền Spring Framework, ra đời nhằm mục đích đơn giản hóa tối đa quá trình cấu hình và triển khai ứng dụng Java. Spring Boot mang lại những ưu điểm vượt trội:</w:t>
+      </w:r>
+    </w:p>
+    <w:p>
+      <w:pPr>
+        <w:spacing w:before="0" w:after="120" w:line="360" w:lineRule="auto"/>
+        <w:ind w:firstLine="720"/>
+        <w:jc w:val="both"/>
+      </w:pPr>
+      <w:r>
+        <w:rPr>
+          <w:rFonts w:ascii="Times New Roman" w:hAnsi="Times New Roman"/>
+          <w:sz w:val="26"/>
+        </w:rPr>
+        <w:t>- Cấu hình tự động (Auto-configuration): Spring Boot tự động cấu hình ứng dụng dựa trên các thư viện jar có trong classpath, giảm thiểu hàng nghìn dòng cấu hình XML phức tạp trước đây.</w:t>
+      </w:r>
+    </w:p>
+    <w:p>
+      <w:pPr>
+        <w:spacing w:before="0" w:after="120" w:line="360" w:lineRule="auto"/>
+        <w:ind w:firstLine="720"/>
+        <w:jc w:val="both"/>
+      </w:pPr>
+      <w:r>
+        <w:rPr>
+          <w:rFonts w:ascii="Times New Roman" w:hAnsi="Times New Roman"/>
+          <w:sz w:val="26"/>
+        </w:rPr>
+        <w:t>- Máy chủ nhúng (Embedded Server): Tích hợp sẵn máy chủ Apache Tomcat hoặc Jetty bên trong ứng dụng, cho phép đóng gói ứng dụng thành một file `.jar` độc lập có thể chạy trực tiếp mà không cần cài đặt máy chủ web bên ngoài.</w:t>
+      </w:r>
+    </w:p>
+    <w:p>
+      <w:pPr>
+        <w:spacing w:before="0" w:after="120" w:line="360" w:lineRule="auto"/>
+        <w:ind w:firstLine="720"/>
+        <w:jc w:val="both"/>
+      </w:pPr>
+      <w:r>
+        <w:rPr>
+          <w:rFonts w:ascii="Times New Roman" w:hAnsi="Times New Roman"/>
+          <w:sz w:val="26"/>
+        </w:rPr>
+        <w:t>- Spring Boot Starters: Cung cấp các gói phụ thuộc được đóng gói sẵn (ví dụ: `spring-boot-starter-web`, `spring-boot-starter-data-jpa`, `spring-boot-starter-security`), giúp việc quản lý phiên bản thư viện trở nên đồng bộ và dễ dàng.</w:t>
+      </w:r>
+    </w:p>
+    <w:p>
+      <w:pPr>
+        <w:pStyle w:val="3"/>
+        <w:spacing w:before="0" w:after="120" w:line="360" w:lineRule="auto"/>
+        <w:ind w:firstLine="0"/>
+        <w:jc w:val="left"/>
+      </w:pPr>
+      <w:r>
+        <w:rPr>
+          <w:rFonts w:ascii="Times New Roman" w:hAnsi="Times New Roman"/>
+          <w:b/>
+          <w:sz w:val="26"/>
+        </w:rPr>
+        <w:t>2.4. Spring Security</w:t>
+      </w:r>
+    </w:p>
+    <w:p>
+      <w:pPr>
+        <w:pStyle w:val="4"/>
+        <w:spacing w:before="0" w:after="120" w:line="360" w:lineRule="auto"/>
+        <w:ind w:firstLine="0"/>
+        <w:jc w:val="left"/>
+      </w:pPr>
+      <w:r>
+        <w:rPr>
+          <w:rFonts w:ascii="Times New Roman" w:hAnsi="Times New Roman"/>
+          <w:b/>
+          <w:sz w:val="26"/>
+        </w:rPr>
+        <w:t>2.4.1. Tổng quan về Spring Security 6.x</w:t>
+      </w:r>
+    </w:p>
+    <w:p>
+      <w:pPr>
+        <w:spacing w:before="0" w:after="120" w:line="360" w:lineRule="auto"/>
+        <w:ind w:firstLine="720"/>
+        <w:jc w:val="both"/>
+      </w:pPr>
+      <w:r>
+        <w:rPr>
+          <w:rFonts w:ascii="Times New Roman" w:hAnsi="Times New Roman"/>
+          <w:sz w:val="26"/>
+        </w:rPr>
+        <w:t>Spring Security là một khung làm việc mạnh mẽ, tùy biến cao, đóng vai trò là chuẩn mực thực tế (De-facto standard) trong việc xác thực (Authentication) và phân quyền (Authorization) cho các ứng dụng dựa trên Spring. Spring Security hoạt động dựa trên một chuỗi các bộ lọc Servlet (Security Filter Chain), can thiệp và kiểm tra mọi yêu cầu HTTP trước khi yêu cầu đó tới được tầng Controller.</w:t>
+      </w:r>
+    </w:p>
+    <w:p>
+      <w:pPr>
+        <w:pStyle w:val="4"/>
+        <w:spacing w:before="0" w:after="120" w:line="360" w:lineRule="auto"/>
+        <w:ind w:firstLine="0"/>
+        <w:jc w:val="left"/>
+      </w:pPr>
+      <w:r>
+        <w:rPr>
+          <w:rFonts w:ascii="Times New Roman" w:hAnsi="Times New Roman"/>
+          <w:b/>
+          <w:sz w:val="26"/>
+        </w:rPr>
+        <w:t>2.4.2. Cơ chế Xác thực và Phân quyền</w:t>
+      </w:r>
+    </w:p>
+    <w:p>
+      <w:pPr>
+        <w:spacing w:before="0" w:after="120" w:line="360" w:lineRule="auto"/>
+        <w:ind w:firstLine="720"/>
+        <w:jc w:val="both"/>
+      </w:pPr>
+      <w:r>
+        <w:rPr>
+          <w:rFonts w:ascii="Times New Roman" w:hAnsi="Times New Roman"/>
+          <w:sz w:val="26"/>
+        </w:rPr>
+        <w:t>Cơ chế hoạt động của Spring Security bao gồm các thành phần cốt lõi:</w:t>
+      </w:r>
+    </w:p>
+    <w:p>
+      <w:pPr>
+        <w:spacing w:before="0" w:after="120" w:line="360" w:lineRule="auto"/>
+        <w:ind w:firstLine="720"/>
+        <w:jc w:val="both"/>
+      </w:pPr>
+      <w:r>
+        <w:rPr>
+          <w:rFonts w:ascii="Times New Roman" w:hAnsi="Times New Roman"/>
+          <w:sz w:val="26"/>
+        </w:rPr>
+        <w:t>- AuthenticationManager: Thành phần trung tâm xử lý yêu cầu xác thực thông tin đăng nhập từ người dùng.</w:t>
+      </w:r>
+    </w:p>
+    <w:p>
+      <w:pPr>
+        <w:spacing w:before="0" w:after="120" w:line="360" w:lineRule="auto"/>
+        <w:ind w:firstLine="720"/>
+        <w:jc w:val="both"/>
+      </w:pPr>
+      <w:r>
+        <w:rPr>
+          <w:rFonts w:ascii="Times New Roman" w:hAnsi="Times New Roman"/>
+          <w:sz w:val="26"/>
+        </w:rPr>
+        <w:t>- UserDetailsService: Interface chứa phương thức `loadUserByUsername()`, truy vấn cơ sở dữ liệu để lấy thông tin người dùng và danh sách quyền hạn (GrantedAuthorities).</w:t>
+      </w:r>
+    </w:p>
+    <w:p>
+      <w:pPr>
+        <w:spacing w:before="0" w:after="120" w:line="360" w:lineRule="auto"/>
+        <w:ind w:firstLine="720"/>
+        <w:jc w:val="both"/>
+      </w:pPr>
+      <w:r>
+        <w:rPr>
+          <w:rFonts w:ascii="Times New Roman" w:hAnsi="Times New Roman"/>
+          <w:sz w:val="26"/>
+        </w:rPr>
+        <w:t>- PasswordEncoder: Cơ chế mã hóa mật khẩu an toàn. Trong dự án sử dụng `BCryptPasswordEncoder` - thuật toán băm mật khẩu một chiều kết hợp muối (Salting), ngăn chặn hoàn toàn các cuộc tấn công tra từ điển hay Rainbow Table.</w:t>
+      </w:r>
+    </w:p>
+    <w:p>
+      <w:pPr>
+        <w:spacing w:before="0" w:after="120" w:line="360" w:lineRule="auto"/>
+        <w:ind w:firstLine="720"/>
+        <w:jc w:val="both"/>
+      </w:pPr>
+      <w:r>
+        <w:rPr>
+          <w:rFonts w:ascii="Times New Roman" w:hAnsi="Times New Roman"/>
+          <w:sz w:val="26"/>
+        </w:rPr>
+        <w:t>- SecurityContextHolder: Nơi lưu trữ thông tin đối tượng người dùng đã xác thực thành công (Authentication object) trong suốt chu kỳ xử lý yêu cầu (Thread Local).</w:t>
+      </w:r>
+    </w:p>
+    <w:p>
+      <w:pPr>
+        <w:pStyle w:val="4"/>
+        <w:spacing w:before="0" w:after="120" w:line="360" w:lineRule="auto"/>
+        <w:ind w:firstLine="0"/>
+        <w:jc w:val="left"/>
+      </w:pPr>
+      <w:r>
+        <w:rPr>
+          <w:rFonts w:ascii="Times New Roman" w:hAnsi="Times New Roman"/>
+          <w:b/>
+          <w:sz w:val="26"/>
+        </w:rPr>
+        <w:t>2.4.3. Mô hình Phân quyền dựa trên vai trò (RBAC) và Bảo mật Web</w:t>
+      </w:r>
+    </w:p>
+    <w:p>
+      <w:pPr>
+        <w:spacing w:before="0" w:after="120" w:line="360" w:lineRule="auto"/>
+        <w:ind w:firstLine="720"/>
+        <w:jc w:val="both"/>
+      </w:pPr>
+      <w:r>
+        <w:rPr>
+          <w:rFonts w:ascii="Times New Roman" w:hAnsi="Times New Roman"/>
+          <w:sz w:val="26"/>
+        </w:rPr>
+        <w:t>Hệ thống áp dụng mô hình Role-Based Access Control (RBAC) để phân quyền người dùng:</w:t>
+      </w:r>
+    </w:p>
+    <w:p>
+      <w:pPr>
+        <w:spacing w:before="0" w:after="120" w:line="360" w:lineRule="auto"/>
+        <w:ind w:firstLine="720"/>
+        <w:jc w:val="both"/>
+      </w:pPr>
+      <w:r>
+        <w:rPr>
+          <w:rFonts w:ascii="Times New Roman" w:hAnsi="Times New Roman"/>
+          <w:sz w:val="26"/>
+        </w:rPr>
+        <w:t>- ROLE_ADMIN: Có toàn quyền truy cập các đường dẫn `/admin/**`, quản trị hệ thống, phê duyệt gian hàng và cấu hình hoa hồng.</w:t>
+      </w:r>
+    </w:p>
+    <w:p>
+      <w:pPr>
+        <w:spacing w:before="0" w:after="120" w:line="360" w:lineRule="auto"/>
+        <w:ind w:firstLine="720"/>
+        <w:jc w:val="both"/>
+      </w:pPr>
+      <w:r>
+        <w:rPr>
+          <w:rFonts w:ascii="Times New Roman" w:hAnsi="Times New Roman"/>
+          <w:sz w:val="26"/>
+        </w:rPr>
+        <w:t>- ROLE_VENDOR: Có quyền truy cập các đường dẫn `/vendor/**`, quản lý sản phẩm, kho hàng và đơn hàng thuộc gian hàng của mình.</w:t>
+      </w:r>
+    </w:p>
+    <w:p>
+      <w:pPr>
+        <w:spacing w:before="0" w:after="120" w:line="360" w:lineRule="auto"/>
+        <w:ind w:firstLine="720"/>
+        <w:jc w:val="both"/>
+      </w:pPr>
+      <w:r>
+        <w:rPr>
+          <w:rFonts w:ascii="Times New Roman" w:hAnsi="Times New Roman"/>
+          <w:sz w:val="26"/>
+        </w:rPr>
+        <w:t>- ROLE_CUSTOMER: Có quyền truy cập các chức năng mua hàng, giỏ hàng `/cart/**`, thanh toán `/checkout/**` và quản lý trang cá nhân.</w:t>
+      </w:r>
+    </w:p>
+    <w:p>
+      <w:pPr>
+        <w:spacing w:before="0" w:after="120" w:line="360" w:lineRule="auto"/>
+        <w:ind w:firstLine="720"/>
+        <w:jc w:val="both"/>
+      </w:pPr>
+      <w:r>
+        <w:rPr>
+          <w:rFonts w:ascii="Times New Roman" w:hAnsi="Times New Roman"/>
+          <w:sz w:val="26"/>
+        </w:rPr>
+        <w:t>Ngoài ra, Spring Security tự động kích hoạt các cơ chế bảo mật web nâng cao như chống tấn công giả mạo yêu cầu Cross-Site Request Forgery (CSRF) thông qua việc cấp phát CSRF Token cho mỗi form giao dịch, bảo mật Session Management và chống chèn mã độc XSS.</w:t>
+      </w:r>
+    </w:p>
+    <w:p>
+      <w:pPr>
+        <w:pStyle w:val="3"/>
+        <w:spacing w:before="0" w:after="120" w:line="360" w:lineRule="auto"/>
+        <w:ind w:firstLine="0"/>
+        <w:jc w:val="left"/>
+      </w:pPr>
+      <w:r>
+        <w:rPr>
+          <w:rFonts w:ascii="Times New Roman" w:hAnsi="Times New Roman"/>
+          <w:b/>
+          <w:sz w:val="26"/>
+        </w:rPr>
+        <w:t>2.5. Spring Data JPA / Hibernate</w:t>
+      </w:r>
+    </w:p>
+    <w:p>
+      <w:pPr>
+        <w:pStyle w:val="4"/>
+        <w:spacing w:before="0" w:after="120" w:line="360" w:lineRule="auto"/>
+        <w:ind w:firstLine="0"/>
+        <w:jc w:val="left"/>
+      </w:pPr>
+      <w:r>
+        <w:rPr>
+          <w:rFonts w:ascii="Times New Roman" w:hAnsi="Times New Roman"/>
+          <w:b/>
+          <w:sz w:val="26"/>
+        </w:rPr>
+        <w:t>2.5.1. Công nghệ Object-Relational Mapping (ORM) và JPA</w:t>
+      </w:r>
+    </w:p>
+    <w:p>
+      <w:pPr>
+        <w:spacing w:before="0" w:after="120" w:line="360" w:lineRule="auto"/>
+        <w:ind w:firstLine="720"/>
+        <w:jc w:val="both"/>
+      </w:pPr>
+      <w:r>
+        <w:rPr>
+          <w:rFonts w:ascii="Times New Roman" w:hAnsi="Times New Roman"/>
+          <w:sz w:val="26"/>
+        </w:rPr>
+        <w:t>Object-Relational Mapping (ORM) là kỹ thuật lập trình cho phép ánh ánh các bảng (Tables) và mối quan hệ trong cơ sở dữ liệu quan hệ sang các lớp (Classes) và đối tượng (Objects) trong ngôn ngữ lập trình hướng đối tượng. Java Persistence API (JPA) là một chuẩn đặc tả (Specification) của Java quản lý dữ liệu quan hệ, định nghĩa các Annotation chuẩn như `@Entity`, `@Table`, `@Id`, `@OneToMany`, `@ManyToOne`, `@ManyToMany` để mô tả cấu trúc dữ liệu.</w:t>
+      </w:r>
+    </w:p>
+    <w:p>
+      <w:pPr>
+        <w:pStyle w:val="4"/>
+        <w:spacing w:before="0" w:after="120" w:line="360" w:lineRule="auto"/>
+        <w:ind w:firstLine="0"/>
+        <w:jc w:val="left"/>
+      </w:pPr>
+      <w:r>
+        <w:rPr>
+          <w:rFonts w:ascii="Times New Roman" w:hAnsi="Times New Roman"/>
+          <w:b/>
+          <w:sz w:val="26"/>
+        </w:rPr>
+        <w:t>2.5.2. Hibernate Framework</w:t>
+      </w:r>
+    </w:p>
+    <w:p>
+      <w:pPr>
+        <w:spacing w:before="0" w:after="120" w:line="360" w:lineRule="auto"/>
+        <w:ind w:firstLine="720"/>
+        <w:jc w:val="both"/>
+      </w:pPr>
+      <w:r>
+        <w:rPr>
+          <w:rFonts w:ascii="Times New Roman" w:hAnsi="Times New Roman"/>
+          <w:sz w:val="26"/>
+        </w:rPr>
+        <w:t>Hibernate ORM là thư viện triển khai (Implementation) phổ biến và mạnh mẽ nhất của chuẩn JPA. Hibernate giúp tự động hóa việc phát sinh các câu lệnh SQL (SELECT, INSERT, UPDATE, DELETE) tương ứng với các thao tác trên đối tượng Java. Hibernate tích hợp cơ chế Persistence Context quản lý trạng thái đối tượng, cơ chế tải dữ liệu linh hoạt (Lazy Loading vs Eager Loading) giúp tối ưu bộ nhớ, cùng hệ thống bộ nhớ đệm (Cache Level 1 và Level 2) nâng cao tốc độ truy xuất dữ liệu.</w:t>
+      </w:r>
+    </w:p>
+    <w:p>
+      <w:pPr>
+        <w:pStyle w:val="4"/>
+        <w:spacing w:before="0" w:after="120" w:line="360" w:lineRule="auto"/>
+        <w:ind w:firstLine="0"/>
+        <w:jc w:val="left"/>
+      </w:pPr>
+      <w:r>
+        <w:rPr>
+          <w:rFonts w:ascii="Times New Roman" w:hAnsi="Times New Roman"/>
+          <w:b/>
+          <w:sz w:val="26"/>
+        </w:rPr>
+        <w:t>2.5.3. Spring Data JPA và Abstraction Layer</w:t>
+      </w:r>
+    </w:p>
+    <w:p>
+      <w:pPr>
+        <w:spacing w:before="0" w:after="120" w:line="360" w:lineRule="auto"/>
+        <w:ind w:firstLine="720"/>
+        <w:jc w:val="both"/>
+      </w:pPr>
+      <w:r>
+        <w:rPr>
+          <w:rFonts w:ascii="Times New Roman" w:hAnsi="Times New Roman"/>
+          <w:sz w:val="26"/>
+        </w:rPr>
+        <w:t>Spring Data JPA là một mô-đun nằm trong hệ sinh thái Spring Data, giúp giản lược tối đa lớp truy xuất dữ liệu (Data Access Layer). Bằng cách mở rộng interface `JpaRepository&lt;T, ID&gt;`, Spring Data JPA tự động cung cấp sẵn toàn bộ các hàm thao tác CRUD (Create, Read, Update, Delete) và phân trang/sắp xếp mà lập trình viên không cần phải viết một dòng lệnh SQL hay HQL nào.</w:t>
+      </w:r>
+    </w:p>
+    <w:p>
+      <w:pPr>
+        <w:spacing w:before="0" w:after="120" w:line="360" w:lineRule="auto"/>
+        <w:ind w:firstLine="720"/>
+        <w:jc w:val="both"/>
+      </w:pPr>
+      <w:r>
+        <w:rPr>
+          <w:rFonts w:ascii="Times New Roman" w:hAnsi="Times New Roman"/>
+          <w:sz w:val="26"/>
+        </w:rPr>
+        <w:t>Ngoài ra, Spring Data JPA hỗ trợ cơ chế Derived Query Methods (tự động sinh câu lệnh SQL từ tên phương thức trong Repository, ví dụ: `findByEmail()`, `findByShopIdAndStatus()`), cũng như cho phép viết các câu truy vấn tùy chỉnh linh hoạt bằng ngôn ngữ JPQL (Java Persistence Query Language) hoặc Native SQL Query đối với các tác vụ phức tạp.</w:t>
+      </w:r>
+    </w:p>
+    <w:p>
+      <w:pPr>
+        <w:pStyle w:val="3"/>
+        <w:spacing w:before="0" w:after="120" w:line="360" w:lineRule="auto"/>
+        <w:ind w:firstLine="0"/>
+        <w:jc w:val="left"/>
+      </w:pPr>
+      <w:r>
+        <w:rPr>
+          <w:rFonts w:ascii="Times New Roman" w:hAnsi="Times New Roman"/>
+          <w:b/>
+          <w:sz w:val="26"/>
+        </w:rPr>
+        <w:t>2.6. Thymeleaf</w:t>
+      </w:r>
+    </w:p>
+    <w:p>
+      <w:pPr>
+        <w:pStyle w:val="4"/>
+        <w:spacing w:before="0" w:after="120" w:line="360" w:lineRule="auto"/>
+        <w:ind w:firstLine="0"/>
+        <w:jc w:val="left"/>
+      </w:pPr>
+      <w:r>
+        <w:rPr>
+          <w:rFonts w:ascii="Times New Roman" w:hAnsi="Times New Roman"/>
+          <w:b/>
+          <w:sz w:val="26"/>
+        </w:rPr>
+        <w:t>2.6.1. Giới thiệu về Thymeleaf Engine</w:t>
+      </w:r>
+    </w:p>
+    <w:p>
+      <w:pPr>
+        <w:spacing w:before="0" w:after="120" w:line="360" w:lineRule="auto"/>
+        <w:ind w:firstLine="720"/>
+        <w:jc w:val="both"/>
+      </w:pPr>
+      <w:r>
+        <w:rPr>
+          <w:rFonts w:ascii="Times New Roman" w:hAnsi="Times New Roman"/>
+          <w:sz w:val="26"/>
+        </w:rPr>
+        <w:t>Thymeleaf là một Server-side Java Template Engine hiện đại dành cho cả môi trường web và độc lập. Khác với các công nghệ render template cũ như JSP (JavaServer Pages), Thymeleaf sở hữu tính năng 'Natural Templating' - cho phép các file giao dịch HTML mẫu (.html) có thể hiển thị chính xác trên các trình duyệt web thông thường như một file tĩnh, đồng thời có thể xử lý render dữ liệu động khi chạy trên máy chủ server.</w:t>
+      </w:r>
+    </w:p>
+    <w:p>
+      <w:pPr>
+        <w:pStyle w:val="4"/>
+        <w:spacing w:before="0" w:after="120" w:line="360" w:lineRule="auto"/>
+        <w:ind w:firstLine="0"/>
+        <w:jc w:val="left"/>
+      </w:pPr>
+      <w:r>
+        <w:rPr>
+          <w:rFonts w:ascii="Times New Roman" w:hAnsi="Times New Roman"/>
+          <w:b/>
+          <w:sz w:val="26"/>
+        </w:rPr>
+        <w:t>2.6.2. Cơ chế tích hợp Thymeleaf với Spring MVC</w:t>
+      </w:r>
+    </w:p>
+    <w:p>
+      <w:pPr>
+        <w:spacing w:before="0" w:after="120" w:line="360" w:lineRule="auto"/>
+        <w:ind w:firstLine="720"/>
+        <w:jc w:val="both"/>
+      </w:pPr>
+      <w:r>
+        <w:rPr>
+          <w:rFonts w:ascii="Times New Roman" w:hAnsi="Times New Roman"/>
+          <w:sz w:val="26"/>
+        </w:rPr>
+        <w:t>Thymeleaf tích hợp hoàn hảo với Spring MVC thông qua bộ dialect chuyên dụng. Thymeleaf sử dụng các thuộc tính bắt đầu bằng tiền tố `th:*` để tương tác với dữ liệu được truyền từ Controller qua đối tượng `Model`:</w:t>
+      </w:r>
+    </w:p>
+    <w:p>
+      <w:pPr>
+        <w:spacing w:before="0" w:after="120" w:line="360" w:lineRule="auto"/>
+        <w:ind w:firstLine="720"/>
+        <w:jc w:val="both"/>
+      </w:pPr>
+      <w:r>
+        <w:rPr>
+          <w:rFonts w:ascii="Times New Roman" w:hAnsi="Times New Roman"/>
+          <w:sz w:val="26"/>
+        </w:rPr>
+        <w:t>- `th:text` và `th:utext`: Hiển thị dữ liệu văn bản động từ đối tượng Java lên thẻ HTML.</w:t>
+      </w:r>
+    </w:p>
+    <w:p>
+      <w:pPr>
+        <w:spacing w:before="0" w:after="120" w:line="360" w:lineRule="auto"/>
+        <w:ind w:firstLine="720"/>
+        <w:jc w:val="both"/>
+      </w:pPr>
+      <w:r>
+        <w:rPr>
+          <w:rFonts w:ascii="Times New Roman" w:hAnsi="Times New Roman"/>
+          <w:sz w:val="26"/>
+        </w:rPr>
+        <w:t>- `th:field`: Ràng buộc dữ liệu hai chiều (Two-way data binding) giữa các trường trong form HTML với đối tượng DTO/Form trong Spring Controller.</w:t>
+      </w:r>
+    </w:p>
+    <w:p>
+      <w:pPr>
+        <w:spacing w:before="0" w:after="120" w:line="360" w:lineRule="auto"/>
+        <w:ind w:firstLine="720"/>
+        <w:jc w:val="both"/>
+      </w:pPr>
+      <w:r>
+        <w:rPr>
+          <w:rFonts w:ascii="Times New Roman" w:hAnsi="Times New Roman"/>
+          <w:sz w:val="26"/>
+        </w:rPr>
+        <w:t>- `th:each`: Lặp qua các danh sách (Collections/Lists) để render dữ liệu bảng, danh sách sản phẩm.</w:t>
+      </w:r>
+    </w:p>
+    <w:p>
+      <w:pPr>
+        <w:spacing w:before="0" w:after="120" w:line="360" w:lineRule="auto"/>
+        <w:ind w:firstLine="720"/>
+        <w:jc w:val="both"/>
+      </w:pPr>
+      <w:r>
+        <w:rPr>
+          <w:rFonts w:ascii="Times New Roman" w:hAnsi="Times New Roman"/>
+          <w:sz w:val="26"/>
+        </w:rPr>
+        <w:t>- `th:if` và `th:unless`: Kiểm tra điều kiện logic để hiển thị hoặc ẩn các khối giao diện.</w:t>
+      </w:r>
+    </w:p>
+    <w:p>
+      <w:pPr>
+        <w:spacing w:before="0" w:after="120" w:line="360" w:lineRule="auto"/>
+        <w:ind w:firstLine="720"/>
+        <w:jc w:val="both"/>
+      </w:pPr>
+      <w:r>
+        <w:rPr>
+          <w:rFonts w:ascii="Times New Roman" w:hAnsi="Times New Roman"/>
+          <w:sz w:val="26"/>
+        </w:rPr>
+        <w:t>- `th:fragment` và `th:replace`: Xây dựng các thành phần giao diện tái sử dụng (Layout Components) như Header, Footer, Sidebar, Navigation Bar.</w:t>
+      </w:r>
+    </w:p>
+    <w:p>
+      <w:pPr>
+        <w:pStyle w:val="4"/>
+        <w:spacing w:before="0" w:after="120" w:line="360" w:lineRule="auto"/>
+        <w:ind w:firstLine="0"/>
+        <w:jc w:val="left"/>
+      </w:pPr>
+      <w:r>
+        <w:rPr>
+          <w:rFonts w:ascii="Times New Roman" w:hAnsi="Times New Roman"/>
+          <w:b/>
+          <w:sz w:val="26"/>
+        </w:rPr>
+        <w:t>2.6.3. Tối ưu giao diện và truyền dữ liệu View-Controller</w:t>
+      </w:r>
+    </w:p>
+    <w:p>
+      <w:pPr>
+        <w:spacing w:before="0" w:after="120" w:line="360" w:lineRule="auto"/>
+        <w:ind w:firstLine="720"/>
+        <w:jc w:val="both"/>
+      </w:pPr>
+      <w:r>
+        <w:rPr>
+          <w:rFonts w:ascii="Times New Roman" w:hAnsi="Times New Roman"/>
+          <w:sz w:val="26"/>
+        </w:rPr>
+        <w:t>Thymeleaf kết hợp với bộ thư viện `thymeleaf-extras-springsecurity` cho phép hiển thị giao diện phân quyền thông minh trực tiếp trên View (ví dụ: ẩn/hiện nút Admin Dashboard dựa trên vai trò của người dùng đang đăng nhập). Đồng thời, Thymeleaf hỗ trợ bắt và hiển thị các thông báo lỗi Validation (`BindingResult`) từ Spring Controller trực quan ngay dưới từng trường nhập liệu của form.</w:t>
+      </w:r>
+    </w:p>
+    <w:p>
+      <w:pPr>
+        <w:pStyle w:val="3"/>
+        <w:spacing w:before="0" w:after="120" w:line="360" w:lineRule="auto"/>
+        <w:ind w:firstLine="0"/>
+        <w:jc w:val="left"/>
+      </w:pPr>
+      <w:r>
+        <w:rPr>
+          <w:rFonts w:ascii="Times New Roman" w:hAnsi="Times New Roman"/>
+          <w:b/>
+          <w:sz w:val="26"/>
+        </w:rPr>
+        <w:t>2.7. MySQL</w:t>
+      </w:r>
+    </w:p>
+    <w:p>
+      <w:pPr>
+        <w:pStyle w:val="4"/>
+        <w:spacing w:before="0" w:after="120" w:line="360" w:lineRule="auto"/>
+        <w:ind w:firstLine="0"/>
+        <w:jc w:val="left"/>
+      </w:pPr>
+      <w:r>
+        <w:rPr>
+          <w:rFonts w:ascii="Times New Roman" w:hAnsi="Times New Roman"/>
+          <w:b/>
+          <w:sz w:val="26"/>
+        </w:rPr>
+        <w:t>2.7.1. Hệ quản trị cơ sở dữ liệu quan hệ MySQL 8.0</w:t>
+      </w:r>
+    </w:p>
+    <w:p>
+      <w:pPr>
+        <w:spacing w:before="0" w:after="120" w:line="360" w:lineRule="auto"/>
+        <w:ind w:firstLine="720"/>
+        <w:jc w:val="both"/>
+      </w:pPr>
+      <w:r>
+        <w:rPr>
+          <w:rFonts w:ascii="Times New Roman" w:hAnsi="Times New Roman"/>
+          <w:sz w:val="26"/>
+        </w:rPr>
+        <w:t>MySQL 8.0 là hệ quản trị cơ sở dữ liệu quan hệ (RDBMS) mã nguồn mở phổ biến nhất thế giới, nổi tiếng với tốc độ xử lý cao, độ tin cậy và tính dễ sử dụng. MySQL 8.0 sử dụng Storage Engine mặc định là InnoDB - hỗ trợ đầy đủ các tính năng nâng cao như giao dịch (Transactions) đạt chuẩn ACID, ràng buộc khóa ngoại (Foreign Key Constraints), khôi phục dữ liệu sau sự cố và cơ chế khóa cấp dòng (Row-level Locking) tối ưu cho các hệ thống có tần suất ghi cao.</w:t>
+      </w:r>
+    </w:p>
+    <w:p>
+      <w:pPr>
+        <w:pStyle w:val="4"/>
+        <w:spacing w:before="0" w:after="120" w:line="360" w:lineRule="auto"/>
+        <w:ind w:firstLine="0"/>
+        <w:jc w:val="left"/>
+      </w:pPr>
+      <w:r>
+        <w:rPr>
+          <w:rFonts w:ascii="Times New Roman" w:hAnsi="Times New Roman"/>
+          <w:b/>
+          <w:sz w:val="26"/>
+        </w:rPr>
+        <w:t>2.7.2. Chuẩn hóa cơ sở dữ liệu và Đánh chỉ mục (Indexing)</w:t>
+      </w:r>
+    </w:p>
+    <w:p>
+      <w:pPr>
+        <w:spacing w:before="0" w:after="120" w:line="360" w:lineRule="auto"/>
+        <w:ind w:firstLine="720"/>
+        <w:jc w:val="both"/>
+      </w:pPr>
+      <w:r>
+        <w:rPr>
+          <w:rFonts w:ascii="Times New Roman" w:hAnsi="Times New Roman"/>
+          <w:sz w:val="26"/>
+        </w:rPr>
+        <w:t>Để đảm bảo cơ sở dữ liệu vận hành tối ưu, hệ thống thực hiện chuẩn hóa dữ liệu đạt chuẩn 3NF (Third Normal Form), loại bỏ tình trạng dư thừa dữ liệu và ngăn chặn các dị thường (Anomalies) khi thực hiện các thao tác thêm, sửa, xóa.</w:t>
+      </w:r>
+    </w:p>
+    <w:p>
+      <w:pPr>
+        <w:spacing w:before="0" w:after="120" w:line="360" w:lineRule="auto"/>
+        <w:ind w:firstLine="720"/>
+        <w:jc w:val="both"/>
+      </w:pPr>
+      <w:r>
+        <w:rPr>
+          <w:rFonts w:ascii="Times New Roman" w:hAnsi="Times New Roman"/>
+          <w:sz w:val="26"/>
+        </w:rPr>
+        <w:t>Bên cạnh đó, dự án triển khai kỹ thuật đánh chỉ mục B-Tree Index trên các cột dữ liệu có tần suất tìm kiếm và liên kết cao (như `product_name`, `category_id`, `shop_id`, `order_code`, `user_id`). Việc sử dụng Index hợp lý giúp giảm độ phức tạp của câu lệnh truy vấn từ O(N) xuống O(log N), tăng tốc độ tìm kiếm sản phẩm và lọc dữ liệu gấp nhiều lần.</w:t>
+      </w:r>
+    </w:p>
+    <w:p>
+      <w:pPr>
+        <w:pStyle w:val="4"/>
+        <w:spacing w:before="0" w:after="120" w:line="360" w:lineRule="auto"/>
+        <w:ind w:firstLine="0"/>
+        <w:jc w:val="left"/>
+      </w:pPr>
+      <w:r>
+        <w:rPr>
+          <w:rFonts w:ascii="Times New Roman" w:hAnsi="Times New Roman"/>
+          <w:b/>
+          <w:sz w:val="26"/>
+        </w:rPr>
+        <w:t>2.7.3. Quản lý giao dịch và khoá dòng</w:t>
+      </w:r>
+    </w:p>
+    <w:p>
+      <w:pPr>
+        <w:spacing w:before="0" w:after="120" w:line="360" w:lineRule="auto"/>
+        <w:ind w:firstLine="720"/>
+        <w:jc w:val="both"/>
+      </w:pPr>
+      <w:r>
+        <w:rPr>
+          <w:rFonts w:ascii="Times New Roman" w:hAnsi="Times New Roman"/>
+          <w:sz w:val="26"/>
+        </w:rPr>
+        <w:t>Trong bài toán thương mại điện tử đa gian hàng, các thao tác như trừ số lượng tồn kho khi đặt hàng hay cộng tiền vào ví gian hàng yêu cầu tính toàn vẹn tuyệt đối. Hệ thống áp dụng cơ chế quản lý giao dịch `@Transactional` của Spring kết hợp với mức độ cách ly giao dịch (Transaction Isolation Level) của MySQL để đảm bảo hoặc toàn bộ chuỗi thao tác thành công (Commit), hoặc nếu có lỗi sẽ hoàn tác hoàn toàn (Rollback), bảo vệ dữ liệu khỏi hiện tượng sai lệch.</w:t>
+      </w:r>
+    </w:p>
+    <w:p>
+      <w:pPr>
+        <w:pStyle w:val="3"/>
+        <w:spacing w:before="0" w:after="120" w:line="360" w:lineRule="auto"/>
+        <w:ind w:firstLine="0"/>
+        <w:jc w:val="left"/>
+      </w:pPr>
+      <w:r>
+        <w:rPr>
+          <w:rFonts w:ascii="Times New Roman" w:hAnsi="Times New Roman"/>
+          <w:b/>
+          <w:sz w:val="26"/>
+        </w:rPr>
+        <w:t>2.8. Mô hình MVC</w:t>
+      </w:r>
+    </w:p>
+    <w:p>
+      <w:pPr>
+        <w:pStyle w:val="4"/>
+        <w:spacing w:before="0" w:after="120" w:line="360" w:lineRule="auto"/>
+        <w:ind w:firstLine="0"/>
+        <w:jc w:val="left"/>
+      </w:pPr>
+      <w:r>
+        <w:rPr>
+          <w:rFonts w:ascii="Times New Roman" w:hAnsi="Times New Roman"/>
+          <w:b/>
+          <w:sz w:val="26"/>
+        </w:rPr>
+        <w:t>2.8.1. Khái niệm và kiến trúc tổng quan mô hình MVC</w:t>
+      </w:r>
+    </w:p>
+    <w:p>
+      <w:pPr>
+        <w:spacing w:before="0" w:after="120" w:line="360" w:lineRule="auto"/>
+        <w:ind w:firstLine="720"/>
+        <w:jc w:val="both"/>
+      </w:pPr>
+      <w:r>
+        <w:rPr>
+          <w:rFonts w:ascii="Times New Roman" w:hAnsi="Times New Roman"/>
+          <w:sz w:val="26"/>
+        </w:rPr>
+        <w:t>Mô hình MVC (Model - View - Controller) là một mẫu kiến trúc phần mềm (Architectural Pattern) kinh điển được ứng dụng rộng rãi trong phát triển các ứng dụng web hiện đại. Mục tiêu cốt lõi của mô hình MVC là phân tách rõ ràng phần mềm thành 3 thành phần độc lập, giúp tăng tính đóng gói, dễ dàng bảo trì, nâng cấp và phân công nhiệm vụ trong nhóm phát triển.</w:t>
+      </w:r>
+    </w:p>
+    <w:p>
+      <w:pPr>
+        <w:pStyle w:val="4"/>
+        <w:spacing w:before="0" w:after="120" w:line="360" w:lineRule="auto"/>
+        <w:ind w:firstLine="0"/>
+        <w:jc w:val="left"/>
+      </w:pPr>
+      <w:r>
+        <w:rPr>
+          <w:rFonts w:ascii="Times New Roman" w:hAnsi="Times New Roman"/>
+          <w:b/>
+          <w:sz w:val="26"/>
+        </w:rPr>
+        <w:t>2.8.2. Vai trò của các thành phần trong dự án Spring Boot</w:t>
+      </w:r>
+    </w:p>
+    <w:p>
+      <w:pPr>
+        <w:spacing w:before="0" w:after="120" w:line="360" w:lineRule="auto"/>
+        <w:ind w:firstLine="720"/>
+        <w:jc w:val="both"/>
+      </w:pPr>
+      <w:r>
+        <w:rPr>
+          <w:rFonts w:ascii="Times New Roman" w:hAnsi="Times New Roman"/>
+          <w:sz w:val="26"/>
+        </w:rPr>
+        <w:t>Trong dự án sàn TMĐT đa gian hàng, mô hình MVC được hiện thực hóa qua các lớp thành phần:</w:t>
+      </w:r>
+    </w:p>
+    <w:p>
+      <w:pPr>
+        <w:spacing w:before="0" w:after="120" w:line="360" w:lineRule="auto"/>
+        <w:ind w:firstLine="720"/>
+        <w:jc w:val="both"/>
+      </w:pPr>
+      <w:r>
+        <w:rPr>
+          <w:rFonts w:ascii="Times New Roman" w:hAnsi="Times New Roman"/>
+          <w:sz w:val="26"/>
+        </w:rPr>
+        <w:t>- Model (Mô hình dữ liệu): Đại diện cho dữ liệu và các quy tắc nghiệp vụ của ứng dụng. Bao gồm các lớp Entity (`User`, `Shop`, `Product`, `Order`, `Review`), các lớp DTO (`CartDto`, `UserRegistrationDto`) chứa dữ liệu trao đổi, cùng các dịch vụ nghiệp vụ (Service classes) thực thi logic tính toán toán học, kiểm tra điều kiện.</w:t>
+      </w:r>
+    </w:p>
+    <w:p>
+      <w:pPr>
+        <w:spacing w:before="0" w:after="120" w:line="360" w:lineRule="auto"/>
+        <w:ind w:firstLine="720"/>
+        <w:jc w:val="both"/>
+      </w:pPr>
+      <w:r>
+        <w:rPr>
+          <w:rFonts w:ascii="Times New Roman" w:hAnsi="Times New Roman"/>
+          <w:sz w:val="26"/>
+        </w:rPr>
+        <w:t>- View (Giao diện hiển thị): Thành phần chịu trách nhiệm trình bày dữ liệu trực quan cho người dùng. Trong dự án, View chính là các trang HTML5 được render động bởi Thymeleaf Engine kết hợp với CSS3, JavaScript và Bootstrap 5 để hiển thị sản phẩm, giỏ hàng, bảng điều khiển admin/vendor.</w:t>
+      </w:r>
+    </w:p>
+    <w:p>
+      <w:pPr>
+        <w:spacing w:before="0" w:after="120" w:line="360" w:lineRule="auto"/>
+        <w:ind w:firstLine="720"/>
+        <w:jc w:val="both"/>
+      </w:pPr>
+      <w:r>
+        <w:rPr>
+          <w:rFonts w:ascii="Times New Roman" w:hAnsi="Times New Roman"/>
+          <w:sz w:val="26"/>
+        </w:rPr>
+        <w:t>- Controller (Bộ điều khiển): Đóng vai trò là cầu nối trung gian điều phối giữa Model và View. Các lớp Controller (như `HomeController`, `CartController`, `CheckoutController`, `AdminController`, `VendorController`) tiếp nhận các yêu cầu HTTP (GET, POST) từ người dùng, gọi các hàm nghiệp vụ ở tầng Service để xử lý dữ liệu, sau đó đưa dữ liệu vào `Model` và chỉ định trang `View` tương ứng để hiển thị kết quả.</w:t>
+      </w:r>
+    </w:p>
+    <w:p>
+      <w:pPr>
+        <w:pStyle w:val="4"/>
+        <w:spacing w:before="0" w:after="120" w:line="360" w:lineRule="auto"/>
+        <w:ind w:firstLine="0"/>
+        <w:jc w:val="left"/>
+      </w:pPr>
+      <w:r>
+        <w:rPr>
+          <w:rFonts w:ascii="Times New Roman" w:hAnsi="Times New Roman"/>
+          <w:b/>
+          <w:sz w:val="26"/>
+        </w:rPr>
+        <w:t>2.8.3. Luồng xử lý dữ liệu chuẩn trong Spring MVC</w:t>
+      </w:r>
+    </w:p>
+    <w:p>
+      <w:pPr>
+        <w:spacing w:before="0" w:after="120" w:line="360" w:lineRule="auto"/>
+        <w:ind w:firstLine="720"/>
+        <w:jc w:val="both"/>
+      </w:pPr>
+      <w:r>
+        <w:rPr>
+          <w:rFonts w:ascii="Times New Roman" w:hAnsi="Times New Roman"/>
+          <w:sz w:val="26"/>
+        </w:rPr>
+        <w:t>Luồng xử lý một yêu cầu (Request Flow) từ khách hàng trong hệ thống diễn ra qua các bước chuẩn hóa:</w:t>
+      </w:r>
+    </w:p>
+    <w:p>
+      <w:pPr>
+        <w:spacing w:before="0" w:after="120" w:line="360" w:lineRule="auto"/>
+        <w:ind w:firstLine="720"/>
+        <w:jc w:val="both"/>
+      </w:pPr>
+      <w:r>
+        <w:rPr>
+          <w:rFonts w:ascii="Times New Roman" w:hAnsi="Times New Roman"/>
+          <w:sz w:val="26"/>
+        </w:rPr>
+        <w:t>- Bước 1: Trình duyệt gửi yêu cầu HTTP (ví dụ: `GET /products/detail/10`) tới máy chủ.</w:t>
+      </w:r>
+    </w:p>
+    <w:p>
+      <w:pPr>
+        <w:spacing w:before="0" w:after="120" w:line="360" w:lineRule="auto"/>
+        <w:ind w:firstLine="720"/>
+        <w:jc w:val="both"/>
+      </w:pPr>
+      <w:r>
+        <w:rPr>
+          <w:rFonts w:ascii="Times New Roman" w:hAnsi="Times New Roman"/>
+          <w:sz w:val="26"/>
+        </w:rPr>
+        <w:t>- Bước 2: `DispatcherServlet` (Front Controller của Spring MVC) tiếp nhận yêu cầu và tra cứu `HandlerMapping` để xác định Controller phù hợp xử lý yêu cầu này.</w:t>
+      </w:r>
+    </w:p>
+    <w:p>
+      <w:pPr>
+        <w:spacing w:before="0" w:after="120" w:line="360" w:lineRule="auto"/>
+        <w:ind w:firstLine="720"/>
+        <w:jc w:val="both"/>
+      </w:pPr>
+      <w:r>
+        <w:rPr>
+          <w:rFonts w:ascii="Times New Roman" w:hAnsi="Times New Roman"/>
+          <w:sz w:val="26"/>
+        </w:rPr>
+        <w:t>- Bước 3: Controller tiếp nhận yêu cầu, trích xuất tham số, và gọi phương thức tương ứng tại tầng `Service` (ví dụ: `productService.getProductById(10)`).</w:t>
+      </w:r>
+    </w:p>
+    <w:p>
+      <w:pPr>
+        <w:spacing w:before="0" w:after="120" w:line="360" w:lineRule="auto"/>
+        <w:ind w:firstLine="720"/>
+        <w:jc w:val="both"/>
+      </w:pPr>
+      <w:r>
+        <w:rPr>
+          <w:rFonts w:ascii="Times New Roman" w:hAnsi="Times New Roman"/>
+          <w:sz w:val="26"/>
+        </w:rPr>
+        <w:t>- Bước 4: Tầng `Service` tương tác với `Repository` để lấy dữ liệu từ MySQL, thực hiện logic nghiệp vụ và trả về kết quả cho Controller.</w:t>
+      </w:r>
+    </w:p>
+    <w:p>
+      <w:pPr>
+        <w:spacing w:before="0" w:after="120" w:line="360" w:lineRule="auto"/>
+        <w:ind w:firstLine="720"/>
+        <w:jc w:val="both"/>
+      </w:pPr>
+      <w:r>
+        <w:rPr>
+          <w:rFonts w:ascii="Times New Roman" w:hAnsi="Times New Roman"/>
+          <w:sz w:val="26"/>
+        </w:rPr>
+        <w:t>- Bước 5: Controller nạp dữ liệu kết quả vào đối tượng `Model` và trả về tên trang View (ví dụ: `"customer/product-detail"`).</w:t>
+      </w:r>
+    </w:p>
+    <w:p>
+      <w:pPr>
+        <w:spacing w:before="0" w:after="120" w:line="360" w:lineRule="auto"/>
+        <w:ind w:firstLine="720"/>
+        <w:jc w:val="both"/>
+      </w:pPr>
+      <w:r>
+        <w:rPr>
+          <w:rFonts w:ascii="Times New Roman" w:hAnsi="Times New Roman"/>
+          <w:sz w:val="26"/>
+        </w:rPr>
+        <w:t>- Bước 6: `ViewResolver` xác định file Thymeleaf HTML tương ứng, Thymeleaf thực hiện trộn dữ liệu từ `Model` vào HTML để tạo ra mã HTML hoàn chỉnh và trả về cho trình duyệt hiển thị.</w:t>
+      </w:r>
+    </w:p>
+    <w:p>
+      <w:pPr>
+        <w:pStyle w:val="3"/>
+        <w:spacing w:before="0" w:after="120" w:line="360" w:lineRule="auto"/>
+        <w:ind w:firstLine="0"/>
+        <w:jc w:val="left"/>
+      </w:pPr>
+      <w:r>
+        <w:rPr>
+          <w:rFonts w:ascii="Times New Roman" w:hAnsi="Times New Roman"/>
+          <w:b/>
+          <w:sz w:val="26"/>
+        </w:rPr>
+        <w:t>2.9. Kiến trúc hệ thống</w:t>
+      </w:r>
+    </w:p>
+    <w:p>
+      <w:pPr>
+        <w:pStyle w:val="4"/>
+        <w:spacing w:before="0" w:after="120" w:line="360" w:lineRule="auto"/>
+        <w:ind w:firstLine="0"/>
+        <w:jc w:val="left"/>
+      </w:pPr>
+      <w:r>
+        <w:rPr>
+          <w:rFonts w:ascii="Times New Roman" w:hAnsi="Times New Roman"/>
+          <w:b/>
+          <w:sz w:val="26"/>
+        </w:rPr>
+        <w:t>2.9.1. Kiến trúc phân tầng 3 lớp (3-Tier Layered Architecture)</w:t>
+      </w:r>
+    </w:p>
+    <w:p>
+      <w:pPr>
+        <w:spacing w:before="0" w:after="120" w:line="360" w:lineRule="auto"/>
+        <w:ind w:firstLine="720"/>
+        <w:jc w:val="both"/>
+      </w:pPr>
+      <w:r>
+        <w:rPr>
+          <w:rFonts w:ascii="Times New Roman" w:hAnsi="Times New Roman"/>
+          <w:sz w:val="26"/>
+        </w:rPr>
+        <w:t>Hệ thống sàn TMĐT đa gian hàng được xây dựng trên kiến trúc phân tầng 3 lớp (3-Tier Architecture) kết hợp với các nguyên lý thiết kế phần mềm sạch (Clean Architecture). Kiến trúc chia ứng dụng thành các tầng độc lập có ranh giới rõ ràng:</w:t>
+      </w:r>
+    </w:p>
+    <w:p>
+      <w:pPr>
+        <w:spacing w:before="0" w:after="120" w:line="360" w:lineRule="auto"/>
+        <w:ind w:firstLine="720"/>
+        <w:jc w:val="both"/>
+      </w:pPr>
+      <w:r>
+        <w:rPr>
+          <w:rFonts w:ascii="Times New Roman" w:hAnsi="Times New Roman"/>
+          <w:sz w:val="26"/>
+        </w:rPr>
+        <w:t>- Tầng Giao diện (Presentation Layer - Web/UI Tier): Bao gồm Spring MVC Controllers, Thymeleaf Views, các file tài nguyên tĩnh (Static Resources: CSS, JS, Images). Tầng này chịu trách nhiệm tương tác trực tiếp với người dùng và định dạng dữ liệu hiển thị.</w:t>
+      </w:r>
+    </w:p>
+    <w:p>
+      <w:pPr>
+        <w:spacing w:before="0" w:after="120" w:line="360" w:lineRule="auto"/>
+        <w:ind w:firstLine="720"/>
+        <w:jc w:val="both"/>
+      </w:pPr>
+      <w:r>
+        <w:rPr>
+          <w:rFonts w:ascii="Times New Roman" w:hAnsi="Times New Roman"/>
+          <w:sz w:val="26"/>
+        </w:rPr>
+        <w:t>- Tầng Logic Nghiệp vụ (Business Logic Layer - Service Tier): Bao gồm các interfaces và classes Service (`UserService`, `ProductService`, `CartService`, `OrderService`). Tầng này đóng gói toàn bộ quy tắc kinh doanh, tính toán thanh toán, quản lý giao dịch và điều phối luồng nghiệp vụ hệ thống.</w:t>
+      </w:r>
+    </w:p>
+    <w:p>
+      <w:pPr>
+        <w:spacing w:before="0" w:after="120" w:line="360" w:lineRule="auto"/>
+        <w:ind w:firstLine="720"/>
+        <w:jc w:val="both"/>
+      </w:pPr>
+      <w:r>
+        <w:rPr>
+          <w:rFonts w:ascii="Times New Roman" w:hAnsi="Times New Roman"/>
+          <w:sz w:val="26"/>
+        </w:rPr>
+        <w:t>- Tầng Truy cập Dữ liệu (Data Access Layer - Persistence Tier): Bao gồm Spring Data JPA Repositories và các đối tượng Entity. Tầng này chịu trách nhiệm duy nhất là giao tiếp, thực hiện các thao tác CRUD và truy vấn dữ liệu với hệ quản trị cơ sở dữ liệu MySQL.</w:t>
+      </w:r>
+    </w:p>
+    <w:p>
+      <w:pPr>
+        <w:pStyle w:val="4"/>
+        <w:spacing w:before="0" w:after="120" w:line="360" w:lineRule="auto"/>
+        <w:ind w:firstLine="0"/>
+        <w:jc w:val="left"/>
+      </w:pPr>
+      <w:r>
+        <w:rPr>
+          <w:rFonts w:ascii="Times New Roman" w:hAnsi="Times New Roman"/>
+          <w:b/>
+          <w:sz w:val="26"/>
+        </w:rPr>
+        <w:t>2.9.2. Mẫu thiết kế DTO và chuyển đổi dữ liệu</w:t>
+      </w:r>
+    </w:p>
+    <w:p>
+      <w:pPr>
+        <w:spacing w:before="0" w:after="120" w:line="360" w:lineRule="auto"/>
+        <w:ind w:firstLine="720"/>
+        <w:jc w:val="both"/>
+      </w:pPr>
+      <w:r>
+        <w:rPr>
+          <w:rFonts w:ascii="Times New Roman" w:hAnsi="Times New Roman"/>
+          <w:sz w:val="26"/>
+        </w:rPr>
+        <w:t>Để đảm bảo tính an toàn và ngăn chặn việc rò rỉ cấu trúc bảng cơ sở dữ liệu ra bên ngoài giao diện, hệ thống áp dụng triệt để mẫu thiết kế DTO (Data Transfer Object). Các đối tượng DTO (như `UserRegistrationDto`, `CartDto`, `CartItemDto`) đóng vai trò là các vật chứa dữ liệu trung gian, chỉ chứa các trường thông tin cần thiết cho việc truyền tải giữa Controller và View, giúp tăng tốc độ truyền dữ liệu và bảo mật thông tin nội bộ.</w:t>
+      </w:r>
+    </w:p>
+    <w:p>
+      <w:pPr>
+        <w:pStyle w:val="4"/>
+        <w:spacing w:before="0" w:after="120" w:line="360" w:lineRule="auto"/>
+        <w:ind w:firstLine="0"/>
+        <w:jc w:val="left"/>
+      </w:pPr>
+      <w:r>
+        <w:rPr>
+          <w:rFonts w:ascii="Times New Roman" w:hAnsi="Times New Roman"/>
+          <w:b/>
+          <w:sz w:val="26"/>
+        </w:rPr>
+        <w:t>2.9.3. Kiến trúc bảo mật và tích hợp dịch vụ bên thứ ba</w:t>
+      </w:r>
+    </w:p>
+    <w:p>
+      <w:pPr>
+        <w:spacing w:before="0" w:after="120" w:line="360" w:lineRule="auto"/>
+        <w:ind w:firstLine="720"/>
+        <w:jc w:val="both"/>
+      </w:pPr>
+      <w:r>
+        <w:rPr>
+          <w:rFonts w:ascii="Times New Roman" w:hAnsi="Times New Roman"/>
+          <w:sz w:val="26"/>
+        </w:rPr>
+        <w:t>Kiến trúc hệ thống được thiết kế mở để dễ dàng tích hợp các dịch vụ bên ngoài:</w:t>
+      </w:r>
+    </w:p>
+    <w:p>
+      <w:pPr>
+        <w:spacing w:before="0" w:after="120" w:line="360" w:lineRule="auto"/>
+        <w:ind w:firstLine="720"/>
+        <w:jc w:val="both"/>
+      </w:pPr>
+      <w:r>
+        <w:rPr>
+          <w:rFonts w:ascii="Times New Roman" w:hAnsi="Times New Roman"/>
+          <w:sz w:val="26"/>
+        </w:rPr>
+        <w:t>- Tích hợp cổng thanh toán trực tuyến: Tích hợp với cổng thanh toán VNPay/MoMo thông qua RESTful Client. Khi người dùng chọn thanh toán online, hệ thống tạo mã giao dịch, tính toán chuỗi băm chữ ký số HMAC-SHA512 để xác thực giao dịch, chuyển hướng người dùng tới cổng thanh toán và nhận kết quả phản hồi an toàn qua Webhook/IPN URL.</w:t>
+      </w:r>
+    </w:p>
+    <w:p>
+      <w:pPr>
+        <w:spacing w:before="0" w:after="120" w:line="360" w:lineRule="auto"/>
+        <w:ind w:firstLine="720"/>
+        <w:jc w:val="both"/>
+      </w:pPr>
+      <w:r>
+        <w:rPr>
+          <w:rFonts w:ascii="Times New Roman" w:hAnsi="Times New Roman"/>
+          <w:sz w:val="26"/>
+        </w:rPr>
+        <w:t>- Tích hợp dịch vụ gửi Email: Tích hợp `Spring Boot Starter Mail` gửi email xác nhận đặt hàng, thông báo đơn hàng mới cho Vendor và khôi phục mật khẩu thông qua giao thức SMTP bất đồng bộ (Asynchronous Email Processing).</w:t>
       </w:r>
     </w:p>
     <w:sectPr>
@@ -3893,7 +5725,7 @@
     <w:lsdException w:qFormat="1" w:unhideWhenUsed="0" w:uiPriority="0" w:semiHidden="0" w:name="Normal Indent"/>
     <w:lsdException w:unhideWhenUsed="0" w:uiPriority="0" w:semiHidden="0" w:name="footnote text"/>
     <w:lsdException w:qFormat="1" w:unhideWhenUsed="0" w:uiPriority="0" w:semiHidden="0" w:name="annotation text"/>
-    <w:lsdException w:unhideWhenUsed="0" w:uiPriority="0" w:semiHidden="0" w:name="header"/>
+    <w:lsdException w:qFormat="1" w:unhideWhenUsed="0" w:uiPriority="0" w:semiHidden="0" w:name="header"/>
     <w:lsdException w:qFormat="1" w:unhideWhenUsed="0" w:uiPriority="0" w:semiHidden="0" w:name="footer"/>
     <w:lsdException w:unhideWhenUsed="0" w:uiPriority="0" w:semiHidden="0" w:name="index heading"/>
     <w:lsdException w:qFormat="1" w:uiPriority="0" w:name="caption"/>
@@ -4107,7 +5939,7 @@
     <w:lsdException w:unhideWhenUsed="0" w:uiPriority="67" w:semiHidden="0" w:name="Medium Grid 1 Accent 6"/>
     <w:lsdException w:unhideWhenUsed="0" w:uiPriority="68" w:semiHidden="0" w:name="Medium Grid 2 Accent 6"/>
     <w:lsdException w:unhideWhenUsed="0" w:uiPriority="69" w:semiHidden="0" w:name="Medium Grid 3 Accent 6"/>
-    <w:lsdException w:unhideWhenUsed="0" w:uiPriority="70" w:semiHidden="0" w:name="Dark List Accent 6"/>
+    <w:lsdException w:qFormat="1" w:unhideWhenUsed="0" w:uiPriority="70" w:semiHidden="0" w:name="Dark List Accent 6"/>
     <w:lsdException w:qFormat="1" w:unhideWhenUsed="0" w:uiPriority="71" w:semiHidden="0" w:name="Colorful Shading Accent 6"/>
     <w:lsdException w:qFormat="1" w:unhideWhenUsed="0" w:uiPriority="72" w:semiHidden="0" w:name="Colorful List Accent 6"/>
     <w:lsdException w:qFormat="1" w:unhideWhenUsed="0" w:uiPriority="73" w:semiHidden="0" w:name="Colorful Grid Accent 6"/>
@@ -4273,6 +6105,7 @@
   <w:style w:type="paragraph" w:styleId="11">
     <w:name w:val="header"/>
     <w:basedOn w:val="1"/>
+    <w:qFormat/>
     <w:uiPriority w:val="0"/>
     <w:pPr>
       <w:tabs>

</xml_diff>